<commit_message>
Primer guardado (13/05/2026, 09:56)
</commit_message>
<xml_diff>
--- a/UT_7_2024_2025 (2).docx
+++ b/UT_7_2024_2025 (2).docx
@@ -1,6 +1,6 @@
 
 <file path=word/document.xml><?xml version="1.0" encoding="utf-8"?>
-<w:document xmlns:wpc="http://schemas.microsoft.com/office/word/2010/wordprocessingCanvas" xmlns:cx="http://schemas.microsoft.com/office/drawing/2014/chartex" xmlns:cx1="http://schemas.microsoft.com/office/drawing/2015/9/8/chartex" xmlns:cx2="http://schemas.microsoft.com/office/drawing/2015/10/21/chartex" xmlns:cx3="http://schemas.microsoft.com/office/drawing/2016/5/9/chartex" xmlns:cx4="http://schemas.microsoft.com/office/drawing/2016/5/10/chartex" xmlns:cx5="http://schemas.microsoft.com/office/drawing/2016/5/11/chartex" xmlns:cx6="http://schemas.microsoft.com/office/drawing/2016/5/12/chartex" xmlns:cx7="http://schemas.microsoft.com/office/drawing/2016/5/13/chartex" xmlns:cx8="http://schemas.microsoft.com/office/drawing/2016/5/14/chartex" xmlns:mc="http://schemas.openxmlformats.org/markup-compatibility/2006" xmlns:aink="http://schemas.microsoft.com/office/drawing/2016/ink" xmlns:am3d="http://schemas.microsoft.com/office/drawing/2017/model3d" xmlns:o="urn:schemas-microsoft-com:office:office" xmlns:oel="http://schemas.microsoft.com/office/2019/extlst" xmlns:r="http://schemas.openxmlformats.org/officeDocument/2006/relationships" xmlns:m="http://schemas.openxmlformats.org/officeDocument/2006/math" xmlns:v="urn:schemas-microsoft-com:vml" xmlns:wp14="http://schemas.microsoft.com/office/word/2010/wordprocessingDrawing" xmlns:wp="http://schemas.openxmlformats.org/drawingml/2006/wordprocessingDrawing" xmlns:w10="urn:schemas-microsoft-com:office:word" xmlns:w="http://schemas.openxmlformats.org/wordprocessingml/2006/main" xmlns:w14="http://schemas.microsoft.com/office/word/2010/wordml" xmlns:w15="http://schemas.microsoft.com/office/word/2012/wordml" xmlns:w16cex="http://schemas.microsoft.com/office/word/2018/wordml/cex" xmlns:w16cid="http://schemas.microsoft.com/office/word/2016/wordml/cid" xmlns:w16="http://schemas.microsoft.com/office/word/2018/wordml" xmlns:w16sdtdh="http://schemas.microsoft.com/office/word/2020/wordml/sdtdatahash" xmlns:w16se="http://schemas.microsoft.com/office/word/2015/wordml/symex" xmlns:wpg="http://schemas.microsoft.com/office/word/2010/wordprocessingGroup" xmlns:wpi="http://schemas.microsoft.com/office/word/2010/wordprocessingInk" xmlns:wne="http://schemas.microsoft.com/office/word/2006/wordml" xmlns:wps="http://schemas.microsoft.com/office/word/2010/wordprocessingShape" mc:Ignorable="w14 w15 w16se w16cid w16 w16cex w16sdtdh wp14">
+<w:document xmlns:wpc="http://schemas.microsoft.com/office/word/2010/wordprocessingCanvas" xmlns:cx="http://schemas.microsoft.com/office/drawing/2014/chartex" xmlns:cx1="http://schemas.microsoft.com/office/drawing/2015/9/8/chartex" xmlns:cx2="http://schemas.microsoft.com/office/drawing/2015/10/21/chartex" xmlns:cx3="http://schemas.microsoft.com/office/drawing/2016/5/9/chartex" xmlns:cx4="http://schemas.microsoft.com/office/drawing/2016/5/10/chartex" xmlns:cx5="http://schemas.microsoft.com/office/drawing/2016/5/11/chartex" xmlns:cx6="http://schemas.microsoft.com/office/drawing/2016/5/12/chartex" xmlns:cx7="http://schemas.microsoft.com/office/drawing/2016/5/13/chartex" xmlns:cx8="http://schemas.microsoft.com/office/drawing/2016/5/14/chartex" xmlns:mc="http://schemas.openxmlformats.org/markup-compatibility/2006" xmlns:aink="http://schemas.microsoft.com/office/drawing/2016/ink" xmlns:am3d="http://schemas.microsoft.com/office/drawing/2017/model3d" xmlns:o="urn:schemas-microsoft-com:office:office" xmlns:oel="http://schemas.microsoft.com/office/2019/extlst" xmlns:r="http://schemas.openxmlformats.org/officeDocument/2006/relationships" xmlns:m="http://schemas.openxmlformats.org/officeDocument/2006/math" xmlns:v="urn:schemas-microsoft-com:vml" xmlns:wp14="http://schemas.microsoft.com/office/word/2010/wordprocessingDrawing" xmlns:wp="http://schemas.openxmlformats.org/drawingml/2006/wordprocessingDrawing" xmlns:w10="urn:schemas-microsoft-com:office:word" xmlns:w="http://schemas.openxmlformats.org/wordprocessingml/2006/main" xmlns:w14="http://schemas.microsoft.com/office/word/2010/wordml" xmlns:w15="http://schemas.microsoft.com/office/word/2012/wordml" xmlns:w16cex="http://schemas.microsoft.com/office/word/2018/wordml/cex" xmlns:w16cid="http://schemas.microsoft.com/office/word/2016/wordml/cid" xmlns:w16="http://schemas.microsoft.com/office/word/2018/wordml" xmlns:w16du="http://schemas.microsoft.com/office/word/2023/wordml/word16du" xmlns:w16sdtdh="http://schemas.microsoft.com/office/word/2020/wordml/sdtdatahash" xmlns:w16sdtfl="http://schemas.microsoft.com/office/word/2024/wordml/sdtformatlock" xmlns:w16se="http://schemas.microsoft.com/office/word/2015/wordml/symex" xmlns:wpg="http://schemas.microsoft.com/office/word/2010/wordprocessingGroup" xmlns:wpi="http://schemas.microsoft.com/office/word/2010/wordprocessingInk" xmlns:wne="http://schemas.microsoft.com/office/word/2006/wordml" xmlns:wps="http://schemas.microsoft.com/office/word/2010/wordprocessingShape" mc:Ignorable="w14 w15 w16se w16cid w16 w16cex w16sdtdh w16sdtfl w16du wp14">
   <w:body>
     <w:tbl>
       <w:tblPr>
@@ -5846,9 +5846,9 @@
       </w:r>
     </w:p>
     <w:p/>
-    <w:bookmarkStart w:id="6" w:name="_Toc170148316" w:displacedByCustomXml="next"/>
+    <w:bookmarkStart w:id="6" w:name="_Toc170148631" w:displacedByCustomXml="next"/>
     <w:bookmarkStart w:id="7" w:name="_Toc49341785" w:displacedByCustomXml="next"/>
-    <w:bookmarkStart w:id="8" w:name="_Toc170148631" w:displacedByCustomXml="next"/>
+    <w:bookmarkStart w:id="8" w:name="_Toc170148316" w:displacedByCustomXml="next"/>
     <w:sdt>
       <w:sdtPr>
         <w:rPr>
@@ -6733,15 +6733,19 @@
                 <w:r>
                   <w:t xml:space="preserve">IDE para desarrollo </w:t>
                 </w:r>
+                <w:proofErr w:type="gramStart"/>
                 <w:r>
                   <w:t>PHP</w:t>
                 </w:r>
                 <w:r>
                   <w:t xml:space="preserve">  (</w:t>
                 </w:r>
+                <w:proofErr w:type="spellStart"/>
+                <w:proofErr w:type="gramEnd"/>
                 <w:r>
                   <w:t>PhpStorm</w:t>
                 </w:r>
+                <w:proofErr w:type="spellEnd"/>
                 <w:r>
                   <w:t>)</w:t>
                 </w:r>
@@ -6825,11 +6829,16 @@
                 <w:r>
                   <w:t xml:space="preserve">Bootstrap </w:t>
                 </w:r>
+                <w:proofErr w:type="gramStart"/>
                 <w:r>
                   <w:t xml:space="preserve">5.3 </w:t>
                 </w:r>
                 <w:r>
-                  <w:t xml:space="preserve"> jQuery 3.</w:t>
+                  <w:t xml:space="preserve"> jQuery</w:t>
+                </w:r>
+                <w:proofErr w:type="gramEnd"/>
+                <w:r>
+                  <w:t xml:space="preserve"> 3.</w:t>
                 </w:r>
                 <w:r>
                   <w:t>7</w:t>
@@ -6841,9 +6850,14 @@
                 </w:r>
               </w:p>
               <w:p>
-                <w:r>
-                  <w:t>https://code.jquery.com/jquery-3.7.1.slim.min.js</w:t>
-                </w:r>
+                <w:hyperlink r:id="rId12" w:history="1">
+                  <w:r>
+                    <w:rPr>
+                      <w:rStyle w:val="Hipervnculo"/>
+                    </w:rPr>
+                    <w:t>https://code.jquery.com/jquery-3.7.1.slim.min.js</w:t>
+                  </w:r>
+                </w:hyperlink>
               </w:p>
             </w:tc>
           </w:tr>
@@ -6859,8 +6873,13 @@
                 <w:tcW w:w="7477" w:type="dxa"/>
               </w:tcPr>
               <w:p>
+                <w:proofErr w:type="spellStart"/>
                 <w:r>
-                  <w:t xml:space="preserve">Mysql </w:t>
+                  <w:t>Mysql</w:t>
+                </w:r>
+                <w:proofErr w:type="spellEnd"/>
+                <w:r>
+                  <w:t xml:space="preserve"> </w:t>
                 </w:r>
                 <w:r>
                   <w:t>8.2</w:t>
@@ -6869,7 +6888,16 @@
                   <w:t xml:space="preserve"> </w:t>
                 </w:r>
                 <w:r>
-                  <w:t xml:space="preserve">– MariaDB </w:t>
+                  <w:t xml:space="preserve">– </w:t>
+                </w:r>
+                <w:proofErr w:type="spellStart"/>
+                <w:proofErr w:type="gramStart"/>
+                <w:r>
+                  <w:t>MariaDB</w:t>
+                </w:r>
+                <w:proofErr w:type="spellEnd"/>
+                <w:r>
+                  <w:t xml:space="preserve"> </w:t>
                 </w:r>
                 <w:r>
                   <w:t xml:space="preserve"> co</w:t>
@@ -6880,6 +6908,7 @@
                 <w:r>
                   <w:t>patible</w:t>
                 </w:r>
+                <w:proofErr w:type="gramEnd"/>
               </w:p>
             </w:tc>
           </w:tr>
@@ -6904,7 +6933,7 @@
                 <w:r>
                   <w:t xml:space="preserve"> - </w:t>
                 </w:r>
-                <w:hyperlink r:id="rId12" w:history="1">
+                <w:hyperlink r:id="rId13" w:history="1">
                   <w:r>
                     <w:rPr>
                       <w:rStyle w:val="Hipervnculo"/>
@@ -6917,7 +6946,7 @@
                 <w:r>
                   <w:t xml:space="preserve">o software draw.io </w:t>
                 </w:r>
-                <w:hyperlink r:id="rId13" w:history="1">
+                <w:hyperlink r:id="rId14" w:history="1">
                   <w:r>
                     <w:rPr>
                       <w:rStyle w:val="Hipervnculo"/>
@@ -6969,8 +6998,13 @@
               </w:tcPr>
               <w:p>
                 <w:r>
-                  <w:t>Servidor web con cpanel</w:t>
+                  <w:t xml:space="preserve">Servidor web con </w:t>
                 </w:r>
+                <w:proofErr w:type="spellStart"/>
+                <w:r>
+                  <w:t>cpanel</w:t>
+                </w:r>
+                <w:proofErr w:type="spellEnd"/>
               </w:p>
             </w:tc>
           </w:tr>
@@ -7026,8 +7060,13 @@
               </w:tcPr>
               <w:p>
                 <w:r>
-                  <w:t>Servidor web con Mysql</w:t>
+                  <w:t xml:space="preserve">Servidor web con </w:t>
                 </w:r>
+                <w:proofErr w:type="spellStart"/>
+                <w:r>
+                  <w:t>Mysql</w:t>
+                </w:r>
+                <w:proofErr w:type="spellEnd"/>
                 <w:r>
                   <w:t xml:space="preserve"> </w:t>
                 </w:r>
@@ -7050,7 +7089,15 @@
               </w:tcPr>
               <w:p>
                 <w:r>
-                  <w:t>Un usuario de acceso a Mysql independiente</w:t>
+                  <w:t xml:space="preserve">Un usuario de acceso a </w:t>
+                </w:r>
+                <w:proofErr w:type="spellStart"/>
+                <w:r>
+                  <w:t>Mysql</w:t>
+                </w:r>
+                <w:proofErr w:type="spellEnd"/>
+                <w:r>
+                  <w:t xml:space="preserve"> independiente</w:t>
                 </w:r>
                 <w:r>
                   <w:t xml:space="preserve"> y BBDD propia</w:t>
@@ -7245,9 +7292,11 @@
           <w:r>
             <w:t xml:space="preserve"> la compra del software de desarrollo </w:t>
           </w:r>
+          <w:proofErr w:type="spellStart"/>
           <w:r>
             <w:t>PHPStorm</w:t>
           </w:r>
+          <w:proofErr w:type="spellEnd"/>
           <w:r>
             <w:t xml:space="preserve"> con una licencia profesional.</w:t>
           </w:r>
@@ -7414,7 +7463,7 @@
                 <o:lock v:ext="edit" aspectratio="t"/>
               </v:shapetype>
               <v:shape id="_x0000_i1025" type="#_x0000_t75" style="width:465.75pt;height:205.3pt">
-                <v:imagedata r:id="rId14" o:title="SecuencaciónFasesProyecto"/>
+                <v:imagedata r:id="rId15" o:title="SecuencaciónFasesProyecto"/>
               </v:shape>
             </w:pict>
           </w:r>
@@ -7441,7 +7490,7 @@
           <w:r>
             <w:pict w14:anchorId="5636CC0F">
               <v:shape id="_x0000_i1026" type="#_x0000_t75" style="width:383.2pt;height:241.8pt">
-                <v:imagedata r:id="rId15" o:title="PlanificaciónRecursosProyectos"/>
+                <v:imagedata r:id="rId16" o:title="PlanificaciónRecursosProyectos"/>
               </v:shape>
             </w:pict>
           </w:r>
@@ -7553,7 +7602,7 @@
                     </pic:cNvPicPr>
                   </pic:nvPicPr>
                   <pic:blipFill>
-                    <a:blip r:embed="rId16">
+                    <a:blip r:embed="rId17">
                       <a:extLst>
                         <a:ext uri="{28A0092B-C50C-407E-A947-70E740481C1C}">
                           <a14:useLocalDpi xmlns:a14="http://schemas.microsoft.com/office/drawing/2010/main" val="0"/>
@@ -7631,7 +7680,7 @@
                     </pic:cNvPicPr>
                   </pic:nvPicPr>
                   <pic:blipFill>
-                    <a:blip r:embed="rId17">
+                    <a:blip r:embed="rId18">
                       <a:extLst>
                         <a:ext uri="{28A0092B-C50C-407E-A947-70E740481C1C}">
                           <a14:useLocalDpi xmlns:a14="http://schemas.microsoft.com/office/drawing/2010/main" val="0"/>
@@ -7706,7 +7755,7 @@
                     </pic:cNvPicPr>
                   </pic:nvPicPr>
                   <pic:blipFill>
-                    <a:blip r:embed="rId18">
+                    <a:blip r:embed="rId19">
                       <a:extLst>
                         <a:ext uri="{28A0092B-C50C-407E-A947-70E740481C1C}">
                           <a14:useLocalDpi xmlns:a14="http://schemas.microsoft.com/office/drawing/2010/main" val="0"/>
@@ -7783,7 +7832,7 @@
                     </pic:cNvPicPr>
                   </pic:nvPicPr>
                   <pic:blipFill>
-                    <a:blip r:embed="rId19">
+                    <a:blip r:embed="rId20">
                       <a:extLst>
                         <a:ext uri="{28A0092B-C50C-407E-A947-70E740481C1C}">
                           <a14:useLocalDpi xmlns:a14="http://schemas.microsoft.com/office/drawing/2010/main" val="0"/>
@@ -7853,7 +7902,7 @@
                     </pic:cNvPicPr>
                   </pic:nvPicPr>
                   <pic:blipFill>
-                    <a:blip r:embed="rId20">
+                    <a:blip r:embed="rId21">
                       <a:extLst>
                         <a:ext uri="{28A0092B-C50C-407E-A947-70E740481C1C}">
                           <a14:useLocalDpi xmlns:a14="http://schemas.microsoft.com/office/drawing/2010/main" val="0"/>
@@ -8411,7 +8460,21 @@
               <w:rPr>
                 <w:b/>
               </w:rPr>
-              <w:t>Cargar la BBDD       subcaso: Gestion de errores</w:t>
+              <w:t xml:space="preserve">Cargar la BBDD       subcaso: </w:t>
+            </w:r>
+            <w:proofErr w:type="spellStart"/>
+            <w:r>
+              <w:rPr>
+                <w:b/>
+              </w:rPr>
+              <w:t>Gestion</w:t>
+            </w:r>
+            <w:proofErr w:type="spellEnd"/>
+            <w:r>
+              <w:rPr>
+                <w:b/>
+              </w:rPr>
+              <w:t xml:space="preserve"> de errores</w:t>
             </w:r>
           </w:p>
         </w:tc>
@@ -10909,7 +10972,21 @@
               <w:rPr>
                 <w:bCs/>
               </w:rPr>
-              <w:t>Se generará un fichero SQL-92 para preservar los datos. Se dará la posibilidad de exportarlos a csv también.</w:t>
+              <w:t xml:space="preserve">Se generará un fichero SQL-92 para preservar los datos. Se dará la posibilidad de exportarlos a </w:t>
+            </w:r>
+            <w:proofErr w:type="spellStart"/>
+            <w:r>
+              <w:rPr>
+                <w:bCs/>
+              </w:rPr>
+              <w:t>csv</w:t>
+            </w:r>
+            <w:proofErr w:type="spellEnd"/>
+            <w:r>
+              <w:rPr>
+                <w:bCs/>
+              </w:rPr>
+              <w:t xml:space="preserve"> también.</w:t>
             </w:r>
           </w:p>
         </w:tc>
@@ -11157,7 +11234,21 @@
               <w:rPr>
                 <w:b/>
               </w:rPr>
-              <w:t>Selección de datos  subcaso: Selección de formato</w:t>
+              <w:t xml:space="preserve">Selección de </w:t>
+            </w:r>
+            <w:proofErr w:type="gramStart"/>
+            <w:r>
+              <w:rPr>
+                <w:b/>
+              </w:rPr>
+              <w:t>datos  subcaso</w:t>
+            </w:r>
+            <w:proofErr w:type="gramEnd"/>
+            <w:r>
+              <w:rPr>
+                <w:b/>
+              </w:rPr>
+              <w:t>: Selección de formato</w:t>
             </w:r>
           </w:p>
         </w:tc>
@@ -11217,7 +11308,35 @@
               <w:rPr>
                 <w:bCs/>
               </w:rPr>
-              <w:t>Se pedirá el formato y sus características para exportar: json, csv, sql-92</w:t>
+              <w:t xml:space="preserve">Se pedirá el formato y sus características para exportar: </w:t>
+            </w:r>
+            <w:proofErr w:type="spellStart"/>
+            <w:r>
+              <w:rPr>
+                <w:bCs/>
+              </w:rPr>
+              <w:t>json</w:t>
+            </w:r>
+            <w:proofErr w:type="spellEnd"/>
+            <w:r>
+              <w:rPr>
+                <w:bCs/>
+              </w:rPr>
+              <w:t xml:space="preserve">, </w:t>
+            </w:r>
+            <w:proofErr w:type="spellStart"/>
+            <w:r>
+              <w:rPr>
+                <w:bCs/>
+              </w:rPr>
+              <w:t>csv</w:t>
+            </w:r>
+            <w:proofErr w:type="spellEnd"/>
+            <w:r>
+              <w:rPr>
+                <w:bCs/>
+              </w:rPr>
+              <w:t>, sql-92</w:t>
             </w:r>
           </w:p>
         </w:tc>
@@ -11591,7 +11710,7 @@
                     </pic:cNvPicPr>
                   </pic:nvPicPr>
                   <pic:blipFill>
-                    <a:blip r:embed="rId21">
+                    <a:blip r:embed="rId22">
                       <a:extLst>
                         <a:ext uri="{28A0092B-C50C-407E-A947-70E740481C1C}">
                           <a14:useLocalDpi xmlns:a14="http://schemas.microsoft.com/office/drawing/2010/main" val="0"/>
@@ -11694,7 +11813,7 @@
                     </pic:cNvPicPr>
                   </pic:nvPicPr>
                   <pic:blipFill>
-                    <a:blip r:embed="rId22">
+                    <a:blip r:embed="rId23">
                       <a:extLst>
                         <a:ext uri="{28A0092B-C50C-407E-A947-70E740481C1C}">
                           <a14:useLocalDpi xmlns:a14="http://schemas.microsoft.com/office/drawing/2010/main" val="0"/>
@@ -11787,8 +11906,8 @@
       </w:pPr>
       <w:r>
         <w:pict w14:anchorId="119133E6">
-          <v:shape id="_x0000_i1027" type="#_x0000_t75" style="width:252.75pt;height:468.75pt">
-            <v:imagedata r:id="rId23" o:title="DA_Login"/>
+          <v:shape id="_x0000_i1027" type="#_x0000_t75" style="width:252.75pt;height:468.95pt">
+            <v:imagedata r:id="rId24" o:title="DA_Login"/>
           </v:shape>
         </w:pict>
       </w:r>
@@ -11818,7 +11937,7 @@
                     </pic:cNvPicPr>
                   </pic:nvPicPr>
                   <pic:blipFill>
-                    <a:blip r:embed="rId24">
+                    <a:blip r:embed="rId25">
                       <a:extLst>
                         <a:ext uri="{28A0092B-C50C-407E-A947-70E740481C1C}">
                           <a14:useLocalDpi xmlns:a14="http://schemas.microsoft.com/office/drawing/2010/main" val="0"/>
@@ -11882,8 +12001,8 @@
     <w:p>
       <w:r>
         <w:pict w14:anchorId="3BC76BB7">
-          <v:shape id="_x0000_i1028" type="#_x0000_t75" style="width:2in;height:523.5pt">
-            <v:imagedata r:id="rId25" o:title="DA_VaciarBBDD"/>
+          <v:shape id="_x0000_i1028" type="#_x0000_t75" style="width:143.95pt;height:523.45pt">
+            <v:imagedata r:id="rId26" o:title="DA_VaciarBBDD"/>
           </v:shape>
         </w:pict>
       </w:r>
@@ -11895,8 +12014,8 @@
       </w:r>
       <w:r>
         <w:pict w14:anchorId="6C7C2997">
-          <v:shape id="_x0000_i1029" type="#_x0000_t75" style="width:144.75pt;height:430.5pt">
-            <v:imagedata r:id="rId26" o:title="DA_GestiónErrores"/>
+          <v:shape id="_x0000_i1029" type="#_x0000_t75" style="width:144.75pt;height:430.2pt">
+            <v:imagedata r:id="rId27" o:title="DA_GestiónErrores"/>
           </v:shape>
         </w:pict>
       </w:r>
@@ -11922,7 +12041,7 @@
                     </pic:cNvPicPr>
                   </pic:nvPicPr>
                   <pic:blipFill>
-                    <a:blip r:embed="rId27">
+                    <a:blip r:embed="rId28">
                       <a:extLst>
                         <a:ext uri="{28A0092B-C50C-407E-A947-70E740481C1C}">
                           <a14:useLocalDpi xmlns:a14="http://schemas.microsoft.com/office/drawing/2010/main" val="0"/>
@@ -11996,7 +12115,7 @@
                     </pic:cNvPicPr>
                   </pic:nvPicPr>
                   <pic:blipFill>
-                    <a:blip r:embed="rId28">
+                    <a:blip r:embed="rId29">
                       <a:extLst>
                         <a:ext uri="{28A0092B-C50C-407E-A947-70E740481C1C}">
                           <a14:useLocalDpi xmlns:a14="http://schemas.microsoft.com/office/drawing/2010/main" val="0"/>
@@ -12052,7 +12171,7 @@
                     </pic:cNvPicPr>
                   </pic:nvPicPr>
                   <pic:blipFill>
-                    <a:blip r:embed="rId29">
+                    <a:blip r:embed="rId30">
                       <a:extLst>
                         <a:ext uri="{28A0092B-C50C-407E-A947-70E740481C1C}">
                           <a14:useLocalDpi xmlns:a14="http://schemas.microsoft.com/office/drawing/2010/main" val="0"/>
@@ -12143,7 +12262,7 @@
                     </pic:cNvPicPr>
                   </pic:nvPicPr>
                   <pic:blipFill>
-                    <a:blip r:embed="rId30">
+                    <a:blip r:embed="rId31">
                       <a:extLst>
                         <a:ext uri="{28A0092B-C50C-407E-A947-70E740481C1C}">
                           <a14:useLocalDpi xmlns:a14="http://schemas.microsoft.com/office/drawing/2010/main" val="0"/>
@@ -12225,7 +12344,7 @@
                     </pic:cNvPicPr>
                   </pic:nvPicPr>
                   <pic:blipFill>
-                    <a:blip r:embed="rId31">
+                    <a:blip r:embed="rId32">
                       <a:extLst>
                         <a:ext uri="{28A0092B-C50C-407E-A947-70E740481C1C}">
                           <a14:useLocalDpi xmlns:a14="http://schemas.microsoft.com/office/drawing/2010/main" val="0"/>
@@ -12307,7 +12426,7 @@
                     </pic:cNvPicPr>
                   </pic:nvPicPr>
                   <pic:blipFill>
-                    <a:blip r:embed="rId32">
+                    <a:blip r:embed="rId33">
                       <a:extLst>
                         <a:ext uri="{28A0092B-C50C-407E-A947-70E740481C1C}">
                           <a14:useLocalDpi xmlns:a14="http://schemas.microsoft.com/office/drawing/2010/main" val="0"/>
@@ -12410,7 +12529,7 @@
                     </pic:cNvPicPr>
                   </pic:nvPicPr>
                   <pic:blipFill>
-                    <a:blip r:embed="rId33">
+                    <a:blip r:embed="rId34">
                       <a:extLst>
                         <a:ext uri="{28A0092B-C50C-407E-A947-70E740481C1C}">
                           <a14:useLocalDpi xmlns:a14="http://schemas.microsoft.com/office/drawing/2010/main" val="0"/>
@@ -12478,10 +12597,18 @@
         <w:t xml:space="preserve">Una vez llevada a cabo la normalización, teniendo en </w:t>
       </w:r>
       <w:r>
-        <w:t>cuenta hasta la forma de Boyce-C</w:t>
-      </w:r>
-      <w:r>
-        <w:t>ood, el resultado es el siguiente:</w:t>
+        <w:t>cuenta hasta la forma de Boyce-</w:t>
+      </w:r>
+      <w:proofErr w:type="spellStart"/>
+      <w:r>
+        <w:t>C</w:t>
+      </w:r>
+      <w:r>
+        <w:t>ood</w:t>
+      </w:r>
+      <w:proofErr w:type="spellEnd"/>
+      <w:r>
+        <w:t>, el resultado es el siguiente:</w:t>
       </w:r>
     </w:p>
     <w:p>
@@ -12547,15 +12674,38 @@
       <w:r>
         <w:t xml:space="preserve">: </w:t>
       </w:r>
+      <w:proofErr w:type="spellStart"/>
       <w:r>
         <w:rPr>
           <w:u w:val="single"/>
         </w:rPr>
         <w:t>isbn</w:t>
       </w:r>
-      <w:r>
-        <w:t>, titulo, autor, numero_ejemplares, id_materia, id_curso</w:t>
-      </w:r>
+      <w:proofErr w:type="spellEnd"/>
+      <w:r>
+        <w:t xml:space="preserve">, titulo, autor, </w:t>
+      </w:r>
+      <w:proofErr w:type="spellStart"/>
+      <w:r>
+        <w:t>numero_ejemplares</w:t>
+      </w:r>
+      <w:proofErr w:type="spellEnd"/>
+      <w:r>
+        <w:t xml:space="preserve">, </w:t>
+      </w:r>
+      <w:proofErr w:type="spellStart"/>
+      <w:r>
+        <w:t>id_materia</w:t>
+      </w:r>
+      <w:proofErr w:type="spellEnd"/>
+      <w:r>
+        <w:t xml:space="preserve">, </w:t>
+      </w:r>
+      <w:proofErr w:type="spellStart"/>
+      <w:r>
+        <w:t>id_curso</w:t>
+      </w:r>
+      <w:proofErr w:type="spellEnd"/>
     </w:p>
     <w:p>
       <w:pPr>
@@ -12585,6 +12735,7 @@
       <w:pPr>
         <w:ind w:left="567"/>
       </w:pPr>
+      <w:proofErr w:type="spellStart"/>
       <w:r>
         <w:rPr>
           <w:b/>
@@ -12592,17 +12743,72 @@
         </w:rPr>
         <w:t>AlumnosCursosLibros</w:t>
       </w:r>
+      <w:proofErr w:type="spellEnd"/>
       <w:r>
         <w:t xml:space="preserve">: </w:t>
       </w:r>
+      <w:proofErr w:type="spellStart"/>
       <w:r>
         <w:rPr>
           <w:u w:val="single"/>
         </w:rPr>
-        <w:t>isbn, id_alumno, id_curso</w:t>
-      </w:r>
-      <w:r>
-        <w:t>, fecha_entrega, fecha_devolucion, estado (entregado, por_devolver)</w:t>
+        <w:t>isbn</w:t>
+      </w:r>
+      <w:proofErr w:type="spellEnd"/>
+      <w:r>
+        <w:rPr>
+          <w:u w:val="single"/>
+        </w:rPr>
+        <w:t xml:space="preserve">, </w:t>
+      </w:r>
+      <w:proofErr w:type="spellStart"/>
+      <w:r>
+        <w:rPr>
+          <w:u w:val="single"/>
+        </w:rPr>
+        <w:t>id_alumno</w:t>
+      </w:r>
+      <w:proofErr w:type="spellEnd"/>
+      <w:r>
+        <w:rPr>
+          <w:u w:val="single"/>
+        </w:rPr>
+        <w:t xml:space="preserve">, </w:t>
+      </w:r>
+      <w:proofErr w:type="spellStart"/>
+      <w:r>
+        <w:rPr>
+          <w:u w:val="single"/>
+        </w:rPr>
+        <w:t>id_curso</w:t>
+      </w:r>
+      <w:proofErr w:type="spellEnd"/>
+      <w:r>
+        <w:t xml:space="preserve">, </w:t>
+      </w:r>
+      <w:proofErr w:type="spellStart"/>
+      <w:r>
+        <w:t>fecha_entrega</w:t>
+      </w:r>
+      <w:proofErr w:type="spellEnd"/>
+      <w:r>
+        <w:t xml:space="preserve">, </w:t>
+      </w:r>
+      <w:proofErr w:type="spellStart"/>
+      <w:r>
+        <w:t>fecha_devolucion</w:t>
+      </w:r>
+      <w:proofErr w:type="spellEnd"/>
+      <w:r>
+        <w:t xml:space="preserve">, estado (entregado, </w:t>
+      </w:r>
+      <w:proofErr w:type="spellStart"/>
+      <w:r>
+        <w:t>por_devolver</w:t>
+      </w:r>
+      <w:proofErr w:type="spellEnd"/>
+      <w:r>
+        <w:t>)</w:t>
       </w:r>
     </w:p>
     <w:p>
@@ -12623,16 +12829,16 @@
         <w:pStyle w:val="Ttulo1"/>
         <w:jc w:val="center"/>
         <w:rPr>
-          <w:sz w:val="144"/>
-          <w:szCs w:val="144"/>
+          <w:sz w:val="96"/>
+          <w:szCs w:val="96"/>
         </w:rPr>
       </w:pPr>
       <w:bookmarkStart w:id="112" w:name="_Toc170148355"/>
       <w:bookmarkStart w:id="113" w:name="_Toc170148670"/>
       <w:r>
         <w:rPr>
-          <w:sz w:val="144"/>
-          <w:szCs w:val="144"/>
+          <w:sz w:val="96"/>
+          <w:szCs w:val="96"/>
         </w:rPr>
         <w:lastRenderedPageBreak/>
         <w:t>Diseño del Proyecto</w:t>
@@ -12643,28 +12849,12 @@
     </w:p>
     <w:p>
       <w:pPr>
-        <w:spacing w:after="200"/>
-        <w:jc w:val="left"/>
-        <w:rPr>
-          <w:rFonts w:eastAsiaTheme="majorEastAsia" w:cstheme="majorBidi"/>
-          <w:b/>
-          <w:sz w:val="36"/>
-          <w:szCs w:val="26"/>
-        </w:rPr>
-      </w:pPr>
-      <w:r>
-        <w:br w:type="page"/>
-      </w:r>
-    </w:p>
-    <w:p>
-      <w:pPr>
         <w:pStyle w:val="Ttulo2"/>
       </w:pPr>
       <w:bookmarkStart w:id="114" w:name="_Toc49341829"/>
       <w:bookmarkStart w:id="115" w:name="_Toc170148356"/>
       <w:bookmarkStart w:id="116" w:name="_Toc170148671"/>
       <w:r>
-        <w:lastRenderedPageBreak/>
         <w:t>Diseño físico de la B</w:t>
       </w:r>
       <w:r>
@@ -13851,8 +14041,19 @@
                 <w:sz w:val="16"/>
                 <w:szCs w:val="16"/>
               </w:rPr>
-              <w:t>Letra del niev</w:t>
-            </w:r>
+              <w:t xml:space="preserve">Letra del </w:t>
+            </w:r>
+            <w:proofErr w:type="spellStart"/>
+            <w:r>
+              <w:rPr>
+                <w:rFonts w:cstheme="minorHAnsi"/>
+                <w:b/>
+                <w:sz w:val="16"/>
+                <w:szCs w:val="16"/>
+              </w:rPr>
+              <w:t>niev</w:t>
+            </w:r>
+            <w:proofErr w:type="spellEnd"/>
           </w:p>
         </w:tc>
       </w:tr>
@@ -14019,8 +14220,19 @@
                 <w:sz w:val="16"/>
                 <w:szCs w:val="16"/>
               </w:rPr>
-              <w:t>1ºeso, 2eso….</w:t>
-            </w:r>
+              <w:t>1ºeso, 2</w:t>
+            </w:r>
+            <w:proofErr w:type="gramStart"/>
+            <w:r>
+              <w:rPr>
+                <w:rFonts w:cstheme="minorHAnsi"/>
+                <w:b/>
+                <w:sz w:val="16"/>
+                <w:szCs w:val="16"/>
+              </w:rPr>
+              <w:t>eso….</w:t>
+            </w:r>
+            <w:proofErr w:type="gramEnd"/>
           </w:p>
         </w:tc>
       </w:tr>
@@ -14288,6 +14500,7 @@
                 <w:szCs w:val="16"/>
               </w:rPr>
             </w:pPr>
+            <w:proofErr w:type="spellStart"/>
             <w:r>
               <w:rPr>
                 <w:rFonts w:cstheme="minorHAnsi"/>
@@ -14297,6 +14510,7 @@
               </w:rPr>
               <w:t>isbn</w:t>
             </w:r>
+            <w:proofErr w:type="spellEnd"/>
           </w:p>
         </w:tc>
         <w:tc>
@@ -14446,8 +14660,19 @@
                 <w:sz w:val="16"/>
                 <w:szCs w:val="16"/>
               </w:rPr>
-              <w:t>Validar formato isbn</w:t>
-            </w:r>
+              <w:t xml:space="preserve">Validar formato </w:t>
+            </w:r>
+            <w:proofErr w:type="spellStart"/>
+            <w:r>
+              <w:rPr>
+                <w:rFonts w:cstheme="minorHAnsi"/>
+                <w:b/>
+                <w:sz w:val="16"/>
+                <w:szCs w:val="16"/>
+              </w:rPr>
+              <w:t>isbn</w:t>
+            </w:r>
+            <w:proofErr w:type="spellEnd"/>
           </w:p>
         </w:tc>
       </w:tr>
@@ -14770,6 +14995,7 @@
                 <w:szCs w:val="16"/>
               </w:rPr>
             </w:pPr>
+            <w:proofErr w:type="spellStart"/>
             <w:r>
               <w:rPr>
                 <w:rFonts w:cstheme="minorHAnsi"/>
@@ -14779,6 +15005,7 @@
               </w:rPr>
               <w:t>numero_ejemplares</w:t>
             </w:r>
+            <w:proofErr w:type="spellEnd"/>
           </w:p>
         </w:tc>
         <w:tc>
@@ -14929,6 +15156,7 @@
                 <w:szCs w:val="16"/>
               </w:rPr>
             </w:pPr>
+            <w:proofErr w:type="spellStart"/>
             <w:r>
               <w:rPr>
                 <w:rFonts w:cstheme="minorHAnsi"/>
@@ -14938,6 +15166,7 @@
               </w:rPr>
               <w:t>id_materia</w:t>
             </w:r>
+            <w:proofErr w:type="spellEnd"/>
           </w:p>
         </w:tc>
         <w:tc>
@@ -15106,6 +15335,7 @@
                 <w:szCs w:val="16"/>
               </w:rPr>
             </w:pPr>
+            <w:proofErr w:type="spellStart"/>
             <w:r>
               <w:rPr>
                 <w:rFonts w:cstheme="minorHAnsi"/>
@@ -15115,6 +15345,7 @@
               </w:rPr>
               <w:t>id_curso</w:t>
             </w:r>
+            <w:proofErr w:type="spellEnd"/>
           </w:p>
         </w:tc>
         <w:tc>
@@ -16212,7 +16443,27 @@
                 <w:sz w:val="16"/>
                 <w:szCs w:val="16"/>
               </w:rPr>
-              <w:t>0, I, II  (0 para no beca, tramo I y II)</w:t>
+              <w:t xml:space="preserve">0, I, </w:t>
+            </w:r>
+            <w:proofErr w:type="gramStart"/>
+            <w:r>
+              <w:rPr>
+                <w:rFonts w:cstheme="minorHAnsi"/>
+                <w:b/>
+                <w:sz w:val="16"/>
+                <w:szCs w:val="16"/>
+              </w:rPr>
+              <w:t>II  (</w:t>
+            </w:r>
+            <w:proofErr w:type="gramEnd"/>
+            <w:r>
+              <w:rPr>
+                <w:rFonts w:cstheme="minorHAnsi"/>
+                <w:b/>
+                <w:sz w:val="16"/>
+                <w:szCs w:val="16"/>
+              </w:rPr>
+              <w:t>0 para no beca, tramo I y II)</w:t>
             </w:r>
           </w:p>
         </w:tc>
@@ -16231,6 +16482,7 @@
                 <w:szCs w:val="16"/>
               </w:rPr>
             </w:pPr>
+            <w:proofErr w:type="spellStart"/>
             <w:r>
               <w:rPr>
                 <w:rFonts w:cstheme="minorHAnsi"/>
@@ -16240,6 +16492,7 @@
               </w:rPr>
               <w:t>bilingue</w:t>
             </w:r>
+            <w:proofErr w:type="spellEnd"/>
           </w:p>
         </w:tc>
         <w:tc>
@@ -16411,6 +16664,7 @@
                 <w:szCs w:val="16"/>
               </w:rPr>
             </w:pPr>
+            <w:proofErr w:type="spellStart"/>
             <w:r>
               <w:rPr>
                 <w:rFonts w:cstheme="minorHAnsi"/>
@@ -16420,6 +16674,7 @@
               </w:rPr>
               <w:t>alumnoscursoslibros</w:t>
             </w:r>
+            <w:proofErr w:type="spellEnd"/>
           </w:p>
         </w:tc>
       </w:tr>
@@ -17021,6 +17276,7 @@
                 <w:szCs w:val="16"/>
               </w:rPr>
             </w:pPr>
+            <w:proofErr w:type="spellStart"/>
             <w:r>
               <w:rPr>
                 <w:rFonts w:cstheme="minorHAnsi"/>
@@ -17030,6 +17286,7 @@
               </w:rPr>
               <w:t>isbn</w:t>
             </w:r>
+            <w:proofErr w:type="spellEnd"/>
           </w:p>
         </w:tc>
         <w:tc>
@@ -17207,6 +17464,7 @@
                 <w:szCs w:val="16"/>
               </w:rPr>
             </w:pPr>
+            <w:proofErr w:type="spellStart"/>
             <w:r>
               <w:rPr>
                 <w:rFonts w:cstheme="minorHAnsi"/>
@@ -17225,6 +17483,7 @@
               </w:rPr>
               <w:t>echa_entrega</w:t>
             </w:r>
+            <w:proofErr w:type="spellEnd"/>
           </w:p>
         </w:tc>
         <w:tc>
@@ -17375,6 +17634,7 @@
                 <w:szCs w:val="16"/>
               </w:rPr>
             </w:pPr>
+            <w:proofErr w:type="spellStart"/>
             <w:r>
               <w:rPr>
                 <w:rFonts w:cstheme="minorHAnsi"/>
@@ -17411,6 +17671,7 @@
               </w:rPr>
               <w:t>evolución</w:t>
             </w:r>
+            <w:proofErr w:type="spellEnd"/>
           </w:p>
         </w:tc>
         <w:tc>
@@ -17683,13 +17944,23 @@
                 <w:sz w:val="16"/>
                 <w:szCs w:val="16"/>
               </w:rPr>
-              <w:t>P: Prestado, D:Devuelto</w:t>
-            </w:r>
+              <w:t xml:space="preserve">P: Prestado, </w:t>
+            </w:r>
+            <w:proofErr w:type="gramStart"/>
+            <w:r>
+              <w:rPr>
+                <w:rFonts w:cstheme="minorHAnsi"/>
+                <w:b/>
+                <w:sz w:val="16"/>
+                <w:szCs w:val="16"/>
+              </w:rPr>
+              <w:t>D:Devuelto</w:t>
+            </w:r>
+            <w:proofErr w:type="gramEnd"/>
           </w:p>
         </w:tc>
       </w:tr>
     </w:tbl>
-    <w:p/>
     <w:p>
       <w:pPr>
         <w:pStyle w:val="Ttulo2"/>
@@ -17697,7 +17968,19 @@
       <w:bookmarkStart w:id="117" w:name="_Toc49341831"/>
       <w:bookmarkStart w:id="118" w:name="_Toc170148358"/>
       <w:bookmarkStart w:id="119" w:name="_Toc170148673"/>
-      <w:r>
+    </w:p>
+    <w:p>
+      <w:pPr>
+        <w:pStyle w:val="Ttulo2"/>
+      </w:pPr>
+    </w:p>
+    <w:p/>
+    <w:p>
+      <w:pPr>
+        <w:pStyle w:val="Ttulo2"/>
+      </w:pPr>
+      <w:r>
+        <w:lastRenderedPageBreak/>
         <w:t>Estructura de almacenamiento</w:t>
       </w:r>
       <w:bookmarkEnd w:id="117"/>
@@ -17705,16 +17988,362 @@
       <w:bookmarkEnd w:id="119"/>
     </w:p>
     <w:p>
-      <w:pPr>
-        <w:rPr>
-          <w:color w:val="FF0000"/>
-        </w:rPr>
-      </w:pPr>
-      <w:r>
-        <w:rPr>
-          <w:color w:val="FF0000"/>
-        </w:rPr>
-        <w:t>Rellenar</w:t>
+      <w:r>
+        <w:drawing>
+          <wp:inline distT="0" distB="0" distL="0" distR="0" wp14:anchorId="5C89E121" wp14:editId="4F4EFF5C">
+            <wp:extent cx="4305300" cy="1491548"/>
+            <wp:effectExtent l="0" t="0" r="0" b="0"/>
+            <wp:docPr id="16987925" name="Imagen 1"/>
+            <wp:cNvGraphicFramePr>
+              <a:graphicFrameLocks xmlns:a="http://schemas.openxmlformats.org/drawingml/2006/main" noChangeAspect="1"/>
+            </wp:cNvGraphicFramePr>
+            <a:graphic xmlns:a="http://schemas.openxmlformats.org/drawingml/2006/main">
+              <a:graphicData uri="http://schemas.openxmlformats.org/drawingml/2006/picture">
+                <pic:pic xmlns:pic="http://schemas.openxmlformats.org/drawingml/2006/picture">
+                  <pic:nvPicPr>
+                    <pic:cNvPr id="16987925" name=""/>
+                    <pic:cNvPicPr/>
+                  </pic:nvPicPr>
+                  <pic:blipFill>
+                    <a:blip r:embed="rId35"/>
+                    <a:stretch>
+                      <a:fillRect/>
+                    </a:stretch>
+                  </pic:blipFill>
+                  <pic:spPr>
+                    <a:xfrm>
+                      <a:off x="0" y="0"/>
+                      <a:ext cx="4323627" cy="1497897"/>
+                    </a:xfrm>
+                    <a:prstGeom prst="rect">
+                      <a:avLst/>
+                    </a:prstGeom>
+                  </pic:spPr>
+                </pic:pic>
+              </a:graphicData>
+            </a:graphic>
+          </wp:inline>
+        </w:drawing>
+      </w:r>
+    </w:p>
+    <w:p>
+      <w:pPr>
+        <w:rPr>
+          <w:b/>
+          <w:bCs/>
+        </w:rPr>
+      </w:pPr>
+      <w:r>
+        <w:rPr>
+          <w:b/>
+          <w:bCs/>
+        </w:rPr>
+        <w:t>WEB</w:t>
+      </w:r>
+    </w:p>
+    <w:p>
+      <w:pPr>
+        <w:rPr>
+          <w:b/>
+          <w:bCs/>
+        </w:rPr>
+      </w:pPr>
+      <w:r>
+        <w:rPr>
+          <w:b/>
+          <w:bCs/>
+        </w:rPr>
+        <w:drawing>
+          <wp:inline distT="0" distB="0" distL="0" distR="0" wp14:anchorId="7D6B2FDC" wp14:editId="7AD45EDA">
+            <wp:extent cx="4267200" cy="712289"/>
+            <wp:effectExtent l="0" t="0" r="0" b="0"/>
+            <wp:docPr id="527370252" name="Imagen 1"/>
+            <wp:cNvGraphicFramePr>
+              <a:graphicFrameLocks xmlns:a="http://schemas.openxmlformats.org/drawingml/2006/main" noChangeAspect="1"/>
+            </wp:cNvGraphicFramePr>
+            <a:graphic xmlns:a="http://schemas.openxmlformats.org/drawingml/2006/main">
+              <a:graphicData uri="http://schemas.openxmlformats.org/drawingml/2006/picture">
+                <pic:pic xmlns:pic="http://schemas.openxmlformats.org/drawingml/2006/picture">
+                  <pic:nvPicPr>
+                    <pic:cNvPr id="527370252" name=""/>
+                    <pic:cNvPicPr/>
+                  </pic:nvPicPr>
+                  <pic:blipFill>
+                    <a:blip r:embed="rId36"/>
+                    <a:stretch>
+                      <a:fillRect/>
+                    </a:stretch>
+                  </pic:blipFill>
+                  <pic:spPr>
+                    <a:xfrm>
+                      <a:off x="0" y="0"/>
+                      <a:ext cx="4338225" cy="724145"/>
+                    </a:xfrm>
+                    <a:prstGeom prst="rect">
+                      <a:avLst/>
+                    </a:prstGeom>
+                  </pic:spPr>
+                </pic:pic>
+              </a:graphicData>
+            </a:graphic>
+          </wp:inline>
+        </w:drawing>
+      </w:r>
+    </w:p>
+    <w:p>
+      <w:pPr>
+        <w:rPr>
+          <w:b/>
+          <w:bCs/>
+        </w:rPr>
+      </w:pPr>
+      <w:r>
+        <w:rPr>
+          <w:b/>
+          <w:bCs/>
+        </w:rPr>
+        <w:t>DOCUMENTOS</w:t>
+      </w:r>
+    </w:p>
+    <w:p>
+      <w:pPr>
+        <w:rPr>
+          <w:b/>
+          <w:bCs/>
+        </w:rPr>
+      </w:pPr>
+      <w:r>
+        <w:rPr>
+          <w:b/>
+          <w:bCs/>
+        </w:rPr>
+        <w:drawing>
+          <wp:inline distT="0" distB="0" distL="0" distR="0" wp14:anchorId="369D85FB" wp14:editId="680F756A">
+            <wp:extent cx="4183380" cy="570930"/>
+            <wp:effectExtent l="0" t="0" r="7620" b="635"/>
+            <wp:docPr id="1900852200" name="Imagen 1"/>
+            <wp:cNvGraphicFramePr>
+              <a:graphicFrameLocks xmlns:a="http://schemas.openxmlformats.org/drawingml/2006/main" noChangeAspect="1"/>
+            </wp:cNvGraphicFramePr>
+            <a:graphic xmlns:a="http://schemas.openxmlformats.org/drawingml/2006/main">
+              <a:graphicData uri="http://schemas.openxmlformats.org/drawingml/2006/picture">
+                <pic:pic xmlns:pic="http://schemas.openxmlformats.org/drawingml/2006/picture">
+                  <pic:nvPicPr>
+                    <pic:cNvPr id="1900852200" name=""/>
+                    <pic:cNvPicPr/>
+                  </pic:nvPicPr>
+                  <pic:blipFill rotWithShape="1">
+                    <a:blip r:embed="rId37"/>
+                    <a:srcRect l="1528" r="2225"/>
+                    <a:stretch>
+                      <a:fillRect/>
+                    </a:stretch>
+                  </pic:blipFill>
+                  <pic:spPr bwMode="auto">
+                    <a:xfrm>
+                      <a:off x="0" y="0"/>
+                      <a:ext cx="4257980" cy="581111"/>
+                    </a:xfrm>
+                    <a:prstGeom prst="rect">
+                      <a:avLst/>
+                    </a:prstGeom>
+                    <a:ln>
+                      <a:noFill/>
+                    </a:ln>
+                    <a:extLst>
+                      <a:ext uri="{53640926-AAD7-44D8-BBD7-CCE9431645EC}">
+                        <a14:shadowObscured xmlns:a14="http://schemas.microsoft.com/office/drawing/2010/main"/>
+                      </a:ext>
+                    </a:extLst>
+                  </pic:spPr>
+                </pic:pic>
+              </a:graphicData>
+            </a:graphic>
+          </wp:inline>
+        </w:drawing>
+      </w:r>
+    </w:p>
+    <w:p>
+      <w:r>
+        <w:t xml:space="preserve">Para la estructura de almacenamiento hemos creado 6 directorios dependiendo de sus funcionalidades, tenemos el directorio de </w:t>
+      </w:r>
+      <w:r>
+        <w:rPr>
+          <w:b/>
+          <w:bCs/>
+        </w:rPr>
+        <w:t>web</w:t>
+      </w:r>
+      <w:r>
+        <w:rPr>
+          <w:b/>
+          <w:bCs/>
+        </w:rPr>
+        <w:t xml:space="preserve"> </w:t>
+      </w:r>
+      <w:r>
+        <w:t xml:space="preserve">que contiene los diferentes recursos que necesitará la aplicación, por ejemplo, tenemos el directorio </w:t>
+      </w:r>
+      <w:r>
+        <w:rPr>
+          <w:b/>
+          <w:bCs/>
+        </w:rPr>
+        <w:t>style</w:t>
+      </w:r>
+      <w:r>
+        <w:t xml:space="preserve"> que son los archivos CSS para el diseño de la aplicación, también tenemos el directorio </w:t>
+      </w:r>
+      <w:r>
+        <w:rPr>
+          <w:b/>
+          <w:bCs/>
+        </w:rPr>
+        <w:t>script</w:t>
+      </w:r>
+      <w:r>
+        <w:rPr>
+          <w:b/>
+          <w:bCs/>
+        </w:rPr>
+        <w:t xml:space="preserve"> </w:t>
+      </w:r>
+      <w:r>
+        <w:t xml:space="preserve">que son los archivos de JavaScript para la funcionalidad de la aplicación y además tenemos el directorio </w:t>
+      </w:r>
+      <w:r>
+        <w:rPr>
+          <w:b/>
+          <w:bCs/>
+        </w:rPr>
+        <w:t>imágenes</w:t>
+      </w:r>
+      <w:r>
+        <w:t xml:space="preserve"> que son las imágenes que utilizaremos para la aplicación.</w:t>
+      </w:r>
+    </w:p>
+    <w:p/>
+    <w:p>
+      <w:r>
+        <w:t xml:space="preserve">Tenemos el directorio </w:t>
+      </w:r>
+      <w:r>
+        <w:rPr>
+          <w:b/>
+          <w:bCs/>
+        </w:rPr>
+        <w:t>alumnos</w:t>
+      </w:r>
+      <w:r>
+        <w:rPr>
+          <w:b/>
+          <w:bCs/>
+        </w:rPr>
+        <w:t xml:space="preserve"> </w:t>
+      </w:r>
+      <w:r>
+        <w:t xml:space="preserve">que es donde almacenaremos todos los archivos que usaremos para la gestión de los alumnos. El directorio </w:t>
+      </w:r>
+      <w:r>
+        <w:rPr>
+          <w:b/>
+          <w:bCs/>
+        </w:rPr>
+        <w:t>libros_prestados</w:t>
+      </w:r>
+      <w:r>
+        <w:rPr>
+          <w:b/>
+          <w:bCs/>
+        </w:rPr>
+        <w:t xml:space="preserve"> </w:t>
+      </w:r>
+      <w:r>
+        <w:t xml:space="preserve">va a contener todo lo relacionado con el </w:t>
+      </w:r>
+      <w:r>
+        <w:t>préstamos</w:t>
+      </w:r>
+      <w:r>
+        <w:t xml:space="preserve"> y devolución de libros. </w:t>
+      </w:r>
+      <w:r>
+        <w:t>También</w:t>
+      </w:r>
+      <w:r>
+        <w:t xml:space="preserve"> tenemos el directorio </w:t>
+      </w:r>
+      <w:r>
+        <w:rPr>
+          <w:b/>
+          <w:bCs/>
+        </w:rPr>
+        <w:t xml:space="preserve">listado_de_libros </w:t>
+      </w:r>
+      <w:r>
+        <w:t xml:space="preserve">que es el que se encargara de generar los listados de los alumnos, libros y </w:t>
+      </w:r>
+      <w:r>
+        <w:t>préstamos</w:t>
+      </w:r>
+      <w:r>
+        <w:t xml:space="preserve">. </w:t>
+      </w:r>
+    </w:p>
+    <w:p/>
+    <w:p>
+      <w:r>
+        <w:t xml:space="preserve">El directorio </w:t>
+      </w:r>
+      <w:r>
+        <w:rPr>
+          <w:b/>
+          <w:bCs/>
+        </w:rPr>
+        <w:t xml:space="preserve">documentos </w:t>
+      </w:r>
+      <w:r>
+        <w:t xml:space="preserve">está compuesto por 2 directorios, el directorio </w:t>
+      </w:r>
+      <w:r>
+        <w:rPr>
+          <w:b/>
+          <w:bCs/>
+        </w:rPr>
+        <w:t xml:space="preserve">contratos </w:t>
+      </w:r>
+      <w:r>
+        <w:t>que</w:t>
+      </w:r>
+      <w:r>
+        <w:rPr>
+          <w:b/>
+          <w:bCs/>
+        </w:rPr>
+        <w:t xml:space="preserve"> </w:t>
+      </w:r>
+      <w:r>
+        <w:t xml:space="preserve">almacenará los contratos que se van a generar por el sistema para su firma y el directorio </w:t>
+      </w:r>
+      <w:r>
+        <w:rPr>
+          <w:b/>
+          <w:bCs/>
+        </w:rPr>
+        <w:t xml:space="preserve">copias_de_seguridad </w:t>
+      </w:r>
+      <w:r>
+        <w:t xml:space="preserve">que es donde almacenaremos las copias de seguridad que se generan para poder proteger la información. Y por último tenemos el directorio </w:t>
+      </w:r>
+      <w:r>
+        <w:rPr>
+          <w:b/>
+          <w:bCs/>
+        </w:rPr>
+        <w:t>base_de_datos</w:t>
+      </w:r>
+      <w:r>
+        <w:t xml:space="preserve"> que contendrá los archivos que son necesarios para poder conectar la aplicación con la base de datos.</w:t>
       </w:r>
     </w:p>
     <w:p/>
@@ -17796,6 +18425,7 @@
       <w:bookmarkStart w:id="130" w:name="_Toc170148362"/>
       <w:bookmarkStart w:id="131" w:name="_Toc170148677"/>
       <w:r>
+        <w:lastRenderedPageBreak/>
         <w:t>Diseño de la estructura de clases y librerías (diagrama de clases)</w:t>
       </w:r>
       <w:bookmarkEnd w:id="129"/>
@@ -17824,7 +18454,6 @@
       <w:bookmarkStart w:id="133" w:name="_Toc170148363"/>
       <w:bookmarkStart w:id="134" w:name="_Toc170148678"/>
       <w:r>
-        <w:lastRenderedPageBreak/>
         <w:t>Diseño de la interfaz gráfica</w:t>
       </w:r>
       <w:bookmarkEnd w:id="132"/>
@@ -18074,7 +18703,7 @@
                     </pic:cNvPicPr>
                   </pic:nvPicPr>
                   <pic:blipFill>
-                    <a:blip r:embed="rId34" cstate="print">
+                    <a:blip r:embed="rId38" cstate="print">
                       <a:extLst>
                         <a:ext uri="{28A0092B-C50C-407E-A947-70E740481C1C}">
                           <a14:useLocalDpi xmlns:a14="http://schemas.microsoft.com/office/drawing/2010/main" val="0"/>
@@ -18197,9 +18826,14 @@
       <w:bookmarkStart w:id="151" w:name="_Toc49341858"/>
       <w:bookmarkStart w:id="152" w:name="_Toc170148368"/>
       <w:bookmarkStart w:id="153" w:name="_Toc170148682"/>
+      <w:proofErr w:type="spellStart"/>
       <w:r>
         <w:lastRenderedPageBreak/>
-        <w:t>Sql de creación (MySQL)</w:t>
+        <w:t>Sql</w:t>
+      </w:r>
+      <w:proofErr w:type="spellEnd"/>
+      <w:r>
+        <w:t xml:space="preserve"> de creación (MySQL)</w:t>
       </w:r>
       <w:bookmarkEnd w:id="148"/>
       <w:bookmarkEnd w:id="149"/>
@@ -18274,7 +18908,21 @@
         <w:rPr>
           <w:lang w:val="en-GB"/>
         </w:rPr>
-        <w:t>-- Servidor: 127.0.0.1</w:t>
+        <w:t xml:space="preserve">-- </w:t>
+      </w:r>
+      <w:proofErr w:type="spellStart"/>
+      <w:r>
+        <w:rPr>
+          <w:lang w:val="en-GB"/>
+        </w:rPr>
+        <w:t>Servidor</w:t>
+      </w:r>
+      <w:proofErr w:type="spellEnd"/>
+      <w:r>
+        <w:rPr>
+          <w:lang w:val="en-GB"/>
+        </w:rPr>
+        <w:t>: 127.0.0.1</w:t>
       </w:r>
     </w:p>
     <w:p>
@@ -18287,7 +18935,21 @@
         <w:rPr>
           <w:lang w:val="en-GB"/>
         </w:rPr>
-        <w:t>-- Tiempo de generación: 24-06-2024 a las 18:56:50</w:t>
+        <w:t xml:space="preserve">-- Tiempo de </w:t>
+      </w:r>
+      <w:proofErr w:type="spellStart"/>
+      <w:r>
+        <w:rPr>
+          <w:lang w:val="en-GB"/>
+        </w:rPr>
+        <w:t>generación</w:t>
+      </w:r>
+      <w:proofErr w:type="spellEnd"/>
+      <w:r>
+        <w:rPr>
+          <w:lang w:val="en-GB"/>
+        </w:rPr>
+        <w:t>: 24-06-2024 a las 18:56:50</w:t>
       </w:r>
     </w:p>
     <w:p>
@@ -18300,7 +18962,35 @@
         <w:rPr>
           <w:lang w:val="en-GB"/>
         </w:rPr>
-        <w:t>-- Versión del servidor: 10.4.27-MariaDB</w:t>
+        <w:t xml:space="preserve">-- </w:t>
+      </w:r>
+      <w:proofErr w:type="spellStart"/>
+      <w:r>
+        <w:rPr>
+          <w:lang w:val="en-GB"/>
+        </w:rPr>
+        <w:t>Versión</w:t>
+      </w:r>
+      <w:proofErr w:type="spellEnd"/>
+      <w:r>
+        <w:rPr>
+          <w:lang w:val="en-GB"/>
+        </w:rPr>
+        <w:t xml:space="preserve"> del </w:t>
+      </w:r>
+      <w:proofErr w:type="spellStart"/>
+      <w:r>
+        <w:rPr>
+          <w:lang w:val="en-GB"/>
+        </w:rPr>
+        <w:t>servidor</w:t>
+      </w:r>
+      <w:proofErr w:type="spellEnd"/>
+      <w:r>
+        <w:rPr>
+          <w:lang w:val="en-GB"/>
+        </w:rPr>
+        <w:t>: 10.4.27-MariaDB</w:t>
       </w:r>
     </w:p>
     <w:p>
@@ -18313,7 +19003,21 @@
         <w:rPr>
           <w:lang w:val="en-GB"/>
         </w:rPr>
-        <w:t>-- Versión de PHP: 8.2.0</w:t>
+        <w:t xml:space="preserve">-- </w:t>
+      </w:r>
+      <w:proofErr w:type="spellStart"/>
+      <w:r>
+        <w:rPr>
+          <w:lang w:val="en-GB"/>
+        </w:rPr>
+        <w:t>Versión</w:t>
+      </w:r>
+      <w:proofErr w:type="spellEnd"/>
+      <w:r>
+        <w:rPr>
+          <w:lang w:val="en-GB"/>
+        </w:rPr>
+        <w:t xml:space="preserve"> de PHP: 8.2.0</w:t>
       </w:r>
     </w:p>
     <w:p>
@@ -18359,7 +19063,21 @@
         <w:rPr>
           <w:lang w:val="en-GB"/>
         </w:rPr>
-        <w:t>SET time_zone = "+00:00";</w:t>
+        <w:t xml:space="preserve">SET </w:t>
+      </w:r>
+      <w:proofErr w:type="spellStart"/>
+      <w:r>
+        <w:rPr>
+          <w:lang w:val="en-GB"/>
+        </w:rPr>
+        <w:t>time_zone</w:t>
+      </w:r>
+      <w:proofErr w:type="spellEnd"/>
+      <w:r>
+        <w:rPr>
+          <w:lang w:val="en-GB"/>
+        </w:rPr>
+        <w:t xml:space="preserve"> = "+00:00";</w:t>
       </w:r>
     </w:p>
     <w:p>
@@ -18451,7 +19169,35 @@
         <w:rPr>
           <w:lang w:val="en-GB"/>
         </w:rPr>
-        <w:t>-- Base de datos: `bancolibros`</w:t>
+        <w:t xml:space="preserve">-- Base de </w:t>
+      </w:r>
+      <w:proofErr w:type="spellStart"/>
+      <w:r>
+        <w:rPr>
+          <w:lang w:val="en-GB"/>
+        </w:rPr>
+        <w:t>datos</w:t>
+      </w:r>
+      <w:proofErr w:type="spellEnd"/>
+      <w:r>
+        <w:rPr>
+          <w:lang w:val="en-GB"/>
+        </w:rPr>
+        <w:t>: `</w:t>
+      </w:r>
+      <w:proofErr w:type="spellStart"/>
+      <w:r>
+        <w:rPr>
+          <w:lang w:val="en-GB"/>
+        </w:rPr>
+        <w:t>bancolibros</w:t>
+      </w:r>
+      <w:proofErr w:type="spellEnd"/>
+      <w:r>
+        <w:rPr>
+          <w:lang w:val="en-GB"/>
+        </w:rPr>
+        <w:t>`</w:t>
       </w:r>
     </w:p>
     <w:p>
@@ -18503,7 +19249,63 @@
         <w:rPr>
           <w:lang w:val="en-GB"/>
         </w:rPr>
-        <w:t>-- Estructura de tabla para la tabla `alumnos`</w:t>
+        <w:t xml:space="preserve">-- </w:t>
+      </w:r>
+      <w:proofErr w:type="spellStart"/>
+      <w:r>
+        <w:rPr>
+          <w:lang w:val="en-GB"/>
+        </w:rPr>
+        <w:t>Estructura</w:t>
+      </w:r>
+      <w:proofErr w:type="spellEnd"/>
+      <w:r>
+        <w:rPr>
+          <w:lang w:val="en-GB"/>
+        </w:rPr>
+        <w:t xml:space="preserve"> de </w:t>
+      </w:r>
+      <w:proofErr w:type="spellStart"/>
+      <w:r>
+        <w:rPr>
+          <w:lang w:val="en-GB"/>
+        </w:rPr>
+        <w:t>tabla</w:t>
+      </w:r>
+      <w:proofErr w:type="spellEnd"/>
+      <w:r>
+        <w:rPr>
+          <w:lang w:val="en-GB"/>
+        </w:rPr>
+        <w:t xml:space="preserve"> para la </w:t>
+      </w:r>
+      <w:proofErr w:type="spellStart"/>
+      <w:r>
+        <w:rPr>
+          <w:lang w:val="en-GB"/>
+        </w:rPr>
+        <w:t>tabla</w:t>
+      </w:r>
+      <w:proofErr w:type="spellEnd"/>
+      <w:r>
+        <w:rPr>
+          <w:lang w:val="en-GB"/>
+        </w:rPr>
+        <w:t xml:space="preserve"> `</w:t>
+      </w:r>
+      <w:proofErr w:type="spellStart"/>
+      <w:r>
+        <w:rPr>
+          <w:lang w:val="en-GB"/>
+        </w:rPr>
+        <w:t>alumnos</w:t>
+      </w:r>
+      <w:proofErr w:type="spellEnd"/>
+      <w:r>
+        <w:rPr>
+          <w:lang w:val="en-GB"/>
+        </w:rPr>
+        <w:t>`</w:t>
       </w:r>
     </w:p>
     <w:p>
@@ -18529,7 +19331,21 @@
         <w:rPr>
           <w:lang w:val="en-GB"/>
         </w:rPr>
-        <w:t>CREATE TABLE `alumnos` (</w:t>
+        <w:t>CREATE TABLE `</w:t>
+      </w:r>
+      <w:proofErr w:type="spellStart"/>
+      <w:r>
+        <w:rPr>
+          <w:lang w:val="en-GB"/>
+        </w:rPr>
+        <w:t>alumnos</w:t>
+      </w:r>
+      <w:proofErr w:type="spellEnd"/>
+      <w:r>
+        <w:rPr>
+          <w:lang w:val="en-GB"/>
+        </w:rPr>
+        <w:t>` (</w:t>
       </w:r>
     </w:p>
     <w:p>
@@ -18542,7 +19358,35 @@
         <w:rPr>
           <w:lang w:val="en-GB"/>
         </w:rPr>
-        <w:t xml:space="preserve">  `nie` varchar(10) NOT NULL,</w:t>
+        <w:t xml:space="preserve">  `</w:t>
+      </w:r>
+      <w:proofErr w:type="spellStart"/>
+      <w:r>
+        <w:rPr>
+          <w:lang w:val="en-GB"/>
+        </w:rPr>
+        <w:t>nie</w:t>
+      </w:r>
+      <w:proofErr w:type="spellEnd"/>
+      <w:r>
+        <w:rPr>
+          <w:lang w:val="en-GB"/>
+        </w:rPr>
+        <w:t xml:space="preserve">` </w:t>
+      </w:r>
+      <w:proofErr w:type="gramStart"/>
+      <w:r>
+        <w:rPr>
+          <w:lang w:val="en-GB"/>
+        </w:rPr>
+        <w:t>varchar(</w:t>
+      </w:r>
+      <w:proofErr w:type="gramEnd"/>
+      <w:r>
+        <w:rPr>
+          <w:lang w:val="en-GB"/>
+        </w:rPr>
+        <w:t>10) NOT NULL,</w:t>
       </w:r>
     </w:p>
     <w:p>
@@ -18555,7 +19399,35 @@
         <w:rPr>
           <w:lang w:val="en-GB"/>
         </w:rPr>
-        <w:t xml:space="preserve">  `nombre` varchar(255) NOT NULL,</w:t>
+        <w:t xml:space="preserve">  `</w:t>
+      </w:r>
+      <w:proofErr w:type="spellStart"/>
+      <w:r>
+        <w:rPr>
+          <w:lang w:val="en-GB"/>
+        </w:rPr>
+        <w:t>nombre</w:t>
+      </w:r>
+      <w:proofErr w:type="spellEnd"/>
+      <w:r>
+        <w:rPr>
+          <w:lang w:val="en-GB"/>
+        </w:rPr>
+        <w:t xml:space="preserve">` </w:t>
+      </w:r>
+      <w:proofErr w:type="gramStart"/>
+      <w:r>
+        <w:rPr>
+          <w:lang w:val="en-GB"/>
+        </w:rPr>
+        <w:t>varchar(</w:t>
+      </w:r>
+      <w:proofErr w:type="gramEnd"/>
+      <w:r>
+        <w:rPr>
+          <w:lang w:val="en-GB"/>
+        </w:rPr>
+        <w:t>255) NOT NULL,</w:t>
       </w:r>
     </w:p>
     <w:p>
@@ -18568,7 +19440,35 @@
         <w:rPr>
           <w:lang w:val="en-GB"/>
         </w:rPr>
-        <w:t xml:space="preserve">  `apellidos` varchar(255) NOT NULL,</w:t>
+        <w:t xml:space="preserve">  `</w:t>
+      </w:r>
+      <w:proofErr w:type="spellStart"/>
+      <w:r>
+        <w:rPr>
+          <w:lang w:val="en-GB"/>
+        </w:rPr>
+        <w:t>apellidos</w:t>
+      </w:r>
+      <w:proofErr w:type="spellEnd"/>
+      <w:r>
+        <w:rPr>
+          <w:lang w:val="en-GB"/>
+        </w:rPr>
+        <w:t xml:space="preserve">` </w:t>
+      </w:r>
+      <w:proofErr w:type="gramStart"/>
+      <w:r>
+        <w:rPr>
+          <w:lang w:val="en-GB"/>
+        </w:rPr>
+        <w:t>varchar(</w:t>
+      </w:r>
+      <w:proofErr w:type="gramEnd"/>
+      <w:r>
+        <w:rPr>
+          <w:lang w:val="en-GB"/>
+        </w:rPr>
+        <w:t>255) NOT NULL,</w:t>
       </w:r>
     </w:p>
     <w:p>
@@ -18581,7 +19481,63 @@
         <w:rPr>
           <w:lang w:val="en-GB"/>
         </w:rPr>
-        <w:t xml:space="preserve">  `tramo` varchar(2) NOT NULL DEFAULT '0' COMMENT '0 nada, I tramo I y II Tramo 2',</w:t>
+        <w:t xml:space="preserve">  `</w:t>
+      </w:r>
+      <w:proofErr w:type="spellStart"/>
+      <w:r>
+        <w:rPr>
+          <w:lang w:val="en-GB"/>
+        </w:rPr>
+        <w:t>tramo</w:t>
+      </w:r>
+      <w:proofErr w:type="spellEnd"/>
+      <w:r>
+        <w:rPr>
+          <w:lang w:val="en-GB"/>
+        </w:rPr>
+        <w:t xml:space="preserve">` </w:t>
+      </w:r>
+      <w:proofErr w:type="gramStart"/>
+      <w:r>
+        <w:rPr>
+          <w:lang w:val="en-GB"/>
+        </w:rPr>
+        <w:t>varchar(</w:t>
+      </w:r>
+      <w:proofErr w:type="gramEnd"/>
+      <w:r>
+        <w:rPr>
+          <w:lang w:val="en-GB"/>
+        </w:rPr>
+        <w:t xml:space="preserve">2) NOT NULL DEFAULT '0' COMMENT '0 nada, I </w:t>
+      </w:r>
+      <w:proofErr w:type="spellStart"/>
+      <w:r>
+        <w:rPr>
+          <w:lang w:val="en-GB"/>
+        </w:rPr>
+        <w:t>tramo</w:t>
+      </w:r>
+      <w:proofErr w:type="spellEnd"/>
+      <w:r>
+        <w:rPr>
+          <w:lang w:val="en-GB"/>
+        </w:rPr>
+        <w:t xml:space="preserve"> I y II </w:t>
+      </w:r>
+      <w:proofErr w:type="spellStart"/>
+      <w:r>
+        <w:rPr>
+          <w:lang w:val="en-GB"/>
+        </w:rPr>
+        <w:t>Tramo</w:t>
+      </w:r>
+      <w:proofErr w:type="spellEnd"/>
+      <w:r>
+        <w:rPr>
+          <w:lang w:val="en-GB"/>
+        </w:rPr>
+        <w:t xml:space="preserve"> 2',</w:t>
       </w:r>
     </w:p>
     <w:p>
@@ -18594,7 +19550,43 @@
         <w:rPr>
           <w:lang w:val="en-GB"/>
         </w:rPr>
-        <w:t xml:space="preserve">  `bilingue` tinyint(1) NOT NULL DEFAULT 1 COMMENT '0 True, 1 false'</w:t>
+        <w:t xml:space="preserve">  `</w:t>
+      </w:r>
+      <w:proofErr w:type="spellStart"/>
+      <w:r>
+        <w:rPr>
+          <w:lang w:val="en-GB"/>
+        </w:rPr>
+        <w:t>bilingue</w:t>
+      </w:r>
+      <w:proofErr w:type="spellEnd"/>
+      <w:r>
+        <w:rPr>
+          <w:lang w:val="en-GB"/>
+        </w:rPr>
+        <w:t xml:space="preserve">` </w:t>
+      </w:r>
+      <w:proofErr w:type="spellStart"/>
+      <w:proofErr w:type="gramStart"/>
+      <w:r>
+        <w:rPr>
+          <w:lang w:val="en-GB"/>
+        </w:rPr>
+        <w:t>tinyint</w:t>
+      </w:r>
+      <w:proofErr w:type="spellEnd"/>
+      <w:r>
+        <w:rPr>
+          <w:lang w:val="en-GB"/>
+        </w:rPr>
+        <w:t>(</w:t>
+      </w:r>
+      <w:proofErr w:type="gramEnd"/>
+      <w:r>
+        <w:rPr>
+          <w:lang w:val="en-GB"/>
+        </w:rPr>
+        <w:t>1) NOT NULL DEFAULT 1 COMMENT '0 True, 1 false'</w:t>
       </w:r>
     </w:p>
     <w:p>
@@ -18607,7 +19599,21 @@
         <w:rPr>
           <w:lang w:val="en-GB"/>
         </w:rPr>
-        <w:t>) ENGINE=InnoDB DEFAULT CHARSET=utf8 COLLATE=utf8_spanish2_ci;</w:t>
+        <w:t>) ENGINE=</w:t>
+      </w:r>
+      <w:proofErr w:type="spellStart"/>
+      <w:r>
+        <w:rPr>
+          <w:lang w:val="en-GB"/>
+        </w:rPr>
+        <w:t>InnoDB</w:t>
+      </w:r>
+      <w:proofErr w:type="spellEnd"/>
+      <w:r>
+        <w:rPr>
+          <w:lang w:val="en-GB"/>
+        </w:rPr>
+        <w:t xml:space="preserve"> DEFAULT CHARSET=utf8 COLLATE=utf8_spanish2_ci;</w:t>
       </w:r>
     </w:p>
     <w:p>
@@ -18646,7 +19652,63 @@
         <w:rPr>
           <w:lang w:val="en-GB"/>
         </w:rPr>
-        <w:t>-- Estructura de tabla para la tabla `alumnoscrusoslibros`</w:t>
+        <w:t xml:space="preserve">-- </w:t>
+      </w:r>
+      <w:proofErr w:type="spellStart"/>
+      <w:r>
+        <w:rPr>
+          <w:lang w:val="en-GB"/>
+        </w:rPr>
+        <w:t>Estructura</w:t>
+      </w:r>
+      <w:proofErr w:type="spellEnd"/>
+      <w:r>
+        <w:rPr>
+          <w:lang w:val="en-GB"/>
+        </w:rPr>
+        <w:t xml:space="preserve"> de </w:t>
+      </w:r>
+      <w:proofErr w:type="spellStart"/>
+      <w:r>
+        <w:rPr>
+          <w:lang w:val="en-GB"/>
+        </w:rPr>
+        <w:t>tabla</w:t>
+      </w:r>
+      <w:proofErr w:type="spellEnd"/>
+      <w:r>
+        <w:rPr>
+          <w:lang w:val="en-GB"/>
+        </w:rPr>
+        <w:t xml:space="preserve"> para la </w:t>
+      </w:r>
+      <w:proofErr w:type="spellStart"/>
+      <w:r>
+        <w:rPr>
+          <w:lang w:val="en-GB"/>
+        </w:rPr>
+        <w:t>tabla</w:t>
+      </w:r>
+      <w:proofErr w:type="spellEnd"/>
+      <w:r>
+        <w:rPr>
+          <w:lang w:val="en-GB"/>
+        </w:rPr>
+        <w:t xml:space="preserve"> `</w:t>
+      </w:r>
+      <w:proofErr w:type="spellStart"/>
+      <w:r>
+        <w:rPr>
+          <w:lang w:val="en-GB"/>
+        </w:rPr>
+        <w:t>alumnoscrusoslibros</w:t>
+      </w:r>
+      <w:proofErr w:type="spellEnd"/>
+      <w:r>
+        <w:rPr>
+          <w:lang w:val="en-GB"/>
+        </w:rPr>
+        <w:t>`</w:t>
       </w:r>
     </w:p>
     <w:p>
@@ -18672,7 +19734,21 @@
         <w:rPr>
           <w:lang w:val="en-GB"/>
         </w:rPr>
-        <w:t>CREATE TABLE `alumnoscrusoslibros` (</w:t>
+        <w:t>CREATE TABLE `</w:t>
+      </w:r>
+      <w:proofErr w:type="spellStart"/>
+      <w:r>
+        <w:rPr>
+          <w:lang w:val="en-GB"/>
+        </w:rPr>
+        <w:t>alumnoscrusoslibros</w:t>
+      </w:r>
+      <w:proofErr w:type="spellEnd"/>
+      <w:r>
+        <w:rPr>
+          <w:lang w:val="en-GB"/>
+        </w:rPr>
+        <w:t>` (</w:t>
       </w:r>
     </w:p>
     <w:p>
@@ -18685,7 +19761,35 @@
         <w:rPr>
           <w:lang w:val="en-GB"/>
         </w:rPr>
-        <w:t xml:space="preserve">  `nie` varchar(10) NOT NULL,</w:t>
+        <w:t xml:space="preserve">  `</w:t>
+      </w:r>
+      <w:proofErr w:type="spellStart"/>
+      <w:r>
+        <w:rPr>
+          <w:lang w:val="en-GB"/>
+        </w:rPr>
+        <w:t>nie</w:t>
+      </w:r>
+      <w:proofErr w:type="spellEnd"/>
+      <w:r>
+        <w:rPr>
+          <w:lang w:val="en-GB"/>
+        </w:rPr>
+        <w:t xml:space="preserve">` </w:t>
+      </w:r>
+      <w:proofErr w:type="gramStart"/>
+      <w:r>
+        <w:rPr>
+          <w:lang w:val="en-GB"/>
+        </w:rPr>
+        <w:t>varchar(</w:t>
+      </w:r>
+      <w:proofErr w:type="gramEnd"/>
+      <w:r>
+        <w:rPr>
+          <w:lang w:val="en-GB"/>
+        </w:rPr>
+        <w:t>10) NOT NULL,</w:t>
       </w:r>
     </w:p>
     <w:p>
@@ -18698,7 +19802,35 @@
         <w:rPr>
           <w:lang w:val="en-GB"/>
         </w:rPr>
-        <w:t xml:space="preserve">  `curso` varchar(255) NOT NULL,</w:t>
+        <w:t xml:space="preserve">  `</w:t>
+      </w:r>
+      <w:proofErr w:type="spellStart"/>
+      <w:r>
+        <w:rPr>
+          <w:lang w:val="en-GB"/>
+        </w:rPr>
+        <w:t>curso</w:t>
+      </w:r>
+      <w:proofErr w:type="spellEnd"/>
+      <w:r>
+        <w:rPr>
+          <w:lang w:val="en-GB"/>
+        </w:rPr>
+        <w:t xml:space="preserve">` </w:t>
+      </w:r>
+      <w:proofErr w:type="gramStart"/>
+      <w:r>
+        <w:rPr>
+          <w:lang w:val="en-GB"/>
+        </w:rPr>
+        <w:t>varchar(</w:t>
+      </w:r>
+      <w:proofErr w:type="gramEnd"/>
+      <w:r>
+        <w:rPr>
+          <w:lang w:val="en-GB"/>
+        </w:rPr>
+        <w:t>255) NOT NULL,</w:t>
       </w:r>
     </w:p>
     <w:p>
@@ -18711,7 +19843,35 @@
         <w:rPr>
           <w:lang w:val="en-GB"/>
         </w:rPr>
-        <w:t xml:space="preserve">  `isbn` varchar(20) NOT NULL,</w:t>
+        <w:t xml:space="preserve">  `</w:t>
+      </w:r>
+      <w:proofErr w:type="spellStart"/>
+      <w:r>
+        <w:rPr>
+          <w:lang w:val="en-GB"/>
+        </w:rPr>
+        <w:t>isbn</w:t>
+      </w:r>
+      <w:proofErr w:type="spellEnd"/>
+      <w:r>
+        <w:rPr>
+          <w:lang w:val="en-GB"/>
+        </w:rPr>
+        <w:t xml:space="preserve">` </w:t>
+      </w:r>
+      <w:proofErr w:type="gramStart"/>
+      <w:r>
+        <w:rPr>
+          <w:lang w:val="en-GB"/>
+        </w:rPr>
+        <w:t>varchar(</w:t>
+      </w:r>
+      <w:proofErr w:type="gramEnd"/>
+      <w:r>
+        <w:rPr>
+          <w:lang w:val="en-GB"/>
+        </w:rPr>
+        <w:t>20) NOT NULL,</w:t>
       </w:r>
     </w:p>
     <w:p>
@@ -18724,7 +19884,21 @@
         <w:rPr>
           <w:lang w:val="en-GB"/>
         </w:rPr>
-        <w:t xml:space="preserve">  `fecha_entrega` date NOT NULL,</w:t>
+        <w:t xml:space="preserve">  `</w:t>
+      </w:r>
+      <w:proofErr w:type="spellStart"/>
+      <w:r>
+        <w:rPr>
+          <w:lang w:val="en-GB"/>
+        </w:rPr>
+        <w:t>fecha_entrega</w:t>
+      </w:r>
+      <w:proofErr w:type="spellEnd"/>
+      <w:r>
+        <w:rPr>
+          <w:lang w:val="en-GB"/>
+        </w:rPr>
+        <w:t>` date NOT NULL,</w:t>
       </w:r>
     </w:p>
     <w:p>
@@ -18738,7 +19912,21 @@
           <w:lang w:val="en-GB"/>
         </w:rPr>
         <w:lastRenderedPageBreak/>
-        <w:t xml:space="preserve">  `fecha_devolucion` date NOT NULL,</w:t>
+        <w:t xml:space="preserve">  `</w:t>
+      </w:r>
+      <w:proofErr w:type="spellStart"/>
+      <w:r>
+        <w:rPr>
+          <w:lang w:val="en-GB"/>
+        </w:rPr>
+        <w:t>fecha_devolucion</w:t>
+      </w:r>
+      <w:proofErr w:type="spellEnd"/>
+      <w:r>
+        <w:rPr>
+          <w:lang w:val="en-GB"/>
+        </w:rPr>
+        <w:t>` date NOT NULL,</w:t>
       </w:r>
     </w:p>
     <w:p>
@@ -18751,7 +19939,63 @@
         <w:rPr>
           <w:lang w:val="en-GB"/>
         </w:rPr>
-        <w:t xml:space="preserve">  `estado` varchar(1) NOT NULL DEFAULT 'P' COMMENT 'P: Prestado, D:Devuelto'</w:t>
+        <w:t xml:space="preserve">  `</w:t>
+      </w:r>
+      <w:proofErr w:type="spellStart"/>
+      <w:r>
+        <w:rPr>
+          <w:lang w:val="en-GB"/>
+        </w:rPr>
+        <w:t>estado</w:t>
+      </w:r>
+      <w:proofErr w:type="spellEnd"/>
+      <w:r>
+        <w:rPr>
+          <w:lang w:val="en-GB"/>
+        </w:rPr>
+        <w:t xml:space="preserve">` </w:t>
+      </w:r>
+      <w:proofErr w:type="gramStart"/>
+      <w:r>
+        <w:rPr>
+          <w:lang w:val="en-GB"/>
+        </w:rPr>
+        <w:t>varchar(</w:t>
+      </w:r>
+      <w:proofErr w:type="gramEnd"/>
+      <w:r>
+        <w:rPr>
+          <w:lang w:val="en-GB"/>
+        </w:rPr>
+        <w:t xml:space="preserve">1) NOT NULL DEFAULT 'P' COMMENT 'P: </w:t>
+      </w:r>
+      <w:proofErr w:type="spellStart"/>
+      <w:r>
+        <w:rPr>
+          <w:lang w:val="en-GB"/>
+        </w:rPr>
+        <w:t>Prestado</w:t>
+      </w:r>
+      <w:proofErr w:type="spellEnd"/>
+      <w:r>
+        <w:rPr>
+          <w:lang w:val="en-GB"/>
+        </w:rPr>
+        <w:t xml:space="preserve">, </w:t>
+      </w:r>
+      <w:proofErr w:type="gramStart"/>
+      <w:r>
+        <w:rPr>
+          <w:lang w:val="en-GB"/>
+        </w:rPr>
+        <w:t>D:Devuelto</w:t>
+      </w:r>
+      <w:proofErr w:type="gramEnd"/>
+      <w:r>
+        <w:rPr>
+          <w:lang w:val="en-GB"/>
+        </w:rPr>
+        <w:t>'</w:t>
       </w:r>
     </w:p>
     <w:p>
@@ -18764,7 +20008,21 @@
         <w:rPr>
           <w:lang w:val="en-GB"/>
         </w:rPr>
-        <w:t>) ENGINE=InnoDB DEFAULT CHARSET=utf8 COLLATE=utf8_spanish2_ci;</w:t>
+        <w:t>) ENGINE=</w:t>
+      </w:r>
+      <w:proofErr w:type="spellStart"/>
+      <w:r>
+        <w:rPr>
+          <w:lang w:val="en-GB"/>
+        </w:rPr>
+        <w:t>InnoDB</w:t>
+      </w:r>
+      <w:proofErr w:type="spellEnd"/>
+      <w:r>
+        <w:rPr>
+          <w:lang w:val="en-GB"/>
+        </w:rPr>
+        <w:t xml:space="preserve"> DEFAULT CHARSET=utf8 COLLATE=utf8_spanish2_ci;</w:t>
       </w:r>
     </w:p>
     <w:p>
@@ -18803,7 +20061,63 @@
         <w:rPr>
           <w:lang w:val="en-GB"/>
         </w:rPr>
-        <w:t>-- Estructura de tabla para la tabla `cursos`</w:t>
+        <w:t xml:space="preserve">-- </w:t>
+      </w:r>
+      <w:proofErr w:type="spellStart"/>
+      <w:r>
+        <w:rPr>
+          <w:lang w:val="en-GB"/>
+        </w:rPr>
+        <w:t>Estructura</w:t>
+      </w:r>
+      <w:proofErr w:type="spellEnd"/>
+      <w:r>
+        <w:rPr>
+          <w:lang w:val="en-GB"/>
+        </w:rPr>
+        <w:t xml:space="preserve"> de </w:t>
+      </w:r>
+      <w:proofErr w:type="spellStart"/>
+      <w:r>
+        <w:rPr>
+          <w:lang w:val="en-GB"/>
+        </w:rPr>
+        <w:t>tabla</w:t>
+      </w:r>
+      <w:proofErr w:type="spellEnd"/>
+      <w:r>
+        <w:rPr>
+          <w:lang w:val="en-GB"/>
+        </w:rPr>
+        <w:t xml:space="preserve"> para la </w:t>
+      </w:r>
+      <w:proofErr w:type="spellStart"/>
+      <w:r>
+        <w:rPr>
+          <w:lang w:val="en-GB"/>
+        </w:rPr>
+        <w:t>tabla</w:t>
+      </w:r>
+      <w:proofErr w:type="spellEnd"/>
+      <w:r>
+        <w:rPr>
+          <w:lang w:val="en-GB"/>
+        </w:rPr>
+        <w:t xml:space="preserve"> `</w:t>
+      </w:r>
+      <w:proofErr w:type="spellStart"/>
+      <w:r>
+        <w:rPr>
+          <w:lang w:val="en-GB"/>
+        </w:rPr>
+        <w:t>cursos</w:t>
+      </w:r>
+      <w:proofErr w:type="spellEnd"/>
+      <w:r>
+        <w:rPr>
+          <w:lang w:val="en-GB"/>
+        </w:rPr>
+        <w:t>`</w:t>
       </w:r>
     </w:p>
     <w:p>
@@ -18829,7 +20143,21 @@
         <w:rPr>
           <w:lang w:val="en-GB"/>
         </w:rPr>
-        <w:t>CREATE TABLE `cursos` (</w:t>
+        <w:t>CREATE TABLE `</w:t>
+      </w:r>
+      <w:proofErr w:type="spellStart"/>
+      <w:r>
+        <w:rPr>
+          <w:lang w:val="en-GB"/>
+        </w:rPr>
+        <w:t>cursos</w:t>
+      </w:r>
+      <w:proofErr w:type="spellEnd"/>
+      <w:r>
+        <w:rPr>
+          <w:lang w:val="en-GB"/>
+        </w:rPr>
+        <w:t>` (</w:t>
       </w:r>
     </w:p>
     <w:p>
@@ -18842,7 +20170,35 @@
         <w:rPr>
           <w:lang w:val="en-GB"/>
         </w:rPr>
-        <w:t xml:space="preserve">  `curso` varchar(20) NOT NULL,</w:t>
+        <w:t xml:space="preserve">  `</w:t>
+      </w:r>
+      <w:proofErr w:type="spellStart"/>
+      <w:r>
+        <w:rPr>
+          <w:lang w:val="en-GB"/>
+        </w:rPr>
+        <w:t>curso</w:t>
+      </w:r>
+      <w:proofErr w:type="spellEnd"/>
+      <w:r>
+        <w:rPr>
+          <w:lang w:val="en-GB"/>
+        </w:rPr>
+        <w:t xml:space="preserve">` </w:t>
+      </w:r>
+      <w:proofErr w:type="gramStart"/>
+      <w:r>
+        <w:rPr>
+          <w:lang w:val="en-GB"/>
+        </w:rPr>
+        <w:t>varchar(</w:t>
+      </w:r>
+      <w:proofErr w:type="gramEnd"/>
+      <w:r>
+        <w:rPr>
+          <w:lang w:val="en-GB"/>
+        </w:rPr>
+        <w:t>20) NOT NULL,</w:t>
       </w:r>
     </w:p>
     <w:p>
@@ -18855,7 +20211,35 @@
         <w:rPr>
           <w:lang w:val="en-GB"/>
         </w:rPr>
-        <w:t xml:space="preserve">  `nivel` varchar(20) NOT NULL</w:t>
+        <w:t xml:space="preserve">  `</w:t>
+      </w:r>
+      <w:proofErr w:type="spellStart"/>
+      <w:r>
+        <w:rPr>
+          <w:lang w:val="en-GB"/>
+        </w:rPr>
+        <w:t>nivel</w:t>
+      </w:r>
+      <w:proofErr w:type="spellEnd"/>
+      <w:r>
+        <w:rPr>
+          <w:lang w:val="en-GB"/>
+        </w:rPr>
+        <w:t xml:space="preserve">` </w:t>
+      </w:r>
+      <w:proofErr w:type="gramStart"/>
+      <w:r>
+        <w:rPr>
+          <w:lang w:val="en-GB"/>
+        </w:rPr>
+        <w:t>varchar(</w:t>
+      </w:r>
+      <w:proofErr w:type="gramEnd"/>
+      <w:r>
+        <w:rPr>
+          <w:lang w:val="en-GB"/>
+        </w:rPr>
+        <w:t>20) NOT NULL</w:t>
       </w:r>
     </w:p>
     <w:p>
@@ -18868,7 +20252,21 @@
         <w:rPr>
           <w:lang w:val="en-GB"/>
         </w:rPr>
-        <w:t>) ENGINE=InnoDB DEFAULT CHARSET=utf8 COLLATE=utf8_spanish2_ci;</w:t>
+        <w:t>) ENGINE=</w:t>
+      </w:r>
+      <w:proofErr w:type="spellStart"/>
+      <w:r>
+        <w:rPr>
+          <w:lang w:val="en-GB"/>
+        </w:rPr>
+        <w:t>InnoDB</w:t>
+      </w:r>
+      <w:proofErr w:type="spellEnd"/>
+      <w:r>
+        <w:rPr>
+          <w:lang w:val="en-GB"/>
+        </w:rPr>
+        <w:t xml:space="preserve"> DEFAULT CHARSET=utf8 COLLATE=utf8_spanish2_ci;</w:t>
       </w:r>
     </w:p>
     <w:p>
@@ -18907,7 +20305,63 @@
         <w:rPr>
           <w:lang w:val="en-GB"/>
         </w:rPr>
-        <w:t>-- Estructura de tabla para la tabla `libros`</w:t>
+        <w:t xml:space="preserve">-- </w:t>
+      </w:r>
+      <w:proofErr w:type="spellStart"/>
+      <w:r>
+        <w:rPr>
+          <w:lang w:val="en-GB"/>
+        </w:rPr>
+        <w:t>Estructura</w:t>
+      </w:r>
+      <w:proofErr w:type="spellEnd"/>
+      <w:r>
+        <w:rPr>
+          <w:lang w:val="en-GB"/>
+        </w:rPr>
+        <w:t xml:space="preserve"> de </w:t>
+      </w:r>
+      <w:proofErr w:type="spellStart"/>
+      <w:r>
+        <w:rPr>
+          <w:lang w:val="en-GB"/>
+        </w:rPr>
+        <w:t>tabla</w:t>
+      </w:r>
+      <w:proofErr w:type="spellEnd"/>
+      <w:r>
+        <w:rPr>
+          <w:lang w:val="en-GB"/>
+        </w:rPr>
+        <w:t xml:space="preserve"> para la </w:t>
+      </w:r>
+      <w:proofErr w:type="spellStart"/>
+      <w:r>
+        <w:rPr>
+          <w:lang w:val="en-GB"/>
+        </w:rPr>
+        <w:t>tabla</w:t>
+      </w:r>
+      <w:proofErr w:type="spellEnd"/>
+      <w:r>
+        <w:rPr>
+          <w:lang w:val="en-GB"/>
+        </w:rPr>
+        <w:t xml:space="preserve"> `</w:t>
+      </w:r>
+      <w:proofErr w:type="spellStart"/>
+      <w:r>
+        <w:rPr>
+          <w:lang w:val="en-GB"/>
+        </w:rPr>
+        <w:t>libros</w:t>
+      </w:r>
+      <w:proofErr w:type="spellEnd"/>
+      <w:r>
+        <w:rPr>
+          <w:lang w:val="en-GB"/>
+        </w:rPr>
+        <w:t>`</w:t>
       </w:r>
     </w:p>
     <w:p>
@@ -18933,7 +20387,21 @@
         <w:rPr>
           <w:lang w:val="en-GB"/>
         </w:rPr>
-        <w:t>CREATE TABLE `libros` (</w:t>
+        <w:t>CREATE TABLE `</w:t>
+      </w:r>
+      <w:proofErr w:type="spellStart"/>
+      <w:r>
+        <w:rPr>
+          <w:lang w:val="en-GB"/>
+        </w:rPr>
+        <w:t>libros</w:t>
+      </w:r>
+      <w:proofErr w:type="spellEnd"/>
+      <w:r>
+        <w:rPr>
+          <w:lang w:val="en-GB"/>
+        </w:rPr>
+        <w:t>` (</w:t>
       </w:r>
     </w:p>
     <w:p>
@@ -18946,7 +20414,35 @@
         <w:rPr>
           <w:lang w:val="en-GB"/>
         </w:rPr>
-        <w:t xml:space="preserve">  `isbn` varchar(20) NOT NULL,</w:t>
+        <w:t xml:space="preserve">  `</w:t>
+      </w:r>
+      <w:proofErr w:type="spellStart"/>
+      <w:r>
+        <w:rPr>
+          <w:lang w:val="en-GB"/>
+        </w:rPr>
+        <w:t>isbn</w:t>
+      </w:r>
+      <w:proofErr w:type="spellEnd"/>
+      <w:r>
+        <w:rPr>
+          <w:lang w:val="en-GB"/>
+        </w:rPr>
+        <w:t xml:space="preserve">` </w:t>
+      </w:r>
+      <w:proofErr w:type="gramStart"/>
+      <w:r>
+        <w:rPr>
+          <w:lang w:val="en-GB"/>
+        </w:rPr>
+        <w:t>varchar(</w:t>
+      </w:r>
+      <w:proofErr w:type="gramEnd"/>
+      <w:r>
+        <w:rPr>
+          <w:lang w:val="en-GB"/>
+        </w:rPr>
+        <w:t>20) NOT NULL,</w:t>
       </w:r>
     </w:p>
     <w:p>
@@ -18959,7 +20455,35 @@
         <w:rPr>
           <w:lang w:val="en-GB"/>
         </w:rPr>
-        <w:t xml:space="preserve">  `titulo` varchar(255) NOT NULL,</w:t>
+        <w:t xml:space="preserve">  `</w:t>
+      </w:r>
+      <w:proofErr w:type="spellStart"/>
+      <w:r>
+        <w:rPr>
+          <w:lang w:val="en-GB"/>
+        </w:rPr>
+        <w:t>titulo</w:t>
+      </w:r>
+      <w:proofErr w:type="spellEnd"/>
+      <w:r>
+        <w:rPr>
+          <w:lang w:val="en-GB"/>
+        </w:rPr>
+        <w:t xml:space="preserve">` </w:t>
+      </w:r>
+      <w:proofErr w:type="gramStart"/>
+      <w:r>
+        <w:rPr>
+          <w:lang w:val="en-GB"/>
+        </w:rPr>
+        <w:t>varchar(</w:t>
+      </w:r>
+      <w:proofErr w:type="gramEnd"/>
+      <w:r>
+        <w:rPr>
+          <w:lang w:val="en-GB"/>
+        </w:rPr>
+        <w:t>255) NOT NULL,</w:t>
       </w:r>
     </w:p>
     <w:p>
@@ -18972,7 +20496,35 @@
         <w:rPr>
           <w:lang w:val="en-GB"/>
         </w:rPr>
-        <w:t xml:space="preserve">  `autor` varchar(255) NOT NULL,</w:t>
+        <w:t xml:space="preserve">  `</w:t>
+      </w:r>
+      <w:proofErr w:type="spellStart"/>
+      <w:r>
+        <w:rPr>
+          <w:lang w:val="en-GB"/>
+        </w:rPr>
+        <w:t>autor</w:t>
+      </w:r>
+      <w:proofErr w:type="spellEnd"/>
+      <w:r>
+        <w:rPr>
+          <w:lang w:val="en-GB"/>
+        </w:rPr>
+        <w:t xml:space="preserve">` </w:t>
+      </w:r>
+      <w:proofErr w:type="gramStart"/>
+      <w:r>
+        <w:rPr>
+          <w:lang w:val="en-GB"/>
+        </w:rPr>
+        <w:t>varchar(</w:t>
+      </w:r>
+      <w:proofErr w:type="gramEnd"/>
+      <w:r>
+        <w:rPr>
+          <w:lang w:val="en-GB"/>
+        </w:rPr>
+        <w:t>255) NOT NULL,</w:t>
       </w:r>
     </w:p>
     <w:p>
@@ -18985,7 +20537,35 @@
         <w:rPr>
           <w:lang w:val="en-GB"/>
         </w:rPr>
-        <w:t xml:space="preserve">  `numero_ejemplares` int(5) NOT NULL,</w:t>
+        <w:t xml:space="preserve">  `</w:t>
+      </w:r>
+      <w:proofErr w:type="spellStart"/>
+      <w:r>
+        <w:rPr>
+          <w:lang w:val="en-GB"/>
+        </w:rPr>
+        <w:t>numero_ejemplares</w:t>
+      </w:r>
+      <w:proofErr w:type="spellEnd"/>
+      <w:r>
+        <w:rPr>
+          <w:lang w:val="en-GB"/>
+        </w:rPr>
+        <w:t xml:space="preserve">` </w:t>
+      </w:r>
+      <w:proofErr w:type="gramStart"/>
+      <w:r>
+        <w:rPr>
+          <w:lang w:val="en-GB"/>
+        </w:rPr>
+        <w:t>int(</w:t>
+      </w:r>
+      <w:proofErr w:type="gramEnd"/>
+      <w:r>
+        <w:rPr>
+          <w:lang w:val="en-GB"/>
+        </w:rPr>
+        <w:t>5) NOT NULL,</w:t>
       </w:r>
     </w:p>
     <w:p>
@@ -18998,7 +20578,35 @@
         <w:rPr>
           <w:lang w:val="en-GB"/>
         </w:rPr>
-        <w:t xml:space="preserve">  `id_materia` int(11) NOT NULL,</w:t>
+        <w:t xml:space="preserve">  `</w:t>
+      </w:r>
+      <w:proofErr w:type="spellStart"/>
+      <w:r>
+        <w:rPr>
+          <w:lang w:val="en-GB"/>
+        </w:rPr>
+        <w:t>id_materia</w:t>
+      </w:r>
+      <w:proofErr w:type="spellEnd"/>
+      <w:r>
+        <w:rPr>
+          <w:lang w:val="en-GB"/>
+        </w:rPr>
+        <w:t xml:space="preserve">` </w:t>
+      </w:r>
+      <w:proofErr w:type="gramStart"/>
+      <w:r>
+        <w:rPr>
+          <w:lang w:val="en-GB"/>
+        </w:rPr>
+        <w:t>int(</w:t>
+      </w:r>
+      <w:proofErr w:type="gramEnd"/>
+      <w:r>
+        <w:rPr>
+          <w:lang w:val="en-GB"/>
+        </w:rPr>
+        <w:t>11) NOT NULL,</w:t>
       </w:r>
     </w:p>
     <w:p>
@@ -19011,7 +20619,35 @@
         <w:rPr>
           <w:lang w:val="en-GB"/>
         </w:rPr>
-        <w:t xml:space="preserve">  `id_curso` varchar(20) NOT NULL</w:t>
+        <w:t xml:space="preserve">  `</w:t>
+      </w:r>
+      <w:proofErr w:type="spellStart"/>
+      <w:r>
+        <w:rPr>
+          <w:lang w:val="en-GB"/>
+        </w:rPr>
+        <w:t>id_curso</w:t>
+      </w:r>
+      <w:proofErr w:type="spellEnd"/>
+      <w:r>
+        <w:rPr>
+          <w:lang w:val="en-GB"/>
+        </w:rPr>
+        <w:t xml:space="preserve">` </w:t>
+      </w:r>
+      <w:proofErr w:type="gramStart"/>
+      <w:r>
+        <w:rPr>
+          <w:lang w:val="en-GB"/>
+        </w:rPr>
+        <w:t>varchar(</w:t>
+      </w:r>
+      <w:proofErr w:type="gramEnd"/>
+      <w:r>
+        <w:rPr>
+          <w:lang w:val="en-GB"/>
+        </w:rPr>
+        <w:t>20) NOT NULL</w:t>
       </w:r>
     </w:p>
     <w:p>
@@ -19024,7 +20660,21 @@
         <w:rPr>
           <w:lang w:val="en-GB"/>
         </w:rPr>
-        <w:t>) ENGINE=InnoDB DEFAULT CHARSET=utf8 COLLATE=utf8_spanish2_ci;</w:t>
+        <w:t>) ENGINE=</w:t>
+      </w:r>
+      <w:proofErr w:type="spellStart"/>
+      <w:r>
+        <w:rPr>
+          <w:lang w:val="en-GB"/>
+        </w:rPr>
+        <w:t>InnoDB</w:t>
+      </w:r>
+      <w:proofErr w:type="spellEnd"/>
+      <w:r>
+        <w:rPr>
+          <w:lang w:val="en-GB"/>
+        </w:rPr>
+        <w:t xml:space="preserve"> DEFAULT CHARSET=utf8 COLLATE=utf8_spanish2_ci;</w:t>
       </w:r>
     </w:p>
     <w:p>
@@ -19063,7 +20713,63 @@
         <w:rPr>
           <w:lang w:val="en-GB"/>
         </w:rPr>
-        <w:t>-- Estructura de tabla para la tabla `materias`</w:t>
+        <w:t xml:space="preserve">-- </w:t>
+      </w:r>
+      <w:proofErr w:type="spellStart"/>
+      <w:r>
+        <w:rPr>
+          <w:lang w:val="en-GB"/>
+        </w:rPr>
+        <w:t>Estructura</w:t>
+      </w:r>
+      <w:proofErr w:type="spellEnd"/>
+      <w:r>
+        <w:rPr>
+          <w:lang w:val="en-GB"/>
+        </w:rPr>
+        <w:t xml:space="preserve"> de </w:t>
+      </w:r>
+      <w:proofErr w:type="spellStart"/>
+      <w:r>
+        <w:rPr>
+          <w:lang w:val="en-GB"/>
+        </w:rPr>
+        <w:t>tabla</w:t>
+      </w:r>
+      <w:proofErr w:type="spellEnd"/>
+      <w:r>
+        <w:rPr>
+          <w:lang w:val="en-GB"/>
+        </w:rPr>
+        <w:t xml:space="preserve"> para la </w:t>
+      </w:r>
+      <w:proofErr w:type="spellStart"/>
+      <w:r>
+        <w:rPr>
+          <w:lang w:val="en-GB"/>
+        </w:rPr>
+        <w:t>tabla</w:t>
+      </w:r>
+      <w:proofErr w:type="spellEnd"/>
+      <w:r>
+        <w:rPr>
+          <w:lang w:val="en-GB"/>
+        </w:rPr>
+        <w:t xml:space="preserve"> `</w:t>
+      </w:r>
+      <w:proofErr w:type="spellStart"/>
+      <w:r>
+        <w:rPr>
+          <w:lang w:val="en-GB"/>
+        </w:rPr>
+        <w:t>materias</w:t>
+      </w:r>
+      <w:proofErr w:type="spellEnd"/>
+      <w:r>
+        <w:rPr>
+          <w:lang w:val="en-GB"/>
+        </w:rPr>
+        <w:t>`</w:t>
       </w:r>
     </w:p>
     <w:p>
@@ -19089,7 +20795,21 @@
         <w:rPr>
           <w:lang w:val="en-GB"/>
         </w:rPr>
-        <w:t>CREATE TABLE `materias` (</w:t>
+        <w:t>CREATE TABLE `</w:t>
+      </w:r>
+      <w:proofErr w:type="spellStart"/>
+      <w:r>
+        <w:rPr>
+          <w:lang w:val="en-GB"/>
+        </w:rPr>
+        <w:t>materias</w:t>
+      </w:r>
+      <w:proofErr w:type="spellEnd"/>
+      <w:r>
+        <w:rPr>
+          <w:lang w:val="en-GB"/>
+        </w:rPr>
+        <w:t>` (</w:t>
       </w:r>
     </w:p>
     <w:p>
@@ -19102,7 +20822,21 @@
         <w:rPr>
           <w:lang w:val="en-GB"/>
         </w:rPr>
-        <w:t xml:space="preserve">  `id` int(11) NOT NULL,</w:t>
+        <w:t xml:space="preserve">  `id` </w:t>
+      </w:r>
+      <w:proofErr w:type="gramStart"/>
+      <w:r>
+        <w:rPr>
+          <w:lang w:val="en-GB"/>
+        </w:rPr>
+        <w:t>int(</w:t>
+      </w:r>
+      <w:proofErr w:type="gramEnd"/>
+      <w:r>
+        <w:rPr>
+          <w:lang w:val="en-GB"/>
+        </w:rPr>
+        <w:t>11) NOT NULL,</w:t>
       </w:r>
     </w:p>
     <w:p>
@@ -19115,7 +20849,35 @@
         <w:rPr>
           <w:lang w:val="en-GB"/>
         </w:rPr>
-        <w:t xml:space="preserve">  `nombre` varchar(255) NOT NULL,</w:t>
+        <w:t xml:space="preserve">  `</w:t>
+      </w:r>
+      <w:proofErr w:type="spellStart"/>
+      <w:r>
+        <w:rPr>
+          <w:lang w:val="en-GB"/>
+        </w:rPr>
+        <w:t>nombre</w:t>
+      </w:r>
+      <w:proofErr w:type="spellEnd"/>
+      <w:r>
+        <w:rPr>
+          <w:lang w:val="en-GB"/>
+        </w:rPr>
+        <w:t xml:space="preserve">` </w:t>
+      </w:r>
+      <w:proofErr w:type="gramStart"/>
+      <w:r>
+        <w:rPr>
+          <w:lang w:val="en-GB"/>
+        </w:rPr>
+        <w:t>varchar(</w:t>
+      </w:r>
+      <w:proofErr w:type="gramEnd"/>
+      <w:r>
+        <w:rPr>
+          <w:lang w:val="en-GB"/>
+        </w:rPr>
+        <w:t>255) NOT NULL,</w:t>
       </w:r>
     </w:p>
     <w:p>
@@ -19128,7 +20890,35 @@
         <w:rPr>
           <w:lang w:val="en-GB"/>
         </w:rPr>
-        <w:t xml:space="preserve">  `departamento` varchar(255) NOT NULL</w:t>
+        <w:t xml:space="preserve">  `</w:t>
+      </w:r>
+      <w:proofErr w:type="spellStart"/>
+      <w:r>
+        <w:rPr>
+          <w:lang w:val="en-GB"/>
+        </w:rPr>
+        <w:t>departamento</w:t>
+      </w:r>
+      <w:proofErr w:type="spellEnd"/>
+      <w:r>
+        <w:rPr>
+          <w:lang w:val="en-GB"/>
+        </w:rPr>
+        <w:t xml:space="preserve">` </w:t>
+      </w:r>
+      <w:proofErr w:type="gramStart"/>
+      <w:r>
+        <w:rPr>
+          <w:lang w:val="en-GB"/>
+        </w:rPr>
+        <w:t>varchar(</w:t>
+      </w:r>
+      <w:proofErr w:type="gramEnd"/>
+      <w:r>
+        <w:rPr>
+          <w:lang w:val="en-GB"/>
+        </w:rPr>
+        <w:t>255) NOT NULL</w:t>
       </w:r>
     </w:p>
     <w:p>
@@ -19141,7 +20931,21 @@
         <w:rPr>
           <w:lang w:val="en-GB"/>
         </w:rPr>
-        <w:t>) ENGINE=InnoDB DEFAULT CHARSET=utf8 COLLATE=utf8_spanish2_ci;</w:t>
+        <w:t>) ENGINE=</w:t>
+      </w:r>
+      <w:proofErr w:type="spellStart"/>
+      <w:r>
+        <w:rPr>
+          <w:lang w:val="en-GB"/>
+        </w:rPr>
+        <w:t>InnoDB</w:t>
+      </w:r>
+      <w:proofErr w:type="spellEnd"/>
+      <w:r>
+        <w:rPr>
+          <w:lang w:val="en-GB"/>
+        </w:rPr>
+        <w:t xml:space="preserve"> DEFAULT CHARSET=utf8 COLLATE=utf8_spanish2_ci;</w:t>
       </w:r>
     </w:p>
     <w:p>
@@ -19167,8 +20971,44 @@
         <w:rPr>
           <w:lang w:val="en-GB"/>
         </w:rPr>
-        <w:t>-- Índices para tablas volcadas</w:t>
-      </w:r>
+        <w:t xml:space="preserve">-- </w:t>
+      </w:r>
+      <w:proofErr w:type="spellStart"/>
+      <w:r>
+        <w:rPr>
+          <w:lang w:val="en-GB"/>
+        </w:rPr>
+        <w:t>Índices</w:t>
+      </w:r>
+      <w:proofErr w:type="spellEnd"/>
+      <w:r>
+        <w:rPr>
+          <w:lang w:val="en-GB"/>
+        </w:rPr>
+        <w:t xml:space="preserve"> para </w:t>
+      </w:r>
+      <w:proofErr w:type="spellStart"/>
+      <w:r>
+        <w:rPr>
+          <w:lang w:val="en-GB"/>
+        </w:rPr>
+        <w:t>tablas</w:t>
+      </w:r>
+      <w:proofErr w:type="spellEnd"/>
+      <w:r>
+        <w:rPr>
+          <w:lang w:val="en-GB"/>
+        </w:rPr>
+        <w:t xml:space="preserve"> </w:t>
+      </w:r>
+      <w:proofErr w:type="spellStart"/>
+      <w:r>
+        <w:rPr>
+          <w:lang w:val="en-GB"/>
+        </w:rPr>
+        <w:t>volcadas</w:t>
+      </w:r>
+      <w:proofErr w:type="spellEnd"/>
     </w:p>
     <w:p>
       <w:pPr>
@@ -19206,7 +21046,35 @@
         <w:rPr>
           <w:lang w:val="en-GB"/>
         </w:rPr>
-        <w:t>-- Indices de la tabla `alumnos`</w:t>
+        <w:t xml:space="preserve">-- Indices de la </w:t>
+      </w:r>
+      <w:proofErr w:type="spellStart"/>
+      <w:r>
+        <w:rPr>
+          <w:lang w:val="en-GB"/>
+        </w:rPr>
+        <w:t>tabla</w:t>
+      </w:r>
+      <w:proofErr w:type="spellEnd"/>
+      <w:r>
+        <w:rPr>
+          <w:lang w:val="en-GB"/>
+        </w:rPr>
+        <w:t xml:space="preserve"> `</w:t>
+      </w:r>
+      <w:proofErr w:type="spellStart"/>
+      <w:r>
+        <w:rPr>
+          <w:lang w:val="en-GB"/>
+        </w:rPr>
+        <w:t>alumnos</w:t>
+      </w:r>
+      <w:proofErr w:type="spellEnd"/>
+      <w:r>
+        <w:rPr>
+          <w:lang w:val="en-GB"/>
+        </w:rPr>
+        <w:t>`</w:t>
       </w:r>
     </w:p>
     <w:p>
@@ -19232,7 +21100,21 @@
         <w:rPr>
           <w:lang w:val="en-GB"/>
         </w:rPr>
-        <w:t>ALTER TABLE `alumnos`</w:t>
+        <w:t>ALTER TABLE `</w:t>
+      </w:r>
+      <w:proofErr w:type="spellStart"/>
+      <w:r>
+        <w:rPr>
+          <w:lang w:val="en-GB"/>
+        </w:rPr>
+        <w:t>alumnos</w:t>
+      </w:r>
+      <w:proofErr w:type="spellEnd"/>
+      <w:r>
+        <w:rPr>
+          <w:lang w:val="en-GB"/>
+        </w:rPr>
+        <w:t>`</w:t>
       </w:r>
     </w:p>
     <w:p>
@@ -19245,7 +21127,21 @@
         <w:rPr>
           <w:lang w:val="en-GB"/>
         </w:rPr>
-        <w:t xml:space="preserve">  ADD PRIMARY KEY (`nie`);</w:t>
+        <w:t xml:space="preserve">  ADD PRIMARY KEY (`</w:t>
+      </w:r>
+      <w:proofErr w:type="spellStart"/>
+      <w:r>
+        <w:rPr>
+          <w:lang w:val="en-GB"/>
+        </w:rPr>
+        <w:t>nie</w:t>
+      </w:r>
+      <w:proofErr w:type="spellEnd"/>
+      <w:r>
+        <w:rPr>
+          <w:lang w:val="en-GB"/>
+        </w:rPr>
+        <w:t>`);</w:t>
       </w:r>
     </w:p>
     <w:p>
@@ -19271,7 +21167,35 @@
         <w:rPr>
           <w:lang w:val="en-GB"/>
         </w:rPr>
-        <w:t>-- Indices de la tabla `alumnoscrusoslibros`</w:t>
+        <w:t xml:space="preserve">-- Indices de la </w:t>
+      </w:r>
+      <w:proofErr w:type="spellStart"/>
+      <w:r>
+        <w:rPr>
+          <w:lang w:val="en-GB"/>
+        </w:rPr>
+        <w:t>tabla</w:t>
+      </w:r>
+      <w:proofErr w:type="spellEnd"/>
+      <w:r>
+        <w:rPr>
+          <w:lang w:val="en-GB"/>
+        </w:rPr>
+        <w:t xml:space="preserve"> `</w:t>
+      </w:r>
+      <w:proofErr w:type="spellStart"/>
+      <w:r>
+        <w:rPr>
+          <w:lang w:val="en-GB"/>
+        </w:rPr>
+        <w:t>alumnoscrusoslibros</w:t>
+      </w:r>
+      <w:proofErr w:type="spellEnd"/>
+      <w:r>
+        <w:rPr>
+          <w:lang w:val="en-GB"/>
+        </w:rPr>
+        <w:t>`</w:t>
       </w:r>
     </w:p>
     <w:p>
@@ -19298,7 +21222,21 @@
           <w:lang w:val="en-GB"/>
         </w:rPr>
         <w:lastRenderedPageBreak/>
-        <w:t>ALTER TABLE `alumnoscrusoslibros`</w:t>
+        <w:t>ALTER TABLE `</w:t>
+      </w:r>
+      <w:proofErr w:type="spellStart"/>
+      <w:r>
+        <w:rPr>
+          <w:lang w:val="en-GB"/>
+        </w:rPr>
+        <w:t>alumnoscrusoslibros</w:t>
+      </w:r>
+      <w:proofErr w:type="spellEnd"/>
+      <w:r>
+        <w:rPr>
+          <w:lang w:val="en-GB"/>
+        </w:rPr>
+        <w:t>`</w:t>
       </w:r>
     </w:p>
     <w:p>
@@ -19311,7 +21249,53 @@
         <w:rPr>
           <w:lang w:val="en-GB"/>
         </w:rPr>
-        <w:t xml:space="preserve">  ADD PRIMARY KEY (`nie`,`curso`,`isbn`),</w:t>
+        <w:t xml:space="preserve">  ADD PRIMARY KEY (`</w:t>
+      </w:r>
+      <w:proofErr w:type="spellStart"/>
+      <w:r>
+        <w:rPr>
+          <w:lang w:val="en-GB"/>
+        </w:rPr>
+        <w:t>nie</w:t>
+      </w:r>
+      <w:proofErr w:type="spellEnd"/>
+      <w:proofErr w:type="gramStart"/>
+      <w:r>
+        <w:rPr>
+          <w:lang w:val="en-GB"/>
+        </w:rPr>
+        <w:t>`,`</w:t>
+      </w:r>
+      <w:proofErr w:type="spellStart"/>
+      <w:proofErr w:type="gramEnd"/>
+      <w:r>
+        <w:rPr>
+          <w:lang w:val="en-GB"/>
+        </w:rPr>
+        <w:t>curso</w:t>
+      </w:r>
+      <w:proofErr w:type="spellEnd"/>
+      <w:proofErr w:type="gramStart"/>
+      <w:r>
+        <w:rPr>
+          <w:lang w:val="en-GB"/>
+        </w:rPr>
+        <w:t>`,`</w:t>
+      </w:r>
+      <w:proofErr w:type="spellStart"/>
+      <w:proofErr w:type="gramEnd"/>
+      <w:r>
+        <w:rPr>
+          <w:lang w:val="en-GB"/>
+        </w:rPr>
+        <w:t>isbn</w:t>
+      </w:r>
+      <w:proofErr w:type="spellEnd"/>
+      <w:r>
+        <w:rPr>
+          <w:lang w:val="en-GB"/>
+        </w:rPr>
+        <w:t>`),</w:t>
       </w:r>
     </w:p>
     <w:p>
@@ -19324,7 +21308,35 @@
         <w:rPr>
           <w:lang w:val="en-GB"/>
         </w:rPr>
-        <w:t xml:space="preserve">  ADD KEY `isbn` (`isbn`),</w:t>
+        <w:t xml:space="preserve">  ADD KEY `</w:t>
+      </w:r>
+      <w:proofErr w:type="spellStart"/>
+      <w:r>
+        <w:rPr>
+          <w:lang w:val="en-GB"/>
+        </w:rPr>
+        <w:t>isbn</w:t>
+      </w:r>
+      <w:proofErr w:type="spellEnd"/>
+      <w:r>
+        <w:rPr>
+          <w:lang w:val="en-GB"/>
+        </w:rPr>
+        <w:t>` (`</w:t>
+      </w:r>
+      <w:proofErr w:type="spellStart"/>
+      <w:r>
+        <w:rPr>
+          <w:lang w:val="en-GB"/>
+        </w:rPr>
+        <w:t>isbn</w:t>
+      </w:r>
+      <w:proofErr w:type="spellEnd"/>
+      <w:r>
+        <w:rPr>
+          <w:lang w:val="en-GB"/>
+        </w:rPr>
+        <w:t>`),</w:t>
       </w:r>
     </w:p>
     <w:p>
@@ -19337,7 +21349,35 @@
         <w:rPr>
           <w:lang w:val="en-GB"/>
         </w:rPr>
-        <w:t xml:space="preserve">  ADD KEY `curso` (`curso`);</w:t>
+        <w:t xml:space="preserve">  ADD KEY `</w:t>
+      </w:r>
+      <w:proofErr w:type="spellStart"/>
+      <w:r>
+        <w:rPr>
+          <w:lang w:val="en-GB"/>
+        </w:rPr>
+        <w:t>curso</w:t>
+      </w:r>
+      <w:proofErr w:type="spellEnd"/>
+      <w:r>
+        <w:rPr>
+          <w:lang w:val="en-GB"/>
+        </w:rPr>
+        <w:t>` (`</w:t>
+      </w:r>
+      <w:proofErr w:type="spellStart"/>
+      <w:r>
+        <w:rPr>
+          <w:lang w:val="en-GB"/>
+        </w:rPr>
+        <w:t>curso</w:t>
+      </w:r>
+      <w:proofErr w:type="spellEnd"/>
+      <w:r>
+        <w:rPr>
+          <w:lang w:val="en-GB"/>
+        </w:rPr>
+        <w:t>`);</w:t>
       </w:r>
     </w:p>
     <w:p>
@@ -19363,7 +21403,35 @@
         <w:rPr>
           <w:lang w:val="en-GB"/>
         </w:rPr>
-        <w:t>-- Indices de la tabla `cursos`</w:t>
+        <w:t xml:space="preserve">-- Indices de la </w:t>
+      </w:r>
+      <w:proofErr w:type="spellStart"/>
+      <w:r>
+        <w:rPr>
+          <w:lang w:val="en-GB"/>
+        </w:rPr>
+        <w:t>tabla</w:t>
+      </w:r>
+      <w:proofErr w:type="spellEnd"/>
+      <w:r>
+        <w:rPr>
+          <w:lang w:val="en-GB"/>
+        </w:rPr>
+        <w:t xml:space="preserve"> `</w:t>
+      </w:r>
+      <w:proofErr w:type="spellStart"/>
+      <w:r>
+        <w:rPr>
+          <w:lang w:val="en-GB"/>
+        </w:rPr>
+        <w:t>cursos</w:t>
+      </w:r>
+      <w:proofErr w:type="spellEnd"/>
+      <w:r>
+        <w:rPr>
+          <w:lang w:val="en-GB"/>
+        </w:rPr>
+        <w:t>`</w:t>
       </w:r>
     </w:p>
     <w:p>
@@ -19389,7 +21457,21 @@
         <w:rPr>
           <w:lang w:val="en-GB"/>
         </w:rPr>
-        <w:t>ALTER TABLE `cursos`</w:t>
+        <w:t>ALTER TABLE `</w:t>
+      </w:r>
+      <w:proofErr w:type="spellStart"/>
+      <w:r>
+        <w:rPr>
+          <w:lang w:val="en-GB"/>
+        </w:rPr>
+        <w:t>cursos</w:t>
+      </w:r>
+      <w:proofErr w:type="spellEnd"/>
+      <w:r>
+        <w:rPr>
+          <w:lang w:val="en-GB"/>
+        </w:rPr>
+        <w:t>`</w:t>
       </w:r>
     </w:p>
     <w:p>
@@ -19402,7 +21484,21 @@
         <w:rPr>
           <w:lang w:val="en-GB"/>
         </w:rPr>
-        <w:t xml:space="preserve">  ADD PRIMARY KEY (`curso`);</w:t>
+        <w:t xml:space="preserve">  ADD PRIMARY KEY (`</w:t>
+      </w:r>
+      <w:proofErr w:type="spellStart"/>
+      <w:r>
+        <w:rPr>
+          <w:lang w:val="en-GB"/>
+        </w:rPr>
+        <w:t>curso</w:t>
+      </w:r>
+      <w:proofErr w:type="spellEnd"/>
+      <w:r>
+        <w:rPr>
+          <w:lang w:val="en-GB"/>
+        </w:rPr>
+        <w:t>`);</w:t>
       </w:r>
     </w:p>
     <w:p>
@@ -19428,7 +21524,35 @@
         <w:rPr>
           <w:lang w:val="en-GB"/>
         </w:rPr>
-        <w:t>-- Indices de la tabla `libros`</w:t>
+        <w:t xml:space="preserve">-- Indices de la </w:t>
+      </w:r>
+      <w:proofErr w:type="spellStart"/>
+      <w:r>
+        <w:rPr>
+          <w:lang w:val="en-GB"/>
+        </w:rPr>
+        <w:t>tabla</w:t>
+      </w:r>
+      <w:proofErr w:type="spellEnd"/>
+      <w:r>
+        <w:rPr>
+          <w:lang w:val="en-GB"/>
+        </w:rPr>
+        <w:t xml:space="preserve"> `</w:t>
+      </w:r>
+      <w:proofErr w:type="spellStart"/>
+      <w:r>
+        <w:rPr>
+          <w:lang w:val="en-GB"/>
+        </w:rPr>
+        <w:t>libros</w:t>
+      </w:r>
+      <w:proofErr w:type="spellEnd"/>
+      <w:r>
+        <w:rPr>
+          <w:lang w:val="en-GB"/>
+        </w:rPr>
+        <w:t>`</w:t>
       </w:r>
     </w:p>
     <w:p>
@@ -19454,7 +21578,21 @@
         <w:rPr>
           <w:lang w:val="en-GB"/>
         </w:rPr>
-        <w:t>ALTER TABLE `libros`</w:t>
+        <w:t>ALTER TABLE `</w:t>
+      </w:r>
+      <w:proofErr w:type="spellStart"/>
+      <w:r>
+        <w:rPr>
+          <w:lang w:val="en-GB"/>
+        </w:rPr>
+        <w:t>libros</w:t>
+      </w:r>
+      <w:proofErr w:type="spellEnd"/>
+      <w:r>
+        <w:rPr>
+          <w:lang w:val="en-GB"/>
+        </w:rPr>
+        <w:t>`</w:t>
       </w:r>
     </w:p>
     <w:p>
@@ -19467,7 +21605,21 @@
         <w:rPr>
           <w:lang w:val="en-GB"/>
         </w:rPr>
-        <w:t xml:space="preserve">  ADD PRIMARY KEY (`isbn`),</w:t>
+        <w:t xml:space="preserve">  ADD PRIMARY KEY (`</w:t>
+      </w:r>
+      <w:proofErr w:type="spellStart"/>
+      <w:r>
+        <w:rPr>
+          <w:lang w:val="en-GB"/>
+        </w:rPr>
+        <w:t>isbn</w:t>
+      </w:r>
+      <w:proofErr w:type="spellEnd"/>
+      <w:r>
+        <w:rPr>
+          <w:lang w:val="en-GB"/>
+        </w:rPr>
+        <w:t>`),</w:t>
       </w:r>
     </w:p>
     <w:p>
@@ -19480,7 +21632,35 @@
         <w:rPr>
           <w:lang w:val="en-GB"/>
         </w:rPr>
-        <w:t xml:space="preserve">  ADD KEY `FK_Materias` (`id_materia`),</w:t>
+        <w:t xml:space="preserve">  ADD KEY `</w:t>
+      </w:r>
+      <w:proofErr w:type="spellStart"/>
+      <w:r>
+        <w:rPr>
+          <w:lang w:val="en-GB"/>
+        </w:rPr>
+        <w:t>FK_Materias</w:t>
+      </w:r>
+      <w:proofErr w:type="spellEnd"/>
+      <w:r>
+        <w:rPr>
+          <w:lang w:val="en-GB"/>
+        </w:rPr>
+        <w:t>` (`</w:t>
+      </w:r>
+      <w:proofErr w:type="spellStart"/>
+      <w:r>
+        <w:rPr>
+          <w:lang w:val="en-GB"/>
+        </w:rPr>
+        <w:t>id_materia</w:t>
+      </w:r>
+      <w:proofErr w:type="spellEnd"/>
+      <w:r>
+        <w:rPr>
+          <w:lang w:val="en-GB"/>
+        </w:rPr>
+        <w:t>`),</w:t>
       </w:r>
     </w:p>
     <w:p>
@@ -19493,7 +21673,35 @@
         <w:rPr>
           <w:lang w:val="en-GB"/>
         </w:rPr>
-        <w:t xml:space="preserve">  ADD KEY `FK_Cursos` (`id_curso`) USING BTREE;</w:t>
+        <w:t xml:space="preserve">  ADD KEY `</w:t>
+      </w:r>
+      <w:proofErr w:type="spellStart"/>
+      <w:r>
+        <w:rPr>
+          <w:lang w:val="en-GB"/>
+        </w:rPr>
+        <w:t>FK_Cursos</w:t>
+      </w:r>
+      <w:proofErr w:type="spellEnd"/>
+      <w:r>
+        <w:rPr>
+          <w:lang w:val="en-GB"/>
+        </w:rPr>
+        <w:t>` (`</w:t>
+      </w:r>
+      <w:proofErr w:type="spellStart"/>
+      <w:r>
+        <w:rPr>
+          <w:lang w:val="en-GB"/>
+        </w:rPr>
+        <w:t>id_curso</w:t>
+      </w:r>
+      <w:proofErr w:type="spellEnd"/>
+      <w:r>
+        <w:rPr>
+          <w:lang w:val="en-GB"/>
+        </w:rPr>
+        <w:t>`) USING BTREE;</w:t>
       </w:r>
     </w:p>
     <w:p>
@@ -19519,7 +21727,35 @@
         <w:rPr>
           <w:lang w:val="en-GB"/>
         </w:rPr>
-        <w:t>-- Indices de la tabla `materias`</w:t>
+        <w:t xml:space="preserve">-- Indices de la </w:t>
+      </w:r>
+      <w:proofErr w:type="spellStart"/>
+      <w:r>
+        <w:rPr>
+          <w:lang w:val="en-GB"/>
+        </w:rPr>
+        <w:t>tabla</w:t>
+      </w:r>
+      <w:proofErr w:type="spellEnd"/>
+      <w:r>
+        <w:rPr>
+          <w:lang w:val="en-GB"/>
+        </w:rPr>
+        <w:t xml:space="preserve"> `</w:t>
+      </w:r>
+      <w:proofErr w:type="spellStart"/>
+      <w:r>
+        <w:rPr>
+          <w:lang w:val="en-GB"/>
+        </w:rPr>
+        <w:t>materias</w:t>
+      </w:r>
+      <w:proofErr w:type="spellEnd"/>
+      <w:r>
+        <w:rPr>
+          <w:lang w:val="en-GB"/>
+        </w:rPr>
+        <w:t>`</w:t>
       </w:r>
     </w:p>
     <w:p>
@@ -19545,7 +21781,21 @@
         <w:rPr>
           <w:lang w:val="en-GB"/>
         </w:rPr>
-        <w:t>ALTER TABLE `materias`</w:t>
+        <w:t>ALTER TABLE `</w:t>
+      </w:r>
+      <w:proofErr w:type="spellStart"/>
+      <w:r>
+        <w:rPr>
+          <w:lang w:val="en-GB"/>
+        </w:rPr>
+        <w:t>materias</w:t>
+      </w:r>
+      <w:proofErr w:type="spellEnd"/>
+      <w:r>
+        <w:rPr>
+          <w:lang w:val="en-GB"/>
+        </w:rPr>
+        <w:t>`</w:t>
       </w:r>
     </w:p>
     <w:p>
@@ -19571,8 +21821,30 @@
         <w:rPr>
           <w:lang w:val="en-GB"/>
         </w:rPr>
-        <w:t>-- Restricciones para tablas volcadas</w:t>
-      </w:r>
+        <w:t xml:space="preserve">-- Restricciones para </w:t>
+      </w:r>
+      <w:proofErr w:type="spellStart"/>
+      <w:r>
+        <w:rPr>
+          <w:lang w:val="en-GB"/>
+        </w:rPr>
+        <w:t>tablas</w:t>
+      </w:r>
+      <w:proofErr w:type="spellEnd"/>
+      <w:r>
+        <w:rPr>
+          <w:lang w:val="en-GB"/>
+        </w:rPr>
+        <w:t xml:space="preserve"> </w:t>
+      </w:r>
+      <w:proofErr w:type="spellStart"/>
+      <w:r>
+        <w:rPr>
+          <w:lang w:val="en-GB"/>
+        </w:rPr>
+        <w:t>volcadas</w:t>
+      </w:r>
+      <w:proofErr w:type="spellEnd"/>
     </w:p>
     <w:p>
       <w:pPr>
@@ -19610,7 +21882,49 @@
         <w:rPr>
           <w:lang w:val="en-GB"/>
         </w:rPr>
-        <w:t>-- Filtros para la tabla `alumnoscrusoslibros`</w:t>
+        <w:t xml:space="preserve">-- </w:t>
+      </w:r>
+      <w:proofErr w:type="spellStart"/>
+      <w:r>
+        <w:rPr>
+          <w:lang w:val="en-GB"/>
+        </w:rPr>
+        <w:t>Filtros</w:t>
+      </w:r>
+      <w:proofErr w:type="spellEnd"/>
+      <w:r>
+        <w:rPr>
+          <w:lang w:val="en-GB"/>
+        </w:rPr>
+        <w:t xml:space="preserve"> para la </w:t>
+      </w:r>
+      <w:proofErr w:type="spellStart"/>
+      <w:r>
+        <w:rPr>
+          <w:lang w:val="en-GB"/>
+        </w:rPr>
+        <w:t>tabla</w:t>
+      </w:r>
+      <w:proofErr w:type="spellEnd"/>
+      <w:r>
+        <w:rPr>
+          <w:lang w:val="en-GB"/>
+        </w:rPr>
+        <w:t xml:space="preserve"> `</w:t>
+      </w:r>
+      <w:proofErr w:type="spellStart"/>
+      <w:r>
+        <w:rPr>
+          <w:lang w:val="en-GB"/>
+        </w:rPr>
+        <w:t>alumnoscrusoslibros</w:t>
+      </w:r>
+      <w:proofErr w:type="spellEnd"/>
+      <w:r>
+        <w:rPr>
+          <w:lang w:val="en-GB"/>
+        </w:rPr>
+        <w:t>`</w:t>
       </w:r>
     </w:p>
     <w:p>
@@ -19636,7 +21950,21 @@
         <w:rPr>
           <w:lang w:val="en-GB"/>
         </w:rPr>
-        <w:t>ALTER TABLE `alumnoscrusoslibros`</w:t>
+        <w:t>ALTER TABLE `</w:t>
+      </w:r>
+      <w:proofErr w:type="spellStart"/>
+      <w:r>
+        <w:rPr>
+          <w:lang w:val="en-GB"/>
+        </w:rPr>
+        <w:t>alumnoscrusoslibros</w:t>
+      </w:r>
+      <w:proofErr w:type="spellEnd"/>
+      <w:r>
+        <w:rPr>
+          <w:lang w:val="en-GB"/>
+        </w:rPr>
+        <w:t>`</w:t>
       </w:r>
     </w:p>
     <w:p>
@@ -19649,7 +21977,49 @@
         <w:rPr>
           <w:lang w:val="en-GB"/>
         </w:rPr>
-        <w:t xml:space="preserve">  ADD CONSTRAINT `alumnoscrusoslibros_ibfk_1` FOREIGN KEY (`isbn`) REFERENCES `libros` (`isbn`) ON DELETE CASCADE ON UPDATE CASCADE,</w:t>
+        <w:t xml:space="preserve">  ADD CONSTRAINT `alumnoscrusoslibros_ibfk_1` FOREIGN KEY (`</w:t>
+      </w:r>
+      <w:proofErr w:type="spellStart"/>
+      <w:r>
+        <w:rPr>
+          <w:lang w:val="en-GB"/>
+        </w:rPr>
+        <w:t>isbn</w:t>
+      </w:r>
+      <w:proofErr w:type="spellEnd"/>
+      <w:r>
+        <w:rPr>
+          <w:lang w:val="en-GB"/>
+        </w:rPr>
+        <w:t>`) REFERENCES `</w:t>
+      </w:r>
+      <w:proofErr w:type="spellStart"/>
+      <w:r>
+        <w:rPr>
+          <w:lang w:val="en-GB"/>
+        </w:rPr>
+        <w:t>libros</w:t>
+      </w:r>
+      <w:proofErr w:type="spellEnd"/>
+      <w:r>
+        <w:rPr>
+          <w:lang w:val="en-GB"/>
+        </w:rPr>
+        <w:t>` (`</w:t>
+      </w:r>
+      <w:proofErr w:type="spellStart"/>
+      <w:r>
+        <w:rPr>
+          <w:lang w:val="en-GB"/>
+        </w:rPr>
+        <w:t>isbn</w:t>
+      </w:r>
+      <w:proofErr w:type="spellEnd"/>
+      <w:r>
+        <w:rPr>
+          <w:lang w:val="en-GB"/>
+        </w:rPr>
+        <w:t>`) ON DELETE CASCADE ON UPDATE CASCADE,</w:t>
       </w:r>
     </w:p>
     <w:p>
@@ -19662,7 +22032,49 @@
         <w:rPr>
           <w:lang w:val="en-GB"/>
         </w:rPr>
-        <w:t xml:space="preserve">  ADD CONSTRAINT `alumnoscrusoslibros_ibfk_2` FOREIGN KEY (`nie`) REFERENCES `alumnos` (`nie`) ON DELETE CASCADE ON UPDATE CASCADE,</w:t>
+        <w:t xml:space="preserve">  ADD CONSTRAINT `alumnoscrusoslibros_ibfk_2` FOREIGN KEY (`</w:t>
+      </w:r>
+      <w:proofErr w:type="spellStart"/>
+      <w:r>
+        <w:rPr>
+          <w:lang w:val="en-GB"/>
+        </w:rPr>
+        <w:t>nie</w:t>
+      </w:r>
+      <w:proofErr w:type="spellEnd"/>
+      <w:r>
+        <w:rPr>
+          <w:lang w:val="en-GB"/>
+        </w:rPr>
+        <w:t>`) REFERENCES `</w:t>
+      </w:r>
+      <w:proofErr w:type="spellStart"/>
+      <w:r>
+        <w:rPr>
+          <w:lang w:val="en-GB"/>
+        </w:rPr>
+        <w:t>alumnos</w:t>
+      </w:r>
+      <w:proofErr w:type="spellEnd"/>
+      <w:r>
+        <w:rPr>
+          <w:lang w:val="en-GB"/>
+        </w:rPr>
+        <w:t>` (`</w:t>
+      </w:r>
+      <w:proofErr w:type="spellStart"/>
+      <w:r>
+        <w:rPr>
+          <w:lang w:val="en-GB"/>
+        </w:rPr>
+        <w:t>nie</w:t>
+      </w:r>
+      <w:proofErr w:type="spellEnd"/>
+      <w:r>
+        <w:rPr>
+          <w:lang w:val="en-GB"/>
+        </w:rPr>
+        <w:t>`) ON DELETE CASCADE ON UPDATE CASCADE,</w:t>
       </w:r>
     </w:p>
     <w:p>
@@ -19675,7 +22087,49 @@
         <w:rPr>
           <w:lang w:val="en-GB"/>
         </w:rPr>
-        <w:t xml:space="preserve">  ADD CONSTRAINT `alumnoscrusoslibros_ibfk_3` FOREIGN KEY (`curso`) REFERENCES `cursos` (`curso`) ON DELETE CASCADE ON UPDATE CASCADE;</w:t>
+        <w:t xml:space="preserve">  ADD CONSTRAINT `alumnoscrusoslibros_ibfk_3` FOREIGN KEY (`</w:t>
+      </w:r>
+      <w:proofErr w:type="spellStart"/>
+      <w:r>
+        <w:rPr>
+          <w:lang w:val="en-GB"/>
+        </w:rPr>
+        <w:t>curso</w:t>
+      </w:r>
+      <w:proofErr w:type="spellEnd"/>
+      <w:r>
+        <w:rPr>
+          <w:lang w:val="en-GB"/>
+        </w:rPr>
+        <w:t>`) REFERENCES `</w:t>
+      </w:r>
+      <w:proofErr w:type="spellStart"/>
+      <w:r>
+        <w:rPr>
+          <w:lang w:val="en-GB"/>
+        </w:rPr>
+        <w:t>cursos</w:t>
+      </w:r>
+      <w:proofErr w:type="spellEnd"/>
+      <w:r>
+        <w:rPr>
+          <w:lang w:val="en-GB"/>
+        </w:rPr>
+        <w:t>` (`</w:t>
+      </w:r>
+      <w:proofErr w:type="spellStart"/>
+      <w:r>
+        <w:rPr>
+          <w:lang w:val="en-GB"/>
+        </w:rPr>
+        <w:t>curso</w:t>
+      </w:r>
+      <w:proofErr w:type="spellEnd"/>
+      <w:r>
+        <w:rPr>
+          <w:lang w:val="en-GB"/>
+        </w:rPr>
+        <w:t>`) ON DELETE CASCADE ON UPDATE CASCADE;</w:t>
       </w:r>
     </w:p>
     <w:p>
@@ -19701,7 +22155,49 @@
         <w:rPr>
           <w:lang w:val="en-GB"/>
         </w:rPr>
-        <w:t>-- Filtros para la tabla `libros`</w:t>
+        <w:t xml:space="preserve">-- </w:t>
+      </w:r>
+      <w:proofErr w:type="spellStart"/>
+      <w:r>
+        <w:rPr>
+          <w:lang w:val="en-GB"/>
+        </w:rPr>
+        <w:t>Filtros</w:t>
+      </w:r>
+      <w:proofErr w:type="spellEnd"/>
+      <w:r>
+        <w:rPr>
+          <w:lang w:val="en-GB"/>
+        </w:rPr>
+        <w:t xml:space="preserve"> para la </w:t>
+      </w:r>
+      <w:proofErr w:type="spellStart"/>
+      <w:r>
+        <w:rPr>
+          <w:lang w:val="en-GB"/>
+        </w:rPr>
+        <w:t>tabla</w:t>
+      </w:r>
+      <w:proofErr w:type="spellEnd"/>
+      <w:r>
+        <w:rPr>
+          <w:lang w:val="en-GB"/>
+        </w:rPr>
+        <w:t xml:space="preserve"> `</w:t>
+      </w:r>
+      <w:proofErr w:type="spellStart"/>
+      <w:r>
+        <w:rPr>
+          <w:lang w:val="en-GB"/>
+        </w:rPr>
+        <w:t>libros</w:t>
+      </w:r>
+      <w:proofErr w:type="spellEnd"/>
+      <w:r>
+        <w:rPr>
+          <w:lang w:val="en-GB"/>
+        </w:rPr>
+        <w:t>`</w:t>
       </w:r>
     </w:p>
     <w:p>
@@ -19727,7 +22223,21 @@
         <w:rPr>
           <w:lang w:val="en-GB"/>
         </w:rPr>
-        <w:t>ALTER TABLE `libros`</w:t>
+        <w:t>ALTER TABLE `</w:t>
+      </w:r>
+      <w:proofErr w:type="spellStart"/>
+      <w:r>
+        <w:rPr>
+          <w:lang w:val="en-GB"/>
+        </w:rPr>
+        <w:t>libros</w:t>
+      </w:r>
+      <w:proofErr w:type="spellEnd"/>
+      <w:r>
+        <w:rPr>
+          <w:lang w:val="en-GB"/>
+        </w:rPr>
+        <w:t>`</w:t>
       </w:r>
     </w:p>
     <w:p>
@@ -19740,7 +22250,63 @@
         <w:rPr>
           <w:lang w:val="en-GB"/>
         </w:rPr>
-        <w:t xml:space="preserve">  ADD CONSTRAINT `fk_libros_cursos` FOREIGN KEY (`id_curso`) REFERENCES `cursos` (`curso`) ON DELETE CASCADE ON UPDATE CASCADE,</w:t>
+        <w:t xml:space="preserve">  ADD CONSTRAINT `</w:t>
+      </w:r>
+      <w:proofErr w:type="spellStart"/>
+      <w:r>
+        <w:rPr>
+          <w:lang w:val="en-GB"/>
+        </w:rPr>
+        <w:t>fk_libros_cursos</w:t>
+      </w:r>
+      <w:proofErr w:type="spellEnd"/>
+      <w:r>
+        <w:rPr>
+          <w:lang w:val="en-GB"/>
+        </w:rPr>
+        <w:t>` FOREIGN KEY (`</w:t>
+      </w:r>
+      <w:proofErr w:type="spellStart"/>
+      <w:r>
+        <w:rPr>
+          <w:lang w:val="en-GB"/>
+        </w:rPr>
+        <w:t>id_curso</w:t>
+      </w:r>
+      <w:proofErr w:type="spellEnd"/>
+      <w:r>
+        <w:rPr>
+          <w:lang w:val="en-GB"/>
+        </w:rPr>
+        <w:t>`) REFERENCES `</w:t>
+      </w:r>
+      <w:proofErr w:type="spellStart"/>
+      <w:r>
+        <w:rPr>
+          <w:lang w:val="en-GB"/>
+        </w:rPr>
+        <w:t>cursos</w:t>
+      </w:r>
+      <w:proofErr w:type="spellEnd"/>
+      <w:r>
+        <w:rPr>
+          <w:lang w:val="en-GB"/>
+        </w:rPr>
+        <w:t>` (`</w:t>
+      </w:r>
+      <w:proofErr w:type="spellStart"/>
+      <w:r>
+        <w:rPr>
+          <w:lang w:val="en-GB"/>
+        </w:rPr>
+        <w:t>curso</w:t>
+      </w:r>
+      <w:proofErr w:type="spellEnd"/>
+      <w:r>
+        <w:rPr>
+          <w:lang w:val="en-GB"/>
+        </w:rPr>
+        <w:t>`) ON DELETE CASCADE ON UPDATE CASCADE,</w:t>
       </w:r>
     </w:p>
     <w:p>
@@ -19753,7 +22319,49 @@
         <w:rPr>
           <w:lang w:val="en-GB"/>
         </w:rPr>
-        <w:t xml:space="preserve">  ADD CONSTRAINT `fk_libros_materias` FOREIGN KEY (`id_materia`) REFERENCES `materias` (`id`) ON DELETE CASCADE ON UPDATE CASCADE;</w:t>
+        <w:t xml:space="preserve">  ADD CONSTRAINT `</w:t>
+      </w:r>
+      <w:proofErr w:type="spellStart"/>
+      <w:r>
+        <w:rPr>
+          <w:lang w:val="en-GB"/>
+        </w:rPr>
+        <w:t>fk_libros_materias</w:t>
+      </w:r>
+      <w:proofErr w:type="spellEnd"/>
+      <w:r>
+        <w:rPr>
+          <w:lang w:val="en-GB"/>
+        </w:rPr>
+        <w:t>` FOREIGN KEY (`</w:t>
+      </w:r>
+      <w:proofErr w:type="spellStart"/>
+      <w:r>
+        <w:rPr>
+          <w:lang w:val="en-GB"/>
+        </w:rPr>
+        <w:t>id_materia</w:t>
+      </w:r>
+      <w:proofErr w:type="spellEnd"/>
+      <w:r>
+        <w:rPr>
+          <w:lang w:val="en-GB"/>
+        </w:rPr>
+        <w:t>`) REFERENCES `</w:t>
+      </w:r>
+      <w:proofErr w:type="spellStart"/>
+      <w:r>
+        <w:rPr>
+          <w:lang w:val="en-GB"/>
+        </w:rPr>
+        <w:t>materias</w:t>
+      </w:r>
+      <w:proofErr w:type="spellEnd"/>
+      <w:r>
+        <w:rPr>
+          <w:lang w:val="en-GB"/>
+        </w:rPr>
+        <w:t>` (`id`) ON DELETE CASCADE ON UPDATE CASCADE;</w:t>
       </w:r>
     </w:p>
     <w:p>
@@ -20469,7 +23077,25 @@
                 <w:sz w:val="16"/>
                 <w:szCs w:val="16"/>
               </w:rPr>
-              <w:t xml:space="preserve"> edge?</w:t>
+              <w:t xml:space="preserve"> </w:t>
+            </w:r>
+            <w:proofErr w:type="spellStart"/>
+            <w:r>
+              <w:rPr>
+                <w:rFonts w:cstheme="minorHAnsi"/>
+                <w:sz w:val="16"/>
+                <w:szCs w:val="16"/>
+              </w:rPr>
+              <w:t>edge</w:t>
+            </w:r>
+            <w:proofErr w:type="spellEnd"/>
+            <w:r>
+              <w:rPr>
+                <w:rFonts w:cstheme="minorHAnsi"/>
+                <w:sz w:val="16"/>
+                <w:szCs w:val="16"/>
+              </w:rPr>
+              <w:t>?</w:t>
             </w:r>
           </w:p>
         </w:tc>
@@ -20687,7 +23313,25 @@
                 <w:sz w:val="16"/>
                 <w:szCs w:val="16"/>
               </w:rPr>
-              <w:t xml:space="preserve"> chrome?</w:t>
+              <w:t xml:space="preserve"> </w:t>
+            </w:r>
+            <w:proofErr w:type="spellStart"/>
+            <w:r>
+              <w:rPr>
+                <w:rFonts w:cstheme="minorHAnsi"/>
+                <w:sz w:val="16"/>
+                <w:szCs w:val="16"/>
+              </w:rPr>
+              <w:t>chrome</w:t>
+            </w:r>
+            <w:proofErr w:type="spellEnd"/>
+            <w:r>
+              <w:rPr>
+                <w:rFonts w:cstheme="minorHAnsi"/>
+                <w:sz w:val="16"/>
+                <w:szCs w:val="16"/>
+              </w:rPr>
+              <w:t>?</w:t>
             </w:r>
           </w:p>
         </w:tc>
@@ -22411,7 +25055,25 @@
                 <w:sz w:val="16"/>
                 <w:szCs w:val="16"/>
               </w:rPr>
-              <w:t>¿Funciona con táblets?</w:t>
+              <w:t xml:space="preserve">¿Funciona con </w:t>
+            </w:r>
+            <w:proofErr w:type="spellStart"/>
+            <w:r>
+              <w:rPr>
+                <w:rFonts w:cstheme="minorHAnsi"/>
+                <w:sz w:val="16"/>
+                <w:szCs w:val="16"/>
+              </w:rPr>
+              <w:t>táblets</w:t>
+            </w:r>
+            <w:proofErr w:type="spellEnd"/>
+            <w:r>
+              <w:rPr>
+                <w:rFonts w:cstheme="minorHAnsi"/>
+                <w:sz w:val="16"/>
+                <w:szCs w:val="16"/>
+              </w:rPr>
+              <w:t>?</w:t>
             </w:r>
           </w:p>
         </w:tc>
@@ -23897,13 +26559,23 @@
                 <w:szCs w:val="16"/>
               </w:rPr>
             </w:pPr>
-            <w:r>
-              <w:rPr>
-                <w:rFonts w:cstheme="minorHAnsi"/>
-                <w:sz w:val="16"/>
-                <w:szCs w:val="16"/>
-              </w:rPr>
-              <w:t>Descripción  de la prueba</w:t>
+            <w:proofErr w:type="gramStart"/>
+            <w:r>
+              <w:rPr>
+                <w:rFonts w:cstheme="minorHAnsi"/>
+                <w:sz w:val="16"/>
+                <w:szCs w:val="16"/>
+              </w:rPr>
+              <w:t>Descripción  de</w:t>
+            </w:r>
+            <w:proofErr w:type="gramEnd"/>
+            <w:r>
+              <w:rPr>
+                <w:rFonts w:cstheme="minorHAnsi"/>
+                <w:sz w:val="16"/>
+                <w:szCs w:val="16"/>
+              </w:rPr>
+              <w:t xml:space="preserve"> la prueba</w:t>
             </w:r>
           </w:p>
         </w:tc>
@@ -25136,7 +27808,7 @@
                         </pic:cNvPicPr>
                       </pic:nvPicPr>
                       <pic:blipFill>
-                        <a:blip r:embed="rId35" cstate="print">
+                        <a:blip r:embed="rId39" cstate="print">
                           <a:extLst>
                             <a:ext uri="{28A0092B-C50C-407E-A947-70E740481C1C}">
                               <a14:useLocalDpi xmlns:a14="http://schemas.microsoft.com/office/drawing/2010/main" val="0"/>
@@ -25182,8 +27854,16 @@
               <w:b w:val="0"/>
             </w:rPr>
             <w:lastRenderedPageBreak/>
-            <w:t>Fichero exportado de Delphos</w:t>
+            <w:t xml:space="preserve">Fichero exportado de </w:t>
           </w:r>
+          <w:proofErr w:type="spellStart"/>
+          <w:r>
+            <w:rPr>
+              <w:b w:val="0"/>
+            </w:rPr>
+            <w:t>Delphos</w:t>
+          </w:r>
+          <w:proofErr w:type="spellEnd"/>
           <w:r>
             <w:rPr>
               <w:b w:val="0"/>
@@ -25220,7 +27900,7 @@
                         </pic:cNvPicPr>
                       </pic:nvPicPr>
                       <pic:blipFill>
-                        <a:blip r:embed="rId36" cstate="print">
+                        <a:blip r:embed="rId40" cstate="print">
                           <a:extLst>
                             <a:ext uri="{28A0092B-C50C-407E-A947-70E740481C1C}">
                               <a14:useLocalDpi xmlns:a14="http://schemas.microsoft.com/office/drawing/2010/main" val="0"/>
@@ -25271,8 +27951,141 @@
             <w:t xml:space="preserve"> (Apellidos, Nombre)</w:t>
           </w:r>
           <w:r>
-            <w:t>, NumeroEscolar, NumeroSolicitud, FechaSolicitud, CampoNoNecesario, CursoAcadémico, CampoNoNecesario, CampoNoNecesario, CampoNoNecesario, CampoNoNecesario, CampoNoNecesario, CampoNoNecesario, CampoNoNecesario, CampoNoNecesario, ResultadoLibros, ResultadoComedor, Matriculado, TipoBecaLibros, TipoBecaComedor</w:t>
+            <w:t xml:space="preserve">, </w:t>
           </w:r>
+          <w:proofErr w:type="spellStart"/>
+          <w:r>
+            <w:t>NumeroEscolar</w:t>
+          </w:r>
+          <w:proofErr w:type="spellEnd"/>
+          <w:r>
+            <w:t xml:space="preserve">, </w:t>
+          </w:r>
+          <w:proofErr w:type="spellStart"/>
+          <w:r>
+            <w:t>NumeroSolicitud</w:t>
+          </w:r>
+          <w:proofErr w:type="spellEnd"/>
+          <w:r>
+            <w:t xml:space="preserve">, </w:t>
+          </w:r>
+          <w:proofErr w:type="spellStart"/>
+          <w:r>
+            <w:t>FechaSolicitud</w:t>
+          </w:r>
+          <w:proofErr w:type="spellEnd"/>
+          <w:r>
+            <w:t xml:space="preserve">, </w:t>
+          </w:r>
+          <w:proofErr w:type="spellStart"/>
+          <w:r>
+            <w:t>CampoNoNecesario</w:t>
+          </w:r>
+          <w:proofErr w:type="spellEnd"/>
+          <w:r>
+            <w:t xml:space="preserve">, </w:t>
+          </w:r>
+          <w:proofErr w:type="spellStart"/>
+          <w:r>
+            <w:t>CursoAcadémico</w:t>
+          </w:r>
+          <w:proofErr w:type="spellEnd"/>
+          <w:r>
+            <w:t xml:space="preserve">, </w:t>
+          </w:r>
+          <w:proofErr w:type="spellStart"/>
+          <w:r>
+            <w:t>CampoNoNecesario</w:t>
+          </w:r>
+          <w:proofErr w:type="spellEnd"/>
+          <w:r>
+            <w:t xml:space="preserve">, </w:t>
+          </w:r>
+          <w:proofErr w:type="spellStart"/>
+          <w:r>
+            <w:t>CampoNoNecesario</w:t>
+          </w:r>
+          <w:proofErr w:type="spellEnd"/>
+          <w:r>
+            <w:t xml:space="preserve">, </w:t>
+          </w:r>
+          <w:proofErr w:type="spellStart"/>
+          <w:r>
+            <w:t>CampoNoNecesario</w:t>
+          </w:r>
+          <w:proofErr w:type="spellEnd"/>
+          <w:r>
+            <w:t xml:space="preserve">, </w:t>
+          </w:r>
+          <w:proofErr w:type="spellStart"/>
+          <w:r>
+            <w:t>CampoNoNecesario</w:t>
+          </w:r>
+          <w:proofErr w:type="spellEnd"/>
+          <w:r>
+            <w:t xml:space="preserve">, </w:t>
+          </w:r>
+          <w:proofErr w:type="spellStart"/>
+          <w:r>
+            <w:t>CampoNoNecesario</w:t>
+          </w:r>
+          <w:proofErr w:type="spellEnd"/>
+          <w:r>
+            <w:t xml:space="preserve">, </w:t>
+          </w:r>
+          <w:proofErr w:type="spellStart"/>
+          <w:r>
+            <w:t>CampoNoNecesario</w:t>
+          </w:r>
+          <w:proofErr w:type="spellEnd"/>
+          <w:r>
+            <w:t xml:space="preserve">, </w:t>
+          </w:r>
+          <w:proofErr w:type="spellStart"/>
+          <w:r>
+            <w:t>CampoNoNecesario</w:t>
+          </w:r>
+          <w:proofErr w:type="spellEnd"/>
+          <w:r>
+            <w:t xml:space="preserve">, </w:t>
+          </w:r>
+          <w:proofErr w:type="spellStart"/>
+          <w:r>
+            <w:t>CampoNoNecesario</w:t>
+          </w:r>
+          <w:proofErr w:type="spellEnd"/>
+          <w:r>
+            <w:t xml:space="preserve">, </w:t>
+          </w:r>
+          <w:proofErr w:type="spellStart"/>
+          <w:r>
+            <w:t>ResultadoLibros</w:t>
+          </w:r>
+          <w:proofErr w:type="spellEnd"/>
+          <w:r>
+            <w:t xml:space="preserve">, </w:t>
+          </w:r>
+          <w:proofErr w:type="spellStart"/>
+          <w:r>
+            <w:t>ResultadoComedor</w:t>
+          </w:r>
+          <w:proofErr w:type="spellEnd"/>
+          <w:r>
+            <w:t xml:space="preserve">, Matriculado, </w:t>
+          </w:r>
+          <w:proofErr w:type="spellStart"/>
+          <w:r>
+            <w:t>TipoBecaLibros</w:t>
+          </w:r>
+          <w:proofErr w:type="spellEnd"/>
+          <w:r>
+            <w:t xml:space="preserve">, </w:t>
+          </w:r>
+          <w:proofErr w:type="spellStart"/>
+          <w:r>
+            <w:t>TipoBecaComedor</w:t>
+          </w:r>
+          <w:proofErr w:type="spellEnd"/>
         </w:p>
         <w:p/>
         <w:p/>
@@ -32928,8 +35741,8 @@
     <w:p/>
     <w:p/>
     <w:sectPr>
-      <w:headerReference w:type="default" r:id="rId37"/>
-      <w:footerReference w:type="default" r:id="rId38"/>
+      <w:headerReference w:type="default" r:id="rId41"/>
+      <w:footerReference w:type="default" r:id="rId42"/>
       <w:pgSz w:w="11906" w:h="16838" w:code="9"/>
       <w:pgMar w:top="1291" w:right="936" w:bottom="720" w:left="936" w:header="0" w:footer="289" w:gutter="0"/>
       <w:pgNumType w:start="1"/>
@@ -32942,7 +35755,7 @@
 </file>
 
 <file path=word/endnotes.xml><?xml version="1.0" encoding="utf-8"?>
-<w:endnotes xmlns:wpc="http://schemas.microsoft.com/office/word/2010/wordprocessingCanvas" xmlns:cx="http://schemas.microsoft.com/office/drawing/2014/chartex" xmlns:cx1="http://schemas.microsoft.com/office/drawing/2015/9/8/chartex" xmlns:cx2="http://schemas.microsoft.com/office/drawing/2015/10/21/chartex" xmlns:cx3="http://schemas.microsoft.com/office/drawing/2016/5/9/chartex" xmlns:cx4="http://schemas.microsoft.com/office/drawing/2016/5/10/chartex" xmlns:cx5="http://schemas.microsoft.com/office/drawing/2016/5/11/chartex" xmlns:cx6="http://schemas.microsoft.com/office/drawing/2016/5/12/chartex" xmlns:cx7="http://schemas.microsoft.com/office/drawing/2016/5/13/chartex" xmlns:cx8="http://schemas.microsoft.com/office/drawing/2016/5/14/chartex" xmlns:mc="http://schemas.openxmlformats.org/markup-compatibility/2006" xmlns:aink="http://schemas.microsoft.com/office/drawing/2016/ink" xmlns:am3d="http://schemas.microsoft.com/office/drawing/2017/model3d" xmlns:o="urn:schemas-microsoft-com:office:office" xmlns:oel="http://schemas.microsoft.com/office/2019/extlst" xmlns:r="http://schemas.openxmlformats.org/officeDocument/2006/relationships" xmlns:m="http://schemas.openxmlformats.org/officeDocument/2006/math" xmlns:v="urn:schemas-microsoft-com:vml" xmlns:wp14="http://schemas.microsoft.com/office/word/2010/wordprocessingDrawing" xmlns:wp="http://schemas.openxmlformats.org/drawingml/2006/wordprocessingDrawing" xmlns:w10="urn:schemas-microsoft-com:office:word" xmlns:w="http://schemas.openxmlformats.org/wordprocessingml/2006/main" xmlns:w14="http://schemas.microsoft.com/office/word/2010/wordml" xmlns:w15="http://schemas.microsoft.com/office/word/2012/wordml" xmlns:w16cex="http://schemas.microsoft.com/office/word/2018/wordml/cex" xmlns:w16cid="http://schemas.microsoft.com/office/word/2016/wordml/cid" xmlns:w16="http://schemas.microsoft.com/office/word/2018/wordml" xmlns:w16sdtdh="http://schemas.microsoft.com/office/word/2020/wordml/sdtdatahash" xmlns:w16se="http://schemas.microsoft.com/office/word/2015/wordml/symex" xmlns:wpg="http://schemas.microsoft.com/office/word/2010/wordprocessingGroup" xmlns:wpi="http://schemas.microsoft.com/office/word/2010/wordprocessingInk" xmlns:wne="http://schemas.microsoft.com/office/word/2006/wordml" xmlns:wps="http://schemas.microsoft.com/office/word/2010/wordprocessingShape" mc:Ignorable="w14 w15 w16se w16cid w16 w16cex w16sdtdh wp14">
+<w:endnotes xmlns:wpc="http://schemas.microsoft.com/office/word/2010/wordprocessingCanvas" xmlns:cx="http://schemas.microsoft.com/office/drawing/2014/chartex" xmlns:cx1="http://schemas.microsoft.com/office/drawing/2015/9/8/chartex" xmlns:cx2="http://schemas.microsoft.com/office/drawing/2015/10/21/chartex" xmlns:cx3="http://schemas.microsoft.com/office/drawing/2016/5/9/chartex" xmlns:cx4="http://schemas.microsoft.com/office/drawing/2016/5/10/chartex" xmlns:cx5="http://schemas.microsoft.com/office/drawing/2016/5/11/chartex" xmlns:cx6="http://schemas.microsoft.com/office/drawing/2016/5/12/chartex" xmlns:cx7="http://schemas.microsoft.com/office/drawing/2016/5/13/chartex" xmlns:cx8="http://schemas.microsoft.com/office/drawing/2016/5/14/chartex" xmlns:mc="http://schemas.openxmlformats.org/markup-compatibility/2006" xmlns:aink="http://schemas.microsoft.com/office/drawing/2016/ink" xmlns:am3d="http://schemas.microsoft.com/office/drawing/2017/model3d" xmlns:o="urn:schemas-microsoft-com:office:office" xmlns:oel="http://schemas.microsoft.com/office/2019/extlst" xmlns:r="http://schemas.openxmlformats.org/officeDocument/2006/relationships" xmlns:m="http://schemas.openxmlformats.org/officeDocument/2006/math" xmlns:v="urn:schemas-microsoft-com:vml" xmlns:wp14="http://schemas.microsoft.com/office/word/2010/wordprocessingDrawing" xmlns:wp="http://schemas.openxmlformats.org/drawingml/2006/wordprocessingDrawing" xmlns:w10="urn:schemas-microsoft-com:office:word" xmlns:w="http://schemas.openxmlformats.org/wordprocessingml/2006/main" xmlns:w14="http://schemas.microsoft.com/office/word/2010/wordml" xmlns:w15="http://schemas.microsoft.com/office/word/2012/wordml" xmlns:w16cex="http://schemas.microsoft.com/office/word/2018/wordml/cex" xmlns:w16cid="http://schemas.microsoft.com/office/word/2016/wordml/cid" xmlns:w16="http://schemas.microsoft.com/office/word/2018/wordml" xmlns:w16du="http://schemas.microsoft.com/office/word/2023/wordml/word16du" xmlns:w16sdtdh="http://schemas.microsoft.com/office/word/2020/wordml/sdtdatahash" xmlns:w16sdtfl="http://schemas.microsoft.com/office/word/2024/wordml/sdtformatlock" xmlns:w16se="http://schemas.microsoft.com/office/word/2015/wordml/symex" xmlns:wpg="http://schemas.microsoft.com/office/word/2010/wordprocessingGroup" xmlns:wpi="http://schemas.microsoft.com/office/word/2010/wordprocessingInk" xmlns:wne="http://schemas.microsoft.com/office/word/2006/wordml" xmlns:wps="http://schemas.microsoft.com/office/word/2010/wordprocessingShape" mc:Ignorable="w14 w15 w16se w16cid w16 w16cex w16sdtdh w16sdtfl w16du wp14">
   <w:endnote w:type="separator" w:id="-1">
     <w:p>
       <w:r>
@@ -32967,7 +35780,7 @@
 </file>
 
 <file path=word/footer1.xml><?xml version="1.0" encoding="utf-8"?>
-<w:ftr xmlns:wpc="http://schemas.microsoft.com/office/word/2010/wordprocessingCanvas" xmlns:cx="http://schemas.microsoft.com/office/drawing/2014/chartex" xmlns:cx1="http://schemas.microsoft.com/office/drawing/2015/9/8/chartex" xmlns:cx2="http://schemas.microsoft.com/office/drawing/2015/10/21/chartex" xmlns:cx3="http://schemas.microsoft.com/office/drawing/2016/5/9/chartex" xmlns:cx4="http://schemas.microsoft.com/office/drawing/2016/5/10/chartex" xmlns:cx5="http://schemas.microsoft.com/office/drawing/2016/5/11/chartex" xmlns:cx6="http://schemas.microsoft.com/office/drawing/2016/5/12/chartex" xmlns:cx7="http://schemas.microsoft.com/office/drawing/2016/5/13/chartex" xmlns:cx8="http://schemas.microsoft.com/office/drawing/2016/5/14/chartex" xmlns:mc="http://schemas.openxmlformats.org/markup-compatibility/2006" xmlns:aink="http://schemas.microsoft.com/office/drawing/2016/ink" xmlns:am3d="http://schemas.microsoft.com/office/drawing/2017/model3d" xmlns:o="urn:schemas-microsoft-com:office:office" xmlns:oel="http://schemas.microsoft.com/office/2019/extlst" xmlns:r="http://schemas.openxmlformats.org/officeDocument/2006/relationships" xmlns:m="http://schemas.openxmlformats.org/officeDocument/2006/math" xmlns:v="urn:schemas-microsoft-com:vml" xmlns:wp14="http://schemas.microsoft.com/office/word/2010/wordprocessingDrawing" xmlns:wp="http://schemas.openxmlformats.org/drawingml/2006/wordprocessingDrawing" xmlns:w10="urn:schemas-microsoft-com:office:word" xmlns:w="http://schemas.openxmlformats.org/wordprocessingml/2006/main" xmlns:w14="http://schemas.microsoft.com/office/word/2010/wordml" xmlns:w15="http://schemas.microsoft.com/office/word/2012/wordml" xmlns:w16cex="http://schemas.microsoft.com/office/word/2018/wordml/cex" xmlns:w16cid="http://schemas.microsoft.com/office/word/2016/wordml/cid" xmlns:w16="http://schemas.microsoft.com/office/word/2018/wordml" xmlns:w16sdtdh="http://schemas.microsoft.com/office/word/2020/wordml/sdtdatahash" xmlns:w16se="http://schemas.microsoft.com/office/word/2015/wordml/symex" xmlns:wpg="http://schemas.microsoft.com/office/word/2010/wordprocessingGroup" xmlns:wpi="http://schemas.microsoft.com/office/word/2010/wordprocessingInk" xmlns:wne="http://schemas.microsoft.com/office/word/2006/wordml" xmlns:wps="http://schemas.microsoft.com/office/word/2010/wordprocessingShape" mc:Ignorable="w14 w15 w16se w16cid w16 w16cex w16sdtdh wp14">
+<w:ftr xmlns:wpc="http://schemas.microsoft.com/office/word/2010/wordprocessingCanvas" xmlns:cx="http://schemas.microsoft.com/office/drawing/2014/chartex" xmlns:cx1="http://schemas.microsoft.com/office/drawing/2015/9/8/chartex" xmlns:cx2="http://schemas.microsoft.com/office/drawing/2015/10/21/chartex" xmlns:cx3="http://schemas.microsoft.com/office/drawing/2016/5/9/chartex" xmlns:cx4="http://schemas.microsoft.com/office/drawing/2016/5/10/chartex" xmlns:cx5="http://schemas.microsoft.com/office/drawing/2016/5/11/chartex" xmlns:cx6="http://schemas.microsoft.com/office/drawing/2016/5/12/chartex" xmlns:cx7="http://schemas.microsoft.com/office/drawing/2016/5/13/chartex" xmlns:cx8="http://schemas.microsoft.com/office/drawing/2016/5/14/chartex" xmlns:mc="http://schemas.openxmlformats.org/markup-compatibility/2006" xmlns:aink="http://schemas.microsoft.com/office/drawing/2016/ink" xmlns:am3d="http://schemas.microsoft.com/office/drawing/2017/model3d" xmlns:o="urn:schemas-microsoft-com:office:office" xmlns:oel="http://schemas.microsoft.com/office/2019/extlst" xmlns:r="http://schemas.openxmlformats.org/officeDocument/2006/relationships" xmlns:m="http://schemas.openxmlformats.org/officeDocument/2006/math" xmlns:v="urn:schemas-microsoft-com:vml" xmlns:wp14="http://schemas.microsoft.com/office/word/2010/wordprocessingDrawing" xmlns:wp="http://schemas.openxmlformats.org/drawingml/2006/wordprocessingDrawing" xmlns:w10="urn:schemas-microsoft-com:office:word" xmlns:w="http://schemas.openxmlformats.org/wordprocessingml/2006/main" xmlns:w14="http://schemas.microsoft.com/office/word/2010/wordml" xmlns:w15="http://schemas.microsoft.com/office/word/2012/wordml" xmlns:w16cex="http://schemas.microsoft.com/office/word/2018/wordml/cex" xmlns:w16cid="http://schemas.microsoft.com/office/word/2016/wordml/cid" xmlns:w16="http://schemas.microsoft.com/office/word/2018/wordml" xmlns:w16du="http://schemas.microsoft.com/office/word/2023/wordml/word16du" xmlns:w16sdtdh="http://schemas.microsoft.com/office/word/2020/wordml/sdtdatahash" xmlns:w16sdtfl="http://schemas.microsoft.com/office/word/2024/wordml/sdtformatlock" xmlns:w16se="http://schemas.microsoft.com/office/word/2015/wordml/symex" xmlns:wpg="http://schemas.microsoft.com/office/word/2010/wordprocessingGroup" xmlns:wpi="http://schemas.microsoft.com/office/word/2010/wordprocessingInk" xmlns:wne="http://schemas.microsoft.com/office/word/2006/wordml" xmlns:wps="http://schemas.microsoft.com/office/word/2010/wordprocessingShape" mc:Ignorable="w14 w15 w16se w16cid w16 w16cex w16sdtdh w16sdtfl w16du wp14">
   <w:p>
     <w:pPr>
       <w:pStyle w:val="Piedepgina"/>
@@ -33023,7 +35836,7 @@
 </file>
 
 <file path=word/footnotes.xml><?xml version="1.0" encoding="utf-8"?>
-<w:footnotes xmlns:wpc="http://schemas.microsoft.com/office/word/2010/wordprocessingCanvas" xmlns:cx="http://schemas.microsoft.com/office/drawing/2014/chartex" xmlns:cx1="http://schemas.microsoft.com/office/drawing/2015/9/8/chartex" xmlns:cx2="http://schemas.microsoft.com/office/drawing/2015/10/21/chartex" xmlns:cx3="http://schemas.microsoft.com/office/drawing/2016/5/9/chartex" xmlns:cx4="http://schemas.microsoft.com/office/drawing/2016/5/10/chartex" xmlns:cx5="http://schemas.microsoft.com/office/drawing/2016/5/11/chartex" xmlns:cx6="http://schemas.microsoft.com/office/drawing/2016/5/12/chartex" xmlns:cx7="http://schemas.microsoft.com/office/drawing/2016/5/13/chartex" xmlns:cx8="http://schemas.microsoft.com/office/drawing/2016/5/14/chartex" xmlns:mc="http://schemas.openxmlformats.org/markup-compatibility/2006" xmlns:aink="http://schemas.microsoft.com/office/drawing/2016/ink" xmlns:am3d="http://schemas.microsoft.com/office/drawing/2017/model3d" xmlns:o="urn:schemas-microsoft-com:office:office" xmlns:oel="http://schemas.microsoft.com/office/2019/extlst" xmlns:r="http://schemas.openxmlformats.org/officeDocument/2006/relationships" xmlns:m="http://schemas.openxmlformats.org/officeDocument/2006/math" xmlns:v="urn:schemas-microsoft-com:vml" xmlns:wp14="http://schemas.microsoft.com/office/word/2010/wordprocessingDrawing" xmlns:wp="http://schemas.openxmlformats.org/drawingml/2006/wordprocessingDrawing" xmlns:w10="urn:schemas-microsoft-com:office:word" xmlns:w="http://schemas.openxmlformats.org/wordprocessingml/2006/main" xmlns:w14="http://schemas.microsoft.com/office/word/2010/wordml" xmlns:w15="http://schemas.microsoft.com/office/word/2012/wordml" xmlns:w16cex="http://schemas.microsoft.com/office/word/2018/wordml/cex" xmlns:w16cid="http://schemas.microsoft.com/office/word/2016/wordml/cid" xmlns:w16="http://schemas.microsoft.com/office/word/2018/wordml" xmlns:w16sdtdh="http://schemas.microsoft.com/office/word/2020/wordml/sdtdatahash" xmlns:w16se="http://schemas.microsoft.com/office/word/2015/wordml/symex" xmlns:wpg="http://schemas.microsoft.com/office/word/2010/wordprocessingGroup" xmlns:wpi="http://schemas.microsoft.com/office/word/2010/wordprocessingInk" xmlns:wne="http://schemas.microsoft.com/office/word/2006/wordml" xmlns:wps="http://schemas.microsoft.com/office/word/2010/wordprocessingShape" mc:Ignorable="w14 w15 w16se w16cid w16 w16cex w16sdtdh wp14">
+<w:footnotes xmlns:wpc="http://schemas.microsoft.com/office/word/2010/wordprocessingCanvas" xmlns:cx="http://schemas.microsoft.com/office/drawing/2014/chartex" xmlns:cx1="http://schemas.microsoft.com/office/drawing/2015/9/8/chartex" xmlns:cx2="http://schemas.microsoft.com/office/drawing/2015/10/21/chartex" xmlns:cx3="http://schemas.microsoft.com/office/drawing/2016/5/9/chartex" xmlns:cx4="http://schemas.microsoft.com/office/drawing/2016/5/10/chartex" xmlns:cx5="http://schemas.microsoft.com/office/drawing/2016/5/11/chartex" xmlns:cx6="http://schemas.microsoft.com/office/drawing/2016/5/12/chartex" xmlns:cx7="http://schemas.microsoft.com/office/drawing/2016/5/13/chartex" xmlns:cx8="http://schemas.microsoft.com/office/drawing/2016/5/14/chartex" xmlns:mc="http://schemas.openxmlformats.org/markup-compatibility/2006" xmlns:aink="http://schemas.microsoft.com/office/drawing/2016/ink" xmlns:am3d="http://schemas.microsoft.com/office/drawing/2017/model3d" xmlns:o="urn:schemas-microsoft-com:office:office" xmlns:oel="http://schemas.microsoft.com/office/2019/extlst" xmlns:r="http://schemas.openxmlformats.org/officeDocument/2006/relationships" xmlns:m="http://schemas.openxmlformats.org/officeDocument/2006/math" xmlns:v="urn:schemas-microsoft-com:vml" xmlns:wp14="http://schemas.microsoft.com/office/word/2010/wordprocessingDrawing" xmlns:wp="http://schemas.openxmlformats.org/drawingml/2006/wordprocessingDrawing" xmlns:w10="urn:schemas-microsoft-com:office:word" xmlns:w="http://schemas.openxmlformats.org/wordprocessingml/2006/main" xmlns:w14="http://schemas.microsoft.com/office/word/2010/wordml" xmlns:w15="http://schemas.microsoft.com/office/word/2012/wordml" xmlns:w16cex="http://schemas.microsoft.com/office/word/2018/wordml/cex" xmlns:w16cid="http://schemas.microsoft.com/office/word/2016/wordml/cid" xmlns:w16="http://schemas.microsoft.com/office/word/2018/wordml" xmlns:w16du="http://schemas.microsoft.com/office/word/2023/wordml/word16du" xmlns:w16sdtdh="http://schemas.microsoft.com/office/word/2020/wordml/sdtdatahash" xmlns:w16sdtfl="http://schemas.microsoft.com/office/word/2024/wordml/sdtformatlock" xmlns:w16se="http://schemas.microsoft.com/office/word/2015/wordml/symex" xmlns:wpg="http://schemas.microsoft.com/office/word/2010/wordprocessingGroup" xmlns:wpi="http://schemas.microsoft.com/office/word/2010/wordprocessingInk" xmlns:wne="http://schemas.microsoft.com/office/word/2006/wordml" xmlns:wps="http://schemas.microsoft.com/office/word/2010/wordprocessingShape" mc:Ignorable="w14 w15 w16se w16cid w16 w16cex w16sdtdh w16sdtfl w16du wp14">
   <w:footnote w:type="separator" w:id="-1">
     <w:p>
       <w:r>
@@ -33048,7 +35861,7 @@
 </file>
 
 <file path=word/header1.xml><?xml version="1.0" encoding="utf-8"?>
-<w:hdr xmlns:wpc="http://schemas.microsoft.com/office/word/2010/wordprocessingCanvas" xmlns:cx="http://schemas.microsoft.com/office/drawing/2014/chartex" xmlns:cx1="http://schemas.microsoft.com/office/drawing/2015/9/8/chartex" xmlns:cx2="http://schemas.microsoft.com/office/drawing/2015/10/21/chartex" xmlns:cx3="http://schemas.microsoft.com/office/drawing/2016/5/9/chartex" xmlns:cx4="http://schemas.microsoft.com/office/drawing/2016/5/10/chartex" xmlns:cx5="http://schemas.microsoft.com/office/drawing/2016/5/11/chartex" xmlns:cx6="http://schemas.microsoft.com/office/drawing/2016/5/12/chartex" xmlns:cx7="http://schemas.microsoft.com/office/drawing/2016/5/13/chartex" xmlns:cx8="http://schemas.microsoft.com/office/drawing/2016/5/14/chartex" xmlns:mc="http://schemas.openxmlformats.org/markup-compatibility/2006" xmlns:aink="http://schemas.microsoft.com/office/drawing/2016/ink" xmlns:am3d="http://schemas.microsoft.com/office/drawing/2017/model3d" xmlns:o="urn:schemas-microsoft-com:office:office" xmlns:oel="http://schemas.microsoft.com/office/2019/extlst" xmlns:r="http://schemas.openxmlformats.org/officeDocument/2006/relationships" xmlns:m="http://schemas.openxmlformats.org/officeDocument/2006/math" xmlns:v="urn:schemas-microsoft-com:vml" xmlns:wp14="http://schemas.microsoft.com/office/word/2010/wordprocessingDrawing" xmlns:wp="http://schemas.openxmlformats.org/drawingml/2006/wordprocessingDrawing" xmlns:w10="urn:schemas-microsoft-com:office:word" xmlns:w="http://schemas.openxmlformats.org/wordprocessingml/2006/main" xmlns:w14="http://schemas.microsoft.com/office/word/2010/wordml" xmlns:w15="http://schemas.microsoft.com/office/word/2012/wordml" xmlns:w16cex="http://schemas.microsoft.com/office/word/2018/wordml/cex" xmlns:w16cid="http://schemas.microsoft.com/office/word/2016/wordml/cid" xmlns:w16="http://schemas.microsoft.com/office/word/2018/wordml" xmlns:w16sdtdh="http://schemas.microsoft.com/office/word/2020/wordml/sdtdatahash" xmlns:w16se="http://schemas.microsoft.com/office/word/2015/wordml/symex" xmlns:wpg="http://schemas.microsoft.com/office/word/2010/wordprocessingGroup" xmlns:wpi="http://schemas.microsoft.com/office/word/2010/wordprocessingInk" xmlns:wne="http://schemas.microsoft.com/office/word/2006/wordml" xmlns:wps="http://schemas.microsoft.com/office/word/2010/wordprocessingShape" mc:Ignorable="w14 w15 w16se w16cid w16 w16cex w16sdtdh wp14">
+<w:hdr xmlns:wpc="http://schemas.microsoft.com/office/word/2010/wordprocessingCanvas" xmlns:cx="http://schemas.microsoft.com/office/drawing/2014/chartex" xmlns:cx1="http://schemas.microsoft.com/office/drawing/2015/9/8/chartex" xmlns:cx2="http://schemas.microsoft.com/office/drawing/2015/10/21/chartex" xmlns:cx3="http://schemas.microsoft.com/office/drawing/2016/5/9/chartex" xmlns:cx4="http://schemas.microsoft.com/office/drawing/2016/5/10/chartex" xmlns:cx5="http://schemas.microsoft.com/office/drawing/2016/5/11/chartex" xmlns:cx6="http://schemas.microsoft.com/office/drawing/2016/5/12/chartex" xmlns:cx7="http://schemas.microsoft.com/office/drawing/2016/5/13/chartex" xmlns:cx8="http://schemas.microsoft.com/office/drawing/2016/5/14/chartex" xmlns:mc="http://schemas.openxmlformats.org/markup-compatibility/2006" xmlns:aink="http://schemas.microsoft.com/office/drawing/2016/ink" xmlns:am3d="http://schemas.microsoft.com/office/drawing/2017/model3d" xmlns:o="urn:schemas-microsoft-com:office:office" xmlns:oel="http://schemas.microsoft.com/office/2019/extlst" xmlns:r="http://schemas.openxmlformats.org/officeDocument/2006/relationships" xmlns:m="http://schemas.openxmlformats.org/officeDocument/2006/math" xmlns:v="urn:schemas-microsoft-com:vml" xmlns:wp14="http://schemas.microsoft.com/office/word/2010/wordprocessingDrawing" xmlns:wp="http://schemas.openxmlformats.org/drawingml/2006/wordprocessingDrawing" xmlns:w10="urn:schemas-microsoft-com:office:word" xmlns:w="http://schemas.openxmlformats.org/wordprocessingml/2006/main" xmlns:w14="http://schemas.microsoft.com/office/word/2010/wordml" xmlns:w15="http://schemas.microsoft.com/office/word/2012/wordml" xmlns:w16cex="http://schemas.microsoft.com/office/word/2018/wordml/cex" xmlns:w16cid="http://schemas.microsoft.com/office/word/2016/wordml/cid" xmlns:w16="http://schemas.microsoft.com/office/word/2018/wordml" xmlns:w16du="http://schemas.microsoft.com/office/word/2023/wordml/word16du" xmlns:w16sdtdh="http://schemas.microsoft.com/office/word/2020/wordml/sdtdatahash" xmlns:w16sdtfl="http://schemas.microsoft.com/office/word/2024/wordml/sdtformatlock" xmlns:w16se="http://schemas.microsoft.com/office/word/2015/wordml/symex" xmlns:wpg="http://schemas.microsoft.com/office/word/2010/wordprocessingGroup" xmlns:wpi="http://schemas.microsoft.com/office/word/2010/wordprocessingInk" xmlns:wne="http://schemas.microsoft.com/office/word/2006/wordml" xmlns:wps="http://schemas.microsoft.com/office/word/2010/wordprocessingShape" mc:Ignorable="w14 w15 w16se w16cid w16 w16cex w16sdtdh w16sdtfl w16du wp14">
   <w:p>
     <w:pPr>
       <w:pStyle w:val="Encabezado"/>
@@ -33141,7 +35954,7 @@
 </file>
 
 <file path=word/numbering.xml><?xml version="1.0" encoding="utf-8"?>
-<w:numbering xmlns:wpc="http://schemas.microsoft.com/office/word/2010/wordprocessingCanvas" xmlns:cx="http://schemas.microsoft.com/office/drawing/2014/chartex" xmlns:cx1="http://schemas.microsoft.com/office/drawing/2015/9/8/chartex" xmlns:cx2="http://schemas.microsoft.com/office/drawing/2015/10/21/chartex" xmlns:cx3="http://schemas.microsoft.com/office/drawing/2016/5/9/chartex" xmlns:cx4="http://schemas.microsoft.com/office/drawing/2016/5/10/chartex" xmlns:cx5="http://schemas.microsoft.com/office/drawing/2016/5/11/chartex" xmlns:cx6="http://schemas.microsoft.com/office/drawing/2016/5/12/chartex" xmlns:cx7="http://schemas.microsoft.com/office/drawing/2016/5/13/chartex" xmlns:cx8="http://schemas.microsoft.com/office/drawing/2016/5/14/chartex" xmlns:mc="http://schemas.openxmlformats.org/markup-compatibility/2006" xmlns:aink="http://schemas.microsoft.com/office/drawing/2016/ink" xmlns:am3d="http://schemas.microsoft.com/office/drawing/2017/model3d" xmlns:o="urn:schemas-microsoft-com:office:office" xmlns:oel="http://schemas.microsoft.com/office/2019/extlst" xmlns:r="http://schemas.openxmlformats.org/officeDocument/2006/relationships" xmlns:m="http://schemas.openxmlformats.org/officeDocument/2006/math" xmlns:v="urn:schemas-microsoft-com:vml" xmlns:wp14="http://schemas.microsoft.com/office/word/2010/wordprocessingDrawing" xmlns:wp="http://schemas.openxmlformats.org/drawingml/2006/wordprocessingDrawing" xmlns:w10="urn:schemas-microsoft-com:office:word" xmlns:w="http://schemas.openxmlformats.org/wordprocessingml/2006/main" xmlns:w14="http://schemas.microsoft.com/office/word/2010/wordml" xmlns:w15="http://schemas.microsoft.com/office/word/2012/wordml" xmlns:w16cex="http://schemas.microsoft.com/office/word/2018/wordml/cex" xmlns:w16cid="http://schemas.microsoft.com/office/word/2016/wordml/cid" xmlns:w16="http://schemas.microsoft.com/office/word/2018/wordml" xmlns:w16sdtdh="http://schemas.microsoft.com/office/word/2020/wordml/sdtdatahash" xmlns:w16se="http://schemas.microsoft.com/office/word/2015/wordml/symex" xmlns:wpg="http://schemas.microsoft.com/office/word/2010/wordprocessingGroup" xmlns:wpi="http://schemas.microsoft.com/office/word/2010/wordprocessingInk" xmlns:wne="http://schemas.microsoft.com/office/word/2006/wordml" xmlns:wps="http://schemas.microsoft.com/office/word/2010/wordprocessingShape" mc:Ignorable="w14 w15 w16se w16cid w16 w16cex w16sdtdh wp14">
+<w:numbering xmlns:wpc="http://schemas.microsoft.com/office/word/2010/wordprocessingCanvas" xmlns:cx="http://schemas.microsoft.com/office/drawing/2014/chartex" xmlns:cx1="http://schemas.microsoft.com/office/drawing/2015/9/8/chartex" xmlns:cx2="http://schemas.microsoft.com/office/drawing/2015/10/21/chartex" xmlns:cx3="http://schemas.microsoft.com/office/drawing/2016/5/9/chartex" xmlns:cx4="http://schemas.microsoft.com/office/drawing/2016/5/10/chartex" xmlns:cx5="http://schemas.microsoft.com/office/drawing/2016/5/11/chartex" xmlns:cx6="http://schemas.microsoft.com/office/drawing/2016/5/12/chartex" xmlns:cx7="http://schemas.microsoft.com/office/drawing/2016/5/13/chartex" xmlns:cx8="http://schemas.microsoft.com/office/drawing/2016/5/14/chartex" xmlns:mc="http://schemas.openxmlformats.org/markup-compatibility/2006" xmlns:aink="http://schemas.microsoft.com/office/drawing/2016/ink" xmlns:am3d="http://schemas.microsoft.com/office/drawing/2017/model3d" xmlns:o="urn:schemas-microsoft-com:office:office" xmlns:oel="http://schemas.microsoft.com/office/2019/extlst" xmlns:r="http://schemas.openxmlformats.org/officeDocument/2006/relationships" xmlns:m="http://schemas.openxmlformats.org/officeDocument/2006/math" xmlns:v="urn:schemas-microsoft-com:vml" xmlns:wp14="http://schemas.microsoft.com/office/word/2010/wordprocessingDrawing" xmlns:wp="http://schemas.openxmlformats.org/drawingml/2006/wordprocessingDrawing" xmlns:w10="urn:schemas-microsoft-com:office:word" xmlns:w="http://schemas.openxmlformats.org/wordprocessingml/2006/main" xmlns:w14="http://schemas.microsoft.com/office/word/2010/wordml" xmlns:w15="http://schemas.microsoft.com/office/word/2012/wordml" xmlns:w16cex="http://schemas.microsoft.com/office/word/2018/wordml/cex" xmlns:w16cid="http://schemas.microsoft.com/office/word/2016/wordml/cid" xmlns:w16="http://schemas.microsoft.com/office/word/2018/wordml" xmlns:w16du="http://schemas.microsoft.com/office/word/2023/wordml/word16du" xmlns:w16sdtdh="http://schemas.microsoft.com/office/word/2020/wordml/sdtdatahash" xmlns:w16sdtfl="http://schemas.microsoft.com/office/word/2024/wordml/sdtformatlock" xmlns:w16se="http://schemas.microsoft.com/office/word/2015/wordml/symex" xmlns:wpg="http://schemas.microsoft.com/office/word/2010/wordprocessingGroup" xmlns:wpi="http://schemas.microsoft.com/office/word/2010/wordprocessingInk" xmlns:wne="http://schemas.microsoft.com/office/word/2006/wordml" xmlns:wps="http://schemas.microsoft.com/office/word/2010/wordprocessingShape" mc:Ignorable="w14 w15 w16se w16cid w16 w16cex w16sdtdh w16sdtfl w16du wp14">
   <w:abstractNum w:abstractNumId="0" w15:restartNumberingAfterBreak="0">
     <w:nsid w:val="07322D63"/>
     <w:multiLevelType w:val="hybridMultilevel"/>
@@ -34717,7 +37530,7 @@
 </file>
 
 <file path=word/styles.xml><?xml version="1.0" encoding="utf-8"?>
-<w:styles xmlns:mc="http://schemas.openxmlformats.org/markup-compatibility/2006" xmlns:r="http://schemas.openxmlformats.org/officeDocument/2006/relationships" xmlns:w="http://schemas.openxmlformats.org/wordprocessingml/2006/main" xmlns:w14="http://schemas.microsoft.com/office/word/2010/wordml" xmlns:w15="http://schemas.microsoft.com/office/word/2012/wordml" xmlns:w16cex="http://schemas.microsoft.com/office/word/2018/wordml/cex" xmlns:w16cid="http://schemas.microsoft.com/office/word/2016/wordml/cid" xmlns:w16="http://schemas.microsoft.com/office/word/2018/wordml" xmlns:w16sdtdh="http://schemas.microsoft.com/office/word/2020/wordml/sdtdatahash" xmlns:w16se="http://schemas.microsoft.com/office/word/2015/wordml/symex" mc:Ignorable="w14 w15 w16se w16cid w16 w16cex w16sdtdh">
+<w:styles xmlns:mc="http://schemas.openxmlformats.org/markup-compatibility/2006" xmlns:r="http://schemas.openxmlformats.org/officeDocument/2006/relationships" xmlns:w="http://schemas.openxmlformats.org/wordprocessingml/2006/main" xmlns:w14="http://schemas.microsoft.com/office/word/2010/wordml" xmlns:w15="http://schemas.microsoft.com/office/word/2012/wordml" xmlns:w16cex="http://schemas.microsoft.com/office/word/2018/wordml/cex" xmlns:w16cid="http://schemas.microsoft.com/office/word/2016/wordml/cid" xmlns:w16="http://schemas.microsoft.com/office/word/2018/wordml" xmlns:w16du="http://schemas.microsoft.com/office/word/2023/wordml/word16du" xmlns:w16sdtdh="http://schemas.microsoft.com/office/word/2020/wordml/sdtdatahash" xmlns:w16sdtfl="http://schemas.microsoft.com/office/word/2024/wordml/sdtformatlock" xmlns:w16se="http://schemas.microsoft.com/office/word/2015/wordml/symex" mc:Ignorable="w14 w15 w16se w16cid w16 w16cex w16sdtdh w16sdtfl w16du">
   <w:docDefaults>
     <w:rPrDefault>
       <w:rPr>
@@ -35209,7 +38022,6 @@
   <w:style w:type="character" w:default="1" w:styleId="Fuentedeprrafopredeter">
     <w:name w:val="Default Paragraph Font"/>
     <w:uiPriority w:val="1"/>
-    <w:semiHidden/>
     <w:unhideWhenUsed/>
   </w:style>
   <w:style w:type="table" w:default="1" w:styleId="Tablanormal">
@@ -36188,7 +39000,7 @@
 </file>
 
 <file path=word/glossary/document.xml><?xml version="1.0" encoding="utf-8"?>
-<w:glossaryDocument xmlns:wpc="http://schemas.microsoft.com/office/word/2010/wordprocessingCanvas" xmlns:cx="http://schemas.microsoft.com/office/drawing/2014/chartex" xmlns:cx1="http://schemas.microsoft.com/office/drawing/2015/9/8/chartex" xmlns:cx2="http://schemas.microsoft.com/office/drawing/2015/10/21/chartex" xmlns:cx3="http://schemas.microsoft.com/office/drawing/2016/5/9/chartex" xmlns:cx4="http://schemas.microsoft.com/office/drawing/2016/5/10/chartex" xmlns:cx5="http://schemas.microsoft.com/office/drawing/2016/5/11/chartex" xmlns:cx6="http://schemas.microsoft.com/office/drawing/2016/5/12/chartex" xmlns:cx7="http://schemas.microsoft.com/office/drawing/2016/5/13/chartex" xmlns:cx8="http://schemas.microsoft.com/office/drawing/2016/5/14/chartex" xmlns:mc="http://schemas.openxmlformats.org/markup-compatibility/2006" xmlns:aink="http://schemas.microsoft.com/office/drawing/2016/ink" xmlns:am3d="http://schemas.microsoft.com/office/drawing/2017/model3d" xmlns:o="urn:schemas-microsoft-com:office:office" xmlns:oel="http://schemas.microsoft.com/office/2019/extlst" xmlns:r="http://schemas.openxmlformats.org/officeDocument/2006/relationships" xmlns:m="http://schemas.openxmlformats.org/officeDocument/2006/math" xmlns:v="urn:schemas-microsoft-com:vml" xmlns:wp14="http://schemas.microsoft.com/office/word/2010/wordprocessingDrawing" xmlns:wp="http://schemas.openxmlformats.org/drawingml/2006/wordprocessingDrawing" xmlns:w10="urn:schemas-microsoft-com:office:word" xmlns:w="http://schemas.openxmlformats.org/wordprocessingml/2006/main" xmlns:w14="http://schemas.microsoft.com/office/word/2010/wordml" xmlns:w15="http://schemas.microsoft.com/office/word/2012/wordml" xmlns:w16cex="http://schemas.microsoft.com/office/word/2018/wordml/cex" xmlns:w16cid="http://schemas.microsoft.com/office/word/2016/wordml/cid" xmlns:w16="http://schemas.microsoft.com/office/word/2018/wordml" xmlns:w16sdtdh="http://schemas.microsoft.com/office/word/2020/wordml/sdtdatahash" xmlns:w16se="http://schemas.microsoft.com/office/word/2015/wordml/symex" xmlns:wpg="http://schemas.microsoft.com/office/word/2010/wordprocessingGroup" xmlns:wpi="http://schemas.microsoft.com/office/word/2010/wordprocessingInk" xmlns:wne="http://schemas.microsoft.com/office/word/2006/wordml" xmlns:wps="http://schemas.microsoft.com/office/word/2010/wordprocessingShape" mc:Ignorable="w14 w15 w16se w16cid w16 w16cex w16sdtdh wp14">
+<w:glossaryDocument xmlns:wpc="http://schemas.microsoft.com/office/word/2010/wordprocessingCanvas" xmlns:cx="http://schemas.microsoft.com/office/drawing/2014/chartex" xmlns:cx1="http://schemas.microsoft.com/office/drawing/2015/9/8/chartex" xmlns:cx2="http://schemas.microsoft.com/office/drawing/2015/10/21/chartex" xmlns:cx3="http://schemas.microsoft.com/office/drawing/2016/5/9/chartex" xmlns:cx4="http://schemas.microsoft.com/office/drawing/2016/5/10/chartex" xmlns:cx5="http://schemas.microsoft.com/office/drawing/2016/5/11/chartex" xmlns:cx6="http://schemas.microsoft.com/office/drawing/2016/5/12/chartex" xmlns:cx7="http://schemas.microsoft.com/office/drawing/2016/5/13/chartex" xmlns:cx8="http://schemas.microsoft.com/office/drawing/2016/5/14/chartex" xmlns:mc="http://schemas.openxmlformats.org/markup-compatibility/2006" xmlns:aink="http://schemas.microsoft.com/office/drawing/2016/ink" xmlns:am3d="http://schemas.microsoft.com/office/drawing/2017/model3d" xmlns:o="urn:schemas-microsoft-com:office:office" xmlns:oel="http://schemas.microsoft.com/office/2019/extlst" xmlns:r="http://schemas.openxmlformats.org/officeDocument/2006/relationships" xmlns:m="http://schemas.openxmlformats.org/officeDocument/2006/math" xmlns:v="urn:schemas-microsoft-com:vml" xmlns:wp14="http://schemas.microsoft.com/office/word/2010/wordprocessingDrawing" xmlns:wp="http://schemas.openxmlformats.org/drawingml/2006/wordprocessingDrawing" xmlns:w10="urn:schemas-microsoft-com:office:word" xmlns:w="http://schemas.openxmlformats.org/wordprocessingml/2006/main" xmlns:w14="http://schemas.microsoft.com/office/word/2010/wordml" xmlns:w15="http://schemas.microsoft.com/office/word/2012/wordml" xmlns:w16cex="http://schemas.microsoft.com/office/word/2018/wordml/cex" xmlns:w16cid="http://schemas.microsoft.com/office/word/2016/wordml/cid" xmlns:w16="http://schemas.microsoft.com/office/word/2018/wordml" xmlns:w16du="http://schemas.microsoft.com/office/word/2023/wordml/word16du" xmlns:w16sdtdh="http://schemas.microsoft.com/office/word/2020/wordml/sdtdatahash" xmlns:w16sdtfl="http://schemas.microsoft.com/office/word/2024/wordml/sdtformatlock" xmlns:w16se="http://schemas.microsoft.com/office/word/2015/wordml/symex" xmlns:wpg="http://schemas.microsoft.com/office/word/2010/wordprocessingGroup" xmlns:wpi="http://schemas.microsoft.com/office/word/2010/wordprocessingInk" xmlns:wne="http://schemas.microsoft.com/office/word/2006/wordml" xmlns:wps="http://schemas.microsoft.com/office/word/2010/wordprocessingShape" mc:Ignorable="w14 w15 w16se w16cid w16 w16cex w16sdtdh w16sdtfl w16du wp14">
   <w:docParts>
     <w:docPart>
       <w:docPartPr>
@@ -36467,7 +39279,7 @@
 </file>
 
 <file path=word/glossary/fontTable.xml><?xml version="1.0" encoding="utf-8"?>
-<w:fonts xmlns:mc="http://schemas.openxmlformats.org/markup-compatibility/2006" xmlns:r="http://schemas.openxmlformats.org/officeDocument/2006/relationships" xmlns:w="http://schemas.openxmlformats.org/wordprocessingml/2006/main" xmlns:w14="http://schemas.microsoft.com/office/word/2010/wordml" xmlns:w15="http://schemas.microsoft.com/office/word/2012/wordml" xmlns:w16cex="http://schemas.microsoft.com/office/word/2018/wordml/cex" xmlns:w16cid="http://schemas.microsoft.com/office/word/2016/wordml/cid" xmlns:w16="http://schemas.microsoft.com/office/word/2018/wordml" xmlns:w16sdtdh="http://schemas.microsoft.com/office/word/2020/wordml/sdtdatahash" xmlns:w16se="http://schemas.microsoft.com/office/word/2015/wordml/symex" mc:Ignorable="w14 w15 w16se w16cid w16 w16cex w16sdtdh">
+<w:fonts xmlns:mc="http://schemas.openxmlformats.org/markup-compatibility/2006" xmlns:r="http://schemas.openxmlformats.org/officeDocument/2006/relationships" xmlns:w="http://schemas.openxmlformats.org/wordprocessingml/2006/main" xmlns:w14="http://schemas.microsoft.com/office/word/2010/wordml" xmlns:w15="http://schemas.microsoft.com/office/word/2012/wordml" xmlns:w16cex="http://schemas.microsoft.com/office/word/2018/wordml/cex" xmlns:w16cid="http://schemas.microsoft.com/office/word/2016/wordml/cid" xmlns:w16="http://schemas.microsoft.com/office/word/2018/wordml" xmlns:w16du="http://schemas.microsoft.com/office/word/2023/wordml/word16du" xmlns:w16sdtdh="http://schemas.microsoft.com/office/word/2020/wordml/sdtdatahash" xmlns:w16sdtfl="http://schemas.microsoft.com/office/word/2024/wordml/sdtformatlock" xmlns:w16se="http://schemas.microsoft.com/office/word/2015/wordml/symex" mc:Ignorable="w14 w15 w16se w16cid w16 w16cex w16sdtdh w16sdtfl w16du">
   <w:font w:name="Symbol">
     <w:panose1 w:val="05050102010706020507"/>
     <w:charset w:val="02"/>
@@ -36504,7 +39316,6 @@
     <w:sig w:usb0="E4002EFF" w:usb1="C200247B" w:usb2="00000009" w:usb3="00000000" w:csb0="000001FF" w:csb1="00000000"/>
   </w:font>
   <w:font w:name="MS Mincho">
-    <w:altName w:val="ＭＳ 明朝"/>
     <w:panose1 w:val="02020609040205080304"/>
     <w:charset w:val="80"/>
     <w:family w:val="modern"/>
@@ -36544,7 +39355,7 @@
 </file>
 
 <file path=word/glossary/settings.xml><?xml version="1.0" encoding="utf-8"?>
-<w:settings xmlns:mc="http://schemas.openxmlformats.org/markup-compatibility/2006" xmlns:o="urn:schemas-microsoft-com:office:office" xmlns:r="http://schemas.openxmlformats.org/officeDocument/2006/relationships" xmlns:m="http://schemas.openxmlformats.org/officeDocument/2006/math" xmlns:v="urn:schemas-microsoft-com:vml" xmlns:w10="urn:schemas-microsoft-com:office:word" xmlns:w="http://schemas.openxmlformats.org/wordprocessingml/2006/main" xmlns:w14="http://schemas.microsoft.com/office/word/2010/wordml" xmlns:w15="http://schemas.microsoft.com/office/word/2012/wordml" xmlns:w16cex="http://schemas.microsoft.com/office/word/2018/wordml/cex" xmlns:w16cid="http://schemas.microsoft.com/office/word/2016/wordml/cid" xmlns:w16="http://schemas.microsoft.com/office/word/2018/wordml" xmlns:w16sdtdh="http://schemas.microsoft.com/office/word/2020/wordml/sdtdatahash" xmlns:w16se="http://schemas.microsoft.com/office/word/2015/wordml/symex" xmlns:sl="http://schemas.openxmlformats.org/schemaLibrary/2006/main" mc:Ignorable="w14 w15 w16se w16cid w16 w16cex w16sdtdh">
+<w:settings xmlns:mc="http://schemas.openxmlformats.org/markup-compatibility/2006" xmlns:o="urn:schemas-microsoft-com:office:office" xmlns:r="http://schemas.openxmlformats.org/officeDocument/2006/relationships" xmlns:m="http://schemas.openxmlformats.org/officeDocument/2006/math" xmlns:v="urn:schemas-microsoft-com:vml" xmlns:w10="urn:schemas-microsoft-com:office:word" xmlns:w="http://schemas.openxmlformats.org/wordprocessingml/2006/main" xmlns:w14="http://schemas.microsoft.com/office/word/2010/wordml" xmlns:w15="http://schemas.microsoft.com/office/word/2012/wordml" xmlns:w16cex="http://schemas.microsoft.com/office/word/2018/wordml/cex" xmlns:w16cid="http://schemas.microsoft.com/office/word/2016/wordml/cid" xmlns:w16="http://schemas.microsoft.com/office/word/2018/wordml" xmlns:w16du="http://schemas.microsoft.com/office/word/2023/wordml/word16du" xmlns:w16sdtdh="http://schemas.microsoft.com/office/word/2020/wordml/sdtdatahash" xmlns:w16sdtfl="http://schemas.microsoft.com/office/word/2024/wordml/sdtformatlock" xmlns:w16se="http://schemas.microsoft.com/office/word/2015/wordml/symex" xmlns:sl="http://schemas.openxmlformats.org/schemaLibrary/2006/main" mc:Ignorable="w14 w15 w16se w16cid w16 w16cex w16sdtdh w16sdtfl w16du">
   <w:view w:val="normal"/>
   <w:defaultTabStop w:val="708"/>
   <w:hyphenationZone w:val="425"/>
@@ -36568,6 +39379,7 @@
     <w:rsid w:val="000C2B5E"/>
     <w:rsid w:val="00112C1E"/>
     <w:rsid w:val="001370FA"/>
+    <w:rsid w:val="0019656C"/>
     <w:rsid w:val="00216802"/>
     <w:rsid w:val="00236FE3"/>
     <w:rsid w:val="002416C9"/>
@@ -36599,6 +39411,7 @@
     <w:rsid w:val="005709E5"/>
     <w:rsid w:val="005959B3"/>
     <w:rsid w:val="005C0E72"/>
+    <w:rsid w:val="005D4E63"/>
     <w:rsid w:val="00605C0D"/>
     <w:rsid w:val="0063227A"/>
     <w:rsid w:val="0066166D"/>
@@ -36612,6 +39425,7 @@
     <w:rsid w:val="007D1778"/>
     <w:rsid w:val="007D7A65"/>
     <w:rsid w:val="007E0BE2"/>
+    <w:rsid w:val="007F13E2"/>
     <w:rsid w:val="00807A4A"/>
     <w:rsid w:val="0081382F"/>
     <w:rsid w:val="00893BCB"/>
@@ -36620,6 +39434,7 @@
     <w:rsid w:val="00962633"/>
     <w:rsid w:val="00963B15"/>
     <w:rsid w:val="009645DB"/>
+    <w:rsid w:val="009804EC"/>
     <w:rsid w:val="009C318C"/>
     <w:rsid w:val="009C5A38"/>
     <w:rsid w:val="009D0F67"/>
@@ -36643,6 +39458,8 @@
     <w:rsid w:val="00CE3A99"/>
     <w:rsid w:val="00D40097"/>
     <w:rsid w:val="00D613BA"/>
+    <w:rsid w:val="00D8033D"/>
+    <w:rsid w:val="00D90F43"/>
     <w:rsid w:val="00E03F4D"/>
     <w:rsid w:val="00E1070B"/>
     <w:rsid w:val="00E32BA3"/>
@@ -36673,7 +39490,7 @@
 </file>
 
 <file path=word/glossary/styles.xml><?xml version="1.0" encoding="utf-8"?>
-<w:styles xmlns:mc="http://schemas.openxmlformats.org/markup-compatibility/2006" xmlns:r="http://schemas.openxmlformats.org/officeDocument/2006/relationships" xmlns:w="http://schemas.openxmlformats.org/wordprocessingml/2006/main" xmlns:w14="http://schemas.microsoft.com/office/word/2010/wordml" xmlns:w15="http://schemas.microsoft.com/office/word/2012/wordml" xmlns:w16cex="http://schemas.microsoft.com/office/word/2018/wordml/cex" xmlns:w16cid="http://schemas.microsoft.com/office/word/2016/wordml/cid" xmlns:w16="http://schemas.microsoft.com/office/word/2018/wordml" xmlns:w16sdtdh="http://schemas.microsoft.com/office/word/2020/wordml/sdtdatahash" xmlns:w16se="http://schemas.microsoft.com/office/word/2015/wordml/symex" mc:Ignorable="w14 w15 w16se w16cid w16 w16cex w16sdtdh">
+<w:styles xmlns:mc="http://schemas.openxmlformats.org/markup-compatibility/2006" xmlns:r="http://schemas.openxmlformats.org/officeDocument/2006/relationships" xmlns:w="http://schemas.openxmlformats.org/wordprocessingml/2006/main" xmlns:w14="http://schemas.microsoft.com/office/word/2010/wordml" xmlns:w15="http://schemas.microsoft.com/office/word/2012/wordml" xmlns:w16cex="http://schemas.microsoft.com/office/word/2018/wordml/cex" xmlns:w16cid="http://schemas.microsoft.com/office/word/2016/wordml/cid" xmlns:w16="http://schemas.microsoft.com/office/word/2018/wordml" xmlns:w16du="http://schemas.microsoft.com/office/word/2023/wordml/word16du" xmlns:w16sdtdh="http://schemas.microsoft.com/office/word/2020/wordml/sdtdatahash" xmlns:w16sdtfl="http://schemas.microsoft.com/office/word/2024/wordml/sdtformatlock" xmlns:w16se="http://schemas.microsoft.com/office/word/2015/wordml/symex" mc:Ignorable="w14 w15 w16se w16cid w16 w16cex w16sdtdh w16sdtfl w16du">
   <w:docDefaults>
     <w:rPrDefault>
       <w:rPr>
@@ -37167,7 +39984,7 @@
 </file>
 
 <file path=word/glossary/webSettings.xml><?xml version="1.0" encoding="utf-8"?>
-<w:webSettings xmlns:mc="http://schemas.openxmlformats.org/markup-compatibility/2006" xmlns:r="http://schemas.openxmlformats.org/officeDocument/2006/relationships" xmlns:w="http://schemas.openxmlformats.org/wordprocessingml/2006/main" xmlns:w14="http://schemas.microsoft.com/office/word/2010/wordml" xmlns:w15="http://schemas.microsoft.com/office/word/2012/wordml" xmlns:w16cex="http://schemas.microsoft.com/office/word/2018/wordml/cex" xmlns:w16cid="http://schemas.microsoft.com/office/word/2016/wordml/cid" xmlns:w16="http://schemas.microsoft.com/office/word/2018/wordml" xmlns:w16sdtdh="http://schemas.microsoft.com/office/word/2020/wordml/sdtdatahash" xmlns:w16se="http://schemas.microsoft.com/office/word/2015/wordml/symex" mc:Ignorable="w14 w15 w16se w16cid w16 w16cex w16sdtdh">
+<w:webSettings xmlns:mc="http://schemas.openxmlformats.org/markup-compatibility/2006" xmlns:r="http://schemas.openxmlformats.org/officeDocument/2006/relationships" xmlns:w="http://schemas.openxmlformats.org/wordprocessingml/2006/main" xmlns:w14="http://schemas.microsoft.com/office/word/2010/wordml" xmlns:w15="http://schemas.microsoft.com/office/word/2012/wordml" xmlns:w16cex="http://schemas.microsoft.com/office/word/2018/wordml/cex" xmlns:w16cid="http://schemas.microsoft.com/office/word/2016/wordml/cid" xmlns:w16="http://schemas.microsoft.com/office/word/2018/wordml" xmlns:w16du="http://schemas.microsoft.com/office/word/2023/wordml/word16du" xmlns:w16sdtdh="http://schemas.microsoft.com/office/word/2020/wordml/sdtdatahash" xmlns:w16sdtfl="http://schemas.microsoft.com/office/word/2024/wordml/sdtformatlock" xmlns:w16se="http://schemas.microsoft.com/office/word/2015/wordml/symex" mc:Ignorable="w14 w15 w16se w16cid w16 w16cex w16sdtdh w16sdtfl w16du">
   <w:optimizeForBrowser/>
   <w:allowPNG/>
 </w:webSettings>

</xml_diff>

<commit_message>
Segundo guardado (14/05/2026, 10:44)
</commit_message>
<xml_diff>
--- a/UT_7_2024_2025 (2).docx
+++ b/UT_7_2024_2025 (2).docx
@@ -5846,9 +5846,9 @@
       </w:r>
     </w:p>
     <w:p/>
-    <w:bookmarkStart w:id="6" w:name="_Toc170148631" w:displacedByCustomXml="next"/>
+    <w:bookmarkStart w:id="6" w:name="_Toc170148316" w:displacedByCustomXml="next"/>
     <w:bookmarkStart w:id="7" w:name="_Toc49341785" w:displacedByCustomXml="next"/>
-    <w:bookmarkStart w:id="8" w:name="_Toc170148316" w:displacedByCustomXml="next"/>
+    <w:bookmarkStart w:id="8" w:name="_Toc170148631" w:displacedByCustomXml="next"/>
     <w:sdt>
       <w:sdtPr>
         <w:rPr>
@@ -17989,6 +17989,9 @@
     </w:p>
     <w:p>
       <w:r>
+        <w:rPr>
+          <w:noProof/>
+        </w:rPr>
         <w:drawing>
           <wp:inline distT="0" distB="0" distL="0" distR="0" wp14:anchorId="5C89E121" wp14:editId="4F4EFF5C">
             <wp:extent cx="4305300" cy="1491548"/>
@@ -18052,6 +18055,7 @@
         <w:rPr>
           <w:b/>
           <w:bCs/>
+          <w:noProof/>
         </w:rPr>
         <w:drawing>
           <wp:inline distT="0" distB="0" distL="0" distR="0" wp14:anchorId="7D6B2FDC" wp14:editId="7AD45EDA">
@@ -18116,6 +18120,7 @@
         <w:rPr>
           <w:b/>
           <w:bCs/>
+          <w:noProof/>
         </w:rPr>
         <w:drawing>
           <wp:inline distT="0" distB="0" distL="0" distR="0" wp14:anchorId="369D85FB" wp14:editId="680F756A">
@@ -18376,16 +18381,8 @@
       <w:bookmarkEnd w:id="125"/>
     </w:p>
     <w:p>
-      <w:pPr>
-        <w:rPr>
-          <w:color w:val="FF0000"/>
-        </w:rPr>
-      </w:pPr>
-      <w:r>
-        <w:rPr>
-          <w:color w:val="FF0000"/>
-        </w:rPr>
-        <w:t>Rellenar</w:t>
+      <w:r>
+        <w:t>La aplicación va a disponer de un archivo de configuración que se va a encargar de almacenar los parámetros que van a ser necesarios para el funcionamiento del sistema. En el archivo se va a guardar el nombre de la base de datos, la conexión a la base de datos, los usuarios con su contraseña para poder acceder, la tura de almacenamiento de las copias de seguridad…</w:t>
       </w:r>
     </w:p>
     <w:p/>
@@ -18397,6 +18394,7 @@
       <w:bookmarkStart w:id="127" w:name="_Toc170148361"/>
       <w:bookmarkStart w:id="128" w:name="_Toc170148676"/>
       <w:r>
+        <w:lastRenderedPageBreak/>
         <w:t>Estructura del fichero de datos</w:t>
       </w:r>
       <w:bookmarkEnd w:id="126"/>
@@ -18404,19 +18402,24 @@
       <w:bookmarkEnd w:id="128"/>
     </w:p>
     <w:p>
-      <w:pPr>
-        <w:rPr>
-          <w:color w:val="FF0000"/>
-        </w:rPr>
-      </w:pPr>
-      <w:r>
-        <w:rPr>
-          <w:color w:val="FF0000"/>
-        </w:rPr>
-        <w:t>Rellenar</w:t>
+      <w:r>
+        <w:t xml:space="preserve">Los ficheros van a utilizar la codificación UTF-8 y estarán separados por comas (,), para poder leer correctamente los caracteres especiales. Los campos serán </w:t>
       </w:r>
     </w:p>
-    <w:p/>
+    <w:p>
+      <w:r>
+        <w:t>“ALUMNO”,</w:t>
+      </w:r>
+      <w:r>
+        <w:t xml:space="preserve"> “APELLIDOS”, “NOMBRE”,</w:t>
+      </w:r>
+      <w:r>
+        <w:t xml:space="preserve"> “NUMEROESCOLAR”, “NUMEROSOLICITUD”, “FECHASOLICITUD”, “CURSOACADEMICO”, “MATRICULADO”, “TITULOLIBRO”, </w:t>
+      </w:r>
+      <w:r>
+        <w:t>“ESTADOPRESTAMO”</w:t>
+      </w:r>
+    </w:p>
     <w:p>
       <w:pPr>
         <w:pStyle w:val="Ttulo2"/>
@@ -18425,7 +18428,6 @@
       <w:bookmarkStart w:id="130" w:name="_Toc170148362"/>
       <w:bookmarkStart w:id="131" w:name="_Toc170148677"/>
       <w:r>
-        <w:lastRenderedPageBreak/>
         <w:t>Diseño de la estructura de clases y librerías (diagrama de clases)</w:t>
       </w:r>
       <w:bookmarkEnd w:id="129"/>
@@ -18786,9 +18788,9 @@
           <w:szCs w:val="144"/>
         </w:rPr>
       </w:pPr>
-      <w:bookmarkStart w:id="145" w:name="_Toc49341857"/>
-      <w:bookmarkStart w:id="146" w:name="_Toc170148367"/>
-      <w:bookmarkStart w:id="147" w:name="_Toc170148681"/>
+      <w:bookmarkStart w:id="144" w:name="_Toc49341857"/>
+      <w:bookmarkStart w:id="145" w:name="_Toc170148367"/>
+      <w:bookmarkStart w:id="146" w:name="_Toc170148681"/>
       <w:r>
         <w:rPr>
           <w:sz w:val="144"/>
@@ -18797,9 +18799,9 @@
         <w:lastRenderedPageBreak/>
         <w:t>Implementar el proyecto</w:t>
       </w:r>
+      <w:bookmarkEnd w:id="144"/>
       <w:bookmarkEnd w:id="145"/>
       <w:bookmarkEnd w:id="146"/>
-      <w:bookmarkEnd w:id="147"/>
     </w:p>
     <w:p>
       <w:pPr>
@@ -18820,12 +18822,12 @@
       <w:pPr>
         <w:pStyle w:val="Ttulo3"/>
       </w:pPr>
-      <w:bookmarkStart w:id="148" w:name="_Toc49341830"/>
-      <w:bookmarkStart w:id="149" w:name="_Toc170148357"/>
-      <w:bookmarkStart w:id="150" w:name="_Toc170148672"/>
-      <w:bookmarkStart w:id="151" w:name="_Toc49341858"/>
-      <w:bookmarkStart w:id="152" w:name="_Toc170148368"/>
-      <w:bookmarkStart w:id="153" w:name="_Toc170148682"/>
+      <w:bookmarkStart w:id="147" w:name="_Toc49341830"/>
+      <w:bookmarkStart w:id="148" w:name="_Toc170148357"/>
+      <w:bookmarkStart w:id="149" w:name="_Toc170148672"/>
+      <w:bookmarkStart w:id="150" w:name="_Toc49341858"/>
+      <w:bookmarkStart w:id="151" w:name="_Toc170148368"/>
+      <w:bookmarkStart w:id="152" w:name="_Toc170148682"/>
       <w:proofErr w:type="spellStart"/>
       <w:r>
         <w:lastRenderedPageBreak/>
@@ -18835,9 +18837,9 @@
       <w:r>
         <w:t xml:space="preserve"> de creación (MySQL)</w:t>
       </w:r>
+      <w:bookmarkEnd w:id="147"/>
       <w:bookmarkEnd w:id="148"/>
       <w:bookmarkEnd w:id="149"/>
-      <w:bookmarkEnd w:id="150"/>
     </w:p>
     <w:p>
       <w:pPr>
@@ -22431,9 +22433,9 @@
         <w:lastRenderedPageBreak/>
         <w:t>Indicadores de calidad</w:t>
       </w:r>
+      <w:bookmarkEnd w:id="150"/>
       <w:bookmarkEnd w:id="151"/>
       <w:bookmarkEnd w:id="152"/>
-      <w:bookmarkEnd w:id="153"/>
     </w:p>
     <w:tbl>
       <w:tblPr>
@@ -26276,16 +26278,16 @@
       <w:pPr>
         <w:pStyle w:val="Ttulo2"/>
       </w:pPr>
-      <w:bookmarkStart w:id="154" w:name="_Toc49341859"/>
-      <w:bookmarkStart w:id="155" w:name="_Toc170148369"/>
-      <w:bookmarkStart w:id="156" w:name="_Toc170148683"/>
+      <w:bookmarkStart w:id="153" w:name="_Toc49341859"/>
+      <w:bookmarkStart w:id="154" w:name="_Toc170148369"/>
+      <w:bookmarkStart w:id="155" w:name="_Toc170148683"/>
       <w:r>
         <w:lastRenderedPageBreak/>
         <w:t>Elaboración de una batería de pruebas para detectar errores</w:t>
       </w:r>
+      <w:bookmarkEnd w:id="153"/>
       <w:bookmarkEnd w:id="154"/>
       <w:bookmarkEnd w:id="155"/>
-      <w:bookmarkEnd w:id="156"/>
     </w:p>
     <w:p>
       <w:r>
@@ -27126,20 +27128,20 @@
       </w:tr>
     </w:tbl>
     <w:p>
-      <w:bookmarkStart w:id="157" w:name="_Toc49341860"/>
+      <w:bookmarkStart w:id="156" w:name="_Toc49341860"/>
     </w:p>
     <w:p>
       <w:pPr>
         <w:pStyle w:val="Ttulo2"/>
       </w:pPr>
-      <w:bookmarkStart w:id="158" w:name="_Toc170148370"/>
-      <w:bookmarkStart w:id="159" w:name="_Toc170148684"/>
+      <w:bookmarkStart w:id="157" w:name="_Toc170148370"/>
+      <w:bookmarkStart w:id="158" w:name="_Toc170148684"/>
       <w:r>
         <w:t>Evaluación y solución de incidencias</w:t>
       </w:r>
+      <w:bookmarkEnd w:id="156"/>
       <w:bookmarkEnd w:id="157"/>
       <w:bookmarkEnd w:id="158"/>
-      <w:bookmarkEnd w:id="159"/>
     </w:p>
     <w:p>
       <w:pPr>
@@ -27159,18 +27161,18 @@
       <w:pPr>
         <w:pStyle w:val="Ttulo2"/>
       </w:pPr>
-      <w:bookmarkStart w:id="160" w:name="_Toc49341861"/>
-      <w:bookmarkStart w:id="161" w:name="_Toc170148371"/>
-      <w:bookmarkStart w:id="162" w:name="_Toc170148685"/>
+      <w:bookmarkStart w:id="159" w:name="_Toc49341861"/>
+      <w:bookmarkStart w:id="160" w:name="_Toc170148371"/>
+      <w:bookmarkStart w:id="161" w:name="_Toc170148685"/>
       <w:r>
         <w:t>Evaluación y seguimiento del</w:t>
       </w:r>
       <w:r>
         <w:t xml:space="preserve"> proyecto</w:t>
       </w:r>
+      <w:bookmarkEnd w:id="159"/>
       <w:bookmarkEnd w:id="160"/>
       <w:bookmarkEnd w:id="161"/>
-      <w:bookmarkEnd w:id="162"/>
     </w:p>
     <w:p>
       <w:pPr>
@@ -27230,7 +27232,7 @@
           <w:szCs w:val="144"/>
         </w:rPr>
       </w:pPr>
-      <w:bookmarkStart w:id="163" w:name="_Toc49341863"/>
+      <w:bookmarkStart w:id="162" w:name="_Toc49341863"/>
       <w:r>
         <w:rPr>
           <w:sz w:val="144"/>
@@ -27248,8 +27250,8 @@
           <w:szCs w:val="144"/>
         </w:rPr>
       </w:pPr>
-      <w:bookmarkStart w:id="164" w:name="_Toc170148373"/>
-      <w:bookmarkStart w:id="165" w:name="_Toc170148686"/>
+      <w:bookmarkStart w:id="163" w:name="_Toc170148373"/>
+      <w:bookmarkStart w:id="164" w:name="_Toc170148686"/>
       <w:r>
         <w:rPr>
           <w:sz w:val="144"/>
@@ -27258,9 +27260,9 @@
         <w:lastRenderedPageBreak/>
         <w:t>Implantación del Proyecto</w:t>
       </w:r>
+      <w:bookmarkEnd w:id="162"/>
       <w:bookmarkEnd w:id="163"/>
       <w:bookmarkEnd w:id="164"/>
-      <w:bookmarkEnd w:id="165"/>
     </w:p>
     <w:p>
       <w:pPr>
@@ -27281,16 +27283,16 @@
       <w:pPr>
         <w:pStyle w:val="Ttulo2"/>
       </w:pPr>
-      <w:bookmarkStart w:id="166" w:name="_Toc49341864"/>
-      <w:bookmarkStart w:id="167" w:name="_Toc170148374"/>
-      <w:bookmarkStart w:id="168" w:name="_Toc170148687"/>
+      <w:bookmarkStart w:id="165" w:name="_Toc49341864"/>
+      <w:bookmarkStart w:id="166" w:name="_Toc170148374"/>
+      <w:bookmarkStart w:id="167" w:name="_Toc170148687"/>
       <w:r>
         <w:lastRenderedPageBreak/>
         <w:t>Plan de implantación</w:t>
       </w:r>
+      <w:bookmarkEnd w:id="165"/>
       <w:bookmarkEnd w:id="166"/>
       <w:bookmarkEnd w:id="167"/>
-      <w:bookmarkEnd w:id="168"/>
     </w:p>
     <w:p>
       <w:pPr>
@@ -27570,31 +27572,31 @@
       <w:pPr>
         <w:pStyle w:val="Ttulo2"/>
       </w:pPr>
-      <w:bookmarkStart w:id="169" w:name="_Toc49341865"/>
-      <w:bookmarkStart w:id="170" w:name="_Toc170148375"/>
-      <w:bookmarkStart w:id="171" w:name="_Toc170148688"/>
+      <w:bookmarkStart w:id="168" w:name="_Toc49341865"/>
+      <w:bookmarkStart w:id="169" w:name="_Toc170148375"/>
+      <w:bookmarkStart w:id="170" w:name="_Toc170148688"/>
       <w:r>
         <w:t>Manual de instalación</w:t>
       </w:r>
+      <w:bookmarkEnd w:id="168"/>
       <w:bookmarkEnd w:id="169"/>
       <w:bookmarkEnd w:id="170"/>
-      <w:bookmarkEnd w:id="171"/>
     </w:p>
     <w:p>
       <w:pPr>
         <w:pStyle w:val="Ttulo3"/>
       </w:pPr>
-      <w:bookmarkStart w:id="172" w:name="_Toc37610656"/>
-      <w:bookmarkStart w:id="173" w:name="_Toc49341866"/>
-      <w:bookmarkStart w:id="174" w:name="_Toc170148376"/>
-      <w:bookmarkStart w:id="175" w:name="_Toc170148689"/>
+      <w:bookmarkStart w:id="171" w:name="_Toc37610656"/>
+      <w:bookmarkStart w:id="172" w:name="_Toc49341866"/>
+      <w:bookmarkStart w:id="173" w:name="_Toc170148376"/>
+      <w:bookmarkStart w:id="174" w:name="_Toc170148689"/>
       <w:r>
         <w:t>Instalación de la aplicación</w:t>
       </w:r>
+      <w:bookmarkEnd w:id="171"/>
       <w:bookmarkEnd w:id="172"/>
       <w:bookmarkEnd w:id="173"/>
       <w:bookmarkEnd w:id="174"/>
-      <w:bookmarkEnd w:id="175"/>
     </w:p>
     <w:p>
       <w:pPr>
@@ -27614,15 +27616,15 @@
       <w:pPr>
         <w:pStyle w:val="Ttulo2"/>
       </w:pPr>
-      <w:bookmarkStart w:id="176" w:name="_Toc49341876"/>
-      <w:bookmarkStart w:id="177" w:name="_Toc170148377"/>
-      <w:bookmarkStart w:id="178" w:name="_Toc170148690"/>
+      <w:bookmarkStart w:id="175" w:name="_Toc49341876"/>
+      <w:bookmarkStart w:id="176" w:name="_Toc170148377"/>
+      <w:bookmarkStart w:id="177" w:name="_Toc170148690"/>
       <w:r>
         <w:t>Mejoras posibles</w:t>
       </w:r>
+      <w:bookmarkEnd w:id="175"/>
       <w:bookmarkEnd w:id="176"/>
       <w:bookmarkEnd w:id="177"/>
-      <w:bookmarkEnd w:id="178"/>
     </w:p>
     <w:p>
       <w:pPr>
@@ -27636,8 +27638,8 @@
         </w:rPr>
         <w:t>Rellenar</w:t>
       </w:r>
-      <w:bookmarkStart w:id="179" w:name="_Toc49341877"/>
-      <w:bookmarkStart w:id="180" w:name="_Toc170148378"/>
+      <w:bookmarkStart w:id="178" w:name="_Toc49341877"/>
+      <w:bookmarkStart w:id="179" w:name="_Toc170148378"/>
     </w:p>
     <w:p>
       <w:pPr>
@@ -27650,13 +27652,13 @@
       <w:pPr>
         <w:pStyle w:val="Ttulo2"/>
       </w:pPr>
-      <w:bookmarkStart w:id="181" w:name="_Toc170148691"/>
+      <w:bookmarkStart w:id="180" w:name="_Toc170148691"/>
       <w:r>
         <w:t>Manual de usuario</w:t>
       </w:r>
+      <w:bookmarkEnd w:id="178"/>
       <w:bookmarkEnd w:id="179"/>
       <w:bookmarkEnd w:id="180"/>
-      <w:bookmarkEnd w:id="181"/>
     </w:p>
     <w:p>
       <w:pPr>
@@ -27681,8 +27683,8 @@
           <w:lang w:bidi="es-ES"/>
         </w:rPr>
       </w:pPr>
-      <w:bookmarkStart w:id="182" w:name="_Toc49341895"/>
-      <w:bookmarkStart w:id="183" w:name="_Toc170148379"/>
+      <w:bookmarkStart w:id="181" w:name="_Toc49341895"/>
+      <w:bookmarkStart w:id="182" w:name="_Toc170148379"/>
       <w:r>
         <w:rPr>
           <w:lang w:bidi="es-ES"/>
@@ -27700,7 +27702,7 @@
           <w:lang w:bidi="es-ES"/>
         </w:rPr>
       </w:pPr>
-      <w:bookmarkStart w:id="184" w:name="_Toc170148692"/>
+      <w:bookmarkStart w:id="183" w:name="_Toc170148692"/>
       <w:r>
         <w:rPr>
           <w:sz w:val="144"/>
@@ -27710,9 +27712,9 @@
         <w:lastRenderedPageBreak/>
         <w:t>Anexos</w:t>
       </w:r>
+      <w:bookmarkEnd w:id="181"/>
       <w:bookmarkEnd w:id="182"/>
       <w:bookmarkEnd w:id="183"/>
-      <w:bookmarkEnd w:id="184"/>
     </w:p>
     <w:sdt>
       <w:sdtPr>
@@ -27758,9 +27760,9 @@
               <w:b w:val="0"/>
             </w:rPr>
           </w:pPr>
-          <w:bookmarkStart w:id="185" w:name="_Toc49341896"/>
-          <w:bookmarkStart w:id="186" w:name="_Toc170148380"/>
-          <w:bookmarkStart w:id="187" w:name="_Toc170148693"/>
+          <w:bookmarkStart w:id="184" w:name="_Toc49341896"/>
+          <w:bookmarkStart w:id="185" w:name="_Toc170148380"/>
+          <w:bookmarkStart w:id="186" w:name="_Toc170148693"/>
           <w:r>
             <w:rPr>
               <w:b w:val="0"/>
@@ -27774,9 +27776,9 @@
             </w:rPr>
             <w:t>contrato usado</w:t>
           </w:r>
+          <w:bookmarkEnd w:id="184"/>
           <w:bookmarkEnd w:id="185"/>
           <w:bookmarkEnd w:id="186"/>
-          <w:bookmarkEnd w:id="187"/>
         </w:p>
         <w:p>
           <w:pPr>
@@ -27847,8 +27849,8 @@
               <w:b w:val="0"/>
             </w:rPr>
           </w:pPr>
-          <w:bookmarkStart w:id="188" w:name="_Toc170148381"/>
-          <w:bookmarkStart w:id="189" w:name="_Toc170148694"/>
+          <w:bookmarkStart w:id="187" w:name="_Toc170148381"/>
+          <w:bookmarkStart w:id="188" w:name="_Toc170148694"/>
           <w:r>
             <w:rPr>
               <w:b w:val="0"/>
@@ -27870,8 +27872,8 @@
             </w:rPr>
             <w:t xml:space="preserve"> (alumnos)</w:t>
           </w:r>
+          <w:bookmarkEnd w:id="187"/>
           <w:bookmarkEnd w:id="188"/>
-          <w:bookmarkEnd w:id="189"/>
         </w:p>
         <w:p>
           <w:pPr>
@@ -28107,9 +28109,9 @@
           <w:b w:val="0"/>
         </w:rPr>
       </w:pPr>
-      <w:bookmarkStart w:id="190" w:name="_Toc49341898"/>
-      <w:bookmarkStart w:id="191" w:name="_Toc170148382"/>
-      <w:bookmarkStart w:id="192" w:name="_Toc170148695"/>
+      <w:bookmarkStart w:id="189" w:name="_Toc49341898"/>
+      <w:bookmarkStart w:id="190" w:name="_Toc170148382"/>
+      <w:bookmarkStart w:id="191" w:name="_Toc170148695"/>
       <w:r>
         <w:rPr>
           <w:b w:val="0"/>
@@ -28117,9 +28119,9 @@
         <w:lastRenderedPageBreak/>
         <w:t>Ejemplo de formulario de satisfacción</w:t>
       </w:r>
+      <w:bookmarkEnd w:id="189"/>
       <w:bookmarkEnd w:id="190"/>
       <w:bookmarkEnd w:id="191"/>
-      <w:bookmarkEnd w:id="192"/>
     </w:p>
     <w:p>
       <w:r>
@@ -30881,8 +30883,8 @@
           <w:b w:val="0"/>
         </w:rPr>
       </w:pPr>
-      <w:bookmarkStart w:id="193" w:name="_Toc170148383"/>
-      <w:bookmarkStart w:id="194" w:name="_Toc170148696"/>
+      <w:bookmarkStart w:id="192" w:name="_Toc170148383"/>
+      <w:bookmarkStart w:id="193" w:name="_Toc170148696"/>
       <w:r>
         <w:rPr>
           <w:b w:val="0"/>
@@ -30890,8 +30892,8 @@
         <w:lastRenderedPageBreak/>
         <w:t>Datos de prueba</w:t>
       </w:r>
+      <w:bookmarkEnd w:id="192"/>
       <w:bookmarkEnd w:id="193"/>
-      <w:bookmarkEnd w:id="194"/>
     </w:p>
     <w:p>
       <w:pPr>
@@ -38022,6 +38024,7 @@
   <w:style w:type="character" w:default="1" w:styleId="Fuentedeprrafopredeter">
     <w:name w:val="Default Paragraph Font"/>
     <w:uiPriority w:val="1"/>
+    <w:semiHidden/>
     <w:unhideWhenUsed/>
   </w:style>
   <w:style w:type="table" w:default="1" w:styleId="Tablanormal">
@@ -39377,6 +39380,7 @@
     <w:rsid w:val="00081F3B"/>
     <w:rsid w:val="000B76EC"/>
     <w:rsid w:val="000C2B5E"/>
+    <w:rsid w:val="0010763A"/>
     <w:rsid w:val="00112C1E"/>
     <w:rsid w:val="001370FA"/>
     <w:rsid w:val="0019656C"/>
@@ -39465,6 +39469,7 @@
     <w:rsid w:val="00E32BA3"/>
     <w:rsid w:val="00F43476"/>
     <w:rsid w:val="00F5150F"/>
+    <w:rsid w:val="00F54031"/>
     <w:rsid w:val="00FA2BCD"/>
     <w:rsid w:val="00FD51C7"/>
   </w:rsids>

</xml_diff>

<commit_message>
Tercer guardado (15/05/2026, 13:47)
</commit_message>
<xml_diff>
--- a/UT_7_2024_2025 (2).docx
+++ b/UT_7_2024_2025 (2).docx
@@ -5846,9 +5846,9 @@
       </w:r>
     </w:p>
     <w:p/>
-    <w:bookmarkStart w:id="6" w:name="_Toc170148316" w:displacedByCustomXml="next"/>
+    <w:bookmarkStart w:id="6" w:name="_Toc170148631" w:displacedByCustomXml="next"/>
     <w:bookmarkStart w:id="7" w:name="_Toc49341785" w:displacedByCustomXml="next"/>
-    <w:bookmarkStart w:id="8" w:name="_Toc170148631" w:displacedByCustomXml="next"/>
+    <w:bookmarkStart w:id="8" w:name="_Toc170148316" w:displacedByCustomXml="next"/>
     <w:sdt>
       <w:sdtPr>
         <w:rPr>
@@ -7462,7 +7462,7 @@
                 <v:path o:extrusionok="f" gradientshapeok="t" o:connecttype="rect"/>
                 <o:lock v:ext="edit" aspectratio="t"/>
               </v:shapetype>
-              <v:shape id="_x0000_i1025" type="#_x0000_t75" style="width:465.75pt;height:205.3pt">
+              <v:shape id="_x0000_i1025" type="#_x0000_t75" style="width:465.75pt;height:205.5pt">
                 <v:imagedata r:id="rId15" o:title="SecuencaciónFasesProyecto"/>
               </v:shape>
             </w:pict>
@@ -7489,7 +7489,7 @@
           </w:pPr>
           <w:r>
             <w:pict w14:anchorId="5636CC0F">
-              <v:shape id="_x0000_i1026" type="#_x0000_t75" style="width:383.2pt;height:241.8pt">
+              <v:shape id="_x0000_i1026" type="#_x0000_t75" style="width:383.25pt;height:241.5pt">
                 <v:imagedata r:id="rId16" o:title="PlanificaciónRecursosProyectos"/>
               </v:shape>
             </w:pict>
@@ -11906,7 +11906,7 @@
       </w:pPr>
       <w:r>
         <w:pict w14:anchorId="119133E6">
-          <v:shape id="_x0000_i1027" type="#_x0000_t75" style="width:252.75pt;height:468.95pt">
+          <v:shape id="_x0000_i1027" type="#_x0000_t75" style="width:252.75pt;height:468.75pt">
             <v:imagedata r:id="rId24" o:title="DA_Login"/>
           </v:shape>
         </w:pict>
@@ -12001,7 +12001,7 @@
     <w:p>
       <w:r>
         <w:pict w14:anchorId="3BC76BB7">
-          <v:shape id="_x0000_i1028" type="#_x0000_t75" style="width:143.95pt;height:523.45pt">
+          <v:shape id="_x0000_i1028" type="#_x0000_t75" style="width:2in;height:523.5pt">
             <v:imagedata r:id="rId26" o:title="DA_VaciarBBDD"/>
           </v:shape>
         </w:pict>
@@ -12014,7 +12014,7 @@
       </w:r>
       <w:r>
         <w:pict w14:anchorId="6C7C2997">
-          <v:shape id="_x0000_i1029" type="#_x0000_t75" style="width:144.75pt;height:430.2pt">
+          <v:shape id="_x0000_i1029" type="#_x0000_t75" style="width:144.75pt;height:430.5pt">
             <v:imagedata r:id="rId27" o:title="DA_GestiónErrores"/>
           </v:shape>
         </w:pict>
@@ -18435,19 +18435,44 @@
       <w:bookmarkEnd w:id="131"/>
     </w:p>
     <w:p>
-      <w:pPr>
-        <w:rPr>
-          <w:color w:val="FF0000"/>
-        </w:rPr>
-      </w:pPr>
-      <w:r>
-        <w:rPr>
-          <w:color w:val="FF0000"/>
-        </w:rPr>
-        <w:t>Rellenar</w:t>
+      <w:r>
+        <w:drawing>
+          <wp:inline distT="0" distB="0" distL="0" distR="0" wp14:anchorId="51E2F271" wp14:editId="75AD2783">
+            <wp:extent cx="3981450" cy="4137077"/>
+            <wp:effectExtent l="0" t="0" r="0" b="0"/>
+            <wp:docPr id="2118964915" name="Imagen 1"/>
+            <wp:cNvGraphicFramePr>
+              <a:graphicFrameLocks xmlns:a="http://schemas.openxmlformats.org/drawingml/2006/main" noChangeAspect="1"/>
+            </wp:cNvGraphicFramePr>
+            <a:graphic xmlns:a="http://schemas.openxmlformats.org/drawingml/2006/main">
+              <a:graphicData uri="http://schemas.openxmlformats.org/drawingml/2006/picture">
+                <pic:pic xmlns:pic="http://schemas.openxmlformats.org/drawingml/2006/picture">
+                  <pic:nvPicPr>
+                    <pic:cNvPr id="2118964915" name=""/>
+                    <pic:cNvPicPr/>
+                  </pic:nvPicPr>
+                  <pic:blipFill>
+                    <a:blip r:embed="rId38"/>
+                    <a:stretch>
+                      <a:fillRect/>
+                    </a:stretch>
+                  </pic:blipFill>
+                  <pic:spPr>
+                    <a:xfrm>
+                      <a:off x="0" y="0"/>
+                      <a:ext cx="3985807" cy="4141604"/>
+                    </a:xfrm>
+                    <a:prstGeom prst="rect">
+                      <a:avLst/>
+                    </a:prstGeom>
+                  </pic:spPr>
+                </pic:pic>
+              </a:graphicData>
+            </a:graphic>
+          </wp:inline>
+        </w:drawing>
       </w:r>
     </w:p>
-    <w:p/>
     <w:p>
       <w:pPr>
         <w:pStyle w:val="Ttulo2"/>
@@ -18516,6 +18541,7 @@
       <w:bookmarkStart w:id="139" w:name="_Toc170148365"/>
       <w:bookmarkStart w:id="140" w:name="_Toc170148680"/>
       <w:r>
+        <w:lastRenderedPageBreak/>
         <w:t>Diseño de las ventanas</w:t>
       </w:r>
       <w:bookmarkEnd w:id="138"/>
@@ -18705,7 +18731,7 @@
                     </pic:cNvPicPr>
                   </pic:nvPicPr>
                   <pic:blipFill>
-                    <a:blip r:embed="rId38" cstate="print">
+                    <a:blip r:embed="rId39" cstate="print">
                       <a:extLst>
                         <a:ext uri="{28A0092B-C50C-407E-A947-70E740481C1C}">
                           <a14:useLocalDpi xmlns:a14="http://schemas.microsoft.com/office/drawing/2010/main" val="0"/>
@@ -27810,7 +27836,7 @@
                         </pic:cNvPicPr>
                       </pic:nvPicPr>
                       <pic:blipFill>
-                        <a:blip r:embed="rId39" cstate="print">
+                        <a:blip r:embed="rId40" cstate="print">
                           <a:extLst>
                             <a:ext uri="{28A0092B-C50C-407E-A947-70E740481C1C}">
                               <a14:useLocalDpi xmlns:a14="http://schemas.microsoft.com/office/drawing/2010/main" val="0"/>
@@ -27902,7 +27928,7 @@
                         </pic:cNvPicPr>
                       </pic:nvPicPr>
                       <pic:blipFill>
-                        <a:blip r:embed="rId40" cstate="print">
+                        <a:blip r:embed="rId41" cstate="print">
                           <a:extLst>
                             <a:ext uri="{28A0092B-C50C-407E-A947-70E740481C1C}">
                               <a14:useLocalDpi xmlns:a14="http://schemas.microsoft.com/office/drawing/2010/main" val="0"/>
@@ -35743,8 +35769,8 @@
     <w:p/>
     <w:p/>
     <w:sectPr>
-      <w:headerReference w:type="default" r:id="rId41"/>
-      <w:footerReference w:type="default" r:id="rId42"/>
+      <w:headerReference w:type="default" r:id="rId42"/>
+      <w:footerReference w:type="default" r:id="rId43"/>
       <w:pgSz w:w="11906" w:h="16838" w:code="9"/>
       <w:pgMar w:top="1291" w:right="936" w:bottom="720" w:left="936" w:header="0" w:footer="289" w:gutter="0"/>
       <w:pgNumType w:start="1"/>
@@ -39383,6 +39409,7 @@
     <w:rsid w:val="0010763A"/>
     <w:rsid w:val="00112C1E"/>
     <w:rsid w:val="001370FA"/>
+    <w:rsid w:val="00147BD0"/>
     <w:rsid w:val="0019656C"/>
     <w:rsid w:val="00216802"/>
     <w:rsid w:val="00236FE3"/>
@@ -39397,6 +39424,7 @@
     <w:rsid w:val="002C23C8"/>
     <w:rsid w:val="00302B91"/>
     <w:rsid w:val="00317777"/>
+    <w:rsid w:val="003B28BB"/>
     <w:rsid w:val="003C1035"/>
     <w:rsid w:val="003D7227"/>
     <w:rsid w:val="003F5CFC"/>

</xml_diff>

<commit_message>
Cuarto guardado (15/05/2026, 20:44)
</commit_message>
<xml_diff>
--- a/UT_7_2024_2025 (2).docx
+++ b/UT_7_2024_2025 (2).docx
@@ -11792,7 +11792,7 @@
       </w:pPr>
       <w:r>
         <w:pict w14:anchorId="119133E6">
-          <v:shape id="_x0000_i1027" type="#_x0000_t75" style="width:252.75pt;height:468.95pt">
+          <v:shape id="_x0000_i1027" type="#_x0000_t75" style="width:252.6pt;height:469.2pt">
             <v:imagedata r:id="rId24" o:title="DA_Login"/>
           </v:shape>
         </w:pict>
@@ -11887,7 +11887,7 @@
     <w:p>
       <w:r>
         <w:pict w14:anchorId="3BC76BB7">
-          <v:shape id="_x0000_i1028" type="#_x0000_t75" style="width:143.95pt;height:523.45pt">
+          <v:shape id="_x0000_i1028" type="#_x0000_t75" style="width:2in;height:523.2pt">
             <v:imagedata r:id="rId26" o:title="DA_VaciarBBDD"/>
           </v:shape>
         </w:pict>
@@ -11900,7 +11900,7 @@
       </w:r>
       <w:r>
         <w:pict w14:anchorId="6C7C2997">
-          <v:shape id="_x0000_i1029" type="#_x0000_t75" style="width:144.75pt;height:430.2pt">
+          <v:shape id="_x0000_i1029" type="#_x0000_t75" style="width:144.6pt;height:430.2pt">
             <v:imagedata r:id="rId27" o:title="DA_GestiónErrores"/>
           </v:shape>
         </w:pict>
@@ -25915,7 +25915,7 @@
         <w:rPr>
           <w:color w:val="FF0000"/>
         </w:rPr>
-        <w:t>Rellenar</w:t>
+        <w:t>Rellena</w:t>
       </w:r>
     </w:p>
     <w:p/>
@@ -37999,12 +37999,12 @@
     <w:rsid w:val="0002148D"/>
     <w:rsid w:val="00050043"/>
     <w:rsid w:val="00081F3B"/>
+    <w:rsid w:val="000A4D58"/>
     <w:rsid w:val="000B76EC"/>
     <w:rsid w:val="000C2B5E"/>
     <w:rsid w:val="0010763A"/>
     <w:rsid w:val="00112C1E"/>
     <w:rsid w:val="001370FA"/>
-    <w:rsid w:val="00152AA0"/>
     <w:rsid w:val="0019656C"/>
     <w:rsid w:val="00216802"/>
     <w:rsid w:val="00236FE3"/>

</xml_diff>

<commit_message>
Quinto guardado (16/05/2026, 16:46)
</commit_message>
<xml_diff>
--- a/UT_7_2024_2025 (2).docx
+++ b/UT_7_2024_2025 (2).docx
@@ -5846,9 +5846,9 @@
       </w:r>
     </w:p>
     <w:p/>
-    <w:bookmarkStart w:id="6" w:name="_Toc170148631" w:displacedByCustomXml="next"/>
+    <w:bookmarkStart w:id="6" w:name="_Toc170148316" w:displacedByCustomXml="next"/>
     <w:bookmarkStart w:id="7" w:name="_Toc49341785" w:displacedByCustomXml="next"/>
-    <w:bookmarkStart w:id="8" w:name="_Toc170148316" w:displacedByCustomXml="next"/>
+    <w:bookmarkStart w:id="8" w:name="_Toc170148631" w:displacedByCustomXml="next"/>
     <w:sdt>
       <w:sdtPr>
         <w:rPr>
@@ -6733,15 +6733,19 @@
                 <w:r>
                   <w:t xml:space="preserve">IDE para desarrollo </w:t>
                 </w:r>
+                <w:proofErr w:type="gramStart"/>
                 <w:r>
                   <w:t>PHP</w:t>
                 </w:r>
                 <w:r>
                   <w:t xml:space="preserve">  (</w:t>
                 </w:r>
+                <w:proofErr w:type="spellStart"/>
+                <w:proofErr w:type="gramEnd"/>
                 <w:r>
                   <w:t>PhpStorm</w:t>
                 </w:r>
+                <w:proofErr w:type="spellEnd"/>
                 <w:r>
                   <w:t>)</w:t>
                 </w:r>
@@ -6825,11 +6829,16 @@
                 <w:r>
                   <w:t xml:space="preserve">Bootstrap </w:t>
                 </w:r>
+                <w:proofErr w:type="gramStart"/>
                 <w:r>
                   <w:t xml:space="preserve">5.3 </w:t>
                 </w:r>
                 <w:r>
-                  <w:t xml:space="preserve"> jQuery 3.</w:t>
+                  <w:t xml:space="preserve"> jQuery</w:t>
+                </w:r>
+                <w:proofErr w:type="gramEnd"/>
+                <w:r>
+                  <w:t xml:space="preserve"> 3.</w:t>
                 </w:r>
                 <w:r>
                   <w:t>7</w:t>
@@ -6864,8 +6873,13 @@
                 <w:tcW w:w="7477" w:type="dxa"/>
               </w:tcPr>
               <w:p>
+                <w:proofErr w:type="spellStart"/>
                 <w:r>
-                  <w:t xml:space="preserve">Mysql </w:t>
+                  <w:t>Mysql</w:t>
+                </w:r>
+                <w:proofErr w:type="spellEnd"/>
+                <w:r>
+                  <w:t xml:space="preserve"> </w:t>
                 </w:r>
                 <w:r>
                   <w:t>8.2</w:t>
@@ -6874,7 +6888,16 @@
                   <w:t xml:space="preserve"> </w:t>
                 </w:r>
                 <w:r>
-                  <w:t xml:space="preserve">– MariaDB </w:t>
+                  <w:t xml:space="preserve">– </w:t>
+                </w:r>
+                <w:proofErr w:type="spellStart"/>
+                <w:proofErr w:type="gramStart"/>
+                <w:r>
+                  <w:t>MariaDB</w:t>
+                </w:r>
+                <w:proofErr w:type="spellEnd"/>
+                <w:r>
+                  <w:t xml:space="preserve"> </w:t>
                 </w:r>
                 <w:r>
                   <w:t xml:space="preserve"> co</w:t>
@@ -6885,6 +6908,7 @@
                 <w:r>
                   <w:t>patible</w:t>
                 </w:r>
+                <w:proofErr w:type="gramEnd"/>
               </w:p>
             </w:tc>
           </w:tr>
@@ -6974,8 +6998,13 @@
               </w:tcPr>
               <w:p>
                 <w:r>
-                  <w:t>Servidor web con cpanel</w:t>
+                  <w:t xml:space="preserve">Servidor web con </w:t>
                 </w:r>
+                <w:proofErr w:type="spellStart"/>
+                <w:r>
+                  <w:t>cpanel</w:t>
+                </w:r>
+                <w:proofErr w:type="spellEnd"/>
               </w:p>
             </w:tc>
           </w:tr>
@@ -7031,8 +7060,13 @@
               </w:tcPr>
               <w:p>
                 <w:r>
-                  <w:t>Servidor web con Mysql</w:t>
+                  <w:t xml:space="preserve">Servidor web con </w:t>
                 </w:r>
+                <w:proofErr w:type="spellStart"/>
+                <w:r>
+                  <w:t>Mysql</w:t>
+                </w:r>
+                <w:proofErr w:type="spellEnd"/>
                 <w:r>
                   <w:t xml:space="preserve"> </w:t>
                 </w:r>
@@ -7055,7 +7089,15 @@
               </w:tcPr>
               <w:p>
                 <w:r>
-                  <w:t>Un usuario de acceso a Mysql independiente</w:t>
+                  <w:t xml:space="preserve">Un usuario de acceso a </w:t>
+                </w:r>
+                <w:proofErr w:type="spellStart"/>
+                <w:r>
+                  <w:t>Mysql</w:t>
+                </w:r>
+                <w:proofErr w:type="spellEnd"/>
+                <w:r>
+                  <w:t xml:space="preserve"> independiente</w:t>
                 </w:r>
                 <w:r>
                   <w:t xml:space="preserve"> y BBDD propia</w:t>
@@ -7250,9 +7292,11 @@
           <w:r>
             <w:t xml:space="preserve"> la compra del software de desarrollo </w:t>
           </w:r>
+          <w:proofErr w:type="spellStart"/>
           <w:r>
             <w:t>PHPStorm</w:t>
           </w:r>
+          <w:proofErr w:type="spellEnd"/>
           <w:r>
             <w:t xml:space="preserve"> con una licencia profesional.</w:t>
           </w:r>
@@ -8416,7 +8460,21 @@
               <w:rPr>
                 <w:b/>
               </w:rPr>
-              <w:t>Cargar la BBDD       subcaso: Gestion de errores</w:t>
+              <w:t xml:space="preserve">Cargar la BBDD       subcaso: </w:t>
+            </w:r>
+            <w:proofErr w:type="spellStart"/>
+            <w:r>
+              <w:rPr>
+                <w:b/>
+              </w:rPr>
+              <w:t>Gestion</w:t>
+            </w:r>
+            <w:proofErr w:type="spellEnd"/>
+            <w:r>
+              <w:rPr>
+                <w:b/>
+              </w:rPr>
+              <w:t xml:space="preserve"> de errores</w:t>
             </w:r>
           </w:p>
         </w:tc>
@@ -10914,7 +10972,21 @@
               <w:rPr>
                 <w:bCs/>
               </w:rPr>
-              <w:t>Se generará un fichero SQL-92 para preservar los datos. Se dará la posibilidad de exportarlos a csv también.</w:t>
+              <w:t xml:space="preserve">Se generará un fichero SQL-92 para preservar los datos. Se dará la posibilidad de exportarlos a </w:t>
+            </w:r>
+            <w:proofErr w:type="spellStart"/>
+            <w:r>
+              <w:rPr>
+                <w:bCs/>
+              </w:rPr>
+              <w:t>csv</w:t>
+            </w:r>
+            <w:proofErr w:type="spellEnd"/>
+            <w:r>
+              <w:rPr>
+                <w:bCs/>
+              </w:rPr>
+              <w:t xml:space="preserve"> también.</w:t>
             </w:r>
           </w:p>
         </w:tc>
@@ -11162,7 +11234,21 @@
               <w:rPr>
                 <w:b/>
               </w:rPr>
-              <w:t>Selección de datos  subcaso: Selección de formato</w:t>
+              <w:t xml:space="preserve">Selección de </w:t>
+            </w:r>
+            <w:proofErr w:type="gramStart"/>
+            <w:r>
+              <w:rPr>
+                <w:b/>
+              </w:rPr>
+              <w:t>datos  subcaso</w:t>
+            </w:r>
+            <w:proofErr w:type="gramEnd"/>
+            <w:r>
+              <w:rPr>
+                <w:b/>
+              </w:rPr>
+              <w:t>: Selección de formato</w:t>
             </w:r>
           </w:p>
         </w:tc>
@@ -11222,7 +11308,35 @@
               <w:rPr>
                 <w:bCs/>
               </w:rPr>
-              <w:t>Se pedirá el formato y sus características para exportar: json, csv, sql-92</w:t>
+              <w:t xml:space="preserve">Se pedirá el formato y sus características para exportar: </w:t>
+            </w:r>
+            <w:proofErr w:type="spellStart"/>
+            <w:r>
+              <w:rPr>
+                <w:bCs/>
+              </w:rPr>
+              <w:t>json</w:t>
+            </w:r>
+            <w:proofErr w:type="spellEnd"/>
+            <w:r>
+              <w:rPr>
+                <w:bCs/>
+              </w:rPr>
+              <w:t xml:space="preserve">, </w:t>
+            </w:r>
+            <w:proofErr w:type="spellStart"/>
+            <w:r>
+              <w:rPr>
+                <w:bCs/>
+              </w:rPr>
+              <w:t>csv</w:t>
+            </w:r>
+            <w:proofErr w:type="spellEnd"/>
+            <w:r>
+              <w:rPr>
+                <w:bCs/>
+              </w:rPr>
+              <w:t>, sql-92</w:t>
             </w:r>
           </w:p>
         </w:tc>
@@ -11792,7 +11906,7 @@
       </w:pPr>
       <w:r>
         <w:pict w14:anchorId="119133E6">
-          <v:shape id="_x0000_i1027" type="#_x0000_t75" style="width:252.6pt;height:469.2pt">
+          <v:shape id="_x0000_i1027" type="#_x0000_t75" style="width:252.5pt;height:469.4pt">
             <v:imagedata r:id="rId24" o:title="DA_Login"/>
           </v:shape>
         </w:pict>
@@ -11887,7 +12001,7 @@
     <w:p>
       <w:r>
         <w:pict w14:anchorId="3BC76BB7">
-          <v:shape id="_x0000_i1028" type="#_x0000_t75" style="width:2in;height:523.2pt">
+          <v:shape id="_x0000_i1028" type="#_x0000_t75" style="width:143.95pt;height:523.45pt">
             <v:imagedata r:id="rId26" o:title="DA_VaciarBBDD"/>
           </v:shape>
         </w:pict>
@@ -11900,7 +12014,7 @@
       </w:r>
       <w:r>
         <w:pict w14:anchorId="6C7C2997">
-          <v:shape id="_x0000_i1029" type="#_x0000_t75" style="width:144.6pt;height:430.2pt">
+          <v:shape id="_x0000_i1029" type="#_x0000_t75" style="width:144.55pt;height:430.2pt">
             <v:imagedata r:id="rId27" o:title="DA_GestiónErrores"/>
           </v:shape>
         </w:pict>
@@ -12483,10 +12597,18 @@
         <w:t xml:space="preserve">Una vez llevada a cabo la normalización, teniendo en </w:t>
       </w:r>
       <w:r>
-        <w:t>cuenta hasta la forma de Boyce-C</w:t>
-      </w:r>
-      <w:r>
-        <w:t>ood, el resultado es el siguiente:</w:t>
+        <w:t>cuenta hasta la forma de Boyce-</w:t>
+      </w:r>
+      <w:proofErr w:type="spellStart"/>
+      <w:r>
+        <w:t>C</w:t>
+      </w:r>
+      <w:r>
+        <w:t>ood</w:t>
+      </w:r>
+      <w:proofErr w:type="spellEnd"/>
+      <w:r>
+        <w:t>, el resultado es el siguiente:</w:t>
       </w:r>
     </w:p>
     <w:p>
@@ -12552,15 +12674,38 @@
       <w:r>
         <w:t xml:space="preserve">: </w:t>
       </w:r>
+      <w:proofErr w:type="spellStart"/>
       <w:r>
         <w:rPr>
           <w:u w:val="single"/>
         </w:rPr>
         <w:t>isbn</w:t>
       </w:r>
-      <w:r>
-        <w:t>, titulo, autor, numero_ejemplares, id_materia, id_curso</w:t>
-      </w:r>
+      <w:proofErr w:type="spellEnd"/>
+      <w:r>
+        <w:t xml:space="preserve">, titulo, autor, </w:t>
+      </w:r>
+      <w:proofErr w:type="spellStart"/>
+      <w:r>
+        <w:t>numero_ejemplares</w:t>
+      </w:r>
+      <w:proofErr w:type="spellEnd"/>
+      <w:r>
+        <w:t xml:space="preserve">, </w:t>
+      </w:r>
+      <w:proofErr w:type="spellStart"/>
+      <w:r>
+        <w:t>id_materia</w:t>
+      </w:r>
+      <w:proofErr w:type="spellEnd"/>
+      <w:r>
+        <w:t xml:space="preserve">, </w:t>
+      </w:r>
+      <w:proofErr w:type="spellStart"/>
+      <w:r>
+        <w:t>id_curso</w:t>
+      </w:r>
+      <w:proofErr w:type="spellEnd"/>
     </w:p>
     <w:p>
       <w:pPr>
@@ -12590,6 +12735,7 @@
       <w:pPr>
         <w:ind w:left="567"/>
       </w:pPr>
+      <w:proofErr w:type="spellStart"/>
       <w:r>
         <w:rPr>
           <w:b/>
@@ -12597,17 +12743,72 @@
         </w:rPr>
         <w:t>AlumnosCursosLibros</w:t>
       </w:r>
+      <w:proofErr w:type="spellEnd"/>
       <w:r>
         <w:t xml:space="preserve">: </w:t>
       </w:r>
+      <w:proofErr w:type="spellStart"/>
       <w:r>
         <w:rPr>
           <w:u w:val="single"/>
         </w:rPr>
-        <w:t>isbn, id_alumno, id_curso</w:t>
-      </w:r>
-      <w:r>
-        <w:t>, fecha_entrega, fecha_devolucion, estado (entregado, por_devolver)</w:t>
+        <w:t>isbn</w:t>
+      </w:r>
+      <w:proofErr w:type="spellEnd"/>
+      <w:r>
+        <w:rPr>
+          <w:u w:val="single"/>
+        </w:rPr>
+        <w:t xml:space="preserve">, </w:t>
+      </w:r>
+      <w:proofErr w:type="spellStart"/>
+      <w:r>
+        <w:rPr>
+          <w:u w:val="single"/>
+        </w:rPr>
+        <w:t>id_alumno</w:t>
+      </w:r>
+      <w:proofErr w:type="spellEnd"/>
+      <w:r>
+        <w:rPr>
+          <w:u w:val="single"/>
+        </w:rPr>
+        <w:t xml:space="preserve">, </w:t>
+      </w:r>
+      <w:proofErr w:type="spellStart"/>
+      <w:r>
+        <w:rPr>
+          <w:u w:val="single"/>
+        </w:rPr>
+        <w:t>id_curso</w:t>
+      </w:r>
+      <w:proofErr w:type="spellEnd"/>
+      <w:r>
+        <w:t xml:space="preserve">, </w:t>
+      </w:r>
+      <w:proofErr w:type="spellStart"/>
+      <w:r>
+        <w:t>fecha_entrega</w:t>
+      </w:r>
+      <w:proofErr w:type="spellEnd"/>
+      <w:r>
+        <w:t xml:space="preserve">, </w:t>
+      </w:r>
+      <w:proofErr w:type="spellStart"/>
+      <w:r>
+        <w:t>fecha_devolucion</w:t>
+      </w:r>
+      <w:proofErr w:type="spellEnd"/>
+      <w:r>
+        <w:t xml:space="preserve">, estado (entregado, </w:t>
+      </w:r>
+      <w:proofErr w:type="spellStart"/>
+      <w:r>
+        <w:t>por_devolver</w:t>
+      </w:r>
+      <w:proofErr w:type="spellEnd"/>
+      <w:r>
+        <w:t>)</w:t>
       </w:r>
     </w:p>
     <w:p>
@@ -13840,8 +14041,19 @@
                 <w:sz w:val="16"/>
                 <w:szCs w:val="16"/>
               </w:rPr>
-              <w:t>Letra del niev</w:t>
-            </w:r>
+              <w:t xml:space="preserve">Letra del </w:t>
+            </w:r>
+            <w:proofErr w:type="spellStart"/>
+            <w:r>
+              <w:rPr>
+                <w:rFonts w:cstheme="minorHAnsi"/>
+                <w:b/>
+                <w:sz w:val="16"/>
+                <w:szCs w:val="16"/>
+              </w:rPr>
+              <w:t>niev</w:t>
+            </w:r>
+            <w:proofErr w:type="spellEnd"/>
           </w:p>
         </w:tc>
       </w:tr>
@@ -14008,8 +14220,19 @@
                 <w:sz w:val="16"/>
                 <w:szCs w:val="16"/>
               </w:rPr>
-              <w:t>1ºeso, 2eso….</w:t>
-            </w:r>
+              <w:t>1ºeso, 2</w:t>
+            </w:r>
+            <w:proofErr w:type="gramStart"/>
+            <w:r>
+              <w:rPr>
+                <w:rFonts w:cstheme="minorHAnsi"/>
+                <w:b/>
+                <w:sz w:val="16"/>
+                <w:szCs w:val="16"/>
+              </w:rPr>
+              <w:t>eso….</w:t>
+            </w:r>
+            <w:proofErr w:type="gramEnd"/>
           </w:p>
         </w:tc>
       </w:tr>
@@ -14277,6 +14500,7 @@
                 <w:szCs w:val="16"/>
               </w:rPr>
             </w:pPr>
+            <w:proofErr w:type="spellStart"/>
             <w:r>
               <w:rPr>
                 <w:rFonts w:cstheme="minorHAnsi"/>
@@ -14286,6 +14510,7 @@
               </w:rPr>
               <w:t>isbn</w:t>
             </w:r>
+            <w:proofErr w:type="spellEnd"/>
           </w:p>
         </w:tc>
         <w:tc>
@@ -14435,8 +14660,19 @@
                 <w:sz w:val="16"/>
                 <w:szCs w:val="16"/>
               </w:rPr>
-              <w:t>Validar formato isbn</w:t>
-            </w:r>
+              <w:t xml:space="preserve">Validar formato </w:t>
+            </w:r>
+            <w:proofErr w:type="spellStart"/>
+            <w:r>
+              <w:rPr>
+                <w:rFonts w:cstheme="minorHAnsi"/>
+                <w:b/>
+                <w:sz w:val="16"/>
+                <w:szCs w:val="16"/>
+              </w:rPr>
+              <w:t>isbn</w:t>
+            </w:r>
+            <w:proofErr w:type="spellEnd"/>
           </w:p>
         </w:tc>
       </w:tr>
@@ -14759,6 +14995,7 @@
                 <w:szCs w:val="16"/>
               </w:rPr>
             </w:pPr>
+            <w:proofErr w:type="spellStart"/>
             <w:r>
               <w:rPr>
                 <w:rFonts w:cstheme="minorHAnsi"/>
@@ -14768,6 +15005,7 @@
               </w:rPr>
               <w:t>numero_ejemplares</w:t>
             </w:r>
+            <w:proofErr w:type="spellEnd"/>
           </w:p>
         </w:tc>
         <w:tc>
@@ -14918,6 +15156,7 @@
                 <w:szCs w:val="16"/>
               </w:rPr>
             </w:pPr>
+            <w:proofErr w:type="spellStart"/>
             <w:r>
               <w:rPr>
                 <w:rFonts w:cstheme="minorHAnsi"/>
@@ -14927,6 +15166,7 @@
               </w:rPr>
               <w:t>id_materia</w:t>
             </w:r>
+            <w:proofErr w:type="spellEnd"/>
           </w:p>
         </w:tc>
         <w:tc>
@@ -15095,6 +15335,7 @@
                 <w:szCs w:val="16"/>
               </w:rPr>
             </w:pPr>
+            <w:proofErr w:type="spellStart"/>
             <w:r>
               <w:rPr>
                 <w:rFonts w:cstheme="minorHAnsi"/>
@@ -15104,6 +15345,7 @@
               </w:rPr>
               <w:t>id_curso</w:t>
             </w:r>
+            <w:proofErr w:type="spellEnd"/>
           </w:p>
         </w:tc>
         <w:tc>
@@ -16201,7 +16443,27 @@
                 <w:sz w:val="16"/>
                 <w:szCs w:val="16"/>
               </w:rPr>
-              <w:t>0, I, II  (0 para no beca, tramo I y II)</w:t>
+              <w:t xml:space="preserve">0, I, </w:t>
+            </w:r>
+            <w:proofErr w:type="gramStart"/>
+            <w:r>
+              <w:rPr>
+                <w:rFonts w:cstheme="minorHAnsi"/>
+                <w:b/>
+                <w:sz w:val="16"/>
+                <w:szCs w:val="16"/>
+              </w:rPr>
+              <w:t>II  (</w:t>
+            </w:r>
+            <w:proofErr w:type="gramEnd"/>
+            <w:r>
+              <w:rPr>
+                <w:rFonts w:cstheme="minorHAnsi"/>
+                <w:b/>
+                <w:sz w:val="16"/>
+                <w:szCs w:val="16"/>
+              </w:rPr>
+              <w:t>0 para no beca, tramo I y II)</w:t>
             </w:r>
           </w:p>
         </w:tc>
@@ -16220,6 +16482,7 @@
                 <w:szCs w:val="16"/>
               </w:rPr>
             </w:pPr>
+            <w:proofErr w:type="spellStart"/>
             <w:r>
               <w:rPr>
                 <w:rFonts w:cstheme="minorHAnsi"/>
@@ -16229,6 +16492,7 @@
               </w:rPr>
               <w:t>bilingue</w:t>
             </w:r>
+            <w:proofErr w:type="spellEnd"/>
           </w:p>
         </w:tc>
         <w:tc>
@@ -16400,6 +16664,7 @@
                 <w:szCs w:val="16"/>
               </w:rPr>
             </w:pPr>
+            <w:proofErr w:type="spellStart"/>
             <w:r>
               <w:rPr>
                 <w:rFonts w:cstheme="minorHAnsi"/>
@@ -16409,6 +16674,7 @@
               </w:rPr>
               <w:t>alumnoscursoslibros</w:t>
             </w:r>
+            <w:proofErr w:type="spellEnd"/>
           </w:p>
         </w:tc>
       </w:tr>
@@ -17010,6 +17276,7 @@
                 <w:szCs w:val="16"/>
               </w:rPr>
             </w:pPr>
+            <w:proofErr w:type="spellStart"/>
             <w:r>
               <w:rPr>
                 <w:rFonts w:cstheme="minorHAnsi"/>
@@ -17019,6 +17286,7 @@
               </w:rPr>
               <w:t>isbn</w:t>
             </w:r>
+            <w:proofErr w:type="spellEnd"/>
           </w:p>
         </w:tc>
         <w:tc>
@@ -17196,6 +17464,7 @@
                 <w:szCs w:val="16"/>
               </w:rPr>
             </w:pPr>
+            <w:proofErr w:type="spellStart"/>
             <w:r>
               <w:rPr>
                 <w:rFonts w:cstheme="minorHAnsi"/>
@@ -17214,6 +17483,7 @@
               </w:rPr>
               <w:t>echa_entrega</w:t>
             </w:r>
+            <w:proofErr w:type="spellEnd"/>
           </w:p>
         </w:tc>
         <w:tc>
@@ -17364,6 +17634,7 @@
                 <w:szCs w:val="16"/>
               </w:rPr>
             </w:pPr>
+            <w:proofErr w:type="spellStart"/>
             <w:r>
               <w:rPr>
                 <w:rFonts w:cstheme="minorHAnsi"/>
@@ -17400,6 +17671,7 @@
               </w:rPr>
               <w:t>evolución</w:t>
             </w:r>
+            <w:proofErr w:type="spellEnd"/>
           </w:p>
         </w:tc>
         <w:tc>
@@ -17672,8 +17944,19 @@
                 <w:sz w:val="16"/>
                 <w:szCs w:val="16"/>
               </w:rPr>
-              <w:t>P: Prestado, D:Devuelto</w:t>
-            </w:r>
+              <w:t xml:space="preserve">P: Prestado, </w:t>
+            </w:r>
+            <w:proofErr w:type="gramStart"/>
+            <w:r>
+              <w:rPr>
+                <w:rFonts w:cstheme="minorHAnsi"/>
+                <w:b/>
+                <w:sz w:val="16"/>
+                <w:szCs w:val="16"/>
+              </w:rPr>
+              <w:t>D:Devuelto</w:t>
+            </w:r>
+            <w:proofErr w:type="gramEnd"/>
           </w:p>
         </w:tc>
       </w:tr>
@@ -18047,23 +18330,34 @@
       <w:r>
         <w:t xml:space="preserve">almacenará los contratos que se van a generar por el sistema para su firma y el directorio </w:t>
       </w:r>
+      <w:proofErr w:type="spellStart"/>
       <w:r>
         <w:rPr>
           <w:b/>
           <w:bCs/>
         </w:rPr>
-        <w:t xml:space="preserve">copias_de_seguridad </w:t>
-      </w:r>
-      <w:r>
-        <w:t xml:space="preserve">que es donde almacenaremos las copias de seguridad que se generan para poder proteger la información. Y por último tenemos el directorio </w:t>
-      </w:r>
+        <w:t>copias_de_seguridad</w:t>
+      </w:r>
+      <w:proofErr w:type="spellEnd"/>
       <w:r>
         <w:rPr>
           <w:b/>
           <w:bCs/>
         </w:rPr>
+        <w:t xml:space="preserve"> </w:t>
+      </w:r>
+      <w:r>
+        <w:t xml:space="preserve">que es donde almacenaremos las copias de seguridad que se generan para poder proteger la información. Y por último tenemos el directorio </w:t>
+      </w:r>
+      <w:proofErr w:type="spellStart"/>
+      <w:r>
+        <w:rPr>
+          <w:b/>
+          <w:bCs/>
+        </w:rPr>
         <w:t>base_de_datos</w:t>
       </w:r>
+      <w:proofErr w:type="spellEnd"/>
       <w:r>
         <w:t xml:space="preserve"> que contendrá los archivos que son necesarios para poder conectar la aplicación con la base de datos.</w:t>
       </w:r>
@@ -18153,11 +18447,30 @@
     </w:p>
     <w:p>
       <w:r>
-        <w:t>El siguiente diagrama va a representar la estructura de clases que va a utilizar la aplicación para poder acceder y poder gestionar la información almacenada en la base de datos. La relación entre las clases va a permitir controlar la gestión de los préstamos las devoluciones, los cursos  y los libros que están asignados a cada alumno. El diagrama de clases se ha realizado teniendo en cuenta las relaciones existentes entre las distintas tablas del modelo relacional que se desarrollo anteriormente.</w:t>
+        <w:t xml:space="preserve">El siguiente diagrama va a representar la estructura de clases que va a utilizar la aplicación para poder acceder y poder gestionar la información almacenada en la base de datos. La relación entre las clases va a permitir controlar la gestión de los préstamos las devoluciones, los </w:t>
+      </w:r>
+      <w:proofErr w:type="gramStart"/>
+      <w:r>
+        <w:t>cursos  y</w:t>
+      </w:r>
+      <w:proofErr w:type="gramEnd"/>
+      <w:r>
+        <w:t xml:space="preserve"> los libros que están asignados a cada alumno. El diagrama de clases se ha realizado teniendo en cuenta las relaciones existentes entre las distintas tablas del modelo relacional que se </w:t>
+      </w:r>
+      <w:proofErr w:type="spellStart"/>
+      <w:r>
+        <w:t>desarrollo</w:t>
+      </w:r>
+      <w:proofErr w:type="spellEnd"/>
+      <w:r>
+        <w:t xml:space="preserve"> anteriormente.</w:t>
       </w:r>
     </w:p>
     <w:p>
       <w:r>
+        <w:rPr>
+          <w:noProof/>
+        </w:rPr>
         <w:drawing>
           <wp:inline distT="0" distB="0" distL="0" distR="0" wp14:anchorId="51E2F271" wp14:editId="75AD2783">
             <wp:extent cx="3981450" cy="4137077"/>
@@ -18576,9 +18889,14 @@
       <w:bookmarkStart w:id="151" w:name="_Toc49341858"/>
       <w:bookmarkStart w:id="152" w:name="_Toc170148368"/>
       <w:bookmarkStart w:id="153" w:name="_Toc170148682"/>
+      <w:proofErr w:type="spellStart"/>
       <w:r>
         <w:lastRenderedPageBreak/>
-        <w:t>Sql de creación (MySQL)</w:t>
+        <w:t>Sql</w:t>
+      </w:r>
+      <w:proofErr w:type="spellEnd"/>
+      <w:r>
+        <w:t xml:space="preserve"> de creación (MySQL)</w:t>
       </w:r>
       <w:bookmarkEnd w:id="148"/>
       <w:bookmarkEnd w:id="149"/>
@@ -18653,7 +18971,21 @@
         <w:rPr>
           <w:lang w:val="en-GB"/>
         </w:rPr>
-        <w:t>-- Servidor: 127.0.0.1</w:t>
+        <w:t xml:space="preserve">-- </w:t>
+      </w:r>
+      <w:proofErr w:type="spellStart"/>
+      <w:r>
+        <w:rPr>
+          <w:lang w:val="en-GB"/>
+        </w:rPr>
+        <w:t>Servidor</w:t>
+      </w:r>
+      <w:proofErr w:type="spellEnd"/>
+      <w:r>
+        <w:rPr>
+          <w:lang w:val="en-GB"/>
+        </w:rPr>
+        <w:t>: 127.0.0.1</w:t>
       </w:r>
     </w:p>
     <w:p>
@@ -18666,7 +18998,21 @@
         <w:rPr>
           <w:lang w:val="en-GB"/>
         </w:rPr>
-        <w:t>-- Tiempo de generación: 24-06-2024 a las 18:56:50</w:t>
+        <w:t xml:space="preserve">-- Tiempo de </w:t>
+      </w:r>
+      <w:proofErr w:type="spellStart"/>
+      <w:r>
+        <w:rPr>
+          <w:lang w:val="en-GB"/>
+        </w:rPr>
+        <w:t>generación</w:t>
+      </w:r>
+      <w:proofErr w:type="spellEnd"/>
+      <w:r>
+        <w:rPr>
+          <w:lang w:val="en-GB"/>
+        </w:rPr>
+        <w:t>: 24-06-2024 a las 18:56:50</w:t>
       </w:r>
     </w:p>
     <w:p>
@@ -18679,7 +19025,35 @@
         <w:rPr>
           <w:lang w:val="en-GB"/>
         </w:rPr>
-        <w:t>-- Versión del servidor: 10.4.27-MariaDB</w:t>
+        <w:t xml:space="preserve">-- </w:t>
+      </w:r>
+      <w:proofErr w:type="spellStart"/>
+      <w:r>
+        <w:rPr>
+          <w:lang w:val="en-GB"/>
+        </w:rPr>
+        <w:t>Versión</w:t>
+      </w:r>
+      <w:proofErr w:type="spellEnd"/>
+      <w:r>
+        <w:rPr>
+          <w:lang w:val="en-GB"/>
+        </w:rPr>
+        <w:t xml:space="preserve"> del </w:t>
+      </w:r>
+      <w:proofErr w:type="spellStart"/>
+      <w:r>
+        <w:rPr>
+          <w:lang w:val="en-GB"/>
+        </w:rPr>
+        <w:t>servidor</w:t>
+      </w:r>
+      <w:proofErr w:type="spellEnd"/>
+      <w:r>
+        <w:rPr>
+          <w:lang w:val="en-GB"/>
+        </w:rPr>
+        <w:t>: 10.4.27-MariaDB</w:t>
       </w:r>
     </w:p>
     <w:p>
@@ -18692,7 +19066,21 @@
         <w:rPr>
           <w:lang w:val="en-GB"/>
         </w:rPr>
-        <w:t>-- Versión de PHP: 8.2.0</w:t>
+        <w:t xml:space="preserve">-- </w:t>
+      </w:r>
+      <w:proofErr w:type="spellStart"/>
+      <w:r>
+        <w:rPr>
+          <w:lang w:val="en-GB"/>
+        </w:rPr>
+        <w:t>Versión</w:t>
+      </w:r>
+      <w:proofErr w:type="spellEnd"/>
+      <w:r>
+        <w:rPr>
+          <w:lang w:val="en-GB"/>
+        </w:rPr>
+        <w:t xml:space="preserve"> de PHP: 8.2.0</w:t>
       </w:r>
     </w:p>
     <w:p>
@@ -18738,7 +19126,21 @@
         <w:rPr>
           <w:lang w:val="en-GB"/>
         </w:rPr>
-        <w:t>SET time_zone = "+00:00";</w:t>
+        <w:t xml:space="preserve">SET </w:t>
+      </w:r>
+      <w:proofErr w:type="spellStart"/>
+      <w:r>
+        <w:rPr>
+          <w:lang w:val="en-GB"/>
+        </w:rPr>
+        <w:t>time_zone</w:t>
+      </w:r>
+      <w:proofErr w:type="spellEnd"/>
+      <w:r>
+        <w:rPr>
+          <w:lang w:val="en-GB"/>
+        </w:rPr>
+        <w:t xml:space="preserve"> = "+00:00";</w:t>
       </w:r>
     </w:p>
     <w:p>
@@ -18830,7 +19232,35 @@
         <w:rPr>
           <w:lang w:val="en-GB"/>
         </w:rPr>
-        <w:t>-- Base de datos: `bancolibros`</w:t>
+        <w:t xml:space="preserve">-- Base de </w:t>
+      </w:r>
+      <w:proofErr w:type="spellStart"/>
+      <w:r>
+        <w:rPr>
+          <w:lang w:val="en-GB"/>
+        </w:rPr>
+        <w:t>datos</w:t>
+      </w:r>
+      <w:proofErr w:type="spellEnd"/>
+      <w:r>
+        <w:rPr>
+          <w:lang w:val="en-GB"/>
+        </w:rPr>
+        <w:t>: `</w:t>
+      </w:r>
+      <w:proofErr w:type="spellStart"/>
+      <w:r>
+        <w:rPr>
+          <w:lang w:val="en-GB"/>
+        </w:rPr>
+        <w:t>bancolibros</w:t>
+      </w:r>
+      <w:proofErr w:type="spellEnd"/>
+      <w:r>
+        <w:rPr>
+          <w:lang w:val="en-GB"/>
+        </w:rPr>
+        <w:t>`</w:t>
       </w:r>
     </w:p>
     <w:p>
@@ -18882,7 +19312,63 @@
         <w:rPr>
           <w:lang w:val="en-GB"/>
         </w:rPr>
-        <w:t>-- Estructura de tabla para la tabla `alumnos`</w:t>
+        <w:t xml:space="preserve">-- </w:t>
+      </w:r>
+      <w:proofErr w:type="spellStart"/>
+      <w:r>
+        <w:rPr>
+          <w:lang w:val="en-GB"/>
+        </w:rPr>
+        <w:t>Estructura</w:t>
+      </w:r>
+      <w:proofErr w:type="spellEnd"/>
+      <w:r>
+        <w:rPr>
+          <w:lang w:val="en-GB"/>
+        </w:rPr>
+        <w:t xml:space="preserve"> de </w:t>
+      </w:r>
+      <w:proofErr w:type="spellStart"/>
+      <w:r>
+        <w:rPr>
+          <w:lang w:val="en-GB"/>
+        </w:rPr>
+        <w:t>tabla</w:t>
+      </w:r>
+      <w:proofErr w:type="spellEnd"/>
+      <w:r>
+        <w:rPr>
+          <w:lang w:val="en-GB"/>
+        </w:rPr>
+        <w:t xml:space="preserve"> para la </w:t>
+      </w:r>
+      <w:proofErr w:type="spellStart"/>
+      <w:r>
+        <w:rPr>
+          <w:lang w:val="en-GB"/>
+        </w:rPr>
+        <w:t>tabla</w:t>
+      </w:r>
+      <w:proofErr w:type="spellEnd"/>
+      <w:r>
+        <w:rPr>
+          <w:lang w:val="en-GB"/>
+        </w:rPr>
+        <w:t xml:space="preserve"> `</w:t>
+      </w:r>
+      <w:proofErr w:type="spellStart"/>
+      <w:r>
+        <w:rPr>
+          <w:lang w:val="en-GB"/>
+        </w:rPr>
+        <w:t>alumnos</w:t>
+      </w:r>
+      <w:proofErr w:type="spellEnd"/>
+      <w:r>
+        <w:rPr>
+          <w:lang w:val="en-GB"/>
+        </w:rPr>
+        <w:t>`</w:t>
       </w:r>
     </w:p>
     <w:p>
@@ -18908,7 +19394,21 @@
         <w:rPr>
           <w:lang w:val="en-GB"/>
         </w:rPr>
-        <w:t>CREATE TABLE `alumnos` (</w:t>
+        <w:t>CREATE TABLE `</w:t>
+      </w:r>
+      <w:proofErr w:type="spellStart"/>
+      <w:r>
+        <w:rPr>
+          <w:lang w:val="en-GB"/>
+        </w:rPr>
+        <w:t>alumnos</w:t>
+      </w:r>
+      <w:proofErr w:type="spellEnd"/>
+      <w:r>
+        <w:rPr>
+          <w:lang w:val="en-GB"/>
+        </w:rPr>
+        <w:t>` (</w:t>
       </w:r>
     </w:p>
     <w:p>
@@ -18921,7 +19421,35 @@
         <w:rPr>
           <w:lang w:val="en-GB"/>
         </w:rPr>
-        <w:t xml:space="preserve">  `nie` varchar(10) NOT NULL,</w:t>
+        <w:t xml:space="preserve">  `</w:t>
+      </w:r>
+      <w:proofErr w:type="spellStart"/>
+      <w:r>
+        <w:rPr>
+          <w:lang w:val="en-GB"/>
+        </w:rPr>
+        <w:t>nie</w:t>
+      </w:r>
+      <w:proofErr w:type="spellEnd"/>
+      <w:r>
+        <w:rPr>
+          <w:lang w:val="en-GB"/>
+        </w:rPr>
+        <w:t xml:space="preserve">` </w:t>
+      </w:r>
+      <w:proofErr w:type="gramStart"/>
+      <w:r>
+        <w:rPr>
+          <w:lang w:val="en-GB"/>
+        </w:rPr>
+        <w:t>varchar(</w:t>
+      </w:r>
+      <w:proofErr w:type="gramEnd"/>
+      <w:r>
+        <w:rPr>
+          <w:lang w:val="en-GB"/>
+        </w:rPr>
+        <w:t>10) NOT NULL,</w:t>
       </w:r>
     </w:p>
     <w:p>
@@ -18934,7 +19462,35 @@
         <w:rPr>
           <w:lang w:val="en-GB"/>
         </w:rPr>
-        <w:t xml:space="preserve">  `nombre` varchar(255) NOT NULL,</w:t>
+        <w:t xml:space="preserve">  `</w:t>
+      </w:r>
+      <w:proofErr w:type="spellStart"/>
+      <w:r>
+        <w:rPr>
+          <w:lang w:val="en-GB"/>
+        </w:rPr>
+        <w:t>nombre</w:t>
+      </w:r>
+      <w:proofErr w:type="spellEnd"/>
+      <w:r>
+        <w:rPr>
+          <w:lang w:val="en-GB"/>
+        </w:rPr>
+        <w:t xml:space="preserve">` </w:t>
+      </w:r>
+      <w:proofErr w:type="gramStart"/>
+      <w:r>
+        <w:rPr>
+          <w:lang w:val="en-GB"/>
+        </w:rPr>
+        <w:t>varchar(</w:t>
+      </w:r>
+      <w:proofErr w:type="gramEnd"/>
+      <w:r>
+        <w:rPr>
+          <w:lang w:val="en-GB"/>
+        </w:rPr>
+        <w:t>255) NOT NULL,</w:t>
       </w:r>
     </w:p>
     <w:p>
@@ -18947,7 +19503,35 @@
         <w:rPr>
           <w:lang w:val="en-GB"/>
         </w:rPr>
-        <w:t xml:space="preserve">  `apellidos` varchar(255) NOT NULL,</w:t>
+        <w:t xml:space="preserve">  `</w:t>
+      </w:r>
+      <w:proofErr w:type="spellStart"/>
+      <w:r>
+        <w:rPr>
+          <w:lang w:val="en-GB"/>
+        </w:rPr>
+        <w:t>apellidos</w:t>
+      </w:r>
+      <w:proofErr w:type="spellEnd"/>
+      <w:r>
+        <w:rPr>
+          <w:lang w:val="en-GB"/>
+        </w:rPr>
+        <w:t xml:space="preserve">` </w:t>
+      </w:r>
+      <w:proofErr w:type="gramStart"/>
+      <w:r>
+        <w:rPr>
+          <w:lang w:val="en-GB"/>
+        </w:rPr>
+        <w:t>varchar(</w:t>
+      </w:r>
+      <w:proofErr w:type="gramEnd"/>
+      <w:r>
+        <w:rPr>
+          <w:lang w:val="en-GB"/>
+        </w:rPr>
+        <w:t>255) NOT NULL,</w:t>
       </w:r>
     </w:p>
     <w:p>
@@ -18960,7 +19544,63 @@
         <w:rPr>
           <w:lang w:val="en-GB"/>
         </w:rPr>
-        <w:t xml:space="preserve">  `tramo` varchar(2) NOT NULL DEFAULT '0' COMMENT '0 nada, I tramo I y II Tramo 2',</w:t>
+        <w:t xml:space="preserve">  `</w:t>
+      </w:r>
+      <w:proofErr w:type="spellStart"/>
+      <w:r>
+        <w:rPr>
+          <w:lang w:val="en-GB"/>
+        </w:rPr>
+        <w:t>tramo</w:t>
+      </w:r>
+      <w:proofErr w:type="spellEnd"/>
+      <w:r>
+        <w:rPr>
+          <w:lang w:val="en-GB"/>
+        </w:rPr>
+        <w:t xml:space="preserve">` </w:t>
+      </w:r>
+      <w:proofErr w:type="gramStart"/>
+      <w:r>
+        <w:rPr>
+          <w:lang w:val="en-GB"/>
+        </w:rPr>
+        <w:t>varchar(</w:t>
+      </w:r>
+      <w:proofErr w:type="gramEnd"/>
+      <w:r>
+        <w:rPr>
+          <w:lang w:val="en-GB"/>
+        </w:rPr>
+        <w:t xml:space="preserve">2) NOT NULL DEFAULT '0' COMMENT '0 nada, I </w:t>
+      </w:r>
+      <w:proofErr w:type="spellStart"/>
+      <w:r>
+        <w:rPr>
+          <w:lang w:val="en-GB"/>
+        </w:rPr>
+        <w:t>tramo</w:t>
+      </w:r>
+      <w:proofErr w:type="spellEnd"/>
+      <w:r>
+        <w:rPr>
+          <w:lang w:val="en-GB"/>
+        </w:rPr>
+        <w:t xml:space="preserve"> I y II </w:t>
+      </w:r>
+      <w:proofErr w:type="spellStart"/>
+      <w:r>
+        <w:rPr>
+          <w:lang w:val="en-GB"/>
+        </w:rPr>
+        <w:t>Tramo</w:t>
+      </w:r>
+      <w:proofErr w:type="spellEnd"/>
+      <w:r>
+        <w:rPr>
+          <w:lang w:val="en-GB"/>
+        </w:rPr>
+        <w:t xml:space="preserve"> 2',</w:t>
       </w:r>
     </w:p>
     <w:p>
@@ -18973,7 +19613,43 @@
         <w:rPr>
           <w:lang w:val="en-GB"/>
         </w:rPr>
-        <w:t xml:space="preserve">  `bilingue` tinyint(1) NOT NULL DEFAULT 1 COMMENT '0 True, 1 false'</w:t>
+        <w:t xml:space="preserve">  `</w:t>
+      </w:r>
+      <w:proofErr w:type="spellStart"/>
+      <w:r>
+        <w:rPr>
+          <w:lang w:val="en-GB"/>
+        </w:rPr>
+        <w:t>bilingue</w:t>
+      </w:r>
+      <w:proofErr w:type="spellEnd"/>
+      <w:r>
+        <w:rPr>
+          <w:lang w:val="en-GB"/>
+        </w:rPr>
+        <w:t xml:space="preserve">` </w:t>
+      </w:r>
+      <w:proofErr w:type="spellStart"/>
+      <w:proofErr w:type="gramStart"/>
+      <w:r>
+        <w:rPr>
+          <w:lang w:val="en-GB"/>
+        </w:rPr>
+        <w:t>tinyint</w:t>
+      </w:r>
+      <w:proofErr w:type="spellEnd"/>
+      <w:r>
+        <w:rPr>
+          <w:lang w:val="en-GB"/>
+        </w:rPr>
+        <w:t>(</w:t>
+      </w:r>
+      <w:proofErr w:type="gramEnd"/>
+      <w:r>
+        <w:rPr>
+          <w:lang w:val="en-GB"/>
+        </w:rPr>
+        <w:t>1) NOT NULL DEFAULT 1 COMMENT '0 True, 1 false'</w:t>
       </w:r>
     </w:p>
     <w:p>
@@ -18986,7 +19662,21 @@
         <w:rPr>
           <w:lang w:val="en-GB"/>
         </w:rPr>
-        <w:t>) ENGINE=InnoDB DEFAULT CHARSET=utf8 COLLATE=utf8_spanish2_ci;</w:t>
+        <w:t>) ENGINE=</w:t>
+      </w:r>
+      <w:proofErr w:type="spellStart"/>
+      <w:r>
+        <w:rPr>
+          <w:lang w:val="en-GB"/>
+        </w:rPr>
+        <w:t>InnoDB</w:t>
+      </w:r>
+      <w:proofErr w:type="spellEnd"/>
+      <w:r>
+        <w:rPr>
+          <w:lang w:val="en-GB"/>
+        </w:rPr>
+        <w:t xml:space="preserve"> DEFAULT CHARSET=utf8 COLLATE=utf8_spanish2_ci;</w:t>
       </w:r>
     </w:p>
     <w:p>
@@ -19025,7 +19715,63 @@
         <w:rPr>
           <w:lang w:val="en-GB"/>
         </w:rPr>
-        <w:t>-- Estructura de tabla para la tabla `alumnoscrusoslibros`</w:t>
+        <w:t xml:space="preserve">-- </w:t>
+      </w:r>
+      <w:proofErr w:type="spellStart"/>
+      <w:r>
+        <w:rPr>
+          <w:lang w:val="en-GB"/>
+        </w:rPr>
+        <w:t>Estructura</w:t>
+      </w:r>
+      <w:proofErr w:type="spellEnd"/>
+      <w:r>
+        <w:rPr>
+          <w:lang w:val="en-GB"/>
+        </w:rPr>
+        <w:t xml:space="preserve"> de </w:t>
+      </w:r>
+      <w:proofErr w:type="spellStart"/>
+      <w:r>
+        <w:rPr>
+          <w:lang w:val="en-GB"/>
+        </w:rPr>
+        <w:t>tabla</w:t>
+      </w:r>
+      <w:proofErr w:type="spellEnd"/>
+      <w:r>
+        <w:rPr>
+          <w:lang w:val="en-GB"/>
+        </w:rPr>
+        <w:t xml:space="preserve"> para la </w:t>
+      </w:r>
+      <w:proofErr w:type="spellStart"/>
+      <w:r>
+        <w:rPr>
+          <w:lang w:val="en-GB"/>
+        </w:rPr>
+        <w:t>tabla</w:t>
+      </w:r>
+      <w:proofErr w:type="spellEnd"/>
+      <w:r>
+        <w:rPr>
+          <w:lang w:val="en-GB"/>
+        </w:rPr>
+        <w:t xml:space="preserve"> `</w:t>
+      </w:r>
+      <w:proofErr w:type="spellStart"/>
+      <w:r>
+        <w:rPr>
+          <w:lang w:val="en-GB"/>
+        </w:rPr>
+        <w:t>alumnoscrusoslibros</w:t>
+      </w:r>
+      <w:proofErr w:type="spellEnd"/>
+      <w:r>
+        <w:rPr>
+          <w:lang w:val="en-GB"/>
+        </w:rPr>
+        <w:t>`</w:t>
       </w:r>
     </w:p>
     <w:p>
@@ -19051,7 +19797,21 @@
         <w:rPr>
           <w:lang w:val="en-GB"/>
         </w:rPr>
-        <w:t>CREATE TABLE `alumnoscrusoslibros` (</w:t>
+        <w:t>CREATE TABLE `</w:t>
+      </w:r>
+      <w:proofErr w:type="spellStart"/>
+      <w:r>
+        <w:rPr>
+          <w:lang w:val="en-GB"/>
+        </w:rPr>
+        <w:t>alumnoscrusoslibros</w:t>
+      </w:r>
+      <w:proofErr w:type="spellEnd"/>
+      <w:r>
+        <w:rPr>
+          <w:lang w:val="en-GB"/>
+        </w:rPr>
+        <w:t>` (</w:t>
       </w:r>
     </w:p>
     <w:p>
@@ -19064,7 +19824,35 @@
         <w:rPr>
           <w:lang w:val="en-GB"/>
         </w:rPr>
-        <w:t xml:space="preserve">  `nie` varchar(10) NOT NULL,</w:t>
+        <w:t xml:space="preserve">  `</w:t>
+      </w:r>
+      <w:proofErr w:type="spellStart"/>
+      <w:r>
+        <w:rPr>
+          <w:lang w:val="en-GB"/>
+        </w:rPr>
+        <w:t>nie</w:t>
+      </w:r>
+      <w:proofErr w:type="spellEnd"/>
+      <w:r>
+        <w:rPr>
+          <w:lang w:val="en-GB"/>
+        </w:rPr>
+        <w:t xml:space="preserve">` </w:t>
+      </w:r>
+      <w:proofErr w:type="gramStart"/>
+      <w:r>
+        <w:rPr>
+          <w:lang w:val="en-GB"/>
+        </w:rPr>
+        <w:t>varchar(</w:t>
+      </w:r>
+      <w:proofErr w:type="gramEnd"/>
+      <w:r>
+        <w:rPr>
+          <w:lang w:val="en-GB"/>
+        </w:rPr>
+        <w:t>10) NOT NULL,</w:t>
       </w:r>
     </w:p>
     <w:p>
@@ -19077,7 +19865,35 @@
         <w:rPr>
           <w:lang w:val="en-GB"/>
         </w:rPr>
-        <w:t xml:space="preserve">  `curso` varchar(255) NOT NULL,</w:t>
+        <w:t xml:space="preserve">  `</w:t>
+      </w:r>
+      <w:proofErr w:type="spellStart"/>
+      <w:r>
+        <w:rPr>
+          <w:lang w:val="en-GB"/>
+        </w:rPr>
+        <w:t>curso</w:t>
+      </w:r>
+      <w:proofErr w:type="spellEnd"/>
+      <w:r>
+        <w:rPr>
+          <w:lang w:val="en-GB"/>
+        </w:rPr>
+        <w:t xml:space="preserve">` </w:t>
+      </w:r>
+      <w:proofErr w:type="gramStart"/>
+      <w:r>
+        <w:rPr>
+          <w:lang w:val="en-GB"/>
+        </w:rPr>
+        <w:t>varchar(</w:t>
+      </w:r>
+      <w:proofErr w:type="gramEnd"/>
+      <w:r>
+        <w:rPr>
+          <w:lang w:val="en-GB"/>
+        </w:rPr>
+        <w:t>255) NOT NULL,</w:t>
       </w:r>
     </w:p>
     <w:p>
@@ -19090,7 +19906,35 @@
         <w:rPr>
           <w:lang w:val="en-GB"/>
         </w:rPr>
-        <w:t xml:space="preserve">  `isbn` varchar(20) NOT NULL,</w:t>
+        <w:t xml:space="preserve">  `</w:t>
+      </w:r>
+      <w:proofErr w:type="spellStart"/>
+      <w:r>
+        <w:rPr>
+          <w:lang w:val="en-GB"/>
+        </w:rPr>
+        <w:t>isbn</w:t>
+      </w:r>
+      <w:proofErr w:type="spellEnd"/>
+      <w:r>
+        <w:rPr>
+          <w:lang w:val="en-GB"/>
+        </w:rPr>
+        <w:t xml:space="preserve">` </w:t>
+      </w:r>
+      <w:proofErr w:type="gramStart"/>
+      <w:r>
+        <w:rPr>
+          <w:lang w:val="en-GB"/>
+        </w:rPr>
+        <w:t>varchar(</w:t>
+      </w:r>
+      <w:proofErr w:type="gramEnd"/>
+      <w:r>
+        <w:rPr>
+          <w:lang w:val="en-GB"/>
+        </w:rPr>
+        <w:t>20) NOT NULL,</w:t>
       </w:r>
     </w:p>
     <w:p>
@@ -19103,7 +19947,21 @@
         <w:rPr>
           <w:lang w:val="en-GB"/>
         </w:rPr>
-        <w:t xml:space="preserve">  `fecha_entrega` date NOT NULL,</w:t>
+        <w:t xml:space="preserve">  `</w:t>
+      </w:r>
+      <w:proofErr w:type="spellStart"/>
+      <w:r>
+        <w:rPr>
+          <w:lang w:val="en-GB"/>
+        </w:rPr>
+        <w:t>fecha_entrega</w:t>
+      </w:r>
+      <w:proofErr w:type="spellEnd"/>
+      <w:r>
+        <w:rPr>
+          <w:lang w:val="en-GB"/>
+        </w:rPr>
+        <w:t>` date NOT NULL,</w:t>
       </w:r>
     </w:p>
     <w:p>
@@ -19117,7 +19975,21 @@
           <w:lang w:val="en-GB"/>
         </w:rPr>
         <w:lastRenderedPageBreak/>
-        <w:t xml:space="preserve">  `fecha_devolucion` date NOT NULL,</w:t>
+        <w:t xml:space="preserve">  `</w:t>
+      </w:r>
+      <w:proofErr w:type="spellStart"/>
+      <w:r>
+        <w:rPr>
+          <w:lang w:val="en-GB"/>
+        </w:rPr>
+        <w:t>fecha_devolucion</w:t>
+      </w:r>
+      <w:proofErr w:type="spellEnd"/>
+      <w:r>
+        <w:rPr>
+          <w:lang w:val="en-GB"/>
+        </w:rPr>
+        <w:t>` date NOT NULL,</w:t>
       </w:r>
     </w:p>
     <w:p>
@@ -19130,7 +20002,63 @@
         <w:rPr>
           <w:lang w:val="en-GB"/>
         </w:rPr>
-        <w:t xml:space="preserve">  `estado` varchar(1) NOT NULL DEFAULT 'P' COMMENT 'P: Prestado, D:Devuelto'</w:t>
+        <w:t xml:space="preserve">  `</w:t>
+      </w:r>
+      <w:proofErr w:type="spellStart"/>
+      <w:r>
+        <w:rPr>
+          <w:lang w:val="en-GB"/>
+        </w:rPr>
+        <w:t>estado</w:t>
+      </w:r>
+      <w:proofErr w:type="spellEnd"/>
+      <w:r>
+        <w:rPr>
+          <w:lang w:val="en-GB"/>
+        </w:rPr>
+        <w:t xml:space="preserve">` </w:t>
+      </w:r>
+      <w:proofErr w:type="gramStart"/>
+      <w:r>
+        <w:rPr>
+          <w:lang w:val="en-GB"/>
+        </w:rPr>
+        <w:t>varchar(</w:t>
+      </w:r>
+      <w:proofErr w:type="gramEnd"/>
+      <w:r>
+        <w:rPr>
+          <w:lang w:val="en-GB"/>
+        </w:rPr>
+        <w:t xml:space="preserve">1) NOT NULL DEFAULT 'P' COMMENT 'P: </w:t>
+      </w:r>
+      <w:proofErr w:type="spellStart"/>
+      <w:r>
+        <w:rPr>
+          <w:lang w:val="en-GB"/>
+        </w:rPr>
+        <w:t>Prestado</w:t>
+      </w:r>
+      <w:proofErr w:type="spellEnd"/>
+      <w:r>
+        <w:rPr>
+          <w:lang w:val="en-GB"/>
+        </w:rPr>
+        <w:t xml:space="preserve">, </w:t>
+      </w:r>
+      <w:proofErr w:type="gramStart"/>
+      <w:r>
+        <w:rPr>
+          <w:lang w:val="en-GB"/>
+        </w:rPr>
+        <w:t>D:Devuelto</w:t>
+      </w:r>
+      <w:proofErr w:type="gramEnd"/>
+      <w:r>
+        <w:rPr>
+          <w:lang w:val="en-GB"/>
+        </w:rPr>
+        <w:t>'</w:t>
       </w:r>
     </w:p>
     <w:p>
@@ -19143,7 +20071,21 @@
         <w:rPr>
           <w:lang w:val="en-GB"/>
         </w:rPr>
-        <w:t>) ENGINE=InnoDB DEFAULT CHARSET=utf8 COLLATE=utf8_spanish2_ci;</w:t>
+        <w:t>) ENGINE=</w:t>
+      </w:r>
+      <w:proofErr w:type="spellStart"/>
+      <w:r>
+        <w:rPr>
+          <w:lang w:val="en-GB"/>
+        </w:rPr>
+        <w:t>InnoDB</w:t>
+      </w:r>
+      <w:proofErr w:type="spellEnd"/>
+      <w:r>
+        <w:rPr>
+          <w:lang w:val="en-GB"/>
+        </w:rPr>
+        <w:t xml:space="preserve"> DEFAULT CHARSET=utf8 COLLATE=utf8_spanish2_ci;</w:t>
       </w:r>
     </w:p>
     <w:p>
@@ -19182,7 +20124,63 @@
         <w:rPr>
           <w:lang w:val="en-GB"/>
         </w:rPr>
-        <w:t>-- Estructura de tabla para la tabla `cursos`</w:t>
+        <w:t xml:space="preserve">-- </w:t>
+      </w:r>
+      <w:proofErr w:type="spellStart"/>
+      <w:r>
+        <w:rPr>
+          <w:lang w:val="en-GB"/>
+        </w:rPr>
+        <w:t>Estructura</w:t>
+      </w:r>
+      <w:proofErr w:type="spellEnd"/>
+      <w:r>
+        <w:rPr>
+          <w:lang w:val="en-GB"/>
+        </w:rPr>
+        <w:t xml:space="preserve"> de </w:t>
+      </w:r>
+      <w:proofErr w:type="spellStart"/>
+      <w:r>
+        <w:rPr>
+          <w:lang w:val="en-GB"/>
+        </w:rPr>
+        <w:t>tabla</w:t>
+      </w:r>
+      <w:proofErr w:type="spellEnd"/>
+      <w:r>
+        <w:rPr>
+          <w:lang w:val="en-GB"/>
+        </w:rPr>
+        <w:t xml:space="preserve"> para la </w:t>
+      </w:r>
+      <w:proofErr w:type="spellStart"/>
+      <w:r>
+        <w:rPr>
+          <w:lang w:val="en-GB"/>
+        </w:rPr>
+        <w:t>tabla</w:t>
+      </w:r>
+      <w:proofErr w:type="spellEnd"/>
+      <w:r>
+        <w:rPr>
+          <w:lang w:val="en-GB"/>
+        </w:rPr>
+        <w:t xml:space="preserve"> `</w:t>
+      </w:r>
+      <w:proofErr w:type="spellStart"/>
+      <w:r>
+        <w:rPr>
+          <w:lang w:val="en-GB"/>
+        </w:rPr>
+        <w:t>cursos</w:t>
+      </w:r>
+      <w:proofErr w:type="spellEnd"/>
+      <w:r>
+        <w:rPr>
+          <w:lang w:val="en-GB"/>
+        </w:rPr>
+        <w:t>`</w:t>
       </w:r>
     </w:p>
     <w:p>
@@ -19208,7 +20206,21 @@
         <w:rPr>
           <w:lang w:val="en-GB"/>
         </w:rPr>
-        <w:t>CREATE TABLE `cursos` (</w:t>
+        <w:t>CREATE TABLE `</w:t>
+      </w:r>
+      <w:proofErr w:type="spellStart"/>
+      <w:r>
+        <w:rPr>
+          <w:lang w:val="en-GB"/>
+        </w:rPr>
+        <w:t>cursos</w:t>
+      </w:r>
+      <w:proofErr w:type="spellEnd"/>
+      <w:r>
+        <w:rPr>
+          <w:lang w:val="en-GB"/>
+        </w:rPr>
+        <w:t>` (</w:t>
       </w:r>
     </w:p>
     <w:p>
@@ -19221,7 +20233,35 @@
         <w:rPr>
           <w:lang w:val="en-GB"/>
         </w:rPr>
-        <w:t xml:space="preserve">  `curso` varchar(20) NOT NULL,</w:t>
+        <w:t xml:space="preserve">  `</w:t>
+      </w:r>
+      <w:proofErr w:type="spellStart"/>
+      <w:r>
+        <w:rPr>
+          <w:lang w:val="en-GB"/>
+        </w:rPr>
+        <w:t>curso</w:t>
+      </w:r>
+      <w:proofErr w:type="spellEnd"/>
+      <w:r>
+        <w:rPr>
+          <w:lang w:val="en-GB"/>
+        </w:rPr>
+        <w:t xml:space="preserve">` </w:t>
+      </w:r>
+      <w:proofErr w:type="gramStart"/>
+      <w:r>
+        <w:rPr>
+          <w:lang w:val="en-GB"/>
+        </w:rPr>
+        <w:t>varchar(</w:t>
+      </w:r>
+      <w:proofErr w:type="gramEnd"/>
+      <w:r>
+        <w:rPr>
+          <w:lang w:val="en-GB"/>
+        </w:rPr>
+        <w:t>20) NOT NULL,</w:t>
       </w:r>
     </w:p>
     <w:p>
@@ -19234,7 +20274,35 @@
         <w:rPr>
           <w:lang w:val="en-GB"/>
         </w:rPr>
-        <w:t xml:space="preserve">  `nivel` varchar(20) NOT NULL</w:t>
+        <w:t xml:space="preserve">  `</w:t>
+      </w:r>
+      <w:proofErr w:type="spellStart"/>
+      <w:r>
+        <w:rPr>
+          <w:lang w:val="en-GB"/>
+        </w:rPr>
+        <w:t>nivel</w:t>
+      </w:r>
+      <w:proofErr w:type="spellEnd"/>
+      <w:r>
+        <w:rPr>
+          <w:lang w:val="en-GB"/>
+        </w:rPr>
+        <w:t xml:space="preserve">` </w:t>
+      </w:r>
+      <w:proofErr w:type="gramStart"/>
+      <w:r>
+        <w:rPr>
+          <w:lang w:val="en-GB"/>
+        </w:rPr>
+        <w:t>varchar(</w:t>
+      </w:r>
+      <w:proofErr w:type="gramEnd"/>
+      <w:r>
+        <w:rPr>
+          <w:lang w:val="en-GB"/>
+        </w:rPr>
+        <w:t>20) NOT NULL</w:t>
       </w:r>
     </w:p>
     <w:p>
@@ -19247,7 +20315,21 @@
         <w:rPr>
           <w:lang w:val="en-GB"/>
         </w:rPr>
-        <w:t>) ENGINE=InnoDB DEFAULT CHARSET=utf8 COLLATE=utf8_spanish2_ci;</w:t>
+        <w:t>) ENGINE=</w:t>
+      </w:r>
+      <w:proofErr w:type="spellStart"/>
+      <w:r>
+        <w:rPr>
+          <w:lang w:val="en-GB"/>
+        </w:rPr>
+        <w:t>InnoDB</w:t>
+      </w:r>
+      <w:proofErr w:type="spellEnd"/>
+      <w:r>
+        <w:rPr>
+          <w:lang w:val="en-GB"/>
+        </w:rPr>
+        <w:t xml:space="preserve"> DEFAULT CHARSET=utf8 COLLATE=utf8_spanish2_ci;</w:t>
       </w:r>
     </w:p>
     <w:p>
@@ -19286,7 +20368,63 @@
         <w:rPr>
           <w:lang w:val="en-GB"/>
         </w:rPr>
-        <w:t>-- Estructura de tabla para la tabla `libros`</w:t>
+        <w:t xml:space="preserve">-- </w:t>
+      </w:r>
+      <w:proofErr w:type="spellStart"/>
+      <w:r>
+        <w:rPr>
+          <w:lang w:val="en-GB"/>
+        </w:rPr>
+        <w:t>Estructura</w:t>
+      </w:r>
+      <w:proofErr w:type="spellEnd"/>
+      <w:r>
+        <w:rPr>
+          <w:lang w:val="en-GB"/>
+        </w:rPr>
+        <w:t xml:space="preserve"> de </w:t>
+      </w:r>
+      <w:proofErr w:type="spellStart"/>
+      <w:r>
+        <w:rPr>
+          <w:lang w:val="en-GB"/>
+        </w:rPr>
+        <w:t>tabla</w:t>
+      </w:r>
+      <w:proofErr w:type="spellEnd"/>
+      <w:r>
+        <w:rPr>
+          <w:lang w:val="en-GB"/>
+        </w:rPr>
+        <w:t xml:space="preserve"> para la </w:t>
+      </w:r>
+      <w:proofErr w:type="spellStart"/>
+      <w:r>
+        <w:rPr>
+          <w:lang w:val="en-GB"/>
+        </w:rPr>
+        <w:t>tabla</w:t>
+      </w:r>
+      <w:proofErr w:type="spellEnd"/>
+      <w:r>
+        <w:rPr>
+          <w:lang w:val="en-GB"/>
+        </w:rPr>
+        <w:t xml:space="preserve"> `</w:t>
+      </w:r>
+      <w:proofErr w:type="spellStart"/>
+      <w:r>
+        <w:rPr>
+          <w:lang w:val="en-GB"/>
+        </w:rPr>
+        <w:t>libros</w:t>
+      </w:r>
+      <w:proofErr w:type="spellEnd"/>
+      <w:r>
+        <w:rPr>
+          <w:lang w:val="en-GB"/>
+        </w:rPr>
+        <w:t>`</w:t>
       </w:r>
     </w:p>
     <w:p>
@@ -19312,7 +20450,21 @@
         <w:rPr>
           <w:lang w:val="en-GB"/>
         </w:rPr>
-        <w:t>CREATE TABLE `libros` (</w:t>
+        <w:t>CREATE TABLE `</w:t>
+      </w:r>
+      <w:proofErr w:type="spellStart"/>
+      <w:r>
+        <w:rPr>
+          <w:lang w:val="en-GB"/>
+        </w:rPr>
+        <w:t>libros</w:t>
+      </w:r>
+      <w:proofErr w:type="spellEnd"/>
+      <w:r>
+        <w:rPr>
+          <w:lang w:val="en-GB"/>
+        </w:rPr>
+        <w:t>` (</w:t>
       </w:r>
     </w:p>
     <w:p>
@@ -19325,7 +20477,35 @@
         <w:rPr>
           <w:lang w:val="en-GB"/>
         </w:rPr>
-        <w:t xml:space="preserve">  `isbn` varchar(20) NOT NULL,</w:t>
+        <w:t xml:space="preserve">  `</w:t>
+      </w:r>
+      <w:proofErr w:type="spellStart"/>
+      <w:r>
+        <w:rPr>
+          <w:lang w:val="en-GB"/>
+        </w:rPr>
+        <w:t>isbn</w:t>
+      </w:r>
+      <w:proofErr w:type="spellEnd"/>
+      <w:r>
+        <w:rPr>
+          <w:lang w:val="en-GB"/>
+        </w:rPr>
+        <w:t xml:space="preserve">` </w:t>
+      </w:r>
+      <w:proofErr w:type="gramStart"/>
+      <w:r>
+        <w:rPr>
+          <w:lang w:val="en-GB"/>
+        </w:rPr>
+        <w:t>varchar(</w:t>
+      </w:r>
+      <w:proofErr w:type="gramEnd"/>
+      <w:r>
+        <w:rPr>
+          <w:lang w:val="en-GB"/>
+        </w:rPr>
+        <w:t>20) NOT NULL,</w:t>
       </w:r>
     </w:p>
     <w:p>
@@ -19338,7 +20518,35 @@
         <w:rPr>
           <w:lang w:val="en-GB"/>
         </w:rPr>
-        <w:t xml:space="preserve">  `titulo` varchar(255) NOT NULL,</w:t>
+        <w:t xml:space="preserve">  `</w:t>
+      </w:r>
+      <w:proofErr w:type="spellStart"/>
+      <w:r>
+        <w:rPr>
+          <w:lang w:val="en-GB"/>
+        </w:rPr>
+        <w:t>titulo</w:t>
+      </w:r>
+      <w:proofErr w:type="spellEnd"/>
+      <w:r>
+        <w:rPr>
+          <w:lang w:val="en-GB"/>
+        </w:rPr>
+        <w:t xml:space="preserve">` </w:t>
+      </w:r>
+      <w:proofErr w:type="gramStart"/>
+      <w:r>
+        <w:rPr>
+          <w:lang w:val="en-GB"/>
+        </w:rPr>
+        <w:t>varchar(</w:t>
+      </w:r>
+      <w:proofErr w:type="gramEnd"/>
+      <w:r>
+        <w:rPr>
+          <w:lang w:val="en-GB"/>
+        </w:rPr>
+        <w:t>255) NOT NULL,</w:t>
       </w:r>
     </w:p>
     <w:p>
@@ -19351,7 +20559,35 @@
         <w:rPr>
           <w:lang w:val="en-GB"/>
         </w:rPr>
-        <w:t xml:space="preserve">  `autor` varchar(255) NOT NULL,</w:t>
+        <w:t xml:space="preserve">  `</w:t>
+      </w:r>
+      <w:proofErr w:type="spellStart"/>
+      <w:r>
+        <w:rPr>
+          <w:lang w:val="en-GB"/>
+        </w:rPr>
+        <w:t>autor</w:t>
+      </w:r>
+      <w:proofErr w:type="spellEnd"/>
+      <w:r>
+        <w:rPr>
+          <w:lang w:val="en-GB"/>
+        </w:rPr>
+        <w:t xml:space="preserve">` </w:t>
+      </w:r>
+      <w:proofErr w:type="gramStart"/>
+      <w:r>
+        <w:rPr>
+          <w:lang w:val="en-GB"/>
+        </w:rPr>
+        <w:t>varchar(</w:t>
+      </w:r>
+      <w:proofErr w:type="gramEnd"/>
+      <w:r>
+        <w:rPr>
+          <w:lang w:val="en-GB"/>
+        </w:rPr>
+        <w:t>255) NOT NULL,</w:t>
       </w:r>
     </w:p>
     <w:p>
@@ -19364,7 +20600,35 @@
         <w:rPr>
           <w:lang w:val="en-GB"/>
         </w:rPr>
-        <w:t xml:space="preserve">  `numero_ejemplares` int(5) NOT NULL,</w:t>
+        <w:t xml:space="preserve">  `</w:t>
+      </w:r>
+      <w:proofErr w:type="spellStart"/>
+      <w:r>
+        <w:rPr>
+          <w:lang w:val="en-GB"/>
+        </w:rPr>
+        <w:t>numero_ejemplares</w:t>
+      </w:r>
+      <w:proofErr w:type="spellEnd"/>
+      <w:r>
+        <w:rPr>
+          <w:lang w:val="en-GB"/>
+        </w:rPr>
+        <w:t xml:space="preserve">` </w:t>
+      </w:r>
+      <w:proofErr w:type="gramStart"/>
+      <w:r>
+        <w:rPr>
+          <w:lang w:val="en-GB"/>
+        </w:rPr>
+        <w:t>int(</w:t>
+      </w:r>
+      <w:proofErr w:type="gramEnd"/>
+      <w:r>
+        <w:rPr>
+          <w:lang w:val="en-GB"/>
+        </w:rPr>
+        <w:t>5) NOT NULL,</w:t>
       </w:r>
     </w:p>
     <w:p>
@@ -19377,7 +20641,35 @@
         <w:rPr>
           <w:lang w:val="en-GB"/>
         </w:rPr>
-        <w:t xml:space="preserve">  `id_materia` int(11) NOT NULL,</w:t>
+        <w:t xml:space="preserve">  `</w:t>
+      </w:r>
+      <w:proofErr w:type="spellStart"/>
+      <w:r>
+        <w:rPr>
+          <w:lang w:val="en-GB"/>
+        </w:rPr>
+        <w:t>id_materia</w:t>
+      </w:r>
+      <w:proofErr w:type="spellEnd"/>
+      <w:r>
+        <w:rPr>
+          <w:lang w:val="en-GB"/>
+        </w:rPr>
+        <w:t xml:space="preserve">` </w:t>
+      </w:r>
+      <w:proofErr w:type="gramStart"/>
+      <w:r>
+        <w:rPr>
+          <w:lang w:val="en-GB"/>
+        </w:rPr>
+        <w:t>int(</w:t>
+      </w:r>
+      <w:proofErr w:type="gramEnd"/>
+      <w:r>
+        <w:rPr>
+          <w:lang w:val="en-GB"/>
+        </w:rPr>
+        <w:t>11) NOT NULL,</w:t>
       </w:r>
     </w:p>
     <w:p>
@@ -19390,7 +20682,35 @@
         <w:rPr>
           <w:lang w:val="en-GB"/>
         </w:rPr>
-        <w:t xml:space="preserve">  `id_curso` varchar(20) NOT NULL</w:t>
+        <w:t xml:space="preserve">  `</w:t>
+      </w:r>
+      <w:proofErr w:type="spellStart"/>
+      <w:r>
+        <w:rPr>
+          <w:lang w:val="en-GB"/>
+        </w:rPr>
+        <w:t>id_curso</w:t>
+      </w:r>
+      <w:proofErr w:type="spellEnd"/>
+      <w:r>
+        <w:rPr>
+          <w:lang w:val="en-GB"/>
+        </w:rPr>
+        <w:t xml:space="preserve">` </w:t>
+      </w:r>
+      <w:proofErr w:type="gramStart"/>
+      <w:r>
+        <w:rPr>
+          <w:lang w:val="en-GB"/>
+        </w:rPr>
+        <w:t>varchar(</w:t>
+      </w:r>
+      <w:proofErr w:type="gramEnd"/>
+      <w:r>
+        <w:rPr>
+          <w:lang w:val="en-GB"/>
+        </w:rPr>
+        <w:t>20) NOT NULL</w:t>
       </w:r>
     </w:p>
     <w:p>
@@ -19403,7 +20723,21 @@
         <w:rPr>
           <w:lang w:val="en-GB"/>
         </w:rPr>
-        <w:t>) ENGINE=InnoDB DEFAULT CHARSET=utf8 COLLATE=utf8_spanish2_ci;</w:t>
+        <w:t>) ENGINE=</w:t>
+      </w:r>
+      <w:proofErr w:type="spellStart"/>
+      <w:r>
+        <w:rPr>
+          <w:lang w:val="en-GB"/>
+        </w:rPr>
+        <w:t>InnoDB</w:t>
+      </w:r>
+      <w:proofErr w:type="spellEnd"/>
+      <w:r>
+        <w:rPr>
+          <w:lang w:val="en-GB"/>
+        </w:rPr>
+        <w:t xml:space="preserve"> DEFAULT CHARSET=utf8 COLLATE=utf8_spanish2_ci;</w:t>
       </w:r>
     </w:p>
     <w:p>
@@ -19442,7 +20776,63 @@
         <w:rPr>
           <w:lang w:val="en-GB"/>
         </w:rPr>
-        <w:t>-- Estructura de tabla para la tabla `materias`</w:t>
+        <w:t xml:space="preserve">-- </w:t>
+      </w:r>
+      <w:proofErr w:type="spellStart"/>
+      <w:r>
+        <w:rPr>
+          <w:lang w:val="en-GB"/>
+        </w:rPr>
+        <w:t>Estructura</w:t>
+      </w:r>
+      <w:proofErr w:type="spellEnd"/>
+      <w:r>
+        <w:rPr>
+          <w:lang w:val="en-GB"/>
+        </w:rPr>
+        <w:t xml:space="preserve"> de </w:t>
+      </w:r>
+      <w:proofErr w:type="spellStart"/>
+      <w:r>
+        <w:rPr>
+          <w:lang w:val="en-GB"/>
+        </w:rPr>
+        <w:t>tabla</w:t>
+      </w:r>
+      <w:proofErr w:type="spellEnd"/>
+      <w:r>
+        <w:rPr>
+          <w:lang w:val="en-GB"/>
+        </w:rPr>
+        <w:t xml:space="preserve"> para la </w:t>
+      </w:r>
+      <w:proofErr w:type="spellStart"/>
+      <w:r>
+        <w:rPr>
+          <w:lang w:val="en-GB"/>
+        </w:rPr>
+        <w:t>tabla</w:t>
+      </w:r>
+      <w:proofErr w:type="spellEnd"/>
+      <w:r>
+        <w:rPr>
+          <w:lang w:val="en-GB"/>
+        </w:rPr>
+        <w:t xml:space="preserve"> `</w:t>
+      </w:r>
+      <w:proofErr w:type="spellStart"/>
+      <w:r>
+        <w:rPr>
+          <w:lang w:val="en-GB"/>
+        </w:rPr>
+        <w:t>materias</w:t>
+      </w:r>
+      <w:proofErr w:type="spellEnd"/>
+      <w:r>
+        <w:rPr>
+          <w:lang w:val="en-GB"/>
+        </w:rPr>
+        <w:t>`</w:t>
       </w:r>
     </w:p>
     <w:p>
@@ -19468,7 +20858,21 @@
         <w:rPr>
           <w:lang w:val="en-GB"/>
         </w:rPr>
-        <w:t>CREATE TABLE `materias` (</w:t>
+        <w:t>CREATE TABLE `</w:t>
+      </w:r>
+      <w:proofErr w:type="spellStart"/>
+      <w:r>
+        <w:rPr>
+          <w:lang w:val="en-GB"/>
+        </w:rPr>
+        <w:t>materias</w:t>
+      </w:r>
+      <w:proofErr w:type="spellEnd"/>
+      <w:r>
+        <w:rPr>
+          <w:lang w:val="en-GB"/>
+        </w:rPr>
+        <w:t>` (</w:t>
       </w:r>
     </w:p>
     <w:p>
@@ -19481,7 +20885,21 @@
         <w:rPr>
           <w:lang w:val="en-GB"/>
         </w:rPr>
-        <w:t xml:space="preserve">  `id` int(11) NOT NULL,</w:t>
+        <w:t xml:space="preserve">  `id` </w:t>
+      </w:r>
+      <w:proofErr w:type="gramStart"/>
+      <w:r>
+        <w:rPr>
+          <w:lang w:val="en-GB"/>
+        </w:rPr>
+        <w:t>int(</w:t>
+      </w:r>
+      <w:proofErr w:type="gramEnd"/>
+      <w:r>
+        <w:rPr>
+          <w:lang w:val="en-GB"/>
+        </w:rPr>
+        <w:t>11) NOT NULL,</w:t>
       </w:r>
     </w:p>
     <w:p>
@@ -19494,7 +20912,35 @@
         <w:rPr>
           <w:lang w:val="en-GB"/>
         </w:rPr>
-        <w:t xml:space="preserve">  `nombre` varchar(255) NOT NULL,</w:t>
+        <w:t xml:space="preserve">  `</w:t>
+      </w:r>
+      <w:proofErr w:type="spellStart"/>
+      <w:r>
+        <w:rPr>
+          <w:lang w:val="en-GB"/>
+        </w:rPr>
+        <w:t>nombre</w:t>
+      </w:r>
+      <w:proofErr w:type="spellEnd"/>
+      <w:r>
+        <w:rPr>
+          <w:lang w:val="en-GB"/>
+        </w:rPr>
+        <w:t xml:space="preserve">` </w:t>
+      </w:r>
+      <w:proofErr w:type="gramStart"/>
+      <w:r>
+        <w:rPr>
+          <w:lang w:val="en-GB"/>
+        </w:rPr>
+        <w:t>varchar(</w:t>
+      </w:r>
+      <w:proofErr w:type="gramEnd"/>
+      <w:r>
+        <w:rPr>
+          <w:lang w:val="en-GB"/>
+        </w:rPr>
+        <w:t>255) NOT NULL,</w:t>
       </w:r>
     </w:p>
     <w:p>
@@ -19507,7 +20953,35 @@
         <w:rPr>
           <w:lang w:val="en-GB"/>
         </w:rPr>
-        <w:t xml:space="preserve">  `departamento` varchar(255) NOT NULL</w:t>
+        <w:t xml:space="preserve">  `</w:t>
+      </w:r>
+      <w:proofErr w:type="spellStart"/>
+      <w:r>
+        <w:rPr>
+          <w:lang w:val="en-GB"/>
+        </w:rPr>
+        <w:t>departamento</w:t>
+      </w:r>
+      <w:proofErr w:type="spellEnd"/>
+      <w:r>
+        <w:rPr>
+          <w:lang w:val="en-GB"/>
+        </w:rPr>
+        <w:t xml:space="preserve">` </w:t>
+      </w:r>
+      <w:proofErr w:type="gramStart"/>
+      <w:r>
+        <w:rPr>
+          <w:lang w:val="en-GB"/>
+        </w:rPr>
+        <w:t>varchar(</w:t>
+      </w:r>
+      <w:proofErr w:type="gramEnd"/>
+      <w:r>
+        <w:rPr>
+          <w:lang w:val="en-GB"/>
+        </w:rPr>
+        <w:t>255) NOT NULL</w:t>
       </w:r>
     </w:p>
     <w:p>
@@ -19520,7 +20994,21 @@
         <w:rPr>
           <w:lang w:val="en-GB"/>
         </w:rPr>
-        <w:t>) ENGINE=InnoDB DEFAULT CHARSET=utf8 COLLATE=utf8_spanish2_ci;</w:t>
+        <w:t>) ENGINE=</w:t>
+      </w:r>
+      <w:proofErr w:type="spellStart"/>
+      <w:r>
+        <w:rPr>
+          <w:lang w:val="en-GB"/>
+        </w:rPr>
+        <w:t>InnoDB</w:t>
+      </w:r>
+      <w:proofErr w:type="spellEnd"/>
+      <w:r>
+        <w:rPr>
+          <w:lang w:val="en-GB"/>
+        </w:rPr>
+        <w:t xml:space="preserve"> DEFAULT CHARSET=utf8 COLLATE=utf8_spanish2_ci;</w:t>
       </w:r>
     </w:p>
     <w:p>
@@ -19546,8 +21034,44 @@
         <w:rPr>
           <w:lang w:val="en-GB"/>
         </w:rPr>
-        <w:t>-- Índices para tablas volcadas</w:t>
-      </w:r>
+        <w:t xml:space="preserve">-- </w:t>
+      </w:r>
+      <w:proofErr w:type="spellStart"/>
+      <w:r>
+        <w:rPr>
+          <w:lang w:val="en-GB"/>
+        </w:rPr>
+        <w:t>Índices</w:t>
+      </w:r>
+      <w:proofErr w:type="spellEnd"/>
+      <w:r>
+        <w:rPr>
+          <w:lang w:val="en-GB"/>
+        </w:rPr>
+        <w:t xml:space="preserve"> para </w:t>
+      </w:r>
+      <w:proofErr w:type="spellStart"/>
+      <w:r>
+        <w:rPr>
+          <w:lang w:val="en-GB"/>
+        </w:rPr>
+        <w:t>tablas</w:t>
+      </w:r>
+      <w:proofErr w:type="spellEnd"/>
+      <w:r>
+        <w:rPr>
+          <w:lang w:val="en-GB"/>
+        </w:rPr>
+        <w:t xml:space="preserve"> </w:t>
+      </w:r>
+      <w:proofErr w:type="spellStart"/>
+      <w:r>
+        <w:rPr>
+          <w:lang w:val="en-GB"/>
+        </w:rPr>
+        <w:t>volcadas</w:t>
+      </w:r>
+      <w:proofErr w:type="spellEnd"/>
     </w:p>
     <w:p>
       <w:pPr>
@@ -19585,7 +21109,35 @@
         <w:rPr>
           <w:lang w:val="en-GB"/>
         </w:rPr>
-        <w:t>-- Indices de la tabla `alumnos`</w:t>
+        <w:t xml:space="preserve">-- Indices de la </w:t>
+      </w:r>
+      <w:proofErr w:type="spellStart"/>
+      <w:r>
+        <w:rPr>
+          <w:lang w:val="en-GB"/>
+        </w:rPr>
+        <w:t>tabla</w:t>
+      </w:r>
+      <w:proofErr w:type="spellEnd"/>
+      <w:r>
+        <w:rPr>
+          <w:lang w:val="en-GB"/>
+        </w:rPr>
+        <w:t xml:space="preserve"> `</w:t>
+      </w:r>
+      <w:proofErr w:type="spellStart"/>
+      <w:r>
+        <w:rPr>
+          <w:lang w:val="en-GB"/>
+        </w:rPr>
+        <w:t>alumnos</w:t>
+      </w:r>
+      <w:proofErr w:type="spellEnd"/>
+      <w:r>
+        <w:rPr>
+          <w:lang w:val="en-GB"/>
+        </w:rPr>
+        <w:t>`</w:t>
       </w:r>
     </w:p>
     <w:p>
@@ -19611,7 +21163,21 @@
         <w:rPr>
           <w:lang w:val="en-GB"/>
         </w:rPr>
-        <w:t>ALTER TABLE `alumnos`</w:t>
+        <w:t>ALTER TABLE `</w:t>
+      </w:r>
+      <w:proofErr w:type="spellStart"/>
+      <w:r>
+        <w:rPr>
+          <w:lang w:val="en-GB"/>
+        </w:rPr>
+        <w:t>alumnos</w:t>
+      </w:r>
+      <w:proofErr w:type="spellEnd"/>
+      <w:r>
+        <w:rPr>
+          <w:lang w:val="en-GB"/>
+        </w:rPr>
+        <w:t>`</w:t>
       </w:r>
     </w:p>
     <w:p>
@@ -19624,7 +21190,21 @@
         <w:rPr>
           <w:lang w:val="en-GB"/>
         </w:rPr>
-        <w:t xml:space="preserve">  ADD PRIMARY KEY (`nie`);</w:t>
+        <w:t xml:space="preserve">  ADD PRIMARY KEY (`</w:t>
+      </w:r>
+      <w:proofErr w:type="spellStart"/>
+      <w:r>
+        <w:rPr>
+          <w:lang w:val="en-GB"/>
+        </w:rPr>
+        <w:t>nie</w:t>
+      </w:r>
+      <w:proofErr w:type="spellEnd"/>
+      <w:r>
+        <w:rPr>
+          <w:lang w:val="en-GB"/>
+        </w:rPr>
+        <w:t>`);</w:t>
       </w:r>
     </w:p>
     <w:p>
@@ -19650,7 +21230,35 @@
         <w:rPr>
           <w:lang w:val="en-GB"/>
         </w:rPr>
-        <w:t>-- Indices de la tabla `alumnoscrusoslibros`</w:t>
+        <w:t xml:space="preserve">-- Indices de la </w:t>
+      </w:r>
+      <w:proofErr w:type="spellStart"/>
+      <w:r>
+        <w:rPr>
+          <w:lang w:val="en-GB"/>
+        </w:rPr>
+        <w:t>tabla</w:t>
+      </w:r>
+      <w:proofErr w:type="spellEnd"/>
+      <w:r>
+        <w:rPr>
+          <w:lang w:val="en-GB"/>
+        </w:rPr>
+        <w:t xml:space="preserve"> `</w:t>
+      </w:r>
+      <w:proofErr w:type="spellStart"/>
+      <w:r>
+        <w:rPr>
+          <w:lang w:val="en-GB"/>
+        </w:rPr>
+        <w:t>alumnoscrusoslibros</w:t>
+      </w:r>
+      <w:proofErr w:type="spellEnd"/>
+      <w:r>
+        <w:rPr>
+          <w:lang w:val="en-GB"/>
+        </w:rPr>
+        <w:t>`</w:t>
       </w:r>
     </w:p>
     <w:p>
@@ -19677,7 +21285,21 @@
           <w:lang w:val="en-GB"/>
         </w:rPr>
         <w:lastRenderedPageBreak/>
-        <w:t>ALTER TABLE `alumnoscrusoslibros`</w:t>
+        <w:t>ALTER TABLE `</w:t>
+      </w:r>
+      <w:proofErr w:type="spellStart"/>
+      <w:r>
+        <w:rPr>
+          <w:lang w:val="en-GB"/>
+        </w:rPr>
+        <w:t>alumnoscrusoslibros</w:t>
+      </w:r>
+      <w:proofErr w:type="spellEnd"/>
+      <w:r>
+        <w:rPr>
+          <w:lang w:val="en-GB"/>
+        </w:rPr>
+        <w:t>`</w:t>
       </w:r>
     </w:p>
     <w:p>
@@ -19690,7 +21312,53 @@
         <w:rPr>
           <w:lang w:val="en-GB"/>
         </w:rPr>
-        <w:t xml:space="preserve">  ADD PRIMARY KEY (`nie`,`curso`,`isbn`),</w:t>
+        <w:t xml:space="preserve">  ADD PRIMARY KEY (`</w:t>
+      </w:r>
+      <w:proofErr w:type="spellStart"/>
+      <w:r>
+        <w:rPr>
+          <w:lang w:val="en-GB"/>
+        </w:rPr>
+        <w:t>nie</w:t>
+      </w:r>
+      <w:proofErr w:type="spellEnd"/>
+      <w:proofErr w:type="gramStart"/>
+      <w:r>
+        <w:rPr>
+          <w:lang w:val="en-GB"/>
+        </w:rPr>
+        <w:t>`,`</w:t>
+      </w:r>
+      <w:proofErr w:type="spellStart"/>
+      <w:proofErr w:type="gramEnd"/>
+      <w:r>
+        <w:rPr>
+          <w:lang w:val="en-GB"/>
+        </w:rPr>
+        <w:t>curso</w:t>
+      </w:r>
+      <w:proofErr w:type="spellEnd"/>
+      <w:proofErr w:type="gramStart"/>
+      <w:r>
+        <w:rPr>
+          <w:lang w:val="en-GB"/>
+        </w:rPr>
+        <w:t>`,`</w:t>
+      </w:r>
+      <w:proofErr w:type="spellStart"/>
+      <w:proofErr w:type="gramEnd"/>
+      <w:r>
+        <w:rPr>
+          <w:lang w:val="en-GB"/>
+        </w:rPr>
+        <w:t>isbn</w:t>
+      </w:r>
+      <w:proofErr w:type="spellEnd"/>
+      <w:r>
+        <w:rPr>
+          <w:lang w:val="en-GB"/>
+        </w:rPr>
+        <w:t>`),</w:t>
       </w:r>
     </w:p>
     <w:p>
@@ -19703,7 +21371,35 @@
         <w:rPr>
           <w:lang w:val="en-GB"/>
         </w:rPr>
-        <w:t xml:space="preserve">  ADD KEY `isbn` (`isbn`),</w:t>
+        <w:t xml:space="preserve">  ADD KEY `</w:t>
+      </w:r>
+      <w:proofErr w:type="spellStart"/>
+      <w:r>
+        <w:rPr>
+          <w:lang w:val="en-GB"/>
+        </w:rPr>
+        <w:t>isbn</w:t>
+      </w:r>
+      <w:proofErr w:type="spellEnd"/>
+      <w:r>
+        <w:rPr>
+          <w:lang w:val="en-GB"/>
+        </w:rPr>
+        <w:t>` (`</w:t>
+      </w:r>
+      <w:proofErr w:type="spellStart"/>
+      <w:r>
+        <w:rPr>
+          <w:lang w:val="en-GB"/>
+        </w:rPr>
+        <w:t>isbn</w:t>
+      </w:r>
+      <w:proofErr w:type="spellEnd"/>
+      <w:r>
+        <w:rPr>
+          <w:lang w:val="en-GB"/>
+        </w:rPr>
+        <w:t>`),</w:t>
       </w:r>
     </w:p>
     <w:p>
@@ -19716,7 +21412,35 @@
         <w:rPr>
           <w:lang w:val="en-GB"/>
         </w:rPr>
-        <w:t xml:space="preserve">  ADD KEY `curso` (`curso`);</w:t>
+        <w:t xml:space="preserve">  ADD KEY `</w:t>
+      </w:r>
+      <w:proofErr w:type="spellStart"/>
+      <w:r>
+        <w:rPr>
+          <w:lang w:val="en-GB"/>
+        </w:rPr>
+        <w:t>curso</w:t>
+      </w:r>
+      <w:proofErr w:type="spellEnd"/>
+      <w:r>
+        <w:rPr>
+          <w:lang w:val="en-GB"/>
+        </w:rPr>
+        <w:t>` (`</w:t>
+      </w:r>
+      <w:proofErr w:type="spellStart"/>
+      <w:r>
+        <w:rPr>
+          <w:lang w:val="en-GB"/>
+        </w:rPr>
+        <w:t>curso</w:t>
+      </w:r>
+      <w:proofErr w:type="spellEnd"/>
+      <w:r>
+        <w:rPr>
+          <w:lang w:val="en-GB"/>
+        </w:rPr>
+        <w:t>`);</w:t>
       </w:r>
     </w:p>
     <w:p>
@@ -19742,7 +21466,35 @@
         <w:rPr>
           <w:lang w:val="en-GB"/>
         </w:rPr>
-        <w:t>-- Indices de la tabla `cursos`</w:t>
+        <w:t xml:space="preserve">-- Indices de la </w:t>
+      </w:r>
+      <w:proofErr w:type="spellStart"/>
+      <w:r>
+        <w:rPr>
+          <w:lang w:val="en-GB"/>
+        </w:rPr>
+        <w:t>tabla</w:t>
+      </w:r>
+      <w:proofErr w:type="spellEnd"/>
+      <w:r>
+        <w:rPr>
+          <w:lang w:val="en-GB"/>
+        </w:rPr>
+        <w:t xml:space="preserve"> `</w:t>
+      </w:r>
+      <w:proofErr w:type="spellStart"/>
+      <w:r>
+        <w:rPr>
+          <w:lang w:val="en-GB"/>
+        </w:rPr>
+        <w:t>cursos</w:t>
+      </w:r>
+      <w:proofErr w:type="spellEnd"/>
+      <w:r>
+        <w:rPr>
+          <w:lang w:val="en-GB"/>
+        </w:rPr>
+        <w:t>`</w:t>
       </w:r>
     </w:p>
     <w:p>
@@ -19768,7 +21520,21 @@
         <w:rPr>
           <w:lang w:val="en-GB"/>
         </w:rPr>
-        <w:t>ALTER TABLE `cursos`</w:t>
+        <w:t>ALTER TABLE `</w:t>
+      </w:r>
+      <w:proofErr w:type="spellStart"/>
+      <w:r>
+        <w:rPr>
+          <w:lang w:val="en-GB"/>
+        </w:rPr>
+        <w:t>cursos</w:t>
+      </w:r>
+      <w:proofErr w:type="spellEnd"/>
+      <w:r>
+        <w:rPr>
+          <w:lang w:val="en-GB"/>
+        </w:rPr>
+        <w:t>`</w:t>
       </w:r>
     </w:p>
     <w:p>
@@ -19781,7 +21547,21 @@
         <w:rPr>
           <w:lang w:val="en-GB"/>
         </w:rPr>
-        <w:t xml:space="preserve">  ADD PRIMARY KEY (`curso`);</w:t>
+        <w:t xml:space="preserve">  ADD PRIMARY KEY (`</w:t>
+      </w:r>
+      <w:proofErr w:type="spellStart"/>
+      <w:r>
+        <w:rPr>
+          <w:lang w:val="en-GB"/>
+        </w:rPr>
+        <w:t>curso</w:t>
+      </w:r>
+      <w:proofErr w:type="spellEnd"/>
+      <w:r>
+        <w:rPr>
+          <w:lang w:val="en-GB"/>
+        </w:rPr>
+        <w:t>`);</w:t>
       </w:r>
     </w:p>
     <w:p>
@@ -19807,7 +21587,35 @@
         <w:rPr>
           <w:lang w:val="en-GB"/>
         </w:rPr>
-        <w:t>-- Indices de la tabla `libros`</w:t>
+        <w:t xml:space="preserve">-- Indices de la </w:t>
+      </w:r>
+      <w:proofErr w:type="spellStart"/>
+      <w:r>
+        <w:rPr>
+          <w:lang w:val="en-GB"/>
+        </w:rPr>
+        <w:t>tabla</w:t>
+      </w:r>
+      <w:proofErr w:type="spellEnd"/>
+      <w:r>
+        <w:rPr>
+          <w:lang w:val="en-GB"/>
+        </w:rPr>
+        <w:t xml:space="preserve"> `</w:t>
+      </w:r>
+      <w:proofErr w:type="spellStart"/>
+      <w:r>
+        <w:rPr>
+          <w:lang w:val="en-GB"/>
+        </w:rPr>
+        <w:t>libros</w:t>
+      </w:r>
+      <w:proofErr w:type="spellEnd"/>
+      <w:r>
+        <w:rPr>
+          <w:lang w:val="en-GB"/>
+        </w:rPr>
+        <w:t>`</w:t>
       </w:r>
     </w:p>
     <w:p>
@@ -19833,7 +21641,21 @@
         <w:rPr>
           <w:lang w:val="en-GB"/>
         </w:rPr>
-        <w:t>ALTER TABLE `libros`</w:t>
+        <w:t>ALTER TABLE `</w:t>
+      </w:r>
+      <w:proofErr w:type="spellStart"/>
+      <w:r>
+        <w:rPr>
+          <w:lang w:val="en-GB"/>
+        </w:rPr>
+        <w:t>libros</w:t>
+      </w:r>
+      <w:proofErr w:type="spellEnd"/>
+      <w:r>
+        <w:rPr>
+          <w:lang w:val="en-GB"/>
+        </w:rPr>
+        <w:t>`</w:t>
       </w:r>
     </w:p>
     <w:p>
@@ -19846,7 +21668,21 @@
         <w:rPr>
           <w:lang w:val="en-GB"/>
         </w:rPr>
-        <w:t xml:space="preserve">  ADD PRIMARY KEY (`isbn`),</w:t>
+        <w:t xml:space="preserve">  ADD PRIMARY KEY (`</w:t>
+      </w:r>
+      <w:proofErr w:type="spellStart"/>
+      <w:r>
+        <w:rPr>
+          <w:lang w:val="en-GB"/>
+        </w:rPr>
+        <w:t>isbn</w:t>
+      </w:r>
+      <w:proofErr w:type="spellEnd"/>
+      <w:r>
+        <w:rPr>
+          <w:lang w:val="en-GB"/>
+        </w:rPr>
+        <w:t>`),</w:t>
       </w:r>
     </w:p>
     <w:p>
@@ -19859,7 +21695,35 @@
         <w:rPr>
           <w:lang w:val="en-GB"/>
         </w:rPr>
-        <w:t xml:space="preserve">  ADD KEY `FK_Materias` (`id_materia`),</w:t>
+        <w:t xml:space="preserve">  ADD KEY `</w:t>
+      </w:r>
+      <w:proofErr w:type="spellStart"/>
+      <w:r>
+        <w:rPr>
+          <w:lang w:val="en-GB"/>
+        </w:rPr>
+        <w:t>FK_Materias</w:t>
+      </w:r>
+      <w:proofErr w:type="spellEnd"/>
+      <w:r>
+        <w:rPr>
+          <w:lang w:val="en-GB"/>
+        </w:rPr>
+        <w:t>` (`</w:t>
+      </w:r>
+      <w:proofErr w:type="spellStart"/>
+      <w:r>
+        <w:rPr>
+          <w:lang w:val="en-GB"/>
+        </w:rPr>
+        <w:t>id_materia</w:t>
+      </w:r>
+      <w:proofErr w:type="spellEnd"/>
+      <w:r>
+        <w:rPr>
+          <w:lang w:val="en-GB"/>
+        </w:rPr>
+        <w:t>`),</w:t>
       </w:r>
     </w:p>
     <w:p>
@@ -19872,7 +21736,35 @@
         <w:rPr>
           <w:lang w:val="en-GB"/>
         </w:rPr>
-        <w:t xml:space="preserve">  ADD KEY `FK_Cursos` (`id_curso`) USING BTREE;</w:t>
+        <w:t xml:space="preserve">  ADD KEY `</w:t>
+      </w:r>
+      <w:proofErr w:type="spellStart"/>
+      <w:r>
+        <w:rPr>
+          <w:lang w:val="en-GB"/>
+        </w:rPr>
+        <w:t>FK_Cursos</w:t>
+      </w:r>
+      <w:proofErr w:type="spellEnd"/>
+      <w:r>
+        <w:rPr>
+          <w:lang w:val="en-GB"/>
+        </w:rPr>
+        <w:t>` (`</w:t>
+      </w:r>
+      <w:proofErr w:type="spellStart"/>
+      <w:r>
+        <w:rPr>
+          <w:lang w:val="en-GB"/>
+        </w:rPr>
+        <w:t>id_curso</w:t>
+      </w:r>
+      <w:proofErr w:type="spellEnd"/>
+      <w:r>
+        <w:rPr>
+          <w:lang w:val="en-GB"/>
+        </w:rPr>
+        <w:t>`) USING BTREE;</w:t>
       </w:r>
     </w:p>
     <w:p>
@@ -19898,7 +21790,35 @@
         <w:rPr>
           <w:lang w:val="en-GB"/>
         </w:rPr>
-        <w:t>-- Indices de la tabla `materias`</w:t>
+        <w:t xml:space="preserve">-- Indices de la </w:t>
+      </w:r>
+      <w:proofErr w:type="spellStart"/>
+      <w:r>
+        <w:rPr>
+          <w:lang w:val="en-GB"/>
+        </w:rPr>
+        <w:t>tabla</w:t>
+      </w:r>
+      <w:proofErr w:type="spellEnd"/>
+      <w:r>
+        <w:rPr>
+          <w:lang w:val="en-GB"/>
+        </w:rPr>
+        <w:t xml:space="preserve"> `</w:t>
+      </w:r>
+      <w:proofErr w:type="spellStart"/>
+      <w:r>
+        <w:rPr>
+          <w:lang w:val="en-GB"/>
+        </w:rPr>
+        <w:t>materias</w:t>
+      </w:r>
+      <w:proofErr w:type="spellEnd"/>
+      <w:r>
+        <w:rPr>
+          <w:lang w:val="en-GB"/>
+        </w:rPr>
+        <w:t>`</w:t>
       </w:r>
     </w:p>
     <w:p>
@@ -19924,7 +21844,21 @@
         <w:rPr>
           <w:lang w:val="en-GB"/>
         </w:rPr>
-        <w:t>ALTER TABLE `materias`</w:t>
+        <w:t>ALTER TABLE `</w:t>
+      </w:r>
+      <w:proofErr w:type="spellStart"/>
+      <w:r>
+        <w:rPr>
+          <w:lang w:val="en-GB"/>
+        </w:rPr>
+        <w:t>materias</w:t>
+      </w:r>
+      <w:proofErr w:type="spellEnd"/>
+      <w:r>
+        <w:rPr>
+          <w:lang w:val="en-GB"/>
+        </w:rPr>
+        <w:t>`</w:t>
       </w:r>
     </w:p>
     <w:p>
@@ -19950,8 +21884,30 @@
         <w:rPr>
           <w:lang w:val="en-GB"/>
         </w:rPr>
-        <w:t>-- Restricciones para tablas volcadas</w:t>
-      </w:r>
+        <w:t xml:space="preserve">-- Restricciones para </w:t>
+      </w:r>
+      <w:proofErr w:type="spellStart"/>
+      <w:r>
+        <w:rPr>
+          <w:lang w:val="en-GB"/>
+        </w:rPr>
+        <w:t>tablas</w:t>
+      </w:r>
+      <w:proofErr w:type="spellEnd"/>
+      <w:r>
+        <w:rPr>
+          <w:lang w:val="en-GB"/>
+        </w:rPr>
+        <w:t xml:space="preserve"> </w:t>
+      </w:r>
+      <w:proofErr w:type="spellStart"/>
+      <w:r>
+        <w:rPr>
+          <w:lang w:val="en-GB"/>
+        </w:rPr>
+        <w:t>volcadas</w:t>
+      </w:r>
+      <w:proofErr w:type="spellEnd"/>
     </w:p>
     <w:p>
       <w:pPr>
@@ -19989,7 +21945,49 @@
         <w:rPr>
           <w:lang w:val="en-GB"/>
         </w:rPr>
-        <w:t>-- Filtros para la tabla `alumnoscrusoslibros`</w:t>
+        <w:t xml:space="preserve">-- </w:t>
+      </w:r>
+      <w:proofErr w:type="spellStart"/>
+      <w:r>
+        <w:rPr>
+          <w:lang w:val="en-GB"/>
+        </w:rPr>
+        <w:t>Filtros</w:t>
+      </w:r>
+      <w:proofErr w:type="spellEnd"/>
+      <w:r>
+        <w:rPr>
+          <w:lang w:val="en-GB"/>
+        </w:rPr>
+        <w:t xml:space="preserve"> para la </w:t>
+      </w:r>
+      <w:proofErr w:type="spellStart"/>
+      <w:r>
+        <w:rPr>
+          <w:lang w:val="en-GB"/>
+        </w:rPr>
+        <w:t>tabla</w:t>
+      </w:r>
+      <w:proofErr w:type="spellEnd"/>
+      <w:r>
+        <w:rPr>
+          <w:lang w:val="en-GB"/>
+        </w:rPr>
+        <w:t xml:space="preserve"> `</w:t>
+      </w:r>
+      <w:proofErr w:type="spellStart"/>
+      <w:r>
+        <w:rPr>
+          <w:lang w:val="en-GB"/>
+        </w:rPr>
+        <w:t>alumnoscrusoslibros</w:t>
+      </w:r>
+      <w:proofErr w:type="spellEnd"/>
+      <w:r>
+        <w:rPr>
+          <w:lang w:val="en-GB"/>
+        </w:rPr>
+        <w:t>`</w:t>
       </w:r>
     </w:p>
     <w:p>
@@ -20015,7 +22013,21 @@
         <w:rPr>
           <w:lang w:val="en-GB"/>
         </w:rPr>
-        <w:t>ALTER TABLE `alumnoscrusoslibros`</w:t>
+        <w:t>ALTER TABLE `</w:t>
+      </w:r>
+      <w:proofErr w:type="spellStart"/>
+      <w:r>
+        <w:rPr>
+          <w:lang w:val="en-GB"/>
+        </w:rPr>
+        <w:t>alumnoscrusoslibros</w:t>
+      </w:r>
+      <w:proofErr w:type="spellEnd"/>
+      <w:r>
+        <w:rPr>
+          <w:lang w:val="en-GB"/>
+        </w:rPr>
+        <w:t>`</w:t>
       </w:r>
     </w:p>
     <w:p>
@@ -20028,7 +22040,49 @@
         <w:rPr>
           <w:lang w:val="en-GB"/>
         </w:rPr>
-        <w:t xml:space="preserve">  ADD CONSTRAINT `alumnoscrusoslibros_ibfk_1` FOREIGN KEY (`isbn`) REFERENCES `libros` (`isbn`) ON DELETE CASCADE ON UPDATE CASCADE,</w:t>
+        <w:t xml:space="preserve">  ADD CONSTRAINT `alumnoscrusoslibros_ibfk_1` FOREIGN KEY (`</w:t>
+      </w:r>
+      <w:proofErr w:type="spellStart"/>
+      <w:r>
+        <w:rPr>
+          <w:lang w:val="en-GB"/>
+        </w:rPr>
+        <w:t>isbn</w:t>
+      </w:r>
+      <w:proofErr w:type="spellEnd"/>
+      <w:r>
+        <w:rPr>
+          <w:lang w:val="en-GB"/>
+        </w:rPr>
+        <w:t>`) REFERENCES `</w:t>
+      </w:r>
+      <w:proofErr w:type="spellStart"/>
+      <w:r>
+        <w:rPr>
+          <w:lang w:val="en-GB"/>
+        </w:rPr>
+        <w:t>libros</w:t>
+      </w:r>
+      <w:proofErr w:type="spellEnd"/>
+      <w:r>
+        <w:rPr>
+          <w:lang w:val="en-GB"/>
+        </w:rPr>
+        <w:t>` (`</w:t>
+      </w:r>
+      <w:proofErr w:type="spellStart"/>
+      <w:r>
+        <w:rPr>
+          <w:lang w:val="en-GB"/>
+        </w:rPr>
+        <w:t>isbn</w:t>
+      </w:r>
+      <w:proofErr w:type="spellEnd"/>
+      <w:r>
+        <w:rPr>
+          <w:lang w:val="en-GB"/>
+        </w:rPr>
+        <w:t>`) ON DELETE CASCADE ON UPDATE CASCADE,</w:t>
       </w:r>
     </w:p>
     <w:p>
@@ -20041,7 +22095,49 @@
         <w:rPr>
           <w:lang w:val="en-GB"/>
         </w:rPr>
-        <w:t xml:space="preserve">  ADD CONSTRAINT `alumnoscrusoslibros_ibfk_2` FOREIGN KEY (`nie`) REFERENCES `alumnos` (`nie`) ON DELETE CASCADE ON UPDATE CASCADE,</w:t>
+        <w:t xml:space="preserve">  ADD CONSTRAINT `alumnoscrusoslibros_ibfk_2` FOREIGN KEY (`</w:t>
+      </w:r>
+      <w:proofErr w:type="spellStart"/>
+      <w:r>
+        <w:rPr>
+          <w:lang w:val="en-GB"/>
+        </w:rPr>
+        <w:t>nie</w:t>
+      </w:r>
+      <w:proofErr w:type="spellEnd"/>
+      <w:r>
+        <w:rPr>
+          <w:lang w:val="en-GB"/>
+        </w:rPr>
+        <w:t>`) REFERENCES `</w:t>
+      </w:r>
+      <w:proofErr w:type="spellStart"/>
+      <w:r>
+        <w:rPr>
+          <w:lang w:val="en-GB"/>
+        </w:rPr>
+        <w:t>alumnos</w:t>
+      </w:r>
+      <w:proofErr w:type="spellEnd"/>
+      <w:r>
+        <w:rPr>
+          <w:lang w:val="en-GB"/>
+        </w:rPr>
+        <w:t>` (`</w:t>
+      </w:r>
+      <w:proofErr w:type="spellStart"/>
+      <w:r>
+        <w:rPr>
+          <w:lang w:val="en-GB"/>
+        </w:rPr>
+        <w:t>nie</w:t>
+      </w:r>
+      <w:proofErr w:type="spellEnd"/>
+      <w:r>
+        <w:rPr>
+          <w:lang w:val="en-GB"/>
+        </w:rPr>
+        <w:t>`) ON DELETE CASCADE ON UPDATE CASCADE,</w:t>
       </w:r>
     </w:p>
     <w:p>
@@ -20054,7 +22150,49 @@
         <w:rPr>
           <w:lang w:val="en-GB"/>
         </w:rPr>
-        <w:t xml:space="preserve">  ADD CONSTRAINT `alumnoscrusoslibros_ibfk_3` FOREIGN KEY (`curso`) REFERENCES `cursos` (`curso`) ON DELETE CASCADE ON UPDATE CASCADE;</w:t>
+        <w:t xml:space="preserve">  ADD CONSTRAINT `alumnoscrusoslibros_ibfk_3` FOREIGN KEY (`</w:t>
+      </w:r>
+      <w:proofErr w:type="spellStart"/>
+      <w:r>
+        <w:rPr>
+          <w:lang w:val="en-GB"/>
+        </w:rPr>
+        <w:t>curso</w:t>
+      </w:r>
+      <w:proofErr w:type="spellEnd"/>
+      <w:r>
+        <w:rPr>
+          <w:lang w:val="en-GB"/>
+        </w:rPr>
+        <w:t>`) REFERENCES `</w:t>
+      </w:r>
+      <w:proofErr w:type="spellStart"/>
+      <w:r>
+        <w:rPr>
+          <w:lang w:val="en-GB"/>
+        </w:rPr>
+        <w:t>cursos</w:t>
+      </w:r>
+      <w:proofErr w:type="spellEnd"/>
+      <w:r>
+        <w:rPr>
+          <w:lang w:val="en-GB"/>
+        </w:rPr>
+        <w:t>` (`</w:t>
+      </w:r>
+      <w:proofErr w:type="spellStart"/>
+      <w:r>
+        <w:rPr>
+          <w:lang w:val="en-GB"/>
+        </w:rPr>
+        <w:t>curso</w:t>
+      </w:r>
+      <w:proofErr w:type="spellEnd"/>
+      <w:r>
+        <w:rPr>
+          <w:lang w:val="en-GB"/>
+        </w:rPr>
+        <w:t>`) ON DELETE CASCADE ON UPDATE CASCADE;</w:t>
       </w:r>
     </w:p>
     <w:p>
@@ -20080,7 +22218,49 @@
         <w:rPr>
           <w:lang w:val="en-GB"/>
         </w:rPr>
-        <w:t>-- Filtros para la tabla `libros`</w:t>
+        <w:t xml:space="preserve">-- </w:t>
+      </w:r>
+      <w:proofErr w:type="spellStart"/>
+      <w:r>
+        <w:rPr>
+          <w:lang w:val="en-GB"/>
+        </w:rPr>
+        <w:t>Filtros</w:t>
+      </w:r>
+      <w:proofErr w:type="spellEnd"/>
+      <w:r>
+        <w:rPr>
+          <w:lang w:val="en-GB"/>
+        </w:rPr>
+        <w:t xml:space="preserve"> para la </w:t>
+      </w:r>
+      <w:proofErr w:type="spellStart"/>
+      <w:r>
+        <w:rPr>
+          <w:lang w:val="en-GB"/>
+        </w:rPr>
+        <w:t>tabla</w:t>
+      </w:r>
+      <w:proofErr w:type="spellEnd"/>
+      <w:r>
+        <w:rPr>
+          <w:lang w:val="en-GB"/>
+        </w:rPr>
+        <w:t xml:space="preserve"> `</w:t>
+      </w:r>
+      <w:proofErr w:type="spellStart"/>
+      <w:r>
+        <w:rPr>
+          <w:lang w:val="en-GB"/>
+        </w:rPr>
+        <w:t>libros</w:t>
+      </w:r>
+      <w:proofErr w:type="spellEnd"/>
+      <w:r>
+        <w:rPr>
+          <w:lang w:val="en-GB"/>
+        </w:rPr>
+        <w:t>`</w:t>
       </w:r>
     </w:p>
     <w:p>
@@ -20106,7 +22286,21 @@
         <w:rPr>
           <w:lang w:val="en-GB"/>
         </w:rPr>
-        <w:t>ALTER TABLE `libros`</w:t>
+        <w:t>ALTER TABLE `</w:t>
+      </w:r>
+      <w:proofErr w:type="spellStart"/>
+      <w:r>
+        <w:rPr>
+          <w:lang w:val="en-GB"/>
+        </w:rPr>
+        <w:t>libros</w:t>
+      </w:r>
+      <w:proofErr w:type="spellEnd"/>
+      <w:r>
+        <w:rPr>
+          <w:lang w:val="en-GB"/>
+        </w:rPr>
+        <w:t>`</w:t>
       </w:r>
     </w:p>
     <w:p>
@@ -20119,7 +22313,63 @@
         <w:rPr>
           <w:lang w:val="en-GB"/>
         </w:rPr>
-        <w:t xml:space="preserve">  ADD CONSTRAINT `fk_libros_cursos` FOREIGN KEY (`id_curso`) REFERENCES `cursos` (`curso`) ON DELETE CASCADE ON UPDATE CASCADE,</w:t>
+        <w:t xml:space="preserve">  ADD CONSTRAINT `</w:t>
+      </w:r>
+      <w:proofErr w:type="spellStart"/>
+      <w:r>
+        <w:rPr>
+          <w:lang w:val="en-GB"/>
+        </w:rPr>
+        <w:t>fk_libros_cursos</w:t>
+      </w:r>
+      <w:proofErr w:type="spellEnd"/>
+      <w:r>
+        <w:rPr>
+          <w:lang w:val="en-GB"/>
+        </w:rPr>
+        <w:t>` FOREIGN KEY (`</w:t>
+      </w:r>
+      <w:proofErr w:type="spellStart"/>
+      <w:r>
+        <w:rPr>
+          <w:lang w:val="en-GB"/>
+        </w:rPr>
+        <w:t>id_curso</w:t>
+      </w:r>
+      <w:proofErr w:type="spellEnd"/>
+      <w:r>
+        <w:rPr>
+          <w:lang w:val="en-GB"/>
+        </w:rPr>
+        <w:t>`) REFERENCES `</w:t>
+      </w:r>
+      <w:proofErr w:type="spellStart"/>
+      <w:r>
+        <w:rPr>
+          <w:lang w:val="en-GB"/>
+        </w:rPr>
+        <w:t>cursos</w:t>
+      </w:r>
+      <w:proofErr w:type="spellEnd"/>
+      <w:r>
+        <w:rPr>
+          <w:lang w:val="en-GB"/>
+        </w:rPr>
+        <w:t>` (`</w:t>
+      </w:r>
+      <w:proofErr w:type="spellStart"/>
+      <w:r>
+        <w:rPr>
+          <w:lang w:val="en-GB"/>
+        </w:rPr>
+        <w:t>curso</w:t>
+      </w:r>
+      <w:proofErr w:type="spellEnd"/>
+      <w:r>
+        <w:rPr>
+          <w:lang w:val="en-GB"/>
+        </w:rPr>
+        <w:t>`) ON DELETE CASCADE ON UPDATE CASCADE,</w:t>
       </w:r>
     </w:p>
     <w:p>
@@ -20132,7 +22382,49 @@
         <w:rPr>
           <w:lang w:val="en-GB"/>
         </w:rPr>
-        <w:t xml:space="preserve">  ADD CONSTRAINT `fk_libros_materias` FOREIGN KEY (`id_materia`) REFERENCES `materias` (`id`) ON DELETE CASCADE ON UPDATE CASCADE;</w:t>
+        <w:t xml:space="preserve">  ADD CONSTRAINT `</w:t>
+      </w:r>
+      <w:proofErr w:type="spellStart"/>
+      <w:r>
+        <w:rPr>
+          <w:lang w:val="en-GB"/>
+        </w:rPr>
+        <w:t>fk_libros_materias</w:t>
+      </w:r>
+      <w:proofErr w:type="spellEnd"/>
+      <w:r>
+        <w:rPr>
+          <w:lang w:val="en-GB"/>
+        </w:rPr>
+        <w:t>` FOREIGN KEY (`</w:t>
+      </w:r>
+      <w:proofErr w:type="spellStart"/>
+      <w:r>
+        <w:rPr>
+          <w:lang w:val="en-GB"/>
+        </w:rPr>
+        <w:t>id_materia</w:t>
+      </w:r>
+      <w:proofErr w:type="spellEnd"/>
+      <w:r>
+        <w:rPr>
+          <w:lang w:val="en-GB"/>
+        </w:rPr>
+        <w:t>`) REFERENCES `</w:t>
+      </w:r>
+      <w:proofErr w:type="spellStart"/>
+      <w:r>
+        <w:rPr>
+          <w:lang w:val="en-GB"/>
+        </w:rPr>
+        <w:t>materias</w:t>
+      </w:r>
+      <w:proofErr w:type="spellEnd"/>
+      <w:r>
+        <w:rPr>
+          <w:lang w:val="en-GB"/>
+        </w:rPr>
+        <w:t>` (`id`) ON DELETE CASCADE ON UPDATE CASCADE;</w:t>
       </w:r>
     </w:p>
     <w:p>
@@ -20848,7 +23140,25 @@
                 <w:sz w:val="16"/>
                 <w:szCs w:val="16"/>
               </w:rPr>
-              <w:t xml:space="preserve"> edge?</w:t>
+              <w:t xml:space="preserve"> </w:t>
+            </w:r>
+            <w:proofErr w:type="spellStart"/>
+            <w:r>
+              <w:rPr>
+                <w:rFonts w:cstheme="minorHAnsi"/>
+                <w:sz w:val="16"/>
+                <w:szCs w:val="16"/>
+              </w:rPr>
+              <w:t>edge</w:t>
+            </w:r>
+            <w:proofErr w:type="spellEnd"/>
+            <w:r>
+              <w:rPr>
+                <w:rFonts w:cstheme="minorHAnsi"/>
+                <w:sz w:val="16"/>
+                <w:szCs w:val="16"/>
+              </w:rPr>
+              <w:t>?</w:t>
             </w:r>
           </w:p>
         </w:tc>
@@ -21066,7 +23376,25 @@
                 <w:sz w:val="16"/>
                 <w:szCs w:val="16"/>
               </w:rPr>
-              <w:t xml:space="preserve"> chrome?</w:t>
+              <w:t xml:space="preserve"> </w:t>
+            </w:r>
+            <w:proofErr w:type="spellStart"/>
+            <w:r>
+              <w:rPr>
+                <w:rFonts w:cstheme="minorHAnsi"/>
+                <w:sz w:val="16"/>
+                <w:szCs w:val="16"/>
+              </w:rPr>
+              <w:t>chrome</w:t>
+            </w:r>
+            <w:proofErr w:type="spellEnd"/>
+            <w:r>
+              <w:rPr>
+                <w:rFonts w:cstheme="minorHAnsi"/>
+                <w:sz w:val="16"/>
+                <w:szCs w:val="16"/>
+              </w:rPr>
+              <w:t>?</w:t>
             </w:r>
           </w:p>
         </w:tc>
@@ -22790,7 +25118,25 @@
                 <w:sz w:val="16"/>
                 <w:szCs w:val="16"/>
               </w:rPr>
-              <w:t>¿Funciona con táblets?</w:t>
+              <w:t xml:space="preserve">¿Funciona con </w:t>
+            </w:r>
+            <w:proofErr w:type="spellStart"/>
+            <w:r>
+              <w:rPr>
+                <w:rFonts w:cstheme="minorHAnsi"/>
+                <w:sz w:val="16"/>
+                <w:szCs w:val="16"/>
+              </w:rPr>
+              <w:t>táblets</w:t>
+            </w:r>
+            <w:proofErr w:type="spellEnd"/>
+            <w:r>
+              <w:rPr>
+                <w:rFonts w:cstheme="minorHAnsi"/>
+                <w:sz w:val="16"/>
+                <w:szCs w:val="16"/>
+              </w:rPr>
+              <w:t>?</w:t>
             </w:r>
           </w:p>
         </w:tc>
@@ -24700,16 +27046,7 @@
                 <w:sz w:val="16"/>
                 <w:szCs w:val="16"/>
               </w:rPr>
-              <w:t xml:space="preserve">Ventana de </w:t>
-            </w:r>
-            <w:r>
-              <w:rPr>
-                <w:rFonts w:cstheme="minorHAnsi"/>
-                <w:b/>
-                <w:sz w:val="16"/>
-                <w:szCs w:val="16"/>
-              </w:rPr>
-              <w:t>la gestión de alumnos</w:t>
+              <w:t>Ventana de la gestión de alumnos</w:t>
             </w:r>
           </w:p>
         </w:tc>
@@ -25254,16 +27591,7 @@
                 <w:sz w:val="16"/>
                 <w:szCs w:val="16"/>
               </w:rPr>
-              <w:t>Ventana de la gestión de</w:t>
-            </w:r>
-            <w:r>
-              <w:rPr>
-                <w:rFonts w:cstheme="minorHAnsi"/>
-                <w:b/>
-                <w:sz w:val="16"/>
-                <w:szCs w:val="16"/>
-              </w:rPr>
-              <w:t xml:space="preserve"> prestamos</w:t>
+              <w:t>Ventana de la gestión de prestamos</w:t>
             </w:r>
           </w:p>
         </w:tc>
@@ -25906,16 +28234,66 @@
       <w:bookmarkEnd w:id="159"/>
     </w:p>
     <w:p>
-      <w:pPr>
-        <w:rPr>
-          <w:color w:val="FF0000"/>
-        </w:rPr>
-      </w:pPr>
-      <w:r>
-        <w:rPr>
-          <w:color w:val="FF0000"/>
-        </w:rPr>
-        <w:t>Rellena</w:t>
+      <w:r>
+        <w:t>Durante el desarrollo del proyecto se han ido encontrando algunas incidencias en el diseño inicial de la base de datos y en el funcionamiento de la aplicación, por lo que ha sido necesario hacer varios cambios y mejoras para que todo funcione correctamente.</w:t>
+      </w:r>
+    </w:p>
+    <w:p/>
+    <w:p>
+      <w:r>
+        <w:t>Se ha revisado la tabla de alumnos, ya que se vio que tener los apellidos separados podía dar problemas a la hora de guardar o tratar los datos, por lo que se ha dejado en un solo campo.</w:t>
+      </w:r>
+    </w:p>
+    <w:p/>
+    <w:p>
+      <w:r>
+        <w:t xml:space="preserve">También se ha modificado la parte de préstamos en la tabla </w:t>
+      </w:r>
+      <w:proofErr w:type="spellStart"/>
+      <w:r>
+        <w:t>alumnoscursoslibros</w:t>
+      </w:r>
+      <w:proofErr w:type="spellEnd"/>
+      <w:r>
+        <w:t>, añadiendo y controlando mejor los campos de fecha de entrega, fecha de devolución y el estado del préstamo, ya que al principio no estaba del todo bien controlado.</w:t>
+      </w:r>
+    </w:p>
+    <w:p/>
+    <w:p>
+      <w:r>
+        <w:t>Se ha mejorado la relación entre las tablas (libros, materias, cursos y préstamos) añadiendo claves foráneas, para evitar que se introduzcan datos que no correspondan o que den errores.</w:t>
+      </w:r>
+    </w:p>
+    <w:p>
+      <w:r>
+        <w:lastRenderedPageBreak/>
+        <w:t xml:space="preserve">Otra cosa que se ha visto necesaria es controlar mejor el stock de libros, ya que sin esto se podían hacer </w:t>
+      </w:r>
+      <w:proofErr w:type="gramStart"/>
+      <w:r>
+        <w:t>préstamos</w:t>
+      </w:r>
+      <w:proofErr w:type="gramEnd"/>
+      <w:r>
+        <w:t xml:space="preserve"> aunque no hubiera ejemplares disponibles, así que se ha reforzado esa parte en la lógica del programa.</w:t>
+      </w:r>
+    </w:p>
+    <w:p/>
+    <w:p>
+      <w:r>
+        <w:t>Durante las pruebas también se han corregido algunos errores, como campos obligatorios que se dejaban vacíos en el alta de alumnos o fallos en el inicio de sesión.</w:t>
+      </w:r>
+    </w:p>
+    <w:p/>
+    <w:p>
+      <w:r>
+        <w:t>Además, se han hecho pequeños cambios en la interfaz para que sea más fácil moverse entre las ventanas de alumnos, libros y préstamos.</w:t>
+      </w:r>
+    </w:p>
+    <w:p/>
+    <w:p>
+      <w:r>
+        <w:t>Por último, se han solucionado algunos problemas en la devolución de libros, para que el estado del préstamo se actualice correctamente cuando se devuelve un libro.</w:t>
       </w:r>
     </w:p>
     <w:p/>
@@ -26156,8 +28534,15 @@
           <w:b/>
         </w:rPr>
         <w:tab/>
+      </w:r>
+      <w:proofErr w:type="spellStart"/>
+      <w:r>
+        <w:rPr>
+          <w:b/>
+        </w:rPr>
         <w:t>Software</w:t>
       </w:r>
+      <w:proofErr w:type="spellEnd"/>
       <w:r>
         <w:rPr>
           <w:b/>
@@ -26244,12 +28629,20 @@
       </w:r>
       <w:r>
         <w:tab/>
+      </w:r>
+      <w:proofErr w:type="spellStart"/>
+      <w:r>
         <w:t>mañana</w:t>
       </w:r>
+      <w:proofErr w:type="spellEnd"/>
       <w:r>
         <w:tab/>
+      </w:r>
+      <w:proofErr w:type="spellStart"/>
+      <w:r>
         <w:t>mañana</w:t>
       </w:r>
+      <w:proofErr w:type="spellEnd"/>
       <w:r>
         <w:tab/>
         <w:t xml:space="preserve">noche </w:t>
@@ -26304,8 +28697,12 @@
       </w:r>
       <w:r>
         <w:tab/>
+      </w:r>
+      <w:proofErr w:type="spellStart"/>
+      <w:r>
         <w:t>Instalador</w:t>
       </w:r>
+      <w:proofErr w:type="spellEnd"/>
       <w:r>
         <w:tab/>
         <w:t>Usuario</w:t>
@@ -26618,8 +29015,16 @@
               <w:b w:val="0"/>
             </w:rPr>
             <w:lastRenderedPageBreak/>
-            <w:t>Fichero exportado de Delphos</w:t>
+            <w:t xml:space="preserve">Fichero exportado de </w:t>
           </w:r>
+          <w:proofErr w:type="spellStart"/>
+          <w:r>
+            <w:rPr>
+              <w:b w:val="0"/>
+            </w:rPr>
+            <w:t>Delphos</w:t>
+          </w:r>
+          <w:proofErr w:type="spellEnd"/>
           <w:r>
             <w:rPr>
               <w:b w:val="0"/>
@@ -26707,8 +29112,141 @@
             <w:t xml:space="preserve"> (Apellidos, Nombre)</w:t>
           </w:r>
           <w:r>
-            <w:t>, NumeroEscolar, NumeroSolicitud, FechaSolicitud, CampoNoNecesario, CursoAcadémico, CampoNoNecesario, CampoNoNecesario, CampoNoNecesario, CampoNoNecesario, CampoNoNecesario, CampoNoNecesario, CampoNoNecesario, CampoNoNecesario, ResultadoLibros, ResultadoComedor, Matriculado, TipoBecaLibros, TipoBecaComedor</w:t>
+            <w:t xml:space="preserve">, </w:t>
           </w:r>
+          <w:proofErr w:type="spellStart"/>
+          <w:r>
+            <w:t>NumeroEscolar</w:t>
+          </w:r>
+          <w:proofErr w:type="spellEnd"/>
+          <w:r>
+            <w:t xml:space="preserve">, </w:t>
+          </w:r>
+          <w:proofErr w:type="spellStart"/>
+          <w:r>
+            <w:t>NumeroSolicitud</w:t>
+          </w:r>
+          <w:proofErr w:type="spellEnd"/>
+          <w:r>
+            <w:t xml:space="preserve">, </w:t>
+          </w:r>
+          <w:proofErr w:type="spellStart"/>
+          <w:r>
+            <w:t>FechaSolicitud</w:t>
+          </w:r>
+          <w:proofErr w:type="spellEnd"/>
+          <w:r>
+            <w:t xml:space="preserve">, </w:t>
+          </w:r>
+          <w:proofErr w:type="spellStart"/>
+          <w:r>
+            <w:t>CampoNoNecesario</w:t>
+          </w:r>
+          <w:proofErr w:type="spellEnd"/>
+          <w:r>
+            <w:t xml:space="preserve">, </w:t>
+          </w:r>
+          <w:proofErr w:type="spellStart"/>
+          <w:r>
+            <w:t>CursoAcadémico</w:t>
+          </w:r>
+          <w:proofErr w:type="spellEnd"/>
+          <w:r>
+            <w:t xml:space="preserve">, </w:t>
+          </w:r>
+          <w:proofErr w:type="spellStart"/>
+          <w:r>
+            <w:t>CampoNoNecesario</w:t>
+          </w:r>
+          <w:proofErr w:type="spellEnd"/>
+          <w:r>
+            <w:t xml:space="preserve">, </w:t>
+          </w:r>
+          <w:proofErr w:type="spellStart"/>
+          <w:r>
+            <w:t>CampoNoNecesario</w:t>
+          </w:r>
+          <w:proofErr w:type="spellEnd"/>
+          <w:r>
+            <w:t xml:space="preserve">, </w:t>
+          </w:r>
+          <w:proofErr w:type="spellStart"/>
+          <w:r>
+            <w:t>CampoNoNecesario</w:t>
+          </w:r>
+          <w:proofErr w:type="spellEnd"/>
+          <w:r>
+            <w:t xml:space="preserve">, </w:t>
+          </w:r>
+          <w:proofErr w:type="spellStart"/>
+          <w:r>
+            <w:t>CampoNoNecesario</w:t>
+          </w:r>
+          <w:proofErr w:type="spellEnd"/>
+          <w:r>
+            <w:t xml:space="preserve">, </w:t>
+          </w:r>
+          <w:proofErr w:type="spellStart"/>
+          <w:r>
+            <w:t>CampoNoNecesario</w:t>
+          </w:r>
+          <w:proofErr w:type="spellEnd"/>
+          <w:r>
+            <w:t xml:space="preserve">, </w:t>
+          </w:r>
+          <w:proofErr w:type="spellStart"/>
+          <w:r>
+            <w:t>CampoNoNecesario</w:t>
+          </w:r>
+          <w:proofErr w:type="spellEnd"/>
+          <w:r>
+            <w:t xml:space="preserve">, </w:t>
+          </w:r>
+          <w:proofErr w:type="spellStart"/>
+          <w:r>
+            <w:t>CampoNoNecesario</w:t>
+          </w:r>
+          <w:proofErr w:type="spellEnd"/>
+          <w:r>
+            <w:t xml:space="preserve">, </w:t>
+          </w:r>
+          <w:proofErr w:type="spellStart"/>
+          <w:r>
+            <w:t>CampoNoNecesario</w:t>
+          </w:r>
+          <w:proofErr w:type="spellEnd"/>
+          <w:r>
+            <w:t xml:space="preserve">, </w:t>
+          </w:r>
+          <w:proofErr w:type="spellStart"/>
+          <w:r>
+            <w:t>ResultadoLibros</w:t>
+          </w:r>
+          <w:proofErr w:type="spellEnd"/>
+          <w:r>
+            <w:t xml:space="preserve">, </w:t>
+          </w:r>
+          <w:proofErr w:type="spellStart"/>
+          <w:r>
+            <w:t>ResultadoComedor</w:t>
+          </w:r>
+          <w:proofErr w:type="spellEnd"/>
+          <w:r>
+            <w:t xml:space="preserve">, Matriculado, </w:t>
+          </w:r>
+          <w:proofErr w:type="spellStart"/>
+          <w:r>
+            <w:t>TipoBecaLibros</w:t>
+          </w:r>
+          <w:proofErr w:type="spellEnd"/>
+          <w:r>
+            <w:t xml:space="preserve">, </w:t>
+          </w:r>
+          <w:proofErr w:type="spellStart"/>
+          <w:r>
+            <w:t>TipoBecaComedor</w:t>
+          </w:r>
+          <w:proofErr w:type="spellEnd"/>
         </w:p>
         <w:p/>
         <w:p/>
@@ -36645,7 +39183,6 @@
   <w:style w:type="character" w:default="1" w:styleId="Fuentedeprrafopredeter">
     <w:name w:val="Default Paragraph Font"/>
     <w:uiPriority w:val="1"/>
-    <w:semiHidden/>
     <w:unhideWhenUsed/>
   </w:style>
   <w:style w:type="table" w:default="1" w:styleId="Tablanormal">
@@ -38016,7 +40553,9 @@
     <w:rsid w:val="00285AD8"/>
     <w:rsid w:val="00296438"/>
     <w:rsid w:val="002B16BA"/>
+    <w:rsid w:val="002B44ED"/>
     <w:rsid w:val="002C23C8"/>
+    <w:rsid w:val="002F529C"/>
     <w:rsid w:val="00302B91"/>
     <w:rsid w:val="00317777"/>
     <w:rsid w:val="003B28BB"/>

</xml_diff>

<commit_message>
Sexto guardado (18/05/2026, 18:31)
</commit_message>
<xml_diff>
--- a/UT_7_2024_2025 (2).docx
+++ b/UT_7_2024_2025 (2).docx
@@ -5846,9 +5846,9 @@
       </w:r>
     </w:p>
     <w:p/>
-    <w:bookmarkStart w:id="6" w:name="_Toc170148316" w:displacedByCustomXml="next"/>
+    <w:bookmarkStart w:id="6" w:name="_Toc170148631" w:displacedByCustomXml="next"/>
     <w:bookmarkStart w:id="7" w:name="_Toc49341785" w:displacedByCustomXml="next"/>
-    <w:bookmarkStart w:id="8" w:name="_Toc170148631" w:displacedByCustomXml="next"/>
+    <w:bookmarkStart w:id="8" w:name="_Toc170148316" w:displacedByCustomXml="next"/>
     <w:sdt>
       <w:sdtPr>
         <w:rPr>
@@ -6733,19 +6733,15 @@
                 <w:r>
                   <w:t xml:space="preserve">IDE para desarrollo </w:t>
                 </w:r>
-                <w:proofErr w:type="gramStart"/>
                 <w:r>
                   <w:t>PHP</w:t>
                 </w:r>
                 <w:r>
                   <w:t xml:space="preserve">  (</w:t>
                 </w:r>
-                <w:proofErr w:type="spellStart"/>
-                <w:proofErr w:type="gramEnd"/>
                 <w:r>
                   <w:t>PhpStorm</w:t>
                 </w:r>
-                <w:proofErr w:type="spellEnd"/>
                 <w:r>
                   <w:t>)</w:t>
                 </w:r>
@@ -6829,16 +6825,11 @@
                 <w:r>
                   <w:t xml:space="preserve">Bootstrap </w:t>
                 </w:r>
-                <w:proofErr w:type="gramStart"/>
                 <w:r>
                   <w:t xml:space="preserve">5.3 </w:t>
                 </w:r>
                 <w:r>
-                  <w:t xml:space="preserve"> jQuery</w:t>
-                </w:r>
-                <w:proofErr w:type="gramEnd"/>
-                <w:r>
-                  <w:t xml:space="preserve"> 3.</w:t>
+                  <w:t xml:space="preserve"> jQuery 3.</w:t>
                 </w:r>
                 <w:r>
                   <w:t>7</w:t>
@@ -6873,13 +6864,8 @@
                 <w:tcW w:w="7477" w:type="dxa"/>
               </w:tcPr>
               <w:p>
-                <w:proofErr w:type="spellStart"/>
                 <w:r>
-                  <w:t>Mysql</w:t>
-                </w:r>
-                <w:proofErr w:type="spellEnd"/>
-                <w:r>
-                  <w:t xml:space="preserve"> </w:t>
+                  <w:t xml:space="preserve">Mysql </w:t>
                 </w:r>
                 <w:r>
                   <w:t>8.2</w:t>
@@ -6888,16 +6874,7 @@
                   <w:t xml:space="preserve"> </w:t>
                 </w:r>
                 <w:r>
-                  <w:t xml:space="preserve">– </w:t>
-                </w:r>
-                <w:proofErr w:type="spellStart"/>
-                <w:proofErr w:type="gramStart"/>
-                <w:r>
-                  <w:t>MariaDB</w:t>
-                </w:r>
-                <w:proofErr w:type="spellEnd"/>
-                <w:r>
-                  <w:t xml:space="preserve"> </w:t>
+                  <w:t xml:space="preserve">– MariaDB </w:t>
                 </w:r>
                 <w:r>
                   <w:t xml:space="preserve"> co</w:t>
@@ -6908,7 +6885,6 @@
                 <w:r>
                   <w:t>patible</w:t>
                 </w:r>
-                <w:proofErr w:type="gramEnd"/>
               </w:p>
             </w:tc>
           </w:tr>
@@ -6998,13 +6974,8 @@
               </w:tcPr>
               <w:p>
                 <w:r>
-                  <w:t xml:space="preserve">Servidor web con </w:t>
+                  <w:t>Servidor web con cpanel</w:t>
                 </w:r>
-                <w:proofErr w:type="spellStart"/>
-                <w:r>
-                  <w:t>cpanel</w:t>
-                </w:r>
-                <w:proofErr w:type="spellEnd"/>
               </w:p>
             </w:tc>
           </w:tr>
@@ -7060,13 +7031,8 @@
               </w:tcPr>
               <w:p>
                 <w:r>
-                  <w:t xml:space="preserve">Servidor web con </w:t>
+                  <w:t>Servidor web con Mysql</w:t>
                 </w:r>
-                <w:proofErr w:type="spellStart"/>
-                <w:r>
-                  <w:t>Mysql</w:t>
-                </w:r>
-                <w:proofErr w:type="spellEnd"/>
                 <w:r>
                   <w:t xml:space="preserve"> </w:t>
                 </w:r>
@@ -7089,15 +7055,7 @@
               </w:tcPr>
               <w:p>
                 <w:r>
-                  <w:t xml:space="preserve">Un usuario de acceso a </w:t>
-                </w:r>
-                <w:proofErr w:type="spellStart"/>
-                <w:r>
-                  <w:t>Mysql</w:t>
-                </w:r>
-                <w:proofErr w:type="spellEnd"/>
-                <w:r>
-                  <w:t xml:space="preserve"> independiente</w:t>
+                  <w:t>Un usuario de acceso a Mysql independiente</w:t>
                 </w:r>
                 <w:r>
                   <w:t xml:space="preserve"> y BBDD propia</w:t>
@@ -7292,11 +7250,9 @@
           <w:r>
             <w:t xml:space="preserve"> la compra del software de desarrollo </w:t>
           </w:r>
-          <w:proofErr w:type="spellStart"/>
           <w:r>
             <w:t>PHPStorm</w:t>
           </w:r>
-          <w:proofErr w:type="spellEnd"/>
           <w:r>
             <w:t xml:space="preserve"> con una licencia profesional.</w:t>
           </w:r>
@@ -8460,21 +8416,7 @@
               <w:rPr>
                 <w:b/>
               </w:rPr>
-              <w:t xml:space="preserve">Cargar la BBDD       subcaso: </w:t>
-            </w:r>
-            <w:proofErr w:type="spellStart"/>
-            <w:r>
-              <w:rPr>
-                <w:b/>
-              </w:rPr>
-              <w:t>Gestion</w:t>
-            </w:r>
-            <w:proofErr w:type="spellEnd"/>
-            <w:r>
-              <w:rPr>
-                <w:b/>
-              </w:rPr>
-              <w:t xml:space="preserve"> de errores</w:t>
+              <w:t>Cargar la BBDD       subcaso: Gestion de errores</w:t>
             </w:r>
           </w:p>
         </w:tc>
@@ -10972,21 +10914,7 @@
               <w:rPr>
                 <w:bCs/>
               </w:rPr>
-              <w:t xml:space="preserve">Se generará un fichero SQL-92 para preservar los datos. Se dará la posibilidad de exportarlos a </w:t>
-            </w:r>
-            <w:proofErr w:type="spellStart"/>
-            <w:r>
-              <w:rPr>
-                <w:bCs/>
-              </w:rPr>
-              <w:t>csv</w:t>
-            </w:r>
-            <w:proofErr w:type="spellEnd"/>
-            <w:r>
-              <w:rPr>
-                <w:bCs/>
-              </w:rPr>
-              <w:t xml:space="preserve"> también.</w:t>
+              <w:t>Se generará un fichero SQL-92 para preservar los datos. Se dará la posibilidad de exportarlos a csv también.</w:t>
             </w:r>
           </w:p>
         </w:tc>
@@ -11234,21 +11162,7 @@
               <w:rPr>
                 <w:b/>
               </w:rPr>
-              <w:t xml:space="preserve">Selección de </w:t>
-            </w:r>
-            <w:proofErr w:type="gramStart"/>
-            <w:r>
-              <w:rPr>
-                <w:b/>
-              </w:rPr>
-              <w:t>datos  subcaso</w:t>
-            </w:r>
-            <w:proofErr w:type="gramEnd"/>
-            <w:r>
-              <w:rPr>
-                <w:b/>
-              </w:rPr>
-              <w:t>: Selección de formato</w:t>
+              <w:t>Selección de datos  subcaso: Selección de formato</w:t>
             </w:r>
           </w:p>
         </w:tc>
@@ -11308,35 +11222,7 @@
               <w:rPr>
                 <w:bCs/>
               </w:rPr>
-              <w:t xml:space="preserve">Se pedirá el formato y sus características para exportar: </w:t>
-            </w:r>
-            <w:proofErr w:type="spellStart"/>
-            <w:r>
-              <w:rPr>
-                <w:bCs/>
-              </w:rPr>
-              <w:t>json</w:t>
-            </w:r>
-            <w:proofErr w:type="spellEnd"/>
-            <w:r>
-              <w:rPr>
-                <w:bCs/>
-              </w:rPr>
-              <w:t xml:space="preserve">, </w:t>
-            </w:r>
-            <w:proofErr w:type="spellStart"/>
-            <w:r>
-              <w:rPr>
-                <w:bCs/>
-              </w:rPr>
-              <w:t>csv</w:t>
-            </w:r>
-            <w:proofErr w:type="spellEnd"/>
-            <w:r>
-              <w:rPr>
-                <w:bCs/>
-              </w:rPr>
-              <w:t>, sql-92</w:t>
+              <w:t>Se pedirá el formato y sus características para exportar: json, csv, sql-92</w:t>
             </w:r>
           </w:p>
         </w:tc>
@@ -12597,18 +12483,10 @@
         <w:t xml:space="preserve">Una vez llevada a cabo la normalización, teniendo en </w:t>
       </w:r>
       <w:r>
-        <w:t>cuenta hasta la forma de Boyce-</w:t>
-      </w:r>
-      <w:proofErr w:type="spellStart"/>
-      <w:r>
-        <w:t>C</w:t>
-      </w:r>
-      <w:r>
-        <w:t>ood</w:t>
-      </w:r>
-      <w:proofErr w:type="spellEnd"/>
-      <w:r>
-        <w:t>, el resultado es el siguiente:</w:t>
+        <w:t>cuenta hasta la forma de Boyce-C</w:t>
+      </w:r>
+      <w:r>
+        <w:t>ood, el resultado es el siguiente:</w:t>
       </w:r>
     </w:p>
     <w:p>
@@ -12674,38 +12552,15 @@
       <w:r>
         <w:t xml:space="preserve">: </w:t>
       </w:r>
-      <w:proofErr w:type="spellStart"/>
       <w:r>
         <w:rPr>
           <w:u w:val="single"/>
         </w:rPr>
         <w:t>isbn</w:t>
       </w:r>
-      <w:proofErr w:type="spellEnd"/>
-      <w:r>
-        <w:t xml:space="preserve">, titulo, autor, </w:t>
-      </w:r>
-      <w:proofErr w:type="spellStart"/>
-      <w:r>
-        <w:t>numero_ejemplares</w:t>
-      </w:r>
-      <w:proofErr w:type="spellEnd"/>
-      <w:r>
-        <w:t xml:space="preserve">, </w:t>
-      </w:r>
-      <w:proofErr w:type="spellStart"/>
-      <w:r>
-        <w:t>id_materia</w:t>
-      </w:r>
-      <w:proofErr w:type="spellEnd"/>
-      <w:r>
-        <w:t xml:space="preserve">, </w:t>
-      </w:r>
-      <w:proofErr w:type="spellStart"/>
-      <w:r>
-        <w:t>id_curso</w:t>
-      </w:r>
-      <w:proofErr w:type="spellEnd"/>
+      <w:r>
+        <w:t>, titulo, autor, numero_ejemplares, id_materia, id_curso</w:t>
+      </w:r>
     </w:p>
     <w:p>
       <w:pPr>
@@ -12735,7 +12590,6 @@
       <w:pPr>
         <w:ind w:left="567"/>
       </w:pPr>
-      <w:proofErr w:type="spellStart"/>
       <w:r>
         <w:rPr>
           <w:b/>
@@ -12743,72 +12597,17 @@
         </w:rPr>
         <w:t>AlumnosCursosLibros</w:t>
       </w:r>
-      <w:proofErr w:type="spellEnd"/>
       <w:r>
         <w:t xml:space="preserve">: </w:t>
       </w:r>
-      <w:proofErr w:type="spellStart"/>
       <w:r>
         <w:rPr>
           <w:u w:val="single"/>
         </w:rPr>
-        <w:t>isbn</w:t>
-      </w:r>
-      <w:proofErr w:type="spellEnd"/>
-      <w:r>
-        <w:rPr>
-          <w:u w:val="single"/>
-        </w:rPr>
-        <w:t xml:space="preserve">, </w:t>
-      </w:r>
-      <w:proofErr w:type="spellStart"/>
-      <w:r>
-        <w:rPr>
-          <w:u w:val="single"/>
-        </w:rPr>
-        <w:t>id_alumno</w:t>
-      </w:r>
-      <w:proofErr w:type="spellEnd"/>
-      <w:r>
-        <w:rPr>
-          <w:u w:val="single"/>
-        </w:rPr>
-        <w:t xml:space="preserve">, </w:t>
-      </w:r>
-      <w:proofErr w:type="spellStart"/>
-      <w:r>
-        <w:rPr>
-          <w:u w:val="single"/>
-        </w:rPr>
-        <w:t>id_curso</w:t>
-      </w:r>
-      <w:proofErr w:type="spellEnd"/>
-      <w:r>
-        <w:t xml:space="preserve">, </w:t>
-      </w:r>
-      <w:proofErr w:type="spellStart"/>
-      <w:r>
-        <w:t>fecha_entrega</w:t>
-      </w:r>
-      <w:proofErr w:type="spellEnd"/>
-      <w:r>
-        <w:t xml:space="preserve">, </w:t>
-      </w:r>
-      <w:proofErr w:type="spellStart"/>
-      <w:r>
-        <w:t>fecha_devolucion</w:t>
-      </w:r>
-      <w:proofErr w:type="spellEnd"/>
-      <w:r>
-        <w:t xml:space="preserve">, estado (entregado, </w:t>
-      </w:r>
-      <w:proofErr w:type="spellStart"/>
-      <w:r>
-        <w:t>por_devolver</w:t>
-      </w:r>
-      <w:proofErr w:type="spellEnd"/>
-      <w:r>
-        <w:t>)</w:t>
+        <w:t>isbn, id_alumno, id_curso</w:t>
+      </w:r>
+      <w:r>
+        <w:t>, fecha_entrega, fecha_devolucion, estado (entregado, por_devolver)</w:t>
       </w:r>
     </w:p>
     <w:p>
@@ -14041,19 +13840,8 @@
                 <w:sz w:val="16"/>
                 <w:szCs w:val="16"/>
               </w:rPr>
-              <w:t xml:space="preserve">Letra del </w:t>
-            </w:r>
-            <w:proofErr w:type="spellStart"/>
-            <w:r>
-              <w:rPr>
-                <w:rFonts w:cstheme="minorHAnsi"/>
-                <w:b/>
-                <w:sz w:val="16"/>
-                <w:szCs w:val="16"/>
-              </w:rPr>
-              <w:t>niev</w:t>
-            </w:r>
-            <w:proofErr w:type="spellEnd"/>
+              <w:t>Letra del niev</w:t>
+            </w:r>
           </w:p>
         </w:tc>
       </w:tr>
@@ -14220,19 +14008,8 @@
                 <w:sz w:val="16"/>
                 <w:szCs w:val="16"/>
               </w:rPr>
-              <w:t>1ºeso, 2</w:t>
-            </w:r>
-            <w:proofErr w:type="gramStart"/>
-            <w:r>
-              <w:rPr>
-                <w:rFonts w:cstheme="minorHAnsi"/>
-                <w:b/>
-                <w:sz w:val="16"/>
-                <w:szCs w:val="16"/>
-              </w:rPr>
-              <w:t>eso….</w:t>
-            </w:r>
-            <w:proofErr w:type="gramEnd"/>
+              <w:t>1ºeso, 2eso….</w:t>
+            </w:r>
           </w:p>
         </w:tc>
       </w:tr>
@@ -14500,7 +14277,6 @@
                 <w:szCs w:val="16"/>
               </w:rPr>
             </w:pPr>
-            <w:proofErr w:type="spellStart"/>
             <w:r>
               <w:rPr>
                 <w:rFonts w:cstheme="minorHAnsi"/>
@@ -14510,7 +14286,6 @@
               </w:rPr>
               <w:t>isbn</w:t>
             </w:r>
-            <w:proofErr w:type="spellEnd"/>
           </w:p>
         </w:tc>
         <w:tc>
@@ -14660,19 +14435,8 @@
                 <w:sz w:val="16"/>
                 <w:szCs w:val="16"/>
               </w:rPr>
-              <w:t xml:space="preserve">Validar formato </w:t>
-            </w:r>
-            <w:proofErr w:type="spellStart"/>
-            <w:r>
-              <w:rPr>
-                <w:rFonts w:cstheme="minorHAnsi"/>
-                <w:b/>
-                <w:sz w:val="16"/>
-                <w:szCs w:val="16"/>
-              </w:rPr>
-              <w:t>isbn</w:t>
-            </w:r>
-            <w:proofErr w:type="spellEnd"/>
+              <w:t>Validar formato isbn</w:t>
+            </w:r>
           </w:p>
         </w:tc>
       </w:tr>
@@ -14995,7 +14759,6 @@
                 <w:szCs w:val="16"/>
               </w:rPr>
             </w:pPr>
-            <w:proofErr w:type="spellStart"/>
             <w:r>
               <w:rPr>
                 <w:rFonts w:cstheme="minorHAnsi"/>
@@ -15005,7 +14768,6 @@
               </w:rPr>
               <w:t>numero_ejemplares</w:t>
             </w:r>
-            <w:proofErr w:type="spellEnd"/>
           </w:p>
         </w:tc>
         <w:tc>
@@ -15156,7 +14918,6 @@
                 <w:szCs w:val="16"/>
               </w:rPr>
             </w:pPr>
-            <w:proofErr w:type="spellStart"/>
             <w:r>
               <w:rPr>
                 <w:rFonts w:cstheme="minorHAnsi"/>
@@ -15166,7 +14927,6 @@
               </w:rPr>
               <w:t>id_materia</w:t>
             </w:r>
-            <w:proofErr w:type="spellEnd"/>
           </w:p>
         </w:tc>
         <w:tc>
@@ -15335,7 +15095,6 @@
                 <w:szCs w:val="16"/>
               </w:rPr>
             </w:pPr>
-            <w:proofErr w:type="spellStart"/>
             <w:r>
               <w:rPr>
                 <w:rFonts w:cstheme="minorHAnsi"/>
@@ -15345,7 +15104,6 @@
               </w:rPr>
               <w:t>id_curso</w:t>
             </w:r>
-            <w:proofErr w:type="spellEnd"/>
           </w:p>
         </w:tc>
         <w:tc>
@@ -16443,27 +16201,7 @@
                 <w:sz w:val="16"/>
                 <w:szCs w:val="16"/>
               </w:rPr>
-              <w:t xml:space="preserve">0, I, </w:t>
-            </w:r>
-            <w:proofErr w:type="gramStart"/>
-            <w:r>
-              <w:rPr>
-                <w:rFonts w:cstheme="minorHAnsi"/>
-                <w:b/>
-                <w:sz w:val="16"/>
-                <w:szCs w:val="16"/>
-              </w:rPr>
-              <w:t>II  (</w:t>
-            </w:r>
-            <w:proofErr w:type="gramEnd"/>
-            <w:r>
-              <w:rPr>
-                <w:rFonts w:cstheme="minorHAnsi"/>
-                <w:b/>
-                <w:sz w:val="16"/>
-                <w:szCs w:val="16"/>
-              </w:rPr>
-              <w:t>0 para no beca, tramo I y II)</w:t>
+              <w:t>0, I, II  (0 para no beca, tramo I y II)</w:t>
             </w:r>
           </w:p>
         </w:tc>
@@ -16482,7 +16220,6 @@
                 <w:szCs w:val="16"/>
               </w:rPr>
             </w:pPr>
-            <w:proofErr w:type="spellStart"/>
             <w:r>
               <w:rPr>
                 <w:rFonts w:cstheme="minorHAnsi"/>
@@ -16492,7 +16229,6 @@
               </w:rPr>
               <w:t>bilingue</w:t>
             </w:r>
-            <w:proofErr w:type="spellEnd"/>
           </w:p>
         </w:tc>
         <w:tc>
@@ -16664,7 +16400,6 @@
                 <w:szCs w:val="16"/>
               </w:rPr>
             </w:pPr>
-            <w:proofErr w:type="spellStart"/>
             <w:r>
               <w:rPr>
                 <w:rFonts w:cstheme="minorHAnsi"/>
@@ -16674,7 +16409,6 @@
               </w:rPr>
               <w:t>alumnoscursoslibros</w:t>
             </w:r>
-            <w:proofErr w:type="spellEnd"/>
           </w:p>
         </w:tc>
       </w:tr>
@@ -17276,7 +17010,6 @@
                 <w:szCs w:val="16"/>
               </w:rPr>
             </w:pPr>
-            <w:proofErr w:type="spellStart"/>
             <w:r>
               <w:rPr>
                 <w:rFonts w:cstheme="minorHAnsi"/>
@@ -17286,7 +17019,6 @@
               </w:rPr>
               <w:t>isbn</w:t>
             </w:r>
-            <w:proofErr w:type="spellEnd"/>
           </w:p>
         </w:tc>
         <w:tc>
@@ -17464,7 +17196,6 @@
                 <w:szCs w:val="16"/>
               </w:rPr>
             </w:pPr>
-            <w:proofErr w:type="spellStart"/>
             <w:r>
               <w:rPr>
                 <w:rFonts w:cstheme="minorHAnsi"/>
@@ -17483,7 +17214,6 @@
               </w:rPr>
               <w:t>echa_entrega</w:t>
             </w:r>
-            <w:proofErr w:type="spellEnd"/>
           </w:p>
         </w:tc>
         <w:tc>
@@ -17634,7 +17364,6 @@
                 <w:szCs w:val="16"/>
               </w:rPr>
             </w:pPr>
-            <w:proofErr w:type="spellStart"/>
             <w:r>
               <w:rPr>
                 <w:rFonts w:cstheme="minorHAnsi"/>
@@ -17671,7 +17400,6 @@
               </w:rPr>
               <w:t>evolución</w:t>
             </w:r>
-            <w:proofErr w:type="spellEnd"/>
           </w:p>
         </w:tc>
         <w:tc>
@@ -17944,19 +17672,8 @@
                 <w:sz w:val="16"/>
                 <w:szCs w:val="16"/>
               </w:rPr>
-              <w:t xml:space="preserve">P: Prestado, </w:t>
-            </w:r>
-            <w:proofErr w:type="gramStart"/>
-            <w:r>
-              <w:rPr>
-                <w:rFonts w:cstheme="minorHAnsi"/>
-                <w:b/>
-                <w:sz w:val="16"/>
-                <w:szCs w:val="16"/>
-              </w:rPr>
-              <w:t>D:Devuelto</w:t>
-            </w:r>
-            <w:proofErr w:type="gramEnd"/>
+              <w:t>P: Prestado, D:Devuelto</w:t>
+            </w:r>
           </w:p>
         </w:tc>
       </w:tr>
@@ -18330,34 +18047,23 @@
       <w:r>
         <w:t xml:space="preserve">almacenará los contratos que se van a generar por el sistema para su firma y el directorio </w:t>
       </w:r>
-      <w:proofErr w:type="spellStart"/>
       <w:r>
         <w:rPr>
           <w:b/>
           <w:bCs/>
         </w:rPr>
-        <w:t>copias_de_seguridad</w:t>
-      </w:r>
-      <w:proofErr w:type="spellEnd"/>
+        <w:t xml:space="preserve">copias_de_seguridad </w:t>
+      </w:r>
+      <w:r>
+        <w:t xml:space="preserve">que es donde almacenaremos las copias de seguridad que se generan para poder proteger la información. Y por último tenemos el directorio </w:t>
+      </w:r>
       <w:r>
         <w:rPr>
           <w:b/>
           <w:bCs/>
         </w:rPr>
-        <w:t xml:space="preserve"> </w:t>
-      </w:r>
-      <w:r>
-        <w:t xml:space="preserve">que es donde almacenaremos las copias de seguridad que se generan para poder proteger la información. Y por último tenemos el directorio </w:t>
-      </w:r>
-      <w:proofErr w:type="spellStart"/>
-      <w:r>
-        <w:rPr>
-          <w:b/>
-          <w:bCs/>
-        </w:rPr>
         <w:t>base_de_datos</w:t>
       </w:r>
-      <w:proofErr w:type="spellEnd"/>
       <w:r>
         <w:t xml:space="preserve"> que contendrá los archivos que son necesarios para poder conectar la aplicación con la base de datos.</w:t>
       </w:r>
@@ -18447,35 +18153,16 @@
     </w:p>
     <w:p>
       <w:r>
-        <w:t xml:space="preserve">El siguiente diagrama va a representar la estructura de clases que va a utilizar la aplicación para poder acceder y poder gestionar la información almacenada en la base de datos. La relación entre las clases va a permitir controlar la gestión de los préstamos las devoluciones, los </w:t>
-      </w:r>
-      <w:proofErr w:type="gramStart"/>
-      <w:r>
-        <w:t>cursos  y</w:t>
-      </w:r>
-      <w:proofErr w:type="gramEnd"/>
-      <w:r>
-        <w:t xml:space="preserve"> los libros que están asignados a cada alumno. El diagrama de clases se ha realizado teniendo en cuenta las relaciones existentes entre las distintas tablas del modelo relacional que se </w:t>
-      </w:r>
-      <w:proofErr w:type="spellStart"/>
-      <w:r>
-        <w:t>desarrollo</w:t>
-      </w:r>
-      <w:proofErr w:type="spellEnd"/>
-      <w:r>
-        <w:t xml:space="preserve"> anteriormente.</w:t>
+        <w:t>El siguiente diagrama va a representar la estructura de clases que va a utilizar la aplicación para poder acceder y poder gestionar la información almacenada en la base de datos. La relación entre las clases va a permitir controlar la gestión de los préstamos las devoluciones, los cursos  y los libros que están asignados a cada alumno. El diagrama de clases se ha realizado teniendo en cuenta las relaciones existentes entre las distintas tablas del modelo relacional que se desarrollo anteriormente.</w:t>
       </w:r>
     </w:p>
     <w:p>
       <w:r>
-        <w:rPr>
-          <w:noProof/>
-        </w:rPr>
         <w:drawing>
-          <wp:inline distT="0" distB="0" distL="0" distR="0" wp14:anchorId="51E2F271" wp14:editId="75AD2783">
-            <wp:extent cx="3981450" cy="4137077"/>
+          <wp:inline distT="0" distB="0" distL="0" distR="0" wp14:anchorId="0F51680C" wp14:editId="652D46DF">
+            <wp:extent cx="3417939" cy="3429000"/>
             <wp:effectExtent l="0" t="0" r="0" b="0"/>
-            <wp:docPr id="2118964915" name="Imagen 1"/>
+            <wp:docPr id="1469717182" name="Imagen 1"/>
             <wp:cNvGraphicFramePr>
               <a:graphicFrameLocks xmlns:a="http://schemas.openxmlformats.org/drawingml/2006/main" noChangeAspect="1"/>
             </wp:cNvGraphicFramePr>
@@ -18483,7 +18170,7 @@
               <a:graphicData uri="http://schemas.openxmlformats.org/drawingml/2006/picture">
                 <pic:pic xmlns:pic="http://schemas.openxmlformats.org/drawingml/2006/picture">
                   <pic:nvPicPr>
-                    <pic:cNvPr id="2118964915" name=""/>
+                    <pic:cNvPr id="1469717182" name=""/>
                     <pic:cNvPicPr/>
                   </pic:nvPicPr>
                   <pic:blipFill>
@@ -18495,7 +18182,7 @@
                   <pic:spPr>
                     <a:xfrm>
                       <a:off x="0" y="0"/>
-                      <a:ext cx="3985807" cy="4141604"/>
+                      <a:ext cx="3427629" cy="3438721"/>
                     </a:xfrm>
                     <a:prstGeom prst="rect">
                       <a:avLst/>
@@ -18849,9 +18536,9 @@
           <w:szCs w:val="144"/>
         </w:rPr>
       </w:pPr>
-      <w:bookmarkStart w:id="145" w:name="_Toc49341857"/>
-      <w:bookmarkStart w:id="146" w:name="_Toc170148367"/>
-      <w:bookmarkStart w:id="147" w:name="_Toc170148681"/>
+      <w:bookmarkStart w:id="144" w:name="_Toc49341857"/>
+      <w:bookmarkStart w:id="145" w:name="_Toc170148367"/>
+      <w:bookmarkStart w:id="146" w:name="_Toc170148681"/>
       <w:r>
         <w:rPr>
           <w:sz w:val="144"/>
@@ -18860,9 +18547,9 @@
         <w:lastRenderedPageBreak/>
         <w:t>Implementar el proyecto</w:t>
       </w:r>
+      <w:bookmarkEnd w:id="144"/>
       <w:bookmarkEnd w:id="145"/>
       <w:bookmarkEnd w:id="146"/>
-      <w:bookmarkEnd w:id="147"/>
     </w:p>
     <w:p>
       <w:pPr>
@@ -18883,24 +18570,19 @@
       <w:pPr>
         <w:pStyle w:val="Ttulo3"/>
       </w:pPr>
-      <w:bookmarkStart w:id="148" w:name="_Toc49341830"/>
-      <w:bookmarkStart w:id="149" w:name="_Toc170148357"/>
-      <w:bookmarkStart w:id="150" w:name="_Toc170148672"/>
-      <w:bookmarkStart w:id="151" w:name="_Toc49341858"/>
-      <w:bookmarkStart w:id="152" w:name="_Toc170148368"/>
-      <w:bookmarkStart w:id="153" w:name="_Toc170148682"/>
-      <w:proofErr w:type="spellStart"/>
+      <w:bookmarkStart w:id="147" w:name="_Toc49341830"/>
+      <w:bookmarkStart w:id="148" w:name="_Toc170148357"/>
+      <w:bookmarkStart w:id="149" w:name="_Toc170148672"/>
+      <w:bookmarkStart w:id="150" w:name="_Toc49341858"/>
+      <w:bookmarkStart w:id="151" w:name="_Toc170148368"/>
+      <w:bookmarkStart w:id="152" w:name="_Toc170148682"/>
       <w:r>
         <w:lastRenderedPageBreak/>
-        <w:t>Sql</w:t>
-      </w:r>
-      <w:proofErr w:type="spellEnd"/>
-      <w:r>
-        <w:t xml:space="preserve"> de creación (MySQL)</w:t>
-      </w:r>
+        <w:t>Sql de creación (MySQL)</w:t>
+      </w:r>
+      <w:bookmarkEnd w:id="147"/>
       <w:bookmarkEnd w:id="148"/>
       <w:bookmarkEnd w:id="149"/>
-      <w:bookmarkEnd w:id="150"/>
     </w:p>
     <w:p>
       <w:pPr>
@@ -18971,21 +18653,7 @@
         <w:rPr>
           <w:lang w:val="en-GB"/>
         </w:rPr>
-        <w:t xml:space="preserve">-- </w:t>
-      </w:r>
-      <w:proofErr w:type="spellStart"/>
-      <w:r>
-        <w:rPr>
-          <w:lang w:val="en-GB"/>
-        </w:rPr>
-        <w:t>Servidor</w:t>
-      </w:r>
-      <w:proofErr w:type="spellEnd"/>
-      <w:r>
-        <w:rPr>
-          <w:lang w:val="en-GB"/>
-        </w:rPr>
-        <w:t>: 127.0.0.1</w:t>
+        <w:t>-- Servidor: 127.0.0.1</w:t>
       </w:r>
     </w:p>
     <w:p>
@@ -18998,21 +18666,7 @@
         <w:rPr>
           <w:lang w:val="en-GB"/>
         </w:rPr>
-        <w:t xml:space="preserve">-- Tiempo de </w:t>
-      </w:r>
-      <w:proofErr w:type="spellStart"/>
-      <w:r>
-        <w:rPr>
-          <w:lang w:val="en-GB"/>
-        </w:rPr>
-        <w:t>generación</w:t>
-      </w:r>
-      <w:proofErr w:type="spellEnd"/>
-      <w:r>
-        <w:rPr>
-          <w:lang w:val="en-GB"/>
-        </w:rPr>
-        <w:t>: 24-06-2024 a las 18:56:50</w:t>
+        <w:t>-- Tiempo de generación: 24-06-2024 a las 18:56:50</w:t>
       </w:r>
     </w:p>
     <w:p>
@@ -19025,35 +18679,7 @@
         <w:rPr>
           <w:lang w:val="en-GB"/>
         </w:rPr>
-        <w:t xml:space="preserve">-- </w:t>
-      </w:r>
-      <w:proofErr w:type="spellStart"/>
-      <w:r>
-        <w:rPr>
-          <w:lang w:val="en-GB"/>
-        </w:rPr>
-        <w:t>Versión</w:t>
-      </w:r>
-      <w:proofErr w:type="spellEnd"/>
-      <w:r>
-        <w:rPr>
-          <w:lang w:val="en-GB"/>
-        </w:rPr>
-        <w:t xml:space="preserve"> del </w:t>
-      </w:r>
-      <w:proofErr w:type="spellStart"/>
-      <w:r>
-        <w:rPr>
-          <w:lang w:val="en-GB"/>
-        </w:rPr>
-        <w:t>servidor</w:t>
-      </w:r>
-      <w:proofErr w:type="spellEnd"/>
-      <w:r>
-        <w:rPr>
-          <w:lang w:val="en-GB"/>
-        </w:rPr>
-        <w:t>: 10.4.27-MariaDB</w:t>
+        <w:t>-- Versión del servidor: 10.4.27-MariaDB</w:t>
       </w:r>
     </w:p>
     <w:p>
@@ -19066,21 +18692,7 @@
         <w:rPr>
           <w:lang w:val="en-GB"/>
         </w:rPr>
-        <w:t xml:space="preserve">-- </w:t>
-      </w:r>
-      <w:proofErr w:type="spellStart"/>
-      <w:r>
-        <w:rPr>
-          <w:lang w:val="en-GB"/>
-        </w:rPr>
-        <w:t>Versión</w:t>
-      </w:r>
-      <w:proofErr w:type="spellEnd"/>
-      <w:r>
-        <w:rPr>
-          <w:lang w:val="en-GB"/>
-        </w:rPr>
-        <w:t xml:space="preserve"> de PHP: 8.2.0</w:t>
+        <w:t>-- Versión de PHP: 8.2.0</w:t>
       </w:r>
     </w:p>
     <w:p>
@@ -19126,21 +18738,7 @@
         <w:rPr>
           <w:lang w:val="en-GB"/>
         </w:rPr>
-        <w:t xml:space="preserve">SET </w:t>
-      </w:r>
-      <w:proofErr w:type="spellStart"/>
-      <w:r>
-        <w:rPr>
-          <w:lang w:val="en-GB"/>
-        </w:rPr>
-        <w:t>time_zone</w:t>
-      </w:r>
-      <w:proofErr w:type="spellEnd"/>
-      <w:r>
-        <w:rPr>
-          <w:lang w:val="en-GB"/>
-        </w:rPr>
-        <w:t xml:space="preserve"> = "+00:00";</w:t>
+        <w:t>SET time_zone = "+00:00";</w:t>
       </w:r>
     </w:p>
     <w:p>
@@ -19232,35 +18830,7 @@
         <w:rPr>
           <w:lang w:val="en-GB"/>
         </w:rPr>
-        <w:t xml:space="preserve">-- Base de </w:t>
-      </w:r>
-      <w:proofErr w:type="spellStart"/>
-      <w:r>
-        <w:rPr>
-          <w:lang w:val="en-GB"/>
-        </w:rPr>
-        <w:t>datos</w:t>
-      </w:r>
-      <w:proofErr w:type="spellEnd"/>
-      <w:r>
-        <w:rPr>
-          <w:lang w:val="en-GB"/>
-        </w:rPr>
-        <w:t>: `</w:t>
-      </w:r>
-      <w:proofErr w:type="spellStart"/>
-      <w:r>
-        <w:rPr>
-          <w:lang w:val="en-GB"/>
-        </w:rPr>
-        <w:t>bancolibros</w:t>
-      </w:r>
-      <w:proofErr w:type="spellEnd"/>
-      <w:r>
-        <w:rPr>
-          <w:lang w:val="en-GB"/>
-        </w:rPr>
-        <w:t>`</w:t>
+        <w:t>-- Base de datos: `bancolibros`</w:t>
       </w:r>
     </w:p>
     <w:p>
@@ -19312,63 +18882,7 @@
         <w:rPr>
           <w:lang w:val="en-GB"/>
         </w:rPr>
-        <w:t xml:space="preserve">-- </w:t>
-      </w:r>
-      <w:proofErr w:type="spellStart"/>
-      <w:r>
-        <w:rPr>
-          <w:lang w:val="en-GB"/>
-        </w:rPr>
-        <w:t>Estructura</w:t>
-      </w:r>
-      <w:proofErr w:type="spellEnd"/>
-      <w:r>
-        <w:rPr>
-          <w:lang w:val="en-GB"/>
-        </w:rPr>
-        <w:t xml:space="preserve"> de </w:t>
-      </w:r>
-      <w:proofErr w:type="spellStart"/>
-      <w:r>
-        <w:rPr>
-          <w:lang w:val="en-GB"/>
-        </w:rPr>
-        <w:t>tabla</w:t>
-      </w:r>
-      <w:proofErr w:type="spellEnd"/>
-      <w:r>
-        <w:rPr>
-          <w:lang w:val="en-GB"/>
-        </w:rPr>
-        <w:t xml:space="preserve"> para la </w:t>
-      </w:r>
-      <w:proofErr w:type="spellStart"/>
-      <w:r>
-        <w:rPr>
-          <w:lang w:val="en-GB"/>
-        </w:rPr>
-        <w:t>tabla</w:t>
-      </w:r>
-      <w:proofErr w:type="spellEnd"/>
-      <w:r>
-        <w:rPr>
-          <w:lang w:val="en-GB"/>
-        </w:rPr>
-        <w:t xml:space="preserve"> `</w:t>
-      </w:r>
-      <w:proofErr w:type="spellStart"/>
-      <w:r>
-        <w:rPr>
-          <w:lang w:val="en-GB"/>
-        </w:rPr>
-        <w:t>alumnos</w:t>
-      </w:r>
-      <w:proofErr w:type="spellEnd"/>
-      <w:r>
-        <w:rPr>
-          <w:lang w:val="en-GB"/>
-        </w:rPr>
-        <w:t>`</w:t>
+        <w:t>-- Estructura de tabla para la tabla `alumnos`</w:t>
       </w:r>
     </w:p>
     <w:p>
@@ -19394,21 +18908,7 @@
         <w:rPr>
           <w:lang w:val="en-GB"/>
         </w:rPr>
-        <w:t>CREATE TABLE `</w:t>
-      </w:r>
-      <w:proofErr w:type="spellStart"/>
-      <w:r>
-        <w:rPr>
-          <w:lang w:val="en-GB"/>
-        </w:rPr>
-        <w:t>alumnos</w:t>
-      </w:r>
-      <w:proofErr w:type="spellEnd"/>
-      <w:r>
-        <w:rPr>
-          <w:lang w:val="en-GB"/>
-        </w:rPr>
-        <w:t>` (</w:t>
+        <w:t>CREATE TABLE `alumnos` (</w:t>
       </w:r>
     </w:p>
     <w:p>
@@ -19421,35 +18921,7 @@
         <w:rPr>
           <w:lang w:val="en-GB"/>
         </w:rPr>
-        <w:t xml:space="preserve">  `</w:t>
-      </w:r>
-      <w:proofErr w:type="spellStart"/>
-      <w:r>
-        <w:rPr>
-          <w:lang w:val="en-GB"/>
-        </w:rPr>
-        <w:t>nie</w:t>
-      </w:r>
-      <w:proofErr w:type="spellEnd"/>
-      <w:r>
-        <w:rPr>
-          <w:lang w:val="en-GB"/>
-        </w:rPr>
-        <w:t xml:space="preserve">` </w:t>
-      </w:r>
-      <w:proofErr w:type="gramStart"/>
-      <w:r>
-        <w:rPr>
-          <w:lang w:val="en-GB"/>
-        </w:rPr>
-        <w:t>varchar(</w:t>
-      </w:r>
-      <w:proofErr w:type="gramEnd"/>
-      <w:r>
-        <w:rPr>
-          <w:lang w:val="en-GB"/>
-        </w:rPr>
-        <w:t>10) NOT NULL,</w:t>
+        <w:t xml:space="preserve">  `nie` varchar(10) NOT NULL,</w:t>
       </w:r>
     </w:p>
     <w:p>
@@ -19462,35 +18934,7 @@
         <w:rPr>
           <w:lang w:val="en-GB"/>
         </w:rPr>
-        <w:t xml:space="preserve">  `</w:t>
-      </w:r>
-      <w:proofErr w:type="spellStart"/>
-      <w:r>
-        <w:rPr>
-          <w:lang w:val="en-GB"/>
-        </w:rPr>
-        <w:t>nombre</w:t>
-      </w:r>
-      <w:proofErr w:type="spellEnd"/>
-      <w:r>
-        <w:rPr>
-          <w:lang w:val="en-GB"/>
-        </w:rPr>
-        <w:t xml:space="preserve">` </w:t>
-      </w:r>
-      <w:proofErr w:type="gramStart"/>
-      <w:r>
-        <w:rPr>
-          <w:lang w:val="en-GB"/>
-        </w:rPr>
-        <w:t>varchar(</w:t>
-      </w:r>
-      <w:proofErr w:type="gramEnd"/>
-      <w:r>
-        <w:rPr>
-          <w:lang w:val="en-GB"/>
-        </w:rPr>
-        <w:t>255) NOT NULL,</w:t>
+        <w:t xml:space="preserve">  `nombre` varchar(255) NOT NULL,</w:t>
       </w:r>
     </w:p>
     <w:p>
@@ -19503,35 +18947,7 @@
         <w:rPr>
           <w:lang w:val="en-GB"/>
         </w:rPr>
-        <w:t xml:space="preserve">  `</w:t>
-      </w:r>
-      <w:proofErr w:type="spellStart"/>
-      <w:r>
-        <w:rPr>
-          <w:lang w:val="en-GB"/>
-        </w:rPr>
-        <w:t>apellidos</w:t>
-      </w:r>
-      <w:proofErr w:type="spellEnd"/>
-      <w:r>
-        <w:rPr>
-          <w:lang w:val="en-GB"/>
-        </w:rPr>
-        <w:t xml:space="preserve">` </w:t>
-      </w:r>
-      <w:proofErr w:type="gramStart"/>
-      <w:r>
-        <w:rPr>
-          <w:lang w:val="en-GB"/>
-        </w:rPr>
-        <w:t>varchar(</w:t>
-      </w:r>
-      <w:proofErr w:type="gramEnd"/>
-      <w:r>
-        <w:rPr>
-          <w:lang w:val="en-GB"/>
-        </w:rPr>
-        <w:t>255) NOT NULL,</w:t>
+        <w:t xml:space="preserve">  `apellidos` varchar(255) NOT NULL,</w:t>
       </w:r>
     </w:p>
     <w:p>
@@ -19544,63 +18960,7 @@
         <w:rPr>
           <w:lang w:val="en-GB"/>
         </w:rPr>
-        <w:t xml:space="preserve">  `</w:t>
-      </w:r>
-      <w:proofErr w:type="spellStart"/>
-      <w:r>
-        <w:rPr>
-          <w:lang w:val="en-GB"/>
-        </w:rPr>
-        <w:t>tramo</w:t>
-      </w:r>
-      <w:proofErr w:type="spellEnd"/>
-      <w:r>
-        <w:rPr>
-          <w:lang w:val="en-GB"/>
-        </w:rPr>
-        <w:t xml:space="preserve">` </w:t>
-      </w:r>
-      <w:proofErr w:type="gramStart"/>
-      <w:r>
-        <w:rPr>
-          <w:lang w:val="en-GB"/>
-        </w:rPr>
-        <w:t>varchar(</w:t>
-      </w:r>
-      <w:proofErr w:type="gramEnd"/>
-      <w:r>
-        <w:rPr>
-          <w:lang w:val="en-GB"/>
-        </w:rPr>
-        <w:t xml:space="preserve">2) NOT NULL DEFAULT '0' COMMENT '0 nada, I </w:t>
-      </w:r>
-      <w:proofErr w:type="spellStart"/>
-      <w:r>
-        <w:rPr>
-          <w:lang w:val="en-GB"/>
-        </w:rPr>
-        <w:t>tramo</w:t>
-      </w:r>
-      <w:proofErr w:type="spellEnd"/>
-      <w:r>
-        <w:rPr>
-          <w:lang w:val="en-GB"/>
-        </w:rPr>
-        <w:t xml:space="preserve"> I y II </w:t>
-      </w:r>
-      <w:proofErr w:type="spellStart"/>
-      <w:r>
-        <w:rPr>
-          <w:lang w:val="en-GB"/>
-        </w:rPr>
-        <w:t>Tramo</w:t>
-      </w:r>
-      <w:proofErr w:type="spellEnd"/>
-      <w:r>
-        <w:rPr>
-          <w:lang w:val="en-GB"/>
-        </w:rPr>
-        <w:t xml:space="preserve"> 2',</w:t>
+        <w:t xml:space="preserve">  `tramo` varchar(2) NOT NULL DEFAULT '0' COMMENT '0 nada, I tramo I y II Tramo 2',</w:t>
       </w:r>
     </w:p>
     <w:p>
@@ -19613,43 +18973,7 @@
         <w:rPr>
           <w:lang w:val="en-GB"/>
         </w:rPr>
-        <w:t xml:space="preserve">  `</w:t>
-      </w:r>
-      <w:proofErr w:type="spellStart"/>
-      <w:r>
-        <w:rPr>
-          <w:lang w:val="en-GB"/>
-        </w:rPr>
-        <w:t>bilingue</w:t>
-      </w:r>
-      <w:proofErr w:type="spellEnd"/>
-      <w:r>
-        <w:rPr>
-          <w:lang w:val="en-GB"/>
-        </w:rPr>
-        <w:t xml:space="preserve">` </w:t>
-      </w:r>
-      <w:proofErr w:type="spellStart"/>
-      <w:proofErr w:type="gramStart"/>
-      <w:r>
-        <w:rPr>
-          <w:lang w:val="en-GB"/>
-        </w:rPr>
-        <w:t>tinyint</w:t>
-      </w:r>
-      <w:proofErr w:type="spellEnd"/>
-      <w:r>
-        <w:rPr>
-          <w:lang w:val="en-GB"/>
-        </w:rPr>
-        <w:t>(</w:t>
-      </w:r>
-      <w:proofErr w:type="gramEnd"/>
-      <w:r>
-        <w:rPr>
-          <w:lang w:val="en-GB"/>
-        </w:rPr>
-        <w:t>1) NOT NULL DEFAULT 1 COMMENT '0 True, 1 false'</w:t>
+        <w:t xml:space="preserve">  `bilingue` tinyint(1) NOT NULL DEFAULT 1 COMMENT '0 True, 1 false'</w:t>
       </w:r>
     </w:p>
     <w:p>
@@ -19662,21 +18986,7 @@
         <w:rPr>
           <w:lang w:val="en-GB"/>
         </w:rPr>
-        <w:t>) ENGINE=</w:t>
-      </w:r>
-      <w:proofErr w:type="spellStart"/>
-      <w:r>
-        <w:rPr>
-          <w:lang w:val="en-GB"/>
-        </w:rPr>
-        <w:t>InnoDB</w:t>
-      </w:r>
-      <w:proofErr w:type="spellEnd"/>
-      <w:r>
-        <w:rPr>
-          <w:lang w:val="en-GB"/>
-        </w:rPr>
-        <w:t xml:space="preserve"> DEFAULT CHARSET=utf8 COLLATE=utf8_spanish2_ci;</w:t>
+        <w:t>) ENGINE=InnoDB DEFAULT CHARSET=utf8 COLLATE=utf8_spanish2_ci;</w:t>
       </w:r>
     </w:p>
     <w:p>
@@ -19715,63 +19025,7 @@
         <w:rPr>
           <w:lang w:val="en-GB"/>
         </w:rPr>
-        <w:t xml:space="preserve">-- </w:t>
-      </w:r>
-      <w:proofErr w:type="spellStart"/>
-      <w:r>
-        <w:rPr>
-          <w:lang w:val="en-GB"/>
-        </w:rPr>
-        <w:t>Estructura</w:t>
-      </w:r>
-      <w:proofErr w:type="spellEnd"/>
-      <w:r>
-        <w:rPr>
-          <w:lang w:val="en-GB"/>
-        </w:rPr>
-        <w:t xml:space="preserve"> de </w:t>
-      </w:r>
-      <w:proofErr w:type="spellStart"/>
-      <w:r>
-        <w:rPr>
-          <w:lang w:val="en-GB"/>
-        </w:rPr>
-        <w:t>tabla</w:t>
-      </w:r>
-      <w:proofErr w:type="spellEnd"/>
-      <w:r>
-        <w:rPr>
-          <w:lang w:val="en-GB"/>
-        </w:rPr>
-        <w:t xml:space="preserve"> para la </w:t>
-      </w:r>
-      <w:proofErr w:type="spellStart"/>
-      <w:r>
-        <w:rPr>
-          <w:lang w:val="en-GB"/>
-        </w:rPr>
-        <w:t>tabla</w:t>
-      </w:r>
-      <w:proofErr w:type="spellEnd"/>
-      <w:r>
-        <w:rPr>
-          <w:lang w:val="en-GB"/>
-        </w:rPr>
-        <w:t xml:space="preserve"> `</w:t>
-      </w:r>
-      <w:proofErr w:type="spellStart"/>
-      <w:r>
-        <w:rPr>
-          <w:lang w:val="en-GB"/>
-        </w:rPr>
-        <w:t>alumnoscrusoslibros</w:t>
-      </w:r>
-      <w:proofErr w:type="spellEnd"/>
-      <w:r>
-        <w:rPr>
-          <w:lang w:val="en-GB"/>
-        </w:rPr>
-        <w:t>`</w:t>
+        <w:t>-- Estructura de tabla para la tabla `alumnoscrusoslibros`</w:t>
       </w:r>
     </w:p>
     <w:p>
@@ -19797,21 +19051,7 @@
         <w:rPr>
           <w:lang w:val="en-GB"/>
         </w:rPr>
-        <w:t>CREATE TABLE `</w:t>
-      </w:r>
-      <w:proofErr w:type="spellStart"/>
-      <w:r>
-        <w:rPr>
-          <w:lang w:val="en-GB"/>
-        </w:rPr>
-        <w:t>alumnoscrusoslibros</w:t>
-      </w:r>
-      <w:proofErr w:type="spellEnd"/>
-      <w:r>
-        <w:rPr>
-          <w:lang w:val="en-GB"/>
-        </w:rPr>
-        <w:t>` (</w:t>
+        <w:t>CREATE TABLE `alumnoscrusoslibros` (</w:t>
       </w:r>
     </w:p>
     <w:p>
@@ -19824,35 +19064,7 @@
         <w:rPr>
           <w:lang w:val="en-GB"/>
         </w:rPr>
-        <w:t xml:space="preserve">  `</w:t>
-      </w:r>
-      <w:proofErr w:type="spellStart"/>
-      <w:r>
-        <w:rPr>
-          <w:lang w:val="en-GB"/>
-        </w:rPr>
-        <w:t>nie</w:t>
-      </w:r>
-      <w:proofErr w:type="spellEnd"/>
-      <w:r>
-        <w:rPr>
-          <w:lang w:val="en-GB"/>
-        </w:rPr>
-        <w:t xml:space="preserve">` </w:t>
-      </w:r>
-      <w:proofErr w:type="gramStart"/>
-      <w:r>
-        <w:rPr>
-          <w:lang w:val="en-GB"/>
-        </w:rPr>
-        <w:t>varchar(</w:t>
-      </w:r>
-      <w:proofErr w:type="gramEnd"/>
-      <w:r>
-        <w:rPr>
-          <w:lang w:val="en-GB"/>
-        </w:rPr>
-        <w:t>10) NOT NULL,</w:t>
+        <w:t xml:space="preserve">  `nie` varchar(10) NOT NULL,</w:t>
       </w:r>
     </w:p>
     <w:p>
@@ -19865,35 +19077,7 @@
         <w:rPr>
           <w:lang w:val="en-GB"/>
         </w:rPr>
-        <w:t xml:space="preserve">  `</w:t>
-      </w:r>
-      <w:proofErr w:type="spellStart"/>
-      <w:r>
-        <w:rPr>
-          <w:lang w:val="en-GB"/>
-        </w:rPr>
-        <w:t>curso</w:t>
-      </w:r>
-      <w:proofErr w:type="spellEnd"/>
-      <w:r>
-        <w:rPr>
-          <w:lang w:val="en-GB"/>
-        </w:rPr>
-        <w:t xml:space="preserve">` </w:t>
-      </w:r>
-      <w:proofErr w:type="gramStart"/>
-      <w:r>
-        <w:rPr>
-          <w:lang w:val="en-GB"/>
-        </w:rPr>
-        <w:t>varchar(</w:t>
-      </w:r>
-      <w:proofErr w:type="gramEnd"/>
-      <w:r>
-        <w:rPr>
-          <w:lang w:val="en-GB"/>
-        </w:rPr>
-        <w:t>255) NOT NULL,</w:t>
+        <w:t xml:space="preserve">  `curso` varchar(255) NOT NULL,</w:t>
       </w:r>
     </w:p>
     <w:p>
@@ -19906,35 +19090,7 @@
         <w:rPr>
           <w:lang w:val="en-GB"/>
         </w:rPr>
-        <w:t xml:space="preserve">  `</w:t>
-      </w:r>
-      <w:proofErr w:type="spellStart"/>
-      <w:r>
-        <w:rPr>
-          <w:lang w:val="en-GB"/>
-        </w:rPr>
-        <w:t>isbn</w:t>
-      </w:r>
-      <w:proofErr w:type="spellEnd"/>
-      <w:r>
-        <w:rPr>
-          <w:lang w:val="en-GB"/>
-        </w:rPr>
-        <w:t xml:space="preserve">` </w:t>
-      </w:r>
-      <w:proofErr w:type="gramStart"/>
-      <w:r>
-        <w:rPr>
-          <w:lang w:val="en-GB"/>
-        </w:rPr>
-        <w:t>varchar(</w:t>
-      </w:r>
-      <w:proofErr w:type="gramEnd"/>
-      <w:r>
-        <w:rPr>
-          <w:lang w:val="en-GB"/>
-        </w:rPr>
-        <w:t>20) NOT NULL,</w:t>
+        <w:t xml:space="preserve">  `isbn` varchar(20) NOT NULL,</w:t>
       </w:r>
     </w:p>
     <w:p>
@@ -19947,21 +19103,7 @@
         <w:rPr>
           <w:lang w:val="en-GB"/>
         </w:rPr>
-        <w:t xml:space="preserve">  `</w:t>
-      </w:r>
-      <w:proofErr w:type="spellStart"/>
-      <w:r>
-        <w:rPr>
-          <w:lang w:val="en-GB"/>
-        </w:rPr>
-        <w:t>fecha_entrega</w:t>
-      </w:r>
-      <w:proofErr w:type="spellEnd"/>
-      <w:r>
-        <w:rPr>
-          <w:lang w:val="en-GB"/>
-        </w:rPr>
-        <w:t>` date NOT NULL,</w:t>
+        <w:t xml:space="preserve">  `fecha_entrega` date NOT NULL,</w:t>
       </w:r>
     </w:p>
     <w:p>
@@ -19975,21 +19117,7 @@
           <w:lang w:val="en-GB"/>
         </w:rPr>
         <w:lastRenderedPageBreak/>
-        <w:t xml:space="preserve">  `</w:t>
-      </w:r>
-      <w:proofErr w:type="spellStart"/>
-      <w:r>
-        <w:rPr>
-          <w:lang w:val="en-GB"/>
-        </w:rPr>
-        <w:t>fecha_devolucion</w:t>
-      </w:r>
-      <w:proofErr w:type="spellEnd"/>
-      <w:r>
-        <w:rPr>
-          <w:lang w:val="en-GB"/>
-        </w:rPr>
-        <w:t>` date NOT NULL,</w:t>
+        <w:t xml:space="preserve">  `fecha_devolucion` date NOT NULL,</w:t>
       </w:r>
     </w:p>
     <w:p>
@@ -20002,63 +19130,7 @@
         <w:rPr>
           <w:lang w:val="en-GB"/>
         </w:rPr>
-        <w:t xml:space="preserve">  `</w:t>
-      </w:r>
-      <w:proofErr w:type="spellStart"/>
-      <w:r>
-        <w:rPr>
-          <w:lang w:val="en-GB"/>
-        </w:rPr>
-        <w:t>estado</w:t>
-      </w:r>
-      <w:proofErr w:type="spellEnd"/>
-      <w:r>
-        <w:rPr>
-          <w:lang w:val="en-GB"/>
-        </w:rPr>
-        <w:t xml:space="preserve">` </w:t>
-      </w:r>
-      <w:proofErr w:type="gramStart"/>
-      <w:r>
-        <w:rPr>
-          <w:lang w:val="en-GB"/>
-        </w:rPr>
-        <w:t>varchar(</w:t>
-      </w:r>
-      <w:proofErr w:type="gramEnd"/>
-      <w:r>
-        <w:rPr>
-          <w:lang w:val="en-GB"/>
-        </w:rPr>
-        <w:t xml:space="preserve">1) NOT NULL DEFAULT 'P' COMMENT 'P: </w:t>
-      </w:r>
-      <w:proofErr w:type="spellStart"/>
-      <w:r>
-        <w:rPr>
-          <w:lang w:val="en-GB"/>
-        </w:rPr>
-        <w:t>Prestado</w:t>
-      </w:r>
-      <w:proofErr w:type="spellEnd"/>
-      <w:r>
-        <w:rPr>
-          <w:lang w:val="en-GB"/>
-        </w:rPr>
-        <w:t xml:space="preserve">, </w:t>
-      </w:r>
-      <w:proofErr w:type="gramStart"/>
-      <w:r>
-        <w:rPr>
-          <w:lang w:val="en-GB"/>
-        </w:rPr>
-        <w:t>D:Devuelto</w:t>
-      </w:r>
-      <w:proofErr w:type="gramEnd"/>
-      <w:r>
-        <w:rPr>
-          <w:lang w:val="en-GB"/>
-        </w:rPr>
-        <w:t>'</w:t>
+        <w:t xml:space="preserve">  `estado` varchar(1) NOT NULL DEFAULT 'P' COMMENT 'P: Prestado, D:Devuelto'</w:t>
       </w:r>
     </w:p>
     <w:p>
@@ -20071,21 +19143,7 @@
         <w:rPr>
           <w:lang w:val="en-GB"/>
         </w:rPr>
-        <w:t>) ENGINE=</w:t>
-      </w:r>
-      <w:proofErr w:type="spellStart"/>
-      <w:r>
-        <w:rPr>
-          <w:lang w:val="en-GB"/>
-        </w:rPr>
-        <w:t>InnoDB</w:t>
-      </w:r>
-      <w:proofErr w:type="spellEnd"/>
-      <w:r>
-        <w:rPr>
-          <w:lang w:val="en-GB"/>
-        </w:rPr>
-        <w:t xml:space="preserve"> DEFAULT CHARSET=utf8 COLLATE=utf8_spanish2_ci;</w:t>
+        <w:t>) ENGINE=InnoDB DEFAULT CHARSET=utf8 COLLATE=utf8_spanish2_ci;</w:t>
       </w:r>
     </w:p>
     <w:p>
@@ -20124,63 +19182,7 @@
         <w:rPr>
           <w:lang w:val="en-GB"/>
         </w:rPr>
-        <w:t xml:space="preserve">-- </w:t>
-      </w:r>
-      <w:proofErr w:type="spellStart"/>
-      <w:r>
-        <w:rPr>
-          <w:lang w:val="en-GB"/>
-        </w:rPr>
-        <w:t>Estructura</w:t>
-      </w:r>
-      <w:proofErr w:type="spellEnd"/>
-      <w:r>
-        <w:rPr>
-          <w:lang w:val="en-GB"/>
-        </w:rPr>
-        <w:t xml:space="preserve"> de </w:t>
-      </w:r>
-      <w:proofErr w:type="spellStart"/>
-      <w:r>
-        <w:rPr>
-          <w:lang w:val="en-GB"/>
-        </w:rPr>
-        <w:t>tabla</w:t>
-      </w:r>
-      <w:proofErr w:type="spellEnd"/>
-      <w:r>
-        <w:rPr>
-          <w:lang w:val="en-GB"/>
-        </w:rPr>
-        <w:t xml:space="preserve"> para la </w:t>
-      </w:r>
-      <w:proofErr w:type="spellStart"/>
-      <w:r>
-        <w:rPr>
-          <w:lang w:val="en-GB"/>
-        </w:rPr>
-        <w:t>tabla</w:t>
-      </w:r>
-      <w:proofErr w:type="spellEnd"/>
-      <w:r>
-        <w:rPr>
-          <w:lang w:val="en-GB"/>
-        </w:rPr>
-        <w:t xml:space="preserve"> `</w:t>
-      </w:r>
-      <w:proofErr w:type="spellStart"/>
-      <w:r>
-        <w:rPr>
-          <w:lang w:val="en-GB"/>
-        </w:rPr>
-        <w:t>cursos</w:t>
-      </w:r>
-      <w:proofErr w:type="spellEnd"/>
-      <w:r>
-        <w:rPr>
-          <w:lang w:val="en-GB"/>
-        </w:rPr>
-        <w:t>`</w:t>
+        <w:t>-- Estructura de tabla para la tabla `cursos`</w:t>
       </w:r>
     </w:p>
     <w:p>
@@ -20206,21 +19208,7 @@
         <w:rPr>
           <w:lang w:val="en-GB"/>
         </w:rPr>
-        <w:t>CREATE TABLE `</w:t>
-      </w:r>
-      <w:proofErr w:type="spellStart"/>
-      <w:r>
-        <w:rPr>
-          <w:lang w:val="en-GB"/>
-        </w:rPr>
-        <w:t>cursos</w:t>
-      </w:r>
-      <w:proofErr w:type="spellEnd"/>
-      <w:r>
-        <w:rPr>
-          <w:lang w:val="en-GB"/>
-        </w:rPr>
-        <w:t>` (</w:t>
+        <w:t>CREATE TABLE `cursos` (</w:t>
       </w:r>
     </w:p>
     <w:p>
@@ -20233,35 +19221,7 @@
         <w:rPr>
           <w:lang w:val="en-GB"/>
         </w:rPr>
-        <w:t xml:space="preserve">  `</w:t>
-      </w:r>
-      <w:proofErr w:type="spellStart"/>
-      <w:r>
-        <w:rPr>
-          <w:lang w:val="en-GB"/>
-        </w:rPr>
-        <w:t>curso</w:t>
-      </w:r>
-      <w:proofErr w:type="spellEnd"/>
-      <w:r>
-        <w:rPr>
-          <w:lang w:val="en-GB"/>
-        </w:rPr>
-        <w:t xml:space="preserve">` </w:t>
-      </w:r>
-      <w:proofErr w:type="gramStart"/>
-      <w:r>
-        <w:rPr>
-          <w:lang w:val="en-GB"/>
-        </w:rPr>
-        <w:t>varchar(</w:t>
-      </w:r>
-      <w:proofErr w:type="gramEnd"/>
-      <w:r>
-        <w:rPr>
-          <w:lang w:val="en-GB"/>
-        </w:rPr>
-        <w:t>20) NOT NULL,</w:t>
+        <w:t xml:space="preserve">  `curso` varchar(20) NOT NULL,</w:t>
       </w:r>
     </w:p>
     <w:p>
@@ -20274,35 +19234,7 @@
         <w:rPr>
           <w:lang w:val="en-GB"/>
         </w:rPr>
-        <w:t xml:space="preserve">  `</w:t>
-      </w:r>
-      <w:proofErr w:type="spellStart"/>
-      <w:r>
-        <w:rPr>
-          <w:lang w:val="en-GB"/>
-        </w:rPr>
-        <w:t>nivel</w:t>
-      </w:r>
-      <w:proofErr w:type="spellEnd"/>
-      <w:r>
-        <w:rPr>
-          <w:lang w:val="en-GB"/>
-        </w:rPr>
-        <w:t xml:space="preserve">` </w:t>
-      </w:r>
-      <w:proofErr w:type="gramStart"/>
-      <w:r>
-        <w:rPr>
-          <w:lang w:val="en-GB"/>
-        </w:rPr>
-        <w:t>varchar(</w:t>
-      </w:r>
-      <w:proofErr w:type="gramEnd"/>
-      <w:r>
-        <w:rPr>
-          <w:lang w:val="en-GB"/>
-        </w:rPr>
-        <w:t>20) NOT NULL</w:t>
+        <w:t xml:space="preserve">  `nivel` varchar(20) NOT NULL</w:t>
       </w:r>
     </w:p>
     <w:p>
@@ -20315,21 +19247,7 @@
         <w:rPr>
           <w:lang w:val="en-GB"/>
         </w:rPr>
-        <w:t>) ENGINE=</w:t>
-      </w:r>
-      <w:proofErr w:type="spellStart"/>
-      <w:r>
-        <w:rPr>
-          <w:lang w:val="en-GB"/>
-        </w:rPr>
-        <w:t>InnoDB</w:t>
-      </w:r>
-      <w:proofErr w:type="spellEnd"/>
-      <w:r>
-        <w:rPr>
-          <w:lang w:val="en-GB"/>
-        </w:rPr>
-        <w:t xml:space="preserve"> DEFAULT CHARSET=utf8 COLLATE=utf8_spanish2_ci;</w:t>
+        <w:t>) ENGINE=InnoDB DEFAULT CHARSET=utf8 COLLATE=utf8_spanish2_ci;</w:t>
       </w:r>
     </w:p>
     <w:p>
@@ -20368,63 +19286,7 @@
         <w:rPr>
           <w:lang w:val="en-GB"/>
         </w:rPr>
-        <w:t xml:space="preserve">-- </w:t>
-      </w:r>
-      <w:proofErr w:type="spellStart"/>
-      <w:r>
-        <w:rPr>
-          <w:lang w:val="en-GB"/>
-        </w:rPr>
-        <w:t>Estructura</w:t>
-      </w:r>
-      <w:proofErr w:type="spellEnd"/>
-      <w:r>
-        <w:rPr>
-          <w:lang w:val="en-GB"/>
-        </w:rPr>
-        <w:t xml:space="preserve"> de </w:t>
-      </w:r>
-      <w:proofErr w:type="spellStart"/>
-      <w:r>
-        <w:rPr>
-          <w:lang w:val="en-GB"/>
-        </w:rPr>
-        <w:t>tabla</w:t>
-      </w:r>
-      <w:proofErr w:type="spellEnd"/>
-      <w:r>
-        <w:rPr>
-          <w:lang w:val="en-GB"/>
-        </w:rPr>
-        <w:t xml:space="preserve"> para la </w:t>
-      </w:r>
-      <w:proofErr w:type="spellStart"/>
-      <w:r>
-        <w:rPr>
-          <w:lang w:val="en-GB"/>
-        </w:rPr>
-        <w:t>tabla</w:t>
-      </w:r>
-      <w:proofErr w:type="spellEnd"/>
-      <w:r>
-        <w:rPr>
-          <w:lang w:val="en-GB"/>
-        </w:rPr>
-        <w:t xml:space="preserve"> `</w:t>
-      </w:r>
-      <w:proofErr w:type="spellStart"/>
-      <w:r>
-        <w:rPr>
-          <w:lang w:val="en-GB"/>
-        </w:rPr>
-        <w:t>libros</w:t>
-      </w:r>
-      <w:proofErr w:type="spellEnd"/>
-      <w:r>
-        <w:rPr>
-          <w:lang w:val="en-GB"/>
-        </w:rPr>
-        <w:t>`</w:t>
+        <w:t>-- Estructura de tabla para la tabla `libros`</w:t>
       </w:r>
     </w:p>
     <w:p>
@@ -20450,21 +19312,7 @@
         <w:rPr>
           <w:lang w:val="en-GB"/>
         </w:rPr>
-        <w:t>CREATE TABLE `</w:t>
-      </w:r>
-      <w:proofErr w:type="spellStart"/>
-      <w:r>
-        <w:rPr>
-          <w:lang w:val="en-GB"/>
-        </w:rPr>
-        <w:t>libros</w:t>
-      </w:r>
-      <w:proofErr w:type="spellEnd"/>
-      <w:r>
-        <w:rPr>
-          <w:lang w:val="en-GB"/>
-        </w:rPr>
-        <w:t>` (</w:t>
+        <w:t>CREATE TABLE `libros` (</w:t>
       </w:r>
     </w:p>
     <w:p>
@@ -20477,35 +19325,7 @@
         <w:rPr>
           <w:lang w:val="en-GB"/>
         </w:rPr>
-        <w:t xml:space="preserve">  `</w:t>
-      </w:r>
-      <w:proofErr w:type="spellStart"/>
-      <w:r>
-        <w:rPr>
-          <w:lang w:val="en-GB"/>
-        </w:rPr>
-        <w:t>isbn</w:t>
-      </w:r>
-      <w:proofErr w:type="spellEnd"/>
-      <w:r>
-        <w:rPr>
-          <w:lang w:val="en-GB"/>
-        </w:rPr>
-        <w:t xml:space="preserve">` </w:t>
-      </w:r>
-      <w:proofErr w:type="gramStart"/>
-      <w:r>
-        <w:rPr>
-          <w:lang w:val="en-GB"/>
-        </w:rPr>
-        <w:t>varchar(</w:t>
-      </w:r>
-      <w:proofErr w:type="gramEnd"/>
-      <w:r>
-        <w:rPr>
-          <w:lang w:val="en-GB"/>
-        </w:rPr>
-        <w:t>20) NOT NULL,</w:t>
+        <w:t xml:space="preserve">  `isbn` varchar(20) NOT NULL,</w:t>
       </w:r>
     </w:p>
     <w:p>
@@ -20518,35 +19338,7 @@
         <w:rPr>
           <w:lang w:val="en-GB"/>
         </w:rPr>
-        <w:t xml:space="preserve">  `</w:t>
-      </w:r>
-      <w:proofErr w:type="spellStart"/>
-      <w:r>
-        <w:rPr>
-          <w:lang w:val="en-GB"/>
-        </w:rPr>
-        <w:t>titulo</w:t>
-      </w:r>
-      <w:proofErr w:type="spellEnd"/>
-      <w:r>
-        <w:rPr>
-          <w:lang w:val="en-GB"/>
-        </w:rPr>
-        <w:t xml:space="preserve">` </w:t>
-      </w:r>
-      <w:proofErr w:type="gramStart"/>
-      <w:r>
-        <w:rPr>
-          <w:lang w:val="en-GB"/>
-        </w:rPr>
-        <w:t>varchar(</w:t>
-      </w:r>
-      <w:proofErr w:type="gramEnd"/>
-      <w:r>
-        <w:rPr>
-          <w:lang w:val="en-GB"/>
-        </w:rPr>
-        <w:t>255) NOT NULL,</w:t>
+        <w:t xml:space="preserve">  `titulo` varchar(255) NOT NULL,</w:t>
       </w:r>
     </w:p>
     <w:p>
@@ -20559,35 +19351,7 @@
         <w:rPr>
           <w:lang w:val="en-GB"/>
         </w:rPr>
-        <w:t xml:space="preserve">  `</w:t>
-      </w:r>
-      <w:proofErr w:type="spellStart"/>
-      <w:r>
-        <w:rPr>
-          <w:lang w:val="en-GB"/>
-        </w:rPr>
-        <w:t>autor</w:t>
-      </w:r>
-      <w:proofErr w:type="spellEnd"/>
-      <w:r>
-        <w:rPr>
-          <w:lang w:val="en-GB"/>
-        </w:rPr>
-        <w:t xml:space="preserve">` </w:t>
-      </w:r>
-      <w:proofErr w:type="gramStart"/>
-      <w:r>
-        <w:rPr>
-          <w:lang w:val="en-GB"/>
-        </w:rPr>
-        <w:t>varchar(</w:t>
-      </w:r>
-      <w:proofErr w:type="gramEnd"/>
-      <w:r>
-        <w:rPr>
-          <w:lang w:val="en-GB"/>
-        </w:rPr>
-        <w:t>255) NOT NULL,</w:t>
+        <w:t xml:space="preserve">  `autor` varchar(255) NOT NULL,</w:t>
       </w:r>
     </w:p>
     <w:p>
@@ -20600,35 +19364,7 @@
         <w:rPr>
           <w:lang w:val="en-GB"/>
         </w:rPr>
-        <w:t xml:space="preserve">  `</w:t>
-      </w:r>
-      <w:proofErr w:type="spellStart"/>
-      <w:r>
-        <w:rPr>
-          <w:lang w:val="en-GB"/>
-        </w:rPr>
-        <w:t>numero_ejemplares</w:t>
-      </w:r>
-      <w:proofErr w:type="spellEnd"/>
-      <w:r>
-        <w:rPr>
-          <w:lang w:val="en-GB"/>
-        </w:rPr>
-        <w:t xml:space="preserve">` </w:t>
-      </w:r>
-      <w:proofErr w:type="gramStart"/>
-      <w:r>
-        <w:rPr>
-          <w:lang w:val="en-GB"/>
-        </w:rPr>
-        <w:t>int(</w:t>
-      </w:r>
-      <w:proofErr w:type="gramEnd"/>
-      <w:r>
-        <w:rPr>
-          <w:lang w:val="en-GB"/>
-        </w:rPr>
-        <w:t>5) NOT NULL,</w:t>
+        <w:t xml:space="preserve">  `numero_ejemplares` int(5) NOT NULL,</w:t>
       </w:r>
     </w:p>
     <w:p>
@@ -20641,35 +19377,7 @@
         <w:rPr>
           <w:lang w:val="en-GB"/>
         </w:rPr>
-        <w:t xml:space="preserve">  `</w:t>
-      </w:r>
-      <w:proofErr w:type="spellStart"/>
-      <w:r>
-        <w:rPr>
-          <w:lang w:val="en-GB"/>
-        </w:rPr>
-        <w:t>id_materia</w:t>
-      </w:r>
-      <w:proofErr w:type="spellEnd"/>
-      <w:r>
-        <w:rPr>
-          <w:lang w:val="en-GB"/>
-        </w:rPr>
-        <w:t xml:space="preserve">` </w:t>
-      </w:r>
-      <w:proofErr w:type="gramStart"/>
-      <w:r>
-        <w:rPr>
-          <w:lang w:val="en-GB"/>
-        </w:rPr>
-        <w:t>int(</w:t>
-      </w:r>
-      <w:proofErr w:type="gramEnd"/>
-      <w:r>
-        <w:rPr>
-          <w:lang w:val="en-GB"/>
-        </w:rPr>
-        <w:t>11) NOT NULL,</w:t>
+        <w:t xml:space="preserve">  `id_materia` int(11) NOT NULL,</w:t>
       </w:r>
     </w:p>
     <w:p>
@@ -20682,35 +19390,7 @@
         <w:rPr>
           <w:lang w:val="en-GB"/>
         </w:rPr>
-        <w:t xml:space="preserve">  `</w:t>
-      </w:r>
-      <w:proofErr w:type="spellStart"/>
-      <w:r>
-        <w:rPr>
-          <w:lang w:val="en-GB"/>
-        </w:rPr>
-        <w:t>id_curso</w:t>
-      </w:r>
-      <w:proofErr w:type="spellEnd"/>
-      <w:r>
-        <w:rPr>
-          <w:lang w:val="en-GB"/>
-        </w:rPr>
-        <w:t xml:space="preserve">` </w:t>
-      </w:r>
-      <w:proofErr w:type="gramStart"/>
-      <w:r>
-        <w:rPr>
-          <w:lang w:val="en-GB"/>
-        </w:rPr>
-        <w:t>varchar(</w:t>
-      </w:r>
-      <w:proofErr w:type="gramEnd"/>
-      <w:r>
-        <w:rPr>
-          <w:lang w:val="en-GB"/>
-        </w:rPr>
-        <w:t>20) NOT NULL</w:t>
+        <w:t xml:space="preserve">  `id_curso` varchar(20) NOT NULL</w:t>
       </w:r>
     </w:p>
     <w:p>
@@ -20723,21 +19403,7 @@
         <w:rPr>
           <w:lang w:val="en-GB"/>
         </w:rPr>
-        <w:t>) ENGINE=</w:t>
-      </w:r>
-      <w:proofErr w:type="spellStart"/>
-      <w:r>
-        <w:rPr>
-          <w:lang w:val="en-GB"/>
-        </w:rPr>
-        <w:t>InnoDB</w:t>
-      </w:r>
-      <w:proofErr w:type="spellEnd"/>
-      <w:r>
-        <w:rPr>
-          <w:lang w:val="en-GB"/>
-        </w:rPr>
-        <w:t xml:space="preserve"> DEFAULT CHARSET=utf8 COLLATE=utf8_spanish2_ci;</w:t>
+        <w:t>) ENGINE=InnoDB DEFAULT CHARSET=utf8 COLLATE=utf8_spanish2_ci;</w:t>
       </w:r>
     </w:p>
     <w:p>
@@ -20776,63 +19442,7 @@
         <w:rPr>
           <w:lang w:val="en-GB"/>
         </w:rPr>
-        <w:t xml:space="preserve">-- </w:t>
-      </w:r>
-      <w:proofErr w:type="spellStart"/>
-      <w:r>
-        <w:rPr>
-          <w:lang w:val="en-GB"/>
-        </w:rPr>
-        <w:t>Estructura</w:t>
-      </w:r>
-      <w:proofErr w:type="spellEnd"/>
-      <w:r>
-        <w:rPr>
-          <w:lang w:val="en-GB"/>
-        </w:rPr>
-        <w:t xml:space="preserve"> de </w:t>
-      </w:r>
-      <w:proofErr w:type="spellStart"/>
-      <w:r>
-        <w:rPr>
-          <w:lang w:val="en-GB"/>
-        </w:rPr>
-        <w:t>tabla</w:t>
-      </w:r>
-      <w:proofErr w:type="spellEnd"/>
-      <w:r>
-        <w:rPr>
-          <w:lang w:val="en-GB"/>
-        </w:rPr>
-        <w:t xml:space="preserve"> para la </w:t>
-      </w:r>
-      <w:proofErr w:type="spellStart"/>
-      <w:r>
-        <w:rPr>
-          <w:lang w:val="en-GB"/>
-        </w:rPr>
-        <w:t>tabla</w:t>
-      </w:r>
-      <w:proofErr w:type="spellEnd"/>
-      <w:r>
-        <w:rPr>
-          <w:lang w:val="en-GB"/>
-        </w:rPr>
-        <w:t xml:space="preserve"> `</w:t>
-      </w:r>
-      <w:proofErr w:type="spellStart"/>
-      <w:r>
-        <w:rPr>
-          <w:lang w:val="en-GB"/>
-        </w:rPr>
-        <w:t>materias</w:t>
-      </w:r>
-      <w:proofErr w:type="spellEnd"/>
-      <w:r>
-        <w:rPr>
-          <w:lang w:val="en-GB"/>
-        </w:rPr>
-        <w:t>`</w:t>
+        <w:t>-- Estructura de tabla para la tabla `materias`</w:t>
       </w:r>
     </w:p>
     <w:p>
@@ -20858,21 +19468,7 @@
         <w:rPr>
           <w:lang w:val="en-GB"/>
         </w:rPr>
-        <w:t>CREATE TABLE `</w:t>
-      </w:r>
-      <w:proofErr w:type="spellStart"/>
-      <w:r>
-        <w:rPr>
-          <w:lang w:val="en-GB"/>
-        </w:rPr>
-        <w:t>materias</w:t>
-      </w:r>
-      <w:proofErr w:type="spellEnd"/>
-      <w:r>
-        <w:rPr>
-          <w:lang w:val="en-GB"/>
-        </w:rPr>
-        <w:t>` (</w:t>
+        <w:t>CREATE TABLE `materias` (</w:t>
       </w:r>
     </w:p>
     <w:p>
@@ -20885,21 +19481,7 @@
         <w:rPr>
           <w:lang w:val="en-GB"/>
         </w:rPr>
-        <w:t xml:space="preserve">  `id` </w:t>
-      </w:r>
-      <w:proofErr w:type="gramStart"/>
-      <w:r>
-        <w:rPr>
-          <w:lang w:val="en-GB"/>
-        </w:rPr>
-        <w:t>int(</w:t>
-      </w:r>
-      <w:proofErr w:type="gramEnd"/>
-      <w:r>
-        <w:rPr>
-          <w:lang w:val="en-GB"/>
-        </w:rPr>
-        <w:t>11) NOT NULL,</w:t>
+        <w:t xml:space="preserve">  `id` int(11) NOT NULL,</w:t>
       </w:r>
     </w:p>
     <w:p>
@@ -20912,35 +19494,7 @@
         <w:rPr>
           <w:lang w:val="en-GB"/>
         </w:rPr>
-        <w:t xml:space="preserve">  `</w:t>
-      </w:r>
-      <w:proofErr w:type="spellStart"/>
-      <w:r>
-        <w:rPr>
-          <w:lang w:val="en-GB"/>
-        </w:rPr>
-        <w:t>nombre</w:t>
-      </w:r>
-      <w:proofErr w:type="spellEnd"/>
-      <w:r>
-        <w:rPr>
-          <w:lang w:val="en-GB"/>
-        </w:rPr>
-        <w:t xml:space="preserve">` </w:t>
-      </w:r>
-      <w:proofErr w:type="gramStart"/>
-      <w:r>
-        <w:rPr>
-          <w:lang w:val="en-GB"/>
-        </w:rPr>
-        <w:t>varchar(</w:t>
-      </w:r>
-      <w:proofErr w:type="gramEnd"/>
-      <w:r>
-        <w:rPr>
-          <w:lang w:val="en-GB"/>
-        </w:rPr>
-        <w:t>255) NOT NULL,</w:t>
+        <w:t xml:space="preserve">  `nombre` varchar(255) NOT NULL,</w:t>
       </w:r>
     </w:p>
     <w:p>
@@ -20953,35 +19507,7 @@
         <w:rPr>
           <w:lang w:val="en-GB"/>
         </w:rPr>
-        <w:t xml:space="preserve">  `</w:t>
-      </w:r>
-      <w:proofErr w:type="spellStart"/>
-      <w:r>
-        <w:rPr>
-          <w:lang w:val="en-GB"/>
-        </w:rPr>
-        <w:t>departamento</w:t>
-      </w:r>
-      <w:proofErr w:type="spellEnd"/>
-      <w:r>
-        <w:rPr>
-          <w:lang w:val="en-GB"/>
-        </w:rPr>
-        <w:t xml:space="preserve">` </w:t>
-      </w:r>
-      <w:proofErr w:type="gramStart"/>
-      <w:r>
-        <w:rPr>
-          <w:lang w:val="en-GB"/>
-        </w:rPr>
-        <w:t>varchar(</w:t>
-      </w:r>
-      <w:proofErr w:type="gramEnd"/>
-      <w:r>
-        <w:rPr>
-          <w:lang w:val="en-GB"/>
-        </w:rPr>
-        <w:t>255) NOT NULL</w:t>
+        <w:t xml:space="preserve">  `departamento` varchar(255) NOT NULL</w:t>
       </w:r>
     </w:p>
     <w:p>
@@ -20994,21 +19520,7 @@
         <w:rPr>
           <w:lang w:val="en-GB"/>
         </w:rPr>
-        <w:t>) ENGINE=</w:t>
-      </w:r>
-      <w:proofErr w:type="spellStart"/>
-      <w:r>
-        <w:rPr>
-          <w:lang w:val="en-GB"/>
-        </w:rPr>
-        <w:t>InnoDB</w:t>
-      </w:r>
-      <w:proofErr w:type="spellEnd"/>
-      <w:r>
-        <w:rPr>
-          <w:lang w:val="en-GB"/>
-        </w:rPr>
-        <w:t xml:space="preserve"> DEFAULT CHARSET=utf8 COLLATE=utf8_spanish2_ci;</w:t>
+        <w:t>) ENGINE=InnoDB DEFAULT CHARSET=utf8 COLLATE=utf8_spanish2_ci;</w:t>
       </w:r>
     </w:p>
     <w:p>
@@ -21034,44 +19546,8 @@
         <w:rPr>
           <w:lang w:val="en-GB"/>
         </w:rPr>
-        <w:t xml:space="preserve">-- </w:t>
-      </w:r>
-      <w:proofErr w:type="spellStart"/>
-      <w:r>
-        <w:rPr>
-          <w:lang w:val="en-GB"/>
-        </w:rPr>
-        <w:t>Índices</w:t>
-      </w:r>
-      <w:proofErr w:type="spellEnd"/>
-      <w:r>
-        <w:rPr>
-          <w:lang w:val="en-GB"/>
-        </w:rPr>
-        <w:t xml:space="preserve"> para </w:t>
-      </w:r>
-      <w:proofErr w:type="spellStart"/>
-      <w:r>
-        <w:rPr>
-          <w:lang w:val="en-GB"/>
-        </w:rPr>
-        <w:t>tablas</w:t>
-      </w:r>
-      <w:proofErr w:type="spellEnd"/>
-      <w:r>
-        <w:rPr>
-          <w:lang w:val="en-GB"/>
-        </w:rPr>
-        <w:t xml:space="preserve"> </w:t>
-      </w:r>
-      <w:proofErr w:type="spellStart"/>
-      <w:r>
-        <w:rPr>
-          <w:lang w:val="en-GB"/>
-        </w:rPr>
-        <w:t>volcadas</w:t>
-      </w:r>
-      <w:proofErr w:type="spellEnd"/>
+        <w:t>-- Índices para tablas volcadas</w:t>
+      </w:r>
     </w:p>
     <w:p>
       <w:pPr>
@@ -21109,35 +19585,7 @@
         <w:rPr>
           <w:lang w:val="en-GB"/>
         </w:rPr>
-        <w:t xml:space="preserve">-- Indices de la </w:t>
-      </w:r>
-      <w:proofErr w:type="spellStart"/>
-      <w:r>
-        <w:rPr>
-          <w:lang w:val="en-GB"/>
-        </w:rPr>
-        <w:t>tabla</w:t>
-      </w:r>
-      <w:proofErr w:type="spellEnd"/>
-      <w:r>
-        <w:rPr>
-          <w:lang w:val="en-GB"/>
-        </w:rPr>
-        <w:t xml:space="preserve"> `</w:t>
-      </w:r>
-      <w:proofErr w:type="spellStart"/>
-      <w:r>
-        <w:rPr>
-          <w:lang w:val="en-GB"/>
-        </w:rPr>
-        <w:t>alumnos</w:t>
-      </w:r>
-      <w:proofErr w:type="spellEnd"/>
-      <w:r>
-        <w:rPr>
-          <w:lang w:val="en-GB"/>
-        </w:rPr>
-        <w:t>`</w:t>
+        <w:t>-- Indices de la tabla `alumnos`</w:t>
       </w:r>
     </w:p>
     <w:p>
@@ -21163,21 +19611,7 @@
         <w:rPr>
           <w:lang w:val="en-GB"/>
         </w:rPr>
-        <w:t>ALTER TABLE `</w:t>
-      </w:r>
-      <w:proofErr w:type="spellStart"/>
-      <w:r>
-        <w:rPr>
-          <w:lang w:val="en-GB"/>
-        </w:rPr>
-        <w:t>alumnos</w:t>
-      </w:r>
-      <w:proofErr w:type="spellEnd"/>
-      <w:r>
-        <w:rPr>
-          <w:lang w:val="en-GB"/>
-        </w:rPr>
-        <w:t>`</w:t>
+        <w:t>ALTER TABLE `alumnos`</w:t>
       </w:r>
     </w:p>
     <w:p>
@@ -21190,21 +19624,7 @@
         <w:rPr>
           <w:lang w:val="en-GB"/>
         </w:rPr>
-        <w:t xml:space="preserve">  ADD PRIMARY KEY (`</w:t>
-      </w:r>
-      <w:proofErr w:type="spellStart"/>
-      <w:r>
-        <w:rPr>
-          <w:lang w:val="en-GB"/>
-        </w:rPr>
-        <w:t>nie</w:t>
-      </w:r>
-      <w:proofErr w:type="spellEnd"/>
-      <w:r>
-        <w:rPr>
-          <w:lang w:val="en-GB"/>
-        </w:rPr>
-        <w:t>`);</w:t>
+        <w:t xml:space="preserve">  ADD PRIMARY KEY (`nie`);</w:t>
       </w:r>
     </w:p>
     <w:p>
@@ -21230,35 +19650,7 @@
         <w:rPr>
           <w:lang w:val="en-GB"/>
         </w:rPr>
-        <w:t xml:space="preserve">-- Indices de la </w:t>
-      </w:r>
-      <w:proofErr w:type="spellStart"/>
-      <w:r>
-        <w:rPr>
-          <w:lang w:val="en-GB"/>
-        </w:rPr>
-        <w:t>tabla</w:t>
-      </w:r>
-      <w:proofErr w:type="spellEnd"/>
-      <w:r>
-        <w:rPr>
-          <w:lang w:val="en-GB"/>
-        </w:rPr>
-        <w:t xml:space="preserve"> `</w:t>
-      </w:r>
-      <w:proofErr w:type="spellStart"/>
-      <w:r>
-        <w:rPr>
-          <w:lang w:val="en-GB"/>
-        </w:rPr>
-        <w:t>alumnoscrusoslibros</w:t>
-      </w:r>
-      <w:proofErr w:type="spellEnd"/>
-      <w:r>
-        <w:rPr>
-          <w:lang w:val="en-GB"/>
-        </w:rPr>
-        <w:t>`</w:t>
+        <w:t>-- Indices de la tabla `alumnoscrusoslibros`</w:t>
       </w:r>
     </w:p>
     <w:p>
@@ -21285,21 +19677,7 @@
           <w:lang w:val="en-GB"/>
         </w:rPr>
         <w:lastRenderedPageBreak/>
-        <w:t>ALTER TABLE `</w:t>
-      </w:r>
-      <w:proofErr w:type="spellStart"/>
-      <w:r>
-        <w:rPr>
-          <w:lang w:val="en-GB"/>
-        </w:rPr>
-        <w:t>alumnoscrusoslibros</w:t>
-      </w:r>
-      <w:proofErr w:type="spellEnd"/>
-      <w:r>
-        <w:rPr>
-          <w:lang w:val="en-GB"/>
-        </w:rPr>
-        <w:t>`</w:t>
+        <w:t>ALTER TABLE `alumnoscrusoslibros`</w:t>
       </w:r>
     </w:p>
     <w:p>
@@ -21312,53 +19690,7 @@
         <w:rPr>
           <w:lang w:val="en-GB"/>
         </w:rPr>
-        <w:t xml:space="preserve">  ADD PRIMARY KEY (`</w:t>
-      </w:r>
-      <w:proofErr w:type="spellStart"/>
-      <w:r>
-        <w:rPr>
-          <w:lang w:val="en-GB"/>
-        </w:rPr>
-        <w:t>nie</w:t>
-      </w:r>
-      <w:proofErr w:type="spellEnd"/>
-      <w:proofErr w:type="gramStart"/>
-      <w:r>
-        <w:rPr>
-          <w:lang w:val="en-GB"/>
-        </w:rPr>
-        <w:t>`,`</w:t>
-      </w:r>
-      <w:proofErr w:type="spellStart"/>
-      <w:proofErr w:type="gramEnd"/>
-      <w:r>
-        <w:rPr>
-          <w:lang w:val="en-GB"/>
-        </w:rPr>
-        <w:t>curso</w:t>
-      </w:r>
-      <w:proofErr w:type="spellEnd"/>
-      <w:proofErr w:type="gramStart"/>
-      <w:r>
-        <w:rPr>
-          <w:lang w:val="en-GB"/>
-        </w:rPr>
-        <w:t>`,`</w:t>
-      </w:r>
-      <w:proofErr w:type="spellStart"/>
-      <w:proofErr w:type="gramEnd"/>
-      <w:r>
-        <w:rPr>
-          <w:lang w:val="en-GB"/>
-        </w:rPr>
-        <w:t>isbn</w:t>
-      </w:r>
-      <w:proofErr w:type="spellEnd"/>
-      <w:r>
-        <w:rPr>
-          <w:lang w:val="en-GB"/>
-        </w:rPr>
-        <w:t>`),</w:t>
+        <w:t xml:space="preserve">  ADD PRIMARY KEY (`nie`,`curso`,`isbn`),</w:t>
       </w:r>
     </w:p>
     <w:p>
@@ -21371,35 +19703,7 @@
         <w:rPr>
           <w:lang w:val="en-GB"/>
         </w:rPr>
-        <w:t xml:space="preserve">  ADD KEY `</w:t>
-      </w:r>
-      <w:proofErr w:type="spellStart"/>
-      <w:r>
-        <w:rPr>
-          <w:lang w:val="en-GB"/>
-        </w:rPr>
-        <w:t>isbn</w:t>
-      </w:r>
-      <w:proofErr w:type="spellEnd"/>
-      <w:r>
-        <w:rPr>
-          <w:lang w:val="en-GB"/>
-        </w:rPr>
-        <w:t>` (`</w:t>
-      </w:r>
-      <w:proofErr w:type="spellStart"/>
-      <w:r>
-        <w:rPr>
-          <w:lang w:val="en-GB"/>
-        </w:rPr>
-        <w:t>isbn</w:t>
-      </w:r>
-      <w:proofErr w:type="spellEnd"/>
-      <w:r>
-        <w:rPr>
-          <w:lang w:val="en-GB"/>
-        </w:rPr>
-        <w:t>`),</w:t>
+        <w:t xml:space="preserve">  ADD KEY `isbn` (`isbn`),</w:t>
       </w:r>
     </w:p>
     <w:p>
@@ -21412,35 +19716,7 @@
         <w:rPr>
           <w:lang w:val="en-GB"/>
         </w:rPr>
-        <w:t xml:space="preserve">  ADD KEY `</w:t>
-      </w:r>
-      <w:proofErr w:type="spellStart"/>
-      <w:r>
-        <w:rPr>
-          <w:lang w:val="en-GB"/>
-        </w:rPr>
-        <w:t>curso</w:t>
-      </w:r>
-      <w:proofErr w:type="spellEnd"/>
-      <w:r>
-        <w:rPr>
-          <w:lang w:val="en-GB"/>
-        </w:rPr>
-        <w:t>` (`</w:t>
-      </w:r>
-      <w:proofErr w:type="spellStart"/>
-      <w:r>
-        <w:rPr>
-          <w:lang w:val="en-GB"/>
-        </w:rPr>
-        <w:t>curso</w:t>
-      </w:r>
-      <w:proofErr w:type="spellEnd"/>
-      <w:r>
-        <w:rPr>
-          <w:lang w:val="en-GB"/>
-        </w:rPr>
-        <w:t>`);</w:t>
+        <w:t xml:space="preserve">  ADD KEY `curso` (`curso`);</w:t>
       </w:r>
     </w:p>
     <w:p>
@@ -21466,35 +19742,7 @@
         <w:rPr>
           <w:lang w:val="en-GB"/>
         </w:rPr>
-        <w:t xml:space="preserve">-- Indices de la </w:t>
-      </w:r>
-      <w:proofErr w:type="spellStart"/>
-      <w:r>
-        <w:rPr>
-          <w:lang w:val="en-GB"/>
-        </w:rPr>
-        <w:t>tabla</w:t>
-      </w:r>
-      <w:proofErr w:type="spellEnd"/>
-      <w:r>
-        <w:rPr>
-          <w:lang w:val="en-GB"/>
-        </w:rPr>
-        <w:t xml:space="preserve"> `</w:t>
-      </w:r>
-      <w:proofErr w:type="spellStart"/>
-      <w:r>
-        <w:rPr>
-          <w:lang w:val="en-GB"/>
-        </w:rPr>
-        <w:t>cursos</w:t>
-      </w:r>
-      <w:proofErr w:type="spellEnd"/>
-      <w:r>
-        <w:rPr>
-          <w:lang w:val="en-GB"/>
-        </w:rPr>
-        <w:t>`</w:t>
+        <w:t>-- Indices de la tabla `cursos`</w:t>
       </w:r>
     </w:p>
     <w:p>
@@ -21520,21 +19768,7 @@
         <w:rPr>
           <w:lang w:val="en-GB"/>
         </w:rPr>
-        <w:t>ALTER TABLE `</w:t>
-      </w:r>
-      <w:proofErr w:type="spellStart"/>
-      <w:r>
-        <w:rPr>
-          <w:lang w:val="en-GB"/>
-        </w:rPr>
-        <w:t>cursos</w:t>
-      </w:r>
-      <w:proofErr w:type="spellEnd"/>
-      <w:r>
-        <w:rPr>
-          <w:lang w:val="en-GB"/>
-        </w:rPr>
-        <w:t>`</w:t>
+        <w:t>ALTER TABLE `cursos`</w:t>
       </w:r>
     </w:p>
     <w:p>
@@ -21547,21 +19781,7 @@
         <w:rPr>
           <w:lang w:val="en-GB"/>
         </w:rPr>
-        <w:t xml:space="preserve">  ADD PRIMARY KEY (`</w:t>
-      </w:r>
-      <w:proofErr w:type="spellStart"/>
-      <w:r>
-        <w:rPr>
-          <w:lang w:val="en-GB"/>
-        </w:rPr>
-        <w:t>curso</w:t>
-      </w:r>
-      <w:proofErr w:type="spellEnd"/>
-      <w:r>
-        <w:rPr>
-          <w:lang w:val="en-GB"/>
-        </w:rPr>
-        <w:t>`);</w:t>
+        <w:t xml:space="preserve">  ADD PRIMARY KEY (`curso`);</w:t>
       </w:r>
     </w:p>
     <w:p>
@@ -21587,35 +19807,7 @@
         <w:rPr>
           <w:lang w:val="en-GB"/>
         </w:rPr>
-        <w:t xml:space="preserve">-- Indices de la </w:t>
-      </w:r>
-      <w:proofErr w:type="spellStart"/>
-      <w:r>
-        <w:rPr>
-          <w:lang w:val="en-GB"/>
-        </w:rPr>
-        <w:t>tabla</w:t>
-      </w:r>
-      <w:proofErr w:type="spellEnd"/>
-      <w:r>
-        <w:rPr>
-          <w:lang w:val="en-GB"/>
-        </w:rPr>
-        <w:t xml:space="preserve"> `</w:t>
-      </w:r>
-      <w:proofErr w:type="spellStart"/>
-      <w:r>
-        <w:rPr>
-          <w:lang w:val="en-GB"/>
-        </w:rPr>
-        <w:t>libros</w:t>
-      </w:r>
-      <w:proofErr w:type="spellEnd"/>
-      <w:r>
-        <w:rPr>
-          <w:lang w:val="en-GB"/>
-        </w:rPr>
-        <w:t>`</w:t>
+        <w:t>-- Indices de la tabla `libros`</w:t>
       </w:r>
     </w:p>
     <w:p>
@@ -21641,21 +19833,7 @@
         <w:rPr>
           <w:lang w:val="en-GB"/>
         </w:rPr>
-        <w:t>ALTER TABLE `</w:t>
-      </w:r>
-      <w:proofErr w:type="spellStart"/>
-      <w:r>
-        <w:rPr>
-          <w:lang w:val="en-GB"/>
-        </w:rPr>
-        <w:t>libros</w:t>
-      </w:r>
-      <w:proofErr w:type="spellEnd"/>
-      <w:r>
-        <w:rPr>
-          <w:lang w:val="en-GB"/>
-        </w:rPr>
-        <w:t>`</w:t>
+        <w:t>ALTER TABLE `libros`</w:t>
       </w:r>
     </w:p>
     <w:p>
@@ -21668,21 +19846,7 @@
         <w:rPr>
           <w:lang w:val="en-GB"/>
         </w:rPr>
-        <w:t xml:space="preserve">  ADD PRIMARY KEY (`</w:t>
-      </w:r>
-      <w:proofErr w:type="spellStart"/>
-      <w:r>
-        <w:rPr>
-          <w:lang w:val="en-GB"/>
-        </w:rPr>
-        <w:t>isbn</w:t>
-      </w:r>
-      <w:proofErr w:type="spellEnd"/>
-      <w:r>
-        <w:rPr>
-          <w:lang w:val="en-GB"/>
-        </w:rPr>
-        <w:t>`),</w:t>
+        <w:t xml:space="preserve">  ADD PRIMARY KEY (`isbn`),</w:t>
       </w:r>
     </w:p>
     <w:p>
@@ -21695,35 +19859,7 @@
         <w:rPr>
           <w:lang w:val="en-GB"/>
         </w:rPr>
-        <w:t xml:space="preserve">  ADD KEY `</w:t>
-      </w:r>
-      <w:proofErr w:type="spellStart"/>
-      <w:r>
-        <w:rPr>
-          <w:lang w:val="en-GB"/>
-        </w:rPr>
-        <w:t>FK_Materias</w:t>
-      </w:r>
-      <w:proofErr w:type="spellEnd"/>
-      <w:r>
-        <w:rPr>
-          <w:lang w:val="en-GB"/>
-        </w:rPr>
-        <w:t>` (`</w:t>
-      </w:r>
-      <w:proofErr w:type="spellStart"/>
-      <w:r>
-        <w:rPr>
-          <w:lang w:val="en-GB"/>
-        </w:rPr>
-        <w:t>id_materia</w:t>
-      </w:r>
-      <w:proofErr w:type="spellEnd"/>
-      <w:r>
-        <w:rPr>
-          <w:lang w:val="en-GB"/>
-        </w:rPr>
-        <w:t>`),</w:t>
+        <w:t xml:space="preserve">  ADD KEY `FK_Materias` (`id_materia`),</w:t>
       </w:r>
     </w:p>
     <w:p>
@@ -21736,35 +19872,7 @@
         <w:rPr>
           <w:lang w:val="en-GB"/>
         </w:rPr>
-        <w:t xml:space="preserve">  ADD KEY `</w:t>
-      </w:r>
-      <w:proofErr w:type="spellStart"/>
-      <w:r>
-        <w:rPr>
-          <w:lang w:val="en-GB"/>
-        </w:rPr>
-        <w:t>FK_Cursos</w:t>
-      </w:r>
-      <w:proofErr w:type="spellEnd"/>
-      <w:r>
-        <w:rPr>
-          <w:lang w:val="en-GB"/>
-        </w:rPr>
-        <w:t>` (`</w:t>
-      </w:r>
-      <w:proofErr w:type="spellStart"/>
-      <w:r>
-        <w:rPr>
-          <w:lang w:val="en-GB"/>
-        </w:rPr>
-        <w:t>id_curso</w:t>
-      </w:r>
-      <w:proofErr w:type="spellEnd"/>
-      <w:r>
-        <w:rPr>
-          <w:lang w:val="en-GB"/>
-        </w:rPr>
-        <w:t>`) USING BTREE;</w:t>
+        <w:t xml:space="preserve">  ADD KEY `FK_Cursos` (`id_curso`) USING BTREE;</w:t>
       </w:r>
     </w:p>
     <w:p>
@@ -21790,35 +19898,7 @@
         <w:rPr>
           <w:lang w:val="en-GB"/>
         </w:rPr>
-        <w:t xml:space="preserve">-- Indices de la </w:t>
-      </w:r>
-      <w:proofErr w:type="spellStart"/>
-      <w:r>
-        <w:rPr>
-          <w:lang w:val="en-GB"/>
-        </w:rPr>
-        <w:t>tabla</w:t>
-      </w:r>
-      <w:proofErr w:type="spellEnd"/>
-      <w:r>
-        <w:rPr>
-          <w:lang w:val="en-GB"/>
-        </w:rPr>
-        <w:t xml:space="preserve"> `</w:t>
-      </w:r>
-      <w:proofErr w:type="spellStart"/>
-      <w:r>
-        <w:rPr>
-          <w:lang w:val="en-GB"/>
-        </w:rPr>
-        <w:t>materias</w:t>
-      </w:r>
-      <w:proofErr w:type="spellEnd"/>
-      <w:r>
-        <w:rPr>
-          <w:lang w:val="en-GB"/>
-        </w:rPr>
-        <w:t>`</w:t>
+        <w:t>-- Indices de la tabla `materias`</w:t>
       </w:r>
     </w:p>
     <w:p>
@@ -21844,21 +19924,7 @@
         <w:rPr>
           <w:lang w:val="en-GB"/>
         </w:rPr>
-        <w:t>ALTER TABLE `</w:t>
-      </w:r>
-      <w:proofErr w:type="spellStart"/>
-      <w:r>
-        <w:rPr>
-          <w:lang w:val="en-GB"/>
-        </w:rPr>
-        <w:t>materias</w:t>
-      </w:r>
-      <w:proofErr w:type="spellEnd"/>
-      <w:r>
-        <w:rPr>
-          <w:lang w:val="en-GB"/>
-        </w:rPr>
-        <w:t>`</w:t>
+        <w:t>ALTER TABLE `materias`</w:t>
       </w:r>
     </w:p>
     <w:p>
@@ -21884,30 +19950,8 @@
         <w:rPr>
           <w:lang w:val="en-GB"/>
         </w:rPr>
-        <w:t xml:space="preserve">-- Restricciones para </w:t>
-      </w:r>
-      <w:proofErr w:type="spellStart"/>
-      <w:r>
-        <w:rPr>
-          <w:lang w:val="en-GB"/>
-        </w:rPr>
-        <w:t>tablas</w:t>
-      </w:r>
-      <w:proofErr w:type="spellEnd"/>
-      <w:r>
-        <w:rPr>
-          <w:lang w:val="en-GB"/>
-        </w:rPr>
-        <w:t xml:space="preserve"> </w:t>
-      </w:r>
-      <w:proofErr w:type="spellStart"/>
-      <w:r>
-        <w:rPr>
-          <w:lang w:val="en-GB"/>
-        </w:rPr>
-        <w:t>volcadas</w:t>
-      </w:r>
-      <w:proofErr w:type="spellEnd"/>
+        <w:t>-- Restricciones para tablas volcadas</w:t>
+      </w:r>
     </w:p>
     <w:p>
       <w:pPr>
@@ -21945,49 +19989,7 @@
         <w:rPr>
           <w:lang w:val="en-GB"/>
         </w:rPr>
-        <w:t xml:space="preserve">-- </w:t>
-      </w:r>
-      <w:proofErr w:type="spellStart"/>
-      <w:r>
-        <w:rPr>
-          <w:lang w:val="en-GB"/>
-        </w:rPr>
-        <w:t>Filtros</w:t>
-      </w:r>
-      <w:proofErr w:type="spellEnd"/>
-      <w:r>
-        <w:rPr>
-          <w:lang w:val="en-GB"/>
-        </w:rPr>
-        <w:t xml:space="preserve"> para la </w:t>
-      </w:r>
-      <w:proofErr w:type="spellStart"/>
-      <w:r>
-        <w:rPr>
-          <w:lang w:val="en-GB"/>
-        </w:rPr>
-        <w:t>tabla</w:t>
-      </w:r>
-      <w:proofErr w:type="spellEnd"/>
-      <w:r>
-        <w:rPr>
-          <w:lang w:val="en-GB"/>
-        </w:rPr>
-        <w:t xml:space="preserve"> `</w:t>
-      </w:r>
-      <w:proofErr w:type="spellStart"/>
-      <w:r>
-        <w:rPr>
-          <w:lang w:val="en-GB"/>
-        </w:rPr>
-        <w:t>alumnoscrusoslibros</w:t>
-      </w:r>
-      <w:proofErr w:type="spellEnd"/>
-      <w:r>
-        <w:rPr>
-          <w:lang w:val="en-GB"/>
-        </w:rPr>
-        <w:t>`</w:t>
+        <w:t>-- Filtros para la tabla `alumnoscrusoslibros`</w:t>
       </w:r>
     </w:p>
     <w:p>
@@ -22013,21 +20015,7 @@
         <w:rPr>
           <w:lang w:val="en-GB"/>
         </w:rPr>
-        <w:t>ALTER TABLE `</w:t>
-      </w:r>
-      <w:proofErr w:type="spellStart"/>
-      <w:r>
-        <w:rPr>
-          <w:lang w:val="en-GB"/>
-        </w:rPr>
-        <w:t>alumnoscrusoslibros</w:t>
-      </w:r>
-      <w:proofErr w:type="spellEnd"/>
-      <w:r>
-        <w:rPr>
-          <w:lang w:val="en-GB"/>
-        </w:rPr>
-        <w:t>`</w:t>
+        <w:t>ALTER TABLE `alumnoscrusoslibros`</w:t>
       </w:r>
     </w:p>
     <w:p>
@@ -22040,49 +20028,7 @@
         <w:rPr>
           <w:lang w:val="en-GB"/>
         </w:rPr>
-        <w:t xml:space="preserve">  ADD CONSTRAINT `alumnoscrusoslibros_ibfk_1` FOREIGN KEY (`</w:t>
-      </w:r>
-      <w:proofErr w:type="spellStart"/>
-      <w:r>
-        <w:rPr>
-          <w:lang w:val="en-GB"/>
-        </w:rPr>
-        <w:t>isbn</w:t>
-      </w:r>
-      <w:proofErr w:type="spellEnd"/>
-      <w:r>
-        <w:rPr>
-          <w:lang w:val="en-GB"/>
-        </w:rPr>
-        <w:t>`) REFERENCES `</w:t>
-      </w:r>
-      <w:proofErr w:type="spellStart"/>
-      <w:r>
-        <w:rPr>
-          <w:lang w:val="en-GB"/>
-        </w:rPr>
-        <w:t>libros</w:t>
-      </w:r>
-      <w:proofErr w:type="spellEnd"/>
-      <w:r>
-        <w:rPr>
-          <w:lang w:val="en-GB"/>
-        </w:rPr>
-        <w:t>` (`</w:t>
-      </w:r>
-      <w:proofErr w:type="spellStart"/>
-      <w:r>
-        <w:rPr>
-          <w:lang w:val="en-GB"/>
-        </w:rPr>
-        <w:t>isbn</w:t>
-      </w:r>
-      <w:proofErr w:type="spellEnd"/>
-      <w:r>
-        <w:rPr>
-          <w:lang w:val="en-GB"/>
-        </w:rPr>
-        <w:t>`) ON DELETE CASCADE ON UPDATE CASCADE,</w:t>
+        <w:t xml:space="preserve">  ADD CONSTRAINT `alumnoscrusoslibros_ibfk_1` FOREIGN KEY (`isbn`) REFERENCES `libros` (`isbn`) ON DELETE CASCADE ON UPDATE CASCADE,</w:t>
       </w:r>
     </w:p>
     <w:p>
@@ -22095,49 +20041,7 @@
         <w:rPr>
           <w:lang w:val="en-GB"/>
         </w:rPr>
-        <w:t xml:space="preserve">  ADD CONSTRAINT `alumnoscrusoslibros_ibfk_2` FOREIGN KEY (`</w:t>
-      </w:r>
-      <w:proofErr w:type="spellStart"/>
-      <w:r>
-        <w:rPr>
-          <w:lang w:val="en-GB"/>
-        </w:rPr>
-        <w:t>nie</w:t>
-      </w:r>
-      <w:proofErr w:type="spellEnd"/>
-      <w:r>
-        <w:rPr>
-          <w:lang w:val="en-GB"/>
-        </w:rPr>
-        <w:t>`) REFERENCES `</w:t>
-      </w:r>
-      <w:proofErr w:type="spellStart"/>
-      <w:r>
-        <w:rPr>
-          <w:lang w:val="en-GB"/>
-        </w:rPr>
-        <w:t>alumnos</w:t>
-      </w:r>
-      <w:proofErr w:type="spellEnd"/>
-      <w:r>
-        <w:rPr>
-          <w:lang w:val="en-GB"/>
-        </w:rPr>
-        <w:t>` (`</w:t>
-      </w:r>
-      <w:proofErr w:type="spellStart"/>
-      <w:r>
-        <w:rPr>
-          <w:lang w:val="en-GB"/>
-        </w:rPr>
-        <w:t>nie</w:t>
-      </w:r>
-      <w:proofErr w:type="spellEnd"/>
-      <w:r>
-        <w:rPr>
-          <w:lang w:val="en-GB"/>
-        </w:rPr>
-        <w:t>`) ON DELETE CASCADE ON UPDATE CASCADE,</w:t>
+        <w:t xml:space="preserve">  ADD CONSTRAINT `alumnoscrusoslibros_ibfk_2` FOREIGN KEY (`nie`) REFERENCES `alumnos` (`nie`) ON DELETE CASCADE ON UPDATE CASCADE,</w:t>
       </w:r>
     </w:p>
     <w:p>
@@ -22150,49 +20054,7 @@
         <w:rPr>
           <w:lang w:val="en-GB"/>
         </w:rPr>
-        <w:t xml:space="preserve">  ADD CONSTRAINT `alumnoscrusoslibros_ibfk_3` FOREIGN KEY (`</w:t>
-      </w:r>
-      <w:proofErr w:type="spellStart"/>
-      <w:r>
-        <w:rPr>
-          <w:lang w:val="en-GB"/>
-        </w:rPr>
-        <w:t>curso</w:t>
-      </w:r>
-      <w:proofErr w:type="spellEnd"/>
-      <w:r>
-        <w:rPr>
-          <w:lang w:val="en-GB"/>
-        </w:rPr>
-        <w:t>`) REFERENCES `</w:t>
-      </w:r>
-      <w:proofErr w:type="spellStart"/>
-      <w:r>
-        <w:rPr>
-          <w:lang w:val="en-GB"/>
-        </w:rPr>
-        <w:t>cursos</w:t>
-      </w:r>
-      <w:proofErr w:type="spellEnd"/>
-      <w:r>
-        <w:rPr>
-          <w:lang w:val="en-GB"/>
-        </w:rPr>
-        <w:t>` (`</w:t>
-      </w:r>
-      <w:proofErr w:type="spellStart"/>
-      <w:r>
-        <w:rPr>
-          <w:lang w:val="en-GB"/>
-        </w:rPr>
-        <w:t>curso</w:t>
-      </w:r>
-      <w:proofErr w:type="spellEnd"/>
-      <w:r>
-        <w:rPr>
-          <w:lang w:val="en-GB"/>
-        </w:rPr>
-        <w:t>`) ON DELETE CASCADE ON UPDATE CASCADE;</w:t>
+        <w:t xml:space="preserve">  ADD CONSTRAINT `alumnoscrusoslibros_ibfk_3` FOREIGN KEY (`curso`) REFERENCES `cursos` (`curso`) ON DELETE CASCADE ON UPDATE CASCADE;</w:t>
       </w:r>
     </w:p>
     <w:p>
@@ -22218,49 +20080,7 @@
         <w:rPr>
           <w:lang w:val="en-GB"/>
         </w:rPr>
-        <w:t xml:space="preserve">-- </w:t>
-      </w:r>
-      <w:proofErr w:type="spellStart"/>
-      <w:r>
-        <w:rPr>
-          <w:lang w:val="en-GB"/>
-        </w:rPr>
-        <w:t>Filtros</w:t>
-      </w:r>
-      <w:proofErr w:type="spellEnd"/>
-      <w:r>
-        <w:rPr>
-          <w:lang w:val="en-GB"/>
-        </w:rPr>
-        <w:t xml:space="preserve"> para la </w:t>
-      </w:r>
-      <w:proofErr w:type="spellStart"/>
-      <w:r>
-        <w:rPr>
-          <w:lang w:val="en-GB"/>
-        </w:rPr>
-        <w:t>tabla</w:t>
-      </w:r>
-      <w:proofErr w:type="spellEnd"/>
-      <w:r>
-        <w:rPr>
-          <w:lang w:val="en-GB"/>
-        </w:rPr>
-        <w:t xml:space="preserve"> `</w:t>
-      </w:r>
-      <w:proofErr w:type="spellStart"/>
-      <w:r>
-        <w:rPr>
-          <w:lang w:val="en-GB"/>
-        </w:rPr>
-        <w:t>libros</w:t>
-      </w:r>
-      <w:proofErr w:type="spellEnd"/>
-      <w:r>
-        <w:rPr>
-          <w:lang w:val="en-GB"/>
-        </w:rPr>
-        <w:t>`</w:t>
+        <w:t>-- Filtros para la tabla `libros`</w:t>
       </w:r>
     </w:p>
     <w:p>
@@ -22286,21 +20106,7 @@
         <w:rPr>
           <w:lang w:val="en-GB"/>
         </w:rPr>
-        <w:t>ALTER TABLE `</w:t>
-      </w:r>
-      <w:proofErr w:type="spellStart"/>
-      <w:r>
-        <w:rPr>
-          <w:lang w:val="en-GB"/>
-        </w:rPr>
-        <w:t>libros</w:t>
-      </w:r>
-      <w:proofErr w:type="spellEnd"/>
-      <w:r>
-        <w:rPr>
-          <w:lang w:val="en-GB"/>
-        </w:rPr>
-        <w:t>`</w:t>
+        <w:t>ALTER TABLE `libros`</w:t>
       </w:r>
     </w:p>
     <w:p>
@@ -22313,63 +20119,7 @@
         <w:rPr>
           <w:lang w:val="en-GB"/>
         </w:rPr>
-        <w:t xml:space="preserve">  ADD CONSTRAINT `</w:t>
-      </w:r>
-      <w:proofErr w:type="spellStart"/>
-      <w:r>
-        <w:rPr>
-          <w:lang w:val="en-GB"/>
-        </w:rPr>
-        <w:t>fk_libros_cursos</w:t>
-      </w:r>
-      <w:proofErr w:type="spellEnd"/>
-      <w:r>
-        <w:rPr>
-          <w:lang w:val="en-GB"/>
-        </w:rPr>
-        <w:t>` FOREIGN KEY (`</w:t>
-      </w:r>
-      <w:proofErr w:type="spellStart"/>
-      <w:r>
-        <w:rPr>
-          <w:lang w:val="en-GB"/>
-        </w:rPr>
-        <w:t>id_curso</w:t>
-      </w:r>
-      <w:proofErr w:type="spellEnd"/>
-      <w:r>
-        <w:rPr>
-          <w:lang w:val="en-GB"/>
-        </w:rPr>
-        <w:t>`) REFERENCES `</w:t>
-      </w:r>
-      <w:proofErr w:type="spellStart"/>
-      <w:r>
-        <w:rPr>
-          <w:lang w:val="en-GB"/>
-        </w:rPr>
-        <w:t>cursos</w:t>
-      </w:r>
-      <w:proofErr w:type="spellEnd"/>
-      <w:r>
-        <w:rPr>
-          <w:lang w:val="en-GB"/>
-        </w:rPr>
-        <w:t>` (`</w:t>
-      </w:r>
-      <w:proofErr w:type="spellStart"/>
-      <w:r>
-        <w:rPr>
-          <w:lang w:val="en-GB"/>
-        </w:rPr>
-        <w:t>curso</w:t>
-      </w:r>
-      <w:proofErr w:type="spellEnd"/>
-      <w:r>
-        <w:rPr>
-          <w:lang w:val="en-GB"/>
-        </w:rPr>
-        <w:t>`) ON DELETE CASCADE ON UPDATE CASCADE,</w:t>
+        <w:t xml:space="preserve">  ADD CONSTRAINT `fk_libros_cursos` FOREIGN KEY (`id_curso`) REFERENCES `cursos` (`curso`) ON DELETE CASCADE ON UPDATE CASCADE,</w:t>
       </w:r>
     </w:p>
     <w:p>
@@ -22382,49 +20132,7 @@
         <w:rPr>
           <w:lang w:val="en-GB"/>
         </w:rPr>
-        <w:t xml:space="preserve">  ADD CONSTRAINT `</w:t>
-      </w:r>
-      <w:proofErr w:type="spellStart"/>
-      <w:r>
-        <w:rPr>
-          <w:lang w:val="en-GB"/>
-        </w:rPr>
-        <w:t>fk_libros_materias</w:t>
-      </w:r>
-      <w:proofErr w:type="spellEnd"/>
-      <w:r>
-        <w:rPr>
-          <w:lang w:val="en-GB"/>
-        </w:rPr>
-        <w:t>` FOREIGN KEY (`</w:t>
-      </w:r>
-      <w:proofErr w:type="spellStart"/>
-      <w:r>
-        <w:rPr>
-          <w:lang w:val="en-GB"/>
-        </w:rPr>
-        <w:t>id_materia</w:t>
-      </w:r>
-      <w:proofErr w:type="spellEnd"/>
-      <w:r>
-        <w:rPr>
-          <w:lang w:val="en-GB"/>
-        </w:rPr>
-        <w:t>`) REFERENCES `</w:t>
-      </w:r>
-      <w:proofErr w:type="spellStart"/>
-      <w:r>
-        <w:rPr>
-          <w:lang w:val="en-GB"/>
-        </w:rPr>
-        <w:t>materias</w:t>
-      </w:r>
-      <w:proofErr w:type="spellEnd"/>
-      <w:r>
-        <w:rPr>
-          <w:lang w:val="en-GB"/>
-        </w:rPr>
-        <w:t>` (`id`) ON DELETE CASCADE ON UPDATE CASCADE;</w:t>
+        <w:t xml:space="preserve">  ADD CONSTRAINT `fk_libros_materias` FOREIGN KEY (`id_materia`) REFERENCES `materias` (`id`) ON DELETE CASCADE ON UPDATE CASCADE;</w:t>
       </w:r>
     </w:p>
     <w:p>
@@ -22494,9 +20202,9 @@
         <w:lastRenderedPageBreak/>
         <w:t>Indicadores de calidad</w:t>
       </w:r>
+      <w:bookmarkEnd w:id="150"/>
       <w:bookmarkEnd w:id="151"/>
       <w:bookmarkEnd w:id="152"/>
-      <w:bookmarkEnd w:id="153"/>
     </w:p>
     <w:tbl>
       <w:tblPr>
@@ -23140,25 +20848,7 @@
                 <w:sz w:val="16"/>
                 <w:szCs w:val="16"/>
               </w:rPr>
-              <w:t xml:space="preserve"> </w:t>
-            </w:r>
-            <w:proofErr w:type="spellStart"/>
-            <w:r>
-              <w:rPr>
-                <w:rFonts w:cstheme="minorHAnsi"/>
-                <w:sz w:val="16"/>
-                <w:szCs w:val="16"/>
-              </w:rPr>
-              <w:t>edge</w:t>
-            </w:r>
-            <w:proofErr w:type="spellEnd"/>
-            <w:r>
-              <w:rPr>
-                <w:rFonts w:cstheme="minorHAnsi"/>
-                <w:sz w:val="16"/>
-                <w:szCs w:val="16"/>
-              </w:rPr>
-              <w:t>?</w:t>
+              <w:t xml:space="preserve"> edge?</w:t>
             </w:r>
           </w:p>
         </w:tc>
@@ -23376,25 +21066,7 @@
                 <w:sz w:val="16"/>
                 <w:szCs w:val="16"/>
               </w:rPr>
-              <w:t xml:space="preserve"> </w:t>
-            </w:r>
-            <w:proofErr w:type="spellStart"/>
-            <w:r>
-              <w:rPr>
-                <w:rFonts w:cstheme="minorHAnsi"/>
-                <w:sz w:val="16"/>
-                <w:szCs w:val="16"/>
-              </w:rPr>
-              <w:t>chrome</w:t>
-            </w:r>
-            <w:proofErr w:type="spellEnd"/>
-            <w:r>
-              <w:rPr>
-                <w:rFonts w:cstheme="minorHAnsi"/>
-                <w:sz w:val="16"/>
-                <w:szCs w:val="16"/>
-              </w:rPr>
-              <w:t>?</w:t>
+              <w:t xml:space="preserve"> chrome?</w:t>
             </w:r>
           </w:p>
         </w:tc>
@@ -25118,25 +22790,7 @@
                 <w:sz w:val="16"/>
                 <w:szCs w:val="16"/>
               </w:rPr>
-              <w:t xml:space="preserve">¿Funciona con </w:t>
-            </w:r>
-            <w:proofErr w:type="spellStart"/>
-            <w:r>
-              <w:rPr>
-                <w:rFonts w:cstheme="minorHAnsi"/>
-                <w:sz w:val="16"/>
-                <w:szCs w:val="16"/>
-              </w:rPr>
-              <w:t>táblets</w:t>
-            </w:r>
-            <w:proofErr w:type="spellEnd"/>
-            <w:r>
-              <w:rPr>
-                <w:rFonts w:cstheme="minorHAnsi"/>
-                <w:sz w:val="16"/>
-                <w:szCs w:val="16"/>
-              </w:rPr>
-              <w:t>?</w:t>
+              <w:t>¿Funciona con táblets?</w:t>
             </w:r>
           </w:p>
         </w:tc>
@@ -26339,16 +23993,16 @@
       <w:pPr>
         <w:pStyle w:val="Ttulo2"/>
       </w:pPr>
-      <w:bookmarkStart w:id="154" w:name="_Toc49341859"/>
-      <w:bookmarkStart w:id="155" w:name="_Toc170148369"/>
-      <w:bookmarkStart w:id="156" w:name="_Toc170148683"/>
+      <w:bookmarkStart w:id="153" w:name="_Toc49341859"/>
+      <w:bookmarkStart w:id="154" w:name="_Toc170148369"/>
+      <w:bookmarkStart w:id="155" w:name="_Toc170148683"/>
       <w:r>
         <w:lastRenderedPageBreak/>
         <w:t>Elaboración de una batería de pruebas para detectar errores</w:t>
       </w:r>
+      <w:bookmarkEnd w:id="153"/>
       <w:bookmarkEnd w:id="154"/>
       <w:bookmarkEnd w:id="155"/>
-      <w:bookmarkEnd w:id="156"/>
     </w:p>
     <w:p>
       <w:r>
@@ -27007,7 +24661,7 @@
       </w:tr>
     </w:tbl>
     <w:p>
-      <w:bookmarkStart w:id="157" w:name="_Toc49341860"/>
+      <w:bookmarkStart w:id="156" w:name="_Toc49341860"/>
     </w:p>
     <w:tbl>
       <w:tblPr>
@@ -28224,14 +25878,14 @@
       <w:pPr>
         <w:pStyle w:val="Ttulo2"/>
       </w:pPr>
-      <w:bookmarkStart w:id="158" w:name="_Toc170148370"/>
-      <w:bookmarkStart w:id="159" w:name="_Toc170148684"/>
+      <w:bookmarkStart w:id="157" w:name="_Toc170148370"/>
+      <w:bookmarkStart w:id="158" w:name="_Toc170148684"/>
       <w:r>
         <w:t>Evaluación y solución de incidencias</w:t>
       </w:r>
+      <w:bookmarkEnd w:id="156"/>
       <w:bookmarkEnd w:id="157"/>
       <w:bookmarkEnd w:id="158"/>
-      <w:bookmarkEnd w:id="159"/>
     </w:p>
     <w:p>
       <w:r>
@@ -28247,15 +25901,7 @@
     <w:p/>
     <w:p>
       <w:r>
-        <w:t xml:space="preserve">También se ha modificado la parte de préstamos en la tabla </w:t>
-      </w:r>
-      <w:proofErr w:type="spellStart"/>
-      <w:r>
-        <w:t>alumnoscursoslibros</w:t>
-      </w:r>
-      <w:proofErr w:type="spellEnd"/>
-      <w:r>
-        <w:t>, añadiendo y controlando mejor los campos de fecha de entrega, fecha de devolución y el estado del préstamo, ya que al principio no estaba del todo bien controlado.</w:t>
+        <w:t>También se ha modificado la parte de préstamos en la tabla alumnoscursoslibros, añadiendo y controlando mejor los campos de fecha de entrega, fecha de devolución y el estado del préstamo, ya que al principio no estaba del todo bien controlado.</w:t>
       </w:r>
     </w:p>
     <w:p/>
@@ -28267,15 +25913,7 @@
     <w:p>
       <w:r>
         <w:lastRenderedPageBreak/>
-        <w:t xml:space="preserve">Otra cosa que se ha visto necesaria es controlar mejor el stock de libros, ya que sin esto se podían hacer </w:t>
-      </w:r>
-      <w:proofErr w:type="gramStart"/>
-      <w:r>
-        <w:t>préstamos</w:t>
-      </w:r>
-      <w:proofErr w:type="gramEnd"/>
-      <w:r>
-        <w:t xml:space="preserve"> aunque no hubiera ejemplares disponibles, así que se ha reforzado esa parte en la lógica del programa.</w:t>
+        <w:t>Otra cosa que se ha visto necesaria es controlar mejor el stock de libros, ya que sin esto se podían hacer préstamos aunque no hubiera ejemplares disponibles, así que se ha reforzado esa parte en la lógica del programa.</w:t>
       </w:r>
     </w:p>
     <w:p/>
@@ -28301,18 +25939,18 @@
       <w:pPr>
         <w:pStyle w:val="Ttulo2"/>
       </w:pPr>
-      <w:bookmarkStart w:id="160" w:name="_Toc49341861"/>
-      <w:bookmarkStart w:id="161" w:name="_Toc170148371"/>
-      <w:bookmarkStart w:id="162" w:name="_Toc170148685"/>
+      <w:bookmarkStart w:id="159" w:name="_Toc49341861"/>
+      <w:bookmarkStart w:id="160" w:name="_Toc170148371"/>
+      <w:bookmarkStart w:id="161" w:name="_Toc170148685"/>
       <w:r>
         <w:t>Evaluación y seguimiento del</w:t>
       </w:r>
       <w:r>
         <w:t xml:space="preserve"> proyecto</w:t>
       </w:r>
+      <w:bookmarkEnd w:id="159"/>
       <w:bookmarkEnd w:id="160"/>
       <w:bookmarkEnd w:id="161"/>
-      <w:bookmarkEnd w:id="162"/>
     </w:p>
     <w:p>
       <w:pPr>
@@ -28372,7 +26010,7 @@
           <w:szCs w:val="144"/>
         </w:rPr>
       </w:pPr>
-      <w:bookmarkStart w:id="163" w:name="_Toc49341863"/>
+      <w:bookmarkStart w:id="162" w:name="_Toc49341863"/>
       <w:r>
         <w:rPr>
           <w:sz w:val="144"/>
@@ -28390,8 +26028,8 @@
           <w:szCs w:val="144"/>
         </w:rPr>
       </w:pPr>
-      <w:bookmarkStart w:id="164" w:name="_Toc170148373"/>
-      <w:bookmarkStart w:id="165" w:name="_Toc170148686"/>
+      <w:bookmarkStart w:id="163" w:name="_Toc170148373"/>
+      <w:bookmarkStart w:id="164" w:name="_Toc170148686"/>
       <w:r>
         <w:rPr>
           <w:sz w:val="144"/>
@@ -28400,9 +26038,9 @@
         <w:lastRenderedPageBreak/>
         <w:t>Implantación del Proyecto</w:t>
       </w:r>
+      <w:bookmarkEnd w:id="162"/>
       <w:bookmarkEnd w:id="163"/>
       <w:bookmarkEnd w:id="164"/>
-      <w:bookmarkEnd w:id="165"/>
     </w:p>
     <w:p>
       <w:pPr>
@@ -28423,16 +26061,16 @@
       <w:pPr>
         <w:pStyle w:val="Ttulo2"/>
       </w:pPr>
-      <w:bookmarkStart w:id="166" w:name="_Toc49341864"/>
-      <w:bookmarkStart w:id="167" w:name="_Toc170148374"/>
-      <w:bookmarkStart w:id="168" w:name="_Toc170148687"/>
+      <w:bookmarkStart w:id="165" w:name="_Toc49341864"/>
+      <w:bookmarkStart w:id="166" w:name="_Toc170148374"/>
+      <w:bookmarkStart w:id="167" w:name="_Toc170148687"/>
       <w:r>
         <w:lastRenderedPageBreak/>
         <w:t>Plan de implantación</w:t>
       </w:r>
+      <w:bookmarkEnd w:id="165"/>
       <w:bookmarkEnd w:id="166"/>
       <w:bookmarkEnd w:id="167"/>
-      <w:bookmarkEnd w:id="168"/>
     </w:p>
     <w:p>
       <w:pPr>
@@ -28534,15 +26172,8 @@
           <w:b/>
         </w:rPr>
         <w:tab/>
-      </w:r>
-      <w:proofErr w:type="spellStart"/>
-      <w:r>
-        <w:rPr>
-          <w:b/>
-        </w:rPr>
         <w:t>Software</w:t>
       </w:r>
-      <w:proofErr w:type="spellEnd"/>
       <w:r>
         <w:rPr>
           <w:b/>
@@ -28629,20 +26260,12 @@
       </w:r>
       <w:r>
         <w:tab/>
-      </w:r>
-      <w:proofErr w:type="spellStart"/>
-      <w:r>
         <w:t>mañana</w:t>
       </w:r>
-      <w:proofErr w:type="spellEnd"/>
       <w:r>
         <w:tab/>
-      </w:r>
-      <w:proofErr w:type="spellStart"/>
-      <w:r>
         <w:t>mañana</w:t>
       </w:r>
-      <w:proofErr w:type="spellEnd"/>
       <w:r>
         <w:tab/>
         <w:t xml:space="preserve">noche </w:t>
@@ -28697,12 +26320,8 @@
       </w:r>
       <w:r>
         <w:tab/>
-      </w:r>
-      <w:proofErr w:type="spellStart"/>
-      <w:r>
         <w:t>Instalador</w:t>
       </w:r>
-      <w:proofErr w:type="spellEnd"/>
       <w:r>
         <w:tab/>
         <w:t>Usuario</w:t>
@@ -28731,31 +26350,31 @@
       <w:pPr>
         <w:pStyle w:val="Ttulo2"/>
       </w:pPr>
-      <w:bookmarkStart w:id="169" w:name="_Toc49341865"/>
-      <w:bookmarkStart w:id="170" w:name="_Toc170148375"/>
-      <w:bookmarkStart w:id="171" w:name="_Toc170148688"/>
+      <w:bookmarkStart w:id="168" w:name="_Toc49341865"/>
+      <w:bookmarkStart w:id="169" w:name="_Toc170148375"/>
+      <w:bookmarkStart w:id="170" w:name="_Toc170148688"/>
       <w:r>
         <w:t>Manual de instalación</w:t>
       </w:r>
+      <w:bookmarkEnd w:id="168"/>
       <w:bookmarkEnd w:id="169"/>
       <w:bookmarkEnd w:id="170"/>
-      <w:bookmarkEnd w:id="171"/>
     </w:p>
     <w:p>
       <w:pPr>
         <w:pStyle w:val="Ttulo3"/>
       </w:pPr>
-      <w:bookmarkStart w:id="172" w:name="_Toc37610656"/>
-      <w:bookmarkStart w:id="173" w:name="_Toc49341866"/>
-      <w:bookmarkStart w:id="174" w:name="_Toc170148376"/>
-      <w:bookmarkStart w:id="175" w:name="_Toc170148689"/>
+      <w:bookmarkStart w:id="171" w:name="_Toc37610656"/>
+      <w:bookmarkStart w:id="172" w:name="_Toc49341866"/>
+      <w:bookmarkStart w:id="173" w:name="_Toc170148376"/>
+      <w:bookmarkStart w:id="174" w:name="_Toc170148689"/>
       <w:r>
         <w:t>Instalación de la aplicación</w:t>
       </w:r>
+      <w:bookmarkEnd w:id="171"/>
       <w:bookmarkEnd w:id="172"/>
       <w:bookmarkEnd w:id="173"/>
       <w:bookmarkEnd w:id="174"/>
-      <w:bookmarkEnd w:id="175"/>
     </w:p>
     <w:p>
       <w:pPr>
@@ -28775,15 +26394,15 @@
       <w:pPr>
         <w:pStyle w:val="Ttulo2"/>
       </w:pPr>
-      <w:bookmarkStart w:id="176" w:name="_Toc49341876"/>
-      <w:bookmarkStart w:id="177" w:name="_Toc170148377"/>
-      <w:bookmarkStart w:id="178" w:name="_Toc170148690"/>
+      <w:bookmarkStart w:id="175" w:name="_Toc49341876"/>
+      <w:bookmarkStart w:id="176" w:name="_Toc170148377"/>
+      <w:bookmarkStart w:id="177" w:name="_Toc170148690"/>
       <w:r>
         <w:t>Mejoras posibles</w:t>
       </w:r>
+      <w:bookmarkEnd w:id="175"/>
       <w:bookmarkEnd w:id="176"/>
       <w:bookmarkEnd w:id="177"/>
-      <w:bookmarkEnd w:id="178"/>
     </w:p>
     <w:p>
       <w:pPr>
@@ -28797,8 +26416,8 @@
         </w:rPr>
         <w:t>Rellenar</w:t>
       </w:r>
-      <w:bookmarkStart w:id="179" w:name="_Toc49341877"/>
-      <w:bookmarkStart w:id="180" w:name="_Toc170148378"/>
+      <w:bookmarkStart w:id="178" w:name="_Toc49341877"/>
+      <w:bookmarkStart w:id="179" w:name="_Toc170148378"/>
     </w:p>
     <w:p>
       <w:pPr>
@@ -28811,13 +26430,13 @@
       <w:pPr>
         <w:pStyle w:val="Ttulo2"/>
       </w:pPr>
-      <w:bookmarkStart w:id="181" w:name="_Toc170148691"/>
+      <w:bookmarkStart w:id="180" w:name="_Toc170148691"/>
       <w:r>
         <w:t>Manual de usuario</w:t>
       </w:r>
+      <w:bookmarkEnd w:id="178"/>
       <w:bookmarkEnd w:id="179"/>
       <w:bookmarkEnd w:id="180"/>
-      <w:bookmarkEnd w:id="181"/>
     </w:p>
     <w:p>
       <w:pPr>
@@ -28842,8 +26461,8 @@
           <w:lang w:bidi="es-ES"/>
         </w:rPr>
       </w:pPr>
-      <w:bookmarkStart w:id="182" w:name="_Toc49341895"/>
-      <w:bookmarkStart w:id="183" w:name="_Toc170148379"/>
+      <w:bookmarkStart w:id="181" w:name="_Toc49341895"/>
+      <w:bookmarkStart w:id="182" w:name="_Toc170148379"/>
       <w:r>
         <w:rPr>
           <w:lang w:bidi="es-ES"/>
@@ -28861,7 +26480,7 @@
           <w:lang w:bidi="es-ES"/>
         </w:rPr>
       </w:pPr>
-      <w:bookmarkStart w:id="184" w:name="_Toc170148692"/>
+      <w:bookmarkStart w:id="183" w:name="_Toc170148692"/>
       <w:r>
         <w:rPr>
           <w:sz w:val="144"/>
@@ -28871,9 +26490,9 @@
         <w:lastRenderedPageBreak/>
         <w:t>Anexos</w:t>
       </w:r>
+      <w:bookmarkEnd w:id="181"/>
       <w:bookmarkEnd w:id="182"/>
       <w:bookmarkEnd w:id="183"/>
-      <w:bookmarkEnd w:id="184"/>
     </w:p>
     <w:sdt>
       <w:sdtPr>
@@ -28919,9 +26538,9 @@
               <w:b w:val="0"/>
             </w:rPr>
           </w:pPr>
-          <w:bookmarkStart w:id="185" w:name="_Toc49341896"/>
-          <w:bookmarkStart w:id="186" w:name="_Toc170148380"/>
-          <w:bookmarkStart w:id="187" w:name="_Toc170148693"/>
+          <w:bookmarkStart w:id="184" w:name="_Toc49341896"/>
+          <w:bookmarkStart w:id="185" w:name="_Toc170148380"/>
+          <w:bookmarkStart w:id="186" w:name="_Toc170148693"/>
           <w:r>
             <w:rPr>
               <w:b w:val="0"/>
@@ -28935,9 +26554,9 @@
             </w:rPr>
             <w:t>contrato usado</w:t>
           </w:r>
+          <w:bookmarkEnd w:id="184"/>
           <w:bookmarkEnd w:id="185"/>
           <w:bookmarkEnd w:id="186"/>
-          <w:bookmarkEnd w:id="187"/>
         </w:p>
         <w:p>
           <w:pPr>
@@ -29008,31 +26627,23 @@
               <w:b w:val="0"/>
             </w:rPr>
           </w:pPr>
-          <w:bookmarkStart w:id="188" w:name="_Toc170148381"/>
-          <w:bookmarkStart w:id="189" w:name="_Toc170148694"/>
+          <w:bookmarkStart w:id="187" w:name="_Toc170148381"/>
+          <w:bookmarkStart w:id="188" w:name="_Toc170148694"/>
           <w:r>
             <w:rPr>
               <w:b w:val="0"/>
             </w:rPr>
             <w:lastRenderedPageBreak/>
-            <w:t xml:space="preserve">Fichero exportado de </w:t>
+            <w:t>Fichero exportado de Delphos</w:t>
           </w:r>
-          <w:proofErr w:type="spellStart"/>
-          <w:r>
-            <w:rPr>
-              <w:b w:val="0"/>
-            </w:rPr>
-            <w:t>Delphos</w:t>
-          </w:r>
-          <w:proofErr w:type="spellEnd"/>
           <w:r>
             <w:rPr>
               <w:b w:val="0"/>
             </w:rPr>
             <w:t xml:space="preserve"> (alumnos)</w:t>
           </w:r>
+          <w:bookmarkEnd w:id="187"/>
           <w:bookmarkEnd w:id="188"/>
-          <w:bookmarkEnd w:id="189"/>
         </w:p>
         <w:p>
           <w:pPr>
@@ -29112,141 +26723,8 @@
             <w:t xml:space="preserve"> (Apellidos, Nombre)</w:t>
           </w:r>
           <w:r>
-            <w:t xml:space="preserve">, </w:t>
+            <w:t>, NumeroEscolar, NumeroSolicitud, FechaSolicitud, CampoNoNecesario, CursoAcadémico, CampoNoNecesario, CampoNoNecesario, CampoNoNecesario, CampoNoNecesario, CampoNoNecesario, CampoNoNecesario, CampoNoNecesario, CampoNoNecesario, ResultadoLibros, ResultadoComedor, Matriculado, TipoBecaLibros, TipoBecaComedor</w:t>
           </w:r>
-          <w:proofErr w:type="spellStart"/>
-          <w:r>
-            <w:t>NumeroEscolar</w:t>
-          </w:r>
-          <w:proofErr w:type="spellEnd"/>
-          <w:r>
-            <w:t xml:space="preserve">, </w:t>
-          </w:r>
-          <w:proofErr w:type="spellStart"/>
-          <w:r>
-            <w:t>NumeroSolicitud</w:t>
-          </w:r>
-          <w:proofErr w:type="spellEnd"/>
-          <w:r>
-            <w:t xml:space="preserve">, </w:t>
-          </w:r>
-          <w:proofErr w:type="spellStart"/>
-          <w:r>
-            <w:t>FechaSolicitud</w:t>
-          </w:r>
-          <w:proofErr w:type="spellEnd"/>
-          <w:r>
-            <w:t xml:space="preserve">, </w:t>
-          </w:r>
-          <w:proofErr w:type="spellStart"/>
-          <w:r>
-            <w:t>CampoNoNecesario</w:t>
-          </w:r>
-          <w:proofErr w:type="spellEnd"/>
-          <w:r>
-            <w:t xml:space="preserve">, </w:t>
-          </w:r>
-          <w:proofErr w:type="spellStart"/>
-          <w:r>
-            <w:t>CursoAcadémico</w:t>
-          </w:r>
-          <w:proofErr w:type="spellEnd"/>
-          <w:r>
-            <w:t xml:space="preserve">, </w:t>
-          </w:r>
-          <w:proofErr w:type="spellStart"/>
-          <w:r>
-            <w:t>CampoNoNecesario</w:t>
-          </w:r>
-          <w:proofErr w:type="spellEnd"/>
-          <w:r>
-            <w:t xml:space="preserve">, </w:t>
-          </w:r>
-          <w:proofErr w:type="spellStart"/>
-          <w:r>
-            <w:t>CampoNoNecesario</w:t>
-          </w:r>
-          <w:proofErr w:type="spellEnd"/>
-          <w:r>
-            <w:t xml:space="preserve">, </w:t>
-          </w:r>
-          <w:proofErr w:type="spellStart"/>
-          <w:r>
-            <w:t>CampoNoNecesario</w:t>
-          </w:r>
-          <w:proofErr w:type="spellEnd"/>
-          <w:r>
-            <w:t xml:space="preserve">, </w:t>
-          </w:r>
-          <w:proofErr w:type="spellStart"/>
-          <w:r>
-            <w:t>CampoNoNecesario</w:t>
-          </w:r>
-          <w:proofErr w:type="spellEnd"/>
-          <w:r>
-            <w:t xml:space="preserve">, </w:t>
-          </w:r>
-          <w:proofErr w:type="spellStart"/>
-          <w:r>
-            <w:t>CampoNoNecesario</w:t>
-          </w:r>
-          <w:proofErr w:type="spellEnd"/>
-          <w:r>
-            <w:t xml:space="preserve">, </w:t>
-          </w:r>
-          <w:proofErr w:type="spellStart"/>
-          <w:r>
-            <w:t>CampoNoNecesario</w:t>
-          </w:r>
-          <w:proofErr w:type="spellEnd"/>
-          <w:r>
-            <w:t xml:space="preserve">, </w:t>
-          </w:r>
-          <w:proofErr w:type="spellStart"/>
-          <w:r>
-            <w:t>CampoNoNecesario</w:t>
-          </w:r>
-          <w:proofErr w:type="spellEnd"/>
-          <w:r>
-            <w:t xml:space="preserve">, </w:t>
-          </w:r>
-          <w:proofErr w:type="spellStart"/>
-          <w:r>
-            <w:t>CampoNoNecesario</w:t>
-          </w:r>
-          <w:proofErr w:type="spellEnd"/>
-          <w:r>
-            <w:t xml:space="preserve">, </w:t>
-          </w:r>
-          <w:proofErr w:type="spellStart"/>
-          <w:r>
-            <w:t>ResultadoLibros</w:t>
-          </w:r>
-          <w:proofErr w:type="spellEnd"/>
-          <w:r>
-            <w:t xml:space="preserve">, </w:t>
-          </w:r>
-          <w:proofErr w:type="spellStart"/>
-          <w:r>
-            <w:t>ResultadoComedor</w:t>
-          </w:r>
-          <w:proofErr w:type="spellEnd"/>
-          <w:r>
-            <w:t xml:space="preserve">, Matriculado, </w:t>
-          </w:r>
-          <w:proofErr w:type="spellStart"/>
-          <w:r>
-            <w:t>TipoBecaLibros</w:t>
-          </w:r>
-          <w:proofErr w:type="spellEnd"/>
-          <w:r>
-            <w:t xml:space="preserve">, </w:t>
-          </w:r>
-          <w:proofErr w:type="spellStart"/>
-          <w:r>
-            <w:t>TipoBecaComedor</w:t>
-          </w:r>
-          <w:proofErr w:type="spellEnd"/>
         </w:p>
         <w:p/>
         <w:p/>
@@ -29268,9 +26746,9 @@
           <w:b w:val="0"/>
         </w:rPr>
       </w:pPr>
-      <w:bookmarkStart w:id="190" w:name="_Toc49341898"/>
-      <w:bookmarkStart w:id="191" w:name="_Toc170148382"/>
-      <w:bookmarkStart w:id="192" w:name="_Toc170148695"/>
+      <w:bookmarkStart w:id="189" w:name="_Toc49341898"/>
+      <w:bookmarkStart w:id="190" w:name="_Toc170148382"/>
+      <w:bookmarkStart w:id="191" w:name="_Toc170148695"/>
       <w:r>
         <w:rPr>
           <w:b w:val="0"/>
@@ -29278,9 +26756,9 @@
         <w:lastRenderedPageBreak/>
         <w:t>Ejemplo de formulario de satisfacción</w:t>
       </w:r>
+      <w:bookmarkEnd w:id="189"/>
       <w:bookmarkEnd w:id="190"/>
       <w:bookmarkEnd w:id="191"/>
-      <w:bookmarkEnd w:id="192"/>
     </w:p>
     <w:p>
       <w:r>
@@ -32042,8 +29520,8 @@
           <w:b w:val="0"/>
         </w:rPr>
       </w:pPr>
-      <w:bookmarkStart w:id="193" w:name="_Toc170148383"/>
-      <w:bookmarkStart w:id="194" w:name="_Toc170148696"/>
+      <w:bookmarkStart w:id="192" w:name="_Toc170148383"/>
+      <w:bookmarkStart w:id="193" w:name="_Toc170148696"/>
       <w:r>
         <w:rPr>
           <w:b w:val="0"/>
@@ -32051,8 +29529,8 @@
         <w:lastRenderedPageBreak/>
         <w:t>Datos de prueba</w:t>
       </w:r>
+      <w:bookmarkEnd w:id="192"/>
       <w:bookmarkEnd w:id="193"/>
-      <w:bookmarkEnd w:id="194"/>
     </w:p>
     <w:p>
       <w:pPr>
@@ -39183,6 +36661,7 @@
   <w:style w:type="character" w:default="1" w:styleId="Fuentedeprrafopredeter">
     <w:name w:val="Default Paragraph Font"/>
     <w:uiPriority w:val="1"/>
+    <w:semiHidden/>
     <w:unhideWhenUsed/>
   </w:style>
   <w:style w:type="table" w:default="1" w:styleId="Tablanormal">
@@ -40585,6 +38064,7 @@
     <w:rsid w:val="00684424"/>
     <w:rsid w:val="006A6D69"/>
     <w:rsid w:val="00734B22"/>
+    <w:rsid w:val="007535C4"/>
     <w:rsid w:val="00760466"/>
     <w:rsid w:val="0078114E"/>
     <w:rsid w:val="00783082"/>
@@ -40596,6 +38076,7 @@
     <w:rsid w:val="0081382F"/>
     <w:rsid w:val="00893BCB"/>
     <w:rsid w:val="008960CF"/>
+    <w:rsid w:val="008D7901"/>
     <w:rsid w:val="009051C9"/>
     <w:rsid w:val="00962633"/>
     <w:rsid w:val="00963B15"/>

</xml_diff>

<commit_message>
Septimo guardado (18/05/2026, 21:33)
</commit_message>
<xml_diff>
--- a/UT_7_2024_2025 (2).docx
+++ b/UT_7_2024_2025 (2).docx
@@ -6733,15 +6733,19 @@
                 <w:r>
                   <w:t xml:space="preserve">IDE para desarrollo </w:t>
                 </w:r>
+                <w:proofErr w:type="gramStart"/>
                 <w:r>
                   <w:t>PHP</w:t>
                 </w:r>
                 <w:r>
                   <w:t xml:space="preserve">  (</w:t>
                 </w:r>
+                <w:proofErr w:type="spellStart"/>
+                <w:proofErr w:type="gramEnd"/>
                 <w:r>
                   <w:t>PhpStorm</w:t>
                 </w:r>
+                <w:proofErr w:type="spellEnd"/>
                 <w:r>
                   <w:t>)</w:t>
                 </w:r>
@@ -6825,11 +6829,16 @@
                 <w:r>
                   <w:t xml:space="preserve">Bootstrap </w:t>
                 </w:r>
+                <w:proofErr w:type="gramStart"/>
                 <w:r>
                   <w:t xml:space="preserve">5.3 </w:t>
                 </w:r>
                 <w:r>
-                  <w:t xml:space="preserve"> jQuery 3.</w:t>
+                  <w:t xml:space="preserve"> jQuery</w:t>
+                </w:r>
+                <w:proofErr w:type="gramEnd"/>
+                <w:r>
+                  <w:t xml:space="preserve"> 3.</w:t>
                 </w:r>
                 <w:r>
                   <w:t>7</w:t>
@@ -6864,8 +6873,13 @@
                 <w:tcW w:w="7477" w:type="dxa"/>
               </w:tcPr>
               <w:p>
+                <w:proofErr w:type="spellStart"/>
                 <w:r>
-                  <w:t xml:space="preserve">Mysql </w:t>
+                  <w:t>Mysql</w:t>
+                </w:r>
+                <w:proofErr w:type="spellEnd"/>
+                <w:r>
+                  <w:t xml:space="preserve"> </w:t>
                 </w:r>
                 <w:r>
                   <w:t>8.2</w:t>
@@ -6874,7 +6888,16 @@
                   <w:t xml:space="preserve"> </w:t>
                 </w:r>
                 <w:r>
-                  <w:t xml:space="preserve">– MariaDB </w:t>
+                  <w:t xml:space="preserve">– </w:t>
+                </w:r>
+                <w:proofErr w:type="spellStart"/>
+                <w:proofErr w:type="gramStart"/>
+                <w:r>
+                  <w:t>MariaDB</w:t>
+                </w:r>
+                <w:proofErr w:type="spellEnd"/>
+                <w:r>
+                  <w:t xml:space="preserve"> </w:t>
                 </w:r>
                 <w:r>
                   <w:t xml:space="preserve"> co</w:t>
@@ -6885,6 +6908,7 @@
                 <w:r>
                   <w:t>patible</w:t>
                 </w:r>
+                <w:proofErr w:type="gramEnd"/>
               </w:p>
             </w:tc>
           </w:tr>
@@ -6974,8 +6998,13 @@
               </w:tcPr>
               <w:p>
                 <w:r>
-                  <w:t>Servidor web con cpanel</w:t>
+                  <w:t xml:space="preserve">Servidor web con </w:t>
                 </w:r>
+                <w:proofErr w:type="spellStart"/>
+                <w:r>
+                  <w:t>cpanel</w:t>
+                </w:r>
+                <w:proofErr w:type="spellEnd"/>
               </w:p>
             </w:tc>
           </w:tr>
@@ -7031,8 +7060,13 @@
               </w:tcPr>
               <w:p>
                 <w:r>
-                  <w:t>Servidor web con Mysql</w:t>
+                  <w:t xml:space="preserve">Servidor web con </w:t>
                 </w:r>
+                <w:proofErr w:type="spellStart"/>
+                <w:r>
+                  <w:t>Mysql</w:t>
+                </w:r>
+                <w:proofErr w:type="spellEnd"/>
                 <w:r>
                   <w:t xml:space="preserve"> </w:t>
                 </w:r>
@@ -7055,7 +7089,15 @@
               </w:tcPr>
               <w:p>
                 <w:r>
-                  <w:t>Un usuario de acceso a Mysql independiente</w:t>
+                  <w:t xml:space="preserve">Un usuario de acceso a </w:t>
+                </w:r>
+                <w:proofErr w:type="spellStart"/>
+                <w:r>
+                  <w:t>Mysql</w:t>
+                </w:r>
+                <w:proofErr w:type="spellEnd"/>
+                <w:r>
+                  <w:t xml:space="preserve"> independiente</w:t>
                 </w:r>
                 <w:r>
                   <w:t xml:space="preserve"> y BBDD propia</w:t>
@@ -7250,9 +7292,11 @@
           <w:r>
             <w:t xml:space="preserve"> la compra del software de desarrollo </w:t>
           </w:r>
+          <w:proofErr w:type="spellStart"/>
           <w:r>
             <w:t>PHPStorm</w:t>
           </w:r>
+          <w:proofErr w:type="spellEnd"/>
           <w:r>
             <w:t xml:space="preserve"> con una licencia profesional.</w:t>
           </w:r>
@@ -8416,7 +8460,21 @@
               <w:rPr>
                 <w:b/>
               </w:rPr>
-              <w:t>Cargar la BBDD       subcaso: Gestion de errores</w:t>
+              <w:t xml:space="preserve">Cargar la BBDD       subcaso: </w:t>
+            </w:r>
+            <w:proofErr w:type="spellStart"/>
+            <w:r>
+              <w:rPr>
+                <w:b/>
+              </w:rPr>
+              <w:t>Gestion</w:t>
+            </w:r>
+            <w:proofErr w:type="spellEnd"/>
+            <w:r>
+              <w:rPr>
+                <w:b/>
+              </w:rPr>
+              <w:t xml:space="preserve"> de errores</w:t>
             </w:r>
           </w:p>
         </w:tc>
@@ -10914,7 +10972,21 @@
               <w:rPr>
                 <w:bCs/>
               </w:rPr>
-              <w:t>Se generará un fichero SQL-92 para preservar los datos. Se dará la posibilidad de exportarlos a csv también.</w:t>
+              <w:t xml:space="preserve">Se generará un fichero SQL-92 para preservar los datos. Se dará la posibilidad de exportarlos a </w:t>
+            </w:r>
+            <w:proofErr w:type="spellStart"/>
+            <w:r>
+              <w:rPr>
+                <w:bCs/>
+              </w:rPr>
+              <w:t>csv</w:t>
+            </w:r>
+            <w:proofErr w:type="spellEnd"/>
+            <w:r>
+              <w:rPr>
+                <w:bCs/>
+              </w:rPr>
+              <w:t xml:space="preserve"> también.</w:t>
             </w:r>
           </w:p>
         </w:tc>
@@ -11162,7 +11234,21 @@
               <w:rPr>
                 <w:b/>
               </w:rPr>
-              <w:t>Selección de datos  subcaso: Selección de formato</w:t>
+              <w:t xml:space="preserve">Selección de </w:t>
+            </w:r>
+            <w:proofErr w:type="gramStart"/>
+            <w:r>
+              <w:rPr>
+                <w:b/>
+              </w:rPr>
+              <w:t>datos  subcaso</w:t>
+            </w:r>
+            <w:proofErr w:type="gramEnd"/>
+            <w:r>
+              <w:rPr>
+                <w:b/>
+              </w:rPr>
+              <w:t>: Selección de formato</w:t>
             </w:r>
           </w:p>
         </w:tc>
@@ -11222,7 +11308,35 @@
               <w:rPr>
                 <w:bCs/>
               </w:rPr>
-              <w:t>Se pedirá el formato y sus características para exportar: json, csv, sql-92</w:t>
+              <w:t xml:space="preserve">Se pedirá el formato y sus características para exportar: </w:t>
+            </w:r>
+            <w:proofErr w:type="spellStart"/>
+            <w:r>
+              <w:rPr>
+                <w:bCs/>
+              </w:rPr>
+              <w:t>json</w:t>
+            </w:r>
+            <w:proofErr w:type="spellEnd"/>
+            <w:r>
+              <w:rPr>
+                <w:bCs/>
+              </w:rPr>
+              <w:t xml:space="preserve">, </w:t>
+            </w:r>
+            <w:proofErr w:type="spellStart"/>
+            <w:r>
+              <w:rPr>
+                <w:bCs/>
+              </w:rPr>
+              <w:t>csv</w:t>
+            </w:r>
+            <w:proofErr w:type="spellEnd"/>
+            <w:r>
+              <w:rPr>
+                <w:bCs/>
+              </w:rPr>
+              <w:t>, sql-92</w:t>
             </w:r>
           </w:p>
         </w:tc>
@@ -12483,10 +12597,18 @@
         <w:t xml:space="preserve">Una vez llevada a cabo la normalización, teniendo en </w:t>
       </w:r>
       <w:r>
-        <w:t>cuenta hasta la forma de Boyce-C</w:t>
-      </w:r>
-      <w:r>
-        <w:t>ood, el resultado es el siguiente:</w:t>
+        <w:t>cuenta hasta la forma de Boyce-</w:t>
+      </w:r>
+      <w:proofErr w:type="spellStart"/>
+      <w:r>
+        <w:t>C</w:t>
+      </w:r>
+      <w:r>
+        <w:t>ood</w:t>
+      </w:r>
+      <w:proofErr w:type="spellEnd"/>
+      <w:r>
+        <w:t>, el resultado es el siguiente:</w:t>
       </w:r>
     </w:p>
     <w:p>
@@ -12552,15 +12674,38 @@
       <w:r>
         <w:t xml:space="preserve">: </w:t>
       </w:r>
+      <w:proofErr w:type="spellStart"/>
       <w:r>
         <w:rPr>
           <w:u w:val="single"/>
         </w:rPr>
         <w:t>isbn</w:t>
       </w:r>
-      <w:r>
-        <w:t>, titulo, autor, numero_ejemplares, id_materia, id_curso</w:t>
-      </w:r>
+      <w:proofErr w:type="spellEnd"/>
+      <w:r>
+        <w:t xml:space="preserve">, titulo, autor, </w:t>
+      </w:r>
+      <w:proofErr w:type="spellStart"/>
+      <w:r>
+        <w:t>numero_ejemplares</w:t>
+      </w:r>
+      <w:proofErr w:type="spellEnd"/>
+      <w:r>
+        <w:t xml:space="preserve">, </w:t>
+      </w:r>
+      <w:proofErr w:type="spellStart"/>
+      <w:r>
+        <w:t>id_materia</w:t>
+      </w:r>
+      <w:proofErr w:type="spellEnd"/>
+      <w:r>
+        <w:t xml:space="preserve">, </w:t>
+      </w:r>
+      <w:proofErr w:type="spellStart"/>
+      <w:r>
+        <w:t>id_curso</w:t>
+      </w:r>
+      <w:proofErr w:type="spellEnd"/>
     </w:p>
     <w:p>
       <w:pPr>
@@ -12590,6 +12735,7 @@
       <w:pPr>
         <w:ind w:left="567"/>
       </w:pPr>
+      <w:proofErr w:type="spellStart"/>
       <w:r>
         <w:rPr>
           <w:b/>
@@ -12597,17 +12743,72 @@
         </w:rPr>
         <w:t>AlumnosCursosLibros</w:t>
       </w:r>
+      <w:proofErr w:type="spellEnd"/>
       <w:r>
         <w:t xml:space="preserve">: </w:t>
       </w:r>
+      <w:proofErr w:type="spellStart"/>
       <w:r>
         <w:rPr>
           <w:u w:val="single"/>
         </w:rPr>
-        <w:t>isbn, id_alumno, id_curso</w:t>
-      </w:r>
-      <w:r>
-        <w:t>, fecha_entrega, fecha_devolucion, estado (entregado, por_devolver)</w:t>
+        <w:t>isbn</w:t>
+      </w:r>
+      <w:proofErr w:type="spellEnd"/>
+      <w:r>
+        <w:rPr>
+          <w:u w:val="single"/>
+        </w:rPr>
+        <w:t xml:space="preserve">, </w:t>
+      </w:r>
+      <w:proofErr w:type="spellStart"/>
+      <w:r>
+        <w:rPr>
+          <w:u w:val="single"/>
+        </w:rPr>
+        <w:t>id_alumno</w:t>
+      </w:r>
+      <w:proofErr w:type="spellEnd"/>
+      <w:r>
+        <w:rPr>
+          <w:u w:val="single"/>
+        </w:rPr>
+        <w:t xml:space="preserve">, </w:t>
+      </w:r>
+      <w:proofErr w:type="spellStart"/>
+      <w:r>
+        <w:rPr>
+          <w:u w:val="single"/>
+        </w:rPr>
+        <w:t>id_curso</w:t>
+      </w:r>
+      <w:proofErr w:type="spellEnd"/>
+      <w:r>
+        <w:t xml:space="preserve">, </w:t>
+      </w:r>
+      <w:proofErr w:type="spellStart"/>
+      <w:r>
+        <w:t>fecha_entrega</w:t>
+      </w:r>
+      <w:proofErr w:type="spellEnd"/>
+      <w:r>
+        <w:t xml:space="preserve">, </w:t>
+      </w:r>
+      <w:proofErr w:type="spellStart"/>
+      <w:r>
+        <w:t>fecha_devolucion</w:t>
+      </w:r>
+      <w:proofErr w:type="spellEnd"/>
+      <w:r>
+        <w:t xml:space="preserve">, estado (entregado, </w:t>
+      </w:r>
+      <w:proofErr w:type="spellStart"/>
+      <w:r>
+        <w:t>por_devolver</w:t>
+      </w:r>
+      <w:proofErr w:type="spellEnd"/>
+      <w:r>
+        <w:t>)</w:t>
       </w:r>
     </w:p>
     <w:p>
@@ -13840,8 +14041,19 @@
                 <w:sz w:val="16"/>
                 <w:szCs w:val="16"/>
               </w:rPr>
-              <w:t>Letra del niev</w:t>
-            </w:r>
+              <w:t xml:space="preserve">Letra del </w:t>
+            </w:r>
+            <w:proofErr w:type="spellStart"/>
+            <w:r>
+              <w:rPr>
+                <w:rFonts w:cstheme="minorHAnsi"/>
+                <w:b/>
+                <w:sz w:val="16"/>
+                <w:szCs w:val="16"/>
+              </w:rPr>
+              <w:t>niev</w:t>
+            </w:r>
+            <w:proofErr w:type="spellEnd"/>
           </w:p>
         </w:tc>
       </w:tr>
@@ -14008,8 +14220,19 @@
                 <w:sz w:val="16"/>
                 <w:szCs w:val="16"/>
               </w:rPr>
-              <w:t>1ºeso, 2eso….</w:t>
-            </w:r>
+              <w:t>1ºeso, 2</w:t>
+            </w:r>
+            <w:proofErr w:type="gramStart"/>
+            <w:r>
+              <w:rPr>
+                <w:rFonts w:cstheme="minorHAnsi"/>
+                <w:b/>
+                <w:sz w:val="16"/>
+                <w:szCs w:val="16"/>
+              </w:rPr>
+              <w:t>eso….</w:t>
+            </w:r>
+            <w:proofErr w:type="gramEnd"/>
           </w:p>
         </w:tc>
       </w:tr>
@@ -14277,6 +14500,7 @@
                 <w:szCs w:val="16"/>
               </w:rPr>
             </w:pPr>
+            <w:proofErr w:type="spellStart"/>
             <w:r>
               <w:rPr>
                 <w:rFonts w:cstheme="minorHAnsi"/>
@@ -14286,6 +14510,7 @@
               </w:rPr>
               <w:t>isbn</w:t>
             </w:r>
+            <w:proofErr w:type="spellEnd"/>
           </w:p>
         </w:tc>
         <w:tc>
@@ -14435,8 +14660,19 @@
                 <w:sz w:val="16"/>
                 <w:szCs w:val="16"/>
               </w:rPr>
-              <w:t>Validar formato isbn</w:t>
-            </w:r>
+              <w:t xml:space="preserve">Validar formato </w:t>
+            </w:r>
+            <w:proofErr w:type="spellStart"/>
+            <w:r>
+              <w:rPr>
+                <w:rFonts w:cstheme="minorHAnsi"/>
+                <w:b/>
+                <w:sz w:val="16"/>
+                <w:szCs w:val="16"/>
+              </w:rPr>
+              <w:t>isbn</w:t>
+            </w:r>
+            <w:proofErr w:type="spellEnd"/>
           </w:p>
         </w:tc>
       </w:tr>
@@ -14759,6 +14995,7 @@
                 <w:szCs w:val="16"/>
               </w:rPr>
             </w:pPr>
+            <w:proofErr w:type="spellStart"/>
             <w:r>
               <w:rPr>
                 <w:rFonts w:cstheme="minorHAnsi"/>
@@ -14768,6 +15005,7 @@
               </w:rPr>
               <w:t>numero_ejemplares</w:t>
             </w:r>
+            <w:proofErr w:type="spellEnd"/>
           </w:p>
         </w:tc>
         <w:tc>
@@ -14918,6 +15156,7 @@
                 <w:szCs w:val="16"/>
               </w:rPr>
             </w:pPr>
+            <w:proofErr w:type="spellStart"/>
             <w:r>
               <w:rPr>
                 <w:rFonts w:cstheme="minorHAnsi"/>
@@ -14927,6 +15166,7 @@
               </w:rPr>
               <w:t>id_materia</w:t>
             </w:r>
+            <w:proofErr w:type="spellEnd"/>
           </w:p>
         </w:tc>
         <w:tc>
@@ -15095,6 +15335,7 @@
                 <w:szCs w:val="16"/>
               </w:rPr>
             </w:pPr>
+            <w:proofErr w:type="spellStart"/>
             <w:r>
               <w:rPr>
                 <w:rFonts w:cstheme="minorHAnsi"/>
@@ -15104,6 +15345,7 @@
               </w:rPr>
               <w:t>id_curso</w:t>
             </w:r>
+            <w:proofErr w:type="spellEnd"/>
           </w:p>
         </w:tc>
         <w:tc>
@@ -16201,7 +16443,27 @@
                 <w:sz w:val="16"/>
                 <w:szCs w:val="16"/>
               </w:rPr>
-              <w:t>0, I, II  (0 para no beca, tramo I y II)</w:t>
+              <w:t xml:space="preserve">0, I, </w:t>
+            </w:r>
+            <w:proofErr w:type="gramStart"/>
+            <w:r>
+              <w:rPr>
+                <w:rFonts w:cstheme="minorHAnsi"/>
+                <w:b/>
+                <w:sz w:val="16"/>
+                <w:szCs w:val="16"/>
+              </w:rPr>
+              <w:t>II  (</w:t>
+            </w:r>
+            <w:proofErr w:type="gramEnd"/>
+            <w:r>
+              <w:rPr>
+                <w:rFonts w:cstheme="minorHAnsi"/>
+                <w:b/>
+                <w:sz w:val="16"/>
+                <w:szCs w:val="16"/>
+              </w:rPr>
+              <w:t>0 para no beca, tramo I y II)</w:t>
             </w:r>
           </w:p>
         </w:tc>
@@ -16220,6 +16482,7 @@
                 <w:szCs w:val="16"/>
               </w:rPr>
             </w:pPr>
+            <w:proofErr w:type="spellStart"/>
             <w:r>
               <w:rPr>
                 <w:rFonts w:cstheme="minorHAnsi"/>
@@ -16229,6 +16492,7 @@
               </w:rPr>
               <w:t>bilingue</w:t>
             </w:r>
+            <w:proofErr w:type="spellEnd"/>
           </w:p>
         </w:tc>
         <w:tc>
@@ -16400,6 +16664,7 @@
                 <w:szCs w:val="16"/>
               </w:rPr>
             </w:pPr>
+            <w:proofErr w:type="spellStart"/>
             <w:r>
               <w:rPr>
                 <w:rFonts w:cstheme="minorHAnsi"/>
@@ -16409,6 +16674,7 @@
               </w:rPr>
               <w:t>alumnoscursoslibros</w:t>
             </w:r>
+            <w:proofErr w:type="spellEnd"/>
           </w:p>
         </w:tc>
       </w:tr>
@@ -17010,6 +17276,7 @@
                 <w:szCs w:val="16"/>
               </w:rPr>
             </w:pPr>
+            <w:proofErr w:type="spellStart"/>
             <w:r>
               <w:rPr>
                 <w:rFonts w:cstheme="minorHAnsi"/>
@@ -17019,6 +17286,7 @@
               </w:rPr>
               <w:t>isbn</w:t>
             </w:r>
+            <w:proofErr w:type="spellEnd"/>
           </w:p>
         </w:tc>
         <w:tc>
@@ -17196,6 +17464,7 @@
                 <w:szCs w:val="16"/>
               </w:rPr>
             </w:pPr>
+            <w:proofErr w:type="spellStart"/>
             <w:r>
               <w:rPr>
                 <w:rFonts w:cstheme="minorHAnsi"/>
@@ -17214,6 +17483,7 @@
               </w:rPr>
               <w:t>echa_entrega</w:t>
             </w:r>
+            <w:proofErr w:type="spellEnd"/>
           </w:p>
         </w:tc>
         <w:tc>
@@ -17364,6 +17634,7 @@
                 <w:szCs w:val="16"/>
               </w:rPr>
             </w:pPr>
+            <w:proofErr w:type="spellStart"/>
             <w:r>
               <w:rPr>
                 <w:rFonts w:cstheme="minorHAnsi"/>
@@ -17400,6 +17671,7 @@
               </w:rPr>
               <w:t>evolución</w:t>
             </w:r>
+            <w:proofErr w:type="spellEnd"/>
           </w:p>
         </w:tc>
         <w:tc>
@@ -17672,8 +17944,19 @@
                 <w:sz w:val="16"/>
                 <w:szCs w:val="16"/>
               </w:rPr>
-              <w:t>P: Prestado, D:Devuelto</w:t>
-            </w:r>
+              <w:t xml:space="preserve">P: Prestado, </w:t>
+            </w:r>
+            <w:proofErr w:type="gramStart"/>
+            <w:r>
+              <w:rPr>
+                <w:rFonts w:cstheme="minorHAnsi"/>
+                <w:b/>
+                <w:sz w:val="16"/>
+                <w:szCs w:val="16"/>
+              </w:rPr>
+              <w:t>D:Devuelto</w:t>
+            </w:r>
+            <w:proofErr w:type="gramEnd"/>
           </w:p>
         </w:tc>
       </w:tr>
@@ -18047,23 +18330,34 @@
       <w:r>
         <w:t xml:space="preserve">almacenará los contratos que se van a generar por el sistema para su firma y el directorio </w:t>
       </w:r>
+      <w:proofErr w:type="spellStart"/>
       <w:r>
         <w:rPr>
           <w:b/>
           <w:bCs/>
         </w:rPr>
-        <w:t xml:space="preserve">copias_de_seguridad </w:t>
-      </w:r>
-      <w:r>
-        <w:t xml:space="preserve">que es donde almacenaremos las copias de seguridad que se generan para poder proteger la información. Y por último tenemos el directorio </w:t>
-      </w:r>
+        <w:t>copias_de_seguridad</w:t>
+      </w:r>
+      <w:proofErr w:type="spellEnd"/>
       <w:r>
         <w:rPr>
           <w:b/>
           <w:bCs/>
         </w:rPr>
+        <w:t xml:space="preserve"> </w:t>
+      </w:r>
+      <w:r>
+        <w:t xml:space="preserve">que es donde almacenaremos las copias de seguridad que se generan para poder proteger la información. Y por último tenemos el directorio </w:t>
+      </w:r>
+      <w:proofErr w:type="spellStart"/>
+      <w:r>
+        <w:rPr>
+          <w:b/>
+          <w:bCs/>
+        </w:rPr>
         <w:t>base_de_datos</w:t>
       </w:r>
+      <w:proofErr w:type="spellEnd"/>
       <w:r>
         <w:t xml:space="preserve"> que contendrá los archivos que son necesarios para poder conectar la aplicación con la base de datos.</w:t>
       </w:r>
@@ -18153,7 +18447,23 @@
     </w:p>
     <w:p>
       <w:r>
-        <w:t>El siguiente diagrama va a representar la estructura de clases que va a utilizar la aplicación para poder acceder y poder gestionar la información almacenada en la base de datos. La relación entre las clases va a permitir controlar la gestión de los préstamos las devoluciones, los cursos  y los libros que están asignados a cada alumno. El diagrama de clases se ha realizado teniendo en cuenta las relaciones existentes entre las distintas tablas del modelo relacional que se desarrollo anteriormente.</w:t>
+        <w:t xml:space="preserve">El siguiente diagrama va a representar la estructura de clases que va a utilizar la aplicación para poder acceder y poder gestionar la información almacenada en la base de datos. La relación entre las clases va a permitir controlar la gestión de los préstamos las devoluciones, los </w:t>
+      </w:r>
+      <w:proofErr w:type="gramStart"/>
+      <w:r>
+        <w:t>cursos  y</w:t>
+      </w:r>
+      <w:proofErr w:type="gramEnd"/>
+      <w:r>
+        <w:t xml:space="preserve"> los libros que están asignados a cada alumno. El diagrama de clases se ha realizado teniendo en cuenta las relaciones existentes entre las distintas tablas del modelo relacional que se </w:t>
+      </w:r>
+      <w:proofErr w:type="spellStart"/>
+      <w:r>
+        <w:t>desarrollo</w:t>
+      </w:r>
+      <w:proofErr w:type="spellEnd"/>
+      <w:r>
+        <w:t xml:space="preserve"> anteriormente.</w:t>
       </w:r>
     </w:p>
     <w:p>
@@ -18242,19 +18552,56 @@
       </w:r>
     </w:p>
     <w:p>
-      <w:pPr>
+      <w:r>
         <w:rPr>
           <w:color w:val="FF0000"/>
         </w:rPr>
-      </w:pPr>
-      <w:r>
-        <w:rPr>
-          <w:color w:val="FF0000"/>
-        </w:rPr>
-        <w:t>Rellenar con un gráfico de ventanas</w:t>
+        <w:drawing>
+          <wp:inline distT="0" distB="0" distL="0" distR="0" wp14:anchorId="14057C45" wp14:editId="05974DEE">
+            <wp:extent cx="6371590" cy="1303655"/>
+            <wp:effectExtent l="0" t="0" r="0" b="0"/>
+            <wp:docPr id="801986488" name="Imagen 1"/>
+            <wp:cNvGraphicFramePr>
+              <a:graphicFrameLocks xmlns:a="http://schemas.openxmlformats.org/drawingml/2006/main" noChangeAspect="1"/>
+            </wp:cNvGraphicFramePr>
+            <a:graphic xmlns:a="http://schemas.openxmlformats.org/drawingml/2006/main">
+              <a:graphicData uri="http://schemas.openxmlformats.org/drawingml/2006/picture">
+                <pic:pic xmlns:pic="http://schemas.openxmlformats.org/drawingml/2006/picture">
+                  <pic:nvPicPr>
+                    <pic:cNvPr id="801986488" name=""/>
+                    <pic:cNvPicPr/>
+                  </pic:nvPicPr>
+                  <pic:blipFill>
+                    <a:blip r:embed="rId39"/>
+                    <a:stretch>
+                      <a:fillRect/>
+                    </a:stretch>
+                  </pic:blipFill>
+                  <pic:spPr>
+                    <a:xfrm>
+                      <a:off x="0" y="0"/>
+                      <a:ext cx="6371590" cy="1303655"/>
+                    </a:xfrm>
+                    <a:prstGeom prst="rect">
+                      <a:avLst/>
+                    </a:prstGeom>
+                  </pic:spPr>
+                </pic:pic>
+              </a:graphicData>
+            </a:graphic>
+          </wp:inline>
+        </w:drawing>
       </w:r>
     </w:p>
     <w:p/>
+    <w:p/>
+    <w:p/>
+    <w:p>
+      <w:r>
+        <w:lastRenderedPageBreak/>
+        <w:t>Registro del alumno</w:t>
+      </w:r>
+    </w:p>
     <w:p>
       <w:pPr>
         <w:pStyle w:val="Ttulo3"/>
@@ -18262,6 +18609,131 @@
       <w:bookmarkStart w:id="138" w:name="_Toc49341841"/>
       <w:bookmarkStart w:id="139" w:name="_Toc170148365"/>
       <w:bookmarkStart w:id="140" w:name="_Toc170148680"/>
+      <w:r>
+        <w:drawing>
+          <wp:inline distT="0" distB="0" distL="0" distR="0" wp14:anchorId="756A0549" wp14:editId="2BE9CD57">
+            <wp:extent cx="2621280" cy="2935458"/>
+            <wp:effectExtent l="0" t="0" r="7620" b="0"/>
+            <wp:docPr id="1473449446" name="Imagen 1"/>
+            <wp:cNvGraphicFramePr>
+              <a:graphicFrameLocks xmlns:a="http://schemas.openxmlformats.org/drawingml/2006/main" noChangeAspect="1"/>
+            </wp:cNvGraphicFramePr>
+            <a:graphic xmlns:a="http://schemas.openxmlformats.org/drawingml/2006/main">
+              <a:graphicData uri="http://schemas.openxmlformats.org/drawingml/2006/picture">
+                <pic:pic xmlns:pic="http://schemas.openxmlformats.org/drawingml/2006/picture">
+                  <pic:nvPicPr>
+                    <pic:cNvPr id="1473449446" name=""/>
+                    <pic:cNvPicPr/>
+                  </pic:nvPicPr>
+                  <pic:blipFill>
+                    <a:blip r:embed="rId40"/>
+                    <a:stretch>
+                      <a:fillRect/>
+                    </a:stretch>
+                  </pic:blipFill>
+                  <pic:spPr>
+                    <a:xfrm>
+                      <a:off x="0" y="0"/>
+                      <a:ext cx="2628492" cy="2943534"/>
+                    </a:xfrm>
+                    <a:prstGeom prst="rect">
+                      <a:avLst/>
+                    </a:prstGeom>
+                  </pic:spPr>
+                </pic:pic>
+              </a:graphicData>
+            </a:graphic>
+          </wp:inline>
+        </w:drawing>
+      </w:r>
+    </w:p>
+    <w:p>
+      <w:r>
+        <w:t>Login</w:t>
+      </w:r>
+    </w:p>
+    <w:p>
+      <w:r>
+        <w:drawing>
+          <wp:inline distT="0" distB="0" distL="0" distR="0" wp14:anchorId="3F3AA855" wp14:editId="7A7D9A65">
+            <wp:extent cx="6811560" cy="1897380"/>
+            <wp:effectExtent l="0" t="0" r="8890" b="7620"/>
+            <wp:docPr id="1508791349" name="Imagen 1"/>
+            <wp:cNvGraphicFramePr>
+              <a:graphicFrameLocks xmlns:a="http://schemas.openxmlformats.org/drawingml/2006/main" noChangeAspect="1"/>
+            </wp:cNvGraphicFramePr>
+            <a:graphic xmlns:a="http://schemas.openxmlformats.org/drawingml/2006/main">
+              <a:graphicData uri="http://schemas.openxmlformats.org/drawingml/2006/picture">
+                <pic:pic xmlns:pic="http://schemas.openxmlformats.org/drawingml/2006/picture">
+                  <pic:nvPicPr>
+                    <pic:cNvPr id="1508791349" name=""/>
+                    <pic:cNvPicPr/>
+                  </pic:nvPicPr>
+                  <pic:blipFill>
+                    <a:blip r:embed="rId41"/>
+                    <a:stretch>
+                      <a:fillRect/>
+                    </a:stretch>
+                  </pic:blipFill>
+                  <pic:spPr>
+                    <a:xfrm>
+                      <a:off x="0" y="0"/>
+                      <a:ext cx="6823057" cy="1900583"/>
+                    </a:xfrm>
+                    <a:prstGeom prst="rect">
+                      <a:avLst/>
+                    </a:prstGeom>
+                  </pic:spPr>
+                </pic:pic>
+              </a:graphicData>
+            </a:graphic>
+          </wp:inline>
+        </w:drawing>
+      </w:r>
+    </w:p>
+    <w:p>
+      <w:r>
+        <w:drawing>
+          <wp:inline distT="0" distB="0" distL="0" distR="0" wp14:anchorId="3D3DFD2C" wp14:editId="3BB3F233">
+            <wp:extent cx="6815435" cy="2057400"/>
+            <wp:effectExtent l="0" t="0" r="5080" b="0"/>
+            <wp:docPr id="1171415245" name="Imagen 1"/>
+            <wp:cNvGraphicFramePr>
+              <a:graphicFrameLocks xmlns:a="http://schemas.openxmlformats.org/drawingml/2006/main" noChangeAspect="1"/>
+            </wp:cNvGraphicFramePr>
+            <a:graphic xmlns:a="http://schemas.openxmlformats.org/drawingml/2006/main">
+              <a:graphicData uri="http://schemas.openxmlformats.org/drawingml/2006/picture">
+                <pic:pic xmlns:pic="http://schemas.openxmlformats.org/drawingml/2006/picture">
+                  <pic:nvPicPr>
+                    <pic:cNvPr id="1171415245" name=""/>
+                    <pic:cNvPicPr/>
+                  </pic:nvPicPr>
+                  <pic:blipFill>
+                    <a:blip r:embed="rId42"/>
+                    <a:stretch>
+                      <a:fillRect/>
+                    </a:stretch>
+                  </pic:blipFill>
+                  <pic:spPr>
+                    <a:xfrm>
+                      <a:off x="0" y="0"/>
+                      <a:ext cx="6822955" cy="2059670"/>
+                    </a:xfrm>
+                    <a:prstGeom prst="rect">
+                      <a:avLst/>
+                    </a:prstGeom>
+                  </pic:spPr>
+                </pic:pic>
+              </a:graphicData>
+            </a:graphic>
+          </wp:inline>
+        </w:drawing>
+      </w:r>
+    </w:p>
+    <w:p>
+      <w:pPr>
+        <w:pStyle w:val="Ttulo3"/>
+      </w:pPr>
       <w:r>
         <w:lastRenderedPageBreak/>
         <w:t>Diseño de las ventanas</w:t>
@@ -18271,12 +18743,130 @@
       <w:bookmarkEnd w:id="140"/>
     </w:p>
     <w:p>
+      <w:r>
+        <w:drawing>
+          <wp:inline distT="0" distB="0" distL="0" distR="0" wp14:anchorId="0FB04EDF" wp14:editId="10444100">
+            <wp:extent cx="4259580" cy="2418460"/>
+            <wp:effectExtent l="0" t="0" r="7620" b="1270"/>
+            <wp:docPr id="1904496865" name="Imagen 1"/>
+            <wp:cNvGraphicFramePr>
+              <a:graphicFrameLocks xmlns:a="http://schemas.openxmlformats.org/drawingml/2006/main" noChangeAspect="1"/>
+            </wp:cNvGraphicFramePr>
+            <a:graphic xmlns:a="http://schemas.openxmlformats.org/drawingml/2006/main">
+              <a:graphicData uri="http://schemas.openxmlformats.org/drawingml/2006/picture">
+                <pic:pic xmlns:pic="http://schemas.openxmlformats.org/drawingml/2006/picture">
+                  <pic:nvPicPr>
+                    <pic:cNvPr id="1904496865" name=""/>
+                    <pic:cNvPicPr/>
+                  </pic:nvPicPr>
+                  <pic:blipFill>
+                    <a:blip r:embed="rId43"/>
+                    <a:stretch>
+                      <a:fillRect/>
+                    </a:stretch>
+                  </pic:blipFill>
+                  <pic:spPr>
+                    <a:xfrm>
+                      <a:off x="0" y="0"/>
+                      <a:ext cx="4273762" cy="2426512"/>
+                    </a:xfrm>
+                    <a:prstGeom prst="rect">
+                      <a:avLst/>
+                    </a:prstGeom>
+                  </pic:spPr>
+                </pic:pic>
+              </a:graphicData>
+            </a:graphic>
+          </wp:inline>
+        </w:drawing>
+      </w:r>
+    </w:p>
+    <w:p>
+      <w:r>
+        <w:drawing>
+          <wp:inline distT="0" distB="0" distL="0" distR="0" wp14:anchorId="372F27C2" wp14:editId="4D39615A">
+            <wp:extent cx="4259580" cy="2325916"/>
+            <wp:effectExtent l="0" t="0" r="7620" b="0"/>
+            <wp:docPr id="1842174928" name="Imagen 1"/>
+            <wp:cNvGraphicFramePr>
+              <a:graphicFrameLocks xmlns:a="http://schemas.openxmlformats.org/drawingml/2006/main" noChangeAspect="1"/>
+            </wp:cNvGraphicFramePr>
+            <a:graphic xmlns:a="http://schemas.openxmlformats.org/drawingml/2006/main">
+              <a:graphicData uri="http://schemas.openxmlformats.org/drawingml/2006/picture">
+                <pic:pic xmlns:pic="http://schemas.openxmlformats.org/drawingml/2006/picture">
+                  <pic:nvPicPr>
+                    <pic:cNvPr id="1842174928" name=""/>
+                    <pic:cNvPicPr/>
+                  </pic:nvPicPr>
+                  <pic:blipFill>
+                    <a:blip r:embed="rId44"/>
+                    <a:stretch>
+                      <a:fillRect/>
+                    </a:stretch>
+                  </pic:blipFill>
+                  <pic:spPr>
+                    <a:xfrm>
+                      <a:off x="0" y="0"/>
+                      <a:ext cx="4271820" cy="2332600"/>
+                    </a:xfrm>
+                    <a:prstGeom prst="rect">
+                      <a:avLst/>
+                    </a:prstGeom>
+                  </pic:spPr>
+                </pic:pic>
+              </a:graphicData>
+            </a:graphic>
+          </wp:inline>
+        </w:drawing>
+      </w:r>
+    </w:p>
+    <w:p>
+      <w:r>
+        <w:drawing>
+          <wp:inline distT="0" distB="0" distL="0" distR="0" wp14:anchorId="095952B9" wp14:editId="1A01FFC1">
+            <wp:extent cx="4249040" cy="2631830"/>
+            <wp:effectExtent l="0" t="0" r="0" b="0"/>
+            <wp:docPr id="1083859307" name="Imagen 1"/>
+            <wp:cNvGraphicFramePr>
+              <a:graphicFrameLocks xmlns:a="http://schemas.openxmlformats.org/drawingml/2006/main" noChangeAspect="1"/>
+            </wp:cNvGraphicFramePr>
+            <a:graphic xmlns:a="http://schemas.openxmlformats.org/drawingml/2006/main">
+              <a:graphicData uri="http://schemas.openxmlformats.org/drawingml/2006/picture">
+                <pic:pic xmlns:pic="http://schemas.openxmlformats.org/drawingml/2006/picture">
+                  <pic:nvPicPr>
+                    <pic:cNvPr id="1083859307" name=""/>
+                    <pic:cNvPicPr/>
+                  </pic:nvPicPr>
+                  <pic:blipFill>
+                    <a:blip r:embed="rId45"/>
+                    <a:stretch>
+                      <a:fillRect/>
+                    </a:stretch>
+                  </pic:blipFill>
+                  <pic:spPr>
+                    <a:xfrm>
+                      <a:off x="0" y="0"/>
+                      <a:ext cx="4259675" cy="2638417"/>
+                    </a:xfrm>
+                    <a:prstGeom prst="rect">
+                      <a:avLst/>
+                    </a:prstGeom>
+                  </pic:spPr>
+                </pic:pic>
+              </a:graphicData>
+            </a:graphic>
+          </wp:inline>
+        </w:drawing>
+      </w:r>
+    </w:p>
+    <w:p>
       <w:pPr>
         <w:pStyle w:val="Ttulo4"/>
       </w:pPr>
       <w:bookmarkStart w:id="141" w:name="_Toc49341843"/>
       <w:bookmarkStart w:id="142" w:name="_Toc170148366"/>
       <w:r>
+        <w:lastRenderedPageBreak/>
         <w:t xml:space="preserve">Ventana </w:t>
       </w:r>
       <w:bookmarkEnd w:id="141"/>
@@ -18453,7 +19043,7 @@
                     </pic:cNvPicPr>
                   </pic:nvPicPr>
                   <pic:blipFill>
-                    <a:blip r:embed="rId39" cstate="print">
+                    <a:blip r:embed="rId46" cstate="print">
                       <a:extLst>
                         <a:ext uri="{28A0092B-C50C-407E-A947-70E740481C1C}">
                           <a14:useLocalDpi xmlns:a14="http://schemas.microsoft.com/office/drawing/2010/main" val="0"/>
@@ -18576,9 +19166,14 @@
       <w:bookmarkStart w:id="150" w:name="_Toc49341858"/>
       <w:bookmarkStart w:id="151" w:name="_Toc170148368"/>
       <w:bookmarkStart w:id="152" w:name="_Toc170148682"/>
+      <w:proofErr w:type="spellStart"/>
       <w:r>
         <w:lastRenderedPageBreak/>
-        <w:t>Sql de creación (MySQL)</w:t>
+        <w:t>Sql</w:t>
+      </w:r>
+      <w:proofErr w:type="spellEnd"/>
+      <w:r>
+        <w:t xml:space="preserve"> de creación (MySQL)</w:t>
       </w:r>
       <w:bookmarkEnd w:id="147"/>
       <w:bookmarkEnd w:id="148"/>
@@ -18653,7 +19248,21 @@
         <w:rPr>
           <w:lang w:val="en-GB"/>
         </w:rPr>
-        <w:t>-- Servidor: 127.0.0.1</w:t>
+        <w:t xml:space="preserve">-- </w:t>
+      </w:r>
+      <w:proofErr w:type="spellStart"/>
+      <w:r>
+        <w:rPr>
+          <w:lang w:val="en-GB"/>
+        </w:rPr>
+        <w:t>Servidor</w:t>
+      </w:r>
+      <w:proofErr w:type="spellEnd"/>
+      <w:r>
+        <w:rPr>
+          <w:lang w:val="en-GB"/>
+        </w:rPr>
+        <w:t>: 127.0.0.1</w:t>
       </w:r>
     </w:p>
     <w:p>
@@ -18666,7 +19275,21 @@
         <w:rPr>
           <w:lang w:val="en-GB"/>
         </w:rPr>
-        <w:t>-- Tiempo de generación: 24-06-2024 a las 18:56:50</w:t>
+        <w:t xml:space="preserve">-- Tiempo de </w:t>
+      </w:r>
+      <w:proofErr w:type="spellStart"/>
+      <w:r>
+        <w:rPr>
+          <w:lang w:val="en-GB"/>
+        </w:rPr>
+        <w:t>generación</w:t>
+      </w:r>
+      <w:proofErr w:type="spellEnd"/>
+      <w:r>
+        <w:rPr>
+          <w:lang w:val="en-GB"/>
+        </w:rPr>
+        <w:t>: 24-06-2024 a las 18:56:50</w:t>
       </w:r>
     </w:p>
     <w:p>
@@ -18679,7 +19302,35 @@
         <w:rPr>
           <w:lang w:val="en-GB"/>
         </w:rPr>
-        <w:t>-- Versión del servidor: 10.4.27-MariaDB</w:t>
+        <w:t xml:space="preserve">-- </w:t>
+      </w:r>
+      <w:proofErr w:type="spellStart"/>
+      <w:r>
+        <w:rPr>
+          <w:lang w:val="en-GB"/>
+        </w:rPr>
+        <w:t>Versión</w:t>
+      </w:r>
+      <w:proofErr w:type="spellEnd"/>
+      <w:r>
+        <w:rPr>
+          <w:lang w:val="en-GB"/>
+        </w:rPr>
+        <w:t xml:space="preserve"> del </w:t>
+      </w:r>
+      <w:proofErr w:type="spellStart"/>
+      <w:r>
+        <w:rPr>
+          <w:lang w:val="en-GB"/>
+        </w:rPr>
+        <w:t>servidor</w:t>
+      </w:r>
+      <w:proofErr w:type="spellEnd"/>
+      <w:r>
+        <w:rPr>
+          <w:lang w:val="en-GB"/>
+        </w:rPr>
+        <w:t>: 10.4.27-MariaDB</w:t>
       </w:r>
     </w:p>
     <w:p>
@@ -18692,7 +19343,21 @@
         <w:rPr>
           <w:lang w:val="en-GB"/>
         </w:rPr>
-        <w:t>-- Versión de PHP: 8.2.0</w:t>
+        <w:t xml:space="preserve">-- </w:t>
+      </w:r>
+      <w:proofErr w:type="spellStart"/>
+      <w:r>
+        <w:rPr>
+          <w:lang w:val="en-GB"/>
+        </w:rPr>
+        <w:t>Versión</w:t>
+      </w:r>
+      <w:proofErr w:type="spellEnd"/>
+      <w:r>
+        <w:rPr>
+          <w:lang w:val="en-GB"/>
+        </w:rPr>
+        <w:t xml:space="preserve"> de PHP: 8.2.0</w:t>
       </w:r>
     </w:p>
     <w:p>
@@ -18738,7 +19403,21 @@
         <w:rPr>
           <w:lang w:val="en-GB"/>
         </w:rPr>
-        <w:t>SET time_zone = "+00:00";</w:t>
+        <w:t xml:space="preserve">SET </w:t>
+      </w:r>
+      <w:proofErr w:type="spellStart"/>
+      <w:r>
+        <w:rPr>
+          <w:lang w:val="en-GB"/>
+        </w:rPr>
+        <w:t>time_zone</w:t>
+      </w:r>
+      <w:proofErr w:type="spellEnd"/>
+      <w:r>
+        <w:rPr>
+          <w:lang w:val="en-GB"/>
+        </w:rPr>
+        <w:t xml:space="preserve"> = "+00:00";</w:t>
       </w:r>
     </w:p>
     <w:p>
@@ -18830,7 +19509,35 @@
         <w:rPr>
           <w:lang w:val="en-GB"/>
         </w:rPr>
-        <w:t>-- Base de datos: `bancolibros`</w:t>
+        <w:t xml:space="preserve">-- Base de </w:t>
+      </w:r>
+      <w:proofErr w:type="spellStart"/>
+      <w:r>
+        <w:rPr>
+          <w:lang w:val="en-GB"/>
+        </w:rPr>
+        <w:t>datos</w:t>
+      </w:r>
+      <w:proofErr w:type="spellEnd"/>
+      <w:r>
+        <w:rPr>
+          <w:lang w:val="en-GB"/>
+        </w:rPr>
+        <w:t>: `</w:t>
+      </w:r>
+      <w:proofErr w:type="spellStart"/>
+      <w:r>
+        <w:rPr>
+          <w:lang w:val="en-GB"/>
+        </w:rPr>
+        <w:t>bancolibros</w:t>
+      </w:r>
+      <w:proofErr w:type="spellEnd"/>
+      <w:r>
+        <w:rPr>
+          <w:lang w:val="en-GB"/>
+        </w:rPr>
+        <w:t>`</w:t>
       </w:r>
     </w:p>
     <w:p>
@@ -18882,7 +19589,63 @@
         <w:rPr>
           <w:lang w:val="en-GB"/>
         </w:rPr>
-        <w:t>-- Estructura de tabla para la tabla `alumnos`</w:t>
+        <w:t xml:space="preserve">-- </w:t>
+      </w:r>
+      <w:proofErr w:type="spellStart"/>
+      <w:r>
+        <w:rPr>
+          <w:lang w:val="en-GB"/>
+        </w:rPr>
+        <w:t>Estructura</w:t>
+      </w:r>
+      <w:proofErr w:type="spellEnd"/>
+      <w:r>
+        <w:rPr>
+          <w:lang w:val="en-GB"/>
+        </w:rPr>
+        <w:t xml:space="preserve"> de </w:t>
+      </w:r>
+      <w:proofErr w:type="spellStart"/>
+      <w:r>
+        <w:rPr>
+          <w:lang w:val="en-GB"/>
+        </w:rPr>
+        <w:t>tabla</w:t>
+      </w:r>
+      <w:proofErr w:type="spellEnd"/>
+      <w:r>
+        <w:rPr>
+          <w:lang w:val="en-GB"/>
+        </w:rPr>
+        <w:t xml:space="preserve"> para la </w:t>
+      </w:r>
+      <w:proofErr w:type="spellStart"/>
+      <w:r>
+        <w:rPr>
+          <w:lang w:val="en-GB"/>
+        </w:rPr>
+        <w:t>tabla</w:t>
+      </w:r>
+      <w:proofErr w:type="spellEnd"/>
+      <w:r>
+        <w:rPr>
+          <w:lang w:val="en-GB"/>
+        </w:rPr>
+        <w:t xml:space="preserve"> `</w:t>
+      </w:r>
+      <w:proofErr w:type="spellStart"/>
+      <w:r>
+        <w:rPr>
+          <w:lang w:val="en-GB"/>
+        </w:rPr>
+        <w:t>alumnos</w:t>
+      </w:r>
+      <w:proofErr w:type="spellEnd"/>
+      <w:r>
+        <w:rPr>
+          <w:lang w:val="en-GB"/>
+        </w:rPr>
+        <w:t>`</w:t>
       </w:r>
     </w:p>
     <w:p>
@@ -18908,7 +19671,21 @@
         <w:rPr>
           <w:lang w:val="en-GB"/>
         </w:rPr>
-        <w:t>CREATE TABLE `alumnos` (</w:t>
+        <w:t>CREATE TABLE `</w:t>
+      </w:r>
+      <w:proofErr w:type="spellStart"/>
+      <w:r>
+        <w:rPr>
+          <w:lang w:val="en-GB"/>
+        </w:rPr>
+        <w:t>alumnos</w:t>
+      </w:r>
+      <w:proofErr w:type="spellEnd"/>
+      <w:r>
+        <w:rPr>
+          <w:lang w:val="en-GB"/>
+        </w:rPr>
+        <w:t>` (</w:t>
       </w:r>
     </w:p>
     <w:p>
@@ -18921,7 +19698,35 @@
         <w:rPr>
           <w:lang w:val="en-GB"/>
         </w:rPr>
-        <w:t xml:space="preserve">  `nie` varchar(10) NOT NULL,</w:t>
+        <w:t xml:space="preserve">  `</w:t>
+      </w:r>
+      <w:proofErr w:type="spellStart"/>
+      <w:r>
+        <w:rPr>
+          <w:lang w:val="en-GB"/>
+        </w:rPr>
+        <w:t>nie</w:t>
+      </w:r>
+      <w:proofErr w:type="spellEnd"/>
+      <w:r>
+        <w:rPr>
+          <w:lang w:val="en-GB"/>
+        </w:rPr>
+        <w:t xml:space="preserve">` </w:t>
+      </w:r>
+      <w:proofErr w:type="gramStart"/>
+      <w:r>
+        <w:rPr>
+          <w:lang w:val="en-GB"/>
+        </w:rPr>
+        <w:t>varchar(</w:t>
+      </w:r>
+      <w:proofErr w:type="gramEnd"/>
+      <w:r>
+        <w:rPr>
+          <w:lang w:val="en-GB"/>
+        </w:rPr>
+        <w:t>10) NOT NULL,</w:t>
       </w:r>
     </w:p>
     <w:p>
@@ -18934,7 +19739,35 @@
         <w:rPr>
           <w:lang w:val="en-GB"/>
         </w:rPr>
-        <w:t xml:space="preserve">  `nombre` varchar(255) NOT NULL,</w:t>
+        <w:t xml:space="preserve">  `</w:t>
+      </w:r>
+      <w:proofErr w:type="spellStart"/>
+      <w:r>
+        <w:rPr>
+          <w:lang w:val="en-GB"/>
+        </w:rPr>
+        <w:t>nombre</w:t>
+      </w:r>
+      <w:proofErr w:type="spellEnd"/>
+      <w:r>
+        <w:rPr>
+          <w:lang w:val="en-GB"/>
+        </w:rPr>
+        <w:t xml:space="preserve">` </w:t>
+      </w:r>
+      <w:proofErr w:type="gramStart"/>
+      <w:r>
+        <w:rPr>
+          <w:lang w:val="en-GB"/>
+        </w:rPr>
+        <w:t>varchar(</w:t>
+      </w:r>
+      <w:proofErr w:type="gramEnd"/>
+      <w:r>
+        <w:rPr>
+          <w:lang w:val="en-GB"/>
+        </w:rPr>
+        <w:t>255) NOT NULL,</w:t>
       </w:r>
     </w:p>
     <w:p>
@@ -18947,7 +19780,35 @@
         <w:rPr>
           <w:lang w:val="en-GB"/>
         </w:rPr>
-        <w:t xml:space="preserve">  `apellidos` varchar(255) NOT NULL,</w:t>
+        <w:t xml:space="preserve">  `</w:t>
+      </w:r>
+      <w:proofErr w:type="spellStart"/>
+      <w:r>
+        <w:rPr>
+          <w:lang w:val="en-GB"/>
+        </w:rPr>
+        <w:t>apellidos</w:t>
+      </w:r>
+      <w:proofErr w:type="spellEnd"/>
+      <w:r>
+        <w:rPr>
+          <w:lang w:val="en-GB"/>
+        </w:rPr>
+        <w:t xml:space="preserve">` </w:t>
+      </w:r>
+      <w:proofErr w:type="gramStart"/>
+      <w:r>
+        <w:rPr>
+          <w:lang w:val="en-GB"/>
+        </w:rPr>
+        <w:t>varchar(</w:t>
+      </w:r>
+      <w:proofErr w:type="gramEnd"/>
+      <w:r>
+        <w:rPr>
+          <w:lang w:val="en-GB"/>
+        </w:rPr>
+        <w:t>255) NOT NULL,</w:t>
       </w:r>
     </w:p>
     <w:p>
@@ -18960,7 +19821,63 @@
         <w:rPr>
           <w:lang w:val="en-GB"/>
         </w:rPr>
-        <w:t xml:space="preserve">  `tramo` varchar(2) NOT NULL DEFAULT '0' COMMENT '0 nada, I tramo I y II Tramo 2',</w:t>
+        <w:t xml:space="preserve">  `</w:t>
+      </w:r>
+      <w:proofErr w:type="spellStart"/>
+      <w:r>
+        <w:rPr>
+          <w:lang w:val="en-GB"/>
+        </w:rPr>
+        <w:t>tramo</w:t>
+      </w:r>
+      <w:proofErr w:type="spellEnd"/>
+      <w:r>
+        <w:rPr>
+          <w:lang w:val="en-GB"/>
+        </w:rPr>
+        <w:t xml:space="preserve">` </w:t>
+      </w:r>
+      <w:proofErr w:type="gramStart"/>
+      <w:r>
+        <w:rPr>
+          <w:lang w:val="en-GB"/>
+        </w:rPr>
+        <w:t>varchar(</w:t>
+      </w:r>
+      <w:proofErr w:type="gramEnd"/>
+      <w:r>
+        <w:rPr>
+          <w:lang w:val="en-GB"/>
+        </w:rPr>
+        <w:t xml:space="preserve">2) NOT NULL DEFAULT '0' COMMENT '0 nada, I </w:t>
+      </w:r>
+      <w:proofErr w:type="spellStart"/>
+      <w:r>
+        <w:rPr>
+          <w:lang w:val="en-GB"/>
+        </w:rPr>
+        <w:t>tramo</w:t>
+      </w:r>
+      <w:proofErr w:type="spellEnd"/>
+      <w:r>
+        <w:rPr>
+          <w:lang w:val="en-GB"/>
+        </w:rPr>
+        <w:t xml:space="preserve"> I y II </w:t>
+      </w:r>
+      <w:proofErr w:type="spellStart"/>
+      <w:r>
+        <w:rPr>
+          <w:lang w:val="en-GB"/>
+        </w:rPr>
+        <w:t>Tramo</w:t>
+      </w:r>
+      <w:proofErr w:type="spellEnd"/>
+      <w:r>
+        <w:rPr>
+          <w:lang w:val="en-GB"/>
+        </w:rPr>
+        <w:t xml:space="preserve"> 2',</w:t>
       </w:r>
     </w:p>
     <w:p>
@@ -18973,7 +19890,43 @@
         <w:rPr>
           <w:lang w:val="en-GB"/>
         </w:rPr>
-        <w:t xml:space="preserve">  `bilingue` tinyint(1) NOT NULL DEFAULT 1 COMMENT '0 True, 1 false'</w:t>
+        <w:t xml:space="preserve">  `</w:t>
+      </w:r>
+      <w:proofErr w:type="spellStart"/>
+      <w:r>
+        <w:rPr>
+          <w:lang w:val="en-GB"/>
+        </w:rPr>
+        <w:t>bilingue</w:t>
+      </w:r>
+      <w:proofErr w:type="spellEnd"/>
+      <w:r>
+        <w:rPr>
+          <w:lang w:val="en-GB"/>
+        </w:rPr>
+        <w:t xml:space="preserve">` </w:t>
+      </w:r>
+      <w:proofErr w:type="spellStart"/>
+      <w:proofErr w:type="gramStart"/>
+      <w:r>
+        <w:rPr>
+          <w:lang w:val="en-GB"/>
+        </w:rPr>
+        <w:t>tinyint</w:t>
+      </w:r>
+      <w:proofErr w:type="spellEnd"/>
+      <w:r>
+        <w:rPr>
+          <w:lang w:val="en-GB"/>
+        </w:rPr>
+        <w:t>(</w:t>
+      </w:r>
+      <w:proofErr w:type="gramEnd"/>
+      <w:r>
+        <w:rPr>
+          <w:lang w:val="en-GB"/>
+        </w:rPr>
+        <w:t>1) NOT NULL DEFAULT 1 COMMENT '0 True, 1 false'</w:t>
       </w:r>
     </w:p>
     <w:p>
@@ -18986,7 +19939,21 @@
         <w:rPr>
           <w:lang w:val="en-GB"/>
         </w:rPr>
-        <w:t>) ENGINE=InnoDB DEFAULT CHARSET=utf8 COLLATE=utf8_spanish2_ci;</w:t>
+        <w:t>) ENGINE=</w:t>
+      </w:r>
+      <w:proofErr w:type="spellStart"/>
+      <w:r>
+        <w:rPr>
+          <w:lang w:val="en-GB"/>
+        </w:rPr>
+        <w:t>InnoDB</w:t>
+      </w:r>
+      <w:proofErr w:type="spellEnd"/>
+      <w:r>
+        <w:rPr>
+          <w:lang w:val="en-GB"/>
+        </w:rPr>
+        <w:t xml:space="preserve"> DEFAULT CHARSET=utf8 COLLATE=utf8_spanish2_ci;</w:t>
       </w:r>
     </w:p>
     <w:p>
@@ -19025,7 +19992,63 @@
         <w:rPr>
           <w:lang w:val="en-GB"/>
         </w:rPr>
-        <w:t>-- Estructura de tabla para la tabla `alumnoscrusoslibros`</w:t>
+        <w:t xml:space="preserve">-- </w:t>
+      </w:r>
+      <w:proofErr w:type="spellStart"/>
+      <w:r>
+        <w:rPr>
+          <w:lang w:val="en-GB"/>
+        </w:rPr>
+        <w:t>Estructura</w:t>
+      </w:r>
+      <w:proofErr w:type="spellEnd"/>
+      <w:r>
+        <w:rPr>
+          <w:lang w:val="en-GB"/>
+        </w:rPr>
+        <w:t xml:space="preserve"> de </w:t>
+      </w:r>
+      <w:proofErr w:type="spellStart"/>
+      <w:r>
+        <w:rPr>
+          <w:lang w:val="en-GB"/>
+        </w:rPr>
+        <w:t>tabla</w:t>
+      </w:r>
+      <w:proofErr w:type="spellEnd"/>
+      <w:r>
+        <w:rPr>
+          <w:lang w:val="en-GB"/>
+        </w:rPr>
+        <w:t xml:space="preserve"> para la </w:t>
+      </w:r>
+      <w:proofErr w:type="spellStart"/>
+      <w:r>
+        <w:rPr>
+          <w:lang w:val="en-GB"/>
+        </w:rPr>
+        <w:t>tabla</w:t>
+      </w:r>
+      <w:proofErr w:type="spellEnd"/>
+      <w:r>
+        <w:rPr>
+          <w:lang w:val="en-GB"/>
+        </w:rPr>
+        <w:t xml:space="preserve"> `</w:t>
+      </w:r>
+      <w:proofErr w:type="spellStart"/>
+      <w:r>
+        <w:rPr>
+          <w:lang w:val="en-GB"/>
+        </w:rPr>
+        <w:t>alumnoscrusoslibros</w:t>
+      </w:r>
+      <w:proofErr w:type="spellEnd"/>
+      <w:r>
+        <w:rPr>
+          <w:lang w:val="en-GB"/>
+        </w:rPr>
+        <w:t>`</w:t>
       </w:r>
     </w:p>
     <w:p>
@@ -19051,7 +20074,21 @@
         <w:rPr>
           <w:lang w:val="en-GB"/>
         </w:rPr>
-        <w:t>CREATE TABLE `alumnoscrusoslibros` (</w:t>
+        <w:t>CREATE TABLE `</w:t>
+      </w:r>
+      <w:proofErr w:type="spellStart"/>
+      <w:r>
+        <w:rPr>
+          <w:lang w:val="en-GB"/>
+        </w:rPr>
+        <w:t>alumnoscrusoslibros</w:t>
+      </w:r>
+      <w:proofErr w:type="spellEnd"/>
+      <w:r>
+        <w:rPr>
+          <w:lang w:val="en-GB"/>
+        </w:rPr>
+        <w:t>` (</w:t>
       </w:r>
     </w:p>
     <w:p>
@@ -19064,7 +20101,35 @@
         <w:rPr>
           <w:lang w:val="en-GB"/>
         </w:rPr>
-        <w:t xml:space="preserve">  `nie` varchar(10) NOT NULL,</w:t>
+        <w:t xml:space="preserve">  `</w:t>
+      </w:r>
+      <w:proofErr w:type="spellStart"/>
+      <w:r>
+        <w:rPr>
+          <w:lang w:val="en-GB"/>
+        </w:rPr>
+        <w:t>nie</w:t>
+      </w:r>
+      <w:proofErr w:type="spellEnd"/>
+      <w:r>
+        <w:rPr>
+          <w:lang w:val="en-GB"/>
+        </w:rPr>
+        <w:t xml:space="preserve">` </w:t>
+      </w:r>
+      <w:proofErr w:type="gramStart"/>
+      <w:r>
+        <w:rPr>
+          <w:lang w:val="en-GB"/>
+        </w:rPr>
+        <w:t>varchar(</w:t>
+      </w:r>
+      <w:proofErr w:type="gramEnd"/>
+      <w:r>
+        <w:rPr>
+          <w:lang w:val="en-GB"/>
+        </w:rPr>
+        <w:t>10) NOT NULL,</w:t>
       </w:r>
     </w:p>
     <w:p>
@@ -19077,7 +20142,35 @@
         <w:rPr>
           <w:lang w:val="en-GB"/>
         </w:rPr>
-        <w:t xml:space="preserve">  `curso` varchar(255) NOT NULL,</w:t>
+        <w:t xml:space="preserve">  `</w:t>
+      </w:r>
+      <w:proofErr w:type="spellStart"/>
+      <w:r>
+        <w:rPr>
+          <w:lang w:val="en-GB"/>
+        </w:rPr>
+        <w:t>curso</w:t>
+      </w:r>
+      <w:proofErr w:type="spellEnd"/>
+      <w:r>
+        <w:rPr>
+          <w:lang w:val="en-GB"/>
+        </w:rPr>
+        <w:t xml:space="preserve">` </w:t>
+      </w:r>
+      <w:proofErr w:type="gramStart"/>
+      <w:r>
+        <w:rPr>
+          <w:lang w:val="en-GB"/>
+        </w:rPr>
+        <w:t>varchar(</w:t>
+      </w:r>
+      <w:proofErr w:type="gramEnd"/>
+      <w:r>
+        <w:rPr>
+          <w:lang w:val="en-GB"/>
+        </w:rPr>
+        <w:t>255) NOT NULL,</w:t>
       </w:r>
     </w:p>
     <w:p>
@@ -19090,7 +20183,35 @@
         <w:rPr>
           <w:lang w:val="en-GB"/>
         </w:rPr>
-        <w:t xml:space="preserve">  `isbn` varchar(20) NOT NULL,</w:t>
+        <w:t xml:space="preserve">  `</w:t>
+      </w:r>
+      <w:proofErr w:type="spellStart"/>
+      <w:r>
+        <w:rPr>
+          <w:lang w:val="en-GB"/>
+        </w:rPr>
+        <w:t>isbn</w:t>
+      </w:r>
+      <w:proofErr w:type="spellEnd"/>
+      <w:r>
+        <w:rPr>
+          <w:lang w:val="en-GB"/>
+        </w:rPr>
+        <w:t xml:space="preserve">` </w:t>
+      </w:r>
+      <w:proofErr w:type="gramStart"/>
+      <w:r>
+        <w:rPr>
+          <w:lang w:val="en-GB"/>
+        </w:rPr>
+        <w:t>varchar(</w:t>
+      </w:r>
+      <w:proofErr w:type="gramEnd"/>
+      <w:r>
+        <w:rPr>
+          <w:lang w:val="en-GB"/>
+        </w:rPr>
+        <w:t>20) NOT NULL,</w:t>
       </w:r>
     </w:p>
     <w:p>
@@ -19103,7 +20224,21 @@
         <w:rPr>
           <w:lang w:val="en-GB"/>
         </w:rPr>
-        <w:t xml:space="preserve">  `fecha_entrega` date NOT NULL,</w:t>
+        <w:t xml:space="preserve">  `</w:t>
+      </w:r>
+      <w:proofErr w:type="spellStart"/>
+      <w:r>
+        <w:rPr>
+          <w:lang w:val="en-GB"/>
+        </w:rPr>
+        <w:t>fecha_entrega</w:t>
+      </w:r>
+      <w:proofErr w:type="spellEnd"/>
+      <w:r>
+        <w:rPr>
+          <w:lang w:val="en-GB"/>
+        </w:rPr>
+        <w:t>` date NOT NULL,</w:t>
       </w:r>
     </w:p>
     <w:p>
@@ -19117,7 +20252,21 @@
           <w:lang w:val="en-GB"/>
         </w:rPr>
         <w:lastRenderedPageBreak/>
-        <w:t xml:space="preserve">  `fecha_devolucion` date NOT NULL,</w:t>
+        <w:t xml:space="preserve">  `</w:t>
+      </w:r>
+      <w:proofErr w:type="spellStart"/>
+      <w:r>
+        <w:rPr>
+          <w:lang w:val="en-GB"/>
+        </w:rPr>
+        <w:t>fecha_devolucion</w:t>
+      </w:r>
+      <w:proofErr w:type="spellEnd"/>
+      <w:r>
+        <w:rPr>
+          <w:lang w:val="en-GB"/>
+        </w:rPr>
+        <w:t>` date NOT NULL,</w:t>
       </w:r>
     </w:p>
     <w:p>
@@ -19130,7 +20279,63 @@
         <w:rPr>
           <w:lang w:val="en-GB"/>
         </w:rPr>
-        <w:t xml:space="preserve">  `estado` varchar(1) NOT NULL DEFAULT 'P' COMMENT 'P: Prestado, D:Devuelto'</w:t>
+        <w:t xml:space="preserve">  `</w:t>
+      </w:r>
+      <w:proofErr w:type="spellStart"/>
+      <w:r>
+        <w:rPr>
+          <w:lang w:val="en-GB"/>
+        </w:rPr>
+        <w:t>estado</w:t>
+      </w:r>
+      <w:proofErr w:type="spellEnd"/>
+      <w:r>
+        <w:rPr>
+          <w:lang w:val="en-GB"/>
+        </w:rPr>
+        <w:t xml:space="preserve">` </w:t>
+      </w:r>
+      <w:proofErr w:type="gramStart"/>
+      <w:r>
+        <w:rPr>
+          <w:lang w:val="en-GB"/>
+        </w:rPr>
+        <w:t>varchar(</w:t>
+      </w:r>
+      <w:proofErr w:type="gramEnd"/>
+      <w:r>
+        <w:rPr>
+          <w:lang w:val="en-GB"/>
+        </w:rPr>
+        <w:t xml:space="preserve">1) NOT NULL DEFAULT 'P' COMMENT 'P: </w:t>
+      </w:r>
+      <w:proofErr w:type="spellStart"/>
+      <w:r>
+        <w:rPr>
+          <w:lang w:val="en-GB"/>
+        </w:rPr>
+        <w:t>Prestado</w:t>
+      </w:r>
+      <w:proofErr w:type="spellEnd"/>
+      <w:r>
+        <w:rPr>
+          <w:lang w:val="en-GB"/>
+        </w:rPr>
+        <w:t xml:space="preserve">, </w:t>
+      </w:r>
+      <w:proofErr w:type="gramStart"/>
+      <w:r>
+        <w:rPr>
+          <w:lang w:val="en-GB"/>
+        </w:rPr>
+        <w:t>D:Devuelto</w:t>
+      </w:r>
+      <w:proofErr w:type="gramEnd"/>
+      <w:r>
+        <w:rPr>
+          <w:lang w:val="en-GB"/>
+        </w:rPr>
+        <w:t>'</w:t>
       </w:r>
     </w:p>
     <w:p>
@@ -19143,7 +20348,21 @@
         <w:rPr>
           <w:lang w:val="en-GB"/>
         </w:rPr>
-        <w:t>) ENGINE=InnoDB DEFAULT CHARSET=utf8 COLLATE=utf8_spanish2_ci;</w:t>
+        <w:t>) ENGINE=</w:t>
+      </w:r>
+      <w:proofErr w:type="spellStart"/>
+      <w:r>
+        <w:rPr>
+          <w:lang w:val="en-GB"/>
+        </w:rPr>
+        <w:t>InnoDB</w:t>
+      </w:r>
+      <w:proofErr w:type="spellEnd"/>
+      <w:r>
+        <w:rPr>
+          <w:lang w:val="en-GB"/>
+        </w:rPr>
+        <w:t xml:space="preserve"> DEFAULT CHARSET=utf8 COLLATE=utf8_spanish2_ci;</w:t>
       </w:r>
     </w:p>
     <w:p>
@@ -19182,7 +20401,63 @@
         <w:rPr>
           <w:lang w:val="en-GB"/>
         </w:rPr>
-        <w:t>-- Estructura de tabla para la tabla `cursos`</w:t>
+        <w:t xml:space="preserve">-- </w:t>
+      </w:r>
+      <w:proofErr w:type="spellStart"/>
+      <w:r>
+        <w:rPr>
+          <w:lang w:val="en-GB"/>
+        </w:rPr>
+        <w:t>Estructura</w:t>
+      </w:r>
+      <w:proofErr w:type="spellEnd"/>
+      <w:r>
+        <w:rPr>
+          <w:lang w:val="en-GB"/>
+        </w:rPr>
+        <w:t xml:space="preserve"> de </w:t>
+      </w:r>
+      <w:proofErr w:type="spellStart"/>
+      <w:r>
+        <w:rPr>
+          <w:lang w:val="en-GB"/>
+        </w:rPr>
+        <w:t>tabla</w:t>
+      </w:r>
+      <w:proofErr w:type="spellEnd"/>
+      <w:r>
+        <w:rPr>
+          <w:lang w:val="en-GB"/>
+        </w:rPr>
+        <w:t xml:space="preserve"> para la </w:t>
+      </w:r>
+      <w:proofErr w:type="spellStart"/>
+      <w:r>
+        <w:rPr>
+          <w:lang w:val="en-GB"/>
+        </w:rPr>
+        <w:t>tabla</w:t>
+      </w:r>
+      <w:proofErr w:type="spellEnd"/>
+      <w:r>
+        <w:rPr>
+          <w:lang w:val="en-GB"/>
+        </w:rPr>
+        <w:t xml:space="preserve"> `</w:t>
+      </w:r>
+      <w:proofErr w:type="spellStart"/>
+      <w:r>
+        <w:rPr>
+          <w:lang w:val="en-GB"/>
+        </w:rPr>
+        <w:t>cursos</w:t>
+      </w:r>
+      <w:proofErr w:type="spellEnd"/>
+      <w:r>
+        <w:rPr>
+          <w:lang w:val="en-GB"/>
+        </w:rPr>
+        <w:t>`</w:t>
       </w:r>
     </w:p>
     <w:p>
@@ -19208,7 +20483,21 @@
         <w:rPr>
           <w:lang w:val="en-GB"/>
         </w:rPr>
-        <w:t>CREATE TABLE `cursos` (</w:t>
+        <w:t>CREATE TABLE `</w:t>
+      </w:r>
+      <w:proofErr w:type="spellStart"/>
+      <w:r>
+        <w:rPr>
+          <w:lang w:val="en-GB"/>
+        </w:rPr>
+        <w:t>cursos</w:t>
+      </w:r>
+      <w:proofErr w:type="spellEnd"/>
+      <w:r>
+        <w:rPr>
+          <w:lang w:val="en-GB"/>
+        </w:rPr>
+        <w:t>` (</w:t>
       </w:r>
     </w:p>
     <w:p>
@@ -19221,7 +20510,35 @@
         <w:rPr>
           <w:lang w:val="en-GB"/>
         </w:rPr>
-        <w:t xml:space="preserve">  `curso` varchar(20) NOT NULL,</w:t>
+        <w:t xml:space="preserve">  `</w:t>
+      </w:r>
+      <w:proofErr w:type="spellStart"/>
+      <w:r>
+        <w:rPr>
+          <w:lang w:val="en-GB"/>
+        </w:rPr>
+        <w:t>curso</w:t>
+      </w:r>
+      <w:proofErr w:type="spellEnd"/>
+      <w:r>
+        <w:rPr>
+          <w:lang w:val="en-GB"/>
+        </w:rPr>
+        <w:t xml:space="preserve">` </w:t>
+      </w:r>
+      <w:proofErr w:type="gramStart"/>
+      <w:r>
+        <w:rPr>
+          <w:lang w:val="en-GB"/>
+        </w:rPr>
+        <w:t>varchar(</w:t>
+      </w:r>
+      <w:proofErr w:type="gramEnd"/>
+      <w:r>
+        <w:rPr>
+          <w:lang w:val="en-GB"/>
+        </w:rPr>
+        <w:t>20) NOT NULL,</w:t>
       </w:r>
     </w:p>
     <w:p>
@@ -19234,7 +20551,35 @@
         <w:rPr>
           <w:lang w:val="en-GB"/>
         </w:rPr>
-        <w:t xml:space="preserve">  `nivel` varchar(20) NOT NULL</w:t>
+        <w:t xml:space="preserve">  `</w:t>
+      </w:r>
+      <w:proofErr w:type="spellStart"/>
+      <w:r>
+        <w:rPr>
+          <w:lang w:val="en-GB"/>
+        </w:rPr>
+        <w:t>nivel</w:t>
+      </w:r>
+      <w:proofErr w:type="spellEnd"/>
+      <w:r>
+        <w:rPr>
+          <w:lang w:val="en-GB"/>
+        </w:rPr>
+        <w:t xml:space="preserve">` </w:t>
+      </w:r>
+      <w:proofErr w:type="gramStart"/>
+      <w:r>
+        <w:rPr>
+          <w:lang w:val="en-GB"/>
+        </w:rPr>
+        <w:t>varchar(</w:t>
+      </w:r>
+      <w:proofErr w:type="gramEnd"/>
+      <w:r>
+        <w:rPr>
+          <w:lang w:val="en-GB"/>
+        </w:rPr>
+        <w:t>20) NOT NULL</w:t>
       </w:r>
     </w:p>
     <w:p>
@@ -19247,7 +20592,21 @@
         <w:rPr>
           <w:lang w:val="en-GB"/>
         </w:rPr>
-        <w:t>) ENGINE=InnoDB DEFAULT CHARSET=utf8 COLLATE=utf8_spanish2_ci;</w:t>
+        <w:t>) ENGINE=</w:t>
+      </w:r>
+      <w:proofErr w:type="spellStart"/>
+      <w:r>
+        <w:rPr>
+          <w:lang w:val="en-GB"/>
+        </w:rPr>
+        <w:t>InnoDB</w:t>
+      </w:r>
+      <w:proofErr w:type="spellEnd"/>
+      <w:r>
+        <w:rPr>
+          <w:lang w:val="en-GB"/>
+        </w:rPr>
+        <w:t xml:space="preserve"> DEFAULT CHARSET=utf8 COLLATE=utf8_spanish2_ci;</w:t>
       </w:r>
     </w:p>
     <w:p>
@@ -19286,7 +20645,63 @@
         <w:rPr>
           <w:lang w:val="en-GB"/>
         </w:rPr>
-        <w:t>-- Estructura de tabla para la tabla `libros`</w:t>
+        <w:t xml:space="preserve">-- </w:t>
+      </w:r>
+      <w:proofErr w:type="spellStart"/>
+      <w:r>
+        <w:rPr>
+          <w:lang w:val="en-GB"/>
+        </w:rPr>
+        <w:t>Estructura</w:t>
+      </w:r>
+      <w:proofErr w:type="spellEnd"/>
+      <w:r>
+        <w:rPr>
+          <w:lang w:val="en-GB"/>
+        </w:rPr>
+        <w:t xml:space="preserve"> de </w:t>
+      </w:r>
+      <w:proofErr w:type="spellStart"/>
+      <w:r>
+        <w:rPr>
+          <w:lang w:val="en-GB"/>
+        </w:rPr>
+        <w:t>tabla</w:t>
+      </w:r>
+      <w:proofErr w:type="spellEnd"/>
+      <w:r>
+        <w:rPr>
+          <w:lang w:val="en-GB"/>
+        </w:rPr>
+        <w:t xml:space="preserve"> para la </w:t>
+      </w:r>
+      <w:proofErr w:type="spellStart"/>
+      <w:r>
+        <w:rPr>
+          <w:lang w:val="en-GB"/>
+        </w:rPr>
+        <w:t>tabla</w:t>
+      </w:r>
+      <w:proofErr w:type="spellEnd"/>
+      <w:r>
+        <w:rPr>
+          <w:lang w:val="en-GB"/>
+        </w:rPr>
+        <w:t xml:space="preserve"> `</w:t>
+      </w:r>
+      <w:proofErr w:type="spellStart"/>
+      <w:r>
+        <w:rPr>
+          <w:lang w:val="en-GB"/>
+        </w:rPr>
+        <w:t>libros</w:t>
+      </w:r>
+      <w:proofErr w:type="spellEnd"/>
+      <w:r>
+        <w:rPr>
+          <w:lang w:val="en-GB"/>
+        </w:rPr>
+        <w:t>`</w:t>
       </w:r>
     </w:p>
     <w:p>
@@ -19312,7 +20727,21 @@
         <w:rPr>
           <w:lang w:val="en-GB"/>
         </w:rPr>
-        <w:t>CREATE TABLE `libros` (</w:t>
+        <w:t>CREATE TABLE `</w:t>
+      </w:r>
+      <w:proofErr w:type="spellStart"/>
+      <w:r>
+        <w:rPr>
+          <w:lang w:val="en-GB"/>
+        </w:rPr>
+        <w:t>libros</w:t>
+      </w:r>
+      <w:proofErr w:type="spellEnd"/>
+      <w:r>
+        <w:rPr>
+          <w:lang w:val="en-GB"/>
+        </w:rPr>
+        <w:t>` (</w:t>
       </w:r>
     </w:p>
     <w:p>
@@ -19325,7 +20754,35 @@
         <w:rPr>
           <w:lang w:val="en-GB"/>
         </w:rPr>
-        <w:t xml:space="preserve">  `isbn` varchar(20) NOT NULL,</w:t>
+        <w:t xml:space="preserve">  `</w:t>
+      </w:r>
+      <w:proofErr w:type="spellStart"/>
+      <w:r>
+        <w:rPr>
+          <w:lang w:val="en-GB"/>
+        </w:rPr>
+        <w:t>isbn</w:t>
+      </w:r>
+      <w:proofErr w:type="spellEnd"/>
+      <w:r>
+        <w:rPr>
+          <w:lang w:val="en-GB"/>
+        </w:rPr>
+        <w:t xml:space="preserve">` </w:t>
+      </w:r>
+      <w:proofErr w:type="gramStart"/>
+      <w:r>
+        <w:rPr>
+          <w:lang w:val="en-GB"/>
+        </w:rPr>
+        <w:t>varchar(</w:t>
+      </w:r>
+      <w:proofErr w:type="gramEnd"/>
+      <w:r>
+        <w:rPr>
+          <w:lang w:val="en-GB"/>
+        </w:rPr>
+        <w:t>20) NOT NULL,</w:t>
       </w:r>
     </w:p>
     <w:p>
@@ -19338,7 +20795,35 @@
         <w:rPr>
           <w:lang w:val="en-GB"/>
         </w:rPr>
-        <w:t xml:space="preserve">  `titulo` varchar(255) NOT NULL,</w:t>
+        <w:t xml:space="preserve">  `</w:t>
+      </w:r>
+      <w:proofErr w:type="spellStart"/>
+      <w:r>
+        <w:rPr>
+          <w:lang w:val="en-GB"/>
+        </w:rPr>
+        <w:t>titulo</w:t>
+      </w:r>
+      <w:proofErr w:type="spellEnd"/>
+      <w:r>
+        <w:rPr>
+          <w:lang w:val="en-GB"/>
+        </w:rPr>
+        <w:t xml:space="preserve">` </w:t>
+      </w:r>
+      <w:proofErr w:type="gramStart"/>
+      <w:r>
+        <w:rPr>
+          <w:lang w:val="en-GB"/>
+        </w:rPr>
+        <w:t>varchar(</w:t>
+      </w:r>
+      <w:proofErr w:type="gramEnd"/>
+      <w:r>
+        <w:rPr>
+          <w:lang w:val="en-GB"/>
+        </w:rPr>
+        <w:t>255) NOT NULL,</w:t>
       </w:r>
     </w:p>
     <w:p>
@@ -19351,7 +20836,35 @@
         <w:rPr>
           <w:lang w:val="en-GB"/>
         </w:rPr>
-        <w:t xml:space="preserve">  `autor` varchar(255) NOT NULL,</w:t>
+        <w:t xml:space="preserve">  `</w:t>
+      </w:r>
+      <w:proofErr w:type="spellStart"/>
+      <w:r>
+        <w:rPr>
+          <w:lang w:val="en-GB"/>
+        </w:rPr>
+        <w:t>autor</w:t>
+      </w:r>
+      <w:proofErr w:type="spellEnd"/>
+      <w:r>
+        <w:rPr>
+          <w:lang w:val="en-GB"/>
+        </w:rPr>
+        <w:t xml:space="preserve">` </w:t>
+      </w:r>
+      <w:proofErr w:type="gramStart"/>
+      <w:r>
+        <w:rPr>
+          <w:lang w:val="en-GB"/>
+        </w:rPr>
+        <w:t>varchar(</w:t>
+      </w:r>
+      <w:proofErr w:type="gramEnd"/>
+      <w:r>
+        <w:rPr>
+          <w:lang w:val="en-GB"/>
+        </w:rPr>
+        <w:t>255) NOT NULL,</w:t>
       </w:r>
     </w:p>
     <w:p>
@@ -19364,7 +20877,35 @@
         <w:rPr>
           <w:lang w:val="en-GB"/>
         </w:rPr>
-        <w:t xml:space="preserve">  `numero_ejemplares` int(5) NOT NULL,</w:t>
+        <w:t xml:space="preserve">  `</w:t>
+      </w:r>
+      <w:proofErr w:type="spellStart"/>
+      <w:r>
+        <w:rPr>
+          <w:lang w:val="en-GB"/>
+        </w:rPr>
+        <w:t>numero_ejemplares</w:t>
+      </w:r>
+      <w:proofErr w:type="spellEnd"/>
+      <w:r>
+        <w:rPr>
+          <w:lang w:val="en-GB"/>
+        </w:rPr>
+        <w:t xml:space="preserve">` </w:t>
+      </w:r>
+      <w:proofErr w:type="gramStart"/>
+      <w:r>
+        <w:rPr>
+          <w:lang w:val="en-GB"/>
+        </w:rPr>
+        <w:t>int(</w:t>
+      </w:r>
+      <w:proofErr w:type="gramEnd"/>
+      <w:r>
+        <w:rPr>
+          <w:lang w:val="en-GB"/>
+        </w:rPr>
+        <w:t>5) NOT NULL,</w:t>
       </w:r>
     </w:p>
     <w:p>
@@ -19377,7 +20918,35 @@
         <w:rPr>
           <w:lang w:val="en-GB"/>
         </w:rPr>
-        <w:t xml:space="preserve">  `id_materia` int(11) NOT NULL,</w:t>
+        <w:t xml:space="preserve">  `</w:t>
+      </w:r>
+      <w:proofErr w:type="spellStart"/>
+      <w:r>
+        <w:rPr>
+          <w:lang w:val="en-GB"/>
+        </w:rPr>
+        <w:t>id_materia</w:t>
+      </w:r>
+      <w:proofErr w:type="spellEnd"/>
+      <w:r>
+        <w:rPr>
+          <w:lang w:val="en-GB"/>
+        </w:rPr>
+        <w:t xml:space="preserve">` </w:t>
+      </w:r>
+      <w:proofErr w:type="gramStart"/>
+      <w:r>
+        <w:rPr>
+          <w:lang w:val="en-GB"/>
+        </w:rPr>
+        <w:t>int(</w:t>
+      </w:r>
+      <w:proofErr w:type="gramEnd"/>
+      <w:r>
+        <w:rPr>
+          <w:lang w:val="en-GB"/>
+        </w:rPr>
+        <w:t>11) NOT NULL,</w:t>
       </w:r>
     </w:p>
     <w:p>
@@ -19390,7 +20959,35 @@
         <w:rPr>
           <w:lang w:val="en-GB"/>
         </w:rPr>
-        <w:t xml:space="preserve">  `id_curso` varchar(20) NOT NULL</w:t>
+        <w:t xml:space="preserve">  `</w:t>
+      </w:r>
+      <w:proofErr w:type="spellStart"/>
+      <w:r>
+        <w:rPr>
+          <w:lang w:val="en-GB"/>
+        </w:rPr>
+        <w:t>id_curso</w:t>
+      </w:r>
+      <w:proofErr w:type="spellEnd"/>
+      <w:r>
+        <w:rPr>
+          <w:lang w:val="en-GB"/>
+        </w:rPr>
+        <w:t xml:space="preserve">` </w:t>
+      </w:r>
+      <w:proofErr w:type="gramStart"/>
+      <w:r>
+        <w:rPr>
+          <w:lang w:val="en-GB"/>
+        </w:rPr>
+        <w:t>varchar(</w:t>
+      </w:r>
+      <w:proofErr w:type="gramEnd"/>
+      <w:r>
+        <w:rPr>
+          <w:lang w:val="en-GB"/>
+        </w:rPr>
+        <w:t>20) NOT NULL</w:t>
       </w:r>
     </w:p>
     <w:p>
@@ -19403,7 +21000,21 @@
         <w:rPr>
           <w:lang w:val="en-GB"/>
         </w:rPr>
-        <w:t>) ENGINE=InnoDB DEFAULT CHARSET=utf8 COLLATE=utf8_spanish2_ci;</w:t>
+        <w:t>) ENGINE=</w:t>
+      </w:r>
+      <w:proofErr w:type="spellStart"/>
+      <w:r>
+        <w:rPr>
+          <w:lang w:val="en-GB"/>
+        </w:rPr>
+        <w:t>InnoDB</w:t>
+      </w:r>
+      <w:proofErr w:type="spellEnd"/>
+      <w:r>
+        <w:rPr>
+          <w:lang w:val="en-GB"/>
+        </w:rPr>
+        <w:t xml:space="preserve"> DEFAULT CHARSET=utf8 COLLATE=utf8_spanish2_ci;</w:t>
       </w:r>
     </w:p>
     <w:p>
@@ -19442,7 +21053,63 @@
         <w:rPr>
           <w:lang w:val="en-GB"/>
         </w:rPr>
-        <w:t>-- Estructura de tabla para la tabla `materias`</w:t>
+        <w:t xml:space="preserve">-- </w:t>
+      </w:r>
+      <w:proofErr w:type="spellStart"/>
+      <w:r>
+        <w:rPr>
+          <w:lang w:val="en-GB"/>
+        </w:rPr>
+        <w:t>Estructura</w:t>
+      </w:r>
+      <w:proofErr w:type="spellEnd"/>
+      <w:r>
+        <w:rPr>
+          <w:lang w:val="en-GB"/>
+        </w:rPr>
+        <w:t xml:space="preserve"> de </w:t>
+      </w:r>
+      <w:proofErr w:type="spellStart"/>
+      <w:r>
+        <w:rPr>
+          <w:lang w:val="en-GB"/>
+        </w:rPr>
+        <w:t>tabla</w:t>
+      </w:r>
+      <w:proofErr w:type="spellEnd"/>
+      <w:r>
+        <w:rPr>
+          <w:lang w:val="en-GB"/>
+        </w:rPr>
+        <w:t xml:space="preserve"> para la </w:t>
+      </w:r>
+      <w:proofErr w:type="spellStart"/>
+      <w:r>
+        <w:rPr>
+          <w:lang w:val="en-GB"/>
+        </w:rPr>
+        <w:t>tabla</w:t>
+      </w:r>
+      <w:proofErr w:type="spellEnd"/>
+      <w:r>
+        <w:rPr>
+          <w:lang w:val="en-GB"/>
+        </w:rPr>
+        <w:t xml:space="preserve"> `</w:t>
+      </w:r>
+      <w:proofErr w:type="spellStart"/>
+      <w:r>
+        <w:rPr>
+          <w:lang w:val="en-GB"/>
+        </w:rPr>
+        <w:t>materias</w:t>
+      </w:r>
+      <w:proofErr w:type="spellEnd"/>
+      <w:r>
+        <w:rPr>
+          <w:lang w:val="en-GB"/>
+        </w:rPr>
+        <w:t>`</w:t>
       </w:r>
     </w:p>
     <w:p>
@@ -19468,7 +21135,21 @@
         <w:rPr>
           <w:lang w:val="en-GB"/>
         </w:rPr>
-        <w:t>CREATE TABLE `materias` (</w:t>
+        <w:t>CREATE TABLE `</w:t>
+      </w:r>
+      <w:proofErr w:type="spellStart"/>
+      <w:r>
+        <w:rPr>
+          <w:lang w:val="en-GB"/>
+        </w:rPr>
+        <w:t>materias</w:t>
+      </w:r>
+      <w:proofErr w:type="spellEnd"/>
+      <w:r>
+        <w:rPr>
+          <w:lang w:val="en-GB"/>
+        </w:rPr>
+        <w:t>` (</w:t>
       </w:r>
     </w:p>
     <w:p>
@@ -19481,7 +21162,21 @@
         <w:rPr>
           <w:lang w:val="en-GB"/>
         </w:rPr>
-        <w:t xml:space="preserve">  `id` int(11) NOT NULL,</w:t>
+        <w:t xml:space="preserve">  `id` </w:t>
+      </w:r>
+      <w:proofErr w:type="gramStart"/>
+      <w:r>
+        <w:rPr>
+          <w:lang w:val="en-GB"/>
+        </w:rPr>
+        <w:t>int(</w:t>
+      </w:r>
+      <w:proofErr w:type="gramEnd"/>
+      <w:r>
+        <w:rPr>
+          <w:lang w:val="en-GB"/>
+        </w:rPr>
+        <w:t>11) NOT NULL,</w:t>
       </w:r>
     </w:p>
     <w:p>
@@ -19494,7 +21189,35 @@
         <w:rPr>
           <w:lang w:val="en-GB"/>
         </w:rPr>
-        <w:t xml:space="preserve">  `nombre` varchar(255) NOT NULL,</w:t>
+        <w:t xml:space="preserve">  `</w:t>
+      </w:r>
+      <w:proofErr w:type="spellStart"/>
+      <w:r>
+        <w:rPr>
+          <w:lang w:val="en-GB"/>
+        </w:rPr>
+        <w:t>nombre</w:t>
+      </w:r>
+      <w:proofErr w:type="spellEnd"/>
+      <w:r>
+        <w:rPr>
+          <w:lang w:val="en-GB"/>
+        </w:rPr>
+        <w:t xml:space="preserve">` </w:t>
+      </w:r>
+      <w:proofErr w:type="gramStart"/>
+      <w:r>
+        <w:rPr>
+          <w:lang w:val="en-GB"/>
+        </w:rPr>
+        <w:t>varchar(</w:t>
+      </w:r>
+      <w:proofErr w:type="gramEnd"/>
+      <w:r>
+        <w:rPr>
+          <w:lang w:val="en-GB"/>
+        </w:rPr>
+        <w:t>255) NOT NULL,</w:t>
       </w:r>
     </w:p>
     <w:p>
@@ -19507,7 +21230,35 @@
         <w:rPr>
           <w:lang w:val="en-GB"/>
         </w:rPr>
-        <w:t xml:space="preserve">  `departamento` varchar(255) NOT NULL</w:t>
+        <w:t xml:space="preserve">  `</w:t>
+      </w:r>
+      <w:proofErr w:type="spellStart"/>
+      <w:r>
+        <w:rPr>
+          <w:lang w:val="en-GB"/>
+        </w:rPr>
+        <w:t>departamento</w:t>
+      </w:r>
+      <w:proofErr w:type="spellEnd"/>
+      <w:r>
+        <w:rPr>
+          <w:lang w:val="en-GB"/>
+        </w:rPr>
+        <w:t xml:space="preserve">` </w:t>
+      </w:r>
+      <w:proofErr w:type="gramStart"/>
+      <w:r>
+        <w:rPr>
+          <w:lang w:val="en-GB"/>
+        </w:rPr>
+        <w:t>varchar(</w:t>
+      </w:r>
+      <w:proofErr w:type="gramEnd"/>
+      <w:r>
+        <w:rPr>
+          <w:lang w:val="en-GB"/>
+        </w:rPr>
+        <w:t>255) NOT NULL</w:t>
       </w:r>
     </w:p>
     <w:p>
@@ -19520,7 +21271,21 @@
         <w:rPr>
           <w:lang w:val="en-GB"/>
         </w:rPr>
-        <w:t>) ENGINE=InnoDB DEFAULT CHARSET=utf8 COLLATE=utf8_spanish2_ci;</w:t>
+        <w:t>) ENGINE=</w:t>
+      </w:r>
+      <w:proofErr w:type="spellStart"/>
+      <w:r>
+        <w:rPr>
+          <w:lang w:val="en-GB"/>
+        </w:rPr>
+        <w:t>InnoDB</w:t>
+      </w:r>
+      <w:proofErr w:type="spellEnd"/>
+      <w:r>
+        <w:rPr>
+          <w:lang w:val="en-GB"/>
+        </w:rPr>
+        <w:t xml:space="preserve"> DEFAULT CHARSET=utf8 COLLATE=utf8_spanish2_ci;</w:t>
       </w:r>
     </w:p>
     <w:p>
@@ -19546,8 +21311,44 @@
         <w:rPr>
           <w:lang w:val="en-GB"/>
         </w:rPr>
-        <w:t>-- Índices para tablas volcadas</w:t>
-      </w:r>
+        <w:t xml:space="preserve">-- </w:t>
+      </w:r>
+      <w:proofErr w:type="spellStart"/>
+      <w:r>
+        <w:rPr>
+          <w:lang w:val="en-GB"/>
+        </w:rPr>
+        <w:t>Índices</w:t>
+      </w:r>
+      <w:proofErr w:type="spellEnd"/>
+      <w:r>
+        <w:rPr>
+          <w:lang w:val="en-GB"/>
+        </w:rPr>
+        <w:t xml:space="preserve"> para </w:t>
+      </w:r>
+      <w:proofErr w:type="spellStart"/>
+      <w:r>
+        <w:rPr>
+          <w:lang w:val="en-GB"/>
+        </w:rPr>
+        <w:t>tablas</w:t>
+      </w:r>
+      <w:proofErr w:type="spellEnd"/>
+      <w:r>
+        <w:rPr>
+          <w:lang w:val="en-GB"/>
+        </w:rPr>
+        <w:t xml:space="preserve"> </w:t>
+      </w:r>
+      <w:proofErr w:type="spellStart"/>
+      <w:r>
+        <w:rPr>
+          <w:lang w:val="en-GB"/>
+        </w:rPr>
+        <w:t>volcadas</w:t>
+      </w:r>
+      <w:proofErr w:type="spellEnd"/>
     </w:p>
     <w:p>
       <w:pPr>
@@ -19585,7 +21386,35 @@
         <w:rPr>
           <w:lang w:val="en-GB"/>
         </w:rPr>
-        <w:t>-- Indices de la tabla `alumnos`</w:t>
+        <w:t xml:space="preserve">-- Indices de la </w:t>
+      </w:r>
+      <w:proofErr w:type="spellStart"/>
+      <w:r>
+        <w:rPr>
+          <w:lang w:val="en-GB"/>
+        </w:rPr>
+        <w:t>tabla</w:t>
+      </w:r>
+      <w:proofErr w:type="spellEnd"/>
+      <w:r>
+        <w:rPr>
+          <w:lang w:val="en-GB"/>
+        </w:rPr>
+        <w:t xml:space="preserve"> `</w:t>
+      </w:r>
+      <w:proofErr w:type="spellStart"/>
+      <w:r>
+        <w:rPr>
+          <w:lang w:val="en-GB"/>
+        </w:rPr>
+        <w:t>alumnos</w:t>
+      </w:r>
+      <w:proofErr w:type="spellEnd"/>
+      <w:r>
+        <w:rPr>
+          <w:lang w:val="en-GB"/>
+        </w:rPr>
+        <w:t>`</w:t>
       </w:r>
     </w:p>
     <w:p>
@@ -19611,7 +21440,21 @@
         <w:rPr>
           <w:lang w:val="en-GB"/>
         </w:rPr>
-        <w:t>ALTER TABLE `alumnos`</w:t>
+        <w:t>ALTER TABLE `</w:t>
+      </w:r>
+      <w:proofErr w:type="spellStart"/>
+      <w:r>
+        <w:rPr>
+          <w:lang w:val="en-GB"/>
+        </w:rPr>
+        <w:t>alumnos</w:t>
+      </w:r>
+      <w:proofErr w:type="spellEnd"/>
+      <w:r>
+        <w:rPr>
+          <w:lang w:val="en-GB"/>
+        </w:rPr>
+        <w:t>`</w:t>
       </w:r>
     </w:p>
     <w:p>
@@ -19624,7 +21467,21 @@
         <w:rPr>
           <w:lang w:val="en-GB"/>
         </w:rPr>
-        <w:t xml:space="preserve">  ADD PRIMARY KEY (`nie`);</w:t>
+        <w:t xml:space="preserve">  ADD PRIMARY KEY (`</w:t>
+      </w:r>
+      <w:proofErr w:type="spellStart"/>
+      <w:r>
+        <w:rPr>
+          <w:lang w:val="en-GB"/>
+        </w:rPr>
+        <w:t>nie</w:t>
+      </w:r>
+      <w:proofErr w:type="spellEnd"/>
+      <w:r>
+        <w:rPr>
+          <w:lang w:val="en-GB"/>
+        </w:rPr>
+        <w:t>`);</w:t>
       </w:r>
     </w:p>
     <w:p>
@@ -19650,7 +21507,35 @@
         <w:rPr>
           <w:lang w:val="en-GB"/>
         </w:rPr>
-        <w:t>-- Indices de la tabla `alumnoscrusoslibros`</w:t>
+        <w:t xml:space="preserve">-- Indices de la </w:t>
+      </w:r>
+      <w:proofErr w:type="spellStart"/>
+      <w:r>
+        <w:rPr>
+          <w:lang w:val="en-GB"/>
+        </w:rPr>
+        <w:t>tabla</w:t>
+      </w:r>
+      <w:proofErr w:type="spellEnd"/>
+      <w:r>
+        <w:rPr>
+          <w:lang w:val="en-GB"/>
+        </w:rPr>
+        <w:t xml:space="preserve"> `</w:t>
+      </w:r>
+      <w:proofErr w:type="spellStart"/>
+      <w:r>
+        <w:rPr>
+          <w:lang w:val="en-GB"/>
+        </w:rPr>
+        <w:t>alumnoscrusoslibros</w:t>
+      </w:r>
+      <w:proofErr w:type="spellEnd"/>
+      <w:r>
+        <w:rPr>
+          <w:lang w:val="en-GB"/>
+        </w:rPr>
+        <w:t>`</w:t>
       </w:r>
     </w:p>
     <w:p>
@@ -19677,7 +21562,21 @@
           <w:lang w:val="en-GB"/>
         </w:rPr>
         <w:lastRenderedPageBreak/>
-        <w:t>ALTER TABLE `alumnoscrusoslibros`</w:t>
+        <w:t>ALTER TABLE `</w:t>
+      </w:r>
+      <w:proofErr w:type="spellStart"/>
+      <w:r>
+        <w:rPr>
+          <w:lang w:val="en-GB"/>
+        </w:rPr>
+        <w:t>alumnoscrusoslibros</w:t>
+      </w:r>
+      <w:proofErr w:type="spellEnd"/>
+      <w:r>
+        <w:rPr>
+          <w:lang w:val="en-GB"/>
+        </w:rPr>
+        <w:t>`</w:t>
       </w:r>
     </w:p>
     <w:p>
@@ -19690,7 +21589,53 @@
         <w:rPr>
           <w:lang w:val="en-GB"/>
         </w:rPr>
-        <w:t xml:space="preserve">  ADD PRIMARY KEY (`nie`,`curso`,`isbn`),</w:t>
+        <w:t xml:space="preserve">  ADD PRIMARY KEY (`</w:t>
+      </w:r>
+      <w:proofErr w:type="spellStart"/>
+      <w:r>
+        <w:rPr>
+          <w:lang w:val="en-GB"/>
+        </w:rPr>
+        <w:t>nie</w:t>
+      </w:r>
+      <w:proofErr w:type="spellEnd"/>
+      <w:proofErr w:type="gramStart"/>
+      <w:r>
+        <w:rPr>
+          <w:lang w:val="en-GB"/>
+        </w:rPr>
+        <w:t>`,`</w:t>
+      </w:r>
+      <w:proofErr w:type="spellStart"/>
+      <w:proofErr w:type="gramEnd"/>
+      <w:r>
+        <w:rPr>
+          <w:lang w:val="en-GB"/>
+        </w:rPr>
+        <w:t>curso</w:t>
+      </w:r>
+      <w:proofErr w:type="spellEnd"/>
+      <w:proofErr w:type="gramStart"/>
+      <w:r>
+        <w:rPr>
+          <w:lang w:val="en-GB"/>
+        </w:rPr>
+        <w:t>`,`</w:t>
+      </w:r>
+      <w:proofErr w:type="spellStart"/>
+      <w:proofErr w:type="gramEnd"/>
+      <w:r>
+        <w:rPr>
+          <w:lang w:val="en-GB"/>
+        </w:rPr>
+        <w:t>isbn</w:t>
+      </w:r>
+      <w:proofErr w:type="spellEnd"/>
+      <w:r>
+        <w:rPr>
+          <w:lang w:val="en-GB"/>
+        </w:rPr>
+        <w:t>`),</w:t>
       </w:r>
     </w:p>
     <w:p>
@@ -19703,7 +21648,35 @@
         <w:rPr>
           <w:lang w:val="en-GB"/>
         </w:rPr>
-        <w:t xml:space="preserve">  ADD KEY `isbn` (`isbn`),</w:t>
+        <w:t xml:space="preserve">  ADD KEY `</w:t>
+      </w:r>
+      <w:proofErr w:type="spellStart"/>
+      <w:r>
+        <w:rPr>
+          <w:lang w:val="en-GB"/>
+        </w:rPr>
+        <w:t>isbn</w:t>
+      </w:r>
+      <w:proofErr w:type="spellEnd"/>
+      <w:r>
+        <w:rPr>
+          <w:lang w:val="en-GB"/>
+        </w:rPr>
+        <w:t>` (`</w:t>
+      </w:r>
+      <w:proofErr w:type="spellStart"/>
+      <w:r>
+        <w:rPr>
+          <w:lang w:val="en-GB"/>
+        </w:rPr>
+        <w:t>isbn</w:t>
+      </w:r>
+      <w:proofErr w:type="spellEnd"/>
+      <w:r>
+        <w:rPr>
+          <w:lang w:val="en-GB"/>
+        </w:rPr>
+        <w:t>`),</w:t>
       </w:r>
     </w:p>
     <w:p>
@@ -19716,7 +21689,35 @@
         <w:rPr>
           <w:lang w:val="en-GB"/>
         </w:rPr>
-        <w:t xml:space="preserve">  ADD KEY `curso` (`curso`);</w:t>
+        <w:t xml:space="preserve">  ADD KEY `</w:t>
+      </w:r>
+      <w:proofErr w:type="spellStart"/>
+      <w:r>
+        <w:rPr>
+          <w:lang w:val="en-GB"/>
+        </w:rPr>
+        <w:t>curso</w:t>
+      </w:r>
+      <w:proofErr w:type="spellEnd"/>
+      <w:r>
+        <w:rPr>
+          <w:lang w:val="en-GB"/>
+        </w:rPr>
+        <w:t>` (`</w:t>
+      </w:r>
+      <w:proofErr w:type="spellStart"/>
+      <w:r>
+        <w:rPr>
+          <w:lang w:val="en-GB"/>
+        </w:rPr>
+        <w:t>curso</w:t>
+      </w:r>
+      <w:proofErr w:type="spellEnd"/>
+      <w:r>
+        <w:rPr>
+          <w:lang w:val="en-GB"/>
+        </w:rPr>
+        <w:t>`);</w:t>
       </w:r>
     </w:p>
     <w:p>
@@ -19742,7 +21743,35 @@
         <w:rPr>
           <w:lang w:val="en-GB"/>
         </w:rPr>
-        <w:t>-- Indices de la tabla `cursos`</w:t>
+        <w:t xml:space="preserve">-- Indices de la </w:t>
+      </w:r>
+      <w:proofErr w:type="spellStart"/>
+      <w:r>
+        <w:rPr>
+          <w:lang w:val="en-GB"/>
+        </w:rPr>
+        <w:t>tabla</w:t>
+      </w:r>
+      <w:proofErr w:type="spellEnd"/>
+      <w:r>
+        <w:rPr>
+          <w:lang w:val="en-GB"/>
+        </w:rPr>
+        <w:t xml:space="preserve"> `</w:t>
+      </w:r>
+      <w:proofErr w:type="spellStart"/>
+      <w:r>
+        <w:rPr>
+          <w:lang w:val="en-GB"/>
+        </w:rPr>
+        <w:t>cursos</w:t>
+      </w:r>
+      <w:proofErr w:type="spellEnd"/>
+      <w:r>
+        <w:rPr>
+          <w:lang w:val="en-GB"/>
+        </w:rPr>
+        <w:t>`</w:t>
       </w:r>
     </w:p>
     <w:p>
@@ -19768,7 +21797,21 @@
         <w:rPr>
           <w:lang w:val="en-GB"/>
         </w:rPr>
-        <w:t>ALTER TABLE `cursos`</w:t>
+        <w:t>ALTER TABLE `</w:t>
+      </w:r>
+      <w:proofErr w:type="spellStart"/>
+      <w:r>
+        <w:rPr>
+          <w:lang w:val="en-GB"/>
+        </w:rPr>
+        <w:t>cursos</w:t>
+      </w:r>
+      <w:proofErr w:type="spellEnd"/>
+      <w:r>
+        <w:rPr>
+          <w:lang w:val="en-GB"/>
+        </w:rPr>
+        <w:t>`</w:t>
       </w:r>
     </w:p>
     <w:p>
@@ -19781,7 +21824,21 @@
         <w:rPr>
           <w:lang w:val="en-GB"/>
         </w:rPr>
-        <w:t xml:space="preserve">  ADD PRIMARY KEY (`curso`);</w:t>
+        <w:t xml:space="preserve">  ADD PRIMARY KEY (`</w:t>
+      </w:r>
+      <w:proofErr w:type="spellStart"/>
+      <w:r>
+        <w:rPr>
+          <w:lang w:val="en-GB"/>
+        </w:rPr>
+        <w:t>curso</w:t>
+      </w:r>
+      <w:proofErr w:type="spellEnd"/>
+      <w:r>
+        <w:rPr>
+          <w:lang w:val="en-GB"/>
+        </w:rPr>
+        <w:t>`);</w:t>
       </w:r>
     </w:p>
     <w:p>
@@ -19807,7 +21864,35 @@
         <w:rPr>
           <w:lang w:val="en-GB"/>
         </w:rPr>
-        <w:t>-- Indices de la tabla `libros`</w:t>
+        <w:t xml:space="preserve">-- Indices de la </w:t>
+      </w:r>
+      <w:proofErr w:type="spellStart"/>
+      <w:r>
+        <w:rPr>
+          <w:lang w:val="en-GB"/>
+        </w:rPr>
+        <w:t>tabla</w:t>
+      </w:r>
+      <w:proofErr w:type="spellEnd"/>
+      <w:r>
+        <w:rPr>
+          <w:lang w:val="en-GB"/>
+        </w:rPr>
+        <w:t xml:space="preserve"> `</w:t>
+      </w:r>
+      <w:proofErr w:type="spellStart"/>
+      <w:r>
+        <w:rPr>
+          <w:lang w:val="en-GB"/>
+        </w:rPr>
+        <w:t>libros</w:t>
+      </w:r>
+      <w:proofErr w:type="spellEnd"/>
+      <w:r>
+        <w:rPr>
+          <w:lang w:val="en-GB"/>
+        </w:rPr>
+        <w:t>`</w:t>
       </w:r>
     </w:p>
     <w:p>
@@ -19833,7 +21918,21 @@
         <w:rPr>
           <w:lang w:val="en-GB"/>
         </w:rPr>
-        <w:t>ALTER TABLE `libros`</w:t>
+        <w:t>ALTER TABLE `</w:t>
+      </w:r>
+      <w:proofErr w:type="spellStart"/>
+      <w:r>
+        <w:rPr>
+          <w:lang w:val="en-GB"/>
+        </w:rPr>
+        <w:t>libros</w:t>
+      </w:r>
+      <w:proofErr w:type="spellEnd"/>
+      <w:r>
+        <w:rPr>
+          <w:lang w:val="en-GB"/>
+        </w:rPr>
+        <w:t>`</w:t>
       </w:r>
     </w:p>
     <w:p>
@@ -19846,7 +21945,21 @@
         <w:rPr>
           <w:lang w:val="en-GB"/>
         </w:rPr>
-        <w:t xml:space="preserve">  ADD PRIMARY KEY (`isbn`),</w:t>
+        <w:t xml:space="preserve">  ADD PRIMARY KEY (`</w:t>
+      </w:r>
+      <w:proofErr w:type="spellStart"/>
+      <w:r>
+        <w:rPr>
+          <w:lang w:val="en-GB"/>
+        </w:rPr>
+        <w:t>isbn</w:t>
+      </w:r>
+      <w:proofErr w:type="spellEnd"/>
+      <w:r>
+        <w:rPr>
+          <w:lang w:val="en-GB"/>
+        </w:rPr>
+        <w:t>`),</w:t>
       </w:r>
     </w:p>
     <w:p>
@@ -19859,7 +21972,35 @@
         <w:rPr>
           <w:lang w:val="en-GB"/>
         </w:rPr>
-        <w:t xml:space="preserve">  ADD KEY `FK_Materias` (`id_materia`),</w:t>
+        <w:t xml:space="preserve">  ADD KEY `</w:t>
+      </w:r>
+      <w:proofErr w:type="spellStart"/>
+      <w:r>
+        <w:rPr>
+          <w:lang w:val="en-GB"/>
+        </w:rPr>
+        <w:t>FK_Materias</w:t>
+      </w:r>
+      <w:proofErr w:type="spellEnd"/>
+      <w:r>
+        <w:rPr>
+          <w:lang w:val="en-GB"/>
+        </w:rPr>
+        <w:t>` (`</w:t>
+      </w:r>
+      <w:proofErr w:type="spellStart"/>
+      <w:r>
+        <w:rPr>
+          <w:lang w:val="en-GB"/>
+        </w:rPr>
+        <w:t>id_materia</w:t>
+      </w:r>
+      <w:proofErr w:type="spellEnd"/>
+      <w:r>
+        <w:rPr>
+          <w:lang w:val="en-GB"/>
+        </w:rPr>
+        <w:t>`),</w:t>
       </w:r>
     </w:p>
     <w:p>
@@ -19872,7 +22013,35 @@
         <w:rPr>
           <w:lang w:val="en-GB"/>
         </w:rPr>
-        <w:t xml:space="preserve">  ADD KEY `FK_Cursos` (`id_curso`) USING BTREE;</w:t>
+        <w:t xml:space="preserve">  ADD KEY `</w:t>
+      </w:r>
+      <w:proofErr w:type="spellStart"/>
+      <w:r>
+        <w:rPr>
+          <w:lang w:val="en-GB"/>
+        </w:rPr>
+        <w:t>FK_Cursos</w:t>
+      </w:r>
+      <w:proofErr w:type="spellEnd"/>
+      <w:r>
+        <w:rPr>
+          <w:lang w:val="en-GB"/>
+        </w:rPr>
+        <w:t>` (`</w:t>
+      </w:r>
+      <w:proofErr w:type="spellStart"/>
+      <w:r>
+        <w:rPr>
+          <w:lang w:val="en-GB"/>
+        </w:rPr>
+        <w:t>id_curso</w:t>
+      </w:r>
+      <w:proofErr w:type="spellEnd"/>
+      <w:r>
+        <w:rPr>
+          <w:lang w:val="en-GB"/>
+        </w:rPr>
+        <w:t>`) USING BTREE;</w:t>
       </w:r>
     </w:p>
     <w:p>
@@ -19898,7 +22067,35 @@
         <w:rPr>
           <w:lang w:val="en-GB"/>
         </w:rPr>
-        <w:t>-- Indices de la tabla `materias`</w:t>
+        <w:t xml:space="preserve">-- Indices de la </w:t>
+      </w:r>
+      <w:proofErr w:type="spellStart"/>
+      <w:r>
+        <w:rPr>
+          <w:lang w:val="en-GB"/>
+        </w:rPr>
+        <w:t>tabla</w:t>
+      </w:r>
+      <w:proofErr w:type="spellEnd"/>
+      <w:r>
+        <w:rPr>
+          <w:lang w:val="en-GB"/>
+        </w:rPr>
+        <w:t xml:space="preserve"> `</w:t>
+      </w:r>
+      <w:proofErr w:type="spellStart"/>
+      <w:r>
+        <w:rPr>
+          <w:lang w:val="en-GB"/>
+        </w:rPr>
+        <w:t>materias</w:t>
+      </w:r>
+      <w:proofErr w:type="spellEnd"/>
+      <w:r>
+        <w:rPr>
+          <w:lang w:val="en-GB"/>
+        </w:rPr>
+        <w:t>`</w:t>
       </w:r>
     </w:p>
     <w:p>
@@ -19924,7 +22121,21 @@
         <w:rPr>
           <w:lang w:val="en-GB"/>
         </w:rPr>
-        <w:t>ALTER TABLE `materias`</w:t>
+        <w:t>ALTER TABLE `</w:t>
+      </w:r>
+      <w:proofErr w:type="spellStart"/>
+      <w:r>
+        <w:rPr>
+          <w:lang w:val="en-GB"/>
+        </w:rPr>
+        <w:t>materias</w:t>
+      </w:r>
+      <w:proofErr w:type="spellEnd"/>
+      <w:r>
+        <w:rPr>
+          <w:lang w:val="en-GB"/>
+        </w:rPr>
+        <w:t>`</w:t>
       </w:r>
     </w:p>
     <w:p>
@@ -19950,8 +22161,30 @@
         <w:rPr>
           <w:lang w:val="en-GB"/>
         </w:rPr>
-        <w:t>-- Restricciones para tablas volcadas</w:t>
-      </w:r>
+        <w:t xml:space="preserve">-- Restricciones para </w:t>
+      </w:r>
+      <w:proofErr w:type="spellStart"/>
+      <w:r>
+        <w:rPr>
+          <w:lang w:val="en-GB"/>
+        </w:rPr>
+        <w:t>tablas</w:t>
+      </w:r>
+      <w:proofErr w:type="spellEnd"/>
+      <w:r>
+        <w:rPr>
+          <w:lang w:val="en-GB"/>
+        </w:rPr>
+        <w:t xml:space="preserve"> </w:t>
+      </w:r>
+      <w:proofErr w:type="spellStart"/>
+      <w:r>
+        <w:rPr>
+          <w:lang w:val="en-GB"/>
+        </w:rPr>
+        <w:t>volcadas</w:t>
+      </w:r>
+      <w:proofErr w:type="spellEnd"/>
     </w:p>
     <w:p>
       <w:pPr>
@@ -19989,7 +22222,49 @@
         <w:rPr>
           <w:lang w:val="en-GB"/>
         </w:rPr>
-        <w:t>-- Filtros para la tabla `alumnoscrusoslibros`</w:t>
+        <w:t xml:space="preserve">-- </w:t>
+      </w:r>
+      <w:proofErr w:type="spellStart"/>
+      <w:r>
+        <w:rPr>
+          <w:lang w:val="en-GB"/>
+        </w:rPr>
+        <w:t>Filtros</w:t>
+      </w:r>
+      <w:proofErr w:type="spellEnd"/>
+      <w:r>
+        <w:rPr>
+          <w:lang w:val="en-GB"/>
+        </w:rPr>
+        <w:t xml:space="preserve"> para la </w:t>
+      </w:r>
+      <w:proofErr w:type="spellStart"/>
+      <w:r>
+        <w:rPr>
+          <w:lang w:val="en-GB"/>
+        </w:rPr>
+        <w:t>tabla</w:t>
+      </w:r>
+      <w:proofErr w:type="spellEnd"/>
+      <w:r>
+        <w:rPr>
+          <w:lang w:val="en-GB"/>
+        </w:rPr>
+        <w:t xml:space="preserve"> `</w:t>
+      </w:r>
+      <w:proofErr w:type="spellStart"/>
+      <w:r>
+        <w:rPr>
+          <w:lang w:val="en-GB"/>
+        </w:rPr>
+        <w:t>alumnoscrusoslibros</w:t>
+      </w:r>
+      <w:proofErr w:type="spellEnd"/>
+      <w:r>
+        <w:rPr>
+          <w:lang w:val="en-GB"/>
+        </w:rPr>
+        <w:t>`</w:t>
       </w:r>
     </w:p>
     <w:p>
@@ -20015,7 +22290,21 @@
         <w:rPr>
           <w:lang w:val="en-GB"/>
         </w:rPr>
-        <w:t>ALTER TABLE `alumnoscrusoslibros`</w:t>
+        <w:t>ALTER TABLE `</w:t>
+      </w:r>
+      <w:proofErr w:type="spellStart"/>
+      <w:r>
+        <w:rPr>
+          <w:lang w:val="en-GB"/>
+        </w:rPr>
+        <w:t>alumnoscrusoslibros</w:t>
+      </w:r>
+      <w:proofErr w:type="spellEnd"/>
+      <w:r>
+        <w:rPr>
+          <w:lang w:val="en-GB"/>
+        </w:rPr>
+        <w:t>`</w:t>
       </w:r>
     </w:p>
     <w:p>
@@ -20028,7 +22317,49 @@
         <w:rPr>
           <w:lang w:val="en-GB"/>
         </w:rPr>
-        <w:t xml:space="preserve">  ADD CONSTRAINT `alumnoscrusoslibros_ibfk_1` FOREIGN KEY (`isbn`) REFERENCES `libros` (`isbn`) ON DELETE CASCADE ON UPDATE CASCADE,</w:t>
+        <w:t xml:space="preserve">  ADD CONSTRAINT `alumnoscrusoslibros_ibfk_1` FOREIGN KEY (`</w:t>
+      </w:r>
+      <w:proofErr w:type="spellStart"/>
+      <w:r>
+        <w:rPr>
+          <w:lang w:val="en-GB"/>
+        </w:rPr>
+        <w:t>isbn</w:t>
+      </w:r>
+      <w:proofErr w:type="spellEnd"/>
+      <w:r>
+        <w:rPr>
+          <w:lang w:val="en-GB"/>
+        </w:rPr>
+        <w:t>`) REFERENCES `</w:t>
+      </w:r>
+      <w:proofErr w:type="spellStart"/>
+      <w:r>
+        <w:rPr>
+          <w:lang w:val="en-GB"/>
+        </w:rPr>
+        <w:t>libros</w:t>
+      </w:r>
+      <w:proofErr w:type="spellEnd"/>
+      <w:r>
+        <w:rPr>
+          <w:lang w:val="en-GB"/>
+        </w:rPr>
+        <w:t>` (`</w:t>
+      </w:r>
+      <w:proofErr w:type="spellStart"/>
+      <w:r>
+        <w:rPr>
+          <w:lang w:val="en-GB"/>
+        </w:rPr>
+        <w:t>isbn</w:t>
+      </w:r>
+      <w:proofErr w:type="spellEnd"/>
+      <w:r>
+        <w:rPr>
+          <w:lang w:val="en-GB"/>
+        </w:rPr>
+        <w:t>`) ON DELETE CASCADE ON UPDATE CASCADE,</w:t>
       </w:r>
     </w:p>
     <w:p>
@@ -20041,7 +22372,49 @@
         <w:rPr>
           <w:lang w:val="en-GB"/>
         </w:rPr>
-        <w:t xml:space="preserve">  ADD CONSTRAINT `alumnoscrusoslibros_ibfk_2` FOREIGN KEY (`nie`) REFERENCES `alumnos` (`nie`) ON DELETE CASCADE ON UPDATE CASCADE,</w:t>
+        <w:t xml:space="preserve">  ADD CONSTRAINT `alumnoscrusoslibros_ibfk_2` FOREIGN KEY (`</w:t>
+      </w:r>
+      <w:proofErr w:type="spellStart"/>
+      <w:r>
+        <w:rPr>
+          <w:lang w:val="en-GB"/>
+        </w:rPr>
+        <w:t>nie</w:t>
+      </w:r>
+      <w:proofErr w:type="spellEnd"/>
+      <w:r>
+        <w:rPr>
+          <w:lang w:val="en-GB"/>
+        </w:rPr>
+        <w:t>`) REFERENCES `</w:t>
+      </w:r>
+      <w:proofErr w:type="spellStart"/>
+      <w:r>
+        <w:rPr>
+          <w:lang w:val="en-GB"/>
+        </w:rPr>
+        <w:t>alumnos</w:t>
+      </w:r>
+      <w:proofErr w:type="spellEnd"/>
+      <w:r>
+        <w:rPr>
+          <w:lang w:val="en-GB"/>
+        </w:rPr>
+        <w:t>` (`</w:t>
+      </w:r>
+      <w:proofErr w:type="spellStart"/>
+      <w:r>
+        <w:rPr>
+          <w:lang w:val="en-GB"/>
+        </w:rPr>
+        <w:t>nie</w:t>
+      </w:r>
+      <w:proofErr w:type="spellEnd"/>
+      <w:r>
+        <w:rPr>
+          <w:lang w:val="en-GB"/>
+        </w:rPr>
+        <w:t>`) ON DELETE CASCADE ON UPDATE CASCADE,</w:t>
       </w:r>
     </w:p>
     <w:p>
@@ -20054,7 +22427,49 @@
         <w:rPr>
           <w:lang w:val="en-GB"/>
         </w:rPr>
-        <w:t xml:space="preserve">  ADD CONSTRAINT `alumnoscrusoslibros_ibfk_3` FOREIGN KEY (`curso`) REFERENCES `cursos` (`curso`) ON DELETE CASCADE ON UPDATE CASCADE;</w:t>
+        <w:t xml:space="preserve">  ADD CONSTRAINT `alumnoscrusoslibros_ibfk_3` FOREIGN KEY (`</w:t>
+      </w:r>
+      <w:proofErr w:type="spellStart"/>
+      <w:r>
+        <w:rPr>
+          <w:lang w:val="en-GB"/>
+        </w:rPr>
+        <w:t>curso</w:t>
+      </w:r>
+      <w:proofErr w:type="spellEnd"/>
+      <w:r>
+        <w:rPr>
+          <w:lang w:val="en-GB"/>
+        </w:rPr>
+        <w:t>`) REFERENCES `</w:t>
+      </w:r>
+      <w:proofErr w:type="spellStart"/>
+      <w:r>
+        <w:rPr>
+          <w:lang w:val="en-GB"/>
+        </w:rPr>
+        <w:t>cursos</w:t>
+      </w:r>
+      <w:proofErr w:type="spellEnd"/>
+      <w:r>
+        <w:rPr>
+          <w:lang w:val="en-GB"/>
+        </w:rPr>
+        <w:t>` (`</w:t>
+      </w:r>
+      <w:proofErr w:type="spellStart"/>
+      <w:r>
+        <w:rPr>
+          <w:lang w:val="en-GB"/>
+        </w:rPr>
+        <w:t>curso</w:t>
+      </w:r>
+      <w:proofErr w:type="spellEnd"/>
+      <w:r>
+        <w:rPr>
+          <w:lang w:val="en-GB"/>
+        </w:rPr>
+        <w:t>`) ON DELETE CASCADE ON UPDATE CASCADE;</w:t>
       </w:r>
     </w:p>
     <w:p>
@@ -20080,7 +22495,49 @@
         <w:rPr>
           <w:lang w:val="en-GB"/>
         </w:rPr>
-        <w:t>-- Filtros para la tabla `libros`</w:t>
+        <w:t xml:space="preserve">-- </w:t>
+      </w:r>
+      <w:proofErr w:type="spellStart"/>
+      <w:r>
+        <w:rPr>
+          <w:lang w:val="en-GB"/>
+        </w:rPr>
+        <w:t>Filtros</w:t>
+      </w:r>
+      <w:proofErr w:type="spellEnd"/>
+      <w:r>
+        <w:rPr>
+          <w:lang w:val="en-GB"/>
+        </w:rPr>
+        <w:t xml:space="preserve"> para la </w:t>
+      </w:r>
+      <w:proofErr w:type="spellStart"/>
+      <w:r>
+        <w:rPr>
+          <w:lang w:val="en-GB"/>
+        </w:rPr>
+        <w:t>tabla</w:t>
+      </w:r>
+      <w:proofErr w:type="spellEnd"/>
+      <w:r>
+        <w:rPr>
+          <w:lang w:val="en-GB"/>
+        </w:rPr>
+        <w:t xml:space="preserve"> `</w:t>
+      </w:r>
+      <w:proofErr w:type="spellStart"/>
+      <w:r>
+        <w:rPr>
+          <w:lang w:val="en-GB"/>
+        </w:rPr>
+        <w:t>libros</w:t>
+      </w:r>
+      <w:proofErr w:type="spellEnd"/>
+      <w:r>
+        <w:rPr>
+          <w:lang w:val="en-GB"/>
+        </w:rPr>
+        <w:t>`</w:t>
       </w:r>
     </w:p>
     <w:p>
@@ -20106,7 +22563,21 @@
         <w:rPr>
           <w:lang w:val="en-GB"/>
         </w:rPr>
-        <w:t>ALTER TABLE `libros`</w:t>
+        <w:t>ALTER TABLE `</w:t>
+      </w:r>
+      <w:proofErr w:type="spellStart"/>
+      <w:r>
+        <w:rPr>
+          <w:lang w:val="en-GB"/>
+        </w:rPr>
+        <w:t>libros</w:t>
+      </w:r>
+      <w:proofErr w:type="spellEnd"/>
+      <w:r>
+        <w:rPr>
+          <w:lang w:val="en-GB"/>
+        </w:rPr>
+        <w:t>`</w:t>
       </w:r>
     </w:p>
     <w:p>
@@ -20119,7 +22590,63 @@
         <w:rPr>
           <w:lang w:val="en-GB"/>
         </w:rPr>
-        <w:t xml:space="preserve">  ADD CONSTRAINT `fk_libros_cursos` FOREIGN KEY (`id_curso`) REFERENCES `cursos` (`curso`) ON DELETE CASCADE ON UPDATE CASCADE,</w:t>
+        <w:t xml:space="preserve">  ADD CONSTRAINT `</w:t>
+      </w:r>
+      <w:proofErr w:type="spellStart"/>
+      <w:r>
+        <w:rPr>
+          <w:lang w:val="en-GB"/>
+        </w:rPr>
+        <w:t>fk_libros_cursos</w:t>
+      </w:r>
+      <w:proofErr w:type="spellEnd"/>
+      <w:r>
+        <w:rPr>
+          <w:lang w:val="en-GB"/>
+        </w:rPr>
+        <w:t>` FOREIGN KEY (`</w:t>
+      </w:r>
+      <w:proofErr w:type="spellStart"/>
+      <w:r>
+        <w:rPr>
+          <w:lang w:val="en-GB"/>
+        </w:rPr>
+        <w:t>id_curso</w:t>
+      </w:r>
+      <w:proofErr w:type="spellEnd"/>
+      <w:r>
+        <w:rPr>
+          <w:lang w:val="en-GB"/>
+        </w:rPr>
+        <w:t>`) REFERENCES `</w:t>
+      </w:r>
+      <w:proofErr w:type="spellStart"/>
+      <w:r>
+        <w:rPr>
+          <w:lang w:val="en-GB"/>
+        </w:rPr>
+        <w:t>cursos</w:t>
+      </w:r>
+      <w:proofErr w:type="spellEnd"/>
+      <w:r>
+        <w:rPr>
+          <w:lang w:val="en-GB"/>
+        </w:rPr>
+        <w:t>` (`</w:t>
+      </w:r>
+      <w:proofErr w:type="spellStart"/>
+      <w:r>
+        <w:rPr>
+          <w:lang w:val="en-GB"/>
+        </w:rPr>
+        <w:t>curso</w:t>
+      </w:r>
+      <w:proofErr w:type="spellEnd"/>
+      <w:r>
+        <w:rPr>
+          <w:lang w:val="en-GB"/>
+        </w:rPr>
+        <w:t>`) ON DELETE CASCADE ON UPDATE CASCADE,</w:t>
       </w:r>
     </w:p>
     <w:p>
@@ -20132,7 +22659,49 @@
         <w:rPr>
           <w:lang w:val="en-GB"/>
         </w:rPr>
-        <w:t xml:space="preserve">  ADD CONSTRAINT `fk_libros_materias` FOREIGN KEY (`id_materia`) REFERENCES `materias` (`id`) ON DELETE CASCADE ON UPDATE CASCADE;</w:t>
+        <w:t xml:space="preserve">  ADD CONSTRAINT `</w:t>
+      </w:r>
+      <w:proofErr w:type="spellStart"/>
+      <w:r>
+        <w:rPr>
+          <w:lang w:val="en-GB"/>
+        </w:rPr>
+        <w:t>fk_libros_materias</w:t>
+      </w:r>
+      <w:proofErr w:type="spellEnd"/>
+      <w:r>
+        <w:rPr>
+          <w:lang w:val="en-GB"/>
+        </w:rPr>
+        <w:t>` FOREIGN KEY (`</w:t>
+      </w:r>
+      <w:proofErr w:type="spellStart"/>
+      <w:r>
+        <w:rPr>
+          <w:lang w:val="en-GB"/>
+        </w:rPr>
+        <w:t>id_materia</w:t>
+      </w:r>
+      <w:proofErr w:type="spellEnd"/>
+      <w:r>
+        <w:rPr>
+          <w:lang w:val="en-GB"/>
+        </w:rPr>
+        <w:t>`) REFERENCES `</w:t>
+      </w:r>
+      <w:proofErr w:type="spellStart"/>
+      <w:r>
+        <w:rPr>
+          <w:lang w:val="en-GB"/>
+        </w:rPr>
+        <w:t>materias</w:t>
+      </w:r>
+      <w:proofErr w:type="spellEnd"/>
+      <w:r>
+        <w:rPr>
+          <w:lang w:val="en-GB"/>
+        </w:rPr>
+        <w:t>` (`id`) ON DELETE CASCADE ON UPDATE CASCADE;</w:t>
       </w:r>
     </w:p>
     <w:p>
@@ -20848,7 +23417,25 @@
                 <w:sz w:val="16"/>
                 <w:szCs w:val="16"/>
               </w:rPr>
-              <w:t xml:space="preserve"> edge?</w:t>
+              <w:t xml:space="preserve"> </w:t>
+            </w:r>
+            <w:proofErr w:type="spellStart"/>
+            <w:r>
+              <w:rPr>
+                <w:rFonts w:cstheme="minorHAnsi"/>
+                <w:sz w:val="16"/>
+                <w:szCs w:val="16"/>
+              </w:rPr>
+              <w:t>edge</w:t>
+            </w:r>
+            <w:proofErr w:type="spellEnd"/>
+            <w:r>
+              <w:rPr>
+                <w:rFonts w:cstheme="minorHAnsi"/>
+                <w:sz w:val="16"/>
+                <w:szCs w:val="16"/>
+              </w:rPr>
+              <w:t>?</w:t>
             </w:r>
           </w:p>
         </w:tc>
@@ -21066,7 +23653,25 @@
                 <w:sz w:val="16"/>
                 <w:szCs w:val="16"/>
               </w:rPr>
-              <w:t xml:space="preserve"> chrome?</w:t>
+              <w:t xml:space="preserve"> </w:t>
+            </w:r>
+            <w:proofErr w:type="spellStart"/>
+            <w:r>
+              <w:rPr>
+                <w:rFonts w:cstheme="minorHAnsi"/>
+                <w:sz w:val="16"/>
+                <w:szCs w:val="16"/>
+              </w:rPr>
+              <w:t>chrome</w:t>
+            </w:r>
+            <w:proofErr w:type="spellEnd"/>
+            <w:r>
+              <w:rPr>
+                <w:rFonts w:cstheme="minorHAnsi"/>
+                <w:sz w:val="16"/>
+                <w:szCs w:val="16"/>
+              </w:rPr>
+              <w:t>?</w:t>
             </w:r>
           </w:p>
         </w:tc>
@@ -22790,7 +25395,25 @@
                 <w:sz w:val="16"/>
                 <w:szCs w:val="16"/>
               </w:rPr>
-              <w:t>¿Funciona con táblets?</w:t>
+              <w:t xml:space="preserve">¿Funciona con </w:t>
+            </w:r>
+            <w:proofErr w:type="spellStart"/>
+            <w:r>
+              <w:rPr>
+                <w:rFonts w:cstheme="minorHAnsi"/>
+                <w:sz w:val="16"/>
+                <w:szCs w:val="16"/>
+              </w:rPr>
+              <w:t>táblets</w:t>
+            </w:r>
+            <w:proofErr w:type="spellEnd"/>
+            <w:r>
+              <w:rPr>
+                <w:rFonts w:cstheme="minorHAnsi"/>
+                <w:sz w:val="16"/>
+                <w:szCs w:val="16"/>
+              </w:rPr>
+              <w:t>?</w:t>
             </w:r>
           </w:p>
         </w:tc>
@@ -25901,7 +28524,15 @@
     <w:p/>
     <w:p>
       <w:r>
-        <w:t>También se ha modificado la parte de préstamos en la tabla alumnoscursoslibros, añadiendo y controlando mejor los campos de fecha de entrega, fecha de devolución y el estado del préstamo, ya que al principio no estaba del todo bien controlado.</w:t>
+        <w:t xml:space="preserve">También se ha modificado la parte de préstamos en la tabla </w:t>
+      </w:r>
+      <w:proofErr w:type="spellStart"/>
+      <w:r>
+        <w:t>alumnoscursoslibros</w:t>
+      </w:r>
+      <w:proofErr w:type="spellEnd"/>
+      <w:r>
+        <w:t>, añadiendo y controlando mejor los campos de fecha de entrega, fecha de devolución y el estado del préstamo, ya que al principio no estaba del todo bien controlado.</w:t>
       </w:r>
     </w:p>
     <w:p/>
@@ -25913,7 +28544,13 @@
     <w:p>
       <w:r>
         <w:lastRenderedPageBreak/>
-        <w:t>Otra cosa que se ha visto necesaria es controlar mejor el stock de libros, ya que sin esto se podían hacer préstamos aunque no hubiera ejemplares disponibles, así que se ha reforzado esa parte en la lógica del programa.</w:t>
+        <w:t xml:space="preserve">Otra cosa que se ha visto necesaria es controlar mejor el stock de libros, ya que sin esto se podían hacer </w:t>
+      </w:r>
+      <w:r>
+        <w:t>préstamos,</w:t>
+      </w:r>
+      <w:r>
+        <w:t xml:space="preserve"> aunque no hubiera ejemplares disponibles, así que se ha reforzado esa parte en la lógica del programa.</w:t>
       </w:r>
     </w:p>
     <w:p/>
@@ -26588,7 +29225,7 @@
                         </pic:cNvPicPr>
                       </pic:nvPicPr>
                       <pic:blipFill>
-                        <a:blip r:embed="rId40" cstate="print">
+                        <a:blip r:embed="rId47" cstate="print">
                           <a:extLst>
                             <a:ext uri="{28A0092B-C50C-407E-A947-70E740481C1C}">
                               <a14:useLocalDpi xmlns:a14="http://schemas.microsoft.com/office/drawing/2010/main" val="0"/>
@@ -26634,8 +29271,16 @@
               <w:b w:val="0"/>
             </w:rPr>
             <w:lastRenderedPageBreak/>
-            <w:t>Fichero exportado de Delphos</w:t>
+            <w:t xml:space="preserve">Fichero exportado de </w:t>
           </w:r>
+          <w:proofErr w:type="spellStart"/>
+          <w:r>
+            <w:rPr>
+              <w:b w:val="0"/>
+            </w:rPr>
+            <w:t>Delphos</w:t>
+          </w:r>
+          <w:proofErr w:type="spellEnd"/>
           <w:r>
             <w:rPr>
               <w:b w:val="0"/>
@@ -26672,7 +29317,7 @@
                         </pic:cNvPicPr>
                       </pic:nvPicPr>
                       <pic:blipFill>
-                        <a:blip r:embed="rId41" cstate="print">
+                        <a:blip r:embed="rId48" cstate="print">
                           <a:extLst>
                             <a:ext uri="{28A0092B-C50C-407E-A947-70E740481C1C}">
                               <a14:useLocalDpi xmlns:a14="http://schemas.microsoft.com/office/drawing/2010/main" val="0"/>
@@ -26723,8 +29368,141 @@
             <w:t xml:space="preserve"> (Apellidos, Nombre)</w:t>
           </w:r>
           <w:r>
-            <w:t>, NumeroEscolar, NumeroSolicitud, FechaSolicitud, CampoNoNecesario, CursoAcadémico, CampoNoNecesario, CampoNoNecesario, CampoNoNecesario, CampoNoNecesario, CampoNoNecesario, CampoNoNecesario, CampoNoNecesario, CampoNoNecesario, ResultadoLibros, ResultadoComedor, Matriculado, TipoBecaLibros, TipoBecaComedor</w:t>
+            <w:t xml:space="preserve">, </w:t>
           </w:r>
+          <w:proofErr w:type="spellStart"/>
+          <w:r>
+            <w:t>NumeroEscolar</w:t>
+          </w:r>
+          <w:proofErr w:type="spellEnd"/>
+          <w:r>
+            <w:t xml:space="preserve">, </w:t>
+          </w:r>
+          <w:proofErr w:type="spellStart"/>
+          <w:r>
+            <w:t>NumeroSolicitud</w:t>
+          </w:r>
+          <w:proofErr w:type="spellEnd"/>
+          <w:r>
+            <w:t xml:space="preserve">, </w:t>
+          </w:r>
+          <w:proofErr w:type="spellStart"/>
+          <w:r>
+            <w:t>FechaSolicitud</w:t>
+          </w:r>
+          <w:proofErr w:type="spellEnd"/>
+          <w:r>
+            <w:t xml:space="preserve">, </w:t>
+          </w:r>
+          <w:proofErr w:type="spellStart"/>
+          <w:r>
+            <w:t>CampoNoNecesario</w:t>
+          </w:r>
+          <w:proofErr w:type="spellEnd"/>
+          <w:r>
+            <w:t xml:space="preserve">, </w:t>
+          </w:r>
+          <w:proofErr w:type="spellStart"/>
+          <w:r>
+            <w:t>CursoAcadémico</w:t>
+          </w:r>
+          <w:proofErr w:type="spellEnd"/>
+          <w:r>
+            <w:t xml:space="preserve">, </w:t>
+          </w:r>
+          <w:proofErr w:type="spellStart"/>
+          <w:r>
+            <w:t>CampoNoNecesario</w:t>
+          </w:r>
+          <w:proofErr w:type="spellEnd"/>
+          <w:r>
+            <w:t xml:space="preserve">, </w:t>
+          </w:r>
+          <w:proofErr w:type="spellStart"/>
+          <w:r>
+            <w:t>CampoNoNecesario</w:t>
+          </w:r>
+          <w:proofErr w:type="spellEnd"/>
+          <w:r>
+            <w:t xml:space="preserve">, </w:t>
+          </w:r>
+          <w:proofErr w:type="spellStart"/>
+          <w:r>
+            <w:t>CampoNoNecesario</w:t>
+          </w:r>
+          <w:proofErr w:type="spellEnd"/>
+          <w:r>
+            <w:t xml:space="preserve">, </w:t>
+          </w:r>
+          <w:proofErr w:type="spellStart"/>
+          <w:r>
+            <w:t>CampoNoNecesario</w:t>
+          </w:r>
+          <w:proofErr w:type="spellEnd"/>
+          <w:r>
+            <w:t xml:space="preserve">, </w:t>
+          </w:r>
+          <w:proofErr w:type="spellStart"/>
+          <w:r>
+            <w:t>CampoNoNecesario</w:t>
+          </w:r>
+          <w:proofErr w:type="spellEnd"/>
+          <w:r>
+            <w:t xml:space="preserve">, </w:t>
+          </w:r>
+          <w:proofErr w:type="spellStart"/>
+          <w:r>
+            <w:t>CampoNoNecesario</w:t>
+          </w:r>
+          <w:proofErr w:type="spellEnd"/>
+          <w:r>
+            <w:t xml:space="preserve">, </w:t>
+          </w:r>
+          <w:proofErr w:type="spellStart"/>
+          <w:r>
+            <w:t>CampoNoNecesario</w:t>
+          </w:r>
+          <w:proofErr w:type="spellEnd"/>
+          <w:r>
+            <w:t xml:space="preserve">, </w:t>
+          </w:r>
+          <w:proofErr w:type="spellStart"/>
+          <w:r>
+            <w:t>CampoNoNecesario</w:t>
+          </w:r>
+          <w:proofErr w:type="spellEnd"/>
+          <w:r>
+            <w:t xml:space="preserve">, </w:t>
+          </w:r>
+          <w:proofErr w:type="spellStart"/>
+          <w:r>
+            <w:t>ResultadoLibros</w:t>
+          </w:r>
+          <w:proofErr w:type="spellEnd"/>
+          <w:r>
+            <w:t xml:space="preserve">, </w:t>
+          </w:r>
+          <w:proofErr w:type="spellStart"/>
+          <w:r>
+            <w:t>ResultadoComedor</w:t>
+          </w:r>
+          <w:proofErr w:type="spellEnd"/>
+          <w:r>
+            <w:t xml:space="preserve">, Matriculado, </w:t>
+          </w:r>
+          <w:proofErr w:type="spellStart"/>
+          <w:r>
+            <w:t>TipoBecaLibros</w:t>
+          </w:r>
+          <w:proofErr w:type="spellEnd"/>
+          <w:r>
+            <w:t xml:space="preserve">, </w:t>
+          </w:r>
+          <w:proofErr w:type="spellStart"/>
+          <w:r>
+            <w:t>TipoBecaComedor</w:t>
+          </w:r>
+          <w:proofErr w:type="spellEnd"/>
         </w:p>
         <w:p/>
         <w:p/>
@@ -34380,8 +37158,8 @@
     <w:p/>
     <w:p/>
     <w:sectPr>
-      <w:headerReference w:type="default" r:id="rId42"/>
-      <w:footerReference w:type="default" r:id="rId43"/>
+      <w:headerReference w:type="default" r:id="rId49"/>
+      <w:footerReference w:type="default" r:id="rId50"/>
       <w:pgSz w:w="11906" w:h="16838" w:code="9"/>
       <w:pgMar w:top="1291" w:right="936" w:bottom="720" w:left="936" w:header="0" w:footer="289" w:gutter="0"/>
       <w:pgNumType w:start="1"/>
@@ -38076,7 +40854,6 @@
     <w:rsid w:val="0081382F"/>
     <w:rsid w:val="00893BCB"/>
     <w:rsid w:val="008960CF"/>
-    <w:rsid w:val="008D7901"/>
     <w:rsid w:val="009051C9"/>
     <w:rsid w:val="00962633"/>
     <w:rsid w:val="00963B15"/>
@@ -38102,6 +40879,7 @@
     <w:rsid w:val="00C627AA"/>
     <w:rsid w:val="00C85D97"/>
     <w:rsid w:val="00C9431D"/>
+    <w:rsid w:val="00CC1A63"/>
     <w:rsid w:val="00CE3A99"/>
     <w:rsid w:val="00D40097"/>
     <w:rsid w:val="00D613BA"/>

</xml_diff>

<commit_message>
Octavo guardado (19/05/2026 08:24)
</commit_message>
<xml_diff>
--- a/UT_7_2024_2025 (2).docx
+++ b/UT_7_2024_2025 (2).docx
@@ -18730,6 +18730,13 @@
         </w:drawing>
       </w:r>
     </w:p>
+    <w:p/>
+    <w:p/>
+    <w:p/>
+    <w:p/>
+    <w:p/>
+    <w:p/>
+    <w:p/>
     <w:p>
       <w:pPr>
         <w:pStyle w:val="Ttulo3"/>
@@ -18741,6 +18748,25 @@
       <w:bookmarkEnd w:id="138"/>
       <w:bookmarkEnd w:id="139"/>
       <w:bookmarkEnd w:id="140"/>
+    </w:p>
+    <w:p>
+      <w:pPr>
+        <w:rPr>
+          <w:b/>
+          <w:bCs/>
+          <w:sz w:val="22"/>
+          <w:szCs w:val="22"/>
+        </w:rPr>
+      </w:pPr>
+      <w:r>
+        <w:rPr>
+          <w:b/>
+          <w:bCs/>
+          <w:sz w:val="22"/>
+          <w:szCs w:val="22"/>
+        </w:rPr>
+        <w:t>Ventana login</w:t>
+      </w:r>
     </w:p>
     <w:p>
       <w:r>
@@ -18782,6 +18808,221 @@
       </w:r>
     </w:p>
     <w:p>
+      <w:pPr>
+        <w:rPr>
+          <w:b/>
+          <w:bCs/>
+          <w:sz w:val="22"/>
+          <w:szCs w:val="22"/>
+        </w:rPr>
+      </w:pPr>
+      <w:r>
+        <w:rPr>
+          <w:b/>
+          <w:bCs/>
+          <w:sz w:val="22"/>
+          <w:szCs w:val="22"/>
+        </w:rPr>
+        <w:t>Descripción</w:t>
+      </w:r>
+    </w:p>
+    <w:p>
+      <w:pPr>
+        <w:rPr>
+          <w:sz w:val="22"/>
+          <w:szCs w:val="22"/>
+        </w:rPr>
+      </w:pPr>
+      <w:r>
+        <w:rPr>
+          <w:sz w:val="22"/>
+          <w:szCs w:val="22"/>
+        </w:rPr>
+        <w:t>Esta</w:t>
+      </w:r>
+      <w:r>
+        <w:rPr>
+          <w:sz w:val="22"/>
+          <w:szCs w:val="22"/>
+        </w:rPr>
+        <w:t xml:space="preserve"> ventana </w:t>
+      </w:r>
+      <w:r>
+        <w:rPr>
+          <w:sz w:val="22"/>
+          <w:szCs w:val="22"/>
+        </w:rPr>
+        <w:t xml:space="preserve">va a </w:t>
+      </w:r>
+      <w:r>
+        <w:rPr>
+          <w:sz w:val="22"/>
+          <w:szCs w:val="22"/>
+        </w:rPr>
+        <w:t xml:space="preserve">permitir a profesores y personal autorizado </w:t>
+      </w:r>
+      <w:r>
+        <w:rPr>
+          <w:sz w:val="22"/>
+          <w:szCs w:val="22"/>
+        </w:rPr>
+        <w:t xml:space="preserve">poder </w:t>
+      </w:r>
+      <w:r>
+        <w:rPr>
+          <w:sz w:val="22"/>
+          <w:szCs w:val="22"/>
+        </w:rPr>
+        <w:t xml:space="preserve">acceder al sistema mediante </w:t>
+      </w:r>
+      <w:r>
+        <w:rPr>
+          <w:sz w:val="22"/>
+          <w:szCs w:val="22"/>
+        </w:rPr>
+        <w:t xml:space="preserve">su </w:t>
+      </w:r>
+      <w:r>
+        <w:rPr>
+          <w:sz w:val="22"/>
+          <w:szCs w:val="22"/>
+        </w:rPr>
+        <w:t>usuario y contraseña.</w:t>
+      </w:r>
+    </w:p>
+    <w:p>
+      <w:pPr>
+        <w:rPr>
+          <w:b/>
+          <w:bCs/>
+          <w:sz w:val="22"/>
+          <w:szCs w:val="22"/>
+        </w:rPr>
+      </w:pPr>
+      <w:r>
+        <w:rPr>
+          <w:b/>
+          <w:bCs/>
+          <w:sz w:val="22"/>
+          <w:szCs w:val="22"/>
+        </w:rPr>
+        <w:t>Restricciones</w:t>
+      </w:r>
+    </w:p>
+    <w:p>
+      <w:pPr>
+        <w:rPr>
+          <w:sz w:val="22"/>
+          <w:szCs w:val="22"/>
+        </w:rPr>
+      </w:pPr>
+      <w:r>
+        <w:rPr>
+          <w:sz w:val="22"/>
+          <w:szCs w:val="22"/>
+        </w:rPr>
+        <w:t>Los campos</w:t>
+      </w:r>
+      <w:r>
+        <w:rPr>
+          <w:sz w:val="22"/>
+          <w:szCs w:val="22"/>
+        </w:rPr>
+        <w:t xml:space="preserve"> del</w:t>
+      </w:r>
+      <w:r>
+        <w:rPr>
+          <w:sz w:val="22"/>
+          <w:szCs w:val="22"/>
+        </w:rPr>
+        <w:t xml:space="preserve"> usuario y contraseña serán obligatorios. </w:t>
+      </w:r>
+    </w:p>
+    <w:p>
+      <w:pPr>
+        <w:rPr>
+          <w:sz w:val="22"/>
+          <w:szCs w:val="22"/>
+        </w:rPr>
+      </w:pPr>
+      <w:r>
+        <w:rPr>
+          <w:sz w:val="22"/>
+          <w:szCs w:val="22"/>
+        </w:rPr>
+        <w:t>La contraseña se</w:t>
+      </w:r>
+      <w:r>
+        <w:rPr>
+          <w:sz w:val="22"/>
+          <w:szCs w:val="22"/>
+        </w:rPr>
+        <w:t xml:space="preserve"> va a</w:t>
+      </w:r>
+      <w:r>
+        <w:rPr>
+          <w:sz w:val="22"/>
+          <w:szCs w:val="22"/>
+        </w:rPr>
+        <w:t xml:space="preserve"> mostrar oculta. </w:t>
+      </w:r>
+    </w:p>
+    <w:p>
+      <w:pPr>
+        <w:rPr>
+          <w:sz w:val="22"/>
+          <w:szCs w:val="22"/>
+        </w:rPr>
+      </w:pPr>
+      <w:r>
+        <w:rPr>
+          <w:sz w:val="22"/>
+          <w:szCs w:val="22"/>
+        </w:rPr>
+        <w:t>Si hay</w:t>
+      </w:r>
+      <w:r>
+        <w:rPr>
+          <w:sz w:val="22"/>
+          <w:szCs w:val="22"/>
+        </w:rPr>
+        <w:t xml:space="preserve"> intentos incorrectos se</w:t>
+      </w:r>
+      <w:r>
+        <w:rPr>
+          <w:sz w:val="22"/>
+          <w:szCs w:val="22"/>
+        </w:rPr>
+        <w:t xml:space="preserve"> va a</w:t>
+      </w:r>
+      <w:r>
+        <w:rPr>
+          <w:sz w:val="22"/>
+          <w:szCs w:val="22"/>
+        </w:rPr>
+        <w:t xml:space="preserve"> mostrar un mensaje de error.</w:t>
+      </w:r>
+    </w:p>
+    <w:p>
+      <w:pPr>
+        <w:rPr>
+          <w:b/>
+          <w:bCs/>
+          <w:sz w:val="22"/>
+          <w:szCs w:val="22"/>
+        </w:rPr>
+      </w:pPr>
+      <w:r>
+        <w:rPr>
+          <w:b/>
+          <w:bCs/>
+          <w:sz w:val="22"/>
+          <w:szCs w:val="22"/>
+        </w:rPr>
+        <w:t>Ventana registrar alumno</w:t>
+      </w:r>
+    </w:p>
+    <w:p>
       <w:r>
         <w:drawing>
           <wp:inline distT="0" distB="0" distL="0" distR="0" wp14:anchorId="372F27C2" wp14:editId="4D39615A">
@@ -18821,7 +19062,247 @@
       </w:r>
     </w:p>
     <w:p>
-      <w:r>
+      <w:pPr>
+        <w:rPr>
+          <w:b/>
+          <w:bCs/>
+          <w:sz w:val="22"/>
+          <w:szCs w:val="22"/>
+        </w:rPr>
+      </w:pPr>
+      <w:r>
+        <w:rPr>
+          <w:b/>
+          <w:bCs/>
+          <w:sz w:val="22"/>
+          <w:szCs w:val="22"/>
+        </w:rPr>
+        <w:t>Descripción</w:t>
+      </w:r>
+    </w:p>
+    <w:p>
+      <w:pPr>
+        <w:rPr>
+          <w:sz w:val="22"/>
+          <w:szCs w:val="22"/>
+        </w:rPr>
+      </w:pPr>
+      <w:r>
+        <w:rPr>
+          <w:sz w:val="22"/>
+          <w:szCs w:val="22"/>
+        </w:rPr>
+        <w:t>Esta ventana va a p</w:t>
+      </w:r>
+      <w:r>
+        <w:rPr>
+          <w:sz w:val="22"/>
+          <w:szCs w:val="22"/>
+        </w:rPr>
+        <w:t>ermitir a</w:t>
+      </w:r>
+      <w:r>
+        <w:rPr>
+          <w:sz w:val="22"/>
+          <w:szCs w:val="22"/>
+        </w:rPr>
+        <w:t xml:space="preserve"> profesores y</w:t>
+      </w:r>
+      <w:r>
+        <w:rPr>
+          <w:sz w:val="22"/>
+          <w:szCs w:val="22"/>
+        </w:rPr>
+        <w:t xml:space="preserve"> personal autorizado </w:t>
+      </w:r>
+      <w:r>
+        <w:rPr>
+          <w:sz w:val="22"/>
+          <w:szCs w:val="22"/>
+        </w:rPr>
+        <w:t xml:space="preserve">a </w:t>
+      </w:r>
+      <w:r>
+        <w:rPr>
+          <w:sz w:val="22"/>
+          <w:szCs w:val="22"/>
+        </w:rPr>
+        <w:t>registrar nuevos alumnos dentro del sistema</w:t>
+      </w:r>
+      <w:r>
+        <w:rPr>
+          <w:sz w:val="22"/>
+          <w:szCs w:val="22"/>
+        </w:rPr>
+        <w:t>.</w:t>
+      </w:r>
+    </w:p>
+    <w:p>
+      <w:pPr>
+        <w:rPr>
+          <w:b/>
+          <w:bCs/>
+          <w:sz w:val="22"/>
+          <w:szCs w:val="22"/>
+        </w:rPr>
+      </w:pPr>
+      <w:r>
+        <w:rPr>
+          <w:b/>
+          <w:bCs/>
+          <w:sz w:val="22"/>
+          <w:szCs w:val="22"/>
+        </w:rPr>
+        <w:t>Restricciones</w:t>
+      </w:r>
+    </w:p>
+    <w:p>
+      <w:pPr>
+        <w:rPr>
+          <w:sz w:val="22"/>
+          <w:szCs w:val="22"/>
+        </w:rPr>
+      </w:pPr>
+      <w:r>
+        <w:rPr>
+          <w:sz w:val="22"/>
+          <w:szCs w:val="22"/>
+        </w:rPr>
+        <w:t xml:space="preserve">Todos los campos obligatorios </w:t>
+      </w:r>
+      <w:r>
+        <w:rPr>
+          <w:sz w:val="22"/>
+          <w:szCs w:val="22"/>
+        </w:rPr>
+        <w:t xml:space="preserve">se </w:t>
+      </w:r>
+      <w:r>
+        <w:rPr>
+          <w:sz w:val="22"/>
+          <w:szCs w:val="22"/>
+        </w:rPr>
+        <w:t xml:space="preserve">deberán completar. </w:t>
+      </w:r>
+    </w:p>
+    <w:p>
+      <w:pPr>
+        <w:rPr>
+          <w:sz w:val="22"/>
+          <w:szCs w:val="22"/>
+        </w:rPr>
+      </w:pPr>
+      <w:r>
+        <w:rPr>
+          <w:sz w:val="22"/>
+          <w:szCs w:val="22"/>
+        </w:rPr>
+        <w:t>El NIE no</w:t>
+      </w:r>
+      <w:r>
+        <w:rPr>
+          <w:sz w:val="22"/>
+          <w:szCs w:val="22"/>
+        </w:rPr>
+        <w:t xml:space="preserve"> va a</w:t>
+      </w:r>
+      <w:r>
+        <w:rPr>
+          <w:sz w:val="22"/>
+          <w:szCs w:val="22"/>
+        </w:rPr>
+        <w:t xml:space="preserve"> pod</w:t>
+      </w:r>
+      <w:r>
+        <w:rPr>
+          <w:sz w:val="22"/>
+          <w:szCs w:val="22"/>
+        </w:rPr>
+        <w:t>er</w:t>
+      </w:r>
+      <w:r>
+        <w:rPr>
+          <w:sz w:val="22"/>
+          <w:szCs w:val="22"/>
+        </w:rPr>
+        <w:t xml:space="preserve"> estar repetido en la base de datos.  </w:t>
+      </w:r>
+    </w:p>
+    <w:p>
+      <w:pPr>
+        <w:rPr>
+          <w:sz w:val="22"/>
+          <w:szCs w:val="22"/>
+        </w:rPr>
+      </w:pPr>
+      <w:r>
+        <w:rPr>
+          <w:sz w:val="22"/>
+          <w:szCs w:val="22"/>
+        </w:rPr>
+        <w:t>Solo</w:t>
+      </w:r>
+      <w:r>
+        <w:rPr>
+          <w:sz w:val="22"/>
+          <w:szCs w:val="22"/>
+        </w:rPr>
+        <w:t xml:space="preserve"> los</w:t>
+      </w:r>
+      <w:r>
+        <w:rPr>
+          <w:sz w:val="22"/>
+          <w:szCs w:val="22"/>
+        </w:rPr>
+        <w:t xml:space="preserve"> usuarios </w:t>
+      </w:r>
+      <w:r>
+        <w:rPr>
+          <w:sz w:val="22"/>
+          <w:szCs w:val="22"/>
+        </w:rPr>
+        <w:t xml:space="preserve">que estén </w:t>
+      </w:r>
+      <w:r>
+        <w:rPr>
+          <w:sz w:val="22"/>
+          <w:szCs w:val="22"/>
+        </w:rPr>
+        <w:t xml:space="preserve">autorizados </w:t>
+      </w:r>
+      <w:r>
+        <w:rPr>
+          <w:sz w:val="22"/>
+          <w:szCs w:val="22"/>
+        </w:rPr>
+        <w:t xml:space="preserve">van a </w:t>
+      </w:r>
+      <w:r>
+        <w:rPr>
+          <w:sz w:val="22"/>
+          <w:szCs w:val="22"/>
+        </w:rPr>
+        <w:t>pod</w:t>
+      </w:r>
+      <w:r>
+        <w:rPr>
+          <w:sz w:val="22"/>
+          <w:szCs w:val="22"/>
+        </w:rPr>
+        <w:t>er</w:t>
+      </w:r>
+      <w:r>
+        <w:rPr>
+          <w:sz w:val="22"/>
+          <w:szCs w:val="22"/>
+        </w:rPr>
+        <w:t xml:space="preserve"> crear nuevos registros.</w:t>
+      </w:r>
+    </w:p>
+    <w:p/>
+    <w:p>
+      <w:r>
+        <w:lastRenderedPageBreak/>
         <w:drawing>
           <wp:inline distT="0" distB="0" distL="0" distR="0" wp14:anchorId="095952B9" wp14:editId="1A01FFC1">
             <wp:extent cx="4249040" cy="2631830"/>
@@ -18866,7 +19347,6 @@
       <w:bookmarkStart w:id="141" w:name="_Toc49341843"/>
       <w:bookmarkStart w:id="142" w:name="_Toc170148366"/>
       <w:r>
-        <w:lastRenderedPageBreak/>
         <w:t xml:space="preserve">Ventana </w:t>
       </w:r>
       <w:bookmarkEnd w:id="141"/>
@@ -19126,9 +19606,9 @@
           <w:szCs w:val="144"/>
         </w:rPr>
       </w:pPr>
-      <w:bookmarkStart w:id="144" w:name="_Toc49341857"/>
-      <w:bookmarkStart w:id="145" w:name="_Toc170148367"/>
-      <w:bookmarkStart w:id="146" w:name="_Toc170148681"/>
+      <w:bookmarkStart w:id="145" w:name="_Toc49341857"/>
+      <w:bookmarkStart w:id="146" w:name="_Toc170148367"/>
+      <w:bookmarkStart w:id="147" w:name="_Toc170148681"/>
       <w:r>
         <w:rPr>
           <w:sz w:val="144"/>
@@ -19137,9 +19617,9 @@
         <w:lastRenderedPageBreak/>
         <w:t>Implementar el proyecto</w:t>
       </w:r>
-      <w:bookmarkEnd w:id="144"/>
       <w:bookmarkEnd w:id="145"/>
       <w:bookmarkEnd w:id="146"/>
+      <w:bookmarkEnd w:id="147"/>
     </w:p>
     <w:p>
       <w:pPr>
@@ -19160,12 +19640,12 @@
       <w:pPr>
         <w:pStyle w:val="Ttulo3"/>
       </w:pPr>
-      <w:bookmarkStart w:id="147" w:name="_Toc49341830"/>
-      <w:bookmarkStart w:id="148" w:name="_Toc170148357"/>
-      <w:bookmarkStart w:id="149" w:name="_Toc170148672"/>
-      <w:bookmarkStart w:id="150" w:name="_Toc49341858"/>
-      <w:bookmarkStart w:id="151" w:name="_Toc170148368"/>
-      <w:bookmarkStart w:id="152" w:name="_Toc170148682"/>
+      <w:bookmarkStart w:id="148" w:name="_Toc49341830"/>
+      <w:bookmarkStart w:id="149" w:name="_Toc170148357"/>
+      <w:bookmarkStart w:id="150" w:name="_Toc170148672"/>
+      <w:bookmarkStart w:id="151" w:name="_Toc49341858"/>
+      <w:bookmarkStart w:id="152" w:name="_Toc170148368"/>
+      <w:bookmarkStart w:id="153" w:name="_Toc170148682"/>
       <w:proofErr w:type="spellStart"/>
       <w:r>
         <w:lastRenderedPageBreak/>
@@ -19175,9 +19655,9 @@
       <w:r>
         <w:t xml:space="preserve"> de creación (MySQL)</w:t>
       </w:r>
-      <w:bookmarkEnd w:id="147"/>
       <w:bookmarkEnd w:id="148"/>
       <w:bookmarkEnd w:id="149"/>
+      <w:bookmarkEnd w:id="150"/>
     </w:p>
     <w:p>
       <w:pPr>
@@ -22771,9 +23251,9 @@
         <w:lastRenderedPageBreak/>
         <w:t>Indicadores de calidad</w:t>
       </w:r>
-      <w:bookmarkEnd w:id="150"/>
       <w:bookmarkEnd w:id="151"/>
       <w:bookmarkEnd w:id="152"/>
+      <w:bookmarkEnd w:id="153"/>
     </w:p>
     <w:tbl>
       <w:tblPr>
@@ -26616,16 +27096,16 @@
       <w:pPr>
         <w:pStyle w:val="Ttulo2"/>
       </w:pPr>
-      <w:bookmarkStart w:id="153" w:name="_Toc49341859"/>
-      <w:bookmarkStart w:id="154" w:name="_Toc170148369"/>
-      <w:bookmarkStart w:id="155" w:name="_Toc170148683"/>
+      <w:bookmarkStart w:id="154" w:name="_Toc49341859"/>
+      <w:bookmarkStart w:id="155" w:name="_Toc170148369"/>
+      <w:bookmarkStart w:id="156" w:name="_Toc170148683"/>
       <w:r>
         <w:lastRenderedPageBreak/>
         <w:t>Elaboración de una batería de pruebas para detectar errores</w:t>
       </w:r>
-      <w:bookmarkEnd w:id="153"/>
       <w:bookmarkEnd w:id="154"/>
       <w:bookmarkEnd w:id="155"/>
+      <w:bookmarkEnd w:id="156"/>
     </w:p>
     <w:p>
       <w:r>
@@ -27284,7 +27764,7 @@
       </w:tr>
     </w:tbl>
     <w:p>
-      <w:bookmarkStart w:id="156" w:name="_Toc49341860"/>
+      <w:bookmarkStart w:id="157" w:name="_Toc49341860"/>
     </w:p>
     <w:tbl>
       <w:tblPr>
@@ -28501,14 +28981,14 @@
       <w:pPr>
         <w:pStyle w:val="Ttulo2"/>
       </w:pPr>
-      <w:bookmarkStart w:id="157" w:name="_Toc170148370"/>
-      <w:bookmarkStart w:id="158" w:name="_Toc170148684"/>
+      <w:bookmarkStart w:id="158" w:name="_Toc170148370"/>
+      <w:bookmarkStart w:id="159" w:name="_Toc170148684"/>
       <w:r>
         <w:t>Evaluación y solución de incidencias</w:t>
       </w:r>
-      <w:bookmarkEnd w:id="156"/>
       <w:bookmarkEnd w:id="157"/>
       <w:bookmarkEnd w:id="158"/>
+      <w:bookmarkEnd w:id="159"/>
     </w:p>
     <w:p>
       <w:r>
@@ -28576,18 +29056,18 @@
       <w:pPr>
         <w:pStyle w:val="Ttulo2"/>
       </w:pPr>
-      <w:bookmarkStart w:id="159" w:name="_Toc49341861"/>
-      <w:bookmarkStart w:id="160" w:name="_Toc170148371"/>
-      <w:bookmarkStart w:id="161" w:name="_Toc170148685"/>
+      <w:bookmarkStart w:id="160" w:name="_Toc49341861"/>
+      <w:bookmarkStart w:id="161" w:name="_Toc170148371"/>
+      <w:bookmarkStart w:id="162" w:name="_Toc170148685"/>
       <w:r>
         <w:t>Evaluación y seguimiento del</w:t>
       </w:r>
       <w:r>
         <w:t xml:space="preserve"> proyecto</w:t>
       </w:r>
-      <w:bookmarkEnd w:id="159"/>
       <w:bookmarkEnd w:id="160"/>
       <w:bookmarkEnd w:id="161"/>
+      <w:bookmarkEnd w:id="162"/>
     </w:p>
     <w:p>
       <w:pPr>
@@ -28647,7 +29127,7 @@
           <w:szCs w:val="144"/>
         </w:rPr>
       </w:pPr>
-      <w:bookmarkStart w:id="162" w:name="_Toc49341863"/>
+      <w:bookmarkStart w:id="163" w:name="_Toc49341863"/>
       <w:r>
         <w:rPr>
           <w:sz w:val="144"/>
@@ -28665,8 +29145,8 @@
           <w:szCs w:val="144"/>
         </w:rPr>
       </w:pPr>
-      <w:bookmarkStart w:id="163" w:name="_Toc170148373"/>
-      <w:bookmarkStart w:id="164" w:name="_Toc170148686"/>
+      <w:bookmarkStart w:id="164" w:name="_Toc170148373"/>
+      <w:bookmarkStart w:id="165" w:name="_Toc170148686"/>
       <w:r>
         <w:rPr>
           <w:sz w:val="144"/>
@@ -28675,9 +29155,9 @@
         <w:lastRenderedPageBreak/>
         <w:t>Implantación del Proyecto</w:t>
       </w:r>
-      <w:bookmarkEnd w:id="162"/>
       <w:bookmarkEnd w:id="163"/>
       <w:bookmarkEnd w:id="164"/>
+      <w:bookmarkEnd w:id="165"/>
     </w:p>
     <w:p>
       <w:pPr>
@@ -28698,16 +29178,16 @@
       <w:pPr>
         <w:pStyle w:val="Ttulo2"/>
       </w:pPr>
-      <w:bookmarkStart w:id="165" w:name="_Toc49341864"/>
-      <w:bookmarkStart w:id="166" w:name="_Toc170148374"/>
-      <w:bookmarkStart w:id="167" w:name="_Toc170148687"/>
+      <w:bookmarkStart w:id="166" w:name="_Toc49341864"/>
+      <w:bookmarkStart w:id="167" w:name="_Toc170148374"/>
+      <w:bookmarkStart w:id="168" w:name="_Toc170148687"/>
       <w:r>
         <w:lastRenderedPageBreak/>
         <w:t>Plan de implantación</w:t>
       </w:r>
-      <w:bookmarkEnd w:id="165"/>
       <w:bookmarkEnd w:id="166"/>
       <w:bookmarkEnd w:id="167"/>
+      <w:bookmarkEnd w:id="168"/>
     </w:p>
     <w:p>
       <w:pPr>
@@ -28987,31 +29467,31 @@
       <w:pPr>
         <w:pStyle w:val="Ttulo2"/>
       </w:pPr>
-      <w:bookmarkStart w:id="168" w:name="_Toc49341865"/>
-      <w:bookmarkStart w:id="169" w:name="_Toc170148375"/>
-      <w:bookmarkStart w:id="170" w:name="_Toc170148688"/>
+      <w:bookmarkStart w:id="169" w:name="_Toc49341865"/>
+      <w:bookmarkStart w:id="170" w:name="_Toc170148375"/>
+      <w:bookmarkStart w:id="171" w:name="_Toc170148688"/>
       <w:r>
         <w:t>Manual de instalación</w:t>
       </w:r>
-      <w:bookmarkEnd w:id="168"/>
       <w:bookmarkEnd w:id="169"/>
       <w:bookmarkEnd w:id="170"/>
+      <w:bookmarkEnd w:id="171"/>
     </w:p>
     <w:p>
       <w:pPr>
         <w:pStyle w:val="Ttulo3"/>
       </w:pPr>
-      <w:bookmarkStart w:id="171" w:name="_Toc37610656"/>
-      <w:bookmarkStart w:id="172" w:name="_Toc49341866"/>
-      <w:bookmarkStart w:id="173" w:name="_Toc170148376"/>
-      <w:bookmarkStart w:id="174" w:name="_Toc170148689"/>
+      <w:bookmarkStart w:id="172" w:name="_Toc37610656"/>
+      <w:bookmarkStart w:id="173" w:name="_Toc49341866"/>
+      <w:bookmarkStart w:id="174" w:name="_Toc170148376"/>
+      <w:bookmarkStart w:id="175" w:name="_Toc170148689"/>
       <w:r>
         <w:t>Instalación de la aplicación</w:t>
       </w:r>
-      <w:bookmarkEnd w:id="171"/>
       <w:bookmarkEnd w:id="172"/>
       <w:bookmarkEnd w:id="173"/>
       <w:bookmarkEnd w:id="174"/>
+      <w:bookmarkEnd w:id="175"/>
     </w:p>
     <w:p>
       <w:pPr>
@@ -29031,15 +29511,15 @@
       <w:pPr>
         <w:pStyle w:val="Ttulo2"/>
       </w:pPr>
-      <w:bookmarkStart w:id="175" w:name="_Toc49341876"/>
-      <w:bookmarkStart w:id="176" w:name="_Toc170148377"/>
-      <w:bookmarkStart w:id="177" w:name="_Toc170148690"/>
+      <w:bookmarkStart w:id="176" w:name="_Toc49341876"/>
+      <w:bookmarkStart w:id="177" w:name="_Toc170148377"/>
+      <w:bookmarkStart w:id="178" w:name="_Toc170148690"/>
       <w:r>
         <w:t>Mejoras posibles</w:t>
       </w:r>
-      <w:bookmarkEnd w:id="175"/>
       <w:bookmarkEnd w:id="176"/>
       <w:bookmarkEnd w:id="177"/>
+      <w:bookmarkEnd w:id="178"/>
     </w:p>
     <w:p>
       <w:pPr>
@@ -29053,8 +29533,8 @@
         </w:rPr>
         <w:t>Rellenar</w:t>
       </w:r>
-      <w:bookmarkStart w:id="178" w:name="_Toc49341877"/>
-      <w:bookmarkStart w:id="179" w:name="_Toc170148378"/>
+      <w:bookmarkStart w:id="179" w:name="_Toc49341877"/>
+      <w:bookmarkStart w:id="180" w:name="_Toc170148378"/>
     </w:p>
     <w:p>
       <w:pPr>
@@ -29067,13 +29547,13 @@
       <w:pPr>
         <w:pStyle w:val="Ttulo2"/>
       </w:pPr>
-      <w:bookmarkStart w:id="180" w:name="_Toc170148691"/>
+      <w:bookmarkStart w:id="181" w:name="_Toc170148691"/>
       <w:r>
         <w:t>Manual de usuario</w:t>
       </w:r>
-      <w:bookmarkEnd w:id="178"/>
       <w:bookmarkEnd w:id="179"/>
       <w:bookmarkEnd w:id="180"/>
+      <w:bookmarkEnd w:id="181"/>
     </w:p>
     <w:p>
       <w:pPr>
@@ -29098,8 +29578,8 @@
           <w:lang w:bidi="es-ES"/>
         </w:rPr>
       </w:pPr>
-      <w:bookmarkStart w:id="181" w:name="_Toc49341895"/>
-      <w:bookmarkStart w:id="182" w:name="_Toc170148379"/>
+      <w:bookmarkStart w:id="182" w:name="_Toc49341895"/>
+      <w:bookmarkStart w:id="183" w:name="_Toc170148379"/>
       <w:r>
         <w:rPr>
           <w:lang w:bidi="es-ES"/>
@@ -29117,7 +29597,7 @@
           <w:lang w:bidi="es-ES"/>
         </w:rPr>
       </w:pPr>
-      <w:bookmarkStart w:id="183" w:name="_Toc170148692"/>
+      <w:bookmarkStart w:id="184" w:name="_Toc170148692"/>
       <w:r>
         <w:rPr>
           <w:sz w:val="144"/>
@@ -29127,9 +29607,9 @@
         <w:lastRenderedPageBreak/>
         <w:t>Anexos</w:t>
       </w:r>
-      <w:bookmarkEnd w:id="181"/>
       <w:bookmarkEnd w:id="182"/>
       <w:bookmarkEnd w:id="183"/>
+      <w:bookmarkEnd w:id="184"/>
     </w:p>
     <w:sdt>
       <w:sdtPr>
@@ -29175,9 +29655,9 @@
               <w:b w:val="0"/>
             </w:rPr>
           </w:pPr>
-          <w:bookmarkStart w:id="184" w:name="_Toc49341896"/>
-          <w:bookmarkStart w:id="185" w:name="_Toc170148380"/>
-          <w:bookmarkStart w:id="186" w:name="_Toc170148693"/>
+          <w:bookmarkStart w:id="185" w:name="_Toc49341896"/>
+          <w:bookmarkStart w:id="186" w:name="_Toc170148380"/>
+          <w:bookmarkStart w:id="187" w:name="_Toc170148693"/>
           <w:r>
             <w:rPr>
               <w:b w:val="0"/>
@@ -29191,9 +29671,9 @@
             </w:rPr>
             <w:t>contrato usado</w:t>
           </w:r>
-          <w:bookmarkEnd w:id="184"/>
           <w:bookmarkEnd w:id="185"/>
           <w:bookmarkEnd w:id="186"/>
+          <w:bookmarkEnd w:id="187"/>
         </w:p>
         <w:p>
           <w:pPr>
@@ -29264,8 +29744,8 @@
               <w:b w:val="0"/>
             </w:rPr>
           </w:pPr>
-          <w:bookmarkStart w:id="187" w:name="_Toc170148381"/>
-          <w:bookmarkStart w:id="188" w:name="_Toc170148694"/>
+          <w:bookmarkStart w:id="188" w:name="_Toc170148381"/>
+          <w:bookmarkStart w:id="189" w:name="_Toc170148694"/>
           <w:r>
             <w:rPr>
               <w:b w:val="0"/>
@@ -29287,8 +29767,8 @@
             </w:rPr>
             <w:t xml:space="preserve"> (alumnos)</w:t>
           </w:r>
-          <w:bookmarkEnd w:id="187"/>
           <w:bookmarkEnd w:id="188"/>
+          <w:bookmarkEnd w:id="189"/>
         </w:p>
         <w:p>
           <w:pPr>
@@ -29524,9 +30004,9 @@
           <w:b w:val="0"/>
         </w:rPr>
       </w:pPr>
-      <w:bookmarkStart w:id="189" w:name="_Toc49341898"/>
-      <w:bookmarkStart w:id="190" w:name="_Toc170148382"/>
-      <w:bookmarkStart w:id="191" w:name="_Toc170148695"/>
+      <w:bookmarkStart w:id="190" w:name="_Toc49341898"/>
+      <w:bookmarkStart w:id="191" w:name="_Toc170148382"/>
+      <w:bookmarkStart w:id="192" w:name="_Toc170148695"/>
       <w:r>
         <w:rPr>
           <w:b w:val="0"/>
@@ -29534,9 +30014,9 @@
         <w:lastRenderedPageBreak/>
         <w:t>Ejemplo de formulario de satisfacción</w:t>
       </w:r>
-      <w:bookmarkEnd w:id="189"/>
       <w:bookmarkEnd w:id="190"/>
       <w:bookmarkEnd w:id="191"/>
+      <w:bookmarkEnd w:id="192"/>
     </w:p>
     <w:p>
       <w:r>
@@ -32298,8 +32778,8 @@
           <w:b w:val="0"/>
         </w:rPr>
       </w:pPr>
-      <w:bookmarkStart w:id="192" w:name="_Toc170148383"/>
-      <w:bookmarkStart w:id="193" w:name="_Toc170148696"/>
+      <w:bookmarkStart w:id="193" w:name="_Toc170148383"/>
+      <w:bookmarkStart w:id="194" w:name="_Toc170148696"/>
       <w:r>
         <w:rPr>
           <w:b w:val="0"/>
@@ -32307,8 +32787,8 @@
         <w:lastRenderedPageBreak/>
         <w:t>Datos de prueba</w:t>
       </w:r>
-      <w:bookmarkEnd w:id="192"/>
       <w:bookmarkEnd w:id="193"/>
+      <w:bookmarkEnd w:id="194"/>
     </w:p>
     <w:p>
       <w:pPr>
@@ -37545,6 +38025,155 @@
     </w:lvl>
   </w:abstractNum>
   <w:abstractNum w:abstractNumId="2" w15:restartNumberingAfterBreak="0">
+    <w:nsid w:val="15DB2CC1"/>
+    <w:multiLevelType w:val="multilevel"/>
+    <w:tmpl w:val="4698BC5C"/>
+    <w:lvl w:ilvl="0">
+      <w:start w:val="1"/>
+      <w:numFmt w:val="bullet"/>
+      <w:lvlText w:val=""/>
+      <w:lvlJc w:val="left"/>
+      <w:pPr>
+        <w:tabs>
+          <w:tab w:val="num" w:pos="720"/>
+        </w:tabs>
+        <w:ind w:left="720" w:hanging="360"/>
+      </w:pPr>
+      <w:rPr>
+        <w:rFonts w:ascii="Symbol" w:hAnsi="Symbol" w:hint="default"/>
+        <w:sz w:val="20"/>
+      </w:rPr>
+    </w:lvl>
+    <w:lvl w:ilvl="1" w:tentative="1">
+      <w:start w:val="1"/>
+      <w:numFmt w:val="bullet"/>
+      <w:lvlText w:val="o"/>
+      <w:lvlJc w:val="left"/>
+      <w:pPr>
+        <w:tabs>
+          <w:tab w:val="num" w:pos="1440"/>
+        </w:tabs>
+        <w:ind w:left="1440" w:hanging="360"/>
+      </w:pPr>
+      <w:rPr>
+        <w:rFonts w:ascii="Courier New" w:hAnsi="Courier New" w:hint="default"/>
+        <w:sz w:val="20"/>
+      </w:rPr>
+    </w:lvl>
+    <w:lvl w:ilvl="2" w:tentative="1">
+      <w:start w:val="1"/>
+      <w:numFmt w:val="bullet"/>
+      <w:lvlText w:val=""/>
+      <w:lvlJc w:val="left"/>
+      <w:pPr>
+        <w:tabs>
+          <w:tab w:val="num" w:pos="2160"/>
+        </w:tabs>
+        <w:ind w:left="2160" w:hanging="360"/>
+      </w:pPr>
+      <w:rPr>
+        <w:rFonts w:ascii="Wingdings" w:hAnsi="Wingdings" w:hint="default"/>
+        <w:sz w:val="20"/>
+      </w:rPr>
+    </w:lvl>
+    <w:lvl w:ilvl="3" w:tentative="1">
+      <w:start w:val="1"/>
+      <w:numFmt w:val="bullet"/>
+      <w:lvlText w:val=""/>
+      <w:lvlJc w:val="left"/>
+      <w:pPr>
+        <w:tabs>
+          <w:tab w:val="num" w:pos="2880"/>
+        </w:tabs>
+        <w:ind w:left="2880" w:hanging="360"/>
+      </w:pPr>
+      <w:rPr>
+        <w:rFonts w:ascii="Wingdings" w:hAnsi="Wingdings" w:hint="default"/>
+        <w:sz w:val="20"/>
+      </w:rPr>
+    </w:lvl>
+    <w:lvl w:ilvl="4" w:tentative="1">
+      <w:start w:val="1"/>
+      <w:numFmt w:val="bullet"/>
+      <w:lvlText w:val=""/>
+      <w:lvlJc w:val="left"/>
+      <w:pPr>
+        <w:tabs>
+          <w:tab w:val="num" w:pos="3600"/>
+        </w:tabs>
+        <w:ind w:left="3600" w:hanging="360"/>
+      </w:pPr>
+      <w:rPr>
+        <w:rFonts w:ascii="Wingdings" w:hAnsi="Wingdings" w:hint="default"/>
+        <w:sz w:val="20"/>
+      </w:rPr>
+    </w:lvl>
+    <w:lvl w:ilvl="5" w:tentative="1">
+      <w:start w:val="1"/>
+      <w:numFmt w:val="bullet"/>
+      <w:lvlText w:val=""/>
+      <w:lvlJc w:val="left"/>
+      <w:pPr>
+        <w:tabs>
+          <w:tab w:val="num" w:pos="4320"/>
+        </w:tabs>
+        <w:ind w:left="4320" w:hanging="360"/>
+      </w:pPr>
+      <w:rPr>
+        <w:rFonts w:ascii="Wingdings" w:hAnsi="Wingdings" w:hint="default"/>
+        <w:sz w:val="20"/>
+      </w:rPr>
+    </w:lvl>
+    <w:lvl w:ilvl="6" w:tentative="1">
+      <w:start w:val="1"/>
+      <w:numFmt w:val="bullet"/>
+      <w:lvlText w:val=""/>
+      <w:lvlJc w:val="left"/>
+      <w:pPr>
+        <w:tabs>
+          <w:tab w:val="num" w:pos="5040"/>
+        </w:tabs>
+        <w:ind w:left="5040" w:hanging="360"/>
+      </w:pPr>
+      <w:rPr>
+        <w:rFonts w:ascii="Wingdings" w:hAnsi="Wingdings" w:hint="default"/>
+        <w:sz w:val="20"/>
+      </w:rPr>
+    </w:lvl>
+    <w:lvl w:ilvl="7" w:tentative="1">
+      <w:start w:val="1"/>
+      <w:numFmt w:val="bullet"/>
+      <w:lvlText w:val=""/>
+      <w:lvlJc w:val="left"/>
+      <w:pPr>
+        <w:tabs>
+          <w:tab w:val="num" w:pos="5760"/>
+        </w:tabs>
+        <w:ind w:left="5760" w:hanging="360"/>
+      </w:pPr>
+      <w:rPr>
+        <w:rFonts w:ascii="Wingdings" w:hAnsi="Wingdings" w:hint="default"/>
+        <w:sz w:val="20"/>
+      </w:rPr>
+    </w:lvl>
+    <w:lvl w:ilvl="8" w:tentative="1">
+      <w:start w:val="1"/>
+      <w:numFmt w:val="bullet"/>
+      <w:lvlText w:val=""/>
+      <w:lvlJc w:val="left"/>
+      <w:pPr>
+        <w:tabs>
+          <w:tab w:val="num" w:pos="6480"/>
+        </w:tabs>
+        <w:ind w:left="6480" w:hanging="360"/>
+      </w:pPr>
+      <w:rPr>
+        <w:rFonts w:ascii="Wingdings" w:hAnsi="Wingdings" w:hint="default"/>
+        <w:sz w:val="20"/>
+      </w:rPr>
+    </w:lvl>
+  </w:abstractNum>
+  <w:abstractNum w:abstractNumId="3" w15:restartNumberingAfterBreak="0">
     <w:nsid w:val="1BC0572C"/>
     <w:multiLevelType w:val="hybridMultilevel"/>
     <w:tmpl w:val="8580F39E"/>
@@ -37657,7 +38286,7 @@
       </w:rPr>
     </w:lvl>
   </w:abstractNum>
-  <w:abstractNum w:abstractNumId="3" w15:restartNumberingAfterBreak="0">
+  <w:abstractNum w:abstractNumId="4" w15:restartNumberingAfterBreak="0">
     <w:nsid w:val="30031545"/>
     <w:multiLevelType w:val="hybridMultilevel"/>
     <w:tmpl w:val="3A9E44FA"/>
@@ -37770,7 +38399,7 @@
       </w:rPr>
     </w:lvl>
   </w:abstractNum>
-  <w:abstractNum w:abstractNumId="4" w15:restartNumberingAfterBreak="0">
+  <w:abstractNum w:abstractNumId="5" w15:restartNumberingAfterBreak="0">
     <w:nsid w:val="408734B4"/>
     <w:multiLevelType w:val="hybridMultilevel"/>
     <w:tmpl w:val="2D56C700"/>
@@ -37883,7 +38512,7 @@
       </w:rPr>
     </w:lvl>
   </w:abstractNum>
-  <w:abstractNum w:abstractNumId="5" w15:restartNumberingAfterBreak="0">
+  <w:abstractNum w:abstractNumId="6" w15:restartNumberingAfterBreak="0">
     <w:nsid w:val="415F2157"/>
     <w:multiLevelType w:val="hybridMultilevel"/>
     <w:tmpl w:val="8C52AE3E"/>
@@ -37996,7 +38625,7 @@
       </w:rPr>
     </w:lvl>
   </w:abstractNum>
-  <w:abstractNum w:abstractNumId="6" w15:restartNumberingAfterBreak="0">
+  <w:abstractNum w:abstractNumId="7" w15:restartNumberingAfterBreak="0">
     <w:nsid w:val="46D2207E"/>
     <w:multiLevelType w:val="hybridMultilevel"/>
     <w:tmpl w:val="7F6A73AA"/>
@@ -38109,7 +38738,7 @@
       </w:rPr>
     </w:lvl>
   </w:abstractNum>
-  <w:abstractNum w:abstractNumId="7" w15:restartNumberingAfterBreak="0">
+  <w:abstractNum w:abstractNumId="8" w15:restartNumberingAfterBreak="0">
     <w:nsid w:val="49174A88"/>
     <w:multiLevelType w:val="hybridMultilevel"/>
     <w:tmpl w:val="A3DEF222"/>
@@ -38222,7 +38851,7 @@
       </w:rPr>
     </w:lvl>
   </w:abstractNum>
-  <w:abstractNum w:abstractNumId="8" w15:restartNumberingAfterBreak="0">
+  <w:abstractNum w:abstractNumId="9" w15:restartNumberingAfterBreak="0">
     <w:nsid w:val="4C27462A"/>
     <w:multiLevelType w:val="hybridMultilevel"/>
     <w:tmpl w:val="D5AE26E6"/>
@@ -38335,7 +38964,7 @@
       </w:rPr>
     </w:lvl>
   </w:abstractNum>
-  <w:abstractNum w:abstractNumId="9" w15:restartNumberingAfterBreak="0">
+  <w:abstractNum w:abstractNumId="10" w15:restartNumberingAfterBreak="0">
     <w:nsid w:val="54E76D80"/>
     <w:multiLevelType w:val="hybridMultilevel"/>
     <w:tmpl w:val="4CAAA5CC"/>
@@ -38448,7 +39077,7 @@
       </w:rPr>
     </w:lvl>
   </w:abstractNum>
-  <w:abstractNum w:abstractNumId="10" w15:restartNumberingAfterBreak="0">
+  <w:abstractNum w:abstractNumId="11" w15:restartNumberingAfterBreak="0">
     <w:nsid w:val="56DC0F4F"/>
     <w:multiLevelType w:val="hybridMultilevel"/>
     <w:tmpl w:val="DBDE6AE6"/>
@@ -38561,7 +39190,7 @@
       </w:rPr>
     </w:lvl>
   </w:abstractNum>
-  <w:abstractNum w:abstractNumId="11" w15:restartNumberingAfterBreak="0">
+  <w:abstractNum w:abstractNumId="12" w15:restartNumberingAfterBreak="0">
     <w:nsid w:val="584108BF"/>
     <w:multiLevelType w:val="hybridMultilevel"/>
     <w:tmpl w:val="720A6B12"/>
@@ -38674,7 +39303,156 @@
       </w:rPr>
     </w:lvl>
   </w:abstractNum>
-  <w:abstractNum w:abstractNumId="12" w15:restartNumberingAfterBreak="0">
+  <w:abstractNum w:abstractNumId="13" w15:restartNumberingAfterBreak="0">
+    <w:nsid w:val="76334F46"/>
+    <w:multiLevelType w:val="multilevel"/>
+    <w:tmpl w:val="1188CD90"/>
+    <w:lvl w:ilvl="0">
+      <w:start w:val="1"/>
+      <w:numFmt w:val="bullet"/>
+      <w:lvlText w:val=""/>
+      <w:lvlJc w:val="left"/>
+      <w:pPr>
+        <w:tabs>
+          <w:tab w:val="num" w:pos="720"/>
+        </w:tabs>
+        <w:ind w:left="720" w:hanging="360"/>
+      </w:pPr>
+      <w:rPr>
+        <w:rFonts w:ascii="Symbol" w:hAnsi="Symbol" w:hint="default"/>
+        <w:sz w:val="20"/>
+      </w:rPr>
+    </w:lvl>
+    <w:lvl w:ilvl="1" w:tentative="1">
+      <w:start w:val="1"/>
+      <w:numFmt w:val="bullet"/>
+      <w:lvlText w:val="o"/>
+      <w:lvlJc w:val="left"/>
+      <w:pPr>
+        <w:tabs>
+          <w:tab w:val="num" w:pos="1440"/>
+        </w:tabs>
+        <w:ind w:left="1440" w:hanging="360"/>
+      </w:pPr>
+      <w:rPr>
+        <w:rFonts w:ascii="Courier New" w:hAnsi="Courier New" w:hint="default"/>
+        <w:sz w:val="20"/>
+      </w:rPr>
+    </w:lvl>
+    <w:lvl w:ilvl="2" w:tentative="1">
+      <w:start w:val="1"/>
+      <w:numFmt w:val="bullet"/>
+      <w:lvlText w:val=""/>
+      <w:lvlJc w:val="left"/>
+      <w:pPr>
+        <w:tabs>
+          <w:tab w:val="num" w:pos="2160"/>
+        </w:tabs>
+        <w:ind w:left="2160" w:hanging="360"/>
+      </w:pPr>
+      <w:rPr>
+        <w:rFonts w:ascii="Wingdings" w:hAnsi="Wingdings" w:hint="default"/>
+        <w:sz w:val="20"/>
+      </w:rPr>
+    </w:lvl>
+    <w:lvl w:ilvl="3" w:tentative="1">
+      <w:start w:val="1"/>
+      <w:numFmt w:val="bullet"/>
+      <w:lvlText w:val=""/>
+      <w:lvlJc w:val="left"/>
+      <w:pPr>
+        <w:tabs>
+          <w:tab w:val="num" w:pos="2880"/>
+        </w:tabs>
+        <w:ind w:left="2880" w:hanging="360"/>
+      </w:pPr>
+      <w:rPr>
+        <w:rFonts w:ascii="Wingdings" w:hAnsi="Wingdings" w:hint="default"/>
+        <w:sz w:val="20"/>
+      </w:rPr>
+    </w:lvl>
+    <w:lvl w:ilvl="4" w:tentative="1">
+      <w:start w:val="1"/>
+      <w:numFmt w:val="bullet"/>
+      <w:lvlText w:val=""/>
+      <w:lvlJc w:val="left"/>
+      <w:pPr>
+        <w:tabs>
+          <w:tab w:val="num" w:pos="3600"/>
+        </w:tabs>
+        <w:ind w:left="3600" w:hanging="360"/>
+      </w:pPr>
+      <w:rPr>
+        <w:rFonts w:ascii="Wingdings" w:hAnsi="Wingdings" w:hint="default"/>
+        <w:sz w:val="20"/>
+      </w:rPr>
+    </w:lvl>
+    <w:lvl w:ilvl="5" w:tentative="1">
+      <w:start w:val="1"/>
+      <w:numFmt w:val="bullet"/>
+      <w:lvlText w:val=""/>
+      <w:lvlJc w:val="left"/>
+      <w:pPr>
+        <w:tabs>
+          <w:tab w:val="num" w:pos="4320"/>
+        </w:tabs>
+        <w:ind w:left="4320" w:hanging="360"/>
+      </w:pPr>
+      <w:rPr>
+        <w:rFonts w:ascii="Wingdings" w:hAnsi="Wingdings" w:hint="default"/>
+        <w:sz w:val="20"/>
+      </w:rPr>
+    </w:lvl>
+    <w:lvl w:ilvl="6" w:tentative="1">
+      <w:start w:val="1"/>
+      <w:numFmt w:val="bullet"/>
+      <w:lvlText w:val=""/>
+      <w:lvlJc w:val="left"/>
+      <w:pPr>
+        <w:tabs>
+          <w:tab w:val="num" w:pos="5040"/>
+        </w:tabs>
+        <w:ind w:left="5040" w:hanging="360"/>
+      </w:pPr>
+      <w:rPr>
+        <w:rFonts w:ascii="Wingdings" w:hAnsi="Wingdings" w:hint="default"/>
+        <w:sz w:val="20"/>
+      </w:rPr>
+    </w:lvl>
+    <w:lvl w:ilvl="7" w:tentative="1">
+      <w:start w:val="1"/>
+      <w:numFmt w:val="bullet"/>
+      <w:lvlText w:val=""/>
+      <w:lvlJc w:val="left"/>
+      <w:pPr>
+        <w:tabs>
+          <w:tab w:val="num" w:pos="5760"/>
+        </w:tabs>
+        <w:ind w:left="5760" w:hanging="360"/>
+      </w:pPr>
+      <w:rPr>
+        <w:rFonts w:ascii="Wingdings" w:hAnsi="Wingdings" w:hint="default"/>
+        <w:sz w:val="20"/>
+      </w:rPr>
+    </w:lvl>
+    <w:lvl w:ilvl="8" w:tentative="1">
+      <w:start w:val="1"/>
+      <w:numFmt w:val="bullet"/>
+      <w:lvlText w:val=""/>
+      <w:lvlJc w:val="left"/>
+      <w:pPr>
+        <w:tabs>
+          <w:tab w:val="num" w:pos="6480"/>
+        </w:tabs>
+        <w:ind w:left="6480" w:hanging="360"/>
+      </w:pPr>
+      <w:rPr>
+        <w:rFonts w:ascii="Wingdings" w:hAnsi="Wingdings" w:hint="default"/>
+        <w:sz w:val="20"/>
+      </w:rPr>
+    </w:lvl>
+  </w:abstractNum>
+  <w:abstractNum w:abstractNumId="14" w15:restartNumberingAfterBreak="0">
     <w:nsid w:val="780E04D7"/>
     <w:multiLevelType w:val="hybridMultilevel"/>
     <w:tmpl w:val="AAA02FD2"/>
@@ -38787,7 +39565,7 @@
       </w:rPr>
     </w:lvl>
   </w:abstractNum>
-  <w:abstractNum w:abstractNumId="13" w15:restartNumberingAfterBreak="0">
+  <w:abstractNum w:abstractNumId="15" w15:restartNumberingAfterBreak="0">
     <w:nsid w:val="79306B18"/>
     <w:multiLevelType w:val="hybridMultilevel"/>
     <w:tmpl w:val="B02AD490"/>
@@ -38901,46 +39679,52 @@
     </w:lvl>
   </w:abstractNum>
   <w:num w:numId="1" w16cid:durableId="1264800247">
-    <w:abstractNumId w:val="12"/>
+    <w:abstractNumId w:val="14"/>
   </w:num>
   <w:num w:numId="2" w16cid:durableId="1848666731">
-    <w:abstractNumId w:val="9"/>
+    <w:abstractNumId w:val="10"/>
   </w:num>
   <w:num w:numId="3" w16cid:durableId="556431196">
     <w:abstractNumId w:val="1"/>
   </w:num>
   <w:num w:numId="4" w16cid:durableId="1217467586">
+    <w:abstractNumId w:val="8"/>
+  </w:num>
+  <w:num w:numId="5" w16cid:durableId="620041898">
+    <w:abstractNumId w:val="6"/>
+  </w:num>
+  <w:num w:numId="6" w16cid:durableId="2026710683">
+    <w:abstractNumId w:val="3"/>
+  </w:num>
+  <w:num w:numId="7" w16cid:durableId="1017121877">
+    <w:abstractNumId w:val="12"/>
+  </w:num>
+  <w:num w:numId="8" w16cid:durableId="1962809096">
+    <w:abstractNumId w:val="4"/>
+  </w:num>
+  <w:num w:numId="9" w16cid:durableId="19283992">
     <w:abstractNumId w:val="7"/>
   </w:num>
-  <w:num w:numId="5" w16cid:durableId="620041898">
-    <w:abstractNumId w:val="5"/>
-  </w:num>
-  <w:num w:numId="6" w16cid:durableId="2026710683">
-    <w:abstractNumId w:val="2"/>
-  </w:num>
-  <w:num w:numId="7" w16cid:durableId="1017121877">
+  <w:num w:numId="10" w16cid:durableId="1822650518">
     <w:abstractNumId w:val="11"/>
   </w:num>
-  <w:num w:numId="8" w16cid:durableId="1962809096">
-    <w:abstractNumId w:val="3"/>
-  </w:num>
-  <w:num w:numId="9" w16cid:durableId="19283992">
-    <w:abstractNumId w:val="6"/>
-  </w:num>
-  <w:num w:numId="10" w16cid:durableId="1822650518">
-    <w:abstractNumId w:val="10"/>
-  </w:num>
   <w:num w:numId="11" w16cid:durableId="301691016">
-    <w:abstractNumId w:val="8"/>
+    <w:abstractNumId w:val="9"/>
   </w:num>
   <w:num w:numId="12" w16cid:durableId="517739745">
-    <w:abstractNumId w:val="13"/>
+    <w:abstractNumId w:val="15"/>
   </w:num>
   <w:num w:numId="13" w16cid:durableId="344672934">
     <w:abstractNumId w:val="0"/>
   </w:num>
   <w:num w:numId="14" w16cid:durableId="1212763014">
-    <w:abstractNumId w:val="4"/>
+    <w:abstractNumId w:val="5"/>
+  </w:num>
+  <w:num w:numId="15" w16cid:durableId="1680768059">
+    <w:abstractNumId w:val="2"/>
+  </w:num>
+  <w:num w:numId="16" w16cid:durableId="1703628997">
+    <w:abstractNumId w:val="13"/>
   </w:num>
   <w:numIdMacAtCleanup w:val="9"/>
 </w:numbering>
@@ -39344,7 +40128,7 @@
   <w:style w:type="paragraph" w:default="1" w:styleId="Normal">
     <w:name w:val="Normal"/>
     <w:qFormat/>
-    <w:rsid w:val="005468BD"/>
+    <w:rsid w:val="007D2FA9"/>
     <w:pPr>
       <w:spacing w:after="0"/>
       <w:jc w:val="both"/>
@@ -39439,7 +40223,6 @@
   <w:style w:type="character" w:default="1" w:styleId="Fuentedeprrafopredeter">
     <w:name w:val="Default Paragraph Font"/>
     <w:uiPriority w:val="1"/>
-    <w:semiHidden/>
     <w:unhideWhenUsed/>
   </w:style>
   <w:style w:type="table" w:default="1" w:styleId="Tablanormal">
@@ -40866,6 +41649,7 @@
     <w:rsid w:val="00A015F9"/>
     <w:rsid w:val="00A71D6A"/>
     <w:rsid w:val="00A94268"/>
+    <w:rsid w:val="00AB2DF2"/>
     <w:rsid w:val="00AC11EA"/>
     <w:rsid w:val="00B444FF"/>
     <w:rsid w:val="00BA03CE"/>
@@ -40879,7 +41663,6 @@
     <w:rsid w:val="00C627AA"/>
     <w:rsid w:val="00C85D97"/>
     <w:rsid w:val="00C9431D"/>
-    <w:rsid w:val="00CC1A63"/>
     <w:rsid w:val="00CE3A99"/>
     <w:rsid w:val="00D40097"/>
     <w:rsid w:val="00D613BA"/>

</xml_diff>

<commit_message>
Noveno guardado (19/05/2026, 20:53)
</commit_message>
<xml_diff>
--- a/UT_7_2024_2025 (2).docx
+++ b/UT_7_2024_2025 (2).docx
@@ -6733,7 +6733,6 @@
                 <w:r>
                   <w:t xml:space="preserve">IDE para desarrollo </w:t>
                 </w:r>
-                <w:proofErr w:type="gramStart"/>
                 <w:r>
                   <w:t>PHP</w:t>
                 </w:r>
@@ -6741,7 +6740,6 @@
                   <w:t xml:space="preserve">  (</w:t>
                 </w:r>
                 <w:proofErr w:type="spellStart"/>
-                <w:proofErr w:type="gramEnd"/>
                 <w:r>
                   <w:t>PhpStorm</w:t>
                 </w:r>
@@ -6829,16 +6827,11 @@
                 <w:r>
                   <w:t xml:space="preserve">Bootstrap </w:t>
                 </w:r>
-                <w:proofErr w:type="gramStart"/>
                 <w:r>
                   <w:t xml:space="preserve">5.3 </w:t>
                 </w:r>
                 <w:r>
-                  <w:t xml:space="preserve"> jQuery</w:t>
-                </w:r>
-                <w:proofErr w:type="gramEnd"/>
-                <w:r>
-                  <w:t xml:space="preserve"> 3.</w:t>
+                  <w:t xml:space="preserve"> jQuery 3.</w:t>
                 </w:r>
                 <w:r>
                   <w:t>7</w:t>
@@ -6891,7 +6884,6 @@
                   <w:t xml:space="preserve">– </w:t>
                 </w:r>
                 <w:proofErr w:type="spellStart"/>
-                <w:proofErr w:type="gramStart"/>
                 <w:r>
                   <w:t>MariaDB</w:t>
                 </w:r>
@@ -6908,7 +6900,6 @@
                 <w:r>
                   <w:t>patible</w:t>
                 </w:r>
-                <w:proofErr w:type="gramEnd"/>
               </w:p>
             </w:tc>
           </w:tr>
@@ -7462,7 +7453,7 @@
                 <v:path o:extrusionok="f" gradientshapeok="t" o:connecttype="rect"/>
                 <o:lock v:ext="edit" aspectratio="t"/>
               </v:shapetype>
-              <v:shape id="_x0000_i1025" type="#_x0000_t75" style="width:465.75pt;height:205.3pt">
+              <v:shape id="_x0000_i1025" type="#_x0000_t75" style="width:465.7pt;height:205.4pt">
                 <v:imagedata r:id="rId15" o:title="SecuencaciónFasesProyecto"/>
               </v:shape>
             </w:pict>
@@ -7489,7 +7480,7 @@
           </w:pPr>
           <w:r>
             <w:pict w14:anchorId="5636CC0F">
-              <v:shape id="_x0000_i1026" type="#_x0000_t75" style="width:383.2pt;height:241.8pt">
+              <v:shape id="_x0000_i1026" type="#_x0000_t75" style="width:383.1pt;height:241.85pt">
                 <v:imagedata r:id="rId16" o:title="PlanificaciónRecursosProyectos"/>
               </v:shape>
             </w:pict>
@@ -11234,21 +11225,7 @@
               <w:rPr>
                 <w:b/>
               </w:rPr>
-              <w:t xml:space="preserve">Selección de </w:t>
-            </w:r>
-            <w:proofErr w:type="gramStart"/>
-            <w:r>
-              <w:rPr>
-                <w:b/>
-              </w:rPr>
-              <w:t>datos  subcaso</w:t>
-            </w:r>
-            <w:proofErr w:type="gramEnd"/>
-            <w:r>
-              <w:rPr>
-                <w:b/>
-              </w:rPr>
-              <w:t>: Selección de formato</w:t>
+              <w:t>Selección de datos  subcaso: Selección de formato</w:t>
             </w:r>
           </w:p>
         </w:tc>
@@ -11906,7 +11883,7 @@
       </w:pPr>
       <w:r>
         <w:pict w14:anchorId="119133E6">
-          <v:shape id="_x0000_i1027" type="#_x0000_t75" style="width:252.5pt;height:469.4pt">
+          <v:shape id="_x0000_i1027" type="#_x0000_t75" style="width:252.45pt;height:469.4pt">
             <v:imagedata r:id="rId24" o:title="DA_Login"/>
           </v:shape>
         </w:pict>
@@ -12001,7 +11978,7 @@
     <w:p>
       <w:r>
         <w:pict w14:anchorId="3BC76BB7">
-          <v:shape id="_x0000_i1028" type="#_x0000_t75" style="width:143.95pt;height:523.45pt">
+          <v:shape id="_x0000_i1028" type="#_x0000_t75" style="width:2in;height:523.4pt">
             <v:imagedata r:id="rId26" o:title="DA_VaciarBBDD"/>
           </v:shape>
         </w:pict>
@@ -12014,7 +11991,7 @@
       </w:r>
       <w:r>
         <w:pict w14:anchorId="6C7C2997">
-          <v:shape id="_x0000_i1029" type="#_x0000_t75" style="width:144.55pt;height:430.2pt">
+          <v:shape id="_x0000_i1029" type="#_x0000_t75" style="width:144.45pt;height:430.15pt">
             <v:imagedata r:id="rId27" o:title="DA_GestiónErrores"/>
           </v:shape>
         </w:pict>
@@ -14220,19 +14197,8 @@
                 <w:sz w:val="16"/>
                 <w:szCs w:val="16"/>
               </w:rPr>
-              <w:t>1ºeso, 2</w:t>
-            </w:r>
-            <w:proofErr w:type="gramStart"/>
-            <w:r>
-              <w:rPr>
-                <w:rFonts w:cstheme="minorHAnsi"/>
-                <w:b/>
-                <w:sz w:val="16"/>
-                <w:szCs w:val="16"/>
-              </w:rPr>
-              <w:t>eso….</w:t>
-            </w:r>
-            <w:proofErr w:type="gramEnd"/>
+              <w:t>1ºeso, 2eso….</w:t>
+            </w:r>
           </w:p>
         </w:tc>
       </w:tr>
@@ -16443,27 +16409,7 @@
                 <w:sz w:val="16"/>
                 <w:szCs w:val="16"/>
               </w:rPr>
-              <w:t xml:space="preserve">0, I, </w:t>
-            </w:r>
-            <w:proofErr w:type="gramStart"/>
-            <w:r>
-              <w:rPr>
-                <w:rFonts w:cstheme="minorHAnsi"/>
-                <w:b/>
-                <w:sz w:val="16"/>
-                <w:szCs w:val="16"/>
-              </w:rPr>
-              <w:t>II  (</w:t>
-            </w:r>
-            <w:proofErr w:type="gramEnd"/>
-            <w:r>
-              <w:rPr>
-                <w:rFonts w:cstheme="minorHAnsi"/>
-                <w:b/>
-                <w:sz w:val="16"/>
-                <w:szCs w:val="16"/>
-              </w:rPr>
-              <w:t>0 para no beca, tramo I y II)</w:t>
+              <w:t>0, I, II  (0 para no beca, tramo I y II)</w:t>
             </w:r>
           </w:p>
         </w:tc>
@@ -17944,19 +17890,8 @@
                 <w:sz w:val="16"/>
                 <w:szCs w:val="16"/>
               </w:rPr>
-              <w:t xml:space="preserve">P: Prestado, </w:t>
-            </w:r>
-            <w:proofErr w:type="gramStart"/>
-            <w:r>
-              <w:rPr>
-                <w:rFonts w:cstheme="minorHAnsi"/>
-                <w:b/>
-                <w:sz w:val="16"/>
-                <w:szCs w:val="16"/>
-              </w:rPr>
-              <w:t>D:Devuelto</w:t>
-            </w:r>
-            <w:proofErr w:type="gramEnd"/>
+              <w:t>P: Prestado, D:Devuelto</w:t>
+            </w:r>
           </w:p>
         </w:tc>
       </w:tr>
@@ -18447,15 +18382,7 @@
     </w:p>
     <w:p>
       <w:r>
-        <w:t xml:space="preserve">El siguiente diagrama va a representar la estructura de clases que va a utilizar la aplicación para poder acceder y poder gestionar la información almacenada en la base de datos. La relación entre las clases va a permitir controlar la gestión de los préstamos las devoluciones, los </w:t>
-      </w:r>
-      <w:proofErr w:type="gramStart"/>
-      <w:r>
-        <w:t>cursos  y</w:t>
-      </w:r>
-      <w:proofErr w:type="gramEnd"/>
-      <w:r>
-        <w:t xml:space="preserve"> los libros que están asignados a cada alumno. El diagrama de clases se ha realizado teniendo en cuenta las relaciones existentes entre las distintas tablas del modelo relacional que se </w:t>
+        <w:t xml:space="preserve">El siguiente diagrama va a representar la estructura de clases que va a utilizar la aplicación para poder acceder y poder gestionar la información almacenada en la base de datos. La relación entre las clases va a permitir controlar la gestión de los préstamos las devoluciones, los cursos  y los libros que están asignados a cada alumno. El diagrama de clases se ha realizado teniendo en cuenta las relaciones existentes entre las distintas tablas del modelo relacional que se </w:t>
       </w:r>
       <w:proofErr w:type="spellStart"/>
       <w:r>
@@ -18771,9 +18698,9 @@
     <w:p>
       <w:r>
         <w:drawing>
-          <wp:inline distT="0" distB="0" distL="0" distR="0" wp14:anchorId="0FB04EDF" wp14:editId="10444100">
-            <wp:extent cx="4259580" cy="2418460"/>
-            <wp:effectExtent l="0" t="0" r="7620" b="1270"/>
+          <wp:inline distT="0" distB="0" distL="0" distR="0" wp14:anchorId="0FB04EDF" wp14:editId="7AD8DCCB">
+            <wp:extent cx="4511499" cy="2561492"/>
+            <wp:effectExtent l="0" t="0" r="3810" b="0"/>
             <wp:docPr id="1904496865" name="Imagen 1"/>
             <wp:cNvGraphicFramePr>
               <a:graphicFrameLocks xmlns:a="http://schemas.openxmlformats.org/drawingml/2006/main" noChangeAspect="1"/>
@@ -18794,7 +18721,7 @@
                   <pic:spPr>
                     <a:xfrm>
                       <a:off x="0" y="0"/>
-                      <a:ext cx="4273762" cy="2426512"/>
+                      <a:ext cx="4535575" cy="2575162"/>
                     </a:xfrm>
                     <a:prstGeom prst="rect">
                       <a:avLst/>
@@ -19005,30 +18932,24 @@
     </w:p>
     <w:p>
       <w:pPr>
-        <w:rPr>
-          <w:b/>
-          <w:bCs/>
+        <w:tabs>
+          <w:tab w:val="left" w:pos="7371"/>
+        </w:tabs>
+        <w:rPr>
           <w:sz w:val="22"/>
           <w:szCs w:val="22"/>
         </w:rPr>
       </w:pPr>
       <w:r>
         <w:rPr>
-          <w:b/>
-          <w:bCs/>
           <w:sz w:val="22"/>
           <w:szCs w:val="22"/>
         </w:rPr>
-        <w:t>Ventana registrar alumno</w:t>
-      </w:r>
-    </w:p>
-    <w:p>
-      <w:r>
         <w:drawing>
-          <wp:inline distT="0" distB="0" distL="0" distR="0" wp14:anchorId="372F27C2" wp14:editId="4D39615A">
-            <wp:extent cx="4259580" cy="2325916"/>
-            <wp:effectExtent l="0" t="0" r="7620" b="0"/>
-            <wp:docPr id="1842174928" name="Imagen 1"/>
+          <wp:inline distT="0" distB="0" distL="0" distR="0" wp14:anchorId="7FA6BE9F" wp14:editId="3CA0BA0B">
+            <wp:extent cx="3446145" cy="3003443"/>
+            <wp:effectExtent l="0" t="0" r="1905" b="6985"/>
+            <wp:docPr id="801259683" name="Imagen 1"/>
             <wp:cNvGraphicFramePr>
               <a:graphicFrameLocks xmlns:a="http://schemas.openxmlformats.org/drawingml/2006/main" noChangeAspect="1"/>
             </wp:cNvGraphicFramePr>
@@ -19036,7 +18957,7 @@
               <a:graphicData uri="http://schemas.openxmlformats.org/drawingml/2006/picture">
                 <pic:pic xmlns:pic="http://schemas.openxmlformats.org/drawingml/2006/picture">
                   <pic:nvPicPr>
-                    <pic:cNvPr id="1842174928" name=""/>
+                    <pic:cNvPr id="801259683" name=""/>
                     <pic:cNvPicPr/>
                   </pic:nvPicPr>
                   <pic:blipFill>
@@ -19048,7 +18969,7 @@
                   <pic:spPr>
                     <a:xfrm>
                       <a:off x="0" y="0"/>
-                      <a:ext cx="4271820" cy="2332600"/>
+                      <a:ext cx="3482080" cy="3034762"/>
                     </a:xfrm>
                     <a:prstGeom prst="rect">
                       <a:avLst/>
@@ -19063,251 +18984,24 @@
     </w:p>
     <w:p>
       <w:pPr>
-        <w:rPr>
-          <w:b/>
-          <w:bCs/>
+        <w:tabs>
+          <w:tab w:val="left" w:pos="7371"/>
+        </w:tabs>
+        <w:rPr>
           <w:sz w:val="22"/>
           <w:szCs w:val="22"/>
         </w:rPr>
       </w:pPr>
       <w:r>
         <w:rPr>
-          <w:b/>
-          <w:bCs/>
           <w:sz w:val="22"/>
           <w:szCs w:val="22"/>
         </w:rPr>
-        <w:t>Descripción</w:t>
-      </w:r>
-    </w:p>
-    <w:p>
-      <w:pPr>
-        <w:rPr>
-          <w:sz w:val="22"/>
-          <w:szCs w:val="22"/>
-        </w:rPr>
-      </w:pPr>
-      <w:r>
-        <w:rPr>
-          <w:sz w:val="22"/>
-          <w:szCs w:val="22"/>
-        </w:rPr>
-        <w:t>Esta ventana va a p</w:t>
-      </w:r>
-      <w:r>
-        <w:rPr>
-          <w:sz w:val="22"/>
-          <w:szCs w:val="22"/>
-        </w:rPr>
-        <w:t>ermitir a</w:t>
-      </w:r>
-      <w:r>
-        <w:rPr>
-          <w:sz w:val="22"/>
-          <w:szCs w:val="22"/>
-        </w:rPr>
-        <w:t xml:space="preserve"> profesores y</w:t>
-      </w:r>
-      <w:r>
-        <w:rPr>
-          <w:sz w:val="22"/>
-          <w:szCs w:val="22"/>
-        </w:rPr>
-        <w:t xml:space="preserve"> personal autorizado </w:t>
-      </w:r>
-      <w:r>
-        <w:rPr>
-          <w:sz w:val="22"/>
-          <w:szCs w:val="22"/>
-        </w:rPr>
-        <w:t xml:space="preserve">a </w:t>
-      </w:r>
-      <w:r>
-        <w:rPr>
-          <w:sz w:val="22"/>
-          <w:szCs w:val="22"/>
-        </w:rPr>
-        <w:t>registrar nuevos alumnos dentro del sistema</w:t>
-      </w:r>
-      <w:r>
-        <w:rPr>
-          <w:sz w:val="22"/>
-          <w:szCs w:val="22"/>
-        </w:rPr>
-        <w:t>.</w:t>
-      </w:r>
-    </w:p>
-    <w:p>
-      <w:pPr>
-        <w:rPr>
-          <w:b/>
-          <w:bCs/>
-          <w:sz w:val="22"/>
-          <w:szCs w:val="22"/>
-        </w:rPr>
-      </w:pPr>
-      <w:r>
-        <w:rPr>
-          <w:b/>
-          <w:bCs/>
-          <w:sz w:val="22"/>
-          <w:szCs w:val="22"/>
-        </w:rPr>
-        <w:t>Restricciones</w:t>
-      </w:r>
-    </w:p>
-    <w:p>
-      <w:pPr>
-        <w:rPr>
-          <w:sz w:val="22"/>
-          <w:szCs w:val="22"/>
-        </w:rPr>
-      </w:pPr>
-      <w:r>
-        <w:rPr>
-          <w:sz w:val="22"/>
-          <w:szCs w:val="22"/>
-        </w:rPr>
-        <w:t xml:space="preserve">Todos los campos obligatorios </w:t>
-      </w:r>
-      <w:r>
-        <w:rPr>
-          <w:sz w:val="22"/>
-          <w:szCs w:val="22"/>
-        </w:rPr>
-        <w:t xml:space="preserve">se </w:t>
-      </w:r>
-      <w:r>
-        <w:rPr>
-          <w:sz w:val="22"/>
-          <w:szCs w:val="22"/>
-        </w:rPr>
-        <w:t xml:space="preserve">deberán completar. </w:t>
-      </w:r>
-    </w:p>
-    <w:p>
-      <w:pPr>
-        <w:rPr>
-          <w:sz w:val="22"/>
-          <w:szCs w:val="22"/>
-        </w:rPr>
-      </w:pPr>
-      <w:r>
-        <w:rPr>
-          <w:sz w:val="22"/>
-          <w:szCs w:val="22"/>
-        </w:rPr>
-        <w:t>El NIE no</w:t>
-      </w:r>
-      <w:r>
-        <w:rPr>
-          <w:sz w:val="22"/>
-          <w:szCs w:val="22"/>
-        </w:rPr>
-        <w:t xml:space="preserve"> va a</w:t>
-      </w:r>
-      <w:r>
-        <w:rPr>
-          <w:sz w:val="22"/>
-          <w:szCs w:val="22"/>
-        </w:rPr>
-        <w:t xml:space="preserve"> pod</w:t>
-      </w:r>
-      <w:r>
-        <w:rPr>
-          <w:sz w:val="22"/>
-          <w:szCs w:val="22"/>
-        </w:rPr>
-        <w:t>er</w:t>
-      </w:r>
-      <w:r>
-        <w:rPr>
-          <w:sz w:val="22"/>
-          <w:szCs w:val="22"/>
-        </w:rPr>
-        <w:t xml:space="preserve"> estar repetido en la base de datos.  </w:t>
-      </w:r>
-    </w:p>
-    <w:p>
-      <w:pPr>
-        <w:rPr>
-          <w:sz w:val="22"/>
-          <w:szCs w:val="22"/>
-        </w:rPr>
-      </w:pPr>
-      <w:r>
-        <w:rPr>
-          <w:sz w:val="22"/>
-          <w:szCs w:val="22"/>
-        </w:rPr>
-        <w:t>Solo</w:t>
-      </w:r>
-      <w:r>
-        <w:rPr>
-          <w:sz w:val="22"/>
-          <w:szCs w:val="22"/>
-        </w:rPr>
-        <w:t xml:space="preserve"> los</w:t>
-      </w:r>
-      <w:r>
-        <w:rPr>
-          <w:sz w:val="22"/>
-          <w:szCs w:val="22"/>
-        </w:rPr>
-        <w:t xml:space="preserve"> usuarios </w:t>
-      </w:r>
-      <w:r>
-        <w:rPr>
-          <w:sz w:val="22"/>
-          <w:szCs w:val="22"/>
-        </w:rPr>
-        <w:t xml:space="preserve">que estén </w:t>
-      </w:r>
-      <w:r>
-        <w:rPr>
-          <w:sz w:val="22"/>
-          <w:szCs w:val="22"/>
-        </w:rPr>
-        <w:t xml:space="preserve">autorizados </w:t>
-      </w:r>
-      <w:r>
-        <w:rPr>
-          <w:sz w:val="22"/>
-          <w:szCs w:val="22"/>
-        </w:rPr>
-        <w:t xml:space="preserve">van a </w:t>
-      </w:r>
-      <w:r>
-        <w:rPr>
-          <w:sz w:val="22"/>
-          <w:szCs w:val="22"/>
-        </w:rPr>
-        <w:t>pod</w:t>
-      </w:r>
-      <w:r>
-        <w:rPr>
-          <w:sz w:val="22"/>
-          <w:szCs w:val="22"/>
-        </w:rPr>
-        <w:t>er</w:t>
-      </w:r>
-      <w:r>
-        <w:rPr>
-          <w:sz w:val="22"/>
-          <w:szCs w:val="22"/>
-        </w:rPr>
-        <w:t xml:space="preserve"> crear nuevos registros.</w:t>
-      </w:r>
-    </w:p>
-    <w:p/>
-    <w:p>
-      <w:r>
-        <w:lastRenderedPageBreak/>
         <w:drawing>
-          <wp:inline distT="0" distB="0" distL="0" distR="0" wp14:anchorId="095952B9" wp14:editId="1A01FFC1">
-            <wp:extent cx="4249040" cy="2631830"/>
+          <wp:inline distT="0" distB="0" distL="0" distR="0" wp14:anchorId="0699F8BE" wp14:editId="41EEA804">
+            <wp:extent cx="3851031" cy="1735536"/>
             <wp:effectExtent l="0" t="0" r="0" b="0"/>
-            <wp:docPr id="1083859307" name="Imagen 1"/>
+            <wp:docPr id="565765926" name="Imagen 1"/>
             <wp:cNvGraphicFramePr>
               <a:graphicFrameLocks xmlns:a="http://schemas.openxmlformats.org/drawingml/2006/main" noChangeAspect="1"/>
             </wp:cNvGraphicFramePr>
@@ -19315,7 +19009,7 @@
               <a:graphicData uri="http://schemas.openxmlformats.org/drawingml/2006/picture">
                 <pic:pic xmlns:pic="http://schemas.openxmlformats.org/drawingml/2006/picture">
                   <pic:nvPicPr>
-                    <pic:cNvPr id="1083859307" name=""/>
+                    <pic:cNvPr id="565765926" name=""/>
                     <pic:cNvPicPr/>
                   </pic:nvPicPr>
                   <pic:blipFill>
@@ -19327,7 +19021,7 @@
                   <pic:spPr>
                     <a:xfrm>
                       <a:off x="0" y="0"/>
-                      <a:ext cx="4259675" cy="2638417"/>
+                      <a:ext cx="3861595" cy="1740297"/>
                     </a:xfrm>
                     <a:prstGeom prst="rect">
                       <a:avLst/>
@@ -19340,6 +19034,413 @@
         </w:drawing>
       </w:r>
     </w:p>
+    <w:p>
+      <w:pPr>
+        <w:rPr>
+          <w:b/>
+          <w:bCs/>
+          <w:sz w:val="22"/>
+          <w:szCs w:val="22"/>
+        </w:rPr>
+      </w:pPr>
+      <w:r>
+        <w:rPr>
+          <w:b/>
+          <w:bCs/>
+          <w:sz w:val="22"/>
+          <w:szCs w:val="22"/>
+        </w:rPr>
+        <w:lastRenderedPageBreak/>
+        <w:t>Ventana registrar alumno</w:t>
+      </w:r>
+    </w:p>
+    <w:p>
+      <w:r>
+        <w:drawing>
+          <wp:inline distT="0" distB="0" distL="0" distR="0" wp14:anchorId="114272C6" wp14:editId="110F9F83">
+            <wp:extent cx="4120662" cy="2302216"/>
+            <wp:effectExtent l="0" t="0" r="0" b="3175"/>
+            <wp:docPr id="2139891683" name="Imagen 1"/>
+            <wp:cNvGraphicFramePr>
+              <a:graphicFrameLocks xmlns:a="http://schemas.openxmlformats.org/drawingml/2006/main" noChangeAspect="1"/>
+            </wp:cNvGraphicFramePr>
+            <a:graphic xmlns:a="http://schemas.openxmlformats.org/drawingml/2006/main">
+              <a:graphicData uri="http://schemas.openxmlformats.org/drawingml/2006/picture">
+                <pic:pic xmlns:pic="http://schemas.openxmlformats.org/drawingml/2006/picture">
+                  <pic:nvPicPr>
+                    <pic:cNvPr id="2139891683" name=""/>
+                    <pic:cNvPicPr/>
+                  </pic:nvPicPr>
+                  <pic:blipFill>
+                    <a:blip r:embed="rId46"/>
+                    <a:stretch>
+                      <a:fillRect/>
+                    </a:stretch>
+                  </pic:blipFill>
+                  <pic:spPr>
+                    <a:xfrm>
+                      <a:off x="0" y="0"/>
+                      <a:ext cx="4132137" cy="2308627"/>
+                    </a:xfrm>
+                    <a:prstGeom prst="rect">
+                      <a:avLst/>
+                    </a:prstGeom>
+                  </pic:spPr>
+                </pic:pic>
+              </a:graphicData>
+            </a:graphic>
+          </wp:inline>
+        </w:drawing>
+      </w:r>
+    </w:p>
+    <w:p>
+      <w:pPr>
+        <w:rPr>
+          <w:b/>
+          <w:bCs/>
+          <w:sz w:val="22"/>
+          <w:szCs w:val="22"/>
+        </w:rPr>
+      </w:pPr>
+      <w:r>
+        <w:rPr>
+          <w:b/>
+          <w:bCs/>
+          <w:sz w:val="22"/>
+          <w:szCs w:val="22"/>
+        </w:rPr>
+        <w:t>Descripción</w:t>
+      </w:r>
+    </w:p>
+    <w:p>
+      <w:pPr>
+        <w:rPr>
+          <w:sz w:val="22"/>
+          <w:szCs w:val="22"/>
+        </w:rPr>
+      </w:pPr>
+      <w:r>
+        <w:rPr>
+          <w:sz w:val="22"/>
+          <w:szCs w:val="22"/>
+        </w:rPr>
+        <w:t>Esta ventana va a p</w:t>
+      </w:r>
+      <w:r>
+        <w:rPr>
+          <w:sz w:val="22"/>
+          <w:szCs w:val="22"/>
+        </w:rPr>
+        <w:t>ermitir a</w:t>
+      </w:r>
+      <w:r>
+        <w:rPr>
+          <w:sz w:val="22"/>
+          <w:szCs w:val="22"/>
+        </w:rPr>
+        <w:t xml:space="preserve"> profesores y</w:t>
+      </w:r>
+      <w:r>
+        <w:rPr>
+          <w:sz w:val="22"/>
+          <w:szCs w:val="22"/>
+        </w:rPr>
+        <w:t xml:space="preserve"> personal autorizado </w:t>
+      </w:r>
+      <w:r>
+        <w:rPr>
+          <w:sz w:val="22"/>
+          <w:szCs w:val="22"/>
+        </w:rPr>
+        <w:t xml:space="preserve">a </w:t>
+      </w:r>
+      <w:r>
+        <w:rPr>
+          <w:sz w:val="22"/>
+          <w:szCs w:val="22"/>
+        </w:rPr>
+        <w:t>registrar nuevos alumnos dentro del sistema</w:t>
+      </w:r>
+      <w:r>
+        <w:rPr>
+          <w:sz w:val="22"/>
+          <w:szCs w:val="22"/>
+        </w:rPr>
+        <w:t>.</w:t>
+      </w:r>
+    </w:p>
+    <w:p>
+      <w:pPr>
+        <w:rPr>
+          <w:b/>
+          <w:bCs/>
+          <w:sz w:val="22"/>
+          <w:szCs w:val="22"/>
+        </w:rPr>
+      </w:pPr>
+      <w:r>
+        <w:rPr>
+          <w:b/>
+          <w:bCs/>
+          <w:sz w:val="22"/>
+          <w:szCs w:val="22"/>
+        </w:rPr>
+        <w:t>Restricciones</w:t>
+      </w:r>
+    </w:p>
+    <w:p>
+      <w:pPr>
+        <w:rPr>
+          <w:sz w:val="22"/>
+          <w:szCs w:val="22"/>
+        </w:rPr>
+      </w:pPr>
+      <w:r>
+        <w:rPr>
+          <w:sz w:val="22"/>
+          <w:szCs w:val="22"/>
+        </w:rPr>
+        <w:t xml:space="preserve">Todos los campos obligatorios </w:t>
+      </w:r>
+      <w:r>
+        <w:rPr>
+          <w:sz w:val="22"/>
+          <w:szCs w:val="22"/>
+        </w:rPr>
+        <w:t xml:space="preserve">se </w:t>
+      </w:r>
+      <w:r>
+        <w:rPr>
+          <w:sz w:val="22"/>
+          <w:szCs w:val="22"/>
+        </w:rPr>
+        <w:t xml:space="preserve">deberán completar. </w:t>
+      </w:r>
+    </w:p>
+    <w:p>
+      <w:pPr>
+        <w:rPr>
+          <w:sz w:val="22"/>
+          <w:szCs w:val="22"/>
+        </w:rPr>
+      </w:pPr>
+      <w:r>
+        <w:rPr>
+          <w:sz w:val="22"/>
+          <w:szCs w:val="22"/>
+        </w:rPr>
+        <w:t>El NIE no</w:t>
+      </w:r>
+      <w:r>
+        <w:rPr>
+          <w:sz w:val="22"/>
+          <w:szCs w:val="22"/>
+        </w:rPr>
+        <w:t xml:space="preserve"> va a</w:t>
+      </w:r>
+      <w:r>
+        <w:rPr>
+          <w:sz w:val="22"/>
+          <w:szCs w:val="22"/>
+        </w:rPr>
+        <w:t xml:space="preserve"> pod</w:t>
+      </w:r>
+      <w:r>
+        <w:rPr>
+          <w:sz w:val="22"/>
+          <w:szCs w:val="22"/>
+        </w:rPr>
+        <w:t>er</w:t>
+      </w:r>
+      <w:r>
+        <w:rPr>
+          <w:sz w:val="22"/>
+          <w:szCs w:val="22"/>
+        </w:rPr>
+        <w:t xml:space="preserve"> estar repetido en la base de datos.  </w:t>
+      </w:r>
+    </w:p>
+    <w:p>
+      <w:pPr>
+        <w:rPr>
+          <w:sz w:val="22"/>
+          <w:szCs w:val="22"/>
+        </w:rPr>
+      </w:pPr>
+      <w:r>
+        <w:rPr>
+          <w:sz w:val="22"/>
+          <w:szCs w:val="22"/>
+        </w:rPr>
+        <w:t>Solo</w:t>
+      </w:r>
+      <w:r>
+        <w:rPr>
+          <w:sz w:val="22"/>
+          <w:szCs w:val="22"/>
+        </w:rPr>
+        <w:t xml:space="preserve"> los</w:t>
+      </w:r>
+      <w:r>
+        <w:rPr>
+          <w:sz w:val="22"/>
+          <w:szCs w:val="22"/>
+        </w:rPr>
+        <w:t xml:space="preserve"> usuarios </w:t>
+      </w:r>
+      <w:r>
+        <w:rPr>
+          <w:sz w:val="22"/>
+          <w:szCs w:val="22"/>
+        </w:rPr>
+        <w:t xml:space="preserve">que estén </w:t>
+      </w:r>
+      <w:r>
+        <w:rPr>
+          <w:sz w:val="22"/>
+          <w:szCs w:val="22"/>
+        </w:rPr>
+        <w:t xml:space="preserve">autorizados </w:t>
+      </w:r>
+      <w:r>
+        <w:rPr>
+          <w:sz w:val="22"/>
+          <w:szCs w:val="22"/>
+        </w:rPr>
+        <w:t xml:space="preserve">van a </w:t>
+      </w:r>
+      <w:r>
+        <w:rPr>
+          <w:sz w:val="22"/>
+          <w:szCs w:val="22"/>
+        </w:rPr>
+        <w:t>pod</w:t>
+      </w:r>
+      <w:r>
+        <w:rPr>
+          <w:sz w:val="22"/>
+          <w:szCs w:val="22"/>
+        </w:rPr>
+        <w:t>er</w:t>
+      </w:r>
+      <w:r>
+        <w:rPr>
+          <w:sz w:val="22"/>
+          <w:szCs w:val="22"/>
+        </w:rPr>
+        <w:t xml:space="preserve"> crear nuevos registros.</w:t>
+      </w:r>
+    </w:p>
+    <w:p>
+      <w:pPr>
+        <w:rPr>
+          <w:b/>
+          <w:bCs/>
+          <w:sz w:val="22"/>
+          <w:szCs w:val="22"/>
+        </w:rPr>
+      </w:pPr>
+      <w:r>
+        <w:rPr>
+          <w:b/>
+          <w:bCs/>
+          <w:sz w:val="22"/>
+          <w:szCs w:val="22"/>
+        </w:rPr>
+        <w:t xml:space="preserve">Ventana </w:t>
+      </w:r>
+      <w:r>
+        <w:rPr>
+          <w:b/>
+          <w:bCs/>
+          <w:sz w:val="22"/>
+          <w:szCs w:val="22"/>
+        </w:rPr>
+        <w:t>validación de los datos</w:t>
+      </w:r>
+    </w:p>
+    <w:p>
+      <w:r>
+        <w:drawing>
+          <wp:inline distT="0" distB="0" distL="0" distR="0" wp14:anchorId="1E008192" wp14:editId="3BA36CEC">
+            <wp:extent cx="4259580" cy="2588690"/>
+            <wp:effectExtent l="0" t="0" r="7620" b="2540"/>
+            <wp:docPr id="65364066" name="Imagen 1"/>
+            <wp:cNvGraphicFramePr>
+              <a:graphicFrameLocks xmlns:a="http://schemas.openxmlformats.org/drawingml/2006/main" noChangeAspect="1"/>
+            </wp:cNvGraphicFramePr>
+            <a:graphic xmlns:a="http://schemas.openxmlformats.org/drawingml/2006/main">
+              <a:graphicData uri="http://schemas.openxmlformats.org/drawingml/2006/picture">
+                <pic:pic xmlns:pic="http://schemas.openxmlformats.org/drawingml/2006/picture">
+                  <pic:nvPicPr>
+                    <pic:cNvPr id="65364066" name=""/>
+                    <pic:cNvPicPr/>
+                  </pic:nvPicPr>
+                  <pic:blipFill>
+                    <a:blip r:embed="rId47"/>
+                    <a:stretch>
+                      <a:fillRect/>
+                    </a:stretch>
+                  </pic:blipFill>
+                  <pic:spPr>
+                    <a:xfrm>
+                      <a:off x="0" y="0"/>
+                      <a:ext cx="4264209" cy="2591503"/>
+                    </a:xfrm>
+                    <a:prstGeom prst="rect">
+                      <a:avLst/>
+                    </a:prstGeom>
+                  </pic:spPr>
+                </pic:pic>
+              </a:graphicData>
+            </a:graphic>
+          </wp:inline>
+        </w:drawing>
+      </w:r>
+    </w:p>
+    <w:p/>
+    <w:p>
+      <w:r>
+        <w:lastRenderedPageBreak/>
+        <w:drawing>
+          <wp:inline distT="0" distB="0" distL="0" distR="0" wp14:anchorId="75143949" wp14:editId="6170AC1E">
+            <wp:extent cx="3915508" cy="3053503"/>
+            <wp:effectExtent l="0" t="0" r="8890" b="0"/>
+            <wp:docPr id="1548460409" name="Imagen 1"/>
+            <wp:cNvGraphicFramePr>
+              <a:graphicFrameLocks xmlns:a="http://schemas.openxmlformats.org/drawingml/2006/main" noChangeAspect="1"/>
+            </wp:cNvGraphicFramePr>
+            <a:graphic xmlns:a="http://schemas.openxmlformats.org/drawingml/2006/main">
+              <a:graphicData uri="http://schemas.openxmlformats.org/drawingml/2006/picture">
+                <pic:pic xmlns:pic="http://schemas.openxmlformats.org/drawingml/2006/picture">
+                  <pic:nvPicPr>
+                    <pic:cNvPr id="1548460409" name=""/>
+                    <pic:cNvPicPr/>
+                  </pic:nvPicPr>
+                  <pic:blipFill>
+                    <a:blip r:embed="rId48"/>
+                    <a:stretch>
+                      <a:fillRect/>
+                    </a:stretch>
+                  </pic:blipFill>
+                  <pic:spPr>
+                    <a:xfrm>
+                      <a:off x="0" y="0"/>
+                      <a:ext cx="3944713" cy="3076278"/>
+                    </a:xfrm>
+                    <a:prstGeom prst="rect">
+                      <a:avLst/>
+                    </a:prstGeom>
+                  </pic:spPr>
+                </pic:pic>
+              </a:graphicData>
+            </a:graphic>
+          </wp:inline>
+        </w:drawing>
+      </w:r>
+    </w:p>
+    <w:p/>
+    <w:p/>
     <w:p>
       <w:pPr>
         <w:pStyle w:val="Ttulo4"/>
@@ -19523,7 +19624,7 @@
                     </pic:cNvPicPr>
                   </pic:nvPicPr>
                   <pic:blipFill>
-                    <a:blip r:embed="rId46" cstate="print">
+                    <a:blip r:embed="rId49" cstate="print">
                       <a:extLst>
                         <a:ext uri="{28A0092B-C50C-407E-A947-70E740481C1C}">
                           <a14:useLocalDpi xmlns:a14="http://schemas.microsoft.com/office/drawing/2010/main" val="0"/>
@@ -20192,21 +20293,7 @@
         <w:rPr>
           <w:lang w:val="en-GB"/>
         </w:rPr>
-        <w:t xml:space="preserve">` </w:t>
-      </w:r>
-      <w:proofErr w:type="gramStart"/>
-      <w:r>
-        <w:rPr>
-          <w:lang w:val="en-GB"/>
-        </w:rPr>
-        <w:t>varchar(</w:t>
-      </w:r>
-      <w:proofErr w:type="gramEnd"/>
-      <w:r>
-        <w:rPr>
-          <w:lang w:val="en-GB"/>
-        </w:rPr>
-        <w:t>10) NOT NULL,</w:t>
+        <w:t>` varchar(10) NOT NULL,</w:t>
       </w:r>
     </w:p>
     <w:p>
@@ -20233,21 +20320,7 @@
         <w:rPr>
           <w:lang w:val="en-GB"/>
         </w:rPr>
-        <w:t xml:space="preserve">` </w:t>
-      </w:r>
-      <w:proofErr w:type="gramStart"/>
-      <w:r>
-        <w:rPr>
-          <w:lang w:val="en-GB"/>
-        </w:rPr>
-        <w:t>varchar(</w:t>
-      </w:r>
-      <w:proofErr w:type="gramEnd"/>
-      <w:r>
-        <w:rPr>
-          <w:lang w:val="en-GB"/>
-        </w:rPr>
-        <w:t>255) NOT NULL,</w:t>
+        <w:t>` varchar(255) NOT NULL,</w:t>
       </w:r>
     </w:p>
     <w:p>
@@ -20274,21 +20347,7 @@
         <w:rPr>
           <w:lang w:val="en-GB"/>
         </w:rPr>
-        <w:t xml:space="preserve">` </w:t>
-      </w:r>
-      <w:proofErr w:type="gramStart"/>
-      <w:r>
-        <w:rPr>
-          <w:lang w:val="en-GB"/>
-        </w:rPr>
-        <w:t>varchar(</w:t>
-      </w:r>
-      <w:proofErr w:type="gramEnd"/>
-      <w:r>
-        <w:rPr>
-          <w:lang w:val="en-GB"/>
-        </w:rPr>
-        <w:t>255) NOT NULL,</w:t>
+        <w:t>` varchar(255) NOT NULL,</w:t>
       </w:r>
     </w:p>
     <w:p>
@@ -20315,21 +20374,7 @@
         <w:rPr>
           <w:lang w:val="en-GB"/>
         </w:rPr>
-        <w:t xml:space="preserve">` </w:t>
-      </w:r>
-      <w:proofErr w:type="gramStart"/>
-      <w:r>
-        <w:rPr>
-          <w:lang w:val="en-GB"/>
-        </w:rPr>
-        <w:t>varchar(</w:t>
-      </w:r>
-      <w:proofErr w:type="gramEnd"/>
-      <w:r>
-        <w:rPr>
-          <w:lang w:val="en-GB"/>
-        </w:rPr>
-        <w:t xml:space="preserve">2) NOT NULL DEFAULT '0' COMMENT '0 nada, I </w:t>
+        <w:t xml:space="preserve">` varchar(2) NOT NULL DEFAULT '0' COMMENT '0 nada, I </w:t>
       </w:r>
       <w:proofErr w:type="spellStart"/>
       <w:r>
@@ -20387,7 +20432,6 @@
         <w:t xml:space="preserve">` </w:t>
       </w:r>
       <w:proofErr w:type="spellStart"/>
-      <w:proofErr w:type="gramStart"/>
       <w:r>
         <w:rPr>
           <w:lang w:val="en-GB"/>
@@ -20399,14 +20443,7 @@
         <w:rPr>
           <w:lang w:val="en-GB"/>
         </w:rPr>
-        <w:t>(</w:t>
-      </w:r>
-      <w:proofErr w:type="gramEnd"/>
-      <w:r>
-        <w:rPr>
-          <w:lang w:val="en-GB"/>
-        </w:rPr>
-        <w:t>1) NOT NULL DEFAULT 1 COMMENT '0 True, 1 false'</w:t>
+        <w:t>(1) NOT NULL DEFAULT 1 COMMENT '0 True, 1 false'</w:t>
       </w:r>
     </w:p>
     <w:p>
@@ -20595,21 +20632,7 @@
         <w:rPr>
           <w:lang w:val="en-GB"/>
         </w:rPr>
-        <w:t xml:space="preserve">` </w:t>
-      </w:r>
-      <w:proofErr w:type="gramStart"/>
-      <w:r>
-        <w:rPr>
-          <w:lang w:val="en-GB"/>
-        </w:rPr>
-        <w:t>varchar(</w:t>
-      </w:r>
-      <w:proofErr w:type="gramEnd"/>
-      <w:r>
-        <w:rPr>
-          <w:lang w:val="en-GB"/>
-        </w:rPr>
-        <w:t>10) NOT NULL,</w:t>
+        <w:t>` varchar(10) NOT NULL,</w:t>
       </w:r>
     </w:p>
     <w:p>
@@ -20636,21 +20659,7 @@
         <w:rPr>
           <w:lang w:val="en-GB"/>
         </w:rPr>
-        <w:t xml:space="preserve">` </w:t>
-      </w:r>
-      <w:proofErr w:type="gramStart"/>
-      <w:r>
-        <w:rPr>
-          <w:lang w:val="en-GB"/>
-        </w:rPr>
-        <w:t>varchar(</w:t>
-      </w:r>
-      <w:proofErr w:type="gramEnd"/>
-      <w:r>
-        <w:rPr>
-          <w:lang w:val="en-GB"/>
-        </w:rPr>
-        <w:t>255) NOT NULL,</w:t>
+        <w:t>` varchar(255) NOT NULL,</w:t>
       </w:r>
     </w:p>
     <w:p>
@@ -20677,21 +20686,7 @@
         <w:rPr>
           <w:lang w:val="en-GB"/>
         </w:rPr>
-        <w:t xml:space="preserve">` </w:t>
-      </w:r>
-      <w:proofErr w:type="gramStart"/>
-      <w:r>
-        <w:rPr>
-          <w:lang w:val="en-GB"/>
-        </w:rPr>
-        <w:t>varchar(</w:t>
-      </w:r>
-      <w:proofErr w:type="gramEnd"/>
-      <w:r>
-        <w:rPr>
-          <w:lang w:val="en-GB"/>
-        </w:rPr>
-        <w:t>20) NOT NULL,</w:t>
+        <w:t>` varchar(20) NOT NULL,</w:t>
       </w:r>
     </w:p>
     <w:p>
@@ -20773,21 +20768,7 @@
         <w:rPr>
           <w:lang w:val="en-GB"/>
         </w:rPr>
-        <w:t xml:space="preserve">` </w:t>
-      </w:r>
-      <w:proofErr w:type="gramStart"/>
-      <w:r>
-        <w:rPr>
-          <w:lang w:val="en-GB"/>
-        </w:rPr>
-        <w:t>varchar(</w:t>
-      </w:r>
-      <w:proofErr w:type="gramEnd"/>
-      <w:r>
-        <w:rPr>
-          <w:lang w:val="en-GB"/>
-        </w:rPr>
-        <w:t xml:space="preserve">1) NOT NULL DEFAULT 'P' COMMENT 'P: </w:t>
+        <w:t xml:space="preserve">` varchar(1) NOT NULL DEFAULT 'P' COMMENT 'P: </w:t>
       </w:r>
       <w:proofErr w:type="spellStart"/>
       <w:r>
@@ -20801,21 +20782,7 @@
         <w:rPr>
           <w:lang w:val="en-GB"/>
         </w:rPr>
-        <w:t xml:space="preserve">, </w:t>
-      </w:r>
-      <w:proofErr w:type="gramStart"/>
-      <w:r>
-        <w:rPr>
-          <w:lang w:val="en-GB"/>
-        </w:rPr>
-        <w:t>D:Devuelto</w:t>
-      </w:r>
-      <w:proofErr w:type="gramEnd"/>
-      <w:r>
-        <w:rPr>
-          <w:lang w:val="en-GB"/>
-        </w:rPr>
-        <w:t>'</w:t>
+        <w:t>, D:Devuelto'</w:t>
       </w:r>
     </w:p>
     <w:p>
@@ -21004,21 +20971,7 @@
         <w:rPr>
           <w:lang w:val="en-GB"/>
         </w:rPr>
-        <w:t xml:space="preserve">` </w:t>
-      </w:r>
-      <w:proofErr w:type="gramStart"/>
-      <w:r>
-        <w:rPr>
-          <w:lang w:val="en-GB"/>
-        </w:rPr>
-        <w:t>varchar(</w:t>
-      </w:r>
-      <w:proofErr w:type="gramEnd"/>
-      <w:r>
-        <w:rPr>
-          <w:lang w:val="en-GB"/>
-        </w:rPr>
-        <w:t>20) NOT NULL,</w:t>
+        <w:t>` varchar(20) NOT NULL,</w:t>
       </w:r>
     </w:p>
     <w:p>
@@ -21045,21 +20998,7 @@
         <w:rPr>
           <w:lang w:val="en-GB"/>
         </w:rPr>
-        <w:t xml:space="preserve">` </w:t>
-      </w:r>
-      <w:proofErr w:type="gramStart"/>
-      <w:r>
-        <w:rPr>
-          <w:lang w:val="en-GB"/>
-        </w:rPr>
-        <w:t>varchar(</w:t>
-      </w:r>
-      <w:proofErr w:type="gramEnd"/>
-      <w:r>
-        <w:rPr>
-          <w:lang w:val="en-GB"/>
-        </w:rPr>
-        <w:t>20) NOT NULL</w:t>
+        <w:t>` varchar(20) NOT NULL</w:t>
       </w:r>
     </w:p>
     <w:p>
@@ -21248,21 +21187,7 @@
         <w:rPr>
           <w:lang w:val="en-GB"/>
         </w:rPr>
-        <w:t xml:space="preserve">` </w:t>
-      </w:r>
-      <w:proofErr w:type="gramStart"/>
-      <w:r>
-        <w:rPr>
-          <w:lang w:val="en-GB"/>
-        </w:rPr>
-        <w:t>varchar(</w:t>
-      </w:r>
-      <w:proofErr w:type="gramEnd"/>
-      <w:r>
-        <w:rPr>
-          <w:lang w:val="en-GB"/>
-        </w:rPr>
-        <w:t>20) NOT NULL,</w:t>
+        <w:t>` varchar(20) NOT NULL,</w:t>
       </w:r>
     </w:p>
     <w:p>
@@ -21289,21 +21214,7 @@
         <w:rPr>
           <w:lang w:val="en-GB"/>
         </w:rPr>
-        <w:t xml:space="preserve">` </w:t>
-      </w:r>
-      <w:proofErr w:type="gramStart"/>
-      <w:r>
-        <w:rPr>
-          <w:lang w:val="en-GB"/>
-        </w:rPr>
-        <w:t>varchar(</w:t>
-      </w:r>
-      <w:proofErr w:type="gramEnd"/>
-      <w:r>
-        <w:rPr>
-          <w:lang w:val="en-GB"/>
-        </w:rPr>
-        <w:t>255) NOT NULL,</w:t>
+        <w:t>` varchar(255) NOT NULL,</w:t>
       </w:r>
     </w:p>
     <w:p>
@@ -21330,21 +21241,7 @@
         <w:rPr>
           <w:lang w:val="en-GB"/>
         </w:rPr>
-        <w:t xml:space="preserve">` </w:t>
-      </w:r>
-      <w:proofErr w:type="gramStart"/>
-      <w:r>
-        <w:rPr>
-          <w:lang w:val="en-GB"/>
-        </w:rPr>
-        <w:t>varchar(</w:t>
-      </w:r>
-      <w:proofErr w:type="gramEnd"/>
-      <w:r>
-        <w:rPr>
-          <w:lang w:val="en-GB"/>
-        </w:rPr>
-        <w:t>255) NOT NULL,</w:t>
+        <w:t>` varchar(255) NOT NULL,</w:t>
       </w:r>
     </w:p>
     <w:p>
@@ -21371,21 +21268,7 @@
         <w:rPr>
           <w:lang w:val="en-GB"/>
         </w:rPr>
-        <w:t xml:space="preserve">` </w:t>
-      </w:r>
-      <w:proofErr w:type="gramStart"/>
-      <w:r>
-        <w:rPr>
-          <w:lang w:val="en-GB"/>
-        </w:rPr>
-        <w:t>int(</w:t>
-      </w:r>
-      <w:proofErr w:type="gramEnd"/>
-      <w:r>
-        <w:rPr>
-          <w:lang w:val="en-GB"/>
-        </w:rPr>
-        <w:t>5) NOT NULL,</w:t>
+        <w:t>` int(5) NOT NULL,</w:t>
       </w:r>
     </w:p>
     <w:p>
@@ -21412,21 +21295,7 @@
         <w:rPr>
           <w:lang w:val="en-GB"/>
         </w:rPr>
-        <w:t xml:space="preserve">` </w:t>
-      </w:r>
-      <w:proofErr w:type="gramStart"/>
-      <w:r>
-        <w:rPr>
-          <w:lang w:val="en-GB"/>
-        </w:rPr>
-        <w:t>int(</w:t>
-      </w:r>
-      <w:proofErr w:type="gramEnd"/>
-      <w:r>
-        <w:rPr>
-          <w:lang w:val="en-GB"/>
-        </w:rPr>
-        <w:t>11) NOT NULL,</w:t>
+        <w:t>` int(11) NOT NULL,</w:t>
       </w:r>
     </w:p>
     <w:p>
@@ -21453,21 +21322,7 @@
         <w:rPr>
           <w:lang w:val="en-GB"/>
         </w:rPr>
-        <w:t xml:space="preserve">` </w:t>
-      </w:r>
-      <w:proofErr w:type="gramStart"/>
-      <w:r>
-        <w:rPr>
-          <w:lang w:val="en-GB"/>
-        </w:rPr>
-        <w:t>varchar(</w:t>
-      </w:r>
-      <w:proofErr w:type="gramEnd"/>
-      <w:r>
-        <w:rPr>
-          <w:lang w:val="en-GB"/>
-        </w:rPr>
-        <w:t>20) NOT NULL</w:t>
+        <w:t>` varchar(20) NOT NULL</w:t>
       </w:r>
     </w:p>
     <w:p>
@@ -21642,21 +21497,7 @@
         <w:rPr>
           <w:lang w:val="en-GB"/>
         </w:rPr>
-        <w:t xml:space="preserve">  `id` </w:t>
-      </w:r>
-      <w:proofErr w:type="gramStart"/>
-      <w:r>
-        <w:rPr>
-          <w:lang w:val="en-GB"/>
-        </w:rPr>
-        <w:t>int(</w:t>
-      </w:r>
-      <w:proofErr w:type="gramEnd"/>
-      <w:r>
-        <w:rPr>
-          <w:lang w:val="en-GB"/>
-        </w:rPr>
-        <w:t>11) NOT NULL,</w:t>
+        <w:t xml:space="preserve">  `id` int(11) NOT NULL,</w:t>
       </w:r>
     </w:p>
     <w:p>
@@ -21683,21 +21524,7 @@
         <w:rPr>
           <w:lang w:val="en-GB"/>
         </w:rPr>
-        <w:t xml:space="preserve">` </w:t>
-      </w:r>
-      <w:proofErr w:type="gramStart"/>
-      <w:r>
-        <w:rPr>
-          <w:lang w:val="en-GB"/>
-        </w:rPr>
-        <w:t>varchar(</w:t>
-      </w:r>
-      <w:proofErr w:type="gramEnd"/>
-      <w:r>
-        <w:rPr>
-          <w:lang w:val="en-GB"/>
-        </w:rPr>
-        <w:t>255) NOT NULL,</w:t>
+        <w:t>` varchar(255) NOT NULL,</w:t>
       </w:r>
     </w:p>
     <w:p>
@@ -21724,21 +21551,7 @@
         <w:rPr>
           <w:lang w:val="en-GB"/>
         </w:rPr>
-        <w:t xml:space="preserve">` </w:t>
-      </w:r>
-      <w:proofErr w:type="gramStart"/>
-      <w:r>
-        <w:rPr>
-          <w:lang w:val="en-GB"/>
-        </w:rPr>
-        <w:t>varchar(</w:t>
-      </w:r>
-      <w:proofErr w:type="gramEnd"/>
-      <w:r>
-        <w:rPr>
-          <w:lang w:val="en-GB"/>
-        </w:rPr>
-        <w:t>255) NOT NULL</w:t>
+        <w:t>` varchar(255) NOT NULL</w:t>
       </w:r>
     </w:p>
     <w:p>
@@ -22079,7 +21892,6 @@
         <w:t>nie</w:t>
       </w:r>
       <w:proofErr w:type="spellEnd"/>
-      <w:proofErr w:type="gramStart"/>
       <w:r>
         <w:rPr>
           <w:lang w:val="en-GB"/>
@@ -22087,7 +21899,6 @@
         <w:t>`,`</w:t>
       </w:r>
       <w:proofErr w:type="spellStart"/>
-      <w:proofErr w:type="gramEnd"/>
       <w:r>
         <w:rPr>
           <w:lang w:val="en-GB"/>
@@ -22095,7 +21906,6 @@
         <w:t>curso</w:t>
       </w:r>
       <w:proofErr w:type="spellEnd"/>
-      <w:proofErr w:type="gramStart"/>
       <w:r>
         <w:rPr>
           <w:lang w:val="en-GB"/>
@@ -22103,7 +21913,6 @@
         <w:t>`,`</w:t>
       </w:r>
       <w:proofErr w:type="spellStart"/>
-      <w:proofErr w:type="gramEnd"/>
       <w:r>
         <w:rPr>
           <w:lang w:val="en-GB"/>
@@ -29705,7 +29514,7 @@
                         </pic:cNvPicPr>
                       </pic:nvPicPr>
                       <pic:blipFill>
-                        <a:blip r:embed="rId47" cstate="print">
+                        <a:blip r:embed="rId50" cstate="print">
                           <a:extLst>
                             <a:ext uri="{28A0092B-C50C-407E-A947-70E740481C1C}">
                               <a14:useLocalDpi xmlns:a14="http://schemas.microsoft.com/office/drawing/2010/main" val="0"/>
@@ -29797,7 +29606,7 @@
                         </pic:cNvPicPr>
                       </pic:nvPicPr>
                       <pic:blipFill>
-                        <a:blip r:embed="rId48" cstate="print">
+                        <a:blip r:embed="rId51" cstate="print">
                           <a:extLst>
                             <a:ext uri="{28A0092B-C50C-407E-A947-70E740481C1C}">
                               <a14:useLocalDpi xmlns:a14="http://schemas.microsoft.com/office/drawing/2010/main" val="0"/>
@@ -37638,8 +37447,8 @@
     <w:p/>
     <w:p/>
     <w:sectPr>
-      <w:headerReference w:type="default" r:id="rId49"/>
-      <w:footerReference w:type="default" r:id="rId50"/>
+      <w:headerReference w:type="default" r:id="rId52"/>
+      <w:footerReference w:type="default" r:id="rId53"/>
       <w:pgSz w:w="11906" w:h="16838" w:code="9"/>
       <w:pgMar w:top="1291" w:right="936" w:bottom="720" w:left="936" w:header="0" w:footer="289" w:gutter="0"/>
       <w:pgNumType w:start="1"/>
@@ -40128,7 +39937,7 @@
   <w:style w:type="paragraph" w:default="1" w:styleId="Normal">
     <w:name w:val="Normal"/>
     <w:qFormat/>
-    <w:rsid w:val="007D2FA9"/>
+    <w:rsid w:val="00CF44D1"/>
     <w:pPr>
       <w:spacing w:after="0"/>
       <w:jc w:val="both"/>
@@ -41581,6 +41390,7 @@
     <w:rsid w:val="000C2B5E"/>
     <w:rsid w:val="0010763A"/>
     <w:rsid w:val="00112C1E"/>
+    <w:rsid w:val="00132793"/>
     <w:rsid w:val="001370FA"/>
     <w:rsid w:val="0019656C"/>
     <w:rsid w:val="00216802"/>
@@ -41649,7 +41459,6 @@
     <w:rsid w:val="00A015F9"/>
     <w:rsid w:val="00A71D6A"/>
     <w:rsid w:val="00A94268"/>
-    <w:rsid w:val="00AB2DF2"/>
     <w:rsid w:val="00AC11EA"/>
     <w:rsid w:val="00B444FF"/>
     <w:rsid w:val="00BA03CE"/>

</xml_diff>

<commit_message>
Decimo guardado (19/05/2026, 22:54)
</commit_message>
<xml_diff>
--- a/UT_7_2024_2025 (2).docx
+++ b/UT_7_2024_2025 (2).docx
@@ -6739,11 +6739,9 @@
                 <w:r>
                   <w:t xml:space="preserve">  (</w:t>
                 </w:r>
-                <w:proofErr w:type="spellStart"/>
                 <w:r>
                   <w:t>PhpStorm</w:t>
                 </w:r>
-                <w:proofErr w:type="spellEnd"/>
                 <w:r>
                   <w:t>)</w:t>
                 </w:r>
@@ -6866,13 +6864,8 @@
                 <w:tcW w:w="7477" w:type="dxa"/>
               </w:tcPr>
               <w:p>
-                <w:proofErr w:type="spellStart"/>
                 <w:r>
-                  <w:t>Mysql</w:t>
-                </w:r>
-                <w:proofErr w:type="spellEnd"/>
-                <w:r>
-                  <w:t xml:space="preserve"> </w:t>
+                  <w:t xml:space="preserve">Mysql </w:t>
                 </w:r>
                 <w:r>
                   <w:t>8.2</w:t>
@@ -6881,15 +6874,7 @@
                   <w:t xml:space="preserve"> </w:t>
                 </w:r>
                 <w:r>
-                  <w:t xml:space="preserve">– </w:t>
-                </w:r>
-                <w:proofErr w:type="spellStart"/>
-                <w:r>
-                  <w:t>MariaDB</w:t>
-                </w:r>
-                <w:proofErr w:type="spellEnd"/>
-                <w:r>
-                  <w:t xml:space="preserve"> </w:t>
+                  <w:t xml:space="preserve">– MariaDB </w:t>
                 </w:r>
                 <w:r>
                   <w:t xml:space="preserve"> co</w:t>
@@ -6989,13 +6974,8 @@
               </w:tcPr>
               <w:p>
                 <w:r>
-                  <w:t xml:space="preserve">Servidor web con </w:t>
+                  <w:t>Servidor web con cpanel</w:t>
                 </w:r>
-                <w:proofErr w:type="spellStart"/>
-                <w:r>
-                  <w:t>cpanel</w:t>
-                </w:r>
-                <w:proofErr w:type="spellEnd"/>
               </w:p>
             </w:tc>
           </w:tr>
@@ -7051,13 +7031,8 @@
               </w:tcPr>
               <w:p>
                 <w:r>
-                  <w:t xml:space="preserve">Servidor web con </w:t>
+                  <w:t>Servidor web con Mysql</w:t>
                 </w:r>
-                <w:proofErr w:type="spellStart"/>
-                <w:r>
-                  <w:t>Mysql</w:t>
-                </w:r>
-                <w:proofErr w:type="spellEnd"/>
                 <w:r>
                   <w:t xml:space="preserve"> </w:t>
                 </w:r>
@@ -7080,15 +7055,7 @@
               </w:tcPr>
               <w:p>
                 <w:r>
-                  <w:t xml:space="preserve">Un usuario de acceso a </w:t>
-                </w:r>
-                <w:proofErr w:type="spellStart"/>
-                <w:r>
-                  <w:t>Mysql</w:t>
-                </w:r>
-                <w:proofErr w:type="spellEnd"/>
-                <w:r>
-                  <w:t xml:space="preserve"> independiente</w:t>
+                  <w:t>Un usuario de acceso a Mysql independiente</w:t>
                 </w:r>
                 <w:r>
                   <w:t xml:space="preserve"> y BBDD propia</w:t>
@@ -7283,11 +7250,9 @@
           <w:r>
             <w:t xml:space="preserve"> la compra del software de desarrollo </w:t>
           </w:r>
-          <w:proofErr w:type="spellStart"/>
           <w:r>
             <w:t>PHPStorm</w:t>
           </w:r>
-          <w:proofErr w:type="spellEnd"/>
           <w:r>
             <w:t xml:space="preserve"> con una licencia profesional.</w:t>
           </w:r>
@@ -7453,7 +7418,7 @@
                 <v:path o:extrusionok="f" gradientshapeok="t" o:connecttype="rect"/>
                 <o:lock v:ext="edit" aspectratio="t"/>
               </v:shapetype>
-              <v:shape id="_x0000_i1025" type="#_x0000_t75" style="width:465.7pt;height:205.4pt">
+              <v:shape id="_x0000_i1025" type="#_x0000_t75" style="width:465.75pt;height:205.3pt">
                 <v:imagedata r:id="rId15" o:title="SecuencaciónFasesProyecto"/>
               </v:shape>
             </w:pict>
@@ -7480,7 +7445,7 @@
           </w:pPr>
           <w:r>
             <w:pict w14:anchorId="5636CC0F">
-              <v:shape id="_x0000_i1026" type="#_x0000_t75" style="width:383.1pt;height:241.85pt">
+              <v:shape id="_x0000_i1026" type="#_x0000_t75" style="width:383.2pt;height:241.8pt">
                 <v:imagedata r:id="rId16" o:title="PlanificaciónRecursosProyectos"/>
               </v:shape>
             </w:pict>
@@ -8451,21 +8416,7 @@
               <w:rPr>
                 <w:b/>
               </w:rPr>
-              <w:t xml:space="preserve">Cargar la BBDD       subcaso: </w:t>
-            </w:r>
-            <w:proofErr w:type="spellStart"/>
-            <w:r>
-              <w:rPr>
-                <w:b/>
-              </w:rPr>
-              <w:t>Gestion</w:t>
-            </w:r>
-            <w:proofErr w:type="spellEnd"/>
-            <w:r>
-              <w:rPr>
-                <w:b/>
-              </w:rPr>
-              <w:t xml:space="preserve"> de errores</w:t>
+              <w:t>Cargar la BBDD       subcaso: Gestion de errores</w:t>
             </w:r>
           </w:p>
         </w:tc>
@@ -10963,21 +10914,7 @@
               <w:rPr>
                 <w:bCs/>
               </w:rPr>
-              <w:t xml:space="preserve">Se generará un fichero SQL-92 para preservar los datos. Se dará la posibilidad de exportarlos a </w:t>
-            </w:r>
-            <w:proofErr w:type="spellStart"/>
-            <w:r>
-              <w:rPr>
-                <w:bCs/>
-              </w:rPr>
-              <w:t>csv</w:t>
-            </w:r>
-            <w:proofErr w:type="spellEnd"/>
-            <w:r>
-              <w:rPr>
-                <w:bCs/>
-              </w:rPr>
-              <w:t xml:space="preserve"> también.</w:t>
+              <w:t>Se generará un fichero SQL-92 para preservar los datos. Se dará la posibilidad de exportarlos a csv también.</w:t>
             </w:r>
           </w:p>
         </w:tc>
@@ -11285,35 +11222,7 @@
               <w:rPr>
                 <w:bCs/>
               </w:rPr>
-              <w:t xml:space="preserve">Se pedirá el formato y sus características para exportar: </w:t>
-            </w:r>
-            <w:proofErr w:type="spellStart"/>
-            <w:r>
-              <w:rPr>
-                <w:bCs/>
-              </w:rPr>
-              <w:t>json</w:t>
-            </w:r>
-            <w:proofErr w:type="spellEnd"/>
-            <w:r>
-              <w:rPr>
-                <w:bCs/>
-              </w:rPr>
-              <w:t xml:space="preserve">, </w:t>
-            </w:r>
-            <w:proofErr w:type="spellStart"/>
-            <w:r>
-              <w:rPr>
-                <w:bCs/>
-              </w:rPr>
-              <w:t>csv</w:t>
-            </w:r>
-            <w:proofErr w:type="spellEnd"/>
-            <w:r>
-              <w:rPr>
-                <w:bCs/>
-              </w:rPr>
-              <w:t>, sql-92</w:t>
+              <w:t>Se pedirá el formato y sus características para exportar: json, csv, sql-92</w:t>
             </w:r>
           </w:p>
         </w:tc>
@@ -11883,7 +11792,7 @@
       </w:pPr>
       <w:r>
         <w:pict w14:anchorId="119133E6">
-          <v:shape id="_x0000_i1027" type="#_x0000_t75" style="width:252.45pt;height:469.4pt">
+          <v:shape id="_x0000_i1027" type="#_x0000_t75" style="width:252.5pt;height:469.4pt">
             <v:imagedata r:id="rId24" o:title="DA_Login"/>
           </v:shape>
         </w:pict>
@@ -11978,7 +11887,7 @@
     <w:p>
       <w:r>
         <w:pict w14:anchorId="3BC76BB7">
-          <v:shape id="_x0000_i1028" type="#_x0000_t75" style="width:2in;height:523.4pt">
+          <v:shape id="_x0000_i1028" type="#_x0000_t75" style="width:143.95pt;height:523.45pt">
             <v:imagedata r:id="rId26" o:title="DA_VaciarBBDD"/>
           </v:shape>
         </w:pict>
@@ -11991,7 +11900,7 @@
       </w:r>
       <w:r>
         <w:pict w14:anchorId="6C7C2997">
-          <v:shape id="_x0000_i1029" type="#_x0000_t75" style="width:144.45pt;height:430.15pt">
+          <v:shape id="_x0000_i1029" type="#_x0000_t75" style="width:144.55pt;height:430.2pt">
             <v:imagedata r:id="rId27" o:title="DA_GestiónErrores"/>
           </v:shape>
         </w:pict>
@@ -12574,18 +12483,10 @@
         <w:t xml:space="preserve">Una vez llevada a cabo la normalización, teniendo en </w:t>
       </w:r>
       <w:r>
-        <w:t>cuenta hasta la forma de Boyce-</w:t>
-      </w:r>
-      <w:proofErr w:type="spellStart"/>
-      <w:r>
-        <w:t>C</w:t>
-      </w:r>
-      <w:r>
-        <w:t>ood</w:t>
-      </w:r>
-      <w:proofErr w:type="spellEnd"/>
-      <w:r>
-        <w:t>, el resultado es el siguiente:</w:t>
+        <w:t>cuenta hasta la forma de Boyce-C</w:t>
+      </w:r>
+      <w:r>
+        <w:t>ood, el resultado es el siguiente:</w:t>
       </w:r>
     </w:p>
     <w:p>
@@ -12651,38 +12552,15 @@
       <w:r>
         <w:t xml:space="preserve">: </w:t>
       </w:r>
-      <w:proofErr w:type="spellStart"/>
       <w:r>
         <w:rPr>
           <w:u w:val="single"/>
         </w:rPr>
         <w:t>isbn</w:t>
       </w:r>
-      <w:proofErr w:type="spellEnd"/>
-      <w:r>
-        <w:t xml:space="preserve">, titulo, autor, </w:t>
-      </w:r>
-      <w:proofErr w:type="spellStart"/>
-      <w:r>
-        <w:t>numero_ejemplares</w:t>
-      </w:r>
-      <w:proofErr w:type="spellEnd"/>
-      <w:r>
-        <w:t xml:space="preserve">, </w:t>
-      </w:r>
-      <w:proofErr w:type="spellStart"/>
-      <w:r>
-        <w:t>id_materia</w:t>
-      </w:r>
-      <w:proofErr w:type="spellEnd"/>
-      <w:r>
-        <w:t xml:space="preserve">, </w:t>
-      </w:r>
-      <w:proofErr w:type="spellStart"/>
-      <w:r>
-        <w:t>id_curso</w:t>
-      </w:r>
-      <w:proofErr w:type="spellEnd"/>
+      <w:r>
+        <w:t>, titulo, autor, numero_ejemplares, id_materia, id_curso</w:t>
+      </w:r>
     </w:p>
     <w:p>
       <w:pPr>
@@ -12712,7 +12590,6 @@
       <w:pPr>
         <w:ind w:left="567"/>
       </w:pPr>
-      <w:proofErr w:type="spellStart"/>
       <w:r>
         <w:rPr>
           <w:b/>
@@ -12720,72 +12597,17 @@
         </w:rPr>
         <w:t>AlumnosCursosLibros</w:t>
       </w:r>
-      <w:proofErr w:type="spellEnd"/>
       <w:r>
         <w:t xml:space="preserve">: </w:t>
       </w:r>
-      <w:proofErr w:type="spellStart"/>
       <w:r>
         <w:rPr>
           <w:u w:val="single"/>
         </w:rPr>
-        <w:t>isbn</w:t>
-      </w:r>
-      <w:proofErr w:type="spellEnd"/>
-      <w:r>
-        <w:rPr>
-          <w:u w:val="single"/>
-        </w:rPr>
-        <w:t xml:space="preserve">, </w:t>
-      </w:r>
-      <w:proofErr w:type="spellStart"/>
-      <w:r>
-        <w:rPr>
-          <w:u w:val="single"/>
-        </w:rPr>
-        <w:t>id_alumno</w:t>
-      </w:r>
-      <w:proofErr w:type="spellEnd"/>
-      <w:r>
-        <w:rPr>
-          <w:u w:val="single"/>
-        </w:rPr>
-        <w:t xml:space="preserve">, </w:t>
-      </w:r>
-      <w:proofErr w:type="spellStart"/>
-      <w:r>
-        <w:rPr>
-          <w:u w:val="single"/>
-        </w:rPr>
-        <w:t>id_curso</w:t>
-      </w:r>
-      <w:proofErr w:type="spellEnd"/>
-      <w:r>
-        <w:t xml:space="preserve">, </w:t>
-      </w:r>
-      <w:proofErr w:type="spellStart"/>
-      <w:r>
-        <w:t>fecha_entrega</w:t>
-      </w:r>
-      <w:proofErr w:type="spellEnd"/>
-      <w:r>
-        <w:t xml:space="preserve">, </w:t>
-      </w:r>
-      <w:proofErr w:type="spellStart"/>
-      <w:r>
-        <w:t>fecha_devolucion</w:t>
-      </w:r>
-      <w:proofErr w:type="spellEnd"/>
-      <w:r>
-        <w:t xml:space="preserve">, estado (entregado, </w:t>
-      </w:r>
-      <w:proofErr w:type="spellStart"/>
-      <w:r>
-        <w:t>por_devolver</w:t>
-      </w:r>
-      <w:proofErr w:type="spellEnd"/>
-      <w:r>
-        <w:t>)</w:t>
+        <w:t>isbn, id_alumno, id_curso</w:t>
+      </w:r>
+      <w:r>
+        <w:t>, fecha_entrega, fecha_devolucion, estado (entregado, por_devolver)</w:t>
       </w:r>
     </w:p>
     <w:p>
@@ -14018,19 +13840,8 @@
                 <w:sz w:val="16"/>
                 <w:szCs w:val="16"/>
               </w:rPr>
-              <w:t xml:space="preserve">Letra del </w:t>
-            </w:r>
-            <w:proofErr w:type="spellStart"/>
-            <w:r>
-              <w:rPr>
-                <w:rFonts w:cstheme="minorHAnsi"/>
-                <w:b/>
-                <w:sz w:val="16"/>
-                <w:szCs w:val="16"/>
-              </w:rPr>
-              <w:t>niev</w:t>
-            </w:r>
-            <w:proofErr w:type="spellEnd"/>
+              <w:t>Letra del niev</w:t>
+            </w:r>
           </w:p>
         </w:tc>
       </w:tr>
@@ -14466,7 +14277,6 @@
                 <w:szCs w:val="16"/>
               </w:rPr>
             </w:pPr>
-            <w:proofErr w:type="spellStart"/>
             <w:r>
               <w:rPr>
                 <w:rFonts w:cstheme="minorHAnsi"/>
@@ -14476,7 +14286,6 @@
               </w:rPr>
               <w:t>isbn</w:t>
             </w:r>
-            <w:proofErr w:type="spellEnd"/>
           </w:p>
         </w:tc>
         <w:tc>
@@ -14626,19 +14435,8 @@
                 <w:sz w:val="16"/>
                 <w:szCs w:val="16"/>
               </w:rPr>
-              <w:t xml:space="preserve">Validar formato </w:t>
-            </w:r>
-            <w:proofErr w:type="spellStart"/>
-            <w:r>
-              <w:rPr>
-                <w:rFonts w:cstheme="minorHAnsi"/>
-                <w:b/>
-                <w:sz w:val="16"/>
-                <w:szCs w:val="16"/>
-              </w:rPr>
-              <w:t>isbn</w:t>
-            </w:r>
-            <w:proofErr w:type="spellEnd"/>
+              <w:t>Validar formato isbn</w:t>
+            </w:r>
           </w:p>
         </w:tc>
       </w:tr>
@@ -14961,7 +14759,6 @@
                 <w:szCs w:val="16"/>
               </w:rPr>
             </w:pPr>
-            <w:proofErr w:type="spellStart"/>
             <w:r>
               <w:rPr>
                 <w:rFonts w:cstheme="minorHAnsi"/>
@@ -14971,7 +14768,6 @@
               </w:rPr>
               <w:t>numero_ejemplares</w:t>
             </w:r>
-            <w:proofErr w:type="spellEnd"/>
           </w:p>
         </w:tc>
         <w:tc>
@@ -15122,7 +14918,6 @@
                 <w:szCs w:val="16"/>
               </w:rPr>
             </w:pPr>
-            <w:proofErr w:type="spellStart"/>
             <w:r>
               <w:rPr>
                 <w:rFonts w:cstheme="minorHAnsi"/>
@@ -15132,7 +14927,6 @@
               </w:rPr>
               <w:t>id_materia</w:t>
             </w:r>
-            <w:proofErr w:type="spellEnd"/>
           </w:p>
         </w:tc>
         <w:tc>
@@ -15301,7 +15095,6 @@
                 <w:szCs w:val="16"/>
               </w:rPr>
             </w:pPr>
-            <w:proofErr w:type="spellStart"/>
             <w:r>
               <w:rPr>
                 <w:rFonts w:cstheme="minorHAnsi"/>
@@ -15311,7 +15104,6 @@
               </w:rPr>
               <w:t>id_curso</w:t>
             </w:r>
-            <w:proofErr w:type="spellEnd"/>
           </w:p>
         </w:tc>
         <w:tc>
@@ -16428,7 +16220,6 @@
                 <w:szCs w:val="16"/>
               </w:rPr>
             </w:pPr>
-            <w:proofErr w:type="spellStart"/>
             <w:r>
               <w:rPr>
                 <w:rFonts w:cstheme="minorHAnsi"/>
@@ -16438,7 +16229,6 @@
               </w:rPr>
               <w:t>bilingue</w:t>
             </w:r>
-            <w:proofErr w:type="spellEnd"/>
           </w:p>
         </w:tc>
         <w:tc>
@@ -16610,7 +16400,6 @@
                 <w:szCs w:val="16"/>
               </w:rPr>
             </w:pPr>
-            <w:proofErr w:type="spellStart"/>
             <w:r>
               <w:rPr>
                 <w:rFonts w:cstheme="minorHAnsi"/>
@@ -16620,7 +16409,6 @@
               </w:rPr>
               <w:t>alumnoscursoslibros</w:t>
             </w:r>
-            <w:proofErr w:type="spellEnd"/>
           </w:p>
         </w:tc>
       </w:tr>
@@ -17222,7 +17010,6 @@
                 <w:szCs w:val="16"/>
               </w:rPr>
             </w:pPr>
-            <w:proofErr w:type="spellStart"/>
             <w:r>
               <w:rPr>
                 <w:rFonts w:cstheme="minorHAnsi"/>
@@ -17232,7 +17019,6 @@
               </w:rPr>
               <w:t>isbn</w:t>
             </w:r>
-            <w:proofErr w:type="spellEnd"/>
           </w:p>
         </w:tc>
         <w:tc>
@@ -17410,7 +17196,6 @@
                 <w:szCs w:val="16"/>
               </w:rPr>
             </w:pPr>
-            <w:proofErr w:type="spellStart"/>
             <w:r>
               <w:rPr>
                 <w:rFonts w:cstheme="minorHAnsi"/>
@@ -17429,7 +17214,6 @@
               </w:rPr>
               <w:t>echa_entrega</w:t>
             </w:r>
-            <w:proofErr w:type="spellEnd"/>
           </w:p>
         </w:tc>
         <w:tc>
@@ -17580,7 +17364,6 @@
                 <w:szCs w:val="16"/>
               </w:rPr>
             </w:pPr>
-            <w:proofErr w:type="spellStart"/>
             <w:r>
               <w:rPr>
                 <w:rFonts w:cstheme="minorHAnsi"/>
@@ -17617,7 +17400,6 @@
               </w:rPr>
               <w:t>evolución</w:t>
             </w:r>
-            <w:proofErr w:type="spellEnd"/>
           </w:p>
         </w:tc>
         <w:tc>
@@ -18265,34 +18047,23 @@
       <w:r>
         <w:t xml:space="preserve">almacenará los contratos que se van a generar por el sistema para su firma y el directorio </w:t>
       </w:r>
-      <w:proofErr w:type="spellStart"/>
       <w:r>
         <w:rPr>
           <w:b/>
           <w:bCs/>
         </w:rPr>
-        <w:t>copias_de_seguridad</w:t>
-      </w:r>
-      <w:proofErr w:type="spellEnd"/>
+        <w:t xml:space="preserve">copias_de_seguridad </w:t>
+      </w:r>
+      <w:r>
+        <w:t xml:space="preserve">que es donde almacenaremos las copias de seguridad que se generan para poder proteger la información. Y por último tenemos el directorio </w:t>
+      </w:r>
       <w:r>
         <w:rPr>
           <w:b/>
           <w:bCs/>
         </w:rPr>
-        <w:t xml:space="preserve"> </w:t>
-      </w:r>
-      <w:r>
-        <w:t xml:space="preserve">que es donde almacenaremos las copias de seguridad que se generan para poder proteger la información. Y por último tenemos el directorio </w:t>
-      </w:r>
-      <w:proofErr w:type="spellStart"/>
-      <w:r>
-        <w:rPr>
-          <w:b/>
-          <w:bCs/>
-        </w:rPr>
         <w:t>base_de_datos</w:t>
       </w:r>
-      <w:proofErr w:type="spellEnd"/>
       <w:r>
         <w:t xml:space="preserve"> que contendrá los archivos que son necesarios para poder conectar la aplicación con la base de datos.</w:t>
       </w:r>
@@ -18382,15 +18153,7 @@
     </w:p>
     <w:p>
       <w:r>
-        <w:t xml:space="preserve">El siguiente diagrama va a representar la estructura de clases que va a utilizar la aplicación para poder acceder y poder gestionar la información almacenada en la base de datos. La relación entre las clases va a permitir controlar la gestión de los préstamos las devoluciones, los cursos  y los libros que están asignados a cada alumno. El diagrama de clases se ha realizado teniendo en cuenta las relaciones existentes entre las distintas tablas del modelo relacional que se </w:t>
-      </w:r>
-      <w:proofErr w:type="spellStart"/>
-      <w:r>
-        <w:t>desarrollo</w:t>
-      </w:r>
-      <w:proofErr w:type="spellEnd"/>
-      <w:r>
-        <w:t xml:space="preserve"> anteriormente.</w:t>
+        <w:t>El siguiente diagrama va a representar la estructura de clases que va a utilizar la aplicación para poder acceder y poder gestionar la información almacenada en la base de datos. La relación entre las clases va a permitir controlar la gestión de los préstamos las devoluciones, los cursos  y los libros que están asignados a cada alumno. El diagrama de clases se ha realizado teniendo en cuenta las relaciones existentes entre las distintas tablas del modelo relacional que se desarrollo anteriormente.</w:t>
       </w:r>
     </w:p>
     <w:p>
@@ -19427,6 +19190,281 @@
                     <a:xfrm>
                       <a:off x="0" y="0"/>
                       <a:ext cx="3944713" cy="3076278"/>
+                    </a:xfrm>
+                    <a:prstGeom prst="rect">
+                      <a:avLst/>
+                    </a:prstGeom>
+                  </pic:spPr>
+                </pic:pic>
+              </a:graphicData>
+            </a:graphic>
+          </wp:inline>
+        </w:drawing>
+      </w:r>
+    </w:p>
+    <w:p>
+      <w:r>
+        <w:drawing>
+          <wp:inline distT="0" distB="0" distL="0" distR="0" wp14:anchorId="02EAF17E" wp14:editId="464E7AAF">
+            <wp:extent cx="3874477" cy="1465382"/>
+            <wp:effectExtent l="0" t="0" r="0" b="1905"/>
+            <wp:docPr id="1821480850" name="Imagen 1"/>
+            <wp:cNvGraphicFramePr>
+              <a:graphicFrameLocks xmlns:a="http://schemas.openxmlformats.org/drawingml/2006/main" noChangeAspect="1"/>
+            </wp:cNvGraphicFramePr>
+            <a:graphic xmlns:a="http://schemas.openxmlformats.org/drawingml/2006/main">
+              <a:graphicData uri="http://schemas.openxmlformats.org/drawingml/2006/picture">
+                <pic:pic xmlns:pic="http://schemas.openxmlformats.org/drawingml/2006/picture">
+                  <pic:nvPicPr>
+                    <pic:cNvPr id="1821480850" name=""/>
+                    <pic:cNvPicPr/>
+                  </pic:nvPicPr>
+                  <pic:blipFill>
+                    <a:blip r:embed="rId49"/>
+                    <a:stretch>
+                      <a:fillRect/>
+                    </a:stretch>
+                  </pic:blipFill>
+                  <pic:spPr>
+                    <a:xfrm>
+                      <a:off x="0" y="0"/>
+                      <a:ext cx="3909936" cy="1478793"/>
+                    </a:xfrm>
+                    <a:prstGeom prst="rect">
+                      <a:avLst/>
+                    </a:prstGeom>
+                  </pic:spPr>
+                </pic:pic>
+              </a:graphicData>
+            </a:graphic>
+          </wp:inline>
+        </w:drawing>
+      </w:r>
+    </w:p>
+    <w:p>
+      <w:r>
+        <w:drawing>
+          <wp:inline distT="0" distB="0" distL="0" distR="0" wp14:anchorId="02487E39" wp14:editId="207889B1">
+            <wp:extent cx="3913626" cy="1819910"/>
+            <wp:effectExtent l="0" t="0" r="0" b="8890"/>
+            <wp:docPr id="660343155" name="Imagen 1"/>
+            <wp:cNvGraphicFramePr>
+              <a:graphicFrameLocks xmlns:a="http://schemas.openxmlformats.org/drawingml/2006/main" noChangeAspect="1"/>
+            </wp:cNvGraphicFramePr>
+            <a:graphic xmlns:a="http://schemas.openxmlformats.org/drawingml/2006/main">
+              <a:graphicData uri="http://schemas.openxmlformats.org/drawingml/2006/picture">
+                <pic:pic xmlns:pic="http://schemas.openxmlformats.org/drawingml/2006/picture">
+                  <pic:nvPicPr>
+                    <pic:cNvPr id="660343155" name=""/>
+                    <pic:cNvPicPr/>
+                  </pic:nvPicPr>
+                  <pic:blipFill>
+                    <a:blip r:embed="rId50"/>
+                    <a:stretch>
+                      <a:fillRect/>
+                    </a:stretch>
+                  </pic:blipFill>
+                  <pic:spPr>
+                    <a:xfrm>
+                      <a:off x="0" y="0"/>
+                      <a:ext cx="3928775" cy="1826955"/>
+                    </a:xfrm>
+                    <a:prstGeom prst="rect">
+                      <a:avLst/>
+                    </a:prstGeom>
+                  </pic:spPr>
+                </pic:pic>
+              </a:graphicData>
+            </a:graphic>
+          </wp:inline>
+        </w:drawing>
+      </w:r>
+    </w:p>
+    <w:p>
+      <w:r>
+        <w:drawing>
+          <wp:inline distT="0" distB="0" distL="0" distR="0" wp14:anchorId="66C2A8CA" wp14:editId="59E53038">
+            <wp:extent cx="3913505" cy="2345216"/>
+            <wp:effectExtent l="0" t="0" r="0" b="0"/>
+            <wp:docPr id="2120355448" name="Imagen 1"/>
+            <wp:cNvGraphicFramePr>
+              <a:graphicFrameLocks xmlns:a="http://schemas.openxmlformats.org/drawingml/2006/main" noChangeAspect="1"/>
+            </wp:cNvGraphicFramePr>
+            <a:graphic xmlns:a="http://schemas.openxmlformats.org/drawingml/2006/main">
+              <a:graphicData uri="http://schemas.openxmlformats.org/drawingml/2006/picture">
+                <pic:pic xmlns:pic="http://schemas.openxmlformats.org/drawingml/2006/picture">
+                  <pic:nvPicPr>
+                    <pic:cNvPr id="2120355448" name=""/>
+                    <pic:cNvPicPr/>
+                  </pic:nvPicPr>
+                  <pic:blipFill>
+                    <a:blip r:embed="rId51"/>
+                    <a:stretch>
+                      <a:fillRect/>
+                    </a:stretch>
+                  </pic:blipFill>
+                  <pic:spPr>
+                    <a:xfrm>
+                      <a:off x="0" y="0"/>
+                      <a:ext cx="3924628" cy="2351881"/>
+                    </a:xfrm>
+                    <a:prstGeom prst="rect">
+                      <a:avLst/>
+                    </a:prstGeom>
+                  </pic:spPr>
+                </pic:pic>
+              </a:graphicData>
+            </a:graphic>
+          </wp:inline>
+        </w:drawing>
+      </w:r>
+    </w:p>
+    <w:p>
+      <w:r>
+        <w:lastRenderedPageBreak/>
+        <w:drawing>
+          <wp:inline distT="0" distB="0" distL="0" distR="0" wp14:anchorId="559C8D48" wp14:editId="21B96F82">
+            <wp:extent cx="3845170" cy="1814518"/>
+            <wp:effectExtent l="0" t="0" r="3175" b="0"/>
+            <wp:docPr id="1585363165" name="Imagen 1"/>
+            <wp:cNvGraphicFramePr>
+              <a:graphicFrameLocks xmlns:a="http://schemas.openxmlformats.org/drawingml/2006/main" noChangeAspect="1"/>
+            </wp:cNvGraphicFramePr>
+            <a:graphic xmlns:a="http://schemas.openxmlformats.org/drawingml/2006/main">
+              <a:graphicData uri="http://schemas.openxmlformats.org/drawingml/2006/picture">
+                <pic:pic xmlns:pic="http://schemas.openxmlformats.org/drawingml/2006/picture">
+                  <pic:nvPicPr>
+                    <pic:cNvPr id="1585363165" name=""/>
+                    <pic:cNvPicPr/>
+                  </pic:nvPicPr>
+                  <pic:blipFill>
+                    <a:blip r:embed="rId52"/>
+                    <a:stretch>
+                      <a:fillRect/>
+                    </a:stretch>
+                  </pic:blipFill>
+                  <pic:spPr>
+                    <a:xfrm>
+                      <a:off x="0" y="0"/>
+                      <a:ext cx="3864347" cy="1823568"/>
+                    </a:xfrm>
+                    <a:prstGeom prst="rect">
+                      <a:avLst/>
+                    </a:prstGeom>
+                  </pic:spPr>
+                </pic:pic>
+              </a:graphicData>
+            </a:graphic>
+          </wp:inline>
+        </w:drawing>
+      </w:r>
+    </w:p>
+    <w:p>
+      <w:r>
+        <w:drawing>
+          <wp:inline distT="0" distB="0" distL="0" distR="0" wp14:anchorId="589FD133" wp14:editId="03BFDB87">
+            <wp:extent cx="3848837" cy="1834662"/>
+            <wp:effectExtent l="0" t="0" r="0" b="0"/>
+            <wp:docPr id="263466832" name="Imagen 1"/>
+            <wp:cNvGraphicFramePr>
+              <a:graphicFrameLocks xmlns:a="http://schemas.openxmlformats.org/drawingml/2006/main" noChangeAspect="1"/>
+            </wp:cNvGraphicFramePr>
+            <a:graphic xmlns:a="http://schemas.openxmlformats.org/drawingml/2006/main">
+              <a:graphicData uri="http://schemas.openxmlformats.org/drawingml/2006/picture">
+                <pic:pic xmlns:pic="http://schemas.openxmlformats.org/drawingml/2006/picture">
+                  <pic:nvPicPr>
+                    <pic:cNvPr id="263466832" name=""/>
+                    <pic:cNvPicPr/>
+                  </pic:nvPicPr>
+                  <pic:blipFill>
+                    <a:blip r:embed="rId53"/>
+                    <a:stretch>
+                      <a:fillRect/>
+                    </a:stretch>
+                  </pic:blipFill>
+                  <pic:spPr>
+                    <a:xfrm>
+                      <a:off x="0" y="0"/>
+                      <a:ext cx="3860445" cy="1840195"/>
+                    </a:xfrm>
+                    <a:prstGeom prst="rect">
+                      <a:avLst/>
+                    </a:prstGeom>
+                  </pic:spPr>
+                </pic:pic>
+              </a:graphicData>
+            </a:graphic>
+          </wp:inline>
+        </w:drawing>
+      </w:r>
+    </w:p>
+    <w:p/>
+    <w:p>
+      <w:r>
+        <w:drawing>
+          <wp:inline distT="0" distB="0" distL="0" distR="0" wp14:anchorId="13D24009" wp14:editId="0ACE688A">
+            <wp:extent cx="5316416" cy="1999617"/>
+            <wp:effectExtent l="0" t="0" r="0" b="635"/>
+            <wp:docPr id="908618920" name="Imagen 1"/>
+            <wp:cNvGraphicFramePr>
+              <a:graphicFrameLocks xmlns:a="http://schemas.openxmlformats.org/drawingml/2006/main" noChangeAspect="1"/>
+            </wp:cNvGraphicFramePr>
+            <a:graphic xmlns:a="http://schemas.openxmlformats.org/drawingml/2006/main">
+              <a:graphicData uri="http://schemas.openxmlformats.org/drawingml/2006/picture">
+                <pic:pic xmlns:pic="http://schemas.openxmlformats.org/drawingml/2006/picture">
+                  <pic:nvPicPr>
+                    <pic:cNvPr id="908618920" name=""/>
+                    <pic:cNvPicPr/>
+                  </pic:nvPicPr>
+                  <pic:blipFill>
+                    <a:blip r:embed="rId54"/>
+                    <a:stretch>
+                      <a:fillRect/>
+                    </a:stretch>
+                  </pic:blipFill>
+                  <pic:spPr>
+                    <a:xfrm>
+                      <a:off x="0" y="0"/>
+                      <a:ext cx="5349168" cy="2011936"/>
+                    </a:xfrm>
+                    <a:prstGeom prst="rect">
+                      <a:avLst/>
+                    </a:prstGeom>
+                  </pic:spPr>
+                </pic:pic>
+              </a:graphicData>
+            </a:graphic>
+          </wp:inline>
+        </w:drawing>
+      </w:r>
+    </w:p>
+    <w:p>
+      <w:r>
+        <w:drawing>
+          <wp:inline distT="0" distB="0" distL="0" distR="0" wp14:anchorId="71941A1A" wp14:editId="28E64B1E">
+            <wp:extent cx="4073770" cy="3070145"/>
+            <wp:effectExtent l="0" t="0" r="3175" b="0"/>
+            <wp:docPr id="886101392" name="Imagen 1"/>
+            <wp:cNvGraphicFramePr>
+              <a:graphicFrameLocks xmlns:a="http://schemas.openxmlformats.org/drawingml/2006/main" noChangeAspect="1"/>
+            </wp:cNvGraphicFramePr>
+            <a:graphic xmlns:a="http://schemas.openxmlformats.org/drawingml/2006/main">
+              <a:graphicData uri="http://schemas.openxmlformats.org/drawingml/2006/picture">
+                <pic:pic xmlns:pic="http://schemas.openxmlformats.org/drawingml/2006/picture">
+                  <pic:nvPicPr>
+                    <pic:cNvPr id="886101392" name=""/>
+                    <pic:cNvPicPr/>
+                  </pic:nvPicPr>
+                  <pic:blipFill>
+                    <a:blip r:embed="rId55"/>
+                    <a:stretch>
+                      <a:fillRect/>
+                    </a:stretch>
+                  </pic:blipFill>
+                  <pic:spPr>
+                    <a:xfrm>
+                      <a:off x="0" y="0"/>
+                      <a:ext cx="4086390" cy="3079656"/>
                     </a:xfrm>
                     <a:prstGeom prst="rect">
                       <a:avLst/>
@@ -19624,7 +19662,7 @@
                     </pic:cNvPicPr>
                   </pic:nvPicPr>
                   <pic:blipFill>
-                    <a:blip r:embed="rId49" cstate="print">
+                    <a:blip r:embed="rId56" cstate="print">
                       <a:extLst>
                         <a:ext uri="{28A0092B-C50C-407E-A947-70E740481C1C}">
                           <a14:useLocalDpi xmlns:a14="http://schemas.microsoft.com/office/drawing/2010/main" val="0"/>
@@ -19747,14 +19785,9 @@
       <w:bookmarkStart w:id="151" w:name="_Toc49341858"/>
       <w:bookmarkStart w:id="152" w:name="_Toc170148368"/>
       <w:bookmarkStart w:id="153" w:name="_Toc170148682"/>
-      <w:proofErr w:type="spellStart"/>
       <w:r>
         <w:lastRenderedPageBreak/>
-        <w:t>Sql</w:t>
-      </w:r>
-      <w:proofErr w:type="spellEnd"/>
-      <w:r>
-        <w:t xml:space="preserve"> de creación (MySQL)</w:t>
+        <w:t>Sql de creación (MySQL)</w:t>
       </w:r>
       <w:bookmarkEnd w:id="148"/>
       <w:bookmarkEnd w:id="149"/>
@@ -19829,21 +19862,7 @@
         <w:rPr>
           <w:lang w:val="en-GB"/>
         </w:rPr>
-        <w:t xml:space="preserve">-- </w:t>
-      </w:r>
-      <w:proofErr w:type="spellStart"/>
-      <w:r>
-        <w:rPr>
-          <w:lang w:val="en-GB"/>
-        </w:rPr>
-        <w:t>Servidor</w:t>
-      </w:r>
-      <w:proofErr w:type="spellEnd"/>
-      <w:r>
-        <w:rPr>
-          <w:lang w:val="en-GB"/>
-        </w:rPr>
-        <w:t>: 127.0.0.1</w:t>
+        <w:t>-- Servidor: 127.0.0.1</w:t>
       </w:r>
     </w:p>
     <w:p>
@@ -19856,21 +19875,7 @@
         <w:rPr>
           <w:lang w:val="en-GB"/>
         </w:rPr>
-        <w:t xml:space="preserve">-- Tiempo de </w:t>
-      </w:r>
-      <w:proofErr w:type="spellStart"/>
-      <w:r>
-        <w:rPr>
-          <w:lang w:val="en-GB"/>
-        </w:rPr>
-        <w:t>generación</w:t>
-      </w:r>
-      <w:proofErr w:type="spellEnd"/>
-      <w:r>
-        <w:rPr>
-          <w:lang w:val="en-GB"/>
-        </w:rPr>
-        <w:t>: 24-06-2024 a las 18:56:50</w:t>
+        <w:t>-- Tiempo de generación: 24-06-2024 a las 18:56:50</w:t>
       </w:r>
     </w:p>
     <w:p>
@@ -19883,35 +19888,7 @@
         <w:rPr>
           <w:lang w:val="en-GB"/>
         </w:rPr>
-        <w:t xml:space="preserve">-- </w:t>
-      </w:r>
-      <w:proofErr w:type="spellStart"/>
-      <w:r>
-        <w:rPr>
-          <w:lang w:val="en-GB"/>
-        </w:rPr>
-        <w:t>Versión</w:t>
-      </w:r>
-      <w:proofErr w:type="spellEnd"/>
-      <w:r>
-        <w:rPr>
-          <w:lang w:val="en-GB"/>
-        </w:rPr>
-        <w:t xml:space="preserve"> del </w:t>
-      </w:r>
-      <w:proofErr w:type="spellStart"/>
-      <w:r>
-        <w:rPr>
-          <w:lang w:val="en-GB"/>
-        </w:rPr>
-        <w:t>servidor</w:t>
-      </w:r>
-      <w:proofErr w:type="spellEnd"/>
-      <w:r>
-        <w:rPr>
-          <w:lang w:val="en-GB"/>
-        </w:rPr>
-        <w:t>: 10.4.27-MariaDB</w:t>
+        <w:t>-- Versión del servidor: 10.4.27-MariaDB</w:t>
       </w:r>
     </w:p>
     <w:p>
@@ -19924,21 +19901,7 @@
         <w:rPr>
           <w:lang w:val="en-GB"/>
         </w:rPr>
-        <w:t xml:space="preserve">-- </w:t>
-      </w:r>
-      <w:proofErr w:type="spellStart"/>
-      <w:r>
-        <w:rPr>
-          <w:lang w:val="en-GB"/>
-        </w:rPr>
-        <w:t>Versión</w:t>
-      </w:r>
-      <w:proofErr w:type="spellEnd"/>
-      <w:r>
-        <w:rPr>
-          <w:lang w:val="en-GB"/>
-        </w:rPr>
-        <w:t xml:space="preserve"> de PHP: 8.2.0</w:t>
+        <w:t>-- Versión de PHP: 8.2.0</w:t>
       </w:r>
     </w:p>
     <w:p>
@@ -19984,21 +19947,7 @@
         <w:rPr>
           <w:lang w:val="en-GB"/>
         </w:rPr>
-        <w:t xml:space="preserve">SET </w:t>
-      </w:r>
-      <w:proofErr w:type="spellStart"/>
-      <w:r>
-        <w:rPr>
-          <w:lang w:val="en-GB"/>
-        </w:rPr>
-        <w:t>time_zone</w:t>
-      </w:r>
-      <w:proofErr w:type="spellEnd"/>
-      <w:r>
-        <w:rPr>
-          <w:lang w:val="en-GB"/>
-        </w:rPr>
-        <w:t xml:space="preserve"> = "+00:00";</w:t>
+        <w:t>SET time_zone = "+00:00";</w:t>
       </w:r>
     </w:p>
     <w:p>
@@ -20090,35 +20039,7 @@
         <w:rPr>
           <w:lang w:val="en-GB"/>
         </w:rPr>
-        <w:t xml:space="preserve">-- Base de </w:t>
-      </w:r>
-      <w:proofErr w:type="spellStart"/>
-      <w:r>
-        <w:rPr>
-          <w:lang w:val="en-GB"/>
-        </w:rPr>
-        <w:t>datos</w:t>
-      </w:r>
-      <w:proofErr w:type="spellEnd"/>
-      <w:r>
-        <w:rPr>
-          <w:lang w:val="en-GB"/>
-        </w:rPr>
-        <w:t>: `</w:t>
-      </w:r>
-      <w:proofErr w:type="spellStart"/>
-      <w:r>
-        <w:rPr>
-          <w:lang w:val="en-GB"/>
-        </w:rPr>
-        <w:t>bancolibros</w:t>
-      </w:r>
-      <w:proofErr w:type="spellEnd"/>
-      <w:r>
-        <w:rPr>
-          <w:lang w:val="en-GB"/>
-        </w:rPr>
-        <w:t>`</w:t>
+        <w:t>-- Base de datos: `bancolibros`</w:t>
       </w:r>
     </w:p>
     <w:p>
@@ -20170,63 +20091,7 @@
         <w:rPr>
           <w:lang w:val="en-GB"/>
         </w:rPr>
-        <w:t xml:space="preserve">-- </w:t>
-      </w:r>
-      <w:proofErr w:type="spellStart"/>
-      <w:r>
-        <w:rPr>
-          <w:lang w:val="en-GB"/>
-        </w:rPr>
-        <w:t>Estructura</w:t>
-      </w:r>
-      <w:proofErr w:type="spellEnd"/>
-      <w:r>
-        <w:rPr>
-          <w:lang w:val="en-GB"/>
-        </w:rPr>
-        <w:t xml:space="preserve"> de </w:t>
-      </w:r>
-      <w:proofErr w:type="spellStart"/>
-      <w:r>
-        <w:rPr>
-          <w:lang w:val="en-GB"/>
-        </w:rPr>
-        <w:t>tabla</w:t>
-      </w:r>
-      <w:proofErr w:type="spellEnd"/>
-      <w:r>
-        <w:rPr>
-          <w:lang w:val="en-GB"/>
-        </w:rPr>
-        <w:t xml:space="preserve"> para la </w:t>
-      </w:r>
-      <w:proofErr w:type="spellStart"/>
-      <w:r>
-        <w:rPr>
-          <w:lang w:val="en-GB"/>
-        </w:rPr>
-        <w:t>tabla</w:t>
-      </w:r>
-      <w:proofErr w:type="spellEnd"/>
-      <w:r>
-        <w:rPr>
-          <w:lang w:val="en-GB"/>
-        </w:rPr>
-        <w:t xml:space="preserve"> `</w:t>
-      </w:r>
-      <w:proofErr w:type="spellStart"/>
-      <w:r>
-        <w:rPr>
-          <w:lang w:val="en-GB"/>
-        </w:rPr>
-        <w:t>alumnos</w:t>
-      </w:r>
-      <w:proofErr w:type="spellEnd"/>
-      <w:r>
-        <w:rPr>
-          <w:lang w:val="en-GB"/>
-        </w:rPr>
-        <w:t>`</w:t>
+        <w:t>-- Estructura de tabla para la tabla `alumnos`</w:t>
       </w:r>
     </w:p>
     <w:p>
@@ -20252,21 +20117,7 @@
         <w:rPr>
           <w:lang w:val="en-GB"/>
         </w:rPr>
-        <w:t>CREATE TABLE `</w:t>
-      </w:r>
-      <w:proofErr w:type="spellStart"/>
-      <w:r>
-        <w:rPr>
-          <w:lang w:val="en-GB"/>
-        </w:rPr>
-        <w:t>alumnos</w:t>
-      </w:r>
-      <w:proofErr w:type="spellEnd"/>
-      <w:r>
-        <w:rPr>
-          <w:lang w:val="en-GB"/>
-        </w:rPr>
-        <w:t>` (</w:t>
+        <w:t>CREATE TABLE `alumnos` (</w:t>
       </w:r>
     </w:p>
     <w:p>
@@ -20279,21 +20130,7 @@
         <w:rPr>
           <w:lang w:val="en-GB"/>
         </w:rPr>
-        <w:t xml:space="preserve">  `</w:t>
-      </w:r>
-      <w:proofErr w:type="spellStart"/>
-      <w:r>
-        <w:rPr>
-          <w:lang w:val="en-GB"/>
-        </w:rPr>
-        <w:t>nie</w:t>
-      </w:r>
-      <w:proofErr w:type="spellEnd"/>
-      <w:r>
-        <w:rPr>
-          <w:lang w:val="en-GB"/>
-        </w:rPr>
-        <w:t>` varchar(10) NOT NULL,</w:t>
+        <w:t xml:space="preserve">  `nie` varchar(10) NOT NULL,</w:t>
       </w:r>
     </w:p>
     <w:p>
@@ -20306,21 +20143,7 @@
         <w:rPr>
           <w:lang w:val="en-GB"/>
         </w:rPr>
-        <w:t xml:space="preserve">  `</w:t>
-      </w:r>
-      <w:proofErr w:type="spellStart"/>
-      <w:r>
-        <w:rPr>
-          <w:lang w:val="en-GB"/>
-        </w:rPr>
-        <w:t>nombre</w:t>
-      </w:r>
-      <w:proofErr w:type="spellEnd"/>
-      <w:r>
-        <w:rPr>
-          <w:lang w:val="en-GB"/>
-        </w:rPr>
-        <w:t>` varchar(255) NOT NULL,</w:t>
+        <w:t xml:space="preserve">  `nombre` varchar(255) NOT NULL,</w:t>
       </w:r>
     </w:p>
     <w:p>
@@ -20333,21 +20156,7 @@
         <w:rPr>
           <w:lang w:val="en-GB"/>
         </w:rPr>
-        <w:t xml:space="preserve">  `</w:t>
-      </w:r>
-      <w:proofErr w:type="spellStart"/>
-      <w:r>
-        <w:rPr>
-          <w:lang w:val="en-GB"/>
-        </w:rPr>
-        <w:t>apellidos</w:t>
-      </w:r>
-      <w:proofErr w:type="spellEnd"/>
-      <w:r>
-        <w:rPr>
-          <w:lang w:val="en-GB"/>
-        </w:rPr>
-        <w:t>` varchar(255) NOT NULL,</w:t>
+        <w:t xml:space="preserve">  `apellidos` varchar(255) NOT NULL,</w:t>
       </w:r>
     </w:p>
     <w:p>
@@ -20360,49 +20169,7 @@
         <w:rPr>
           <w:lang w:val="en-GB"/>
         </w:rPr>
-        <w:t xml:space="preserve">  `</w:t>
-      </w:r>
-      <w:proofErr w:type="spellStart"/>
-      <w:r>
-        <w:rPr>
-          <w:lang w:val="en-GB"/>
-        </w:rPr>
-        <w:t>tramo</w:t>
-      </w:r>
-      <w:proofErr w:type="spellEnd"/>
-      <w:r>
-        <w:rPr>
-          <w:lang w:val="en-GB"/>
-        </w:rPr>
-        <w:t xml:space="preserve">` varchar(2) NOT NULL DEFAULT '0' COMMENT '0 nada, I </w:t>
-      </w:r>
-      <w:proofErr w:type="spellStart"/>
-      <w:r>
-        <w:rPr>
-          <w:lang w:val="en-GB"/>
-        </w:rPr>
-        <w:t>tramo</w:t>
-      </w:r>
-      <w:proofErr w:type="spellEnd"/>
-      <w:r>
-        <w:rPr>
-          <w:lang w:val="en-GB"/>
-        </w:rPr>
-        <w:t xml:space="preserve"> I y II </w:t>
-      </w:r>
-      <w:proofErr w:type="spellStart"/>
-      <w:r>
-        <w:rPr>
-          <w:lang w:val="en-GB"/>
-        </w:rPr>
-        <w:t>Tramo</w:t>
-      </w:r>
-      <w:proofErr w:type="spellEnd"/>
-      <w:r>
-        <w:rPr>
-          <w:lang w:val="en-GB"/>
-        </w:rPr>
-        <w:t xml:space="preserve"> 2',</w:t>
+        <w:t xml:space="preserve">  `tramo` varchar(2) NOT NULL DEFAULT '0' COMMENT '0 nada, I tramo I y II Tramo 2',</w:t>
       </w:r>
     </w:p>
     <w:p>
@@ -20415,35 +20182,7 @@
         <w:rPr>
           <w:lang w:val="en-GB"/>
         </w:rPr>
-        <w:t xml:space="preserve">  `</w:t>
-      </w:r>
-      <w:proofErr w:type="spellStart"/>
-      <w:r>
-        <w:rPr>
-          <w:lang w:val="en-GB"/>
-        </w:rPr>
-        <w:t>bilingue</w:t>
-      </w:r>
-      <w:proofErr w:type="spellEnd"/>
-      <w:r>
-        <w:rPr>
-          <w:lang w:val="en-GB"/>
-        </w:rPr>
-        <w:t xml:space="preserve">` </w:t>
-      </w:r>
-      <w:proofErr w:type="spellStart"/>
-      <w:r>
-        <w:rPr>
-          <w:lang w:val="en-GB"/>
-        </w:rPr>
-        <w:t>tinyint</w:t>
-      </w:r>
-      <w:proofErr w:type="spellEnd"/>
-      <w:r>
-        <w:rPr>
-          <w:lang w:val="en-GB"/>
-        </w:rPr>
-        <w:t>(1) NOT NULL DEFAULT 1 COMMENT '0 True, 1 false'</w:t>
+        <w:t xml:space="preserve">  `bilingue` tinyint(1) NOT NULL DEFAULT 1 COMMENT '0 True, 1 false'</w:t>
       </w:r>
     </w:p>
     <w:p>
@@ -20456,21 +20195,7 @@
         <w:rPr>
           <w:lang w:val="en-GB"/>
         </w:rPr>
-        <w:t>) ENGINE=</w:t>
-      </w:r>
-      <w:proofErr w:type="spellStart"/>
-      <w:r>
-        <w:rPr>
-          <w:lang w:val="en-GB"/>
-        </w:rPr>
-        <w:t>InnoDB</w:t>
-      </w:r>
-      <w:proofErr w:type="spellEnd"/>
-      <w:r>
-        <w:rPr>
-          <w:lang w:val="en-GB"/>
-        </w:rPr>
-        <w:t xml:space="preserve"> DEFAULT CHARSET=utf8 COLLATE=utf8_spanish2_ci;</w:t>
+        <w:t>) ENGINE=InnoDB DEFAULT CHARSET=utf8 COLLATE=utf8_spanish2_ci;</w:t>
       </w:r>
     </w:p>
     <w:p>
@@ -20509,63 +20234,7 @@
         <w:rPr>
           <w:lang w:val="en-GB"/>
         </w:rPr>
-        <w:t xml:space="preserve">-- </w:t>
-      </w:r>
-      <w:proofErr w:type="spellStart"/>
-      <w:r>
-        <w:rPr>
-          <w:lang w:val="en-GB"/>
-        </w:rPr>
-        <w:t>Estructura</w:t>
-      </w:r>
-      <w:proofErr w:type="spellEnd"/>
-      <w:r>
-        <w:rPr>
-          <w:lang w:val="en-GB"/>
-        </w:rPr>
-        <w:t xml:space="preserve"> de </w:t>
-      </w:r>
-      <w:proofErr w:type="spellStart"/>
-      <w:r>
-        <w:rPr>
-          <w:lang w:val="en-GB"/>
-        </w:rPr>
-        <w:t>tabla</w:t>
-      </w:r>
-      <w:proofErr w:type="spellEnd"/>
-      <w:r>
-        <w:rPr>
-          <w:lang w:val="en-GB"/>
-        </w:rPr>
-        <w:t xml:space="preserve"> para la </w:t>
-      </w:r>
-      <w:proofErr w:type="spellStart"/>
-      <w:r>
-        <w:rPr>
-          <w:lang w:val="en-GB"/>
-        </w:rPr>
-        <w:t>tabla</w:t>
-      </w:r>
-      <w:proofErr w:type="spellEnd"/>
-      <w:r>
-        <w:rPr>
-          <w:lang w:val="en-GB"/>
-        </w:rPr>
-        <w:t xml:space="preserve"> `</w:t>
-      </w:r>
-      <w:proofErr w:type="spellStart"/>
-      <w:r>
-        <w:rPr>
-          <w:lang w:val="en-GB"/>
-        </w:rPr>
-        <w:t>alumnoscrusoslibros</w:t>
-      </w:r>
-      <w:proofErr w:type="spellEnd"/>
-      <w:r>
-        <w:rPr>
-          <w:lang w:val="en-GB"/>
-        </w:rPr>
-        <w:t>`</w:t>
+        <w:t>-- Estructura de tabla para la tabla `alumnoscrusoslibros`</w:t>
       </w:r>
     </w:p>
     <w:p>
@@ -20591,21 +20260,7 @@
         <w:rPr>
           <w:lang w:val="en-GB"/>
         </w:rPr>
-        <w:t>CREATE TABLE `</w:t>
-      </w:r>
-      <w:proofErr w:type="spellStart"/>
-      <w:r>
-        <w:rPr>
-          <w:lang w:val="en-GB"/>
-        </w:rPr>
-        <w:t>alumnoscrusoslibros</w:t>
-      </w:r>
-      <w:proofErr w:type="spellEnd"/>
-      <w:r>
-        <w:rPr>
-          <w:lang w:val="en-GB"/>
-        </w:rPr>
-        <w:t>` (</w:t>
+        <w:t>CREATE TABLE `alumnoscrusoslibros` (</w:t>
       </w:r>
     </w:p>
     <w:p>
@@ -20618,21 +20273,7 @@
         <w:rPr>
           <w:lang w:val="en-GB"/>
         </w:rPr>
-        <w:t xml:space="preserve">  `</w:t>
-      </w:r>
-      <w:proofErr w:type="spellStart"/>
-      <w:r>
-        <w:rPr>
-          <w:lang w:val="en-GB"/>
-        </w:rPr>
-        <w:t>nie</w:t>
-      </w:r>
-      <w:proofErr w:type="spellEnd"/>
-      <w:r>
-        <w:rPr>
-          <w:lang w:val="en-GB"/>
-        </w:rPr>
-        <w:t>` varchar(10) NOT NULL,</w:t>
+        <w:t xml:space="preserve">  `nie` varchar(10) NOT NULL,</w:t>
       </w:r>
     </w:p>
     <w:p>
@@ -20645,21 +20286,7 @@
         <w:rPr>
           <w:lang w:val="en-GB"/>
         </w:rPr>
-        <w:t xml:space="preserve">  `</w:t>
-      </w:r>
-      <w:proofErr w:type="spellStart"/>
-      <w:r>
-        <w:rPr>
-          <w:lang w:val="en-GB"/>
-        </w:rPr>
-        <w:t>curso</w:t>
-      </w:r>
-      <w:proofErr w:type="spellEnd"/>
-      <w:r>
-        <w:rPr>
-          <w:lang w:val="en-GB"/>
-        </w:rPr>
-        <w:t>` varchar(255) NOT NULL,</w:t>
+        <w:t xml:space="preserve">  `curso` varchar(255) NOT NULL,</w:t>
       </w:r>
     </w:p>
     <w:p>
@@ -20672,21 +20299,7 @@
         <w:rPr>
           <w:lang w:val="en-GB"/>
         </w:rPr>
-        <w:t xml:space="preserve">  `</w:t>
-      </w:r>
-      <w:proofErr w:type="spellStart"/>
-      <w:r>
-        <w:rPr>
-          <w:lang w:val="en-GB"/>
-        </w:rPr>
-        <w:t>isbn</w:t>
-      </w:r>
-      <w:proofErr w:type="spellEnd"/>
-      <w:r>
-        <w:rPr>
-          <w:lang w:val="en-GB"/>
-        </w:rPr>
-        <w:t>` varchar(20) NOT NULL,</w:t>
+        <w:t xml:space="preserve">  `isbn` varchar(20) NOT NULL,</w:t>
       </w:r>
     </w:p>
     <w:p>
@@ -20699,21 +20312,7 @@
         <w:rPr>
           <w:lang w:val="en-GB"/>
         </w:rPr>
-        <w:t xml:space="preserve">  `</w:t>
-      </w:r>
-      <w:proofErr w:type="spellStart"/>
-      <w:r>
-        <w:rPr>
-          <w:lang w:val="en-GB"/>
-        </w:rPr>
-        <w:t>fecha_entrega</w:t>
-      </w:r>
-      <w:proofErr w:type="spellEnd"/>
-      <w:r>
-        <w:rPr>
-          <w:lang w:val="en-GB"/>
-        </w:rPr>
-        <w:t>` date NOT NULL,</w:t>
+        <w:t xml:space="preserve">  `fecha_entrega` date NOT NULL,</w:t>
       </w:r>
     </w:p>
     <w:p>
@@ -20727,21 +20326,7 @@
           <w:lang w:val="en-GB"/>
         </w:rPr>
         <w:lastRenderedPageBreak/>
-        <w:t xml:space="preserve">  `</w:t>
-      </w:r>
-      <w:proofErr w:type="spellStart"/>
-      <w:r>
-        <w:rPr>
-          <w:lang w:val="en-GB"/>
-        </w:rPr>
-        <w:t>fecha_devolucion</w:t>
-      </w:r>
-      <w:proofErr w:type="spellEnd"/>
-      <w:r>
-        <w:rPr>
-          <w:lang w:val="en-GB"/>
-        </w:rPr>
-        <w:t>` date NOT NULL,</w:t>
+        <w:t xml:space="preserve">  `fecha_devolucion` date NOT NULL,</w:t>
       </w:r>
     </w:p>
     <w:p>
@@ -20754,35 +20339,7 @@
         <w:rPr>
           <w:lang w:val="en-GB"/>
         </w:rPr>
-        <w:t xml:space="preserve">  `</w:t>
-      </w:r>
-      <w:proofErr w:type="spellStart"/>
-      <w:r>
-        <w:rPr>
-          <w:lang w:val="en-GB"/>
-        </w:rPr>
-        <w:t>estado</w:t>
-      </w:r>
-      <w:proofErr w:type="spellEnd"/>
-      <w:r>
-        <w:rPr>
-          <w:lang w:val="en-GB"/>
-        </w:rPr>
-        <w:t xml:space="preserve">` varchar(1) NOT NULL DEFAULT 'P' COMMENT 'P: </w:t>
-      </w:r>
-      <w:proofErr w:type="spellStart"/>
-      <w:r>
-        <w:rPr>
-          <w:lang w:val="en-GB"/>
-        </w:rPr>
-        <w:t>Prestado</w:t>
-      </w:r>
-      <w:proofErr w:type="spellEnd"/>
-      <w:r>
-        <w:rPr>
-          <w:lang w:val="en-GB"/>
-        </w:rPr>
-        <w:t>, D:Devuelto'</w:t>
+        <w:t xml:space="preserve">  `estado` varchar(1) NOT NULL DEFAULT 'P' COMMENT 'P: Prestado, D:Devuelto'</w:t>
       </w:r>
     </w:p>
     <w:p>
@@ -20795,21 +20352,7 @@
         <w:rPr>
           <w:lang w:val="en-GB"/>
         </w:rPr>
-        <w:t>) ENGINE=</w:t>
-      </w:r>
-      <w:proofErr w:type="spellStart"/>
-      <w:r>
-        <w:rPr>
-          <w:lang w:val="en-GB"/>
-        </w:rPr>
-        <w:t>InnoDB</w:t>
-      </w:r>
-      <w:proofErr w:type="spellEnd"/>
-      <w:r>
-        <w:rPr>
-          <w:lang w:val="en-GB"/>
-        </w:rPr>
-        <w:t xml:space="preserve"> DEFAULT CHARSET=utf8 COLLATE=utf8_spanish2_ci;</w:t>
+        <w:t>) ENGINE=InnoDB DEFAULT CHARSET=utf8 COLLATE=utf8_spanish2_ci;</w:t>
       </w:r>
     </w:p>
     <w:p>
@@ -20848,63 +20391,7 @@
         <w:rPr>
           <w:lang w:val="en-GB"/>
         </w:rPr>
-        <w:t xml:space="preserve">-- </w:t>
-      </w:r>
-      <w:proofErr w:type="spellStart"/>
-      <w:r>
-        <w:rPr>
-          <w:lang w:val="en-GB"/>
-        </w:rPr>
-        <w:t>Estructura</w:t>
-      </w:r>
-      <w:proofErr w:type="spellEnd"/>
-      <w:r>
-        <w:rPr>
-          <w:lang w:val="en-GB"/>
-        </w:rPr>
-        <w:t xml:space="preserve"> de </w:t>
-      </w:r>
-      <w:proofErr w:type="spellStart"/>
-      <w:r>
-        <w:rPr>
-          <w:lang w:val="en-GB"/>
-        </w:rPr>
-        <w:t>tabla</w:t>
-      </w:r>
-      <w:proofErr w:type="spellEnd"/>
-      <w:r>
-        <w:rPr>
-          <w:lang w:val="en-GB"/>
-        </w:rPr>
-        <w:t xml:space="preserve"> para la </w:t>
-      </w:r>
-      <w:proofErr w:type="spellStart"/>
-      <w:r>
-        <w:rPr>
-          <w:lang w:val="en-GB"/>
-        </w:rPr>
-        <w:t>tabla</w:t>
-      </w:r>
-      <w:proofErr w:type="spellEnd"/>
-      <w:r>
-        <w:rPr>
-          <w:lang w:val="en-GB"/>
-        </w:rPr>
-        <w:t xml:space="preserve"> `</w:t>
-      </w:r>
-      <w:proofErr w:type="spellStart"/>
-      <w:r>
-        <w:rPr>
-          <w:lang w:val="en-GB"/>
-        </w:rPr>
-        <w:t>cursos</w:t>
-      </w:r>
-      <w:proofErr w:type="spellEnd"/>
-      <w:r>
-        <w:rPr>
-          <w:lang w:val="en-GB"/>
-        </w:rPr>
-        <w:t>`</w:t>
+        <w:t>-- Estructura de tabla para la tabla `cursos`</w:t>
       </w:r>
     </w:p>
     <w:p>
@@ -20930,21 +20417,7 @@
         <w:rPr>
           <w:lang w:val="en-GB"/>
         </w:rPr>
-        <w:t>CREATE TABLE `</w:t>
-      </w:r>
-      <w:proofErr w:type="spellStart"/>
-      <w:r>
-        <w:rPr>
-          <w:lang w:val="en-GB"/>
-        </w:rPr>
-        <w:t>cursos</w:t>
-      </w:r>
-      <w:proofErr w:type="spellEnd"/>
-      <w:r>
-        <w:rPr>
-          <w:lang w:val="en-GB"/>
-        </w:rPr>
-        <w:t>` (</w:t>
+        <w:t>CREATE TABLE `cursos` (</w:t>
       </w:r>
     </w:p>
     <w:p>
@@ -20957,21 +20430,7 @@
         <w:rPr>
           <w:lang w:val="en-GB"/>
         </w:rPr>
-        <w:t xml:space="preserve">  `</w:t>
-      </w:r>
-      <w:proofErr w:type="spellStart"/>
-      <w:r>
-        <w:rPr>
-          <w:lang w:val="en-GB"/>
-        </w:rPr>
-        <w:t>curso</w:t>
-      </w:r>
-      <w:proofErr w:type="spellEnd"/>
-      <w:r>
-        <w:rPr>
-          <w:lang w:val="en-GB"/>
-        </w:rPr>
-        <w:t>` varchar(20) NOT NULL,</w:t>
+        <w:t xml:space="preserve">  `curso` varchar(20) NOT NULL,</w:t>
       </w:r>
     </w:p>
     <w:p>
@@ -20984,21 +20443,7 @@
         <w:rPr>
           <w:lang w:val="en-GB"/>
         </w:rPr>
-        <w:t xml:space="preserve">  `</w:t>
-      </w:r>
-      <w:proofErr w:type="spellStart"/>
-      <w:r>
-        <w:rPr>
-          <w:lang w:val="en-GB"/>
-        </w:rPr>
-        <w:t>nivel</w:t>
-      </w:r>
-      <w:proofErr w:type="spellEnd"/>
-      <w:r>
-        <w:rPr>
-          <w:lang w:val="en-GB"/>
-        </w:rPr>
-        <w:t>` varchar(20) NOT NULL</w:t>
+        <w:t xml:space="preserve">  `nivel` varchar(20) NOT NULL</w:t>
       </w:r>
     </w:p>
     <w:p>
@@ -21011,21 +20456,7 @@
         <w:rPr>
           <w:lang w:val="en-GB"/>
         </w:rPr>
-        <w:t>) ENGINE=</w:t>
-      </w:r>
-      <w:proofErr w:type="spellStart"/>
-      <w:r>
-        <w:rPr>
-          <w:lang w:val="en-GB"/>
-        </w:rPr>
-        <w:t>InnoDB</w:t>
-      </w:r>
-      <w:proofErr w:type="spellEnd"/>
-      <w:r>
-        <w:rPr>
-          <w:lang w:val="en-GB"/>
-        </w:rPr>
-        <w:t xml:space="preserve"> DEFAULT CHARSET=utf8 COLLATE=utf8_spanish2_ci;</w:t>
+        <w:t>) ENGINE=InnoDB DEFAULT CHARSET=utf8 COLLATE=utf8_spanish2_ci;</w:t>
       </w:r>
     </w:p>
     <w:p>
@@ -21064,63 +20495,7 @@
         <w:rPr>
           <w:lang w:val="en-GB"/>
         </w:rPr>
-        <w:t xml:space="preserve">-- </w:t>
-      </w:r>
-      <w:proofErr w:type="spellStart"/>
-      <w:r>
-        <w:rPr>
-          <w:lang w:val="en-GB"/>
-        </w:rPr>
-        <w:t>Estructura</w:t>
-      </w:r>
-      <w:proofErr w:type="spellEnd"/>
-      <w:r>
-        <w:rPr>
-          <w:lang w:val="en-GB"/>
-        </w:rPr>
-        <w:t xml:space="preserve"> de </w:t>
-      </w:r>
-      <w:proofErr w:type="spellStart"/>
-      <w:r>
-        <w:rPr>
-          <w:lang w:val="en-GB"/>
-        </w:rPr>
-        <w:t>tabla</w:t>
-      </w:r>
-      <w:proofErr w:type="spellEnd"/>
-      <w:r>
-        <w:rPr>
-          <w:lang w:val="en-GB"/>
-        </w:rPr>
-        <w:t xml:space="preserve"> para la </w:t>
-      </w:r>
-      <w:proofErr w:type="spellStart"/>
-      <w:r>
-        <w:rPr>
-          <w:lang w:val="en-GB"/>
-        </w:rPr>
-        <w:t>tabla</w:t>
-      </w:r>
-      <w:proofErr w:type="spellEnd"/>
-      <w:r>
-        <w:rPr>
-          <w:lang w:val="en-GB"/>
-        </w:rPr>
-        <w:t xml:space="preserve"> `</w:t>
-      </w:r>
-      <w:proofErr w:type="spellStart"/>
-      <w:r>
-        <w:rPr>
-          <w:lang w:val="en-GB"/>
-        </w:rPr>
-        <w:t>libros</w:t>
-      </w:r>
-      <w:proofErr w:type="spellEnd"/>
-      <w:r>
-        <w:rPr>
-          <w:lang w:val="en-GB"/>
-        </w:rPr>
-        <w:t>`</w:t>
+        <w:t>-- Estructura de tabla para la tabla `libros`</w:t>
       </w:r>
     </w:p>
     <w:p>
@@ -21146,21 +20521,7 @@
         <w:rPr>
           <w:lang w:val="en-GB"/>
         </w:rPr>
-        <w:t>CREATE TABLE `</w:t>
-      </w:r>
-      <w:proofErr w:type="spellStart"/>
-      <w:r>
-        <w:rPr>
-          <w:lang w:val="en-GB"/>
-        </w:rPr>
-        <w:t>libros</w:t>
-      </w:r>
-      <w:proofErr w:type="spellEnd"/>
-      <w:r>
-        <w:rPr>
-          <w:lang w:val="en-GB"/>
-        </w:rPr>
-        <w:t>` (</w:t>
+        <w:t>CREATE TABLE `libros` (</w:t>
       </w:r>
     </w:p>
     <w:p>
@@ -21173,21 +20534,7 @@
         <w:rPr>
           <w:lang w:val="en-GB"/>
         </w:rPr>
-        <w:t xml:space="preserve">  `</w:t>
-      </w:r>
-      <w:proofErr w:type="spellStart"/>
-      <w:r>
-        <w:rPr>
-          <w:lang w:val="en-GB"/>
-        </w:rPr>
-        <w:t>isbn</w:t>
-      </w:r>
-      <w:proofErr w:type="spellEnd"/>
-      <w:r>
-        <w:rPr>
-          <w:lang w:val="en-GB"/>
-        </w:rPr>
-        <w:t>` varchar(20) NOT NULL,</w:t>
+        <w:t xml:space="preserve">  `isbn` varchar(20) NOT NULL,</w:t>
       </w:r>
     </w:p>
     <w:p>
@@ -21200,21 +20547,7 @@
         <w:rPr>
           <w:lang w:val="en-GB"/>
         </w:rPr>
-        <w:t xml:space="preserve">  `</w:t>
-      </w:r>
-      <w:proofErr w:type="spellStart"/>
-      <w:r>
-        <w:rPr>
-          <w:lang w:val="en-GB"/>
-        </w:rPr>
-        <w:t>titulo</w:t>
-      </w:r>
-      <w:proofErr w:type="spellEnd"/>
-      <w:r>
-        <w:rPr>
-          <w:lang w:val="en-GB"/>
-        </w:rPr>
-        <w:t>` varchar(255) NOT NULL,</w:t>
+        <w:t xml:space="preserve">  `titulo` varchar(255) NOT NULL,</w:t>
       </w:r>
     </w:p>
     <w:p>
@@ -21227,21 +20560,7 @@
         <w:rPr>
           <w:lang w:val="en-GB"/>
         </w:rPr>
-        <w:t xml:space="preserve">  `</w:t>
-      </w:r>
-      <w:proofErr w:type="spellStart"/>
-      <w:r>
-        <w:rPr>
-          <w:lang w:val="en-GB"/>
-        </w:rPr>
-        <w:t>autor</w:t>
-      </w:r>
-      <w:proofErr w:type="spellEnd"/>
-      <w:r>
-        <w:rPr>
-          <w:lang w:val="en-GB"/>
-        </w:rPr>
-        <w:t>` varchar(255) NOT NULL,</w:t>
+        <w:t xml:space="preserve">  `autor` varchar(255) NOT NULL,</w:t>
       </w:r>
     </w:p>
     <w:p>
@@ -21254,21 +20573,7 @@
         <w:rPr>
           <w:lang w:val="en-GB"/>
         </w:rPr>
-        <w:t xml:space="preserve">  `</w:t>
-      </w:r>
-      <w:proofErr w:type="spellStart"/>
-      <w:r>
-        <w:rPr>
-          <w:lang w:val="en-GB"/>
-        </w:rPr>
-        <w:t>numero_ejemplares</w:t>
-      </w:r>
-      <w:proofErr w:type="spellEnd"/>
-      <w:r>
-        <w:rPr>
-          <w:lang w:val="en-GB"/>
-        </w:rPr>
-        <w:t>` int(5) NOT NULL,</w:t>
+        <w:t xml:space="preserve">  `numero_ejemplares` int(5) NOT NULL,</w:t>
       </w:r>
     </w:p>
     <w:p>
@@ -21281,21 +20586,7 @@
         <w:rPr>
           <w:lang w:val="en-GB"/>
         </w:rPr>
-        <w:t xml:space="preserve">  `</w:t>
-      </w:r>
-      <w:proofErr w:type="spellStart"/>
-      <w:r>
-        <w:rPr>
-          <w:lang w:val="en-GB"/>
-        </w:rPr>
-        <w:t>id_materia</w:t>
-      </w:r>
-      <w:proofErr w:type="spellEnd"/>
-      <w:r>
-        <w:rPr>
-          <w:lang w:val="en-GB"/>
-        </w:rPr>
-        <w:t>` int(11) NOT NULL,</w:t>
+        <w:t xml:space="preserve">  `id_materia` int(11) NOT NULL,</w:t>
       </w:r>
     </w:p>
     <w:p>
@@ -21308,21 +20599,7 @@
         <w:rPr>
           <w:lang w:val="en-GB"/>
         </w:rPr>
-        <w:t xml:space="preserve">  `</w:t>
-      </w:r>
-      <w:proofErr w:type="spellStart"/>
-      <w:r>
-        <w:rPr>
-          <w:lang w:val="en-GB"/>
-        </w:rPr>
-        <w:t>id_curso</w:t>
-      </w:r>
-      <w:proofErr w:type="spellEnd"/>
-      <w:r>
-        <w:rPr>
-          <w:lang w:val="en-GB"/>
-        </w:rPr>
-        <w:t>` varchar(20) NOT NULL</w:t>
+        <w:t xml:space="preserve">  `id_curso` varchar(20) NOT NULL</w:t>
       </w:r>
     </w:p>
     <w:p>
@@ -21335,21 +20612,7 @@
         <w:rPr>
           <w:lang w:val="en-GB"/>
         </w:rPr>
-        <w:t>) ENGINE=</w:t>
-      </w:r>
-      <w:proofErr w:type="spellStart"/>
-      <w:r>
-        <w:rPr>
-          <w:lang w:val="en-GB"/>
-        </w:rPr>
-        <w:t>InnoDB</w:t>
-      </w:r>
-      <w:proofErr w:type="spellEnd"/>
-      <w:r>
-        <w:rPr>
-          <w:lang w:val="en-GB"/>
-        </w:rPr>
-        <w:t xml:space="preserve"> DEFAULT CHARSET=utf8 COLLATE=utf8_spanish2_ci;</w:t>
+        <w:t>) ENGINE=InnoDB DEFAULT CHARSET=utf8 COLLATE=utf8_spanish2_ci;</w:t>
       </w:r>
     </w:p>
     <w:p>
@@ -21388,63 +20651,7 @@
         <w:rPr>
           <w:lang w:val="en-GB"/>
         </w:rPr>
-        <w:t xml:space="preserve">-- </w:t>
-      </w:r>
-      <w:proofErr w:type="spellStart"/>
-      <w:r>
-        <w:rPr>
-          <w:lang w:val="en-GB"/>
-        </w:rPr>
-        <w:t>Estructura</w:t>
-      </w:r>
-      <w:proofErr w:type="spellEnd"/>
-      <w:r>
-        <w:rPr>
-          <w:lang w:val="en-GB"/>
-        </w:rPr>
-        <w:t xml:space="preserve"> de </w:t>
-      </w:r>
-      <w:proofErr w:type="spellStart"/>
-      <w:r>
-        <w:rPr>
-          <w:lang w:val="en-GB"/>
-        </w:rPr>
-        <w:t>tabla</w:t>
-      </w:r>
-      <w:proofErr w:type="spellEnd"/>
-      <w:r>
-        <w:rPr>
-          <w:lang w:val="en-GB"/>
-        </w:rPr>
-        <w:t xml:space="preserve"> para la </w:t>
-      </w:r>
-      <w:proofErr w:type="spellStart"/>
-      <w:r>
-        <w:rPr>
-          <w:lang w:val="en-GB"/>
-        </w:rPr>
-        <w:t>tabla</w:t>
-      </w:r>
-      <w:proofErr w:type="spellEnd"/>
-      <w:r>
-        <w:rPr>
-          <w:lang w:val="en-GB"/>
-        </w:rPr>
-        <w:t xml:space="preserve"> `</w:t>
-      </w:r>
-      <w:proofErr w:type="spellStart"/>
-      <w:r>
-        <w:rPr>
-          <w:lang w:val="en-GB"/>
-        </w:rPr>
-        <w:t>materias</w:t>
-      </w:r>
-      <w:proofErr w:type="spellEnd"/>
-      <w:r>
-        <w:rPr>
-          <w:lang w:val="en-GB"/>
-        </w:rPr>
-        <w:t>`</w:t>
+        <w:t>-- Estructura de tabla para la tabla `materias`</w:t>
       </w:r>
     </w:p>
     <w:p>
@@ -21470,21 +20677,7 @@
         <w:rPr>
           <w:lang w:val="en-GB"/>
         </w:rPr>
-        <w:t>CREATE TABLE `</w:t>
-      </w:r>
-      <w:proofErr w:type="spellStart"/>
-      <w:r>
-        <w:rPr>
-          <w:lang w:val="en-GB"/>
-        </w:rPr>
-        <w:t>materias</w:t>
-      </w:r>
-      <w:proofErr w:type="spellEnd"/>
-      <w:r>
-        <w:rPr>
-          <w:lang w:val="en-GB"/>
-        </w:rPr>
-        <w:t>` (</w:t>
+        <w:t>CREATE TABLE `materias` (</w:t>
       </w:r>
     </w:p>
     <w:p>
@@ -21510,21 +20703,7 @@
         <w:rPr>
           <w:lang w:val="en-GB"/>
         </w:rPr>
-        <w:t xml:space="preserve">  `</w:t>
-      </w:r>
-      <w:proofErr w:type="spellStart"/>
-      <w:r>
-        <w:rPr>
-          <w:lang w:val="en-GB"/>
-        </w:rPr>
-        <w:t>nombre</w:t>
-      </w:r>
-      <w:proofErr w:type="spellEnd"/>
-      <w:r>
-        <w:rPr>
-          <w:lang w:val="en-GB"/>
-        </w:rPr>
-        <w:t>` varchar(255) NOT NULL,</w:t>
+        <w:t xml:space="preserve">  `nombre` varchar(255) NOT NULL,</w:t>
       </w:r>
     </w:p>
     <w:p>
@@ -21537,21 +20716,7 @@
         <w:rPr>
           <w:lang w:val="en-GB"/>
         </w:rPr>
-        <w:t xml:space="preserve">  `</w:t>
-      </w:r>
-      <w:proofErr w:type="spellStart"/>
-      <w:r>
-        <w:rPr>
-          <w:lang w:val="en-GB"/>
-        </w:rPr>
-        <w:t>departamento</w:t>
-      </w:r>
-      <w:proofErr w:type="spellEnd"/>
-      <w:r>
-        <w:rPr>
-          <w:lang w:val="en-GB"/>
-        </w:rPr>
-        <w:t>` varchar(255) NOT NULL</w:t>
+        <w:t xml:space="preserve">  `departamento` varchar(255) NOT NULL</w:t>
       </w:r>
     </w:p>
     <w:p>
@@ -21564,21 +20729,7 @@
         <w:rPr>
           <w:lang w:val="en-GB"/>
         </w:rPr>
-        <w:t>) ENGINE=</w:t>
-      </w:r>
-      <w:proofErr w:type="spellStart"/>
-      <w:r>
-        <w:rPr>
-          <w:lang w:val="en-GB"/>
-        </w:rPr>
-        <w:t>InnoDB</w:t>
-      </w:r>
-      <w:proofErr w:type="spellEnd"/>
-      <w:r>
-        <w:rPr>
-          <w:lang w:val="en-GB"/>
-        </w:rPr>
-        <w:t xml:space="preserve"> DEFAULT CHARSET=utf8 COLLATE=utf8_spanish2_ci;</w:t>
+        <w:t>) ENGINE=InnoDB DEFAULT CHARSET=utf8 COLLATE=utf8_spanish2_ci;</w:t>
       </w:r>
     </w:p>
     <w:p>
@@ -21604,44 +20755,8 @@
         <w:rPr>
           <w:lang w:val="en-GB"/>
         </w:rPr>
-        <w:t xml:space="preserve">-- </w:t>
-      </w:r>
-      <w:proofErr w:type="spellStart"/>
-      <w:r>
-        <w:rPr>
-          <w:lang w:val="en-GB"/>
-        </w:rPr>
-        <w:t>Índices</w:t>
-      </w:r>
-      <w:proofErr w:type="spellEnd"/>
-      <w:r>
-        <w:rPr>
-          <w:lang w:val="en-GB"/>
-        </w:rPr>
-        <w:t xml:space="preserve"> para </w:t>
-      </w:r>
-      <w:proofErr w:type="spellStart"/>
-      <w:r>
-        <w:rPr>
-          <w:lang w:val="en-GB"/>
-        </w:rPr>
-        <w:t>tablas</w:t>
-      </w:r>
-      <w:proofErr w:type="spellEnd"/>
-      <w:r>
-        <w:rPr>
-          <w:lang w:val="en-GB"/>
-        </w:rPr>
-        <w:t xml:space="preserve"> </w:t>
-      </w:r>
-      <w:proofErr w:type="spellStart"/>
-      <w:r>
-        <w:rPr>
-          <w:lang w:val="en-GB"/>
-        </w:rPr>
-        <w:t>volcadas</w:t>
-      </w:r>
-      <w:proofErr w:type="spellEnd"/>
+        <w:t>-- Índices para tablas volcadas</w:t>
+      </w:r>
     </w:p>
     <w:p>
       <w:pPr>
@@ -21679,35 +20794,7 @@
         <w:rPr>
           <w:lang w:val="en-GB"/>
         </w:rPr>
-        <w:t xml:space="preserve">-- Indices de la </w:t>
-      </w:r>
-      <w:proofErr w:type="spellStart"/>
-      <w:r>
-        <w:rPr>
-          <w:lang w:val="en-GB"/>
-        </w:rPr>
-        <w:t>tabla</w:t>
-      </w:r>
-      <w:proofErr w:type="spellEnd"/>
-      <w:r>
-        <w:rPr>
-          <w:lang w:val="en-GB"/>
-        </w:rPr>
-        <w:t xml:space="preserve"> `</w:t>
-      </w:r>
-      <w:proofErr w:type="spellStart"/>
-      <w:r>
-        <w:rPr>
-          <w:lang w:val="en-GB"/>
-        </w:rPr>
-        <w:t>alumnos</w:t>
-      </w:r>
-      <w:proofErr w:type="spellEnd"/>
-      <w:r>
-        <w:rPr>
-          <w:lang w:val="en-GB"/>
-        </w:rPr>
-        <w:t>`</w:t>
+        <w:t>-- Indices de la tabla `alumnos`</w:t>
       </w:r>
     </w:p>
     <w:p>
@@ -21733,21 +20820,7 @@
         <w:rPr>
           <w:lang w:val="en-GB"/>
         </w:rPr>
-        <w:t>ALTER TABLE `</w:t>
-      </w:r>
-      <w:proofErr w:type="spellStart"/>
-      <w:r>
-        <w:rPr>
-          <w:lang w:val="en-GB"/>
-        </w:rPr>
-        <w:t>alumnos</w:t>
-      </w:r>
-      <w:proofErr w:type="spellEnd"/>
-      <w:r>
-        <w:rPr>
-          <w:lang w:val="en-GB"/>
-        </w:rPr>
-        <w:t>`</w:t>
+        <w:t>ALTER TABLE `alumnos`</w:t>
       </w:r>
     </w:p>
     <w:p>
@@ -21760,21 +20833,7 @@
         <w:rPr>
           <w:lang w:val="en-GB"/>
         </w:rPr>
-        <w:t xml:space="preserve">  ADD PRIMARY KEY (`</w:t>
-      </w:r>
-      <w:proofErr w:type="spellStart"/>
-      <w:r>
-        <w:rPr>
-          <w:lang w:val="en-GB"/>
-        </w:rPr>
-        <w:t>nie</w:t>
-      </w:r>
-      <w:proofErr w:type="spellEnd"/>
-      <w:r>
-        <w:rPr>
-          <w:lang w:val="en-GB"/>
-        </w:rPr>
-        <w:t>`);</w:t>
+        <w:t xml:space="preserve">  ADD PRIMARY KEY (`nie`);</w:t>
       </w:r>
     </w:p>
     <w:p>
@@ -21800,35 +20859,7 @@
         <w:rPr>
           <w:lang w:val="en-GB"/>
         </w:rPr>
-        <w:t xml:space="preserve">-- Indices de la </w:t>
-      </w:r>
-      <w:proofErr w:type="spellStart"/>
-      <w:r>
-        <w:rPr>
-          <w:lang w:val="en-GB"/>
-        </w:rPr>
-        <w:t>tabla</w:t>
-      </w:r>
-      <w:proofErr w:type="spellEnd"/>
-      <w:r>
-        <w:rPr>
-          <w:lang w:val="en-GB"/>
-        </w:rPr>
-        <w:t xml:space="preserve"> `</w:t>
-      </w:r>
-      <w:proofErr w:type="spellStart"/>
-      <w:r>
-        <w:rPr>
-          <w:lang w:val="en-GB"/>
-        </w:rPr>
-        <w:t>alumnoscrusoslibros</w:t>
-      </w:r>
-      <w:proofErr w:type="spellEnd"/>
-      <w:r>
-        <w:rPr>
-          <w:lang w:val="en-GB"/>
-        </w:rPr>
-        <w:t>`</w:t>
+        <w:t>-- Indices de la tabla `alumnoscrusoslibros`</w:t>
       </w:r>
     </w:p>
     <w:p>
@@ -21855,21 +20886,7 @@
           <w:lang w:val="en-GB"/>
         </w:rPr>
         <w:lastRenderedPageBreak/>
-        <w:t>ALTER TABLE `</w:t>
-      </w:r>
-      <w:proofErr w:type="spellStart"/>
-      <w:r>
-        <w:rPr>
-          <w:lang w:val="en-GB"/>
-        </w:rPr>
-        <w:t>alumnoscrusoslibros</w:t>
-      </w:r>
-      <w:proofErr w:type="spellEnd"/>
-      <w:r>
-        <w:rPr>
-          <w:lang w:val="en-GB"/>
-        </w:rPr>
-        <w:t>`</w:t>
+        <w:t>ALTER TABLE `alumnoscrusoslibros`</w:t>
       </w:r>
     </w:p>
     <w:p>
@@ -21882,49 +20899,7 @@
         <w:rPr>
           <w:lang w:val="en-GB"/>
         </w:rPr>
-        <w:t xml:space="preserve">  ADD PRIMARY KEY (`</w:t>
-      </w:r>
-      <w:proofErr w:type="spellStart"/>
-      <w:r>
-        <w:rPr>
-          <w:lang w:val="en-GB"/>
-        </w:rPr>
-        <w:t>nie</w:t>
-      </w:r>
-      <w:proofErr w:type="spellEnd"/>
-      <w:r>
-        <w:rPr>
-          <w:lang w:val="en-GB"/>
-        </w:rPr>
-        <w:t>`,`</w:t>
-      </w:r>
-      <w:proofErr w:type="spellStart"/>
-      <w:r>
-        <w:rPr>
-          <w:lang w:val="en-GB"/>
-        </w:rPr>
-        <w:t>curso</w:t>
-      </w:r>
-      <w:proofErr w:type="spellEnd"/>
-      <w:r>
-        <w:rPr>
-          <w:lang w:val="en-GB"/>
-        </w:rPr>
-        <w:t>`,`</w:t>
-      </w:r>
-      <w:proofErr w:type="spellStart"/>
-      <w:r>
-        <w:rPr>
-          <w:lang w:val="en-GB"/>
-        </w:rPr>
-        <w:t>isbn</w:t>
-      </w:r>
-      <w:proofErr w:type="spellEnd"/>
-      <w:r>
-        <w:rPr>
-          <w:lang w:val="en-GB"/>
-        </w:rPr>
-        <w:t>`),</w:t>
+        <w:t xml:space="preserve">  ADD PRIMARY KEY (`nie`,`curso`,`isbn`),</w:t>
       </w:r>
     </w:p>
     <w:p>
@@ -21937,35 +20912,7 @@
         <w:rPr>
           <w:lang w:val="en-GB"/>
         </w:rPr>
-        <w:t xml:space="preserve">  ADD KEY `</w:t>
-      </w:r>
-      <w:proofErr w:type="spellStart"/>
-      <w:r>
-        <w:rPr>
-          <w:lang w:val="en-GB"/>
-        </w:rPr>
-        <w:t>isbn</w:t>
-      </w:r>
-      <w:proofErr w:type="spellEnd"/>
-      <w:r>
-        <w:rPr>
-          <w:lang w:val="en-GB"/>
-        </w:rPr>
-        <w:t>` (`</w:t>
-      </w:r>
-      <w:proofErr w:type="spellStart"/>
-      <w:r>
-        <w:rPr>
-          <w:lang w:val="en-GB"/>
-        </w:rPr>
-        <w:t>isbn</w:t>
-      </w:r>
-      <w:proofErr w:type="spellEnd"/>
-      <w:r>
-        <w:rPr>
-          <w:lang w:val="en-GB"/>
-        </w:rPr>
-        <w:t>`),</w:t>
+        <w:t xml:space="preserve">  ADD KEY `isbn` (`isbn`),</w:t>
       </w:r>
     </w:p>
     <w:p>
@@ -21978,35 +20925,7 @@
         <w:rPr>
           <w:lang w:val="en-GB"/>
         </w:rPr>
-        <w:t xml:space="preserve">  ADD KEY `</w:t>
-      </w:r>
-      <w:proofErr w:type="spellStart"/>
-      <w:r>
-        <w:rPr>
-          <w:lang w:val="en-GB"/>
-        </w:rPr>
-        <w:t>curso</w:t>
-      </w:r>
-      <w:proofErr w:type="spellEnd"/>
-      <w:r>
-        <w:rPr>
-          <w:lang w:val="en-GB"/>
-        </w:rPr>
-        <w:t>` (`</w:t>
-      </w:r>
-      <w:proofErr w:type="spellStart"/>
-      <w:r>
-        <w:rPr>
-          <w:lang w:val="en-GB"/>
-        </w:rPr>
-        <w:t>curso</w:t>
-      </w:r>
-      <w:proofErr w:type="spellEnd"/>
-      <w:r>
-        <w:rPr>
-          <w:lang w:val="en-GB"/>
-        </w:rPr>
-        <w:t>`);</w:t>
+        <w:t xml:space="preserve">  ADD KEY `curso` (`curso`);</w:t>
       </w:r>
     </w:p>
     <w:p>
@@ -22032,35 +20951,7 @@
         <w:rPr>
           <w:lang w:val="en-GB"/>
         </w:rPr>
-        <w:t xml:space="preserve">-- Indices de la </w:t>
-      </w:r>
-      <w:proofErr w:type="spellStart"/>
-      <w:r>
-        <w:rPr>
-          <w:lang w:val="en-GB"/>
-        </w:rPr>
-        <w:t>tabla</w:t>
-      </w:r>
-      <w:proofErr w:type="spellEnd"/>
-      <w:r>
-        <w:rPr>
-          <w:lang w:val="en-GB"/>
-        </w:rPr>
-        <w:t xml:space="preserve"> `</w:t>
-      </w:r>
-      <w:proofErr w:type="spellStart"/>
-      <w:r>
-        <w:rPr>
-          <w:lang w:val="en-GB"/>
-        </w:rPr>
-        <w:t>cursos</w:t>
-      </w:r>
-      <w:proofErr w:type="spellEnd"/>
-      <w:r>
-        <w:rPr>
-          <w:lang w:val="en-GB"/>
-        </w:rPr>
-        <w:t>`</w:t>
+        <w:t>-- Indices de la tabla `cursos`</w:t>
       </w:r>
     </w:p>
     <w:p>
@@ -22086,21 +20977,7 @@
         <w:rPr>
           <w:lang w:val="en-GB"/>
         </w:rPr>
-        <w:t>ALTER TABLE `</w:t>
-      </w:r>
-      <w:proofErr w:type="spellStart"/>
-      <w:r>
-        <w:rPr>
-          <w:lang w:val="en-GB"/>
-        </w:rPr>
-        <w:t>cursos</w:t>
-      </w:r>
-      <w:proofErr w:type="spellEnd"/>
-      <w:r>
-        <w:rPr>
-          <w:lang w:val="en-GB"/>
-        </w:rPr>
-        <w:t>`</w:t>
+        <w:t>ALTER TABLE `cursos`</w:t>
       </w:r>
     </w:p>
     <w:p>
@@ -22113,21 +20990,7 @@
         <w:rPr>
           <w:lang w:val="en-GB"/>
         </w:rPr>
-        <w:t xml:space="preserve">  ADD PRIMARY KEY (`</w:t>
-      </w:r>
-      <w:proofErr w:type="spellStart"/>
-      <w:r>
-        <w:rPr>
-          <w:lang w:val="en-GB"/>
-        </w:rPr>
-        <w:t>curso</w:t>
-      </w:r>
-      <w:proofErr w:type="spellEnd"/>
-      <w:r>
-        <w:rPr>
-          <w:lang w:val="en-GB"/>
-        </w:rPr>
-        <w:t>`);</w:t>
+        <w:t xml:space="preserve">  ADD PRIMARY KEY (`curso`);</w:t>
       </w:r>
     </w:p>
     <w:p>
@@ -22153,35 +21016,7 @@
         <w:rPr>
           <w:lang w:val="en-GB"/>
         </w:rPr>
-        <w:t xml:space="preserve">-- Indices de la </w:t>
-      </w:r>
-      <w:proofErr w:type="spellStart"/>
-      <w:r>
-        <w:rPr>
-          <w:lang w:val="en-GB"/>
-        </w:rPr>
-        <w:t>tabla</w:t>
-      </w:r>
-      <w:proofErr w:type="spellEnd"/>
-      <w:r>
-        <w:rPr>
-          <w:lang w:val="en-GB"/>
-        </w:rPr>
-        <w:t xml:space="preserve"> `</w:t>
-      </w:r>
-      <w:proofErr w:type="spellStart"/>
-      <w:r>
-        <w:rPr>
-          <w:lang w:val="en-GB"/>
-        </w:rPr>
-        <w:t>libros</w:t>
-      </w:r>
-      <w:proofErr w:type="spellEnd"/>
-      <w:r>
-        <w:rPr>
-          <w:lang w:val="en-GB"/>
-        </w:rPr>
-        <w:t>`</w:t>
+        <w:t>-- Indices de la tabla `libros`</w:t>
       </w:r>
     </w:p>
     <w:p>
@@ -22207,21 +21042,7 @@
         <w:rPr>
           <w:lang w:val="en-GB"/>
         </w:rPr>
-        <w:t>ALTER TABLE `</w:t>
-      </w:r>
-      <w:proofErr w:type="spellStart"/>
-      <w:r>
-        <w:rPr>
-          <w:lang w:val="en-GB"/>
-        </w:rPr>
-        <w:t>libros</w:t>
-      </w:r>
-      <w:proofErr w:type="spellEnd"/>
-      <w:r>
-        <w:rPr>
-          <w:lang w:val="en-GB"/>
-        </w:rPr>
-        <w:t>`</w:t>
+        <w:t>ALTER TABLE `libros`</w:t>
       </w:r>
     </w:p>
     <w:p>
@@ -22234,21 +21055,7 @@
         <w:rPr>
           <w:lang w:val="en-GB"/>
         </w:rPr>
-        <w:t xml:space="preserve">  ADD PRIMARY KEY (`</w:t>
-      </w:r>
-      <w:proofErr w:type="spellStart"/>
-      <w:r>
-        <w:rPr>
-          <w:lang w:val="en-GB"/>
-        </w:rPr>
-        <w:t>isbn</w:t>
-      </w:r>
-      <w:proofErr w:type="spellEnd"/>
-      <w:r>
-        <w:rPr>
-          <w:lang w:val="en-GB"/>
-        </w:rPr>
-        <w:t>`),</w:t>
+        <w:t xml:space="preserve">  ADD PRIMARY KEY (`isbn`),</w:t>
       </w:r>
     </w:p>
     <w:p>
@@ -22261,35 +21068,7 @@
         <w:rPr>
           <w:lang w:val="en-GB"/>
         </w:rPr>
-        <w:t xml:space="preserve">  ADD KEY `</w:t>
-      </w:r>
-      <w:proofErr w:type="spellStart"/>
-      <w:r>
-        <w:rPr>
-          <w:lang w:val="en-GB"/>
-        </w:rPr>
-        <w:t>FK_Materias</w:t>
-      </w:r>
-      <w:proofErr w:type="spellEnd"/>
-      <w:r>
-        <w:rPr>
-          <w:lang w:val="en-GB"/>
-        </w:rPr>
-        <w:t>` (`</w:t>
-      </w:r>
-      <w:proofErr w:type="spellStart"/>
-      <w:r>
-        <w:rPr>
-          <w:lang w:val="en-GB"/>
-        </w:rPr>
-        <w:t>id_materia</w:t>
-      </w:r>
-      <w:proofErr w:type="spellEnd"/>
-      <w:r>
-        <w:rPr>
-          <w:lang w:val="en-GB"/>
-        </w:rPr>
-        <w:t>`),</w:t>
+        <w:t xml:space="preserve">  ADD KEY `FK_Materias` (`id_materia`),</w:t>
       </w:r>
     </w:p>
     <w:p>
@@ -22302,35 +21081,7 @@
         <w:rPr>
           <w:lang w:val="en-GB"/>
         </w:rPr>
-        <w:t xml:space="preserve">  ADD KEY `</w:t>
-      </w:r>
-      <w:proofErr w:type="spellStart"/>
-      <w:r>
-        <w:rPr>
-          <w:lang w:val="en-GB"/>
-        </w:rPr>
-        <w:t>FK_Cursos</w:t>
-      </w:r>
-      <w:proofErr w:type="spellEnd"/>
-      <w:r>
-        <w:rPr>
-          <w:lang w:val="en-GB"/>
-        </w:rPr>
-        <w:t>` (`</w:t>
-      </w:r>
-      <w:proofErr w:type="spellStart"/>
-      <w:r>
-        <w:rPr>
-          <w:lang w:val="en-GB"/>
-        </w:rPr>
-        <w:t>id_curso</w:t>
-      </w:r>
-      <w:proofErr w:type="spellEnd"/>
-      <w:r>
-        <w:rPr>
-          <w:lang w:val="en-GB"/>
-        </w:rPr>
-        <w:t>`) USING BTREE;</w:t>
+        <w:t xml:space="preserve">  ADD KEY `FK_Cursos` (`id_curso`) USING BTREE;</w:t>
       </w:r>
     </w:p>
     <w:p>
@@ -22356,35 +21107,7 @@
         <w:rPr>
           <w:lang w:val="en-GB"/>
         </w:rPr>
-        <w:t xml:space="preserve">-- Indices de la </w:t>
-      </w:r>
-      <w:proofErr w:type="spellStart"/>
-      <w:r>
-        <w:rPr>
-          <w:lang w:val="en-GB"/>
-        </w:rPr>
-        <w:t>tabla</w:t>
-      </w:r>
-      <w:proofErr w:type="spellEnd"/>
-      <w:r>
-        <w:rPr>
-          <w:lang w:val="en-GB"/>
-        </w:rPr>
-        <w:t xml:space="preserve"> `</w:t>
-      </w:r>
-      <w:proofErr w:type="spellStart"/>
-      <w:r>
-        <w:rPr>
-          <w:lang w:val="en-GB"/>
-        </w:rPr>
-        <w:t>materias</w:t>
-      </w:r>
-      <w:proofErr w:type="spellEnd"/>
-      <w:r>
-        <w:rPr>
-          <w:lang w:val="en-GB"/>
-        </w:rPr>
-        <w:t>`</w:t>
+        <w:t>-- Indices de la tabla `materias`</w:t>
       </w:r>
     </w:p>
     <w:p>
@@ -22410,21 +21133,7 @@
         <w:rPr>
           <w:lang w:val="en-GB"/>
         </w:rPr>
-        <w:t>ALTER TABLE `</w:t>
-      </w:r>
-      <w:proofErr w:type="spellStart"/>
-      <w:r>
-        <w:rPr>
-          <w:lang w:val="en-GB"/>
-        </w:rPr>
-        <w:t>materias</w:t>
-      </w:r>
-      <w:proofErr w:type="spellEnd"/>
-      <w:r>
-        <w:rPr>
-          <w:lang w:val="en-GB"/>
-        </w:rPr>
-        <w:t>`</w:t>
+        <w:t>ALTER TABLE `materias`</w:t>
       </w:r>
     </w:p>
     <w:p>
@@ -22450,30 +21159,8 @@
         <w:rPr>
           <w:lang w:val="en-GB"/>
         </w:rPr>
-        <w:t xml:space="preserve">-- Restricciones para </w:t>
-      </w:r>
-      <w:proofErr w:type="spellStart"/>
-      <w:r>
-        <w:rPr>
-          <w:lang w:val="en-GB"/>
-        </w:rPr>
-        <w:t>tablas</w:t>
-      </w:r>
-      <w:proofErr w:type="spellEnd"/>
-      <w:r>
-        <w:rPr>
-          <w:lang w:val="en-GB"/>
-        </w:rPr>
-        <w:t xml:space="preserve"> </w:t>
-      </w:r>
-      <w:proofErr w:type="spellStart"/>
-      <w:r>
-        <w:rPr>
-          <w:lang w:val="en-GB"/>
-        </w:rPr>
-        <w:t>volcadas</w:t>
-      </w:r>
-      <w:proofErr w:type="spellEnd"/>
+        <w:t>-- Restricciones para tablas volcadas</w:t>
+      </w:r>
     </w:p>
     <w:p>
       <w:pPr>
@@ -22511,49 +21198,7 @@
         <w:rPr>
           <w:lang w:val="en-GB"/>
         </w:rPr>
-        <w:t xml:space="preserve">-- </w:t>
-      </w:r>
-      <w:proofErr w:type="spellStart"/>
-      <w:r>
-        <w:rPr>
-          <w:lang w:val="en-GB"/>
-        </w:rPr>
-        <w:t>Filtros</w:t>
-      </w:r>
-      <w:proofErr w:type="spellEnd"/>
-      <w:r>
-        <w:rPr>
-          <w:lang w:val="en-GB"/>
-        </w:rPr>
-        <w:t xml:space="preserve"> para la </w:t>
-      </w:r>
-      <w:proofErr w:type="spellStart"/>
-      <w:r>
-        <w:rPr>
-          <w:lang w:val="en-GB"/>
-        </w:rPr>
-        <w:t>tabla</w:t>
-      </w:r>
-      <w:proofErr w:type="spellEnd"/>
-      <w:r>
-        <w:rPr>
-          <w:lang w:val="en-GB"/>
-        </w:rPr>
-        <w:t xml:space="preserve"> `</w:t>
-      </w:r>
-      <w:proofErr w:type="spellStart"/>
-      <w:r>
-        <w:rPr>
-          <w:lang w:val="en-GB"/>
-        </w:rPr>
-        <w:t>alumnoscrusoslibros</w:t>
-      </w:r>
-      <w:proofErr w:type="spellEnd"/>
-      <w:r>
-        <w:rPr>
-          <w:lang w:val="en-GB"/>
-        </w:rPr>
-        <w:t>`</w:t>
+        <w:t>-- Filtros para la tabla `alumnoscrusoslibros`</w:t>
       </w:r>
     </w:p>
     <w:p>
@@ -22579,21 +21224,7 @@
         <w:rPr>
           <w:lang w:val="en-GB"/>
         </w:rPr>
-        <w:t>ALTER TABLE `</w:t>
-      </w:r>
-      <w:proofErr w:type="spellStart"/>
-      <w:r>
-        <w:rPr>
-          <w:lang w:val="en-GB"/>
-        </w:rPr>
-        <w:t>alumnoscrusoslibros</w:t>
-      </w:r>
-      <w:proofErr w:type="spellEnd"/>
-      <w:r>
-        <w:rPr>
-          <w:lang w:val="en-GB"/>
-        </w:rPr>
-        <w:t>`</w:t>
+        <w:t>ALTER TABLE `alumnoscrusoslibros`</w:t>
       </w:r>
     </w:p>
     <w:p>
@@ -22606,49 +21237,7 @@
         <w:rPr>
           <w:lang w:val="en-GB"/>
         </w:rPr>
-        <w:t xml:space="preserve">  ADD CONSTRAINT `alumnoscrusoslibros_ibfk_1` FOREIGN KEY (`</w:t>
-      </w:r>
-      <w:proofErr w:type="spellStart"/>
-      <w:r>
-        <w:rPr>
-          <w:lang w:val="en-GB"/>
-        </w:rPr>
-        <w:t>isbn</w:t>
-      </w:r>
-      <w:proofErr w:type="spellEnd"/>
-      <w:r>
-        <w:rPr>
-          <w:lang w:val="en-GB"/>
-        </w:rPr>
-        <w:t>`) REFERENCES `</w:t>
-      </w:r>
-      <w:proofErr w:type="spellStart"/>
-      <w:r>
-        <w:rPr>
-          <w:lang w:val="en-GB"/>
-        </w:rPr>
-        <w:t>libros</w:t>
-      </w:r>
-      <w:proofErr w:type="spellEnd"/>
-      <w:r>
-        <w:rPr>
-          <w:lang w:val="en-GB"/>
-        </w:rPr>
-        <w:t>` (`</w:t>
-      </w:r>
-      <w:proofErr w:type="spellStart"/>
-      <w:r>
-        <w:rPr>
-          <w:lang w:val="en-GB"/>
-        </w:rPr>
-        <w:t>isbn</w:t>
-      </w:r>
-      <w:proofErr w:type="spellEnd"/>
-      <w:r>
-        <w:rPr>
-          <w:lang w:val="en-GB"/>
-        </w:rPr>
-        <w:t>`) ON DELETE CASCADE ON UPDATE CASCADE,</w:t>
+        <w:t xml:space="preserve">  ADD CONSTRAINT `alumnoscrusoslibros_ibfk_1` FOREIGN KEY (`isbn`) REFERENCES `libros` (`isbn`) ON DELETE CASCADE ON UPDATE CASCADE,</w:t>
       </w:r>
     </w:p>
     <w:p>
@@ -22661,49 +21250,7 @@
         <w:rPr>
           <w:lang w:val="en-GB"/>
         </w:rPr>
-        <w:t xml:space="preserve">  ADD CONSTRAINT `alumnoscrusoslibros_ibfk_2` FOREIGN KEY (`</w:t>
-      </w:r>
-      <w:proofErr w:type="spellStart"/>
-      <w:r>
-        <w:rPr>
-          <w:lang w:val="en-GB"/>
-        </w:rPr>
-        <w:t>nie</w:t>
-      </w:r>
-      <w:proofErr w:type="spellEnd"/>
-      <w:r>
-        <w:rPr>
-          <w:lang w:val="en-GB"/>
-        </w:rPr>
-        <w:t>`) REFERENCES `</w:t>
-      </w:r>
-      <w:proofErr w:type="spellStart"/>
-      <w:r>
-        <w:rPr>
-          <w:lang w:val="en-GB"/>
-        </w:rPr>
-        <w:t>alumnos</w:t>
-      </w:r>
-      <w:proofErr w:type="spellEnd"/>
-      <w:r>
-        <w:rPr>
-          <w:lang w:val="en-GB"/>
-        </w:rPr>
-        <w:t>` (`</w:t>
-      </w:r>
-      <w:proofErr w:type="spellStart"/>
-      <w:r>
-        <w:rPr>
-          <w:lang w:val="en-GB"/>
-        </w:rPr>
-        <w:t>nie</w:t>
-      </w:r>
-      <w:proofErr w:type="spellEnd"/>
-      <w:r>
-        <w:rPr>
-          <w:lang w:val="en-GB"/>
-        </w:rPr>
-        <w:t>`) ON DELETE CASCADE ON UPDATE CASCADE,</w:t>
+        <w:t xml:space="preserve">  ADD CONSTRAINT `alumnoscrusoslibros_ibfk_2` FOREIGN KEY (`nie`) REFERENCES `alumnos` (`nie`) ON DELETE CASCADE ON UPDATE CASCADE,</w:t>
       </w:r>
     </w:p>
     <w:p>
@@ -22716,49 +21263,7 @@
         <w:rPr>
           <w:lang w:val="en-GB"/>
         </w:rPr>
-        <w:t xml:space="preserve">  ADD CONSTRAINT `alumnoscrusoslibros_ibfk_3` FOREIGN KEY (`</w:t>
-      </w:r>
-      <w:proofErr w:type="spellStart"/>
-      <w:r>
-        <w:rPr>
-          <w:lang w:val="en-GB"/>
-        </w:rPr>
-        <w:t>curso</w:t>
-      </w:r>
-      <w:proofErr w:type="spellEnd"/>
-      <w:r>
-        <w:rPr>
-          <w:lang w:val="en-GB"/>
-        </w:rPr>
-        <w:t>`) REFERENCES `</w:t>
-      </w:r>
-      <w:proofErr w:type="spellStart"/>
-      <w:r>
-        <w:rPr>
-          <w:lang w:val="en-GB"/>
-        </w:rPr>
-        <w:t>cursos</w:t>
-      </w:r>
-      <w:proofErr w:type="spellEnd"/>
-      <w:r>
-        <w:rPr>
-          <w:lang w:val="en-GB"/>
-        </w:rPr>
-        <w:t>` (`</w:t>
-      </w:r>
-      <w:proofErr w:type="spellStart"/>
-      <w:r>
-        <w:rPr>
-          <w:lang w:val="en-GB"/>
-        </w:rPr>
-        <w:t>curso</w:t>
-      </w:r>
-      <w:proofErr w:type="spellEnd"/>
-      <w:r>
-        <w:rPr>
-          <w:lang w:val="en-GB"/>
-        </w:rPr>
-        <w:t>`) ON DELETE CASCADE ON UPDATE CASCADE;</w:t>
+        <w:t xml:space="preserve">  ADD CONSTRAINT `alumnoscrusoslibros_ibfk_3` FOREIGN KEY (`curso`) REFERENCES `cursos` (`curso`) ON DELETE CASCADE ON UPDATE CASCADE;</w:t>
       </w:r>
     </w:p>
     <w:p>
@@ -22784,49 +21289,7 @@
         <w:rPr>
           <w:lang w:val="en-GB"/>
         </w:rPr>
-        <w:t xml:space="preserve">-- </w:t>
-      </w:r>
-      <w:proofErr w:type="spellStart"/>
-      <w:r>
-        <w:rPr>
-          <w:lang w:val="en-GB"/>
-        </w:rPr>
-        <w:t>Filtros</w:t>
-      </w:r>
-      <w:proofErr w:type="spellEnd"/>
-      <w:r>
-        <w:rPr>
-          <w:lang w:val="en-GB"/>
-        </w:rPr>
-        <w:t xml:space="preserve"> para la </w:t>
-      </w:r>
-      <w:proofErr w:type="spellStart"/>
-      <w:r>
-        <w:rPr>
-          <w:lang w:val="en-GB"/>
-        </w:rPr>
-        <w:t>tabla</w:t>
-      </w:r>
-      <w:proofErr w:type="spellEnd"/>
-      <w:r>
-        <w:rPr>
-          <w:lang w:val="en-GB"/>
-        </w:rPr>
-        <w:t xml:space="preserve"> `</w:t>
-      </w:r>
-      <w:proofErr w:type="spellStart"/>
-      <w:r>
-        <w:rPr>
-          <w:lang w:val="en-GB"/>
-        </w:rPr>
-        <w:t>libros</w:t>
-      </w:r>
-      <w:proofErr w:type="spellEnd"/>
-      <w:r>
-        <w:rPr>
-          <w:lang w:val="en-GB"/>
-        </w:rPr>
-        <w:t>`</w:t>
+        <w:t>-- Filtros para la tabla `libros`</w:t>
       </w:r>
     </w:p>
     <w:p>
@@ -22852,21 +21315,7 @@
         <w:rPr>
           <w:lang w:val="en-GB"/>
         </w:rPr>
-        <w:t>ALTER TABLE `</w:t>
-      </w:r>
-      <w:proofErr w:type="spellStart"/>
-      <w:r>
-        <w:rPr>
-          <w:lang w:val="en-GB"/>
-        </w:rPr>
-        <w:t>libros</w:t>
-      </w:r>
-      <w:proofErr w:type="spellEnd"/>
-      <w:r>
-        <w:rPr>
-          <w:lang w:val="en-GB"/>
-        </w:rPr>
-        <w:t>`</w:t>
+        <w:t>ALTER TABLE `libros`</w:t>
       </w:r>
     </w:p>
     <w:p>
@@ -22879,63 +21328,7 @@
         <w:rPr>
           <w:lang w:val="en-GB"/>
         </w:rPr>
-        <w:t xml:space="preserve">  ADD CONSTRAINT `</w:t>
-      </w:r>
-      <w:proofErr w:type="spellStart"/>
-      <w:r>
-        <w:rPr>
-          <w:lang w:val="en-GB"/>
-        </w:rPr>
-        <w:t>fk_libros_cursos</w:t>
-      </w:r>
-      <w:proofErr w:type="spellEnd"/>
-      <w:r>
-        <w:rPr>
-          <w:lang w:val="en-GB"/>
-        </w:rPr>
-        <w:t>` FOREIGN KEY (`</w:t>
-      </w:r>
-      <w:proofErr w:type="spellStart"/>
-      <w:r>
-        <w:rPr>
-          <w:lang w:val="en-GB"/>
-        </w:rPr>
-        <w:t>id_curso</w:t>
-      </w:r>
-      <w:proofErr w:type="spellEnd"/>
-      <w:r>
-        <w:rPr>
-          <w:lang w:val="en-GB"/>
-        </w:rPr>
-        <w:t>`) REFERENCES `</w:t>
-      </w:r>
-      <w:proofErr w:type="spellStart"/>
-      <w:r>
-        <w:rPr>
-          <w:lang w:val="en-GB"/>
-        </w:rPr>
-        <w:t>cursos</w:t>
-      </w:r>
-      <w:proofErr w:type="spellEnd"/>
-      <w:r>
-        <w:rPr>
-          <w:lang w:val="en-GB"/>
-        </w:rPr>
-        <w:t>` (`</w:t>
-      </w:r>
-      <w:proofErr w:type="spellStart"/>
-      <w:r>
-        <w:rPr>
-          <w:lang w:val="en-GB"/>
-        </w:rPr>
-        <w:t>curso</w:t>
-      </w:r>
-      <w:proofErr w:type="spellEnd"/>
-      <w:r>
-        <w:rPr>
-          <w:lang w:val="en-GB"/>
-        </w:rPr>
-        <w:t>`) ON DELETE CASCADE ON UPDATE CASCADE,</w:t>
+        <w:t xml:space="preserve">  ADD CONSTRAINT `fk_libros_cursos` FOREIGN KEY (`id_curso`) REFERENCES `cursos` (`curso`) ON DELETE CASCADE ON UPDATE CASCADE,</w:t>
       </w:r>
     </w:p>
     <w:p>
@@ -22948,49 +21341,7 @@
         <w:rPr>
           <w:lang w:val="en-GB"/>
         </w:rPr>
-        <w:t xml:space="preserve">  ADD CONSTRAINT `</w:t>
-      </w:r>
-      <w:proofErr w:type="spellStart"/>
-      <w:r>
-        <w:rPr>
-          <w:lang w:val="en-GB"/>
-        </w:rPr>
-        <w:t>fk_libros_materias</w:t>
-      </w:r>
-      <w:proofErr w:type="spellEnd"/>
-      <w:r>
-        <w:rPr>
-          <w:lang w:val="en-GB"/>
-        </w:rPr>
-        <w:t>` FOREIGN KEY (`</w:t>
-      </w:r>
-      <w:proofErr w:type="spellStart"/>
-      <w:r>
-        <w:rPr>
-          <w:lang w:val="en-GB"/>
-        </w:rPr>
-        <w:t>id_materia</w:t>
-      </w:r>
-      <w:proofErr w:type="spellEnd"/>
-      <w:r>
-        <w:rPr>
-          <w:lang w:val="en-GB"/>
-        </w:rPr>
-        <w:t>`) REFERENCES `</w:t>
-      </w:r>
-      <w:proofErr w:type="spellStart"/>
-      <w:r>
-        <w:rPr>
-          <w:lang w:val="en-GB"/>
-        </w:rPr>
-        <w:t>materias</w:t>
-      </w:r>
-      <w:proofErr w:type="spellEnd"/>
-      <w:r>
-        <w:rPr>
-          <w:lang w:val="en-GB"/>
-        </w:rPr>
-        <w:t>` (`id`) ON DELETE CASCADE ON UPDATE CASCADE;</w:t>
+        <w:t xml:space="preserve">  ADD CONSTRAINT `fk_libros_materias` FOREIGN KEY (`id_materia`) REFERENCES `materias` (`id`) ON DELETE CASCADE ON UPDATE CASCADE;</w:t>
       </w:r>
     </w:p>
     <w:p>
@@ -23706,25 +22057,7 @@
                 <w:sz w:val="16"/>
                 <w:szCs w:val="16"/>
               </w:rPr>
-              <w:t xml:space="preserve"> </w:t>
-            </w:r>
-            <w:proofErr w:type="spellStart"/>
-            <w:r>
-              <w:rPr>
-                <w:rFonts w:cstheme="minorHAnsi"/>
-                <w:sz w:val="16"/>
-                <w:szCs w:val="16"/>
-              </w:rPr>
-              <w:t>edge</w:t>
-            </w:r>
-            <w:proofErr w:type="spellEnd"/>
-            <w:r>
-              <w:rPr>
-                <w:rFonts w:cstheme="minorHAnsi"/>
-                <w:sz w:val="16"/>
-                <w:szCs w:val="16"/>
-              </w:rPr>
-              <w:t>?</w:t>
+              <w:t xml:space="preserve"> edge?</w:t>
             </w:r>
           </w:p>
         </w:tc>
@@ -23942,25 +22275,7 @@
                 <w:sz w:val="16"/>
                 <w:szCs w:val="16"/>
               </w:rPr>
-              <w:t xml:space="preserve"> </w:t>
-            </w:r>
-            <w:proofErr w:type="spellStart"/>
-            <w:r>
-              <w:rPr>
-                <w:rFonts w:cstheme="minorHAnsi"/>
-                <w:sz w:val="16"/>
-                <w:szCs w:val="16"/>
-              </w:rPr>
-              <w:t>chrome</w:t>
-            </w:r>
-            <w:proofErr w:type="spellEnd"/>
-            <w:r>
-              <w:rPr>
-                <w:rFonts w:cstheme="minorHAnsi"/>
-                <w:sz w:val="16"/>
-                <w:szCs w:val="16"/>
-              </w:rPr>
-              <w:t>?</w:t>
+              <w:t xml:space="preserve"> chrome?</w:t>
             </w:r>
           </w:p>
         </w:tc>
@@ -25684,25 +23999,7 @@
                 <w:sz w:val="16"/>
                 <w:szCs w:val="16"/>
               </w:rPr>
-              <w:t xml:space="preserve">¿Funciona con </w:t>
-            </w:r>
-            <w:proofErr w:type="spellStart"/>
-            <w:r>
-              <w:rPr>
-                <w:rFonts w:cstheme="minorHAnsi"/>
-                <w:sz w:val="16"/>
-                <w:szCs w:val="16"/>
-              </w:rPr>
-              <w:t>táblets</w:t>
-            </w:r>
-            <w:proofErr w:type="spellEnd"/>
-            <w:r>
-              <w:rPr>
-                <w:rFonts w:cstheme="minorHAnsi"/>
-                <w:sz w:val="16"/>
-                <w:szCs w:val="16"/>
-              </w:rPr>
-              <w:t>?</w:t>
+              <w:t>¿Funciona con táblets?</w:t>
             </w:r>
           </w:p>
         </w:tc>
@@ -28813,15 +27110,7 @@
     <w:p/>
     <w:p>
       <w:r>
-        <w:t xml:space="preserve">También se ha modificado la parte de préstamos en la tabla </w:t>
-      </w:r>
-      <w:proofErr w:type="spellStart"/>
-      <w:r>
-        <w:t>alumnoscursoslibros</w:t>
-      </w:r>
-      <w:proofErr w:type="spellEnd"/>
-      <w:r>
-        <w:t>, añadiendo y controlando mejor los campos de fecha de entrega, fecha de devolución y el estado del préstamo, ya que al principio no estaba del todo bien controlado.</w:t>
+        <w:t>También se ha modificado la parte de préstamos en la tabla alumnoscursoslibros, añadiendo y controlando mejor los campos de fecha de entrega, fecha de devolución y el estado del préstamo, ya que al principio no estaba del todo bien controlado.</w:t>
       </w:r>
     </w:p>
     <w:p/>
@@ -29514,7 +27803,7 @@
                         </pic:cNvPicPr>
                       </pic:nvPicPr>
                       <pic:blipFill>
-                        <a:blip r:embed="rId50" cstate="print">
+                        <a:blip r:embed="rId57" cstate="print">
                           <a:extLst>
                             <a:ext uri="{28A0092B-C50C-407E-A947-70E740481C1C}">
                               <a14:useLocalDpi xmlns:a14="http://schemas.microsoft.com/office/drawing/2010/main" val="0"/>
@@ -29560,16 +27849,8 @@
               <w:b w:val="0"/>
             </w:rPr>
             <w:lastRenderedPageBreak/>
-            <w:t xml:space="preserve">Fichero exportado de </w:t>
+            <w:t>Fichero exportado de Delphos</w:t>
           </w:r>
-          <w:proofErr w:type="spellStart"/>
-          <w:r>
-            <w:rPr>
-              <w:b w:val="0"/>
-            </w:rPr>
-            <w:t>Delphos</w:t>
-          </w:r>
-          <w:proofErr w:type="spellEnd"/>
           <w:r>
             <w:rPr>
               <w:b w:val="0"/>
@@ -29606,7 +27887,7 @@
                         </pic:cNvPicPr>
                       </pic:nvPicPr>
                       <pic:blipFill>
-                        <a:blip r:embed="rId51" cstate="print">
+                        <a:blip r:embed="rId58" cstate="print">
                           <a:extLst>
                             <a:ext uri="{28A0092B-C50C-407E-A947-70E740481C1C}">
                               <a14:useLocalDpi xmlns:a14="http://schemas.microsoft.com/office/drawing/2010/main" val="0"/>
@@ -29657,141 +27938,8 @@
             <w:t xml:space="preserve"> (Apellidos, Nombre)</w:t>
           </w:r>
           <w:r>
-            <w:t xml:space="preserve">, </w:t>
+            <w:t>, NumeroEscolar, NumeroSolicitud, FechaSolicitud, CampoNoNecesario, CursoAcadémico, CampoNoNecesario, CampoNoNecesario, CampoNoNecesario, CampoNoNecesario, CampoNoNecesario, CampoNoNecesario, CampoNoNecesario, CampoNoNecesario, ResultadoLibros, ResultadoComedor, Matriculado, TipoBecaLibros, TipoBecaComedor</w:t>
           </w:r>
-          <w:proofErr w:type="spellStart"/>
-          <w:r>
-            <w:t>NumeroEscolar</w:t>
-          </w:r>
-          <w:proofErr w:type="spellEnd"/>
-          <w:r>
-            <w:t xml:space="preserve">, </w:t>
-          </w:r>
-          <w:proofErr w:type="spellStart"/>
-          <w:r>
-            <w:t>NumeroSolicitud</w:t>
-          </w:r>
-          <w:proofErr w:type="spellEnd"/>
-          <w:r>
-            <w:t xml:space="preserve">, </w:t>
-          </w:r>
-          <w:proofErr w:type="spellStart"/>
-          <w:r>
-            <w:t>FechaSolicitud</w:t>
-          </w:r>
-          <w:proofErr w:type="spellEnd"/>
-          <w:r>
-            <w:t xml:space="preserve">, </w:t>
-          </w:r>
-          <w:proofErr w:type="spellStart"/>
-          <w:r>
-            <w:t>CampoNoNecesario</w:t>
-          </w:r>
-          <w:proofErr w:type="spellEnd"/>
-          <w:r>
-            <w:t xml:space="preserve">, </w:t>
-          </w:r>
-          <w:proofErr w:type="spellStart"/>
-          <w:r>
-            <w:t>CursoAcadémico</w:t>
-          </w:r>
-          <w:proofErr w:type="spellEnd"/>
-          <w:r>
-            <w:t xml:space="preserve">, </w:t>
-          </w:r>
-          <w:proofErr w:type="spellStart"/>
-          <w:r>
-            <w:t>CampoNoNecesario</w:t>
-          </w:r>
-          <w:proofErr w:type="spellEnd"/>
-          <w:r>
-            <w:t xml:space="preserve">, </w:t>
-          </w:r>
-          <w:proofErr w:type="spellStart"/>
-          <w:r>
-            <w:t>CampoNoNecesario</w:t>
-          </w:r>
-          <w:proofErr w:type="spellEnd"/>
-          <w:r>
-            <w:t xml:space="preserve">, </w:t>
-          </w:r>
-          <w:proofErr w:type="spellStart"/>
-          <w:r>
-            <w:t>CampoNoNecesario</w:t>
-          </w:r>
-          <w:proofErr w:type="spellEnd"/>
-          <w:r>
-            <w:t xml:space="preserve">, </w:t>
-          </w:r>
-          <w:proofErr w:type="spellStart"/>
-          <w:r>
-            <w:t>CampoNoNecesario</w:t>
-          </w:r>
-          <w:proofErr w:type="spellEnd"/>
-          <w:r>
-            <w:t xml:space="preserve">, </w:t>
-          </w:r>
-          <w:proofErr w:type="spellStart"/>
-          <w:r>
-            <w:t>CampoNoNecesario</w:t>
-          </w:r>
-          <w:proofErr w:type="spellEnd"/>
-          <w:r>
-            <w:t xml:space="preserve">, </w:t>
-          </w:r>
-          <w:proofErr w:type="spellStart"/>
-          <w:r>
-            <w:t>CampoNoNecesario</w:t>
-          </w:r>
-          <w:proofErr w:type="spellEnd"/>
-          <w:r>
-            <w:t xml:space="preserve">, </w:t>
-          </w:r>
-          <w:proofErr w:type="spellStart"/>
-          <w:r>
-            <w:t>CampoNoNecesario</w:t>
-          </w:r>
-          <w:proofErr w:type="spellEnd"/>
-          <w:r>
-            <w:t xml:space="preserve">, </w:t>
-          </w:r>
-          <w:proofErr w:type="spellStart"/>
-          <w:r>
-            <w:t>CampoNoNecesario</w:t>
-          </w:r>
-          <w:proofErr w:type="spellEnd"/>
-          <w:r>
-            <w:t xml:space="preserve">, </w:t>
-          </w:r>
-          <w:proofErr w:type="spellStart"/>
-          <w:r>
-            <w:t>ResultadoLibros</w:t>
-          </w:r>
-          <w:proofErr w:type="spellEnd"/>
-          <w:r>
-            <w:t xml:space="preserve">, </w:t>
-          </w:r>
-          <w:proofErr w:type="spellStart"/>
-          <w:r>
-            <w:t>ResultadoComedor</w:t>
-          </w:r>
-          <w:proofErr w:type="spellEnd"/>
-          <w:r>
-            <w:t xml:space="preserve">, Matriculado, </w:t>
-          </w:r>
-          <w:proofErr w:type="spellStart"/>
-          <w:r>
-            <w:t>TipoBecaLibros</w:t>
-          </w:r>
-          <w:proofErr w:type="spellEnd"/>
-          <w:r>
-            <w:t xml:space="preserve">, </w:t>
-          </w:r>
-          <w:proofErr w:type="spellStart"/>
-          <w:r>
-            <w:t>TipoBecaComedor</w:t>
-          </w:r>
-          <w:proofErr w:type="spellEnd"/>
         </w:p>
         <w:p/>
         <w:p/>
@@ -37447,8 +35595,8 @@
     <w:p/>
     <w:p/>
     <w:sectPr>
-      <w:headerReference w:type="default" r:id="rId52"/>
-      <w:footerReference w:type="default" r:id="rId53"/>
+      <w:headerReference w:type="default" r:id="rId59"/>
+      <w:footerReference w:type="default" r:id="rId60"/>
       <w:pgSz w:w="11906" w:h="16838" w:code="9"/>
       <w:pgMar w:top="1291" w:right="936" w:bottom="720" w:left="936" w:header="0" w:footer="289" w:gutter="0"/>
       <w:pgNumType w:start="1"/>
@@ -41390,7 +39538,6 @@
     <w:rsid w:val="000C2B5E"/>
     <w:rsid w:val="0010763A"/>
     <w:rsid w:val="00112C1E"/>
-    <w:rsid w:val="00132793"/>
     <w:rsid w:val="001370FA"/>
     <w:rsid w:val="0019656C"/>
     <w:rsid w:val="00216802"/>
@@ -41469,6 +39616,7 @@
     <w:rsid w:val="00BF4800"/>
     <w:rsid w:val="00C04752"/>
     <w:rsid w:val="00C278E8"/>
+    <w:rsid w:val="00C47D9B"/>
     <w:rsid w:val="00C627AA"/>
     <w:rsid w:val="00C85D97"/>
     <w:rsid w:val="00C9431D"/>

</xml_diff>

<commit_message>
Duodecimo guardado (23/05/2026, 00:21)
</commit_message>
<xml_diff>
--- a/UT_7_2024_2025 (2).docx
+++ b/UT_7_2024_2025 (2).docx
@@ -18556,15 +18556,11 @@
     </w:p>
     <w:p>
       <w:r>
-        <w:rPr>
-          <w:noProof/>
-          <w:color w:val="FF0000"/>
-        </w:rPr>
         <w:drawing>
-          <wp:inline distT="0" distB="0" distL="0" distR="0" wp14:anchorId="14057C45" wp14:editId="05974DEE">
-            <wp:extent cx="6371590" cy="1303655"/>
-            <wp:effectExtent l="0" t="0" r="0" b="0"/>
-            <wp:docPr id="801986488" name="Imagen 1"/>
+          <wp:inline distT="0" distB="0" distL="0" distR="0" wp14:anchorId="4EFD5237" wp14:editId="161187A8">
+            <wp:extent cx="6050280" cy="1966914"/>
+            <wp:effectExtent l="0" t="0" r="7620" b="0"/>
+            <wp:docPr id="1371084769" name="Imagen 1"/>
             <wp:cNvGraphicFramePr>
               <a:graphicFrameLocks xmlns:a="http://schemas.openxmlformats.org/drawingml/2006/main" noChangeAspect="1"/>
             </wp:cNvGraphicFramePr>
@@ -18572,7 +18568,7 @@
               <a:graphicData uri="http://schemas.openxmlformats.org/drawingml/2006/picture">
                 <pic:pic xmlns:pic="http://schemas.openxmlformats.org/drawingml/2006/picture">
                   <pic:nvPicPr>
-                    <pic:cNvPr id="801986488" name=""/>
+                    <pic:cNvPr id="1371084769" name=""/>
                     <pic:cNvPicPr/>
                   </pic:nvPicPr>
                   <pic:blipFill>
@@ -18584,7 +18580,7 @@
                   <pic:spPr>
                     <a:xfrm>
                       <a:off x="0" y="0"/>
-                      <a:ext cx="6371590" cy="1303655"/>
+                      <a:ext cx="6090447" cy="1979972"/>
                     </a:xfrm>
                     <a:prstGeom prst="rect">
                       <a:avLst/>
@@ -18597,15 +18593,6 @@
         </w:drawing>
       </w:r>
     </w:p>
-    <w:p/>
-    <w:p/>
-    <w:p/>
-    <w:p>
-      <w:r>
-        <w:lastRenderedPageBreak/>
-        <w:t>Registro del alumno</w:t>
-      </w:r>
-    </w:p>
     <w:p>
       <w:pPr>
         <w:pStyle w:val="Ttulo3"/>
@@ -18613,147 +18600,6 @@
       <w:bookmarkStart w:id="138" w:name="_Toc49341841"/>
       <w:bookmarkStart w:id="139" w:name="_Toc170148365"/>
       <w:bookmarkStart w:id="140" w:name="_Toc170148680"/>
-      <w:r>
-        <w:rPr>
-          <w:noProof/>
-        </w:rPr>
-        <w:drawing>
-          <wp:inline distT="0" distB="0" distL="0" distR="0" wp14:anchorId="756A0549" wp14:editId="2BE9CD57">
-            <wp:extent cx="2621280" cy="2935458"/>
-            <wp:effectExtent l="0" t="0" r="7620" b="0"/>
-            <wp:docPr id="1473449446" name="Imagen 1"/>
-            <wp:cNvGraphicFramePr>
-              <a:graphicFrameLocks xmlns:a="http://schemas.openxmlformats.org/drawingml/2006/main" noChangeAspect="1"/>
-            </wp:cNvGraphicFramePr>
-            <a:graphic xmlns:a="http://schemas.openxmlformats.org/drawingml/2006/main">
-              <a:graphicData uri="http://schemas.openxmlformats.org/drawingml/2006/picture">
-                <pic:pic xmlns:pic="http://schemas.openxmlformats.org/drawingml/2006/picture">
-                  <pic:nvPicPr>
-                    <pic:cNvPr id="1473449446" name=""/>
-                    <pic:cNvPicPr/>
-                  </pic:nvPicPr>
-                  <pic:blipFill>
-                    <a:blip r:embed="rId40"/>
-                    <a:stretch>
-                      <a:fillRect/>
-                    </a:stretch>
-                  </pic:blipFill>
-                  <pic:spPr>
-                    <a:xfrm>
-                      <a:off x="0" y="0"/>
-                      <a:ext cx="2628492" cy="2943534"/>
-                    </a:xfrm>
-                    <a:prstGeom prst="rect">
-                      <a:avLst/>
-                    </a:prstGeom>
-                  </pic:spPr>
-                </pic:pic>
-              </a:graphicData>
-            </a:graphic>
-          </wp:inline>
-        </w:drawing>
-      </w:r>
-    </w:p>
-    <w:p>
-      <w:r>
-        <w:t>Login</w:t>
-      </w:r>
-    </w:p>
-    <w:p>
-      <w:r>
-        <w:rPr>
-          <w:noProof/>
-        </w:rPr>
-        <w:drawing>
-          <wp:inline distT="0" distB="0" distL="0" distR="0" wp14:anchorId="3F3AA855" wp14:editId="7A7D9A65">
-            <wp:extent cx="6811560" cy="1897380"/>
-            <wp:effectExtent l="0" t="0" r="8890" b="7620"/>
-            <wp:docPr id="1508791349" name="Imagen 1"/>
-            <wp:cNvGraphicFramePr>
-              <a:graphicFrameLocks xmlns:a="http://schemas.openxmlformats.org/drawingml/2006/main" noChangeAspect="1"/>
-            </wp:cNvGraphicFramePr>
-            <a:graphic xmlns:a="http://schemas.openxmlformats.org/drawingml/2006/main">
-              <a:graphicData uri="http://schemas.openxmlformats.org/drawingml/2006/picture">
-                <pic:pic xmlns:pic="http://schemas.openxmlformats.org/drawingml/2006/picture">
-                  <pic:nvPicPr>
-                    <pic:cNvPr id="1508791349" name=""/>
-                    <pic:cNvPicPr/>
-                  </pic:nvPicPr>
-                  <pic:blipFill>
-                    <a:blip r:embed="rId41"/>
-                    <a:stretch>
-                      <a:fillRect/>
-                    </a:stretch>
-                  </pic:blipFill>
-                  <pic:spPr>
-                    <a:xfrm>
-                      <a:off x="0" y="0"/>
-                      <a:ext cx="6823057" cy="1900583"/>
-                    </a:xfrm>
-                    <a:prstGeom prst="rect">
-                      <a:avLst/>
-                    </a:prstGeom>
-                  </pic:spPr>
-                </pic:pic>
-              </a:graphicData>
-            </a:graphic>
-          </wp:inline>
-        </w:drawing>
-      </w:r>
-    </w:p>
-    <w:p>
-      <w:r>
-        <w:rPr>
-          <w:noProof/>
-        </w:rPr>
-        <w:drawing>
-          <wp:inline distT="0" distB="0" distL="0" distR="0" wp14:anchorId="3D3DFD2C" wp14:editId="3BB3F233">
-            <wp:extent cx="6815435" cy="2057400"/>
-            <wp:effectExtent l="0" t="0" r="5080" b="0"/>
-            <wp:docPr id="1171415245" name="Imagen 1"/>
-            <wp:cNvGraphicFramePr>
-              <a:graphicFrameLocks xmlns:a="http://schemas.openxmlformats.org/drawingml/2006/main" noChangeAspect="1"/>
-            </wp:cNvGraphicFramePr>
-            <a:graphic xmlns:a="http://schemas.openxmlformats.org/drawingml/2006/main">
-              <a:graphicData uri="http://schemas.openxmlformats.org/drawingml/2006/picture">
-                <pic:pic xmlns:pic="http://schemas.openxmlformats.org/drawingml/2006/picture">
-                  <pic:nvPicPr>
-                    <pic:cNvPr id="1171415245" name=""/>
-                    <pic:cNvPicPr/>
-                  </pic:nvPicPr>
-                  <pic:blipFill>
-                    <a:blip r:embed="rId42"/>
-                    <a:stretch>
-                      <a:fillRect/>
-                    </a:stretch>
-                  </pic:blipFill>
-                  <pic:spPr>
-                    <a:xfrm>
-                      <a:off x="0" y="0"/>
-                      <a:ext cx="6822955" cy="2059670"/>
-                    </a:xfrm>
-                    <a:prstGeom prst="rect">
-                      <a:avLst/>
-                    </a:prstGeom>
-                  </pic:spPr>
-                </pic:pic>
-              </a:graphicData>
-            </a:graphic>
-          </wp:inline>
-        </w:drawing>
-      </w:r>
-    </w:p>
-    <w:p/>
-    <w:p/>
-    <w:p/>
-    <w:p/>
-    <w:p/>
-    <w:p/>
-    <w:p/>
-    <w:p>
-      <w:pPr>
-        <w:pStyle w:val="Ttulo3"/>
-      </w:pPr>
       <w:r>
         <w:lastRenderedPageBreak/>
         <w:t>Diseño de las ventanas</w:t>
@@ -18795,7 +18641,7 @@
                     <pic:cNvPicPr/>
                   </pic:nvPicPr>
                   <pic:blipFill>
-                    <a:blip r:embed="rId43"/>
+                    <a:blip r:embed="rId40"/>
                     <a:stretch>
                       <a:fillRect/>
                     </a:stretch>
@@ -18920,7 +18766,7 @@
                     <pic:cNvPicPr/>
                   </pic:nvPicPr>
                   <pic:blipFill>
-                    <a:blip r:embed="rId44"/>
+                    <a:blip r:embed="rId41"/>
                     <a:stretch>
                       <a:fillRect/>
                     </a:stretch>
@@ -28406,12 +28252,6 @@
     <w:p/>
     <w:p>
       <w:r>
-        <w:t>Además, se han hecho pequeños cambios en la interfaz para que sea más fácil moverse entre las ventanas de alumnos, libros y préstamos.</w:t>
-      </w:r>
-    </w:p>
-    <w:p/>
-    <w:p>
-      <w:r>
         <w:t>Por último, se han solucionado algunos problemas en la devolución de libros, para que el estado del préstamo se actualice correctamente cuando se devuelve un libro.</w:t>
       </w:r>
     </w:p>
@@ -28435,19 +28275,113 @@
     </w:p>
     <w:p>
       <w:pPr>
-        <w:rPr>
-          <w:color w:val="FF0000"/>
-        </w:rPr>
-      </w:pPr>
-      <w:r>
-        <w:rPr>
-          <w:color w:val="FF0000"/>
-        </w:rPr>
-        <w:t>Rellenar</w:t>
+        <w:jc w:val="left"/>
+      </w:pPr>
+      <w:r>
+        <w:rPr>
+          <w:b/>
+          <w:bCs/>
+        </w:rPr>
+        <w:t>Diseño de la gestión de alumnos.</w:t>
+      </w:r>
+      <w:r>
+        <w:br/>
+        <w:t>Durante el desarrollo se implementó un módulo de gestión de alumnos con operaciones básicas de consulta y alta. Se decidió utilizar un menú sencillo en consola que permite ver todos los alumnos registrados en la base de datos y añadir nuevos registros.</w:t>
       </w:r>
     </w:p>
-    <w:p/>
-    <w:p/>
+    <w:p>
+      <w:pPr>
+        <w:jc w:val="left"/>
+      </w:pPr>
+      <w:r>
+        <w:rPr>
+          <w:b/>
+          <w:bCs/>
+        </w:rPr>
+        <w:t>Diseño de la gestión de préstamos.</w:t>
+      </w:r>
+      <w:r>
+        <w:br/>
+        <w:t xml:space="preserve">La gestión de préstamos se diseñó para controlar la asignación y devolución de libros a alumnos. El proceso se divide en tres funcionalidades principales: visualización de préstamos, asignación de libros y devolución mediante cambio de estado. Se utiliza un campo de estado (P para prestado y D para devuelto), lo que permite un seguimiento claro del ciclo del préstamo en la tabla </w:t>
+      </w:r>
+      <w:proofErr w:type="spellStart"/>
+      <w:r>
+        <w:t>alumnoscursoslibros</w:t>
+      </w:r>
+      <w:proofErr w:type="spellEnd"/>
+      <w:r>
+        <w:t>.</w:t>
+      </w:r>
+    </w:p>
+    <w:p>
+      <w:pPr>
+        <w:jc w:val="left"/>
+      </w:pPr>
+      <w:r>
+        <w:rPr>
+          <w:b/>
+          <w:bCs/>
+        </w:rPr>
+        <w:t>Diseño de la gestión de libros.</w:t>
+      </w:r>
+      <w:r>
+        <w:br/>
+        <w:t>El módulo de libros permite consultar el catálogo, dar de alta nuevos libros, modificar el stock y realizar búsquedas por ISBN, título o autor. Se implementa una validación para evitar la duplicación de ISBN y otra para impedir valores negativos en el stock, garantizando la integridad de los datos almacenados en la tabla libros.</w:t>
+      </w:r>
+    </w:p>
+    <w:p>
+      <w:pPr>
+        <w:jc w:val="left"/>
+      </w:pPr>
+      <w:r>
+        <w:rPr>
+          <w:b/>
+          <w:bCs/>
+        </w:rPr>
+        <w:t>Sistema de autenticación.</w:t>
+      </w:r>
+      <w:r>
+        <w:br/>
+        <w:t>Se añadió un sistema de inicio de sesión básico para controlar el acceso a la aplicación. El usuario debe introducir credenciales (usuario y contraseña), permitiéndose un máximo de tres intentos. En caso de fallo, el sistema bloquea el acceso, evitando el uso no autorizado del programa.</w:t>
+      </w:r>
+    </w:p>
+    <w:p>
+      <w:pPr>
+        <w:jc w:val="left"/>
+      </w:pPr>
+      <w:r>
+        <w:rPr>
+          <w:b/>
+          <w:bCs/>
+        </w:rPr>
+        <w:t>Diseño de la base de datos.</w:t>
+      </w:r>
+      <w:r>
+        <w:br/>
+        <w:t xml:space="preserve">Se utilizó una base de datos relacional en MySQL gestionada mediante la clase de conexión </w:t>
+      </w:r>
+      <w:proofErr w:type="spellStart"/>
+      <w:r>
+        <w:t>Conexion</w:t>
+      </w:r>
+      <w:proofErr w:type="spellEnd"/>
+      <w:r>
+        <w:t xml:space="preserve">. Las tablas principales utilizadas son alumnos, libros y </w:t>
+      </w:r>
+      <w:proofErr w:type="spellStart"/>
+      <w:r>
+        <w:t>alumnoscursoslibros</w:t>
+      </w:r>
+      <w:proofErr w:type="spellEnd"/>
+      <w:r>
+        <w:t>, que permiten relacionar alumnos, libros y préstamos de forma estructurada.</w:t>
+      </w:r>
+    </w:p>
+    <w:p>
+      <w:pPr>
+        <w:jc w:val="left"/>
+      </w:pPr>
+    </w:p>
     <w:p>
       <w:pPr>
         <w:jc w:val="center"/>
@@ -28497,6 +28431,7 @@
           <w:sz w:val="144"/>
           <w:szCs w:val="144"/>
         </w:rPr>
+        <w:lastRenderedPageBreak/>
         <w:br w:type="page"/>
       </w:r>
     </w:p>
@@ -28555,34 +28490,480 @@
     </w:p>
     <w:p>
       <w:pPr>
-        <w:rPr>
-          <w:color w:val="FF0000"/>
-        </w:rPr>
-      </w:pPr>
-      <w:r>
-        <w:rPr>
-          <w:color w:val="FF0000"/>
-        </w:rPr>
-        <w:t>Rellenar: Esto es un ejemplo NO USAR, hacer el nuestro propio en función de mi proyecto</w:t>
+        <w:jc w:val="left"/>
+      </w:pPr>
+      <w:r>
+        <w:t>Para realizar la implantación de la aplicación se intentará que afecte lo menos posible al funcionamiento del centro.</w:t>
+      </w:r>
+      <w:r>
+        <w:t xml:space="preserve"> </w:t>
+      </w:r>
+      <w:r>
+        <w:t>La instalación del sistema se realizará fuera del horario escolar para evitar problemas durante las clases.</w:t>
+      </w:r>
+      <w:r>
+        <w:t xml:space="preserve"> </w:t>
+      </w:r>
+      <w:r>
+        <w:t>Primero se instalará el programa y la base de datos en el servidor.</w:t>
+      </w:r>
+      <w:r>
+        <w:t xml:space="preserve"> </w:t>
+      </w:r>
+      <w:r>
+        <w:t>Después se configurará el sistema y se comprobará que todo funciona correctamente.</w:t>
+      </w:r>
+      <w:r>
+        <w:t xml:space="preserve"> </w:t>
+      </w:r>
+      <w:r>
+        <w:t>Una vez terminada la instalación se realizarán pruebas para verificar que los usuarios pueden acceder correctamente y utilizar las diferentes funciones de la aplicación, como la gestión de alumnos, préstamos y libros.</w:t>
+      </w:r>
+      <w:r>
+        <w:t xml:space="preserve"> </w:t>
+      </w:r>
+      <w:r>
+        <w:t>Por último, se dará una pequeña formación al administrador para explicar el funcionamiento básico del sistema.</w:t>
       </w:r>
     </w:p>
-    <w:p/>
     <w:p>
-      <w:r>
-        <w:tab/>
-        <w:t>En cuanto a la implantación del software, tendremos en cuenta que se minimizarán las molestias que se puedan realizar al personal existente, por lo que la migración se realizará de noche, estando disponible al día siguiente en el que se realizarán pruebas con el personal y una vez la formación del mismo haya sido terminada. A continuación, el plan de instalació</w:t>
-      </w:r>
-      <w:r>
-        <w:t>n</w:t>
-      </w:r>
-      <w:r>
-        <w:t xml:space="preserve"> para</w:t>
-      </w:r>
-      <w:r>
-        <w:t xml:space="preserve"> el sistema.</w:t>
-      </w:r>
+      <w:pPr>
+        <w:jc w:val="left"/>
+      </w:pPr>
     </w:p>
-    <w:p/>
+    <w:tbl>
+      <w:tblPr>
+        <w:tblW w:w="0" w:type="auto"/>
+        <w:tblCellSpacing w:w="15" w:type="dxa"/>
+        <w:tblCellMar>
+          <w:top w:w="15" w:type="dxa"/>
+          <w:left w:w="15" w:type="dxa"/>
+          <w:bottom w:w="15" w:type="dxa"/>
+          <w:right w:w="15" w:type="dxa"/>
+        </w:tblCellMar>
+        <w:tblLook w:val="04A0" w:firstRow="1" w:lastRow="0" w:firstColumn="1" w:lastColumn="0" w:noHBand="0" w:noVBand="1"/>
+      </w:tblPr>
+      <w:tblGrid>
+        <w:gridCol w:w="1952"/>
+        <w:gridCol w:w="5007"/>
+        <w:gridCol w:w="827"/>
+      </w:tblGrid>
+      <w:tr>
+        <w:trPr>
+          <w:tblHeader/>
+          <w:tblCellSpacing w:w="15" w:type="dxa"/>
+        </w:trPr>
+        <w:tc>
+          <w:tcPr>
+            <w:tcW w:w="0" w:type="auto"/>
+            <w:vAlign w:val="center"/>
+            <w:hideMark/>
+          </w:tcPr>
+          <w:p>
+            <w:pPr>
+              <w:tabs>
+                <w:tab w:val="left" w:pos="284"/>
+                <w:tab w:val="left" w:pos="2268"/>
+                <w:tab w:val="left" w:pos="4820"/>
+                <w:tab w:val="left" w:pos="7230"/>
+              </w:tabs>
+              <w:rPr>
+                <w:b/>
+                <w:bCs/>
+              </w:rPr>
+            </w:pPr>
+            <w:r>
+              <w:rPr>
+                <w:b/>
+                <w:bCs/>
+              </w:rPr>
+              <w:t>Fase</w:t>
+            </w:r>
+          </w:p>
+        </w:tc>
+        <w:tc>
+          <w:tcPr>
+            <w:tcW w:w="0" w:type="auto"/>
+            <w:vAlign w:val="center"/>
+            <w:hideMark/>
+          </w:tcPr>
+          <w:p>
+            <w:pPr>
+              <w:tabs>
+                <w:tab w:val="left" w:pos="284"/>
+                <w:tab w:val="left" w:pos="2268"/>
+                <w:tab w:val="left" w:pos="4820"/>
+                <w:tab w:val="left" w:pos="7230"/>
+              </w:tabs>
+              <w:rPr>
+                <w:b/>
+                <w:bCs/>
+              </w:rPr>
+            </w:pPr>
+            <w:r>
+              <w:rPr>
+                <w:b/>
+                <w:bCs/>
+              </w:rPr>
+              <w:t>Descripción</w:t>
+            </w:r>
+          </w:p>
+        </w:tc>
+        <w:tc>
+          <w:tcPr>
+            <w:tcW w:w="0" w:type="auto"/>
+            <w:vAlign w:val="center"/>
+            <w:hideMark/>
+          </w:tcPr>
+          <w:p>
+            <w:pPr>
+              <w:tabs>
+                <w:tab w:val="left" w:pos="284"/>
+                <w:tab w:val="left" w:pos="2268"/>
+                <w:tab w:val="left" w:pos="4820"/>
+                <w:tab w:val="left" w:pos="7230"/>
+              </w:tabs>
+              <w:rPr>
+                <w:b/>
+                <w:bCs/>
+              </w:rPr>
+            </w:pPr>
+            <w:r>
+              <w:rPr>
+                <w:b/>
+                <w:bCs/>
+              </w:rPr>
+              <w:t>Tiempo</w:t>
+            </w:r>
+          </w:p>
+        </w:tc>
+      </w:tr>
+      <w:tr>
+        <w:trPr>
+          <w:tblCellSpacing w:w="15" w:type="dxa"/>
+        </w:trPr>
+        <w:tc>
+          <w:tcPr>
+            <w:tcW w:w="0" w:type="auto"/>
+            <w:vAlign w:val="center"/>
+            <w:hideMark/>
+          </w:tcPr>
+          <w:p>
+            <w:pPr>
+              <w:tabs>
+                <w:tab w:val="left" w:pos="284"/>
+                <w:tab w:val="left" w:pos="2268"/>
+                <w:tab w:val="left" w:pos="4820"/>
+                <w:tab w:val="left" w:pos="7230"/>
+              </w:tabs>
+            </w:pPr>
+            <w:r>
+              <w:t>Instalación</w:t>
+            </w:r>
+          </w:p>
+        </w:tc>
+        <w:tc>
+          <w:tcPr>
+            <w:tcW w:w="0" w:type="auto"/>
+            <w:vAlign w:val="center"/>
+            <w:hideMark/>
+          </w:tcPr>
+          <w:p>
+            <w:pPr>
+              <w:tabs>
+                <w:tab w:val="left" w:pos="284"/>
+                <w:tab w:val="left" w:pos="2268"/>
+                <w:tab w:val="left" w:pos="4820"/>
+                <w:tab w:val="left" w:pos="7230"/>
+              </w:tabs>
+            </w:pPr>
+            <w:r>
+              <w:t>Instalación de la aplicación y la base de datos</w:t>
+            </w:r>
+          </w:p>
+        </w:tc>
+        <w:tc>
+          <w:tcPr>
+            <w:tcW w:w="0" w:type="auto"/>
+            <w:vAlign w:val="center"/>
+            <w:hideMark/>
+          </w:tcPr>
+          <w:p>
+            <w:pPr>
+              <w:tabs>
+                <w:tab w:val="left" w:pos="284"/>
+                <w:tab w:val="left" w:pos="2268"/>
+                <w:tab w:val="left" w:pos="4820"/>
+                <w:tab w:val="left" w:pos="7230"/>
+              </w:tabs>
+            </w:pPr>
+            <w:r>
+              <w:t>1 día</w:t>
+            </w:r>
+          </w:p>
+        </w:tc>
+      </w:tr>
+      <w:tr>
+        <w:trPr>
+          <w:tblCellSpacing w:w="15" w:type="dxa"/>
+        </w:trPr>
+        <w:tc>
+          <w:tcPr>
+            <w:tcW w:w="0" w:type="auto"/>
+            <w:vAlign w:val="center"/>
+            <w:hideMark/>
+          </w:tcPr>
+          <w:p>
+            <w:pPr>
+              <w:tabs>
+                <w:tab w:val="left" w:pos="284"/>
+                <w:tab w:val="left" w:pos="2268"/>
+                <w:tab w:val="left" w:pos="4820"/>
+                <w:tab w:val="left" w:pos="7230"/>
+              </w:tabs>
+            </w:pPr>
+            <w:r>
+              <w:t>Configuración</w:t>
+            </w:r>
+          </w:p>
+        </w:tc>
+        <w:tc>
+          <w:tcPr>
+            <w:tcW w:w="0" w:type="auto"/>
+            <w:vAlign w:val="center"/>
+            <w:hideMark/>
+          </w:tcPr>
+          <w:p>
+            <w:pPr>
+              <w:tabs>
+                <w:tab w:val="left" w:pos="284"/>
+                <w:tab w:val="left" w:pos="2268"/>
+                <w:tab w:val="left" w:pos="4820"/>
+                <w:tab w:val="left" w:pos="7230"/>
+              </w:tabs>
+            </w:pPr>
+            <w:r>
+              <w:t>Configuración inicial del sistema y usuarios</w:t>
+            </w:r>
+          </w:p>
+        </w:tc>
+        <w:tc>
+          <w:tcPr>
+            <w:tcW w:w="0" w:type="auto"/>
+            <w:vAlign w:val="center"/>
+            <w:hideMark/>
+          </w:tcPr>
+          <w:p>
+            <w:pPr>
+              <w:tabs>
+                <w:tab w:val="left" w:pos="284"/>
+                <w:tab w:val="left" w:pos="2268"/>
+                <w:tab w:val="left" w:pos="4820"/>
+                <w:tab w:val="left" w:pos="7230"/>
+              </w:tabs>
+            </w:pPr>
+            <w:r>
+              <w:t>1 día</w:t>
+            </w:r>
+          </w:p>
+        </w:tc>
+      </w:tr>
+      <w:tr>
+        <w:trPr>
+          <w:tblCellSpacing w:w="15" w:type="dxa"/>
+        </w:trPr>
+        <w:tc>
+          <w:tcPr>
+            <w:tcW w:w="0" w:type="auto"/>
+            <w:vAlign w:val="center"/>
+            <w:hideMark/>
+          </w:tcPr>
+          <w:p>
+            <w:pPr>
+              <w:tabs>
+                <w:tab w:val="left" w:pos="284"/>
+                <w:tab w:val="left" w:pos="2268"/>
+                <w:tab w:val="left" w:pos="4820"/>
+                <w:tab w:val="left" w:pos="7230"/>
+              </w:tabs>
+            </w:pPr>
+            <w:r>
+              <w:t>Pruebas</w:t>
+            </w:r>
+          </w:p>
+        </w:tc>
+        <w:tc>
+          <w:tcPr>
+            <w:tcW w:w="0" w:type="auto"/>
+            <w:vAlign w:val="center"/>
+            <w:hideMark/>
+          </w:tcPr>
+          <w:p>
+            <w:pPr>
+              <w:tabs>
+                <w:tab w:val="left" w:pos="284"/>
+                <w:tab w:val="left" w:pos="2268"/>
+                <w:tab w:val="left" w:pos="4820"/>
+                <w:tab w:val="left" w:pos="7230"/>
+              </w:tabs>
+            </w:pPr>
+            <w:r>
+              <w:t>Comprobación del funcionamiento de la aplicación</w:t>
+            </w:r>
+          </w:p>
+        </w:tc>
+        <w:tc>
+          <w:tcPr>
+            <w:tcW w:w="0" w:type="auto"/>
+            <w:vAlign w:val="center"/>
+            <w:hideMark/>
+          </w:tcPr>
+          <w:p>
+            <w:pPr>
+              <w:tabs>
+                <w:tab w:val="left" w:pos="284"/>
+                <w:tab w:val="left" w:pos="2268"/>
+                <w:tab w:val="left" w:pos="4820"/>
+                <w:tab w:val="left" w:pos="7230"/>
+              </w:tabs>
+            </w:pPr>
+            <w:r>
+              <w:t>2 días</w:t>
+            </w:r>
+          </w:p>
+        </w:tc>
+      </w:tr>
+      <w:tr>
+        <w:trPr>
+          <w:tblCellSpacing w:w="15" w:type="dxa"/>
+        </w:trPr>
+        <w:tc>
+          <w:tcPr>
+            <w:tcW w:w="0" w:type="auto"/>
+            <w:vAlign w:val="center"/>
+            <w:hideMark/>
+          </w:tcPr>
+          <w:p>
+            <w:pPr>
+              <w:tabs>
+                <w:tab w:val="left" w:pos="284"/>
+                <w:tab w:val="left" w:pos="2268"/>
+                <w:tab w:val="left" w:pos="4820"/>
+                <w:tab w:val="left" w:pos="7230"/>
+              </w:tabs>
+            </w:pPr>
+            <w:r>
+              <w:t>Migración de datos</w:t>
+            </w:r>
+          </w:p>
+        </w:tc>
+        <w:tc>
+          <w:tcPr>
+            <w:tcW w:w="0" w:type="auto"/>
+            <w:vAlign w:val="center"/>
+            <w:hideMark/>
+          </w:tcPr>
+          <w:p>
+            <w:pPr>
+              <w:tabs>
+                <w:tab w:val="left" w:pos="284"/>
+                <w:tab w:val="left" w:pos="2268"/>
+                <w:tab w:val="left" w:pos="4820"/>
+                <w:tab w:val="left" w:pos="7230"/>
+              </w:tabs>
+            </w:pPr>
+            <w:r>
+              <w:t>Carga de alumnos, libros y préstamos</w:t>
+            </w:r>
+          </w:p>
+        </w:tc>
+        <w:tc>
+          <w:tcPr>
+            <w:tcW w:w="0" w:type="auto"/>
+            <w:vAlign w:val="center"/>
+            <w:hideMark/>
+          </w:tcPr>
+          <w:p>
+            <w:pPr>
+              <w:tabs>
+                <w:tab w:val="left" w:pos="284"/>
+                <w:tab w:val="left" w:pos="2268"/>
+                <w:tab w:val="left" w:pos="4820"/>
+                <w:tab w:val="left" w:pos="7230"/>
+              </w:tabs>
+            </w:pPr>
+            <w:r>
+              <w:t>1 día</w:t>
+            </w:r>
+          </w:p>
+        </w:tc>
+      </w:tr>
+      <w:tr>
+        <w:trPr>
+          <w:tblCellSpacing w:w="15" w:type="dxa"/>
+        </w:trPr>
+        <w:tc>
+          <w:tcPr>
+            <w:tcW w:w="0" w:type="auto"/>
+            <w:vAlign w:val="center"/>
+            <w:hideMark/>
+          </w:tcPr>
+          <w:p>
+            <w:pPr>
+              <w:tabs>
+                <w:tab w:val="left" w:pos="284"/>
+                <w:tab w:val="left" w:pos="2268"/>
+                <w:tab w:val="left" w:pos="4820"/>
+                <w:tab w:val="left" w:pos="7230"/>
+              </w:tabs>
+            </w:pPr>
+            <w:r>
+              <w:t>Formación</w:t>
+            </w:r>
+          </w:p>
+        </w:tc>
+        <w:tc>
+          <w:tcPr>
+            <w:tcW w:w="0" w:type="auto"/>
+            <w:vAlign w:val="center"/>
+            <w:hideMark/>
+          </w:tcPr>
+          <w:p>
+            <w:pPr>
+              <w:tabs>
+                <w:tab w:val="left" w:pos="284"/>
+                <w:tab w:val="left" w:pos="2268"/>
+                <w:tab w:val="left" w:pos="4820"/>
+                <w:tab w:val="left" w:pos="7230"/>
+              </w:tabs>
+            </w:pPr>
+            <w:r>
+              <w:t>Explicación básica del uso de la aplicación</w:t>
+            </w:r>
+          </w:p>
+        </w:tc>
+        <w:tc>
+          <w:tcPr>
+            <w:tcW w:w="0" w:type="auto"/>
+            <w:vAlign w:val="center"/>
+            <w:hideMark/>
+          </w:tcPr>
+          <w:p>
+            <w:pPr>
+              <w:tabs>
+                <w:tab w:val="left" w:pos="284"/>
+                <w:tab w:val="left" w:pos="2268"/>
+                <w:tab w:val="left" w:pos="4820"/>
+                <w:tab w:val="left" w:pos="7230"/>
+              </w:tabs>
+            </w:pPr>
+            <w:r>
+              <w:t>1 día</w:t>
+            </w:r>
+          </w:p>
+        </w:tc>
+      </w:tr>
+    </w:tbl>
     <w:p>
       <w:pPr>
         <w:tabs>
@@ -28591,250 +28972,7 @@
           <w:tab w:val="left" w:pos="4820"/>
           <w:tab w:val="left" w:pos="7230"/>
         </w:tabs>
-        <w:rPr>
-          <w:b/>
-        </w:rPr>
-      </w:pPr>
-      <w:r>
-        <w:rPr>
-          <w:b/>
-        </w:rPr>
-        <w:tab/>
-        <w:t>Instalación</w:t>
-      </w:r>
-      <w:r>
-        <w:rPr>
-          <w:b/>
-        </w:rPr>
-        <w:tab/>
-        <w:t>Configuración</w:t>
-      </w:r>
-      <w:r>
-        <w:rPr>
-          <w:b/>
-        </w:rPr>
-        <w:tab/>
-        <w:t>Pruebas</w:t>
-      </w:r>
-      <w:r>
-        <w:rPr>
-          <w:b/>
-        </w:rPr>
-        <w:tab/>
-      </w:r>
-      <w:r>
-        <w:rPr>
-          <w:b/>
-        </w:rPr>
-        <w:t>Migración</w:t>
-      </w:r>
-    </w:p>
-    <w:p>
-      <w:pPr>
-        <w:tabs>
-          <w:tab w:val="left" w:pos="284"/>
-          <w:tab w:val="left" w:pos="2268"/>
-          <w:tab w:val="left" w:pos="4820"/>
-          <w:tab w:val="left" w:pos="7230"/>
-        </w:tabs>
-        <w:rPr>
-          <w:b/>
-        </w:rPr>
-      </w:pPr>
-      <w:r>
-        <w:rPr>
-          <w:b/>
-        </w:rPr>
-        <w:tab/>
-        <w:t>Software</w:t>
-      </w:r>
-      <w:r>
-        <w:rPr>
-          <w:b/>
-        </w:rPr>
-        <w:tab/>
-      </w:r>
-      <w:proofErr w:type="spellStart"/>
-      <w:r>
-        <w:rPr>
-          <w:b/>
-        </w:rPr>
-        <w:t>Software</w:t>
-      </w:r>
-      <w:proofErr w:type="spellEnd"/>
-      <w:r>
-        <w:rPr>
-          <w:b/>
-        </w:rPr>
-        <w:tab/>
-        <w:t>Formación</w:t>
-      </w:r>
-    </w:p>
-    <w:p>
-      <w:pPr>
-        <w:tabs>
-          <w:tab w:val="left" w:pos="284"/>
-          <w:tab w:val="left" w:pos="2268"/>
-          <w:tab w:val="left" w:pos="4820"/>
-          <w:tab w:val="left" w:pos="7230"/>
-        </w:tabs>
-      </w:pPr>
-      <w:r>
-        <w:tab/>
-      </w:r>
-      <w:r>
-        <w:t>2</w:t>
-      </w:r>
-      <w:r>
-        <w:t>2</w:t>
-      </w:r>
-      <w:r>
-        <w:t xml:space="preserve"> día</w:t>
-      </w:r>
-      <w:r>
-        <w:tab/>
-      </w:r>
-      <w:r>
-        <w:t>3</w:t>
-      </w:r>
-      <w:r>
-        <w:t>3</w:t>
-      </w:r>
-      <w:r>
-        <w:t xml:space="preserve"> día</w:t>
-      </w:r>
-      <w:r>
-        <w:tab/>
-      </w:r>
-      <w:r>
-        <w:t>5</w:t>
-      </w:r>
-      <w:r>
-        <w:t>5</w:t>
-      </w:r>
-      <w:r>
-        <w:t xml:space="preserve"> días</w:t>
-      </w:r>
-      <w:r>
-        <w:tab/>
-      </w:r>
-      <w:r>
-        <w:t>5</w:t>
-      </w:r>
-      <w:r>
-        <w:t>5</w:t>
-      </w:r>
-      <w:r>
-        <w:t xml:space="preserve"> días</w:t>
-      </w:r>
-    </w:p>
-    <w:p>
-      <w:pPr>
-        <w:tabs>
-          <w:tab w:val="left" w:pos="284"/>
-          <w:tab w:val="left" w:pos="2268"/>
-          <w:tab w:val="left" w:pos="4820"/>
-          <w:tab w:val="left" w:pos="7230"/>
-        </w:tabs>
-      </w:pPr>
-      <w:r>
-        <w:tab/>
-      </w:r>
-      <w:r>
-        <w:t>m</w:t>
-      </w:r>
-      <w:r>
-        <w:t>añana</w:t>
-      </w:r>
-      <w:r>
-        <w:tab/>
-      </w:r>
-      <w:proofErr w:type="spellStart"/>
-      <w:r>
-        <w:t>mañana</w:t>
-      </w:r>
-      <w:proofErr w:type="spellEnd"/>
-      <w:r>
-        <w:tab/>
-      </w:r>
-      <w:proofErr w:type="spellStart"/>
-      <w:r>
-        <w:t>mañana</w:t>
-      </w:r>
-      <w:proofErr w:type="spellEnd"/>
-      <w:r>
-        <w:tab/>
-        <w:t xml:space="preserve">noche </w:t>
-      </w:r>
-      <w:r>
-        <w:t>–</w:t>
-      </w:r>
-      <w:r>
-        <w:t xml:space="preserve"> mañana</w:t>
-      </w:r>
-    </w:p>
-    <w:p>
-      <w:pPr>
-        <w:tabs>
-          <w:tab w:val="left" w:pos="284"/>
-          <w:tab w:val="left" w:pos="2268"/>
-          <w:tab w:val="left" w:pos="4820"/>
-          <w:tab w:val="left" w:pos="7230"/>
-        </w:tabs>
-      </w:pPr>
-      <w:r>
-        <w:tab/>
-      </w:r>
-      <w:r>
-        <w:tab/>
-        <w:t>Pruebas de sistema</w:t>
-      </w:r>
-      <w:r>
-        <w:tab/>
-        <w:t>Pruebas de usuario</w:t>
-      </w:r>
-      <w:r>
-        <w:tab/>
-        <w:t>Pruebas de funcionamiento</w:t>
-      </w:r>
-    </w:p>
-    <w:p>
-      <w:pPr>
-        <w:tabs>
-          <w:tab w:val="left" w:pos="284"/>
-          <w:tab w:val="left" w:pos="2268"/>
-          <w:tab w:val="left" w:pos="4820"/>
-          <w:tab w:val="left" w:pos="7230"/>
-        </w:tabs>
-      </w:pPr>
-      <w:r>
-        <w:tab/>
-      </w:r>
-      <w:r>
-        <w:tab/>
-        <w:t>Instalador</w:t>
-      </w:r>
-      <w:r>
-        <w:tab/>
-      </w:r>
-      <w:proofErr w:type="spellStart"/>
-      <w:r>
-        <w:t>Instalador</w:t>
-      </w:r>
-      <w:proofErr w:type="spellEnd"/>
-      <w:r>
-        <w:tab/>
-        <w:t>Usuario</w:t>
-      </w:r>
-      <w:r>
-        <w:tab/>
-      </w:r>
-      <w:r>
-        <w:tab/>
-      </w:r>
-      <w:r>
-        <w:tab/>
-      </w:r>
+      </w:pPr>
     </w:p>
     <w:p>
       <w:pPr>
@@ -29088,7 +29226,7 @@
                         </pic:cNvPicPr>
                       </pic:nvPicPr>
                       <pic:blipFill>
-                        <a:blip r:embed="rId45" cstate="print">
+                        <a:blip r:embed="rId42" cstate="print">
                           <a:extLst>
                             <a:ext uri="{28A0092B-C50C-407E-A947-70E740481C1C}">
                               <a14:useLocalDpi xmlns:a14="http://schemas.microsoft.com/office/drawing/2010/main" val="0"/>
@@ -29180,7 +29318,7 @@
                         </pic:cNvPicPr>
                       </pic:nvPicPr>
                       <pic:blipFill>
-                        <a:blip r:embed="rId46" cstate="print">
+                        <a:blip r:embed="rId43" cstate="print">
                           <a:extLst>
                             <a:ext uri="{28A0092B-C50C-407E-A947-70E740481C1C}">
                               <a14:useLocalDpi xmlns:a14="http://schemas.microsoft.com/office/drawing/2010/main" val="0"/>
@@ -37021,8 +37159,8 @@
     <w:p/>
     <w:p/>
     <w:sectPr>
-      <w:headerReference w:type="default" r:id="rId47"/>
-      <w:footerReference w:type="default" r:id="rId48"/>
+      <w:headerReference w:type="default" r:id="rId44"/>
+      <w:footerReference w:type="default" r:id="rId45"/>
       <w:pgSz w:w="11906" w:h="16838" w:code="9"/>
       <w:pgMar w:top="1291" w:right="936" w:bottom="720" w:left="936" w:header="0" w:footer="289" w:gutter="0"/>
       <w:pgNumType w:start="1"/>
@@ -40848,6 +40986,17 @@
       <w:shd w:val="clear" w:color="auto" w:fill="E1DFDD"/>
     </w:rPr>
   </w:style>
+  <w:style w:type="paragraph" w:styleId="NormalWeb">
+    <w:name w:val="Normal (Web)"/>
+    <w:basedOn w:val="Normal"/>
+    <w:uiPriority w:val="99"/>
+    <w:semiHidden/>
+    <w:unhideWhenUsed/>
+    <w:rsid w:val="00814EC7"/>
+    <w:rPr>
+      <w:rFonts w:ascii="Times New Roman" w:hAnsi="Times New Roman" w:cs="Times New Roman"/>
+    </w:rPr>
+  </w:style>
 </w:styles>
 </file>
 
@@ -41230,7 +41379,6 @@
     <w:rsid w:val="000A4D58"/>
     <w:rsid w:val="000B76EC"/>
     <w:rsid w:val="000C2B5E"/>
-    <w:rsid w:val="000C2FD3"/>
     <w:rsid w:val="0010763A"/>
     <w:rsid w:val="00112C1E"/>
     <w:rsid w:val="001370FA"/>
@@ -41303,6 +41451,7 @@
     <w:rsid w:val="00A71D6A"/>
     <w:rsid w:val="00A94268"/>
     <w:rsid w:val="00AC11EA"/>
+    <w:rsid w:val="00AF6189"/>
     <w:rsid w:val="00B444FF"/>
     <w:rsid w:val="00BA03CE"/>
     <w:rsid w:val="00BB60B5"/>

</xml_diff>

<commit_message>
Decimoquinto guardado (24/05/2026, 19:19)
</commit_message>
<xml_diff>
--- a/UT_7_2024_2025 (2).docx
+++ b/UT_7_2024_2025 (2).docx
@@ -6733,7 +6733,6 @@
                 <w:r>
                   <w:t xml:space="preserve">IDE para desarrollo </w:t>
                 </w:r>
-                <w:proofErr w:type="gramStart"/>
                 <w:r>
                   <w:t>PHP</w:t>
                 </w:r>
@@ -6741,7 +6740,6 @@
                   <w:t xml:space="preserve">  (</w:t>
                 </w:r>
                 <w:proofErr w:type="spellStart"/>
-                <w:proofErr w:type="gramEnd"/>
                 <w:r>
                   <w:t>PhpStorm</w:t>
                 </w:r>
@@ -6829,16 +6827,11 @@
                 <w:r>
                   <w:t xml:space="preserve">Bootstrap </w:t>
                 </w:r>
-                <w:proofErr w:type="gramStart"/>
                 <w:r>
                   <w:t xml:space="preserve">5.3 </w:t>
                 </w:r>
                 <w:r>
-                  <w:t xml:space="preserve"> jQuery</w:t>
-                </w:r>
-                <w:proofErr w:type="gramEnd"/>
-                <w:r>
-                  <w:t xml:space="preserve"> 3.</w:t>
+                  <w:t xml:space="preserve"> jQuery 3.</w:t>
                 </w:r>
                 <w:r>
                   <w:t>7</w:t>
@@ -6891,7 +6884,6 @@
                   <w:t xml:space="preserve">– </w:t>
                 </w:r>
                 <w:proofErr w:type="spellStart"/>
-                <w:proofErr w:type="gramStart"/>
                 <w:r>
                   <w:t>MariaDB</w:t>
                 </w:r>
@@ -6908,7 +6900,6 @@
                 <w:r>
                   <w:t>patible</w:t>
                 </w:r>
-                <w:proofErr w:type="gramEnd"/>
               </w:p>
             </w:tc>
           </w:tr>
@@ -11234,21 +11225,7 @@
               <w:rPr>
                 <w:b/>
               </w:rPr>
-              <w:t xml:space="preserve">Selección de </w:t>
-            </w:r>
-            <w:proofErr w:type="gramStart"/>
-            <w:r>
-              <w:rPr>
-                <w:b/>
-              </w:rPr>
-              <w:t>datos  subcaso</w:t>
-            </w:r>
-            <w:proofErr w:type="gramEnd"/>
-            <w:r>
-              <w:rPr>
-                <w:b/>
-              </w:rPr>
-              <w:t>: Selección de formato</w:t>
+              <w:t>Selección de datos  subcaso: Selección de formato</w:t>
             </w:r>
           </w:p>
         </w:tc>
@@ -14220,19 +14197,8 @@
                 <w:sz w:val="16"/>
                 <w:szCs w:val="16"/>
               </w:rPr>
-              <w:t>1ºeso, 2</w:t>
-            </w:r>
-            <w:proofErr w:type="gramStart"/>
-            <w:r>
-              <w:rPr>
-                <w:rFonts w:cstheme="minorHAnsi"/>
-                <w:b/>
-                <w:sz w:val="16"/>
-                <w:szCs w:val="16"/>
-              </w:rPr>
-              <w:t>eso….</w:t>
-            </w:r>
-            <w:proofErr w:type="gramEnd"/>
+              <w:t>1ºeso, 2eso….</w:t>
+            </w:r>
           </w:p>
         </w:tc>
       </w:tr>
@@ -16443,27 +16409,7 @@
                 <w:sz w:val="16"/>
                 <w:szCs w:val="16"/>
               </w:rPr>
-              <w:t xml:space="preserve">0, I, </w:t>
-            </w:r>
-            <w:proofErr w:type="gramStart"/>
-            <w:r>
-              <w:rPr>
-                <w:rFonts w:cstheme="minorHAnsi"/>
-                <w:b/>
-                <w:sz w:val="16"/>
-                <w:szCs w:val="16"/>
-              </w:rPr>
-              <w:t>II  (</w:t>
-            </w:r>
-            <w:proofErr w:type="gramEnd"/>
-            <w:r>
-              <w:rPr>
-                <w:rFonts w:cstheme="minorHAnsi"/>
-                <w:b/>
-                <w:sz w:val="16"/>
-                <w:szCs w:val="16"/>
-              </w:rPr>
-              <w:t>0 para no beca, tramo I y II)</w:t>
+              <w:t>0, I, II  (0 para no beca, tramo I y II)</w:t>
             </w:r>
           </w:p>
         </w:tc>
@@ -17944,19 +17890,8 @@
                 <w:sz w:val="16"/>
                 <w:szCs w:val="16"/>
               </w:rPr>
-              <w:t xml:space="preserve">P: Prestado, </w:t>
-            </w:r>
-            <w:proofErr w:type="gramStart"/>
-            <w:r>
-              <w:rPr>
-                <w:rFonts w:cstheme="minorHAnsi"/>
-                <w:b/>
-                <w:sz w:val="16"/>
-                <w:szCs w:val="16"/>
-              </w:rPr>
-              <w:t>D:Devuelto</w:t>
-            </w:r>
-            <w:proofErr w:type="gramEnd"/>
+              <w:t>P: Prestado, D:Devuelto</w:t>
+            </w:r>
           </w:p>
         </w:tc>
       </w:tr>
@@ -18447,15 +18382,7 @@
     </w:p>
     <w:p>
       <w:r>
-        <w:t xml:space="preserve">El siguiente diagrama va a representar la estructura de clases que va a utilizar la aplicación para poder acceder y poder gestionar la información almacenada en la base de datos. La relación entre las clases va a permitir controlar la gestión de los préstamos las devoluciones, los </w:t>
-      </w:r>
-      <w:proofErr w:type="gramStart"/>
-      <w:r>
-        <w:t>cursos  y</w:t>
-      </w:r>
-      <w:proofErr w:type="gramEnd"/>
-      <w:r>
-        <w:t xml:space="preserve"> los libros que están asignados a cada alumno. El diagrama de clases se ha realizado teniendo en cuenta las relaciones existentes entre las distintas tablas del modelo relacional que se </w:t>
+        <w:t xml:space="preserve">El siguiente diagrama va a representar la estructura de clases que va a utilizar la aplicación para poder acceder y poder gestionar la información almacenada en la base de datos. La relación entre las clases va a permitir controlar la gestión de los préstamos las devoluciones, los cursos  y los libros que están asignados a cada alumno. El diagrama de clases se ha realizado teniendo en cuenta las relaciones existentes entre las distintas tablas del modelo relacional que se </w:t>
       </w:r>
       <w:proofErr w:type="spellStart"/>
       <w:r>
@@ -20853,21 +20780,157 @@
         <w:rPr>
           <w:lang w:val="en-GB"/>
         </w:rPr>
+        <w:t>` varchar(10) NOT NULL,</w:t>
+      </w:r>
+    </w:p>
+    <w:p>
+      <w:pPr>
+        <w:rPr>
+          <w:lang w:val="en-GB"/>
+        </w:rPr>
+      </w:pPr>
+      <w:r>
+        <w:rPr>
+          <w:lang w:val="en-GB"/>
+        </w:rPr>
+        <w:t xml:space="preserve">  `</w:t>
+      </w:r>
+      <w:proofErr w:type="spellStart"/>
+      <w:r>
+        <w:rPr>
+          <w:lang w:val="en-GB"/>
+        </w:rPr>
+        <w:t>nombre</w:t>
+      </w:r>
+      <w:proofErr w:type="spellEnd"/>
+      <w:r>
+        <w:rPr>
+          <w:lang w:val="en-GB"/>
+        </w:rPr>
+        <w:t>` varchar(255) NOT NULL,</w:t>
+      </w:r>
+    </w:p>
+    <w:p>
+      <w:pPr>
+        <w:rPr>
+          <w:lang w:val="en-GB"/>
+        </w:rPr>
+      </w:pPr>
+      <w:r>
+        <w:rPr>
+          <w:lang w:val="en-GB"/>
+        </w:rPr>
+        <w:t xml:space="preserve">  `</w:t>
+      </w:r>
+      <w:proofErr w:type="spellStart"/>
+      <w:r>
+        <w:rPr>
+          <w:lang w:val="en-GB"/>
+        </w:rPr>
+        <w:t>apellidos</w:t>
+      </w:r>
+      <w:proofErr w:type="spellEnd"/>
+      <w:r>
+        <w:rPr>
+          <w:lang w:val="en-GB"/>
+        </w:rPr>
+        <w:t>` varchar(255) NOT NULL,</w:t>
+      </w:r>
+    </w:p>
+    <w:p>
+      <w:pPr>
+        <w:rPr>
+          <w:lang w:val="en-GB"/>
+        </w:rPr>
+      </w:pPr>
+      <w:r>
+        <w:rPr>
+          <w:lang w:val="en-GB"/>
+        </w:rPr>
+        <w:t xml:space="preserve">  `</w:t>
+      </w:r>
+      <w:proofErr w:type="spellStart"/>
+      <w:r>
+        <w:rPr>
+          <w:lang w:val="en-GB"/>
+        </w:rPr>
+        <w:t>tramo</w:t>
+      </w:r>
+      <w:proofErr w:type="spellEnd"/>
+      <w:r>
+        <w:rPr>
+          <w:lang w:val="en-GB"/>
+        </w:rPr>
+        <w:t xml:space="preserve">` varchar(2) NOT NULL DEFAULT '0' COMMENT '0 nada, I </w:t>
+      </w:r>
+      <w:proofErr w:type="spellStart"/>
+      <w:r>
+        <w:rPr>
+          <w:lang w:val="en-GB"/>
+        </w:rPr>
+        <w:t>tramo</w:t>
+      </w:r>
+      <w:proofErr w:type="spellEnd"/>
+      <w:r>
+        <w:rPr>
+          <w:lang w:val="en-GB"/>
+        </w:rPr>
+        <w:t xml:space="preserve"> I y II </w:t>
+      </w:r>
+      <w:proofErr w:type="spellStart"/>
+      <w:r>
+        <w:rPr>
+          <w:lang w:val="en-GB"/>
+        </w:rPr>
+        <w:t>Tramo</w:t>
+      </w:r>
+      <w:proofErr w:type="spellEnd"/>
+      <w:r>
+        <w:rPr>
+          <w:lang w:val="en-GB"/>
+        </w:rPr>
+        <w:t xml:space="preserve"> 2',</w:t>
+      </w:r>
+    </w:p>
+    <w:p>
+      <w:pPr>
+        <w:rPr>
+          <w:lang w:val="en-GB"/>
+        </w:rPr>
+      </w:pPr>
+      <w:r>
+        <w:rPr>
+          <w:lang w:val="en-GB"/>
+        </w:rPr>
+        <w:t xml:space="preserve">  `</w:t>
+      </w:r>
+      <w:proofErr w:type="spellStart"/>
+      <w:r>
+        <w:rPr>
+          <w:lang w:val="en-GB"/>
+        </w:rPr>
+        <w:t>bilingue</w:t>
+      </w:r>
+      <w:proofErr w:type="spellEnd"/>
+      <w:r>
+        <w:rPr>
+          <w:lang w:val="en-GB"/>
+        </w:rPr>
         <w:t xml:space="preserve">` </w:t>
       </w:r>
-      <w:proofErr w:type="gramStart"/>
+      <w:proofErr w:type="spellStart"/>
       <w:r>
         <w:rPr>
           <w:lang w:val="en-GB"/>
         </w:rPr>
-        <w:t>varchar(</w:t>
-      </w:r>
-      <w:proofErr w:type="gramEnd"/>
+        <w:t>tinyint</w:t>
+      </w:r>
+      <w:proofErr w:type="spellEnd"/>
       <w:r>
         <w:rPr>
           <w:lang w:val="en-GB"/>
         </w:rPr>
-        <w:t>10) NOT NULL,</w:t>
+        <w:t>(1) NOT NULL DEFAULT 1 COMMENT '0 True, 1 false'</w:t>
       </w:r>
     </w:p>
     <w:p>
@@ -20880,6 +20943,168 @@
         <w:rPr>
           <w:lang w:val="en-GB"/>
         </w:rPr>
+        <w:t>) ENGINE=</w:t>
+      </w:r>
+      <w:proofErr w:type="spellStart"/>
+      <w:r>
+        <w:rPr>
+          <w:lang w:val="en-GB"/>
+        </w:rPr>
+        <w:t>InnoDB</w:t>
+      </w:r>
+      <w:proofErr w:type="spellEnd"/>
+      <w:r>
+        <w:rPr>
+          <w:lang w:val="en-GB"/>
+        </w:rPr>
+        <w:t xml:space="preserve"> DEFAULT CHARSET=utf8 COLLATE=utf8_spanish2_ci;</w:t>
+      </w:r>
+    </w:p>
+    <w:p>
+      <w:pPr>
+        <w:rPr>
+          <w:lang w:val="en-GB"/>
+        </w:rPr>
+      </w:pPr>
+      <w:r>
+        <w:rPr>
+          <w:lang w:val="en-GB"/>
+        </w:rPr>
+        <w:t>-- --------------------------------------------------------</w:t>
+      </w:r>
+    </w:p>
+    <w:p>
+      <w:pPr>
+        <w:rPr>
+          <w:lang w:val="en-GB"/>
+        </w:rPr>
+      </w:pPr>
+      <w:r>
+        <w:rPr>
+          <w:lang w:val="en-GB"/>
+        </w:rPr>
+        <w:t>--</w:t>
+      </w:r>
+    </w:p>
+    <w:p>
+      <w:pPr>
+        <w:rPr>
+          <w:lang w:val="en-GB"/>
+        </w:rPr>
+      </w:pPr>
+      <w:r>
+        <w:rPr>
+          <w:lang w:val="en-GB"/>
+        </w:rPr>
+        <w:t xml:space="preserve">-- </w:t>
+      </w:r>
+      <w:proofErr w:type="spellStart"/>
+      <w:r>
+        <w:rPr>
+          <w:lang w:val="en-GB"/>
+        </w:rPr>
+        <w:t>Estructura</w:t>
+      </w:r>
+      <w:proofErr w:type="spellEnd"/>
+      <w:r>
+        <w:rPr>
+          <w:lang w:val="en-GB"/>
+        </w:rPr>
+        <w:t xml:space="preserve"> de </w:t>
+      </w:r>
+      <w:proofErr w:type="spellStart"/>
+      <w:r>
+        <w:rPr>
+          <w:lang w:val="en-GB"/>
+        </w:rPr>
+        <w:t>tabla</w:t>
+      </w:r>
+      <w:proofErr w:type="spellEnd"/>
+      <w:r>
+        <w:rPr>
+          <w:lang w:val="en-GB"/>
+        </w:rPr>
+        <w:t xml:space="preserve"> para la </w:t>
+      </w:r>
+      <w:proofErr w:type="spellStart"/>
+      <w:r>
+        <w:rPr>
+          <w:lang w:val="en-GB"/>
+        </w:rPr>
+        <w:t>tabla</w:t>
+      </w:r>
+      <w:proofErr w:type="spellEnd"/>
+      <w:r>
+        <w:rPr>
+          <w:lang w:val="en-GB"/>
+        </w:rPr>
+        <w:t xml:space="preserve"> `</w:t>
+      </w:r>
+      <w:proofErr w:type="spellStart"/>
+      <w:r>
+        <w:rPr>
+          <w:lang w:val="en-GB"/>
+        </w:rPr>
+        <w:t>alumnoscrusoslibros</w:t>
+      </w:r>
+      <w:proofErr w:type="spellEnd"/>
+      <w:r>
+        <w:rPr>
+          <w:lang w:val="en-GB"/>
+        </w:rPr>
+        <w:t>`</w:t>
+      </w:r>
+    </w:p>
+    <w:p>
+      <w:pPr>
+        <w:rPr>
+          <w:lang w:val="en-GB"/>
+        </w:rPr>
+      </w:pPr>
+      <w:r>
+        <w:rPr>
+          <w:lang w:val="en-GB"/>
+        </w:rPr>
+        <w:t>--</w:t>
+      </w:r>
+    </w:p>
+    <w:p>
+      <w:pPr>
+        <w:rPr>
+          <w:lang w:val="en-GB"/>
+        </w:rPr>
+      </w:pPr>
+      <w:r>
+        <w:rPr>
+          <w:lang w:val="en-GB"/>
+        </w:rPr>
+        <w:t>CREATE TABLE `</w:t>
+      </w:r>
+      <w:proofErr w:type="spellStart"/>
+      <w:r>
+        <w:rPr>
+          <w:lang w:val="en-GB"/>
+        </w:rPr>
+        <w:t>alumnoscrusoslibros</w:t>
+      </w:r>
+      <w:proofErr w:type="spellEnd"/>
+      <w:r>
+        <w:rPr>
+          <w:lang w:val="en-GB"/>
+        </w:rPr>
+        <w:t>` (</w:t>
+      </w:r>
+    </w:p>
+    <w:p>
+      <w:pPr>
+        <w:rPr>
+          <w:lang w:val="en-GB"/>
+        </w:rPr>
+      </w:pPr>
+      <w:r>
+        <w:rPr>
+          <w:lang w:val="en-GB"/>
+        </w:rPr>
         <w:t xml:space="preserve">  `</w:t>
       </w:r>
       <w:proofErr w:type="spellStart"/>
@@ -20887,40 +21112,53 @@
         <w:rPr>
           <w:lang w:val="en-GB"/>
         </w:rPr>
-        <w:t>nombre</w:t>
+        <w:t>nie</w:t>
       </w:r>
       <w:proofErr w:type="spellEnd"/>
       <w:r>
         <w:rPr>
           <w:lang w:val="en-GB"/>
         </w:rPr>
-        <w:t xml:space="preserve">` </w:t>
-      </w:r>
-      <w:proofErr w:type="gramStart"/>
-      <w:r>
+        <w:t>` varchar(10) NOT NULL,</w:t>
+      </w:r>
+    </w:p>
+    <w:p>
+      <w:pPr>
         <w:rPr>
           <w:lang w:val="en-GB"/>
         </w:rPr>
-        <w:t>varchar(</w:t>
-      </w:r>
-      <w:proofErr w:type="gramEnd"/>
+      </w:pPr>
       <w:r>
         <w:rPr>
           <w:lang w:val="en-GB"/>
         </w:rPr>
-        <w:t>255) NOT NULL,</w:t>
-      </w:r>
-    </w:p>
-    <w:p>
-      <w:pPr>
+        <w:t xml:space="preserve">  `</w:t>
+      </w:r>
+      <w:proofErr w:type="spellStart"/>
+      <w:r>
         <w:rPr>
           <w:lang w:val="en-GB"/>
         </w:rPr>
-      </w:pPr>
+        <w:t>curso</w:t>
+      </w:r>
+      <w:proofErr w:type="spellEnd"/>
       <w:r>
         <w:rPr>
           <w:lang w:val="en-GB"/>
         </w:rPr>
+        <w:t>` varchar(255) NOT NULL,</w:t>
+      </w:r>
+    </w:p>
+    <w:p>
+      <w:pPr>
+        <w:rPr>
+          <w:lang w:val="en-GB"/>
+        </w:rPr>
+      </w:pPr>
+      <w:r>
+        <w:rPr>
+          <w:lang w:val="en-GB"/>
+        </w:rPr>
         <w:t xml:space="preserve">  `</w:t>
       </w:r>
       <w:proofErr w:type="spellStart"/>
@@ -20928,431 +21166,14 @@
         <w:rPr>
           <w:lang w:val="en-GB"/>
         </w:rPr>
-        <w:t>apellidos</w:t>
+        <w:t>isbn</w:t>
       </w:r>
       <w:proofErr w:type="spellEnd"/>
       <w:r>
         <w:rPr>
           <w:lang w:val="en-GB"/>
         </w:rPr>
-        <w:t xml:space="preserve">` </w:t>
-      </w:r>
-      <w:proofErr w:type="gramStart"/>
-      <w:r>
-        <w:rPr>
-          <w:lang w:val="en-GB"/>
-        </w:rPr>
-        <w:t>varchar(</w:t>
-      </w:r>
-      <w:proofErr w:type="gramEnd"/>
-      <w:r>
-        <w:rPr>
-          <w:lang w:val="en-GB"/>
-        </w:rPr>
-        <w:t>255) NOT NULL,</w:t>
-      </w:r>
-    </w:p>
-    <w:p>
-      <w:pPr>
-        <w:rPr>
-          <w:lang w:val="en-GB"/>
-        </w:rPr>
-      </w:pPr>
-      <w:r>
-        <w:rPr>
-          <w:lang w:val="en-GB"/>
-        </w:rPr>
-        <w:t xml:space="preserve">  `</w:t>
-      </w:r>
-      <w:proofErr w:type="spellStart"/>
-      <w:r>
-        <w:rPr>
-          <w:lang w:val="en-GB"/>
-        </w:rPr>
-        <w:t>tramo</w:t>
-      </w:r>
-      <w:proofErr w:type="spellEnd"/>
-      <w:r>
-        <w:rPr>
-          <w:lang w:val="en-GB"/>
-        </w:rPr>
-        <w:t xml:space="preserve">` </w:t>
-      </w:r>
-      <w:proofErr w:type="gramStart"/>
-      <w:r>
-        <w:rPr>
-          <w:lang w:val="en-GB"/>
-        </w:rPr>
-        <w:t>varchar(</w:t>
-      </w:r>
-      <w:proofErr w:type="gramEnd"/>
-      <w:r>
-        <w:rPr>
-          <w:lang w:val="en-GB"/>
-        </w:rPr>
-        <w:t xml:space="preserve">2) NOT NULL DEFAULT '0' COMMENT '0 nada, I </w:t>
-      </w:r>
-      <w:proofErr w:type="spellStart"/>
-      <w:r>
-        <w:rPr>
-          <w:lang w:val="en-GB"/>
-        </w:rPr>
-        <w:t>tramo</w:t>
-      </w:r>
-      <w:proofErr w:type="spellEnd"/>
-      <w:r>
-        <w:rPr>
-          <w:lang w:val="en-GB"/>
-        </w:rPr>
-        <w:t xml:space="preserve"> I y II </w:t>
-      </w:r>
-      <w:proofErr w:type="spellStart"/>
-      <w:r>
-        <w:rPr>
-          <w:lang w:val="en-GB"/>
-        </w:rPr>
-        <w:t>Tramo</w:t>
-      </w:r>
-      <w:proofErr w:type="spellEnd"/>
-      <w:r>
-        <w:rPr>
-          <w:lang w:val="en-GB"/>
-        </w:rPr>
-        <w:t xml:space="preserve"> 2',</w:t>
-      </w:r>
-    </w:p>
-    <w:p>
-      <w:pPr>
-        <w:rPr>
-          <w:lang w:val="en-GB"/>
-        </w:rPr>
-      </w:pPr>
-      <w:r>
-        <w:rPr>
-          <w:lang w:val="en-GB"/>
-        </w:rPr>
-        <w:t xml:space="preserve">  `</w:t>
-      </w:r>
-      <w:proofErr w:type="spellStart"/>
-      <w:r>
-        <w:rPr>
-          <w:lang w:val="en-GB"/>
-        </w:rPr>
-        <w:t>bilingue</w:t>
-      </w:r>
-      <w:proofErr w:type="spellEnd"/>
-      <w:r>
-        <w:rPr>
-          <w:lang w:val="en-GB"/>
-        </w:rPr>
-        <w:t xml:space="preserve">` </w:t>
-      </w:r>
-      <w:proofErr w:type="spellStart"/>
-      <w:proofErr w:type="gramStart"/>
-      <w:r>
-        <w:rPr>
-          <w:lang w:val="en-GB"/>
-        </w:rPr>
-        <w:t>tinyint</w:t>
-      </w:r>
-      <w:proofErr w:type="spellEnd"/>
-      <w:r>
-        <w:rPr>
-          <w:lang w:val="en-GB"/>
-        </w:rPr>
-        <w:t>(</w:t>
-      </w:r>
-      <w:proofErr w:type="gramEnd"/>
-      <w:r>
-        <w:rPr>
-          <w:lang w:val="en-GB"/>
-        </w:rPr>
-        <w:t>1) NOT NULL DEFAULT 1 COMMENT '0 True, 1 false'</w:t>
-      </w:r>
-    </w:p>
-    <w:p>
-      <w:pPr>
-        <w:rPr>
-          <w:lang w:val="en-GB"/>
-        </w:rPr>
-      </w:pPr>
-      <w:r>
-        <w:rPr>
-          <w:lang w:val="en-GB"/>
-        </w:rPr>
-        <w:t>) ENGINE=</w:t>
-      </w:r>
-      <w:proofErr w:type="spellStart"/>
-      <w:r>
-        <w:rPr>
-          <w:lang w:val="en-GB"/>
-        </w:rPr>
-        <w:t>InnoDB</w:t>
-      </w:r>
-      <w:proofErr w:type="spellEnd"/>
-      <w:r>
-        <w:rPr>
-          <w:lang w:val="en-GB"/>
-        </w:rPr>
-        <w:t xml:space="preserve"> DEFAULT CHARSET=utf8 COLLATE=utf8_spanish2_ci;</w:t>
-      </w:r>
-    </w:p>
-    <w:p>
-      <w:pPr>
-        <w:rPr>
-          <w:lang w:val="en-GB"/>
-        </w:rPr>
-      </w:pPr>
-      <w:r>
-        <w:rPr>
-          <w:lang w:val="en-GB"/>
-        </w:rPr>
-        <w:t>-- --------------------------------------------------------</w:t>
-      </w:r>
-    </w:p>
-    <w:p>
-      <w:pPr>
-        <w:rPr>
-          <w:lang w:val="en-GB"/>
-        </w:rPr>
-      </w:pPr>
-      <w:r>
-        <w:rPr>
-          <w:lang w:val="en-GB"/>
-        </w:rPr>
-        <w:t>--</w:t>
-      </w:r>
-    </w:p>
-    <w:p>
-      <w:pPr>
-        <w:rPr>
-          <w:lang w:val="en-GB"/>
-        </w:rPr>
-      </w:pPr>
-      <w:r>
-        <w:rPr>
-          <w:lang w:val="en-GB"/>
-        </w:rPr>
-        <w:t xml:space="preserve">-- </w:t>
-      </w:r>
-      <w:proofErr w:type="spellStart"/>
-      <w:r>
-        <w:rPr>
-          <w:lang w:val="en-GB"/>
-        </w:rPr>
-        <w:t>Estructura</w:t>
-      </w:r>
-      <w:proofErr w:type="spellEnd"/>
-      <w:r>
-        <w:rPr>
-          <w:lang w:val="en-GB"/>
-        </w:rPr>
-        <w:t xml:space="preserve"> de </w:t>
-      </w:r>
-      <w:proofErr w:type="spellStart"/>
-      <w:r>
-        <w:rPr>
-          <w:lang w:val="en-GB"/>
-        </w:rPr>
-        <w:t>tabla</w:t>
-      </w:r>
-      <w:proofErr w:type="spellEnd"/>
-      <w:r>
-        <w:rPr>
-          <w:lang w:val="en-GB"/>
-        </w:rPr>
-        <w:t xml:space="preserve"> para la </w:t>
-      </w:r>
-      <w:proofErr w:type="spellStart"/>
-      <w:r>
-        <w:rPr>
-          <w:lang w:val="en-GB"/>
-        </w:rPr>
-        <w:t>tabla</w:t>
-      </w:r>
-      <w:proofErr w:type="spellEnd"/>
-      <w:r>
-        <w:rPr>
-          <w:lang w:val="en-GB"/>
-        </w:rPr>
-        <w:t xml:space="preserve"> `</w:t>
-      </w:r>
-      <w:proofErr w:type="spellStart"/>
-      <w:r>
-        <w:rPr>
-          <w:lang w:val="en-GB"/>
-        </w:rPr>
-        <w:t>alumnoscrusoslibros</w:t>
-      </w:r>
-      <w:proofErr w:type="spellEnd"/>
-      <w:r>
-        <w:rPr>
-          <w:lang w:val="en-GB"/>
-        </w:rPr>
-        <w:t>`</w:t>
-      </w:r>
-    </w:p>
-    <w:p>
-      <w:pPr>
-        <w:rPr>
-          <w:lang w:val="en-GB"/>
-        </w:rPr>
-      </w:pPr>
-      <w:r>
-        <w:rPr>
-          <w:lang w:val="en-GB"/>
-        </w:rPr>
-        <w:t>--</w:t>
-      </w:r>
-    </w:p>
-    <w:p>
-      <w:pPr>
-        <w:rPr>
-          <w:lang w:val="en-GB"/>
-        </w:rPr>
-      </w:pPr>
-      <w:r>
-        <w:rPr>
-          <w:lang w:val="en-GB"/>
-        </w:rPr>
-        <w:t>CREATE TABLE `</w:t>
-      </w:r>
-      <w:proofErr w:type="spellStart"/>
-      <w:r>
-        <w:rPr>
-          <w:lang w:val="en-GB"/>
-        </w:rPr>
-        <w:t>alumnoscrusoslibros</w:t>
-      </w:r>
-      <w:proofErr w:type="spellEnd"/>
-      <w:r>
-        <w:rPr>
-          <w:lang w:val="en-GB"/>
-        </w:rPr>
-        <w:t>` (</w:t>
-      </w:r>
-    </w:p>
-    <w:p>
-      <w:pPr>
-        <w:rPr>
-          <w:lang w:val="en-GB"/>
-        </w:rPr>
-      </w:pPr>
-      <w:r>
-        <w:rPr>
-          <w:lang w:val="en-GB"/>
-        </w:rPr>
-        <w:t xml:space="preserve">  `</w:t>
-      </w:r>
-      <w:proofErr w:type="spellStart"/>
-      <w:r>
-        <w:rPr>
-          <w:lang w:val="en-GB"/>
-        </w:rPr>
-        <w:t>nie</w:t>
-      </w:r>
-      <w:proofErr w:type="spellEnd"/>
-      <w:r>
-        <w:rPr>
-          <w:lang w:val="en-GB"/>
-        </w:rPr>
-        <w:t xml:space="preserve">` </w:t>
-      </w:r>
-      <w:proofErr w:type="gramStart"/>
-      <w:r>
-        <w:rPr>
-          <w:lang w:val="en-GB"/>
-        </w:rPr>
-        <w:t>varchar(</w:t>
-      </w:r>
-      <w:proofErr w:type="gramEnd"/>
-      <w:r>
-        <w:rPr>
-          <w:lang w:val="en-GB"/>
-        </w:rPr>
-        <w:t>10) NOT NULL,</w:t>
-      </w:r>
-    </w:p>
-    <w:p>
-      <w:pPr>
-        <w:rPr>
-          <w:lang w:val="en-GB"/>
-        </w:rPr>
-      </w:pPr>
-      <w:r>
-        <w:rPr>
-          <w:lang w:val="en-GB"/>
-        </w:rPr>
-        <w:t xml:space="preserve">  `</w:t>
-      </w:r>
-      <w:proofErr w:type="spellStart"/>
-      <w:r>
-        <w:rPr>
-          <w:lang w:val="en-GB"/>
-        </w:rPr>
-        <w:t>curso</w:t>
-      </w:r>
-      <w:proofErr w:type="spellEnd"/>
-      <w:r>
-        <w:rPr>
-          <w:lang w:val="en-GB"/>
-        </w:rPr>
-        <w:t xml:space="preserve">` </w:t>
-      </w:r>
-      <w:proofErr w:type="gramStart"/>
-      <w:r>
-        <w:rPr>
-          <w:lang w:val="en-GB"/>
-        </w:rPr>
-        <w:t>varchar(</w:t>
-      </w:r>
-      <w:proofErr w:type="gramEnd"/>
-      <w:r>
-        <w:rPr>
-          <w:lang w:val="en-GB"/>
-        </w:rPr>
-        <w:t>255) NOT NULL,</w:t>
-      </w:r>
-    </w:p>
-    <w:p>
-      <w:pPr>
-        <w:rPr>
-          <w:lang w:val="en-GB"/>
-        </w:rPr>
-      </w:pPr>
-      <w:r>
-        <w:rPr>
-          <w:lang w:val="en-GB"/>
-        </w:rPr>
-        <w:t xml:space="preserve">  `</w:t>
-      </w:r>
-      <w:proofErr w:type="spellStart"/>
-      <w:r>
-        <w:rPr>
-          <w:lang w:val="en-GB"/>
-        </w:rPr>
-        <w:t>isbn</w:t>
-      </w:r>
-      <w:proofErr w:type="spellEnd"/>
-      <w:r>
-        <w:rPr>
-          <w:lang w:val="en-GB"/>
-        </w:rPr>
-        <w:t xml:space="preserve">` </w:t>
-      </w:r>
-      <w:proofErr w:type="gramStart"/>
-      <w:r>
-        <w:rPr>
-          <w:lang w:val="en-GB"/>
-        </w:rPr>
-        <w:t>varchar(</w:t>
-      </w:r>
-      <w:proofErr w:type="gramEnd"/>
-      <w:r>
-        <w:rPr>
-          <w:lang w:val="en-GB"/>
-        </w:rPr>
-        <w:t>20) NOT NULL,</w:t>
+        <w:t>` varchar(20) NOT NULL,</w:t>
       </w:r>
     </w:p>
     <w:p>
@@ -21434,49 +21255,61 @@
         <w:rPr>
           <w:lang w:val="en-GB"/>
         </w:rPr>
-        <w:t xml:space="preserve">` </w:t>
-      </w:r>
-      <w:proofErr w:type="gramStart"/>
+        <w:t xml:space="preserve">` varchar(1) NOT NULL DEFAULT 'P' COMMENT 'P: </w:t>
+      </w:r>
+      <w:proofErr w:type="spellStart"/>
       <w:r>
         <w:rPr>
           <w:lang w:val="en-GB"/>
         </w:rPr>
-        <w:t>varchar(</w:t>
-      </w:r>
-      <w:proofErr w:type="gramEnd"/>
+        <w:t>Prestado</w:t>
+      </w:r>
+      <w:proofErr w:type="spellEnd"/>
       <w:r>
         <w:rPr>
           <w:lang w:val="en-GB"/>
         </w:rPr>
-        <w:t xml:space="preserve">1) NOT NULL DEFAULT 'P' COMMENT 'P: </w:t>
+        <w:t>, D:Devuelto'</w:t>
+      </w:r>
+    </w:p>
+    <w:p>
+      <w:pPr>
+        <w:rPr>
+          <w:lang w:val="en-GB"/>
+        </w:rPr>
+      </w:pPr>
+      <w:r>
+        <w:rPr>
+          <w:lang w:val="en-GB"/>
+        </w:rPr>
+        <w:t>) ENGINE=</w:t>
       </w:r>
       <w:proofErr w:type="spellStart"/>
       <w:r>
         <w:rPr>
           <w:lang w:val="en-GB"/>
         </w:rPr>
-        <w:t>Prestado</w:t>
+        <w:t>InnoDB</w:t>
       </w:r>
       <w:proofErr w:type="spellEnd"/>
       <w:r>
         <w:rPr>
           <w:lang w:val="en-GB"/>
         </w:rPr>
-        <w:t xml:space="preserve">, </w:t>
-      </w:r>
-      <w:proofErr w:type="gramStart"/>
-      <w:r>
+        <w:t xml:space="preserve"> DEFAULT CHARSET=utf8 COLLATE=utf8_spanish2_ci;</w:t>
+      </w:r>
+    </w:p>
+    <w:p>
+      <w:pPr>
         <w:rPr>
           <w:lang w:val="en-GB"/>
         </w:rPr>
-        <w:t>D:Devuelto</w:t>
-      </w:r>
-      <w:proofErr w:type="gramEnd"/>
+      </w:pPr>
       <w:r>
         <w:rPr>
           <w:lang w:val="en-GB"/>
         </w:rPr>
-        <w:t>'</w:t>
+        <w:t>-- --------------------------------------------------------</w:t>
       </w:r>
     </w:p>
     <w:p>
@@ -21489,6 +21322,182 @@
         <w:rPr>
           <w:lang w:val="en-GB"/>
         </w:rPr>
+        <w:t>--</w:t>
+      </w:r>
+    </w:p>
+    <w:p>
+      <w:pPr>
+        <w:rPr>
+          <w:lang w:val="en-GB"/>
+        </w:rPr>
+      </w:pPr>
+      <w:r>
+        <w:rPr>
+          <w:lang w:val="en-GB"/>
+        </w:rPr>
+        <w:t xml:space="preserve">-- </w:t>
+      </w:r>
+      <w:proofErr w:type="spellStart"/>
+      <w:r>
+        <w:rPr>
+          <w:lang w:val="en-GB"/>
+        </w:rPr>
+        <w:t>Estructura</w:t>
+      </w:r>
+      <w:proofErr w:type="spellEnd"/>
+      <w:r>
+        <w:rPr>
+          <w:lang w:val="en-GB"/>
+        </w:rPr>
+        <w:t xml:space="preserve"> de </w:t>
+      </w:r>
+      <w:proofErr w:type="spellStart"/>
+      <w:r>
+        <w:rPr>
+          <w:lang w:val="en-GB"/>
+        </w:rPr>
+        <w:t>tabla</w:t>
+      </w:r>
+      <w:proofErr w:type="spellEnd"/>
+      <w:r>
+        <w:rPr>
+          <w:lang w:val="en-GB"/>
+        </w:rPr>
+        <w:t xml:space="preserve"> para la </w:t>
+      </w:r>
+      <w:proofErr w:type="spellStart"/>
+      <w:r>
+        <w:rPr>
+          <w:lang w:val="en-GB"/>
+        </w:rPr>
+        <w:t>tabla</w:t>
+      </w:r>
+      <w:proofErr w:type="spellEnd"/>
+      <w:r>
+        <w:rPr>
+          <w:lang w:val="en-GB"/>
+        </w:rPr>
+        <w:t xml:space="preserve"> `</w:t>
+      </w:r>
+      <w:proofErr w:type="spellStart"/>
+      <w:r>
+        <w:rPr>
+          <w:lang w:val="en-GB"/>
+        </w:rPr>
+        <w:t>cursos</w:t>
+      </w:r>
+      <w:proofErr w:type="spellEnd"/>
+      <w:r>
+        <w:rPr>
+          <w:lang w:val="en-GB"/>
+        </w:rPr>
+        <w:t>`</w:t>
+      </w:r>
+    </w:p>
+    <w:p>
+      <w:pPr>
+        <w:rPr>
+          <w:lang w:val="en-GB"/>
+        </w:rPr>
+      </w:pPr>
+      <w:r>
+        <w:rPr>
+          <w:lang w:val="en-GB"/>
+        </w:rPr>
+        <w:t>--</w:t>
+      </w:r>
+    </w:p>
+    <w:p>
+      <w:pPr>
+        <w:rPr>
+          <w:lang w:val="en-GB"/>
+        </w:rPr>
+      </w:pPr>
+      <w:r>
+        <w:rPr>
+          <w:lang w:val="en-GB"/>
+        </w:rPr>
+        <w:t>CREATE TABLE `</w:t>
+      </w:r>
+      <w:proofErr w:type="spellStart"/>
+      <w:r>
+        <w:rPr>
+          <w:lang w:val="en-GB"/>
+        </w:rPr>
+        <w:t>cursos</w:t>
+      </w:r>
+      <w:proofErr w:type="spellEnd"/>
+      <w:r>
+        <w:rPr>
+          <w:lang w:val="en-GB"/>
+        </w:rPr>
+        <w:t>` (</w:t>
+      </w:r>
+    </w:p>
+    <w:p>
+      <w:pPr>
+        <w:rPr>
+          <w:lang w:val="en-GB"/>
+        </w:rPr>
+      </w:pPr>
+      <w:r>
+        <w:rPr>
+          <w:lang w:val="en-GB"/>
+        </w:rPr>
+        <w:t xml:space="preserve">  `</w:t>
+      </w:r>
+      <w:proofErr w:type="spellStart"/>
+      <w:r>
+        <w:rPr>
+          <w:lang w:val="en-GB"/>
+        </w:rPr>
+        <w:t>curso</w:t>
+      </w:r>
+      <w:proofErr w:type="spellEnd"/>
+      <w:r>
+        <w:rPr>
+          <w:lang w:val="en-GB"/>
+        </w:rPr>
+        <w:t>` varchar(20) NOT NULL,</w:t>
+      </w:r>
+    </w:p>
+    <w:p>
+      <w:pPr>
+        <w:rPr>
+          <w:lang w:val="en-GB"/>
+        </w:rPr>
+      </w:pPr>
+      <w:r>
+        <w:rPr>
+          <w:lang w:val="en-GB"/>
+        </w:rPr>
+        <w:t xml:space="preserve">  `</w:t>
+      </w:r>
+      <w:proofErr w:type="spellStart"/>
+      <w:r>
+        <w:rPr>
+          <w:lang w:val="en-GB"/>
+        </w:rPr>
+        <w:t>nivel</w:t>
+      </w:r>
+      <w:proofErr w:type="spellEnd"/>
+      <w:r>
+        <w:rPr>
+          <w:lang w:val="en-GB"/>
+        </w:rPr>
+        <w:t>` varchar(20) NOT NULL</w:t>
+      </w:r>
+    </w:p>
+    <w:p>
+      <w:pPr>
+        <w:rPr>
+          <w:lang w:val="en-GB"/>
+        </w:rPr>
+      </w:pPr>
+      <w:r>
+        <w:rPr>
+          <w:lang w:val="en-GB"/>
+        </w:rPr>
         <w:t>) ENGINE=</w:t>
       </w:r>
       <w:proofErr w:type="spellStart"/>
@@ -21591,7 +21600,7 @@
         <w:rPr>
           <w:lang w:val="en-GB"/>
         </w:rPr>
-        <w:t>cursos</w:t>
+        <w:t>libros</w:t>
       </w:r>
       <w:proofErr w:type="spellEnd"/>
       <w:r>
@@ -21631,7 +21640,7 @@
         <w:rPr>
           <w:lang w:val="en-GB"/>
         </w:rPr>
-        <w:t>cursos</w:t>
+        <w:t>libros</w:t>
       </w:r>
       <w:proofErr w:type="spellEnd"/>
       <w:r>
@@ -21658,40 +21667,53 @@
         <w:rPr>
           <w:lang w:val="en-GB"/>
         </w:rPr>
-        <w:t>curso</w:t>
+        <w:t>isbn</w:t>
       </w:r>
       <w:proofErr w:type="spellEnd"/>
       <w:r>
         <w:rPr>
           <w:lang w:val="en-GB"/>
         </w:rPr>
-        <w:t xml:space="preserve">` </w:t>
-      </w:r>
-      <w:proofErr w:type="gramStart"/>
-      <w:r>
+        <w:t>` varchar(20) NOT NULL,</w:t>
+      </w:r>
+    </w:p>
+    <w:p>
+      <w:pPr>
         <w:rPr>
           <w:lang w:val="en-GB"/>
         </w:rPr>
-        <w:t>varchar(</w:t>
-      </w:r>
-      <w:proofErr w:type="gramEnd"/>
+      </w:pPr>
       <w:r>
         <w:rPr>
           <w:lang w:val="en-GB"/>
         </w:rPr>
-        <w:t>20) NOT NULL,</w:t>
-      </w:r>
-    </w:p>
-    <w:p>
-      <w:pPr>
+        <w:t xml:space="preserve">  `</w:t>
+      </w:r>
+      <w:proofErr w:type="spellStart"/>
+      <w:r>
         <w:rPr>
           <w:lang w:val="en-GB"/>
         </w:rPr>
-      </w:pPr>
+        <w:t>titulo</w:t>
+      </w:r>
+      <w:proofErr w:type="spellEnd"/>
       <w:r>
         <w:rPr>
           <w:lang w:val="en-GB"/>
         </w:rPr>
+        <w:t>` varchar(255) NOT NULL,</w:t>
+      </w:r>
+    </w:p>
+    <w:p>
+      <w:pPr>
+        <w:rPr>
+          <w:lang w:val="en-GB"/>
+        </w:rPr>
+      </w:pPr>
+      <w:r>
+        <w:rPr>
+          <w:lang w:val="en-GB"/>
+        </w:rPr>
         <w:t xml:space="preserve">  `</w:t>
       </w:r>
       <w:proofErr w:type="spellStart"/>
@@ -21699,40 +21721,107 @@
         <w:rPr>
           <w:lang w:val="en-GB"/>
         </w:rPr>
-        <w:t>nivel</w:t>
+        <w:t>autor</w:t>
       </w:r>
       <w:proofErr w:type="spellEnd"/>
       <w:r>
         <w:rPr>
           <w:lang w:val="en-GB"/>
         </w:rPr>
-        <w:t xml:space="preserve">` </w:t>
-      </w:r>
-      <w:proofErr w:type="gramStart"/>
-      <w:r>
+        <w:t>` varchar(255) NOT NULL,</w:t>
+      </w:r>
+    </w:p>
+    <w:p>
+      <w:pPr>
         <w:rPr>
           <w:lang w:val="en-GB"/>
         </w:rPr>
-        <w:t>varchar(</w:t>
-      </w:r>
-      <w:proofErr w:type="gramEnd"/>
+      </w:pPr>
       <w:r>
         <w:rPr>
           <w:lang w:val="en-GB"/>
         </w:rPr>
-        <w:t>20) NOT NULL</w:t>
-      </w:r>
-    </w:p>
-    <w:p>
-      <w:pPr>
+        <w:t xml:space="preserve">  `</w:t>
+      </w:r>
+      <w:proofErr w:type="spellStart"/>
+      <w:r>
         <w:rPr>
           <w:lang w:val="en-GB"/>
         </w:rPr>
-      </w:pPr>
+        <w:t>numero_ejemplares</w:t>
+      </w:r>
+      <w:proofErr w:type="spellEnd"/>
       <w:r>
         <w:rPr>
           <w:lang w:val="en-GB"/>
         </w:rPr>
+        <w:t>` int(5) NOT NULL,</w:t>
+      </w:r>
+    </w:p>
+    <w:p>
+      <w:pPr>
+        <w:rPr>
+          <w:lang w:val="en-GB"/>
+        </w:rPr>
+      </w:pPr>
+      <w:r>
+        <w:rPr>
+          <w:lang w:val="en-GB"/>
+        </w:rPr>
+        <w:t xml:space="preserve">  `</w:t>
+      </w:r>
+      <w:proofErr w:type="spellStart"/>
+      <w:r>
+        <w:rPr>
+          <w:lang w:val="en-GB"/>
+        </w:rPr>
+        <w:t>id_materia</w:t>
+      </w:r>
+      <w:proofErr w:type="spellEnd"/>
+      <w:r>
+        <w:rPr>
+          <w:lang w:val="en-GB"/>
+        </w:rPr>
+        <w:t>` int(11) NOT NULL,</w:t>
+      </w:r>
+    </w:p>
+    <w:p>
+      <w:pPr>
+        <w:rPr>
+          <w:lang w:val="en-GB"/>
+        </w:rPr>
+      </w:pPr>
+      <w:r>
+        <w:rPr>
+          <w:lang w:val="en-GB"/>
+        </w:rPr>
+        <w:t xml:space="preserve">  `</w:t>
+      </w:r>
+      <w:proofErr w:type="spellStart"/>
+      <w:r>
+        <w:rPr>
+          <w:lang w:val="en-GB"/>
+        </w:rPr>
+        <w:t>id_curso</w:t>
+      </w:r>
+      <w:proofErr w:type="spellEnd"/>
+      <w:r>
+        <w:rPr>
+          <w:lang w:val="en-GB"/>
+        </w:rPr>
+        <w:t>` varchar(20) NOT NULL</w:t>
+      </w:r>
+    </w:p>
+    <w:p>
+      <w:pPr>
+        <w:rPr>
+          <w:lang w:val="en-GB"/>
+        </w:rPr>
+      </w:pPr>
+      <w:r>
+        <w:rPr>
+          <w:lang w:val="en-GB"/>
+        </w:rPr>
         <w:t>) ENGINE=</w:t>
       </w:r>
       <w:proofErr w:type="spellStart"/>
@@ -21835,7 +21924,7 @@
         <w:rPr>
           <w:lang w:val="en-GB"/>
         </w:rPr>
-        <w:t>libros</w:t>
+        <w:t>materias</w:t>
       </w:r>
       <w:proofErr w:type="spellEnd"/>
       <w:r>
@@ -21875,7 +21964,7 @@
         <w:rPr>
           <w:lang w:val="en-GB"/>
         </w:rPr>
-        <w:t>libros</w:t>
+        <w:t>materias</w:t>
       </w:r>
       <w:proofErr w:type="spellEnd"/>
       <w:r>
@@ -21895,6 +21984,19 @@
         <w:rPr>
           <w:lang w:val="en-GB"/>
         </w:rPr>
+        <w:t xml:space="preserve">  `id` int(11) NOT NULL,</w:t>
+      </w:r>
+    </w:p>
+    <w:p>
+      <w:pPr>
+        <w:rPr>
+          <w:lang w:val="en-GB"/>
+        </w:rPr>
+      </w:pPr>
+      <w:r>
+        <w:rPr>
+          <w:lang w:val="en-GB"/>
+        </w:rPr>
         <w:t xml:space="preserve">  `</w:t>
       </w:r>
       <w:proofErr w:type="spellStart"/>
@@ -21902,504 +22004,41 @@
         <w:rPr>
           <w:lang w:val="en-GB"/>
         </w:rPr>
-        <w:t>isbn</w:t>
+        <w:t>nombre</w:t>
       </w:r>
       <w:proofErr w:type="spellEnd"/>
       <w:r>
         <w:rPr>
           <w:lang w:val="en-GB"/>
         </w:rPr>
-        <w:t xml:space="preserve">` </w:t>
-      </w:r>
-      <w:proofErr w:type="gramStart"/>
-      <w:r>
+        <w:t>` varchar(255) NOT NULL,</w:t>
+      </w:r>
+    </w:p>
+    <w:p>
+      <w:pPr>
         <w:rPr>
           <w:lang w:val="en-GB"/>
         </w:rPr>
-        <w:t>varchar(</w:t>
-      </w:r>
-      <w:proofErr w:type="gramEnd"/>
+      </w:pPr>
       <w:r>
         <w:rPr>
           <w:lang w:val="en-GB"/>
         </w:rPr>
-        <w:t>20) NOT NULL,</w:t>
-      </w:r>
-    </w:p>
-    <w:p>
-      <w:pPr>
+        <w:t xml:space="preserve">  `</w:t>
+      </w:r>
+      <w:proofErr w:type="spellStart"/>
+      <w:r>
         <w:rPr>
           <w:lang w:val="en-GB"/>
         </w:rPr>
-      </w:pPr>
+        <w:t>departamento</w:t>
+      </w:r>
+      <w:proofErr w:type="spellEnd"/>
       <w:r>
         <w:rPr>
           <w:lang w:val="en-GB"/>
         </w:rPr>
-        <w:t xml:space="preserve">  `</w:t>
-      </w:r>
-      <w:proofErr w:type="spellStart"/>
-      <w:r>
-        <w:rPr>
-          <w:lang w:val="en-GB"/>
-        </w:rPr>
-        <w:t>titulo</w:t>
-      </w:r>
-      <w:proofErr w:type="spellEnd"/>
-      <w:r>
-        <w:rPr>
-          <w:lang w:val="en-GB"/>
-        </w:rPr>
-        <w:t xml:space="preserve">` </w:t>
-      </w:r>
-      <w:proofErr w:type="gramStart"/>
-      <w:r>
-        <w:rPr>
-          <w:lang w:val="en-GB"/>
-        </w:rPr>
-        <w:t>varchar(</w:t>
-      </w:r>
-      <w:proofErr w:type="gramEnd"/>
-      <w:r>
-        <w:rPr>
-          <w:lang w:val="en-GB"/>
-        </w:rPr>
-        <w:t>255) NOT NULL,</w:t>
-      </w:r>
-    </w:p>
-    <w:p>
-      <w:pPr>
-        <w:rPr>
-          <w:lang w:val="en-GB"/>
-        </w:rPr>
-      </w:pPr>
-      <w:r>
-        <w:rPr>
-          <w:lang w:val="en-GB"/>
-        </w:rPr>
-        <w:t xml:space="preserve">  `</w:t>
-      </w:r>
-      <w:proofErr w:type="spellStart"/>
-      <w:r>
-        <w:rPr>
-          <w:lang w:val="en-GB"/>
-        </w:rPr>
-        <w:t>autor</w:t>
-      </w:r>
-      <w:proofErr w:type="spellEnd"/>
-      <w:r>
-        <w:rPr>
-          <w:lang w:val="en-GB"/>
-        </w:rPr>
-        <w:t xml:space="preserve">` </w:t>
-      </w:r>
-      <w:proofErr w:type="gramStart"/>
-      <w:r>
-        <w:rPr>
-          <w:lang w:val="en-GB"/>
-        </w:rPr>
-        <w:t>varchar(</w:t>
-      </w:r>
-      <w:proofErr w:type="gramEnd"/>
-      <w:r>
-        <w:rPr>
-          <w:lang w:val="en-GB"/>
-        </w:rPr>
-        <w:t>255) NOT NULL,</w:t>
-      </w:r>
-    </w:p>
-    <w:p>
-      <w:pPr>
-        <w:rPr>
-          <w:lang w:val="en-GB"/>
-        </w:rPr>
-      </w:pPr>
-      <w:r>
-        <w:rPr>
-          <w:lang w:val="en-GB"/>
-        </w:rPr>
-        <w:t xml:space="preserve">  `</w:t>
-      </w:r>
-      <w:proofErr w:type="spellStart"/>
-      <w:r>
-        <w:rPr>
-          <w:lang w:val="en-GB"/>
-        </w:rPr>
-        <w:t>numero_ejemplares</w:t>
-      </w:r>
-      <w:proofErr w:type="spellEnd"/>
-      <w:r>
-        <w:rPr>
-          <w:lang w:val="en-GB"/>
-        </w:rPr>
-        <w:t xml:space="preserve">` </w:t>
-      </w:r>
-      <w:proofErr w:type="gramStart"/>
-      <w:r>
-        <w:rPr>
-          <w:lang w:val="en-GB"/>
-        </w:rPr>
-        <w:t>int(</w:t>
-      </w:r>
-      <w:proofErr w:type="gramEnd"/>
-      <w:r>
-        <w:rPr>
-          <w:lang w:val="en-GB"/>
-        </w:rPr>
-        <w:t>5) NOT NULL,</w:t>
-      </w:r>
-    </w:p>
-    <w:p>
-      <w:pPr>
-        <w:rPr>
-          <w:lang w:val="en-GB"/>
-        </w:rPr>
-      </w:pPr>
-      <w:r>
-        <w:rPr>
-          <w:lang w:val="en-GB"/>
-        </w:rPr>
-        <w:t xml:space="preserve">  `</w:t>
-      </w:r>
-      <w:proofErr w:type="spellStart"/>
-      <w:r>
-        <w:rPr>
-          <w:lang w:val="en-GB"/>
-        </w:rPr>
-        <w:t>id_materia</w:t>
-      </w:r>
-      <w:proofErr w:type="spellEnd"/>
-      <w:r>
-        <w:rPr>
-          <w:lang w:val="en-GB"/>
-        </w:rPr>
-        <w:t xml:space="preserve">` </w:t>
-      </w:r>
-      <w:proofErr w:type="gramStart"/>
-      <w:r>
-        <w:rPr>
-          <w:lang w:val="en-GB"/>
-        </w:rPr>
-        <w:t>int(</w:t>
-      </w:r>
-      <w:proofErr w:type="gramEnd"/>
-      <w:r>
-        <w:rPr>
-          <w:lang w:val="en-GB"/>
-        </w:rPr>
-        <w:t>11) NOT NULL,</w:t>
-      </w:r>
-    </w:p>
-    <w:p>
-      <w:pPr>
-        <w:rPr>
-          <w:lang w:val="en-GB"/>
-        </w:rPr>
-      </w:pPr>
-      <w:r>
-        <w:rPr>
-          <w:lang w:val="en-GB"/>
-        </w:rPr>
-        <w:t xml:space="preserve">  `</w:t>
-      </w:r>
-      <w:proofErr w:type="spellStart"/>
-      <w:r>
-        <w:rPr>
-          <w:lang w:val="en-GB"/>
-        </w:rPr>
-        <w:t>id_curso</w:t>
-      </w:r>
-      <w:proofErr w:type="spellEnd"/>
-      <w:r>
-        <w:rPr>
-          <w:lang w:val="en-GB"/>
-        </w:rPr>
-        <w:t xml:space="preserve">` </w:t>
-      </w:r>
-      <w:proofErr w:type="gramStart"/>
-      <w:r>
-        <w:rPr>
-          <w:lang w:val="en-GB"/>
-        </w:rPr>
-        <w:t>varchar(</w:t>
-      </w:r>
-      <w:proofErr w:type="gramEnd"/>
-      <w:r>
-        <w:rPr>
-          <w:lang w:val="en-GB"/>
-        </w:rPr>
-        <w:t>20) NOT NULL</w:t>
-      </w:r>
-    </w:p>
-    <w:p>
-      <w:pPr>
-        <w:rPr>
-          <w:lang w:val="en-GB"/>
-        </w:rPr>
-      </w:pPr>
-      <w:r>
-        <w:rPr>
-          <w:lang w:val="en-GB"/>
-        </w:rPr>
-        <w:t>) ENGINE=</w:t>
-      </w:r>
-      <w:proofErr w:type="spellStart"/>
-      <w:r>
-        <w:rPr>
-          <w:lang w:val="en-GB"/>
-        </w:rPr>
-        <w:t>InnoDB</w:t>
-      </w:r>
-      <w:proofErr w:type="spellEnd"/>
-      <w:r>
-        <w:rPr>
-          <w:lang w:val="en-GB"/>
-        </w:rPr>
-        <w:t xml:space="preserve"> DEFAULT CHARSET=utf8 COLLATE=utf8_spanish2_ci;</w:t>
-      </w:r>
-    </w:p>
-    <w:p>
-      <w:pPr>
-        <w:rPr>
-          <w:lang w:val="en-GB"/>
-        </w:rPr>
-      </w:pPr>
-      <w:r>
-        <w:rPr>
-          <w:lang w:val="en-GB"/>
-        </w:rPr>
-        <w:t>-- --------------------------------------------------------</w:t>
-      </w:r>
-    </w:p>
-    <w:p>
-      <w:pPr>
-        <w:rPr>
-          <w:lang w:val="en-GB"/>
-        </w:rPr>
-      </w:pPr>
-      <w:r>
-        <w:rPr>
-          <w:lang w:val="en-GB"/>
-        </w:rPr>
-        <w:t>--</w:t>
-      </w:r>
-    </w:p>
-    <w:p>
-      <w:pPr>
-        <w:rPr>
-          <w:lang w:val="en-GB"/>
-        </w:rPr>
-      </w:pPr>
-      <w:r>
-        <w:rPr>
-          <w:lang w:val="en-GB"/>
-        </w:rPr>
-        <w:t xml:space="preserve">-- </w:t>
-      </w:r>
-      <w:proofErr w:type="spellStart"/>
-      <w:r>
-        <w:rPr>
-          <w:lang w:val="en-GB"/>
-        </w:rPr>
-        <w:t>Estructura</w:t>
-      </w:r>
-      <w:proofErr w:type="spellEnd"/>
-      <w:r>
-        <w:rPr>
-          <w:lang w:val="en-GB"/>
-        </w:rPr>
-        <w:t xml:space="preserve"> de </w:t>
-      </w:r>
-      <w:proofErr w:type="spellStart"/>
-      <w:r>
-        <w:rPr>
-          <w:lang w:val="en-GB"/>
-        </w:rPr>
-        <w:t>tabla</w:t>
-      </w:r>
-      <w:proofErr w:type="spellEnd"/>
-      <w:r>
-        <w:rPr>
-          <w:lang w:val="en-GB"/>
-        </w:rPr>
-        <w:t xml:space="preserve"> para la </w:t>
-      </w:r>
-      <w:proofErr w:type="spellStart"/>
-      <w:r>
-        <w:rPr>
-          <w:lang w:val="en-GB"/>
-        </w:rPr>
-        <w:t>tabla</w:t>
-      </w:r>
-      <w:proofErr w:type="spellEnd"/>
-      <w:r>
-        <w:rPr>
-          <w:lang w:val="en-GB"/>
-        </w:rPr>
-        <w:t xml:space="preserve"> `</w:t>
-      </w:r>
-      <w:proofErr w:type="spellStart"/>
-      <w:r>
-        <w:rPr>
-          <w:lang w:val="en-GB"/>
-        </w:rPr>
-        <w:t>materias</w:t>
-      </w:r>
-      <w:proofErr w:type="spellEnd"/>
-      <w:r>
-        <w:rPr>
-          <w:lang w:val="en-GB"/>
-        </w:rPr>
-        <w:t>`</w:t>
-      </w:r>
-    </w:p>
-    <w:p>
-      <w:pPr>
-        <w:rPr>
-          <w:lang w:val="en-GB"/>
-        </w:rPr>
-      </w:pPr>
-      <w:r>
-        <w:rPr>
-          <w:lang w:val="en-GB"/>
-        </w:rPr>
-        <w:t>--</w:t>
-      </w:r>
-    </w:p>
-    <w:p>
-      <w:pPr>
-        <w:rPr>
-          <w:lang w:val="en-GB"/>
-        </w:rPr>
-      </w:pPr>
-      <w:r>
-        <w:rPr>
-          <w:lang w:val="en-GB"/>
-        </w:rPr>
-        <w:t>CREATE TABLE `</w:t>
-      </w:r>
-      <w:proofErr w:type="spellStart"/>
-      <w:r>
-        <w:rPr>
-          <w:lang w:val="en-GB"/>
-        </w:rPr>
-        <w:t>materias</w:t>
-      </w:r>
-      <w:proofErr w:type="spellEnd"/>
-      <w:r>
-        <w:rPr>
-          <w:lang w:val="en-GB"/>
-        </w:rPr>
-        <w:t>` (</w:t>
-      </w:r>
-    </w:p>
-    <w:p>
-      <w:pPr>
-        <w:rPr>
-          <w:lang w:val="en-GB"/>
-        </w:rPr>
-      </w:pPr>
-      <w:r>
-        <w:rPr>
-          <w:lang w:val="en-GB"/>
-        </w:rPr>
-        <w:t xml:space="preserve">  `id` </w:t>
-      </w:r>
-      <w:proofErr w:type="gramStart"/>
-      <w:r>
-        <w:rPr>
-          <w:lang w:val="en-GB"/>
-        </w:rPr>
-        <w:t>int(</w:t>
-      </w:r>
-      <w:proofErr w:type="gramEnd"/>
-      <w:r>
-        <w:rPr>
-          <w:lang w:val="en-GB"/>
-        </w:rPr>
-        <w:t>11) NOT NULL,</w:t>
-      </w:r>
-    </w:p>
-    <w:p>
-      <w:pPr>
-        <w:rPr>
-          <w:lang w:val="en-GB"/>
-        </w:rPr>
-      </w:pPr>
-      <w:r>
-        <w:rPr>
-          <w:lang w:val="en-GB"/>
-        </w:rPr>
-        <w:t xml:space="preserve">  `</w:t>
-      </w:r>
-      <w:proofErr w:type="spellStart"/>
-      <w:r>
-        <w:rPr>
-          <w:lang w:val="en-GB"/>
-        </w:rPr>
-        <w:t>nombre</w:t>
-      </w:r>
-      <w:proofErr w:type="spellEnd"/>
-      <w:r>
-        <w:rPr>
-          <w:lang w:val="en-GB"/>
-        </w:rPr>
-        <w:t xml:space="preserve">` </w:t>
-      </w:r>
-      <w:proofErr w:type="gramStart"/>
-      <w:r>
-        <w:rPr>
-          <w:lang w:val="en-GB"/>
-        </w:rPr>
-        <w:t>varchar(</w:t>
-      </w:r>
-      <w:proofErr w:type="gramEnd"/>
-      <w:r>
-        <w:rPr>
-          <w:lang w:val="en-GB"/>
-        </w:rPr>
-        <w:t>255) NOT NULL,</w:t>
-      </w:r>
-    </w:p>
-    <w:p>
-      <w:pPr>
-        <w:rPr>
-          <w:lang w:val="en-GB"/>
-        </w:rPr>
-      </w:pPr>
-      <w:r>
-        <w:rPr>
-          <w:lang w:val="en-GB"/>
-        </w:rPr>
-        <w:t xml:space="preserve">  `</w:t>
-      </w:r>
-      <w:proofErr w:type="spellStart"/>
-      <w:r>
-        <w:rPr>
-          <w:lang w:val="en-GB"/>
-        </w:rPr>
-        <w:t>departamento</w:t>
-      </w:r>
-      <w:proofErr w:type="spellEnd"/>
-      <w:r>
-        <w:rPr>
-          <w:lang w:val="en-GB"/>
-        </w:rPr>
-        <w:t xml:space="preserve">` </w:t>
-      </w:r>
-      <w:proofErr w:type="gramStart"/>
-      <w:r>
-        <w:rPr>
-          <w:lang w:val="en-GB"/>
-        </w:rPr>
-        <w:t>varchar(</w:t>
-      </w:r>
-      <w:proofErr w:type="gramEnd"/>
-      <w:r>
-        <w:rPr>
-          <w:lang w:val="en-GB"/>
-        </w:rPr>
-        <w:t>255) NOT NULL</w:t>
+        <w:t>` varchar(255) NOT NULL</w:t>
       </w:r>
     </w:p>
     <w:p>
@@ -22740,7 +22379,6 @@
         <w:t>nie</w:t>
       </w:r>
       <w:proofErr w:type="spellEnd"/>
-      <w:proofErr w:type="gramStart"/>
       <w:r>
         <w:rPr>
           <w:lang w:val="en-GB"/>
@@ -22748,7 +22386,6 @@
         <w:t>`,`</w:t>
       </w:r>
       <w:proofErr w:type="spellStart"/>
-      <w:proofErr w:type="gramEnd"/>
       <w:r>
         <w:rPr>
           <w:lang w:val="en-GB"/>
@@ -22756,7 +22393,6 @@
         <w:t>curso</w:t>
       </w:r>
       <w:proofErr w:type="spellEnd"/>
-      <w:proofErr w:type="gramStart"/>
       <w:r>
         <w:rPr>
           <w:lang w:val="en-GB"/>
@@ -22764,7 +22400,6 @@
         <w:t>`,`</w:t>
       </w:r>
       <w:proofErr w:type="spellStart"/>
-      <w:proofErr w:type="gramEnd"/>
       <w:r>
         <w:rPr>
           <w:lang w:val="en-GB"/>
@@ -30610,15 +30245,6 @@
       </w:r>
       <w:r>
         <w:t xml:space="preserve"> </w:t>
-      </w:r>
-    </w:p>
-    <w:p>
-      <w:pPr>
-        <w:spacing w:after="160" w:line="259" w:lineRule="auto"/>
-        <w:jc w:val="left"/>
-      </w:pPr>
-      <w:r>
-        <w:t>WINDOWS</w:t>
       </w:r>
     </w:p>
     <w:p>
@@ -31270,17 +30896,8 @@
         <w:t xml:space="preserve">l </w:t>
       </w:r>
       <w:r>
-        <w:t>ordenador.</w:t>
-      </w:r>
-      <w:r>
-        <w:t xml:space="preserve"> </w:t>
-      </w:r>
-    </w:p>
-    <w:p>
-      <w:pPr>
-        <w:spacing w:after="160" w:line="259" w:lineRule="auto"/>
-        <w:jc w:val="left"/>
-      </w:pPr>
+        <w:t>ordenador</w:t>
+      </w:r>
       <w:r>
         <w:t>:</w:t>
       </w:r>
@@ -31894,21 +31511,100 @@
         <w:spacing w:after="160" w:line="259" w:lineRule="auto"/>
         <w:jc w:val="left"/>
       </w:pPr>
-      <w:r>
-        <w:t xml:space="preserve">Y ya lo tenemos creado para instalar la versión de Python que PyCharm deberá utilizar </w:t>
-      </w:r>
     </w:p>
     <w:p>
       <w:pPr>
         <w:spacing w:after="160" w:line="259" w:lineRule="auto"/>
         <w:jc w:val="left"/>
       </w:pPr>
+      <w:r>
+        <w:lastRenderedPageBreak/>
+        <w:t xml:space="preserve">Después de crear el proyecto, nos debemos instalar el XAMPP que se va a utilizar para gestionar la base de datos, para ello nos meteremos en la página oficial de XAMPP, </w:t>
+      </w:r>
+      <w:hyperlink r:id="rId76" w:history="1">
+        <w:r>
+          <w:rPr>
+            <w:rStyle w:val="Hipervnculo"/>
+          </w:rPr>
+          <w:t>https://www.apachefriends.org/download.html</w:t>
+        </w:r>
+      </w:hyperlink>
+      <w:r>
+        <w:t xml:space="preserve">,  </w:t>
+      </w:r>
+      <w:r>
+        <w:t>seleccionar</w:t>
+      </w:r>
+      <w:r>
+        <w:t>emos</w:t>
+      </w:r>
+      <w:r>
+        <w:t xml:space="preserve"> la versión </w:t>
+      </w:r>
+      <w:r>
+        <w:t xml:space="preserve">que sea </w:t>
+      </w:r>
+      <w:r>
+        <w:t xml:space="preserve">compatible con </w:t>
+      </w:r>
+      <w:r>
+        <w:t xml:space="preserve">nuestro </w:t>
+      </w:r>
+      <w:r>
+        <w:t>sistema operativo de</w:t>
+      </w:r>
+      <w:r>
+        <w:t xml:space="preserve">l </w:t>
+      </w:r>
+      <w:r>
+        <w:t>ordenador</w:t>
+      </w:r>
+      <w:r>
+        <w:t>:</w:t>
+      </w:r>
     </w:p>
     <w:p>
       <w:pPr>
         <w:spacing w:after="160" w:line="259" w:lineRule="auto"/>
         <w:jc w:val="left"/>
       </w:pPr>
+      <w:r>
+        <w:drawing>
+          <wp:inline distT="0" distB="0" distL="0" distR="0" wp14:anchorId="0F882C00" wp14:editId="2EA4E192">
+            <wp:extent cx="6371590" cy="3843655"/>
+            <wp:effectExtent l="0" t="0" r="0" b="4445"/>
+            <wp:docPr id="1306322277" name="Imagen 1"/>
+            <wp:cNvGraphicFramePr>
+              <a:graphicFrameLocks xmlns:a="http://schemas.openxmlformats.org/drawingml/2006/main" noChangeAspect="1"/>
+            </wp:cNvGraphicFramePr>
+            <a:graphic xmlns:a="http://schemas.openxmlformats.org/drawingml/2006/main">
+              <a:graphicData uri="http://schemas.openxmlformats.org/drawingml/2006/picture">
+                <pic:pic xmlns:pic="http://schemas.openxmlformats.org/drawingml/2006/picture">
+                  <pic:nvPicPr>
+                    <pic:cNvPr id="1306322277" name=""/>
+                    <pic:cNvPicPr/>
+                  </pic:nvPicPr>
+                  <pic:blipFill>
+                    <a:blip r:embed="rId77"/>
+                    <a:stretch>
+                      <a:fillRect/>
+                    </a:stretch>
+                  </pic:blipFill>
+                  <pic:spPr>
+                    <a:xfrm>
+                      <a:off x="0" y="0"/>
+                      <a:ext cx="6371590" cy="3843655"/>
+                    </a:xfrm>
+                    <a:prstGeom prst="rect">
+                      <a:avLst/>
+                    </a:prstGeom>
+                  </pic:spPr>
+                </pic:pic>
+              </a:graphicData>
+            </a:graphic>
+          </wp:inline>
+        </w:drawing>
+      </w:r>
     </w:p>
     <w:p>
       <w:pPr>
@@ -31916,71 +31612,852 @@
         <w:jc w:val="left"/>
       </w:pPr>
       <w:r>
+        <w:t>Esperamos a que se descargue el archivo:</w:t>
+      </w:r>
+    </w:p>
+    <w:p>
+      <w:pPr>
+        <w:spacing w:after="160" w:line="259" w:lineRule="auto"/>
+        <w:jc w:val="left"/>
+      </w:pPr>
+      <w:r>
+        <w:drawing>
+          <wp:inline distT="0" distB="0" distL="0" distR="0" wp14:anchorId="498AA255" wp14:editId="668273B7">
+            <wp:extent cx="2834886" cy="1341236"/>
+            <wp:effectExtent l="0" t="0" r="3810" b="0"/>
+            <wp:docPr id="1851213358" name="Imagen 1"/>
+            <wp:cNvGraphicFramePr>
+              <a:graphicFrameLocks xmlns:a="http://schemas.openxmlformats.org/drawingml/2006/main" noChangeAspect="1"/>
+            </wp:cNvGraphicFramePr>
+            <a:graphic xmlns:a="http://schemas.openxmlformats.org/drawingml/2006/main">
+              <a:graphicData uri="http://schemas.openxmlformats.org/drawingml/2006/picture">
+                <pic:pic xmlns:pic="http://schemas.openxmlformats.org/drawingml/2006/picture">
+                  <pic:nvPicPr>
+                    <pic:cNvPr id="1851213358" name=""/>
+                    <pic:cNvPicPr/>
+                  </pic:nvPicPr>
+                  <pic:blipFill>
+                    <a:blip r:embed="rId78"/>
+                    <a:stretch>
+                      <a:fillRect/>
+                    </a:stretch>
+                  </pic:blipFill>
+                  <pic:spPr>
+                    <a:xfrm>
+                      <a:off x="0" y="0"/>
+                      <a:ext cx="2834886" cy="1341236"/>
+                    </a:xfrm>
+                    <a:prstGeom prst="rect">
+                      <a:avLst/>
+                    </a:prstGeom>
+                  </pic:spPr>
+                </pic:pic>
+              </a:graphicData>
+            </a:graphic>
+          </wp:inline>
+        </w:drawing>
+      </w:r>
+    </w:p>
+    <w:p>
+      <w:pPr>
+        <w:spacing w:after="160" w:line="259" w:lineRule="auto"/>
+        <w:jc w:val="left"/>
+      </w:pPr>
+      <w:r>
+        <w:t>Le daremos a permitir:</w:t>
+      </w:r>
+    </w:p>
+    <w:p>
+      <w:pPr>
+        <w:spacing w:after="160" w:line="259" w:lineRule="auto"/>
+        <w:jc w:val="left"/>
+      </w:pPr>
+      <w:r>
+        <w:lastRenderedPageBreak/>
+        <w:drawing>
+          <wp:inline distT="0" distB="0" distL="0" distR="0" wp14:anchorId="0693CF61" wp14:editId="6F8769B8">
+            <wp:extent cx="3589331" cy="2720576"/>
+            <wp:effectExtent l="0" t="0" r="0" b="3810"/>
+            <wp:docPr id="450843854" name="Imagen 1"/>
+            <wp:cNvGraphicFramePr>
+              <a:graphicFrameLocks xmlns:a="http://schemas.openxmlformats.org/drawingml/2006/main" noChangeAspect="1"/>
+            </wp:cNvGraphicFramePr>
+            <a:graphic xmlns:a="http://schemas.openxmlformats.org/drawingml/2006/main">
+              <a:graphicData uri="http://schemas.openxmlformats.org/drawingml/2006/picture">
+                <pic:pic xmlns:pic="http://schemas.openxmlformats.org/drawingml/2006/picture">
+                  <pic:nvPicPr>
+                    <pic:cNvPr id="450843854" name=""/>
+                    <pic:cNvPicPr/>
+                  </pic:nvPicPr>
+                  <pic:blipFill>
+                    <a:blip r:embed="rId79"/>
+                    <a:stretch>
+                      <a:fillRect/>
+                    </a:stretch>
+                  </pic:blipFill>
+                  <pic:spPr>
+                    <a:xfrm>
+                      <a:off x="0" y="0"/>
+                      <a:ext cx="3589331" cy="2720576"/>
+                    </a:xfrm>
+                    <a:prstGeom prst="rect">
+                      <a:avLst/>
+                    </a:prstGeom>
+                  </pic:spPr>
+                </pic:pic>
+              </a:graphicData>
+            </a:graphic>
+          </wp:inline>
+        </w:drawing>
+      </w:r>
+    </w:p>
+    <w:p>
+      <w:pPr>
+        <w:spacing w:after="160" w:line="259" w:lineRule="auto"/>
+        <w:jc w:val="left"/>
+      </w:pPr>
+      <w:r>
+        <w:t xml:space="preserve">Nos saldrá esta pantalla, donde le daremos a </w:t>
+      </w:r>
+      <w:proofErr w:type="spellStart"/>
+      <w:r>
+        <w:t>next</w:t>
+      </w:r>
+      <w:proofErr w:type="spellEnd"/>
+      <w:r>
+        <w:t>:</w:t>
+      </w:r>
+    </w:p>
+    <w:p>
+      <w:pPr>
+        <w:spacing w:after="160" w:line="259" w:lineRule="auto"/>
+        <w:jc w:val="left"/>
+      </w:pPr>
+      <w:r>
+        <w:drawing>
+          <wp:inline distT="0" distB="0" distL="0" distR="0" wp14:anchorId="3D328442" wp14:editId="4C794C52">
+            <wp:extent cx="3040380" cy="2573992"/>
+            <wp:effectExtent l="0" t="0" r="7620" b="0"/>
+            <wp:docPr id="291217008" name="Imagen 1"/>
+            <wp:cNvGraphicFramePr>
+              <a:graphicFrameLocks xmlns:a="http://schemas.openxmlformats.org/drawingml/2006/main" noChangeAspect="1"/>
+            </wp:cNvGraphicFramePr>
+            <a:graphic xmlns:a="http://schemas.openxmlformats.org/drawingml/2006/main">
+              <a:graphicData uri="http://schemas.openxmlformats.org/drawingml/2006/picture">
+                <pic:pic xmlns:pic="http://schemas.openxmlformats.org/drawingml/2006/picture">
+                  <pic:nvPicPr>
+                    <pic:cNvPr id="291217008" name=""/>
+                    <pic:cNvPicPr/>
+                  </pic:nvPicPr>
+                  <pic:blipFill>
+                    <a:blip r:embed="rId80"/>
+                    <a:stretch>
+                      <a:fillRect/>
+                    </a:stretch>
+                  </pic:blipFill>
+                  <pic:spPr>
+                    <a:xfrm>
+                      <a:off x="0" y="0"/>
+                      <a:ext cx="3042687" cy="2575945"/>
+                    </a:xfrm>
+                    <a:prstGeom prst="rect">
+                      <a:avLst/>
+                    </a:prstGeom>
+                  </pic:spPr>
+                </pic:pic>
+              </a:graphicData>
+            </a:graphic>
+          </wp:inline>
+        </w:drawing>
+      </w:r>
+    </w:p>
+    <w:p>
+      <w:pPr>
+        <w:spacing w:after="160" w:line="259" w:lineRule="auto"/>
+        <w:jc w:val="left"/>
+      </w:pPr>
+      <w:r>
+        <w:t xml:space="preserve">Nos saldrá esta pantalla, donde le </w:t>
+      </w:r>
+      <w:r>
+        <w:t>volveremos</w:t>
+      </w:r>
+      <w:r>
+        <w:t xml:space="preserve"> a</w:t>
+      </w:r>
+      <w:r>
+        <w:t xml:space="preserve"> dar a</w:t>
+      </w:r>
+      <w:r>
+        <w:t xml:space="preserve"> </w:t>
+      </w:r>
+      <w:proofErr w:type="spellStart"/>
+      <w:r>
+        <w:t>next</w:t>
+      </w:r>
+      <w:proofErr w:type="spellEnd"/>
+      <w:r>
+        <w:t>:</w:t>
+      </w:r>
+    </w:p>
+    <w:p>
+      <w:pPr>
+        <w:spacing w:after="160" w:line="259" w:lineRule="auto"/>
+        <w:jc w:val="left"/>
+      </w:pPr>
+      <w:r>
+        <w:drawing>
+          <wp:inline distT="0" distB="0" distL="0" distR="0" wp14:anchorId="33B68229" wp14:editId="407D9681">
+            <wp:extent cx="2948940" cy="2487813"/>
+            <wp:effectExtent l="0" t="0" r="3810" b="8255"/>
+            <wp:docPr id="46919330" name="Imagen 1"/>
+            <wp:cNvGraphicFramePr>
+              <a:graphicFrameLocks xmlns:a="http://schemas.openxmlformats.org/drawingml/2006/main" noChangeAspect="1"/>
+            </wp:cNvGraphicFramePr>
+            <a:graphic xmlns:a="http://schemas.openxmlformats.org/drawingml/2006/main">
+              <a:graphicData uri="http://schemas.openxmlformats.org/drawingml/2006/picture">
+                <pic:pic xmlns:pic="http://schemas.openxmlformats.org/drawingml/2006/picture">
+                  <pic:nvPicPr>
+                    <pic:cNvPr id="46919330" name=""/>
+                    <pic:cNvPicPr/>
+                  </pic:nvPicPr>
+                  <pic:blipFill>
+                    <a:blip r:embed="rId81"/>
+                    <a:stretch>
+                      <a:fillRect/>
+                    </a:stretch>
+                  </pic:blipFill>
+                  <pic:spPr>
+                    <a:xfrm>
+                      <a:off x="0" y="0"/>
+                      <a:ext cx="2951627" cy="2490079"/>
+                    </a:xfrm>
+                    <a:prstGeom prst="rect">
+                      <a:avLst/>
+                    </a:prstGeom>
+                  </pic:spPr>
+                </pic:pic>
+              </a:graphicData>
+            </a:graphic>
+          </wp:inline>
+        </w:drawing>
+      </w:r>
+    </w:p>
+    <w:p>
+      <w:pPr>
+        <w:spacing w:after="160" w:line="259" w:lineRule="auto"/>
+        <w:jc w:val="left"/>
+      </w:pPr>
+      <w:r>
+        <w:t>En esta pantalla, le volveremos a dar a Next:</w:t>
+      </w:r>
+    </w:p>
+    <w:p>
+      <w:pPr>
+        <w:spacing w:after="160" w:line="259" w:lineRule="auto"/>
+        <w:jc w:val="left"/>
+      </w:pPr>
+      <w:r>
+        <w:lastRenderedPageBreak/>
+        <w:drawing>
+          <wp:inline distT="0" distB="0" distL="0" distR="0" wp14:anchorId="65F193A9" wp14:editId="53B5C12B">
+            <wp:extent cx="3063240" cy="2568230"/>
+            <wp:effectExtent l="0" t="0" r="3810" b="3810"/>
+            <wp:docPr id="1515299443" name="Imagen 1"/>
+            <wp:cNvGraphicFramePr>
+              <a:graphicFrameLocks xmlns:a="http://schemas.openxmlformats.org/drawingml/2006/main" noChangeAspect="1"/>
+            </wp:cNvGraphicFramePr>
+            <a:graphic xmlns:a="http://schemas.openxmlformats.org/drawingml/2006/main">
+              <a:graphicData uri="http://schemas.openxmlformats.org/drawingml/2006/picture">
+                <pic:pic xmlns:pic="http://schemas.openxmlformats.org/drawingml/2006/picture">
+                  <pic:nvPicPr>
+                    <pic:cNvPr id="1515299443" name=""/>
+                    <pic:cNvPicPr/>
+                  </pic:nvPicPr>
+                  <pic:blipFill>
+                    <a:blip r:embed="rId82"/>
+                    <a:stretch>
+                      <a:fillRect/>
+                    </a:stretch>
+                  </pic:blipFill>
+                  <pic:spPr>
+                    <a:xfrm>
+                      <a:off x="0" y="0"/>
+                      <a:ext cx="3067499" cy="2571800"/>
+                    </a:xfrm>
+                    <a:prstGeom prst="rect">
+                      <a:avLst/>
+                    </a:prstGeom>
+                  </pic:spPr>
+                </pic:pic>
+              </a:graphicData>
+            </a:graphic>
+          </wp:inline>
+        </w:drawing>
+      </w:r>
+    </w:p>
+    <w:p>
+      <w:pPr>
+        <w:spacing w:after="160" w:line="259" w:lineRule="auto"/>
+        <w:jc w:val="left"/>
+      </w:pPr>
+      <w:r>
+        <w:t>En esta pantalla, también le daremos a Next y ya iniciará la instalación:</w:t>
+      </w:r>
+    </w:p>
+    <w:p>
+      <w:pPr>
+        <w:spacing w:after="160" w:line="259" w:lineRule="auto"/>
+        <w:jc w:val="left"/>
+      </w:pPr>
+      <w:r>
+        <w:drawing>
+          <wp:inline distT="0" distB="0" distL="0" distR="0" wp14:anchorId="299F4F98" wp14:editId="3FD8F672">
+            <wp:extent cx="3063240" cy="2575238"/>
+            <wp:effectExtent l="0" t="0" r="3810" b="0"/>
+            <wp:docPr id="1445312226" name="Imagen 1"/>
+            <wp:cNvGraphicFramePr>
+              <a:graphicFrameLocks xmlns:a="http://schemas.openxmlformats.org/drawingml/2006/main" noChangeAspect="1"/>
+            </wp:cNvGraphicFramePr>
+            <a:graphic xmlns:a="http://schemas.openxmlformats.org/drawingml/2006/main">
+              <a:graphicData uri="http://schemas.openxmlformats.org/drawingml/2006/picture">
+                <pic:pic xmlns:pic="http://schemas.openxmlformats.org/drawingml/2006/picture">
+                  <pic:nvPicPr>
+                    <pic:cNvPr id="1445312226" name=""/>
+                    <pic:cNvPicPr/>
+                  </pic:nvPicPr>
+                  <pic:blipFill>
+                    <a:blip r:embed="rId83"/>
+                    <a:stretch>
+                      <a:fillRect/>
+                    </a:stretch>
+                  </pic:blipFill>
+                  <pic:spPr>
+                    <a:xfrm>
+                      <a:off x="0" y="0"/>
+                      <a:ext cx="3065333" cy="2576997"/>
+                    </a:xfrm>
+                    <a:prstGeom prst="rect">
+                      <a:avLst/>
+                    </a:prstGeom>
+                  </pic:spPr>
+                </pic:pic>
+              </a:graphicData>
+            </a:graphic>
+          </wp:inline>
+        </w:drawing>
+      </w:r>
+    </w:p>
+    <w:p>
+      <w:pPr>
+        <w:spacing w:after="160" w:line="259" w:lineRule="auto"/>
+        <w:jc w:val="left"/>
+      </w:pPr>
+      <w:r>
+        <w:t xml:space="preserve">La siguiente ventana que nos aparece es la que nos dice que ya se ha instalado correctamente, le daremos a </w:t>
+      </w:r>
+      <w:proofErr w:type="spellStart"/>
+      <w:r>
+        <w:t>Finish</w:t>
+      </w:r>
+      <w:proofErr w:type="spellEnd"/>
+      <w:r>
+        <w:t xml:space="preserve"> para terminar la instalación:</w:t>
+      </w:r>
+    </w:p>
+    <w:p>
+      <w:pPr>
+        <w:spacing w:after="160" w:line="259" w:lineRule="auto"/>
+        <w:jc w:val="left"/>
+      </w:pPr>
+      <w:r>
+        <w:drawing>
+          <wp:inline distT="0" distB="0" distL="0" distR="0" wp14:anchorId="0C07CCEB" wp14:editId="2E7A24E5">
+            <wp:extent cx="3116580" cy="2610211"/>
+            <wp:effectExtent l="0" t="0" r="7620" b="0"/>
+            <wp:docPr id="1551136421" name="Imagen 1"/>
+            <wp:cNvGraphicFramePr>
+              <a:graphicFrameLocks xmlns:a="http://schemas.openxmlformats.org/drawingml/2006/main" noChangeAspect="1"/>
+            </wp:cNvGraphicFramePr>
+            <a:graphic xmlns:a="http://schemas.openxmlformats.org/drawingml/2006/main">
+              <a:graphicData uri="http://schemas.openxmlformats.org/drawingml/2006/picture">
+                <pic:pic xmlns:pic="http://schemas.openxmlformats.org/drawingml/2006/picture">
+                  <pic:nvPicPr>
+                    <pic:cNvPr id="1551136421" name=""/>
+                    <pic:cNvPicPr/>
+                  </pic:nvPicPr>
+                  <pic:blipFill>
+                    <a:blip r:embed="rId84"/>
+                    <a:stretch>
+                      <a:fillRect/>
+                    </a:stretch>
+                  </pic:blipFill>
+                  <pic:spPr>
+                    <a:xfrm>
+                      <a:off x="0" y="0"/>
+                      <a:ext cx="3117829" cy="2611257"/>
+                    </a:xfrm>
+                    <a:prstGeom prst="rect">
+                      <a:avLst/>
+                    </a:prstGeom>
+                  </pic:spPr>
+                </pic:pic>
+              </a:graphicData>
+            </a:graphic>
+          </wp:inline>
+        </w:drawing>
+      </w:r>
+    </w:p>
+    <w:p>
+      <w:pPr>
+        <w:spacing w:after="160" w:line="259" w:lineRule="auto"/>
+        <w:jc w:val="left"/>
+      </w:pPr>
+    </w:p>
+    <w:p>
+      <w:pPr>
+        <w:spacing w:after="160" w:line="259" w:lineRule="auto"/>
+        <w:jc w:val="left"/>
+      </w:pPr>
+      <w:r>
+        <w:lastRenderedPageBreak/>
+        <w:t>Ahora abriremos el XAMPP en el buscador de aplicaciones para iniciar el apache y el MySQL:</w:t>
+      </w:r>
+    </w:p>
+    <w:p>
+      <w:pPr>
+        <w:spacing w:after="160" w:line="259" w:lineRule="auto"/>
+        <w:jc w:val="left"/>
+      </w:pPr>
+      <w:r>
+        <w:drawing>
+          <wp:inline distT="0" distB="0" distL="0" distR="0" wp14:anchorId="3E190A0F" wp14:editId="5DAEE693">
+            <wp:extent cx="1943100" cy="3994467"/>
+            <wp:effectExtent l="0" t="0" r="0" b="6350"/>
+            <wp:docPr id="1410520602" name="Imagen 1"/>
+            <wp:cNvGraphicFramePr>
+              <a:graphicFrameLocks xmlns:a="http://schemas.openxmlformats.org/drawingml/2006/main" noChangeAspect="1"/>
+            </wp:cNvGraphicFramePr>
+            <a:graphic xmlns:a="http://schemas.openxmlformats.org/drawingml/2006/main">
+              <a:graphicData uri="http://schemas.openxmlformats.org/drawingml/2006/picture">
+                <pic:pic xmlns:pic="http://schemas.openxmlformats.org/drawingml/2006/picture">
+                  <pic:nvPicPr>
+                    <pic:cNvPr id="1410520602" name=""/>
+                    <pic:cNvPicPr/>
+                  </pic:nvPicPr>
+                  <pic:blipFill>
+                    <a:blip r:embed="rId85"/>
+                    <a:stretch>
+                      <a:fillRect/>
+                    </a:stretch>
+                  </pic:blipFill>
+                  <pic:spPr>
+                    <a:xfrm>
+                      <a:off x="0" y="0"/>
+                      <a:ext cx="1943666" cy="3995631"/>
+                    </a:xfrm>
+                    <a:prstGeom prst="rect">
+                      <a:avLst/>
+                    </a:prstGeom>
+                  </pic:spPr>
+                </pic:pic>
+              </a:graphicData>
+            </a:graphic>
+          </wp:inline>
+        </w:drawing>
+      </w:r>
+    </w:p>
+    <w:p>
+      <w:pPr>
+        <w:spacing w:after="160" w:line="259" w:lineRule="auto"/>
+        <w:jc w:val="left"/>
+      </w:pPr>
+      <w:r>
+        <w:t>Cuando le demos a la aplicación nos saldrá esta ventana, donde le daremos a inicial el Apache y el MySQL, para saber si funcionan correctamente deberán aparecer en verde:</w:t>
+      </w:r>
+    </w:p>
+    <w:p>
+      <w:pPr>
+        <w:spacing w:after="160" w:line="259" w:lineRule="auto"/>
+        <w:jc w:val="left"/>
+      </w:pPr>
+      <w:r>
+        <w:drawing>
+          <wp:inline distT="0" distB="0" distL="0" distR="0" wp14:anchorId="6805B198" wp14:editId="4EEA268B">
+            <wp:extent cx="3855720" cy="2509369"/>
+            <wp:effectExtent l="0" t="0" r="0" b="5715"/>
+            <wp:docPr id="319474863" name="Imagen 1"/>
+            <wp:cNvGraphicFramePr>
+              <a:graphicFrameLocks xmlns:a="http://schemas.openxmlformats.org/drawingml/2006/main" noChangeAspect="1"/>
+            </wp:cNvGraphicFramePr>
+            <a:graphic xmlns:a="http://schemas.openxmlformats.org/drawingml/2006/main">
+              <a:graphicData uri="http://schemas.openxmlformats.org/drawingml/2006/picture">
+                <pic:pic xmlns:pic="http://schemas.openxmlformats.org/drawingml/2006/picture">
+                  <pic:nvPicPr>
+                    <pic:cNvPr id="319474863" name=""/>
+                    <pic:cNvPicPr/>
+                  </pic:nvPicPr>
+                  <pic:blipFill>
+                    <a:blip r:embed="rId86"/>
+                    <a:stretch>
+                      <a:fillRect/>
+                    </a:stretch>
+                  </pic:blipFill>
+                  <pic:spPr>
+                    <a:xfrm>
+                      <a:off x="0" y="0"/>
+                      <a:ext cx="3860904" cy="2512743"/>
+                    </a:xfrm>
+                    <a:prstGeom prst="rect">
+                      <a:avLst/>
+                    </a:prstGeom>
+                  </pic:spPr>
+                </pic:pic>
+              </a:graphicData>
+            </a:graphic>
+          </wp:inline>
+        </w:drawing>
+      </w:r>
+    </w:p>
+    <w:p>
+      <w:pPr>
+        <w:spacing w:after="160" w:line="259" w:lineRule="auto"/>
+        <w:jc w:val="left"/>
+      </w:pPr>
+      <w:r>
+        <w:lastRenderedPageBreak/>
+        <w:drawing>
+          <wp:inline distT="0" distB="0" distL="0" distR="0" wp14:anchorId="7AA947F7" wp14:editId="0B620C6F">
+            <wp:extent cx="3436620" cy="2197121"/>
+            <wp:effectExtent l="0" t="0" r="0" b="0"/>
+            <wp:docPr id="549485766" name="Imagen 1"/>
+            <wp:cNvGraphicFramePr>
+              <a:graphicFrameLocks xmlns:a="http://schemas.openxmlformats.org/drawingml/2006/main" noChangeAspect="1"/>
+            </wp:cNvGraphicFramePr>
+            <a:graphic xmlns:a="http://schemas.openxmlformats.org/drawingml/2006/main">
+              <a:graphicData uri="http://schemas.openxmlformats.org/drawingml/2006/picture">
+                <pic:pic xmlns:pic="http://schemas.openxmlformats.org/drawingml/2006/picture">
+                  <pic:nvPicPr>
+                    <pic:cNvPr id="549485766" name=""/>
+                    <pic:cNvPicPr/>
+                  </pic:nvPicPr>
+                  <pic:blipFill>
+                    <a:blip r:embed="rId87"/>
+                    <a:stretch>
+                      <a:fillRect/>
+                    </a:stretch>
+                  </pic:blipFill>
+                  <pic:spPr>
+                    <a:xfrm>
+                      <a:off x="0" y="0"/>
+                      <a:ext cx="3448093" cy="2204456"/>
+                    </a:xfrm>
+                    <a:prstGeom prst="rect">
+                      <a:avLst/>
+                    </a:prstGeom>
+                  </pic:spPr>
+                </pic:pic>
+              </a:graphicData>
+            </a:graphic>
+          </wp:inline>
+        </w:drawing>
+      </w:r>
+    </w:p>
+    <w:p>
+      <w:pPr>
+        <w:spacing w:after="160" w:line="259" w:lineRule="auto"/>
+        <w:jc w:val="left"/>
+      </w:pPr>
+      <w:proofErr w:type="spellStart"/>
+      <w:r>
+        <w:t>Despues</w:t>
+      </w:r>
+      <w:proofErr w:type="spellEnd"/>
+      <w:r>
+        <w:t xml:space="preserve"> de iniciar correctamente el apache y el MySQL, lo que debemos hacer es meternos en el navegador y poner en el buscador </w:t>
+      </w:r>
+      <w:hyperlink r:id="rId88" w:history="1">
+        <w:r>
+          <w:rPr>
+            <w:rStyle w:val="Hipervnculo"/>
+          </w:rPr>
+          <w:t>http://localhost/phpmyadmin</w:t>
+        </w:r>
+      </w:hyperlink>
+      <w:r>
+        <w:t>, y nos aparecerá lo siguiente:</w:t>
+      </w:r>
+    </w:p>
+    <w:p>
+      <w:pPr>
+        <w:spacing w:after="160" w:line="259" w:lineRule="auto"/>
+        <w:jc w:val="left"/>
+      </w:pPr>
+      <w:r>
+        <w:drawing>
+          <wp:inline distT="0" distB="0" distL="0" distR="0" wp14:anchorId="4F262A88" wp14:editId="5E9F69CE">
+            <wp:extent cx="3314700" cy="2963211"/>
+            <wp:effectExtent l="0" t="0" r="0" b="8890"/>
+            <wp:docPr id="475041493" name="Imagen 1"/>
+            <wp:cNvGraphicFramePr>
+              <a:graphicFrameLocks xmlns:a="http://schemas.openxmlformats.org/drawingml/2006/main" noChangeAspect="1"/>
+            </wp:cNvGraphicFramePr>
+            <a:graphic xmlns:a="http://schemas.openxmlformats.org/drawingml/2006/main">
+              <a:graphicData uri="http://schemas.openxmlformats.org/drawingml/2006/picture">
+                <pic:pic xmlns:pic="http://schemas.openxmlformats.org/drawingml/2006/picture">
+                  <pic:nvPicPr>
+                    <pic:cNvPr id="475041493" name=""/>
+                    <pic:cNvPicPr/>
+                  </pic:nvPicPr>
+                  <pic:blipFill>
+                    <a:blip r:embed="rId89"/>
+                    <a:stretch>
+                      <a:fillRect/>
+                    </a:stretch>
+                  </pic:blipFill>
+                  <pic:spPr>
+                    <a:xfrm>
+                      <a:off x="0" y="0"/>
+                      <a:ext cx="3318289" cy="2966419"/>
+                    </a:xfrm>
+                    <a:prstGeom prst="rect">
+                      <a:avLst/>
+                    </a:prstGeom>
+                  </pic:spPr>
+                </pic:pic>
+              </a:graphicData>
+            </a:graphic>
+          </wp:inline>
+        </w:drawing>
+      </w:r>
+    </w:p>
+    <w:p>
+      <w:pPr>
+        <w:spacing w:after="160" w:line="259" w:lineRule="auto"/>
+        <w:jc w:val="left"/>
+      </w:pPr>
+      <w:r>
+        <w:t>Ahora le daremos a nueva:</w:t>
+      </w:r>
+    </w:p>
+    <w:p>
+      <w:pPr>
+        <w:spacing w:after="160" w:line="259" w:lineRule="auto"/>
+        <w:jc w:val="left"/>
+      </w:pPr>
+      <w:r>
+        <w:drawing>
+          <wp:inline distT="0" distB="0" distL="0" distR="0" wp14:anchorId="2D2EA0D4" wp14:editId="15C048D9">
+            <wp:extent cx="2987040" cy="2670295"/>
+            <wp:effectExtent l="0" t="0" r="3810" b="0"/>
+            <wp:docPr id="112274032" name="Imagen 1"/>
+            <wp:cNvGraphicFramePr>
+              <a:graphicFrameLocks xmlns:a="http://schemas.openxmlformats.org/drawingml/2006/main" noChangeAspect="1"/>
+            </wp:cNvGraphicFramePr>
+            <a:graphic xmlns:a="http://schemas.openxmlformats.org/drawingml/2006/main">
+              <a:graphicData uri="http://schemas.openxmlformats.org/drawingml/2006/picture">
+                <pic:pic xmlns:pic="http://schemas.openxmlformats.org/drawingml/2006/picture">
+                  <pic:nvPicPr>
+                    <pic:cNvPr id="112274032" name=""/>
+                    <pic:cNvPicPr/>
+                  </pic:nvPicPr>
+                  <pic:blipFill>
+                    <a:blip r:embed="rId90"/>
+                    <a:stretch>
+                      <a:fillRect/>
+                    </a:stretch>
+                  </pic:blipFill>
+                  <pic:spPr>
+                    <a:xfrm>
+                      <a:off x="0" y="0"/>
+                      <a:ext cx="2992887" cy="2675522"/>
+                    </a:xfrm>
+                    <a:prstGeom prst="rect">
+                      <a:avLst/>
+                    </a:prstGeom>
+                  </pic:spPr>
+                </pic:pic>
+              </a:graphicData>
+            </a:graphic>
+          </wp:inline>
+        </w:drawing>
+      </w:r>
+    </w:p>
+    <w:p>
+      <w:pPr>
+        <w:spacing w:after="160" w:line="259" w:lineRule="auto"/>
+        <w:jc w:val="left"/>
+      </w:pPr>
+      <w:r>
+        <w:lastRenderedPageBreak/>
+        <w:t>Cuando le demos nos saldrá esta ventana</w:t>
+      </w:r>
+      <w:r>
+        <w:t>, donde en Crear base de datos, le pondremos el nombre de la base de datos del proyecto, y en el desplegable le pondremos utf8_spanish2_ci  y le ya le podemos dar a crear</w:t>
+      </w:r>
+      <w:r>
+        <w:t>:</w:t>
+      </w:r>
+    </w:p>
+    <w:p>
+      <w:pPr>
+        <w:spacing w:after="160" w:line="259" w:lineRule="auto"/>
+        <w:jc w:val="left"/>
+      </w:pPr>
+      <w:r>
+        <w:drawing>
+          <wp:inline distT="0" distB="0" distL="0" distR="0" wp14:anchorId="4BC9224F" wp14:editId="2D2D37BE">
+            <wp:extent cx="5113020" cy="4163692"/>
+            <wp:effectExtent l="0" t="0" r="0" b="8890"/>
+            <wp:docPr id="311622078" name="Imagen 1"/>
+            <wp:cNvGraphicFramePr>
+              <a:graphicFrameLocks xmlns:a="http://schemas.openxmlformats.org/drawingml/2006/main" noChangeAspect="1"/>
+            </wp:cNvGraphicFramePr>
+            <a:graphic xmlns:a="http://schemas.openxmlformats.org/drawingml/2006/main">
+              <a:graphicData uri="http://schemas.openxmlformats.org/drawingml/2006/picture">
+                <pic:pic xmlns:pic="http://schemas.openxmlformats.org/drawingml/2006/picture">
+                  <pic:nvPicPr>
+                    <pic:cNvPr id="311622078" name=""/>
+                    <pic:cNvPicPr/>
+                  </pic:nvPicPr>
+                  <pic:blipFill>
+                    <a:blip r:embed="rId91"/>
+                    <a:stretch>
+                      <a:fillRect/>
+                    </a:stretch>
+                  </pic:blipFill>
+                  <pic:spPr>
+                    <a:xfrm>
+                      <a:off x="0" y="0"/>
+                      <a:ext cx="5115404" cy="4165633"/>
+                    </a:xfrm>
+                    <a:prstGeom prst="rect">
+                      <a:avLst/>
+                    </a:prstGeom>
+                  </pic:spPr>
+                </pic:pic>
+              </a:graphicData>
+            </a:graphic>
+          </wp:inline>
+        </w:drawing>
+      </w:r>
+    </w:p>
+    <w:p>
+      <w:pPr>
+        <w:spacing w:after="160" w:line="259" w:lineRule="auto"/>
+        <w:jc w:val="left"/>
+      </w:pPr>
+      <w:r>
+        <w:t>Y como podemos ver ya tenemos creada la base de datos:</w:t>
+      </w:r>
+    </w:p>
+    <w:p>
+      <w:pPr>
+        <w:spacing w:after="160" w:line="259" w:lineRule="auto"/>
+        <w:jc w:val="left"/>
+      </w:pPr>
+      <w:r>
+        <w:drawing>
+          <wp:inline distT="0" distB="0" distL="0" distR="0" wp14:anchorId="4866091E" wp14:editId="0D78A1A3">
+            <wp:extent cx="1897544" cy="2575783"/>
+            <wp:effectExtent l="0" t="0" r="7620" b="0"/>
+            <wp:docPr id="1060894005" name="Imagen 1"/>
+            <wp:cNvGraphicFramePr>
+              <a:graphicFrameLocks xmlns:a="http://schemas.openxmlformats.org/drawingml/2006/main" noChangeAspect="1"/>
+            </wp:cNvGraphicFramePr>
+            <a:graphic xmlns:a="http://schemas.openxmlformats.org/drawingml/2006/main">
+              <a:graphicData uri="http://schemas.openxmlformats.org/drawingml/2006/picture">
+                <pic:pic xmlns:pic="http://schemas.openxmlformats.org/drawingml/2006/picture">
+                  <pic:nvPicPr>
+                    <pic:cNvPr id="1060894005" name=""/>
+                    <pic:cNvPicPr/>
+                  </pic:nvPicPr>
+                  <pic:blipFill>
+                    <a:blip r:embed="rId92"/>
+                    <a:stretch>
+                      <a:fillRect/>
+                    </a:stretch>
+                  </pic:blipFill>
+                  <pic:spPr>
+                    <a:xfrm>
+                      <a:off x="0" y="0"/>
+                      <a:ext cx="1897544" cy="2575783"/>
+                    </a:xfrm>
+                    <a:prstGeom prst="rect">
+                      <a:avLst/>
+                    </a:prstGeom>
+                  </pic:spPr>
+                </pic:pic>
+              </a:graphicData>
+            </a:graphic>
+          </wp:inline>
+        </w:drawing>
+      </w:r>
+    </w:p>
+    <w:p>
+      <w:pPr>
+        <w:spacing w:after="160" w:line="259" w:lineRule="auto"/>
+        <w:jc w:val="left"/>
+      </w:pPr>
+    </w:p>
+    <w:p>
+      <w:pPr>
+        <w:spacing w:after="160" w:line="259" w:lineRule="auto"/>
+        <w:jc w:val="left"/>
+      </w:pPr>
+    </w:p>
+    <w:p>
+      <w:pPr>
+        <w:spacing w:after="160" w:line="259" w:lineRule="auto"/>
+        <w:jc w:val="left"/>
+      </w:pPr>
+    </w:p>
+    <w:p>
+      <w:pPr>
+        <w:spacing w:after="160" w:line="259" w:lineRule="auto"/>
+        <w:jc w:val="left"/>
+      </w:pPr>
+    </w:p>
+    <w:p>
+      <w:pPr>
+        <w:spacing w:after="160" w:line="259" w:lineRule="auto"/>
+        <w:jc w:val="left"/>
+      </w:pPr>
+    </w:p>
+    <w:p>
+      <w:pPr>
+        <w:spacing w:after="160" w:line="259" w:lineRule="auto"/>
+        <w:jc w:val="left"/>
+      </w:pPr>
+    </w:p>
+    <w:p>
+      <w:pPr>
+        <w:spacing w:after="160" w:line="259" w:lineRule="auto"/>
+        <w:jc w:val="left"/>
+      </w:pPr>
+    </w:p>
+    <w:p>
+      <w:pPr>
+        <w:spacing w:after="160" w:line="259" w:lineRule="auto"/>
+        <w:jc w:val="left"/>
+      </w:pPr>
+    </w:p>
+    <w:p>
+      <w:pPr>
+        <w:spacing w:after="160" w:line="259" w:lineRule="auto"/>
+        <w:jc w:val="left"/>
+      </w:pPr>
+    </w:p>
+    <w:p>
+      <w:pPr>
+        <w:spacing w:after="160" w:line="259" w:lineRule="auto"/>
+        <w:jc w:val="left"/>
+      </w:pPr>
+      <w:r>
         <w:t>.</w:t>
       </w:r>
     </w:p>
     <w:p/>
-    <w:p>
-      <w:pPr>
-        <w:pStyle w:val="Ttulo2"/>
-      </w:pPr>
-      <w:bookmarkStart w:id="172" w:name="_Toc49341876"/>
-      <w:bookmarkStart w:id="173" w:name="_Toc170148377"/>
-      <w:bookmarkStart w:id="174" w:name="_Toc170148690"/>
-      <w:r>
-        <w:t>Mejoras posibles</w:t>
-      </w:r>
-      <w:bookmarkEnd w:id="172"/>
-      <w:bookmarkEnd w:id="173"/>
-      <w:bookmarkEnd w:id="174"/>
-    </w:p>
-    <w:p>
-      <w:pPr>
-        <w:rPr>
-          <w:color w:val="FF0000"/>
-        </w:rPr>
-      </w:pPr>
-      <w:r>
-        <w:rPr>
-          <w:color w:val="FF0000"/>
-        </w:rPr>
-        <w:t>Rellenar</w:t>
-      </w:r>
-      <w:bookmarkStart w:id="175" w:name="_Toc49341877"/>
-      <w:bookmarkStart w:id="176" w:name="_Toc170148378"/>
-    </w:p>
-    <w:p>
-      <w:pPr>
-        <w:rPr>
-          <w:color w:val="FF0000"/>
-        </w:rPr>
-      </w:pPr>
-    </w:p>
-    <w:p>
-      <w:pPr>
-        <w:pStyle w:val="Ttulo2"/>
-      </w:pPr>
-      <w:bookmarkStart w:id="177" w:name="_Toc170148691"/>
-      <w:r>
-        <w:t>Manual de usuario</w:t>
-      </w:r>
-      <w:bookmarkEnd w:id="175"/>
-      <w:bookmarkEnd w:id="176"/>
-      <w:bookmarkEnd w:id="177"/>
-    </w:p>
-    <w:p>
-      <w:pPr>
-        <w:rPr>
-          <w:color w:val="FF0000"/>
-        </w:rPr>
-      </w:pPr>
-      <w:r>
-        <w:rPr>
-          <w:color w:val="FF0000"/>
-        </w:rPr>
-        <w:t>Rellenar</w:t>
-      </w:r>
-    </w:p>
     <w:p/>
     <w:p>
       <w:pPr>
@@ -31991,8 +32468,8 @@
           <w:lang w:bidi="es-ES"/>
         </w:rPr>
       </w:pPr>
-      <w:bookmarkStart w:id="178" w:name="_Toc49341895"/>
-      <w:bookmarkStart w:id="179" w:name="_Toc170148379"/>
+      <w:bookmarkStart w:id="172" w:name="_Toc49341895"/>
+      <w:bookmarkStart w:id="173" w:name="_Toc170148379"/>
       <w:r>
         <w:rPr>
           <w:lang w:bidi="es-ES"/>
@@ -32010,7 +32487,7 @@
           <w:lang w:bidi="es-ES"/>
         </w:rPr>
       </w:pPr>
-      <w:bookmarkStart w:id="180" w:name="_Toc170148692"/>
+      <w:bookmarkStart w:id="174" w:name="_Toc170148692"/>
       <w:r>
         <w:rPr>
           <w:sz w:val="144"/>
@@ -32020,9 +32497,9 @@
         <w:lastRenderedPageBreak/>
         <w:t>Anexos</w:t>
       </w:r>
-      <w:bookmarkEnd w:id="178"/>
-      <w:bookmarkEnd w:id="179"/>
-      <w:bookmarkEnd w:id="180"/>
+      <w:bookmarkEnd w:id="172"/>
+      <w:bookmarkEnd w:id="173"/>
+      <w:bookmarkEnd w:id="174"/>
     </w:p>
     <w:sdt>
       <w:sdtPr>
@@ -32068,9 +32545,9 @@
               <w:b w:val="0"/>
             </w:rPr>
           </w:pPr>
-          <w:bookmarkStart w:id="181" w:name="_Toc49341896"/>
-          <w:bookmarkStart w:id="182" w:name="_Toc170148380"/>
-          <w:bookmarkStart w:id="183" w:name="_Toc170148693"/>
+          <w:bookmarkStart w:id="175" w:name="_Toc49341896"/>
+          <w:bookmarkStart w:id="176" w:name="_Toc170148380"/>
+          <w:bookmarkStart w:id="177" w:name="_Toc170148693"/>
           <w:r>
             <w:rPr>
               <w:b w:val="0"/>
@@ -32084,9 +32561,9 @@
             </w:rPr>
             <w:t>contrato usado</w:t>
           </w:r>
-          <w:bookmarkEnd w:id="181"/>
-          <w:bookmarkEnd w:id="182"/>
-          <w:bookmarkEnd w:id="183"/>
+          <w:bookmarkEnd w:id="175"/>
+          <w:bookmarkEnd w:id="176"/>
+          <w:bookmarkEnd w:id="177"/>
         </w:p>
         <w:p>
           <w:pPr>
@@ -32118,7 +32595,7 @@
                         </pic:cNvPicPr>
                       </pic:nvPicPr>
                       <pic:blipFill>
-                        <a:blip r:embed="rId76" cstate="print">
+                        <a:blip r:embed="rId93" cstate="print">
                           <a:extLst>
                             <a:ext uri="{28A0092B-C50C-407E-A947-70E740481C1C}">
                               <a14:useLocalDpi xmlns:a14="http://schemas.microsoft.com/office/drawing/2010/main" val="0"/>
@@ -32157,8 +32634,8 @@
               <w:b w:val="0"/>
             </w:rPr>
           </w:pPr>
-          <w:bookmarkStart w:id="184" w:name="_Toc170148381"/>
-          <w:bookmarkStart w:id="185" w:name="_Toc170148694"/>
+          <w:bookmarkStart w:id="178" w:name="_Toc170148381"/>
+          <w:bookmarkStart w:id="179" w:name="_Toc170148694"/>
           <w:r>
             <w:rPr>
               <w:b w:val="0"/>
@@ -32180,8 +32657,8 @@
             </w:rPr>
             <w:t xml:space="preserve"> (alumnos)</w:t>
           </w:r>
-          <w:bookmarkEnd w:id="184"/>
-          <w:bookmarkEnd w:id="185"/>
+          <w:bookmarkEnd w:id="178"/>
+          <w:bookmarkEnd w:id="179"/>
         </w:p>
         <w:p>
           <w:pPr>
@@ -32210,7 +32687,7 @@
                         </pic:cNvPicPr>
                       </pic:nvPicPr>
                       <pic:blipFill>
-                        <a:blip r:embed="rId77" cstate="print">
+                        <a:blip r:embed="rId94" cstate="print">
                           <a:extLst>
                             <a:ext uri="{28A0092B-C50C-407E-A947-70E740481C1C}">
                               <a14:useLocalDpi xmlns:a14="http://schemas.microsoft.com/office/drawing/2010/main" val="0"/>
@@ -32417,9 +32894,9 @@
           <w:b w:val="0"/>
         </w:rPr>
       </w:pPr>
-      <w:bookmarkStart w:id="186" w:name="_Toc49341898"/>
-      <w:bookmarkStart w:id="187" w:name="_Toc170148382"/>
-      <w:bookmarkStart w:id="188" w:name="_Toc170148695"/>
+      <w:bookmarkStart w:id="180" w:name="_Toc49341898"/>
+      <w:bookmarkStart w:id="181" w:name="_Toc170148382"/>
+      <w:bookmarkStart w:id="182" w:name="_Toc170148695"/>
       <w:r>
         <w:rPr>
           <w:b w:val="0"/>
@@ -32427,9 +32904,9 @@
         <w:lastRenderedPageBreak/>
         <w:t>Ejemplo de formulario de satisfacción</w:t>
       </w:r>
-      <w:bookmarkEnd w:id="186"/>
-      <w:bookmarkEnd w:id="187"/>
-      <w:bookmarkEnd w:id="188"/>
+      <w:bookmarkEnd w:id="180"/>
+      <w:bookmarkEnd w:id="181"/>
+      <w:bookmarkEnd w:id="182"/>
     </w:p>
     <w:p>
       <w:r>
@@ -35191,8 +35668,8 @@
           <w:b w:val="0"/>
         </w:rPr>
       </w:pPr>
-      <w:bookmarkStart w:id="189" w:name="_Toc170148383"/>
-      <w:bookmarkStart w:id="190" w:name="_Toc170148696"/>
+      <w:bookmarkStart w:id="183" w:name="_Toc170148383"/>
+      <w:bookmarkStart w:id="184" w:name="_Toc170148696"/>
       <w:r>
         <w:rPr>
           <w:b w:val="0"/>
@@ -35200,8 +35677,8 @@
         <w:lastRenderedPageBreak/>
         <w:t>Datos de prueba</w:t>
       </w:r>
-      <w:bookmarkEnd w:id="189"/>
-      <w:bookmarkEnd w:id="190"/>
+      <w:bookmarkEnd w:id="183"/>
+      <w:bookmarkEnd w:id="184"/>
     </w:p>
     <w:p>
       <w:pPr>
@@ -40051,8 +40528,8 @@
     <w:p/>
     <w:p/>
     <w:sectPr>
-      <w:headerReference w:type="default" r:id="rId78"/>
-      <w:footerReference w:type="default" r:id="rId79"/>
+      <w:headerReference w:type="default" r:id="rId95"/>
+      <w:footerReference w:type="default" r:id="rId96"/>
       <w:pgSz w:w="11906" w:h="16838" w:code="9"/>
       <w:pgMar w:top="1291" w:right="936" w:bottom="720" w:left="936" w:header="0" w:footer="289" w:gutter="0"/>
       <w:pgNumType w:start="1"/>
@@ -45813,7 +46290,7 @@
   <w:style w:type="paragraph" w:default="1" w:styleId="Normal">
     <w:name w:val="Normal"/>
     <w:qFormat/>
-    <w:rsid w:val="007610BC"/>
+    <w:rsid w:val="007501F1"/>
     <w:pPr>
       <w:spacing w:after="0"/>
       <w:jc w:val="both"/>
@@ -47318,6 +47795,7 @@
     <w:rsid w:val="003D7227"/>
     <w:rsid w:val="003F5CFC"/>
     <w:rsid w:val="003F71E4"/>
+    <w:rsid w:val="0040383D"/>
     <w:rsid w:val="004130A3"/>
     <w:rsid w:val="00444837"/>
     <w:rsid w:val="004B6A68"/>
@@ -47353,7 +47831,6 @@
     <w:rsid w:val="0081382F"/>
     <w:rsid w:val="00893BCB"/>
     <w:rsid w:val="008960CF"/>
-    <w:rsid w:val="008C619E"/>
     <w:rsid w:val="009051C9"/>
     <w:rsid w:val="00962633"/>
     <w:rsid w:val="00963B15"/>

</xml_diff>

<commit_message>
Decimosexto guardado (24/05/2026, 23:07)
</commit_message>
<xml_diff>
--- a/UT_7_2024_2025 (2).docx
+++ b/UT_7_2024_2025 (2).docx
@@ -6733,6 +6733,7 @@
                 <w:r>
                   <w:t xml:space="preserve">IDE para desarrollo </w:t>
                 </w:r>
+                <w:proofErr w:type="gramStart"/>
                 <w:r>
                   <w:t>PHP</w:t>
                 </w:r>
@@ -6740,6 +6741,7 @@
                   <w:t xml:space="preserve">  (</w:t>
                 </w:r>
                 <w:proofErr w:type="spellStart"/>
+                <w:proofErr w:type="gramEnd"/>
                 <w:r>
                   <w:t>PhpStorm</w:t>
                 </w:r>
@@ -6827,11 +6829,16 @@
                 <w:r>
                   <w:t xml:space="preserve">Bootstrap </w:t>
                 </w:r>
+                <w:proofErr w:type="gramStart"/>
                 <w:r>
                   <w:t xml:space="preserve">5.3 </w:t>
                 </w:r>
                 <w:r>
-                  <w:t xml:space="preserve"> jQuery 3.</w:t>
+                  <w:t xml:space="preserve"> jQuery</w:t>
+                </w:r>
+                <w:proofErr w:type="gramEnd"/>
+                <w:r>
+                  <w:t xml:space="preserve"> 3.</w:t>
                 </w:r>
                 <w:r>
                   <w:t>7</w:t>
@@ -6884,6 +6891,7 @@
                   <w:t xml:space="preserve">– </w:t>
                 </w:r>
                 <w:proofErr w:type="spellStart"/>
+                <w:proofErr w:type="gramStart"/>
                 <w:r>
                   <w:t>MariaDB</w:t>
                 </w:r>
@@ -6900,6 +6908,7 @@
                 <w:r>
                   <w:t>patible</w:t>
                 </w:r>
+                <w:proofErr w:type="gramEnd"/>
               </w:p>
             </w:tc>
           </w:tr>
@@ -11225,7 +11234,21 @@
               <w:rPr>
                 <w:b/>
               </w:rPr>
-              <w:t>Selección de datos  subcaso: Selección de formato</w:t>
+              <w:t xml:space="preserve">Selección de </w:t>
+            </w:r>
+            <w:proofErr w:type="gramStart"/>
+            <w:r>
+              <w:rPr>
+                <w:b/>
+              </w:rPr>
+              <w:t>datos  subcaso</w:t>
+            </w:r>
+            <w:proofErr w:type="gramEnd"/>
+            <w:r>
+              <w:rPr>
+                <w:b/>
+              </w:rPr>
+              <w:t>: Selección de formato</w:t>
             </w:r>
           </w:p>
         </w:tc>
@@ -14197,8 +14220,19 @@
                 <w:sz w:val="16"/>
                 <w:szCs w:val="16"/>
               </w:rPr>
-              <w:t>1ºeso, 2eso….</w:t>
-            </w:r>
+              <w:t>1ºeso, 2</w:t>
+            </w:r>
+            <w:proofErr w:type="gramStart"/>
+            <w:r>
+              <w:rPr>
+                <w:rFonts w:cstheme="minorHAnsi"/>
+                <w:b/>
+                <w:sz w:val="16"/>
+                <w:szCs w:val="16"/>
+              </w:rPr>
+              <w:t>eso….</w:t>
+            </w:r>
+            <w:proofErr w:type="gramEnd"/>
           </w:p>
         </w:tc>
       </w:tr>
@@ -16409,7 +16443,27 @@
                 <w:sz w:val="16"/>
                 <w:szCs w:val="16"/>
               </w:rPr>
-              <w:t>0, I, II  (0 para no beca, tramo I y II)</w:t>
+              <w:t xml:space="preserve">0, I, </w:t>
+            </w:r>
+            <w:proofErr w:type="gramStart"/>
+            <w:r>
+              <w:rPr>
+                <w:rFonts w:cstheme="minorHAnsi"/>
+                <w:b/>
+                <w:sz w:val="16"/>
+                <w:szCs w:val="16"/>
+              </w:rPr>
+              <w:t>II  (</w:t>
+            </w:r>
+            <w:proofErr w:type="gramEnd"/>
+            <w:r>
+              <w:rPr>
+                <w:rFonts w:cstheme="minorHAnsi"/>
+                <w:b/>
+                <w:sz w:val="16"/>
+                <w:szCs w:val="16"/>
+              </w:rPr>
+              <w:t>0 para no beca, tramo I y II)</w:t>
             </w:r>
           </w:p>
         </w:tc>
@@ -17890,8 +17944,19 @@
                 <w:sz w:val="16"/>
                 <w:szCs w:val="16"/>
               </w:rPr>
-              <w:t>P: Prestado, D:Devuelto</w:t>
-            </w:r>
+              <w:t xml:space="preserve">P: Prestado, </w:t>
+            </w:r>
+            <w:proofErr w:type="gramStart"/>
+            <w:r>
+              <w:rPr>
+                <w:rFonts w:cstheme="minorHAnsi"/>
+                <w:b/>
+                <w:sz w:val="16"/>
+                <w:szCs w:val="16"/>
+              </w:rPr>
+              <w:t>D:Devuelto</w:t>
+            </w:r>
+            <w:proofErr w:type="gramEnd"/>
           </w:p>
         </w:tc>
       </w:tr>
@@ -18382,7 +18447,15 @@
     </w:p>
     <w:p>
       <w:r>
-        <w:t xml:space="preserve">El siguiente diagrama va a representar la estructura de clases que va a utilizar la aplicación para poder acceder y poder gestionar la información almacenada en la base de datos. La relación entre las clases va a permitir controlar la gestión de los préstamos las devoluciones, los cursos  y los libros que están asignados a cada alumno. El diagrama de clases se ha realizado teniendo en cuenta las relaciones existentes entre las distintas tablas del modelo relacional que se </w:t>
+        <w:t xml:space="preserve">El siguiente diagrama va a representar la estructura de clases que va a utilizar la aplicación para poder acceder y poder gestionar la información almacenada en la base de datos. La relación entre las clases va a permitir controlar la gestión de los préstamos las devoluciones, los </w:t>
+      </w:r>
+      <w:proofErr w:type="gramStart"/>
+      <w:r>
+        <w:t>cursos  y</w:t>
+      </w:r>
+      <w:proofErr w:type="gramEnd"/>
+      <w:r>
+        <w:t xml:space="preserve"> los libros que están asignados a cada alumno. El diagrama de clases se ha realizado teniendo en cuenta las relaciones existentes entre las distintas tablas del modelo relacional que se </w:t>
       </w:r>
       <w:proofErr w:type="spellStart"/>
       <w:r>
@@ -20780,7 +20853,21 @@
         <w:rPr>
           <w:lang w:val="en-GB"/>
         </w:rPr>
-        <w:t>` varchar(10) NOT NULL,</w:t>
+        <w:t xml:space="preserve">` </w:t>
+      </w:r>
+      <w:proofErr w:type="gramStart"/>
+      <w:r>
+        <w:rPr>
+          <w:lang w:val="en-GB"/>
+        </w:rPr>
+        <w:t>varchar(</w:t>
+      </w:r>
+      <w:proofErr w:type="gramEnd"/>
+      <w:r>
+        <w:rPr>
+          <w:lang w:val="en-GB"/>
+        </w:rPr>
+        <w:t>10) NOT NULL,</w:t>
       </w:r>
     </w:p>
     <w:p>
@@ -20807,7 +20894,21 @@
         <w:rPr>
           <w:lang w:val="en-GB"/>
         </w:rPr>
-        <w:t>` varchar(255) NOT NULL,</w:t>
+        <w:t xml:space="preserve">` </w:t>
+      </w:r>
+      <w:proofErr w:type="gramStart"/>
+      <w:r>
+        <w:rPr>
+          <w:lang w:val="en-GB"/>
+        </w:rPr>
+        <w:t>varchar(</w:t>
+      </w:r>
+      <w:proofErr w:type="gramEnd"/>
+      <w:r>
+        <w:rPr>
+          <w:lang w:val="en-GB"/>
+        </w:rPr>
+        <w:t>255) NOT NULL,</w:t>
       </w:r>
     </w:p>
     <w:p>
@@ -20834,7 +20935,21 @@
         <w:rPr>
           <w:lang w:val="en-GB"/>
         </w:rPr>
-        <w:t>` varchar(255) NOT NULL,</w:t>
+        <w:t xml:space="preserve">` </w:t>
+      </w:r>
+      <w:proofErr w:type="gramStart"/>
+      <w:r>
+        <w:rPr>
+          <w:lang w:val="en-GB"/>
+        </w:rPr>
+        <w:t>varchar(</w:t>
+      </w:r>
+      <w:proofErr w:type="gramEnd"/>
+      <w:r>
+        <w:rPr>
+          <w:lang w:val="en-GB"/>
+        </w:rPr>
+        <w:t>255) NOT NULL,</w:t>
       </w:r>
     </w:p>
     <w:p>
@@ -20861,7 +20976,21 @@
         <w:rPr>
           <w:lang w:val="en-GB"/>
         </w:rPr>
-        <w:t xml:space="preserve">` varchar(2) NOT NULL DEFAULT '0' COMMENT '0 nada, I </w:t>
+        <w:t xml:space="preserve">` </w:t>
+      </w:r>
+      <w:proofErr w:type="gramStart"/>
+      <w:r>
+        <w:rPr>
+          <w:lang w:val="en-GB"/>
+        </w:rPr>
+        <w:t>varchar(</w:t>
+      </w:r>
+      <w:proofErr w:type="gramEnd"/>
+      <w:r>
+        <w:rPr>
+          <w:lang w:val="en-GB"/>
+        </w:rPr>
+        <w:t xml:space="preserve">2) NOT NULL DEFAULT '0' COMMENT '0 nada, I </w:t>
       </w:r>
       <w:proofErr w:type="spellStart"/>
       <w:r>
@@ -20919,6 +21048,7 @@
         <w:t xml:space="preserve">` </w:t>
       </w:r>
       <w:proofErr w:type="spellStart"/>
+      <w:proofErr w:type="gramStart"/>
       <w:r>
         <w:rPr>
           <w:lang w:val="en-GB"/>
@@ -20930,7 +21060,14 @@
         <w:rPr>
           <w:lang w:val="en-GB"/>
         </w:rPr>
-        <w:t>(1) NOT NULL DEFAULT 1 COMMENT '0 True, 1 false'</w:t>
+        <w:t>(</w:t>
+      </w:r>
+      <w:proofErr w:type="gramEnd"/>
+      <w:r>
+        <w:rPr>
+          <w:lang w:val="en-GB"/>
+        </w:rPr>
+        <w:t>1) NOT NULL DEFAULT 1 COMMENT '0 True, 1 false'</w:t>
       </w:r>
     </w:p>
     <w:p>
@@ -21119,7 +21256,21 @@
         <w:rPr>
           <w:lang w:val="en-GB"/>
         </w:rPr>
-        <w:t>` varchar(10) NOT NULL,</w:t>
+        <w:t xml:space="preserve">` </w:t>
+      </w:r>
+      <w:proofErr w:type="gramStart"/>
+      <w:r>
+        <w:rPr>
+          <w:lang w:val="en-GB"/>
+        </w:rPr>
+        <w:t>varchar(</w:t>
+      </w:r>
+      <w:proofErr w:type="gramEnd"/>
+      <w:r>
+        <w:rPr>
+          <w:lang w:val="en-GB"/>
+        </w:rPr>
+        <w:t>10) NOT NULL,</w:t>
       </w:r>
     </w:p>
     <w:p>
@@ -21146,7 +21297,21 @@
         <w:rPr>
           <w:lang w:val="en-GB"/>
         </w:rPr>
-        <w:t>` varchar(255) NOT NULL,</w:t>
+        <w:t xml:space="preserve">` </w:t>
+      </w:r>
+      <w:proofErr w:type="gramStart"/>
+      <w:r>
+        <w:rPr>
+          <w:lang w:val="en-GB"/>
+        </w:rPr>
+        <w:t>varchar(</w:t>
+      </w:r>
+      <w:proofErr w:type="gramEnd"/>
+      <w:r>
+        <w:rPr>
+          <w:lang w:val="en-GB"/>
+        </w:rPr>
+        <w:t>255) NOT NULL,</w:t>
       </w:r>
     </w:p>
     <w:p>
@@ -21173,7 +21338,21 @@
         <w:rPr>
           <w:lang w:val="en-GB"/>
         </w:rPr>
-        <w:t>` varchar(20) NOT NULL,</w:t>
+        <w:t xml:space="preserve">` </w:t>
+      </w:r>
+      <w:proofErr w:type="gramStart"/>
+      <w:r>
+        <w:rPr>
+          <w:lang w:val="en-GB"/>
+        </w:rPr>
+        <w:t>varchar(</w:t>
+      </w:r>
+      <w:proofErr w:type="gramEnd"/>
+      <w:r>
+        <w:rPr>
+          <w:lang w:val="en-GB"/>
+        </w:rPr>
+        <w:t>20) NOT NULL,</w:t>
       </w:r>
     </w:p>
     <w:p>
@@ -21255,7 +21434,21 @@
         <w:rPr>
           <w:lang w:val="en-GB"/>
         </w:rPr>
-        <w:t xml:space="preserve">` varchar(1) NOT NULL DEFAULT 'P' COMMENT 'P: </w:t>
+        <w:t xml:space="preserve">` </w:t>
+      </w:r>
+      <w:proofErr w:type="gramStart"/>
+      <w:r>
+        <w:rPr>
+          <w:lang w:val="en-GB"/>
+        </w:rPr>
+        <w:t>varchar(</w:t>
+      </w:r>
+      <w:proofErr w:type="gramEnd"/>
+      <w:r>
+        <w:rPr>
+          <w:lang w:val="en-GB"/>
+        </w:rPr>
+        <w:t xml:space="preserve">1) NOT NULL DEFAULT 'P' COMMENT 'P: </w:t>
       </w:r>
       <w:proofErr w:type="spellStart"/>
       <w:r>
@@ -21269,7 +21462,21 @@
         <w:rPr>
           <w:lang w:val="en-GB"/>
         </w:rPr>
-        <w:t>, D:Devuelto'</w:t>
+        <w:t xml:space="preserve">, </w:t>
+      </w:r>
+      <w:proofErr w:type="gramStart"/>
+      <w:r>
+        <w:rPr>
+          <w:lang w:val="en-GB"/>
+        </w:rPr>
+        <w:t>D:Devuelto</w:t>
+      </w:r>
+      <w:proofErr w:type="gramEnd"/>
+      <w:r>
+        <w:rPr>
+          <w:lang w:val="en-GB"/>
+        </w:rPr>
+        <w:t>'</w:t>
       </w:r>
     </w:p>
     <w:p>
@@ -21458,7 +21665,21 @@
         <w:rPr>
           <w:lang w:val="en-GB"/>
         </w:rPr>
-        <w:t>` varchar(20) NOT NULL,</w:t>
+        <w:t xml:space="preserve">` </w:t>
+      </w:r>
+      <w:proofErr w:type="gramStart"/>
+      <w:r>
+        <w:rPr>
+          <w:lang w:val="en-GB"/>
+        </w:rPr>
+        <w:t>varchar(</w:t>
+      </w:r>
+      <w:proofErr w:type="gramEnd"/>
+      <w:r>
+        <w:rPr>
+          <w:lang w:val="en-GB"/>
+        </w:rPr>
+        <w:t>20) NOT NULL,</w:t>
       </w:r>
     </w:p>
     <w:p>
@@ -21485,7 +21706,21 @@
         <w:rPr>
           <w:lang w:val="en-GB"/>
         </w:rPr>
-        <w:t>` varchar(20) NOT NULL</w:t>
+        <w:t xml:space="preserve">` </w:t>
+      </w:r>
+      <w:proofErr w:type="gramStart"/>
+      <w:r>
+        <w:rPr>
+          <w:lang w:val="en-GB"/>
+        </w:rPr>
+        <w:t>varchar(</w:t>
+      </w:r>
+      <w:proofErr w:type="gramEnd"/>
+      <w:r>
+        <w:rPr>
+          <w:lang w:val="en-GB"/>
+        </w:rPr>
+        <w:t>20) NOT NULL</w:t>
       </w:r>
     </w:p>
     <w:p>
@@ -21674,7 +21909,21 @@
         <w:rPr>
           <w:lang w:val="en-GB"/>
         </w:rPr>
-        <w:t>` varchar(20) NOT NULL,</w:t>
+        <w:t xml:space="preserve">` </w:t>
+      </w:r>
+      <w:proofErr w:type="gramStart"/>
+      <w:r>
+        <w:rPr>
+          <w:lang w:val="en-GB"/>
+        </w:rPr>
+        <w:t>varchar(</w:t>
+      </w:r>
+      <w:proofErr w:type="gramEnd"/>
+      <w:r>
+        <w:rPr>
+          <w:lang w:val="en-GB"/>
+        </w:rPr>
+        <w:t>20) NOT NULL,</w:t>
       </w:r>
     </w:p>
     <w:p>
@@ -21701,7 +21950,21 @@
         <w:rPr>
           <w:lang w:val="en-GB"/>
         </w:rPr>
-        <w:t>` varchar(255) NOT NULL,</w:t>
+        <w:t xml:space="preserve">` </w:t>
+      </w:r>
+      <w:proofErr w:type="gramStart"/>
+      <w:r>
+        <w:rPr>
+          <w:lang w:val="en-GB"/>
+        </w:rPr>
+        <w:t>varchar(</w:t>
+      </w:r>
+      <w:proofErr w:type="gramEnd"/>
+      <w:r>
+        <w:rPr>
+          <w:lang w:val="en-GB"/>
+        </w:rPr>
+        <w:t>255) NOT NULL,</w:t>
       </w:r>
     </w:p>
     <w:p>
@@ -21728,7 +21991,21 @@
         <w:rPr>
           <w:lang w:val="en-GB"/>
         </w:rPr>
-        <w:t>` varchar(255) NOT NULL,</w:t>
+        <w:t xml:space="preserve">` </w:t>
+      </w:r>
+      <w:proofErr w:type="gramStart"/>
+      <w:r>
+        <w:rPr>
+          <w:lang w:val="en-GB"/>
+        </w:rPr>
+        <w:t>varchar(</w:t>
+      </w:r>
+      <w:proofErr w:type="gramEnd"/>
+      <w:r>
+        <w:rPr>
+          <w:lang w:val="en-GB"/>
+        </w:rPr>
+        <w:t>255) NOT NULL,</w:t>
       </w:r>
     </w:p>
     <w:p>
@@ -21755,7 +22032,21 @@
         <w:rPr>
           <w:lang w:val="en-GB"/>
         </w:rPr>
-        <w:t>` int(5) NOT NULL,</w:t>
+        <w:t xml:space="preserve">` </w:t>
+      </w:r>
+      <w:proofErr w:type="gramStart"/>
+      <w:r>
+        <w:rPr>
+          <w:lang w:val="en-GB"/>
+        </w:rPr>
+        <w:t>int(</w:t>
+      </w:r>
+      <w:proofErr w:type="gramEnd"/>
+      <w:r>
+        <w:rPr>
+          <w:lang w:val="en-GB"/>
+        </w:rPr>
+        <w:t>5) NOT NULL,</w:t>
       </w:r>
     </w:p>
     <w:p>
@@ -21782,7 +22073,21 @@
         <w:rPr>
           <w:lang w:val="en-GB"/>
         </w:rPr>
-        <w:t>` int(11) NOT NULL,</w:t>
+        <w:t xml:space="preserve">` </w:t>
+      </w:r>
+      <w:proofErr w:type="gramStart"/>
+      <w:r>
+        <w:rPr>
+          <w:lang w:val="en-GB"/>
+        </w:rPr>
+        <w:t>int(</w:t>
+      </w:r>
+      <w:proofErr w:type="gramEnd"/>
+      <w:r>
+        <w:rPr>
+          <w:lang w:val="en-GB"/>
+        </w:rPr>
+        <w:t>11) NOT NULL,</w:t>
       </w:r>
     </w:p>
     <w:p>
@@ -21809,7 +22114,21 @@
         <w:rPr>
           <w:lang w:val="en-GB"/>
         </w:rPr>
-        <w:t>` varchar(20) NOT NULL</w:t>
+        <w:t xml:space="preserve">` </w:t>
+      </w:r>
+      <w:proofErr w:type="gramStart"/>
+      <w:r>
+        <w:rPr>
+          <w:lang w:val="en-GB"/>
+        </w:rPr>
+        <w:t>varchar(</w:t>
+      </w:r>
+      <w:proofErr w:type="gramEnd"/>
+      <w:r>
+        <w:rPr>
+          <w:lang w:val="en-GB"/>
+        </w:rPr>
+        <w:t>20) NOT NULL</w:t>
       </w:r>
     </w:p>
     <w:p>
@@ -21984,7 +22303,21 @@
         <w:rPr>
           <w:lang w:val="en-GB"/>
         </w:rPr>
-        <w:t xml:space="preserve">  `id` int(11) NOT NULL,</w:t>
+        <w:t xml:space="preserve">  `id` </w:t>
+      </w:r>
+      <w:proofErr w:type="gramStart"/>
+      <w:r>
+        <w:rPr>
+          <w:lang w:val="en-GB"/>
+        </w:rPr>
+        <w:t>int(</w:t>
+      </w:r>
+      <w:proofErr w:type="gramEnd"/>
+      <w:r>
+        <w:rPr>
+          <w:lang w:val="en-GB"/>
+        </w:rPr>
+        <w:t>11) NOT NULL,</w:t>
       </w:r>
     </w:p>
     <w:p>
@@ -22011,7 +22344,21 @@
         <w:rPr>
           <w:lang w:val="en-GB"/>
         </w:rPr>
-        <w:t>` varchar(255) NOT NULL,</w:t>
+        <w:t xml:space="preserve">` </w:t>
+      </w:r>
+      <w:proofErr w:type="gramStart"/>
+      <w:r>
+        <w:rPr>
+          <w:lang w:val="en-GB"/>
+        </w:rPr>
+        <w:t>varchar(</w:t>
+      </w:r>
+      <w:proofErr w:type="gramEnd"/>
+      <w:r>
+        <w:rPr>
+          <w:lang w:val="en-GB"/>
+        </w:rPr>
+        <w:t>255) NOT NULL,</w:t>
       </w:r>
     </w:p>
     <w:p>
@@ -22038,7 +22385,21 @@
         <w:rPr>
           <w:lang w:val="en-GB"/>
         </w:rPr>
-        <w:t>` varchar(255) NOT NULL</w:t>
+        <w:t xml:space="preserve">` </w:t>
+      </w:r>
+      <w:proofErr w:type="gramStart"/>
+      <w:r>
+        <w:rPr>
+          <w:lang w:val="en-GB"/>
+        </w:rPr>
+        <w:t>varchar(</w:t>
+      </w:r>
+      <w:proofErr w:type="gramEnd"/>
+      <w:r>
+        <w:rPr>
+          <w:lang w:val="en-GB"/>
+        </w:rPr>
+        <w:t>255) NOT NULL</w:t>
       </w:r>
     </w:p>
     <w:p>
@@ -22379,6 +22740,7 @@
         <w:t>nie</w:t>
       </w:r>
       <w:proofErr w:type="spellEnd"/>
+      <w:proofErr w:type="gramStart"/>
       <w:r>
         <w:rPr>
           <w:lang w:val="en-GB"/>
@@ -22386,6 +22748,7 @@
         <w:t>`,`</w:t>
       </w:r>
       <w:proofErr w:type="spellStart"/>
+      <w:proofErr w:type="gramEnd"/>
       <w:r>
         <w:rPr>
           <w:lang w:val="en-GB"/>
@@ -22393,6 +22756,7 @@
         <w:t>curso</w:t>
       </w:r>
       <w:proofErr w:type="spellEnd"/>
+      <w:proofErr w:type="gramStart"/>
       <w:r>
         <w:rPr>
           <w:lang w:val="en-GB"/>
@@ -22400,6 +22764,7 @@
         <w:t>`,`</w:t>
       </w:r>
       <w:proofErr w:type="spellStart"/>
+      <w:proofErr w:type="gramEnd"/>
       <w:r>
         <w:rPr>
           <w:lang w:val="en-GB"/>
@@ -32293,7 +32658,15 @@
         <w:t>Cuando le demos nos saldrá esta ventana</w:t>
       </w:r>
       <w:r>
-        <w:t>, donde en Crear base de datos, le pondremos el nombre de la base de datos del proyecto, y en el desplegable le pondremos utf8_spanish2_ci  y le ya le podemos dar a crear</w:t>
+        <w:t>, donde en Crear base de datos, le pondremos el nombre de la base de datos del proyecto, y en el desplegable le pondremos utf8_spanish2_</w:t>
+      </w:r>
+      <w:proofErr w:type="gramStart"/>
+      <w:r>
+        <w:t>ci  y</w:t>
+      </w:r>
+      <w:proofErr w:type="gramEnd"/>
+      <w:r>
+        <w:t xml:space="preserve"> le ya le podemos dar a crear</w:t>
       </w:r>
       <w:r>
         <w:t>:</w:t>
@@ -35679,19 +36052,6 @@
       </w:r>
       <w:bookmarkEnd w:id="183"/>
       <w:bookmarkEnd w:id="184"/>
-    </w:p>
-    <w:p>
-      <w:pPr>
-        <w:rPr>
-          <w:color w:val="FF0000"/>
-        </w:rPr>
-      </w:pPr>
-      <w:r>
-        <w:rPr>
-          <w:color w:val="FF0000"/>
-        </w:rPr>
-        <w:t>Rellenar</w:t>
-      </w:r>
     </w:p>
     <w:p/>
     <w:p/>
@@ -47795,7 +48155,6 @@
     <w:rsid w:val="003D7227"/>
     <w:rsid w:val="003F5CFC"/>
     <w:rsid w:val="003F71E4"/>
-    <w:rsid w:val="0040383D"/>
     <w:rsid w:val="004130A3"/>
     <w:rsid w:val="00444837"/>
     <w:rsid w:val="004B6A68"/>
@@ -47817,6 +48176,7 @@
     <w:rsid w:val="0066166D"/>
     <w:rsid w:val="00681ED5"/>
     <w:rsid w:val="00684424"/>
+    <w:rsid w:val="00693639"/>
     <w:rsid w:val="006A6D69"/>
     <w:rsid w:val="00734B22"/>
     <w:rsid w:val="007535C4"/>

</xml_diff>

<commit_message>
Decimoseptimo guardado (24/05/2026, 23:13)
</commit_message>
<xml_diff>
--- a/UT_7_2024_2025 (2).docx
+++ b/UT_7_2024_2025 (2).docx
@@ -17820,7 +17820,16 @@
                 <w:sz w:val="16"/>
                 <w:szCs w:val="16"/>
               </w:rPr>
-              <w:t>estado</w:t>
+              <w:t>E</w:t>
+            </w:r>
+            <w:r>
+              <w:rPr>
+                <w:rFonts w:cstheme="minorHAnsi"/>
+                <w:b/>
+                <w:sz w:val="16"/>
+                <w:szCs w:val="16"/>
+              </w:rPr>
+              <w:t>stado</w:t>
             </w:r>
           </w:p>
         </w:tc>
@@ -18393,7 +18402,7 @@
     </w:p>
     <w:p>
       <w:r>
-        <w:t>La aplicación va a disponer de un archivo de configuración que se va a encargar de almacenar los parámetros que van a ser necesarios para el funcionamiento del sistema. En el archivo se va a guardar el nombre de la base de datos, la conexión a la base de datos, los usuarios con su contraseña para poder acceder, la tura de almacenamiento de las copias de seguridad…</w:t>
+        <w:t>La aplicación va a disponer de un archivo de configuración que se va a encargar de almacenar los parámetros que van a ser necesarios para el funcionamiento del sistema. En el archivo se va a guardar el nombre de la base de datos, la conexión a la base de datos, los usuarios con su contraseña para poder acceder…</w:t>
       </w:r>
     </w:p>
     <w:p/>
@@ -18447,15 +18456,7 @@
     </w:p>
     <w:p>
       <w:r>
-        <w:t xml:space="preserve">El siguiente diagrama va a representar la estructura de clases que va a utilizar la aplicación para poder acceder y poder gestionar la información almacenada en la base de datos. La relación entre las clases va a permitir controlar la gestión de los préstamos las devoluciones, los </w:t>
-      </w:r>
-      <w:proofErr w:type="gramStart"/>
-      <w:r>
-        <w:t>cursos  y</w:t>
-      </w:r>
-      <w:proofErr w:type="gramEnd"/>
-      <w:r>
-        <w:t xml:space="preserve"> los libros que están asignados a cada alumno. El diagrama de clases se ha realizado teniendo en cuenta las relaciones existentes entre las distintas tablas del modelo relacional que se </w:t>
+        <w:t xml:space="preserve">El siguiente diagrama va a representar la estructura de clases que va a utilizar la aplicación para poder acceder y poder gestionar la información almacenada en la base de datos. La relación entre las clases va a permitir controlar la gestión de los préstamos las devoluciones, los cursos y los libros que están asignados a cada alumno. El diagrama de clases se ha realizado teniendo en cuenta las relaciones existentes entre las distintas tablas del modelo relacional que se </w:t>
       </w:r>
       <w:proofErr w:type="spellStart"/>
       <w:r>
@@ -29737,7 +29738,7 @@
       </w:r>
       <w:r>
         <w:br/>
-        <w:t>Durante el desarrollo se implementó un módulo de gestión de alumnos con operaciones básicas de consulta y alta. Se decidió utilizar un menú sencillo en consola que permite ver todos los alumnos registrados en la base de datos y añadir nuevos registros.</w:t>
+        <w:t>Durante el desarrollo se implementó un módulo de gestión de alumnos con operaciones básicas de consulta y alta. Se decidió utilizar un menú sencillo en consola que permite ver todos los alumnos registrados en la base de datos y añadir nuevos.</w:t>
       </w:r>
     </w:p>
     <w:p>
@@ -29944,13 +29945,13 @@
         <w:jc w:val="left"/>
       </w:pPr>
       <w:r>
-        <w:t>Para realizar la implantación de la aplicación se intentará que afecte lo menos posible al funcionamiento del centro.</w:t>
-      </w:r>
-      <w:r>
-        <w:t xml:space="preserve"> </w:t>
-      </w:r>
-      <w:r>
-        <w:t>La instalación del sistema se realizará fuera del horario escolar para evitar problemas durante las clases.</w:t>
+        <w:t xml:space="preserve">Para realizar la implantación de la aplicación se intentará que afecte lo menos posible al funcionamiento del </w:t>
+      </w:r>
+      <w:r>
+        <w:t>instituto</w:t>
+      </w:r>
+      <w:r>
+        <w:t>.</w:t>
       </w:r>
       <w:r>
         <w:t xml:space="preserve"> </w:t>
@@ -48176,7 +48177,6 @@
     <w:rsid w:val="0066166D"/>
     <w:rsid w:val="00681ED5"/>
     <w:rsid w:val="00684424"/>
-    <w:rsid w:val="00693639"/>
     <w:rsid w:val="006A6D69"/>
     <w:rsid w:val="00734B22"/>
     <w:rsid w:val="007535C4"/>
@@ -48204,6 +48204,7 @@
     <w:rsid w:val="00A71D6A"/>
     <w:rsid w:val="00A94268"/>
     <w:rsid w:val="00AC11EA"/>
+    <w:rsid w:val="00AE5EF4"/>
     <w:rsid w:val="00B444FF"/>
     <w:rsid w:val="00BA03CE"/>
     <w:rsid w:val="00BB60B5"/>

</xml_diff>